<commit_message>
I forgot to save the docs
</commit_message>
<xml_diff>
--- a/Barta_rocnikova_prace.docx
+++ b/Barta_rocnikova_prace.docx
@@ -5581,6 +5581,12 @@
       </w:r>
     </w:p>
     <w:p>
+      <w:pPr>
+        <w:rPr>
+          <w:rFonts w:ascii="Times New Roman" w:hAnsi="Times New Roman"/>
+          <w:sz w:val="24"/>
+        </w:rPr>
+      </w:pPr>
       <w:r>
         <w:t>Celý Habit-Tracker jsem rozdělil na nezávislé a znovupoužitelné komponenty. Tento přístup považuji za jeden z největších důvodů, proč je Angular pro podobné projekty tak vhodný. Místo toho, aby byl celý kód „na jednom místě“, má každá část aplikace svůj vlastní komponentní soubor a vlastní logiku i šablonu.</w:t>
       </w:r>
@@ -5616,6 +5622,12 @@
       <w:proofErr w:type="spellEnd"/>
     </w:p>
     <w:p>
+      <w:pPr>
+        <w:rPr>
+          <w:rFonts w:ascii="Times New Roman" w:hAnsi="Times New Roman"/>
+          <w:sz w:val="24"/>
+        </w:rPr>
+      </w:pPr>
       <w:r>
         <w:t xml:space="preserve">Pro práci s daty používám službu </w:t>
       </w:r>
@@ -5653,16 +5665,318 @@
       </w:r>
       <w:proofErr w:type="spellEnd"/>
       <w:r>
-        <w:t xml:space="preserve">) lépe odděluje od uživatelského rozhraní (komponenty). Kód je potom </w:t>
-      </w:r>
-      <w:r>
-        <w:t>přehlednější,</w:t>
-      </w:r>
+        <w:t xml:space="preserve">) lépe </w:t>
+      </w:r>
+      <w:proofErr w:type="spellStart"/>
+      <w:r>
+        <w:t>oddědušší</w:t>
+      </w:r>
+      <w:proofErr w:type="spellEnd"/>
+      <w:r>
+        <w:t xml:space="preserve"> na případné úpravy, protože změny v datové logice nezasáhnou tolik UI a </w:t>
+      </w:r>
+      <w:proofErr w:type="spellStart"/>
+      <w:r>
+        <w:t>naopakluje</w:t>
+      </w:r>
+      <w:proofErr w:type="spellEnd"/>
+      <w:r>
+        <w:t xml:space="preserve"> od uživatelského rozhraní (komponenty). Kód je potom přehlednější, a hlavně jedno.</w:t>
+      </w:r>
+    </w:p>
+    <w:p>
+      <w:pPr>
+        <w:pStyle w:val="Nadpis3"/>
+      </w:pPr>
+      <w:r>
+        <w:t>Angular CLI</w:t>
+      </w:r>
+    </w:p>
+    <w:p>
+      <w:pPr>
+        <w:rPr>
+          <w:rFonts w:ascii="Times New Roman" w:hAnsi="Times New Roman"/>
+          <w:sz w:val="24"/>
+        </w:rPr>
+      </w:pPr>
+      <w:r>
+        <w:t xml:space="preserve">Při vývoji jsem hodně využíval Angular CLI. To je příkazový nástroj, který Angular poskytuje a který pomáhá zautomatizovat několik činností. Podle oficiální dokumentace </w:t>
+      </w:r>
+      <w:r>
+        <w:rPr>
+          <w:rStyle w:val="VrazncittChar"/>
+        </w:rPr>
+        <w:t xml:space="preserve">"Angular CLI e nástrojem příkazového řádku, který vám umožňuje vytvářet, vyvíjet, testovat, nasazovat a udržovat Angular aplikace přímo z příkazového </w:t>
+      </w:r>
+      <w:r>
+        <w:rPr>
+          <w:rStyle w:val="VrazncittChar"/>
+        </w:rPr>
+        <w:lastRenderedPageBreak/>
+        <w:t>prostředí."[1]</w:t>
+      </w:r>
+      <w:r>
+        <w:t xml:space="preserve"> Pomocí něj se dají generovat nové komponenty, služby nebo další části projektu prostřednictvím schémat (</w:t>
+      </w:r>
+      <w:proofErr w:type="spellStart"/>
+      <w:r>
+        <w:t>schematics</w:t>
+      </w:r>
+      <w:proofErr w:type="spellEnd"/>
+      <w:r>
+        <w:t xml:space="preserve">), která </w:t>
+      </w:r>
+      <w:r>
+        <w:rPr>
+          <w:rStyle w:val="VrazncittChar"/>
+        </w:rPr>
+        <w:t>"generují a upravují zdrojové soubory vaší aplikace automaticky."[1]</w:t>
+      </w:r>
+      <w:r>
+        <w:t xml:space="preserve"> Také se přes něj spouští vývojový server v </w:t>
+      </w:r>
+      <w:proofErr w:type="spellStart"/>
+      <w:r>
+        <w:t>localhostu</w:t>
+      </w:r>
+      <w:proofErr w:type="spellEnd"/>
+      <w:r>
+        <w:t xml:space="preserve"> na p</w:t>
+      </w:r>
+      <w:r>
+        <w:t>or</w:t>
+      </w:r>
+      <w:r>
+        <w:t>tu 4200. Pro mě bylo Angular CLI důležité i kvůli časovému ulehčení práce. Když člověk dělá projekt, který obsahuje více komponent, nechce ručně vytvářet strukturu pro každou komponentu. CLI mi to připravilo rychle a přehledně, takže jsem se mohl soustředit hlavně na vlastní funkčnost aplikace.</w:t>
+      </w:r>
+    </w:p>
+    <w:p/>
+    <w:p>
+      <w:pPr>
+        <w:pStyle w:val="Nadpis2"/>
+      </w:pPr>
+      <w:r>
+        <w:t>Angular Material</w:t>
+      </w:r>
+    </w:p>
+    <w:p>
+      <w:pPr>
+        <w:rPr>
+          <w:rFonts w:ascii="Times New Roman" w:hAnsi="Times New Roman"/>
+          <w:sz w:val="24"/>
+        </w:rPr>
+      </w:pPr>
+      <w:r>
+        <w:t xml:space="preserve">Pro hlavní stránku jsou klíčové komponenty </w:t>
+      </w:r>
+      <w:proofErr w:type="spellStart"/>
+      <w:r>
+        <w:t>MatCard</w:t>
+      </w:r>
+      <w:proofErr w:type="spellEnd"/>
+      <w:r>
+        <w:t xml:space="preserve"> a </w:t>
+      </w:r>
+      <w:proofErr w:type="spellStart"/>
+      <w:r>
+        <w:t>MatTabs</w:t>
+      </w:r>
+      <w:proofErr w:type="spellEnd"/>
+      <w:r>
+        <w:t xml:space="preserve">. </w:t>
+      </w:r>
+      <w:proofErr w:type="spellStart"/>
+      <w:r>
+        <w:t>MatCard</w:t>
+      </w:r>
+      <w:proofErr w:type="spellEnd"/>
+      <w:r>
+        <w:t xml:space="preserve"> používám tam, kde chci mít návyky zobrazené v ucelených „kartách“ – uživatel pak hned vidí strukturu a nemusí se v obsahu ztrácet. </w:t>
+      </w:r>
+      <w:proofErr w:type="spellStart"/>
+      <w:r>
+        <w:t>MatTabs</w:t>
+      </w:r>
+      <w:proofErr w:type="spellEnd"/>
+      <w:r>
+        <w:t xml:space="preserve"> zase řeší přepínání mezi dvěma kategoriemi návyků. V mém případě to jsou „dobré“ a „špatné“ návyky. Tento způsob přepínání je pro uživatele intuitivní, protože místo přesměrování nebo složitých filtrů jen přepne záložku a hned vidí relevantní obsah.</w:t>
+      </w:r>
+    </w:p>
+    <w:p>
+      <w:pPr>
+        <w:pStyle w:val="Nadpis3"/>
+      </w:pPr>
+      <w:r>
+        <w:t>Karty a panely</w:t>
+      </w:r>
+    </w:p>
+    <w:p>
+      <w:r>
+        <w:t xml:space="preserve">Pro hlavní stránku jsou klíčové komponenty </w:t>
+      </w:r>
+      <w:proofErr w:type="spellStart"/>
+      <w:r>
+        <w:t>MatCard</w:t>
+      </w:r>
+      <w:proofErr w:type="spellEnd"/>
+      <w:r>
+        <w:t xml:space="preserve"> a </w:t>
+      </w:r>
+      <w:proofErr w:type="spellStart"/>
+      <w:r>
+        <w:t>MatTabs</w:t>
+      </w:r>
+      <w:proofErr w:type="spellEnd"/>
+      <w:r>
+        <w:t xml:space="preserve">. </w:t>
+      </w:r>
+      <w:proofErr w:type="spellStart"/>
+      <w:r>
+        <w:t>MatCard</w:t>
+      </w:r>
+      <w:proofErr w:type="spellEnd"/>
+      <w:r>
+        <w:t xml:space="preserve"> používám tam, kde chci mít návyky zobrazené v ucelených „kartách“ – uživatel pak hned vidí strukturu a nemusí se v obsahu ztrácet. </w:t>
+      </w:r>
+      <w:proofErr w:type="spellStart"/>
+      <w:r>
+        <w:t>MatTabs</w:t>
+      </w:r>
+      <w:proofErr w:type="spellEnd"/>
+      <w:r>
+        <w:t xml:space="preserve"> zase řeší přepínání mezi dvěma kategoriemi návyků. V mém případě to jsou „dobré“ a „špatné“ návyky. Tento způsob přepínání je pro uživatele intuitivní, protože místo přesměrování nebo složitých filtrů jen přepne záložku a hned vidí relevantní obsah.</w:t>
+      </w:r>
+    </w:p>
+    <w:p>
+      <w:pPr>
+        <w:pStyle w:val="Nadpis3"/>
+      </w:pPr>
+      <w:r>
+        <w:t>Formulářové prvky a ikony</w:t>
+      </w:r>
+    </w:p>
+    <w:p>
+      <w:pPr>
+        <w:rPr>
+          <w:rFonts w:ascii="Times New Roman" w:hAnsi="Times New Roman"/>
+          <w:sz w:val="24"/>
+        </w:rPr>
+      </w:pPr>
+      <w:r>
+        <w:t xml:space="preserve">Pro zadávání názvu nového návyku a výběr barvy používám ovládací prvky </w:t>
+      </w:r>
+      <w:proofErr w:type="spellStart"/>
+      <w:r>
+        <w:t>MatFormField</w:t>
+      </w:r>
+      <w:proofErr w:type="spellEnd"/>
+      <w:r>
+        <w:t xml:space="preserve">. Tyhle prvky pomáhají držet formy přehledné a vizuálně jednotné. Dále jsem využil systém ikon přes komponentu </w:t>
+      </w:r>
+      <w:proofErr w:type="spellStart"/>
+      <w:r>
+        <w:t>MatIcon</w:t>
+      </w:r>
+      <w:proofErr w:type="spellEnd"/>
+      <w:r>
+        <w:t>. Ikony jsem použil jako vizuální doplněk k návykům, aby bylo možné návyky rychleji rozpoznat a aby vzhled aplikace nebyl jen „textový“, ale měl i jasné symboly. I když se to může zdát jako drobnost, v praxi to zvyšuje použitelnost a uživatelský komfort.</w:t>
+      </w:r>
+    </w:p>
+    <w:p>
+      <w:pPr>
+        <w:pStyle w:val="Nadpis2"/>
+      </w:pPr>
+      <w:proofErr w:type="spellStart"/>
+      <w:r>
+        <w:t>TypeScript</w:t>
+      </w:r>
+      <w:proofErr w:type="spellEnd"/>
+    </w:p>
+    <w:p>
+      <w:proofErr w:type="spellStart"/>
+      <w:r>
+        <w:t>TypeScript</w:t>
+      </w:r>
+      <w:proofErr w:type="spellEnd"/>
+      <w:r>
+        <w:t xml:space="preserve"> je programovací jazyk, který rozšiřuje JavaScript o statické typování a další moderní funkce. Pro projekt Habit-Tracker jsem zvolil </w:t>
+      </w:r>
+      <w:proofErr w:type="spellStart"/>
+      <w:r>
+        <w:t>TypeScript</w:t>
+      </w:r>
+      <w:proofErr w:type="spellEnd"/>
+      <w:r>
+        <w:t xml:space="preserve"> jako primární jazyk, protože umožňuje psát bezpečnější a lépe udržovatelný kód. </w:t>
+      </w:r>
+      <w:proofErr w:type="spellStart"/>
+      <w:r>
+        <w:t>TypeScript</w:t>
+      </w:r>
+      <w:proofErr w:type="spellEnd"/>
+      <w:r>
+        <w:t xml:space="preserve"> se kompiluje do běžného </w:t>
+      </w:r>
+      <w:proofErr w:type="spellStart"/>
+      <w:r>
+        <w:t>JavaScriptu</w:t>
+      </w:r>
+      <w:proofErr w:type="spellEnd"/>
+      <w:r>
+        <w:t>, takže je plně kompatibilní se všemi prohlížeči a Angular frameworkem.</w:t>
+      </w:r>
+    </w:p>
+    <w:p>
+      <w:r>
+        <w:t xml:space="preserve">Volba </w:t>
+      </w:r>
+      <w:proofErr w:type="spellStart"/>
+      <w:r>
+        <w:t>TypeScriptu</w:t>
+      </w:r>
+      <w:proofErr w:type="spellEnd"/>
+      <w:r>
+        <w:t xml:space="preserve"> pro tento projekt byla přirozená, protože Angular je </w:t>
+      </w:r>
+      <w:proofErr w:type="spellStart"/>
+      <w:r>
+        <w:t>oficálně</w:t>
+      </w:r>
+      <w:proofErr w:type="spellEnd"/>
+      <w:r>
+        <w:t xml:space="preserve"> postaven na </w:t>
+      </w:r>
+      <w:proofErr w:type="spellStart"/>
+      <w:r>
+        <w:t>TypeScriptu</w:t>
+      </w:r>
+      <w:proofErr w:type="spellEnd"/>
+      <w:r>
+        <w:t xml:space="preserve"> a všechny jeho klíčové funkce (</w:t>
+      </w:r>
+      <w:proofErr w:type="spellStart"/>
+      <w:r>
+        <w:t>dependency</w:t>
+      </w:r>
+      <w:proofErr w:type="spellEnd"/>
       <w:r>
         <w:t xml:space="preserve"> </w:t>
       </w:r>
-      <w:r>
-        <w:t>a hlavně jednodušší na případné úpravy, protože změny v datové logice nezasáhnou tolik UI a naopak.</w:t>
+      <w:proofErr w:type="spellStart"/>
+      <w:r>
+        <w:t>injection</w:t>
+      </w:r>
+      <w:proofErr w:type="spellEnd"/>
+      <w:r>
+        <w:t xml:space="preserve">, </w:t>
+      </w:r>
+      <w:proofErr w:type="spellStart"/>
+      <w:r>
+        <w:t>dekorátory</w:t>
+      </w:r>
+      <w:proofErr w:type="spellEnd"/>
+      <w:r>
+        <w:t>, typy) jsou optimalizovány právě pro tento jazyk. Díky tomu lze plně využít všech výhod, které Angular nabízí.</w:t>
       </w:r>
     </w:p>
     <w:p>
@@ -5670,358 +5984,340 @@
         <w:pStyle w:val="Nadpis3"/>
       </w:pPr>
       <w:r>
-        <w:t>Angular CLI</w:t>
-      </w:r>
-    </w:p>
-    <w:p>
-      <w:r>
-        <w:t>Při vývoji jsem hodně využíval Angular CLI. To je příkazový nástroj, který Angular poskytuje a který pomáhá zautomatizovat několik činností. Například se pomocí něj dají generovat nové komponenty, služby nebo další části projektu. Také se přes něj spouští vývojový server v</w:t>
-      </w:r>
-      <w:r>
-        <w:t> </w:t>
-      </w:r>
-      <w:proofErr w:type="spellStart"/>
-      <w:r>
-        <w:t>localhost</w:t>
-      </w:r>
-      <w:r>
-        <w:t>u</w:t>
-      </w:r>
-      <w:proofErr w:type="spellEnd"/>
-      <w:r>
-        <w:t xml:space="preserve"> na </w:t>
-      </w:r>
-      <w:proofErr w:type="spellStart"/>
-      <w:r>
-        <w:t>protu</w:t>
-      </w:r>
-      <w:proofErr w:type="spellEnd"/>
-      <w:r>
-        <w:t xml:space="preserve"> 4200</w:t>
+        <w:lastRenderedPageBreak/>
+        <w:t>Statické typování</w:t>
+      </w:r>
+    </w:p>
+    <w:p>
+      <w:r>
+        <w:t xml:space="preserve">Jednou z hlavních výhod </w:t>
+      </w:r>
+      <w:proofErr w:type="spellStart"/>
+      <w:r>
+        <w:t>TypeScriptu</w:t>
+      </w:r>
+      <w:proofErr w:type="spellEnd"/>
+      <w:r>
+        <w:t xml:space="preserve"> je statické typování. V </w:t>
+      </w:r>
+      <w:proofErr w:type="spellStart"/>
+      <w:r>
+        <w:t>JavaScriptu</w:t>
+      </w:r>
+      <w:proofErr w:type="spellEnd"/>
+      <w:r>
+        <w:t xml:space="preserve"> by se typ proměnné mohl změnit kdykoliv, což může vést k obtížně odhalitelným chybám. V </w:t>
+      </w:r>
+      <w:proofErr w:type="spellStart"/>
+      <w:r>
+        <w:t>TypeScriptu</w:t>
+      </w:r>
+      <w:proofErr w:type="spellEnd"/>
+      <w:r>
+        <w:t xml:space="preserve"> se typ definuje při deklaraci a kompilátor kontroluje, zda se typ používá správně.</w:t>
+      </w:r>
+    </w:p>
+    <w:p>
+      <w:r>
+        <w:t>V Habit-Trackeru jsem vytvořil rozhraní (</w:t>
+      </w:r>
+      <w:proofErr w:type="spellStart"/>
+      <w:r>
+        <w:t>interfaces</w:t>
+      </w:r>
+      <w:proofErr w:type="spellEnd"/>
+      <w:r>
+        <w:t>) pro objekty návyků. Například rozhraní Habit definuje všechny vlastnosti, které návyk obsahuje</w:t>
       </w:r>
       <w:r>
         <w:t>.</w:t>
       </w:r>
+    </w:p>
+    <w:p>
+      <w:r>
+        <w:t>Díky tomu je už při psaní kódu jasné, jaké vlastnosti má objekt, a editor může poskytovat lepší návrhy (</w:t>
+      </w:r>
+      <w:proofErr w:type="spellStart"/>
+      <w:r>
+        <w:t>autocomplete</w:t>
+      </w:r>
+      <w:proofErr w:type="spellEnd"/>
+      <w:r>
+        <w:t>). Chyby se odhalují během vývoje, ne až když aplikace běží.</w:t>
+      </w:r>
+    </w:p>
+    <w:p>
+      <w:pPr>
+        <w:pStyle w:val="Nadpis3"/>
+      </w:pPr>
+      <w:proofErr w:type="spellStart"/>
+      <w:r>
+        <w:t>Interfaces</w:t>
+      </w:r>
+      <w:proofErr w:type="spellEnd"/>
+      <w:r>
+        <w:t xml:space="preserve"> a typy</w:t>
+      </w:r>
+    </w:p>
+    <w:p>
+      <w:proofErr w:type="spellStart"/>
+      <w:r>
+        <w:t>Interfaces</w:t>
+      </w:r>
+      <w:proofErr w:type="spellEnd"/>
+      <w:r>
+        <w:t xml:space="preserve"> v </w:t>
+      </w:r>
+      <w:proofErr w:type="spellStart"/>
+      <w:r>
+        <w:t>TypeScriptu</w:t>
+      </w:r>
+      <w:proofErr w:type="spellEnd"/>
+      <w:r>
+        <w:t xml:space="preserve"> slouží </w:t>
+      </w:r>
+      <w:proofErr w:type="gramStart"/>
+      <w:r>
+        <w:t xml:space="preserve">pro </w:t>
+      </w:r>
+      <w:r>
+        <w:t xml:space="preserve"> definování</w:t>
+      </w:r>
+      <w:proofErr w:type="gramEnd"/>
+      <w:r>
+        <w:t xml:space="preserve"> struktury objektů. V projektu jsem definoval interface pro Habit Tento interface zajišťuje, že všechny návyky v aplikaci mají konzistentní strukturu a jsou správně typované.</w:t>
+      </w:r>
+    </w:p>
+    <w:p>
+      <w:r>
+        <w:t xml:space="preserve">Tímto způsobem je zajištěno, že všechny návyky v aplikaci mají konzistentní strukturu. Pokud by se někdo pokusil přidat návyk bez některého z těchto polí, </w:t>
+      </w:r>
+      <w:proofErr w:type="spellStart"/>
+      <w:r>
+        <w:t>TypeScript</w:t>
+      </w:r>
+      <w:proofErr w:type="spellEnd"/>
+      <w:r>
+        <w:t xml:space="preserve"> by to označil jako chybu. </w:t>
+      </w:r>
+      <w:proofErr w:type="spellStart"/>
+      <w:r>
+        <w:t>Interfaces</w:t>
+      </w:r>
+      <w:proofErr w:type="spellEnd"/>
+      <w:r>
+        <w:t xml:space="preserve"> také zlepšují čitelnost kódu, protože vývojář hned vidí, jaké data komponenta očekává.</w:t>
+      </w:r>
+    </w:p>
+    <w:p>
+      <w:pPr>
+        <w:pStyle w:val="Nadpis3"/>
+      </w:pPr>
+      <w:proofErr w:type="spellStart"/>
+      <w:r>
+        <w:t>Dekorátory</w:t>
+      </w:r>
+      <w:proofErr w:type="spellEnd"/>
+      <w:r>
+        <w:t xml:space="preserve"> a metadata</w:t>
+      </w:r>
+    </w:p>
+    <w:p>
+      <w:proofErr w:type="spellStart"/>
+      <w:r>
+        <w:t>TypeScript</w:t>
+      </w:r>
+      <w:proofErr w:type="spellEnd"/>
+      <w:r>
+        <w:t xml:space="preserve"> podporuje </w:t>
+      </w:r>
+      <w:proofErr w:type="spellStart"/>
+      <w:r>
+        <w:t>dekorátory</w:t>
+      </w:r>
+      <w:proofErr w:type="spellEnd"/>
+      <w:r>
+        <w:t xml:space="preserve">, což jsou speciální funkce, které mění chování tříd, metod nebo vlastností. Angular intenzivně používá </w:t>
+      </w:r>
+      <w:proofErr w:type="spellStart"/>
+      <w:r>
+        <w:t>dekorátory</w:t>
+      </w:r>
+      <w:proofErr w:type="spellEnd"/>
+      <w:r>
+        <w:t xml:space="preserve"> jako @Component, @Injectable, @Input, @Input, @Output. Tyto </w:t>
+      </w:r>
+      <w:proofErr w:type="spellStart"/>
+      <w:r>
+        <w:t>dekorátory</w:t>
+      </w:r>
+      <w:proofErr w:type="spellEnd"/>
+      <w:r>
+        <w:t xml:space="preserve"> poskytují metadata, která Angular používá k vytvoření a konfiguraci součástí aplikace.</w:t>
+      </w:r>
+    </w:p>
+    <w:p>
+      <w:r>
+        <w:t xml:space="preserve">Například </w:t>
+      </w:r>
+      <w:proofErr w:type="spellStart"/>
+      <w:r>
+        <w:t>dekorátor</w:t>
+      </w:r>
+      <w:proofErr w:type="spellEnd"/>
+      <w:r>
+        <w:t xml:space="preserve"> @Component definuje, že třída je komponenta, a specifikuje její šablonu, styly a selektor. </w:t>
+      </w:r>
+      <w:proofErr w:type="spellStart"/>
+      <w:r>
+        <w:t>Dekorátor</w:t>
+      </w:r>
+      <w:proofErr w:type="spellEnd"/>
+      <w:r>
+        <w:t xml:space="preserve"> @Injectable označuje, že třída je služba, kterou lze vložit do jiných tříd pomocí </w:t>
+      </w:r>
+      <w:proofErr w:type="spellStart"/>
+      <w:r>
+        <w:t>dependency</w:t>
+      </w:r>
+      <w:proofErr w:type="spellEnd"/>
       <w:r>
         <w:t xml:space="preserve"> </w:t>
       </w:r>
-      <w:r>
-        <w:t xml:space="preserve">Pro mě bylo Angular CLI </w:t>
-      </w:r>
+      <w:proofErr w:type="spellStart"/>
+      <w:r>
+        <w:t>injection</w:t>
+      </w:r>
+      <w:proofErr w:type="spellEnd"/>
+      <w:r>
+        <w:t xml:space="preserve">. Bez </w:t>
+      </w:r>
+      <w:proofErr w:type="spellStart"/>
+      <w:r>
+        <w:t>TypeScriptu</w:t>
+      </w:r>
+      <w:proofErr w:type="spellEnd"/>
+      <w:r>
+        <w:t xml:space="preserve"> by bylo obtížné používat tyto pokročilé funkce </w:t>
+      </w:r>
+      <w:proofErr w:type="spellStart"/>
+      <w:r>
+        <w:t>Angularu</w:t>
+      </w:r>
+      <w:proofErr w:type="spellEnd"/>
+      <w:r>
+        <w:t>.</w:t>
+      </w:r>
+    </w:p>
+    <w:p>
+      <w:pPr>
+        <w:pStyle w:val="Nadpis3"/>
+      </w:pPr>
+      <w:r>
+        <w:t>Generické typy</w:t>
+      </w:r>
+    </w:p>
+    <w:p>
+      <w:proofErr w:type="spellStart"/>
+      <w:r>
+        <w:t>TypeScript</w:t>
+      </w:r>
+      <w:proofErr w:type="spellEnd"/>
+      <w:r>
+        <w:t xml:space="preserve"> podporuje generické typy, které umožňují psát kód, který je flexibilní, ale zároveň typově bezpečný. V </w:t>
+      </w:r>
+      <w:proofErr w:type="spellStart"/>
+      <w:r>
+        <w:t>DataService</w:t>
+      </w:r>
+      <w:proofErr w:type="spellEnd"/>
+      <w:r>
+        <w:t xml:space="preserve"> jsem používal generické typy pro </w:t>
+      </w:r>
+      <w:proofErr w:type="spellStart"/>
+      <w:r>
+        <w:t>napříkad</w:t>
+      </w:r>
+      <w:proofErr w:type="spellEnd"/>
+      <w:r>
+        <w:t xml:space="preserve"> </w:t>
+      </w:r>
+      <w:proofErr w:type="spellStart"/>
+      <w:r>
+        <w:t>BehaviorSubject</w:t>
+      </w:r>
+      <w:proofErr w:type="spellEnd"/>
+      <w:r>
+        <w:t>.</w:t>
+      </w:r>
+      <w:r>
+        <w:t xml:space="preserve"> </w:t>
+      </w:r>
+      <w:r>
+        <w:t xml:space="preserve">Tímto způsobem je jasně vidět, že </w:t>
+      </w:r>
+      <w:proofErr w:type="spellStart"/>
+      <w:r>
+        <w:t>habitsSubject</w:t>
+      </w:r>
+      <w:proofErr w:type="spellEnd"/>
+      <w:r>
+        <w:t xml:space="preserve"> emituje pole návyků. Pokud by se někdo pokusil vložit něco jiného, </w:t>
+      </w:r>
+      <w:proofErr w:type="spellStart"/>
+      <w:r>
+        <w:t>TypeScript</w:t>
+      </w:r>
+      <w:proofErr w:type="spellEnd"/>
+      <w:r>
+        <w:t xml:space="preserve"> by to detekoval jako chybu. Generické typy jsou zvlášť užitečné při práci s </w:t>
+      </w:r>
+      <w:proofErr w:type="spellStart"/>
+      <w:r>
+        <w:t>observables</w:t>
+      </w:r>
+      <w:proofErr w:type="spellEnd"/>
+      <w:r>
+        <w:t xml:space="preserve"> a reaktivním programováním.</w:t>
+      </w:r>
+    </w:p>
+    <w:p>
+      <w:pPr>
+        <w:pStyle w:val="Nadpis2"/>
+      </w:pPr>
+      <w:r>
+        <w:t>Netlify</w:t>
+      </w:r>
+    </w:p>
+    <w:p>
+      <w:r>
+        <w:t>V minulosti mě vždycky zajímalo, jak dostat vytvořenou aplikaci na web, aby ji šlo reálně sdílet. Netlify je v tomhle ohledu jednoduchá a docela „student-</w:t>
+      </w:r>
+      <w:proofErr w:type="spellStart"/>
+      <w:r>
+        <w:t>friendly</w:t>
+      </w:r>
+      <w:proofErr w:type="spellEnd"/>
+      <w:r>
+        <w:t xml:space="preserve">“ platforma. Nabízí rychlé publikování bez toho, aby člověk musel řešit složitý </w:t>
+      </w:r>
+      <w:proofErr w:type="spellStart"/>
+      <w:r>
+        <w:t>backend</w:t>
+      </w:r>
+      <w:proofErr w:type="spellEnd"/>
+      <w:r>
+        <w:t xml:space="preserve"> nebo vlastní konfiguraci serveru.</w:t>
+      </w:r>
+    </w:p>
+    <w:p>
+      <w:r>
+        <w:t>Protože je Habit-Tracker single-page aplikace bez potřeby databáze, Netlify mi dává smysl. Aplikaci lze nasadit tak, že se build verze projektu publikují do produkce. Netlify sice umožňuje i použití databáze, ale v mém případě jsem ji zatím nepotřeboval – data si totiž aplikace ukládá lokálně v prohlížeči. Díky tomu je nasazení jednodušší a celý projekt je soustředěný spíš na samotnou funkcionalitu UI.</w:t>
+      </w:r>
+    </w:p>
+    <w:p>
       <w:r>
         <w:lastRenderedPageBreak/>
-        <w:t>důležité i kvůli času. Když člověk dělá ročníkovou práci, nechce ručně vytvářet strukturu pro každou komponentu. CLI mi to připravilo rychle a správně, takže jsem se mohl soustředit hlavně na vlastní funkčnost aplikace.</w:t>
-      </w:r>
-    </w:p>
-    <w:p/>
-    <w:p>
-      <w:pPr>
-        <w:pStyle w:val="Nadpis2"/>
-      </w:pPr>
-      <w:r>
-        <w:t>Angular Material</w:t>
-      </w:r>
-    </w:p>
-    <w:p>
-      <w:r>
-        <w:t xml:space="preserve">Aby měla aplikace co nejhezčí a profesionální </w:t>
-      </w:r>
-      <w:proofErr w:type="gramStart"/>
-      <w:r>
-        <w:t>vzhled</w:t>
-      </w:r>
-      <w:proofErr w:type="gramEnd"/>
-      <w:r>
-        <w:t xml:space="preserve"> a hlavně byla příjemná pro uživatele, rozhodl jsem se použít Angular Material. Je to knihovna komponent, které jsou navržené podle principů Material Designu od Googlu. Díky tomu aplikace nepůsobí „nesourodě“ – komponenty mají podobný styl, chování i vizuální konzistenci.</w:t>
-      </w:r>
-      <w:r>
-        <w:t xml:space="preserve"> </w:t>
-      </w:r>
-      <w:r>
-        <w:t>Z hlediska ročníkové práce mi Angular Material také ušetřil spoustu času. Nemusel jsem navrhovat všechno od nuly (což by bylo zbytečně těžké a pomalé), ale mohl jsem se soustředit na samotnou logiku Habit-Trackeru. Vzhled se navíc dal postupně doladit pomocí SCSS tak, aby seděl do mé barevné schématu.</w:t>
-      </w:r>
-    </w:p>
-    <w:p>
-      <w:pPr>
-        <w:pStyle w:val="Nadpis3"/>
-      </w:pPr>
-      <w:r>
-        <w:t>Karty a panely</w:t>
-      </w:r>
-    </w:p>
-    <w:p>
-      <w:r>
-        <w:t xml:space="preserve">Pro hlavní stránku jsou klíčové komponenty </w:t>
-      </w:r>
-      <w:proofErr w:type="spellStart"/>
-      <w:r>
-        <w:t>MatCard</w:t>
-      </w:r>
-      <w:proofErr w:type="spellEnd"/>
-      <w:r>
-        <w:t xml:space="preserve"> a </w:t>
-      </w:r>
-      <w:proofErr w:type="spellStart"/>
-      <w:r>
-        <w:t>MatTabs</w:t>
-      </w:r>
-      <w:proofErr w:type="spellEnd"/>
-      <w:r>
-        <w:t xml:space="preserve">. </w:t>
-      </w:r>
-      <w:proofErr w:type="spellStart"/>
-      <w:r>
-        <w:t>MatCard</w:t>
-      </w:r>
-      <w:proofErr w:type="spellEnd"/>
-      <w:r>
-        <w:t xml:space="preserve"> používám tam, kde chci mít návyky zobrazené v ucelených „kartách“ – uživatel pak hned vidí strukturu a nemusí se v obsahu ztrácet. </w:t>
-      </w:r>
-      <w:proofErr w:type="spellStart"/>
-      <w:r>
-        <w:t>MatTabs</w:t>
-      </w:r>
-      <w:proofErr w:type="spellEnd"/>
-      <w:r>
-        <w:t xml:space="preserve"> zase řeší přepínání mezi dvěma kategoriemi návyků. V mém případě to jsou „dobré“ a „špatné“ návyky. Tento způsob přepínání je pro uživatele intuitivní, protože místo přesměrování nebo složitých filtrů jen přepne záložku a hned vidí relevantní obsah.</w:t>
-      </w:r>
-    </w:p>
-    <w:p>
-      <w:pPr>
-        <w:pStyle w:val="Nadpis3"/>
-      </w:pPr>
-      <w:r>
-        <w:t>Formulářové prvky a ikony</w:t>
-      </w:r>
-    </w:p>
-    <w:p>
-      <w:r>
-        <w:t xml:space="preserve">Pro zadávání názvu nového návyku a výběr barvy používám ovládací prvky </w:t>
-      </w:r>
-      <w:proofErr w:type="spellStart"/>
-      <w:r>
-        <w:t>MatFormField</w:t>
-      </w:r>
-      <w:proofErr w:type="spellEnd"/>
-      <w:r>
-        <w:t xml:space="preserve">. Tyhle prvky pomáhají držet formy přehledné a vizuálně jednotné. Dále jsem využil systém ikon přes komponentu </w:t>
-      </w:r>
-      <w:proofErr w:type="spellStart"/>
-      <w:r>
-        <w:t>MatIcon</w:t>
-      </w:r>
-      <w:proofErr w:type="spellEnd"/>
-      <w:r>
-        <w:t>. Ikony jsem použil jako vizuální doplněk k návykům, aby bylo možné návyky rychleji rozpoznat a aby vzhled aplikace nebyl jen „textový“, ale měl i jasné symboly. I když se to může zdát jako drobnost, v praxi to zvyšuje použitelnost a uživatelský komfort</w:t>
-      </w:r>
-    </w:p>
-    <w:p>
-      <w:pPr>
-        <w:pStyle w:val="Nadpis2"/>
-      </w:pPr>
-      <w:proofErr w:type="spellStart"/>
-      <w:r>
-        <w:t>Sass</w:t>
-      </w:r>
-      <w:proofErr w:type="spellEnd"/>
-      <w:r>
-        <w:t xml:space="preserve"> CSS (SCSS)</w:t>
-      </w:r>
-    </w:p>
-    <w:p>
-      <w:r>
-        <w:t xml:space="preserve">Původně jsem měl v plánu psát styly v LESS. V průběhu implementace Angular </w:t>
-      </w:r>
-      <w:proofErr w:type="spellStart"/>
-      <w:r>
-        <w:t>Materialu</w:t>
-      </w:r>
-      <w:proofErr w:type="spellEnd"/>
-      <w:r>
-        <w:t xml:space="preserve"> jsem ale přešel na SCSS. Rozhodnutí nebylo složité – Angular Material je postavený právě na </w:t>
-      </w:r>
-      <w:proofErr w:type="spellStart"/>
-      <w:r>
-        <w:t>Sass</w:t>
-      </w:r>
-      <w:proofErr w:type="spellEnd"/>
-      <w:r>
-        <w:t xml:space="preserve">, takže bylo logické držet se stejného </w:t>
-      </w:r>
-      <w:proofErr w:type="spellStart"/>
-      <w:r>
-        <w:t>stylovacího</w:t>
-      </w:r>
-      <w:proofErr w:type="spellEnd"/>
-      <w:r>
-        <w:t xml:space="preserve"> systému. Tím jsem chtěl dosáhnout plné </w:t>
-      </w:r>
-      <w:proofErr w:type="gramStart"/>
-      <w:r>
-        <w:t>kompatibility</w:t>
-      </w:r>
-      <w:proofErr w:type="gramEnd"/>
-      <w:r>
-        <w:t xml:space="preserve"> a hlavně konzistence stylů v celém projektu.</w:t>
-      </w:r>
-    </w:p>
-    <w:p>
-      <w:r>
-        <w:t xml:space="preserve">SCSS mi navíc umožňuje psát přehlednější CSS díky některým vlastnostem navíc oproti klasickému CSS. Například pracuji s proměnnými, umím vnořovat styly do logické struktury a používám </w:t>
-      </w:r>
-      <w:proofErr w:type="spellStart"/>
-      <w:r>
-        <w:t>mixiny</w:t>
-      </w:r>
-      <w:proofErr w:type="spellEnd"/>
-      <w:r>
-        <w:t xml:space="preserve">. Díky tomu se vyhnu zbytečnému opakování kódu a </w:t>
-      </w:r>
-      <w:proofErr w:type="spellStart"/>
-      <w:r>
-        <w:t>stylovací</w:t>
-      </w:r>
-      <w:proofErr w:type="spellEnd"/>
-      <w:r>
-        <w:t xml:space="preserve"> logika se dá lépe udržovat i do budoucna.</w:t>
-      </w:r>
-    </w:p>
-    <w:p>
-      <w:pPr>
-        <w:pStyle w:val="Nadpis3"/>
-      </w:pPr>
-      <w:proofErr w:type="spellStart"/>
-      <w:r>
-        <w:t>Variables</w:t>
-      </w:r>
-      <w:proofErr w:type="spellEnd"/>
-    </w:p>
-    <w:p>
-      <w:r>
-        <w:t xml:space="preserve">V SCSS používám </w:t>
-      </w:r>
-      <w:proofErr w:type="spellStart"/>
-      <w:r>
-        <w:t>variables</w:t>
-      </w:r>
-      <w:proofErr w:type="spellEnd"/>
-      <w:r>
-        <w:t xml:space="preserve"> pro centrální definici barev a typografie. V souboru se globálními styly mám nastavené barvy pro pozitivní a negativní návyky, ale také základní barvy, které se používají napříč aplikací. </w:t>
-      </w:r>
-      <w:r>
-        <w:lastRenderedPageBreak/>
-        <w:t>Výhoda je, že když bych chtěl změnit barevné schéma, nemusím procházet celý projekt a hledat všechny konkrétní barvy. Stačí upravit proměnné na jednom místě, a úprava se projeví všude.</w:t>
-      </w:r>
-    </w:p>
-    <w:p>
-      <w:pPr>
-        <w:pStyle w:val="Nadpis3"/>
-      </w:pPr>
-      <w:proofErr w:type="spellStart"/>
-      <w:r>
-        <w:t>Nesting</w:t>
-      </w:r>
-      <w:proofErr w:type="spellEnd"/>
-    </w:p>
-    <w:p>
-      <w:proofErr w:type="spellStart"/>
-      <w:r>
-        <w:t>Nesting</w:t>
-      </w:r>
-      <w:proofErr w:type="spellEnd"/>
-      <w:r>
-        <w:t xml:space="preserve"> (vnořování) využívám hlavně pro čitelnost. Kód se pak podobá struktuře HTML. To mi pomáhá při ladění, protože vidím, že styl patří právě k danému prvku nebo komponentě. Například když </w:t>
-      </w:r>
-      <w:proofErr w:type="gramStart"/>
-      <w:r>
-        <w:t>upravuju</w:t>
-      </w:r>
-      <w:proofErr w:type="gramEnd"/>
-      <w:r>
-        <w:t xml:space="preserve"> vzhled tlačítka v kartách návyků, je jasné, kam daný blok stylu patří, a nemusím zbytečně hledat v dlouhém CSS souboru.</w:t>
-      </w:r>
-    </w:p>
-    <w:p>
-      <w:pPr>
-        <w:pStyle w:val="Nadpis3"/>
-      </w:pPr>
-      <w:proofErr w:type="spellStart"/>
-      <w:r>
-        <w:t>Mixins</w:t>
-      </w:r>
-      <w:proofErr w:type="spellEnd"/>
-    </w:p>
-    <w:p>
-      <w:proofErr w:type="spellStart"/>
-      <w:r>
-        <w:t>Mixins</w:t>
-      </w:r>
-      <w:proofErr w:type="spellEnd"/>
-      <w:r>
-        <w:t xml:space="preserve"> používám v momentě, kdy se v projektu objevují podobné opakující se vizuální efekty. V Habit-Trackeru se to projevilo třeba u stínů karet (box-shadow) nebo u responzivních bodů (media queries). </w:t>
-      </w:r>
-      <w:proofErr w:type="spellStart"/>
-      <w:r>
-        <w:t>Mixiny</w:t>
-      </w:r>
-      <w:proofErr w:type="spellEnd"/>
-      <w:r>
-        <w:t xml:space="preserve"> mi pomáhají zachovat vizuální konzistenci napříč aplikací a zároveň snižují množství opakovaného kódu. Když se pak něco rozhodnu změnit, upravím </w:t>
-      </w:r>
-      <w:proofErr w:type="spellStart"/>
-      <w:r>
-        <w:t>mixin</w:t>
-      </w:r>
-      <w:proofErr w:type="spellEnd"/>
-      <w:r>
-        <w:t xml:space="preserve"> a změna se projeví ve všech místech, kde se </w:t>
-      </w:r>
-      <w:proofErr w:type="spellStart"/>
-      <w:r>
-        <w:t>mixin</w:t>
-      </w:r>
-      <w:proofErr w:type="spellEnd"/>
-      <w:r>
-        <w:t xml:space="preserve"> používá.</w:t>
-      </w:r>
-    </w:p>
-    <w:p/>
-    <w:p>
-      <w:pPr>
-        <w:pStyle w:val="Nadpis2"/>
-      </w:pPr>
-      <w:r>
-        <w:t>Netlify</w:t>
-      </w:r>
-    </w:p>
-    <w:p>
-      <w:r>
-        <w:t>V minulosti mě vždycky zajímalo, jak dostat vytvořenou aplikaci na web, aby ji šlo reálně sdílet. Netlify je v tomhle ohledu jednoduchá a docela „student-</w:t>
-      </w:r>
-      <w:proofErr w:type="spellStart"/>
-      <w:r>
-        <w:t>friendly</w:t>
-      </w:r>
-      <w:proofErr w:type="spellEnd"/>
-      <w:r>
-        <w:t xml:space="preserve">“ platforma. Nabízí rychlé publikování bez toho, aby člověk musel řešit složitý </w:t>
-      </w:r>
-      <w:proofErr w:type="spellStart"/>
-      <w:r>
-        <w:t>backend</w:t>
-      </w:r>
-      <w:proofErr w:type="spellEnd"/>
-      <w:r>
-        <w:t xml:space="preserve"> nebo vlastní konfiguraci serveru.</w:t>
-      </w:r>
-    </w:p>
-    <w:p>
-      <w:r>
-        <w:t>Protože je Habit-Tracker single-page aplikace bez potřeby databáze, Netlify mi dává smysl. Aplikaci lze nasadit tak, že se build verze projektu publikují do produkce. Netlify sice umožňuje i použití databáze, ale v mém případě jsem ji zatím nepotřeboval – data si totiž aplikace ukládá lokálně v prohlížeči. Díky tomu je nasazení jednodušší a celý projekt je soustředěný spíš na samotnou funkcionalitu UI.</w:t>
-      </w:r>
-    </w:p>
-    <w:p>
-      <w:r>
         <w:br w:type="page"/>
       </w:r>
     </w:p>
@@ -6072,40 +6368,335 @@
     <w:p>
       <w:bookmarkStart w:id="34" w:name="_Toc226556245"/>
       <w:r>
-        <w:t>V aplikaci je datová vrstva postavená na jednoduchém modelu návyků. Základní datová struktura Habit obsahuje informace potřebné pro zobrazení v UI a pro výpočet/uchování historie plnění. Každý návyk má identifikátor (id), název (</w:t>
-      </w:r>
-      <w:proofErr w:type="spellStart"/>
-      <w:r>
-        <w:t>name</w:t>
-      </w:r>
-      <w:proofErr w:type="spellEnd"/>
-      <w:r>
-        <w:t>), popis (</w:t>
-      </w:r>
-      <w:proofErr w:type="spellStart"/>
-      <w:r>
-        <w:t>description</w:t>
-      </w:r>
-      <w:proofErr w:type="spellEnd"/>
-      <w:r>
-        <w:t>), typ (type – rozlišuje „dobrý“ a „špatný“ návyk) a také proměnné pro sledování pokroku v čase (</w:t>
-      </w:r>
-      <w:proofErr w:type="spellStart"/>
-      <w:r>
-        <w:t>history</w:t>
-      </w:r>
-      <w:proofErr w:type="spellEnd"/>
-      <w:r>
-        <w:t xml:space="preserve"> – historie splnění a hodnota pro průběžné počítání řetězce plnění) a aktuální délku denní řády(</w:t>
-      </w:r>
-      <w:proofErr w:type="spellStart"/>
-      <w:r>
-        <w:t>streak</w:t>
-      </w:r>
-      <w:proofErr w:type="spellEnd"/>
-      <w:r>
-        <w:t>).</w:t>
-      </w:r>
+        <w:t xml:space="preserve">V aplikaci je datová vrstva postavená na jednoduchém modelu návyků. Základní datová struktura Habit obsahuje informace potřebné pro zobrazení v UI a pro výpočet/uchování historie plnění. Každý návyk má </w:t>
+      </w:r>
+      <w:r>
+        <w:t>následující vlastnosti:</w:t>
+      </w:r>
+    </w:p>
+    <w:tbl>
+      <w:tblPr>
+        <w:tblStyle w:val="Mkatabulky"/>
+        <w:tblW w:w="0" w:type="auto"/>
+        <w:tblLook w:val="04A0" w:firstRow="1" w:lastRow="0" w:firstColumn="1" w:lastColumn="0" w:noHBand="0" w:noVBand="1"/>
+      </w:tblPr>
+      <w:tblGrid>
+        <w:gridCol w:w="3209"/>
+        <w:gridCol w:w="3209"/>
+        <w:gridCol w:w="3210"/>
+      </w:tblGrid>
+      <w:tr>
+        <w:tc>
+          <w:tcPr>
+            <w:tcW w:w="3209" w:type="dxa"/>
+          </w:tcPr>
+          <w:p>
+            <w:r>
+              <w:t>Název</w:t>
+            </w:r>
+          </w:p>
+        </w:tc>
+        <w:tc>
+          <w:tcPr>
+            <w:tcW w:w="3209" w:type="dxa"/>
+          </w:tcPr>
+          <w:p>
+            <w:r>
+              <w:t>Typ</w:t>
+            </w:r>
+          </w:p>
+        </w:tc>
+        <w:tc>
+          <w:tcPr>
+            <w:tcW w:w="3210" w:type="dxa"/>
+          </w:tcPr>
+          <w:p>
+            <w:r>
+              <w:t>Účel</w:t>
+            </w:r>
+          </w:p>
+        </w:tc>
+      </w:tr>
+      <w:tr>
+        <w:tc>
+          <w:tcPr>
+            <w:tcW w:w="3209" w:type="dxa"/>
+          </w:tcPr>
+          <w:p>
+            <w:r>
+              <w:t>ID</w:t>
+            </w:r>
+          </w:p>
+        </w:tc>
+        <w:tc>
+          <w:tcPr>
+            <w:tcW w:w="3209" w:type="dxa"/>
+          </w:tcPr>
+          <w:p>
+            <w:proofErr w:type="spellStart"/>
+            <w:r>
+              <w:t>String</w:t>
+            </w:r>
+            <w:proofErr w:type="spellEnd"/>
+          </w:p>
+        </w:tc>
+        <w:tc>
+          <w:tcPr>
+            <w:tcW w:w="3210" w:type="dxa"/>
+          </w:tcPr>
+          <w:p>
+            <w:r>
+              <w:t xml:space="preserve">Unikátní identifikátor každého </w:t>
+            </w:r>
+            <w:r>
+              <w:t>habitu pro přesné určení habitu, se kterým pracuje</w:t>
+            </w:r>
+          </w:p>
+        </w:tc>
+      </w:tr>
+      <w:tr>
+        <w:tc>
+          <w:tcPr>
+            <w:tcW w:w="3209" w:type="dxa"/>
+          </w:tcPr>
+          <w:p>
+            <w:r>
+              <w:t>NAME</w:t>
+            </w:r>
+          </w:p>
+        </w:tc>
+        <w:tc>
+          <w:tcPr>
+            <w:tcW w:w="3209" w:type="dxa"/>
+          </w:tcPr>
+          <w:p>
+            <w:proofErr w:type="spellStart"/>
+            <w:r>
+              <w:t>String</w:t>
+            </w:r>
+            <w:proofErr w:type="spellEnd"/>
+          </w:p>
+        </w:tc>
+        <w:tc>
+          <w:tcPr>
+            <w:tcW w:w="3210" w:type="dxa"/>
+          </w:tcPr>
+          <w:p>
+            <w:r>
+              <w:t>Uživatelem definované pojmenování habitu</w:t>
+            </w:r>
+          </w:p>
+        </w:tc>
+      </w:tr>
+      <w:tr>
+        <w:tc>
+          <w:tcPr>
+            <w:tcW w:w="3209" w:type="dxa"/>
+          </w:tcPr>
+          <w:p>
+            <w:r>
+              <w:t>DESCRIPTION</w:t>
+            </w:r>
+          </w:p>
+        </w:tc>
+        <w:tc>
+          <w:tcPr>
+            <w:tcW w:w="3209" w:type="dxa"/>
+          </w:tcPr>
+          <w:p>
+            <w:proofErr w:type="spellStart"/>
+            <w:r>
+              <w:t>String</w:t>
+            </w:r>
+            <w:proofErr w:type="spellEnd"/>
+          </w:p>
+        </w:tc>
+        <w:tc>
+          <w:tcPr>
+            <w:tcW w:w="3210" w:type="dxa"/>
+          </w:tcPr>
+          <w:p>
+            <w:r>
+              <w:t>Uživatelem zadaný popis daného habitu</w:t>
+            </w:r>
+          </w:p>
+        </w:tc>
+      </w:tr>
+      <w:tr>
+        <w:tc>
+          <w:tcPr>
+            <w:tcW w:w="3209" w:type="dxa"/>
+          </w:tcPr>
+          <w:p>
+            <w:r>
+              <w:t>TYPE</w:t>
+            </w:r>
+          </w:p>
+        </w:tc>
+        <w:tc>
+          <w:tcPr>
+            <w:tcW w:w="3209" w:type="dxa"/>
+          </w:tcPr>
+          <w:p>
+            <w:proofErr w:type="spellStart"/>
+            <w:r>
+              <w:t>HabitType</w:t>
+            </w:r>
+            <w:proofErr w:type="spellEnd"/>
+            <w:r>
+              <w:t xml:space="preserve"> neboli „positive“ || „negative“</w:t>
+            </w:r>
+          </w:p>
+        </w:tc>
+        <w:tc>
+          <w:tcPr>
+            <w:tcW w:w="3210" w:type="dxa"/>
+          </w:tcPr>
+          <w:p>
+            <w:proofErr w:type="gramStart"/>
+            <w:r>
+              <w:t>U</w:t>
+            </w:r>
+            <w:r>
+              <w:t>kazatel</w:t>
+            </w:r>
+            <w:proofErr w:type="gramEnd"/>
+            <w:r>
+              <w:t xml:space="preserve"> zda daný habit náleží skupině kladné nebo špatné</w:t>
+            </w:r>
+          </w:p>
+        </w:tc>
+      </w:tr>
+      <w:tr>
+        <w:tc>
+          <w:tcPr>
+            <w:tcW w:w="3209" w:type="dxa"/>
+          </w:tcPr>
+          <w:p>
+            <w:r>
+              <w:t>HISTORY</w:t>
+            </w:r>
+          </w:p>
+        </w:tc>
+        <w:tc>
+          <w:tcPr>
+            <w:tcW w:w="3209" w:type="dxa"/>
+          </w:tcPr>
+          <w:p>
+            <w:proofErr w:type="spellStart"/>
+            <w:proofErr w:type="gramStart"/>
+            <w:r>
+              <w:t>Array</w:t>
+            </w:r>
+            <w:proofErr w:type="spellEnd"/>
+            <w:r>
+              <w:t>&lt;</w:t>
+            </w:r>
+            <w:proofErr w:type="spellStart"/>
+            <w:proofErr w:type="gramEnd"/>
+            <w:r>
+              <w:t>Date</w:t>
+            </w:r>
+            <w:proofErr w:type="spellEnd"/>
+            <w:r>
+              <w:t>&gt;</w:t>
+            </w:r>
+          </w:p>
+        </w:tc>
+        <w:tc>
+          <w:tcPr>
+            <w:tcW w:w="3210" w:type="dxa"/>
+          </w:tcPr>
+          <w:p>
+            <w:r>
+              <w:t>Udržuje v sobě data, kdy byl daný habit „splněn“ uživatelem</w:t>
+            </w:r>
+          </w:p>
+        </w:tc>
+      </w:tr>
+      <w:tr>
+        <w:tc>
+          <w:tcPr>
+            <w:tcW w:w="3209" w:type="dxa"/>
+          </w:tcPr>
+          <w:p>
+            <w:r>
+              <w:t>STREAK</w:t>
+            </w:r>
+          </w:p>
+        </w:tc>
+        <w:tc>
+          <w:tcPr>
+            <w:tcW w:w="3209" w:type="dxa"/>
+          </w:tcPr>
+          <w:p>
+            <w:proofErr w:type="spellStart"/>
+            <w:r>
+              <w:t>Number</w:t>
+            </w:r>
+            <w:proofErr w:type="spellEnd"/>
+            <w:r>
+              <w:t xml:space="preserve"> (</w:t>
+            </w:r>
+            <w:r>
+              <w:t xml:space="preserve">přesněji </w:t>
+            </w:r>
+            <w:proofErr w:type="spellStart"/>
+            <w:r>
+              <w:t>Integer</w:t>
+            </w:r>
+            <w:proofErr w:type="spellEnd"/>
+            <w:r>
+              <w:t>)</w:t>
+            </w:r>
+          </w:p>
+        </w:tc>
+        <w:tc>
+          <w:tcPr>
+            <w:tcW w:w="3210" w:type="dxa"/>
+          </w:tcPr>
+          <w:p>
+            <w:pPr>
+              <w:keepNext/>
+            </w:pPr>
+            <w:r>
+              <w:t>Je roven velikosti podmnožiny HISTORY, která začíná aktuálním datumem a končí posledním datumem v řadě po sobě bez jediné mezery</w:t>
+            </w:r>
+          </w:p>
+        </w:tc>
+      </w:tr>
+    </w:tbl>
+    <w:p>
+      <w:pPr>
+        <w:pStyle w:val="Titulek"/>
+        <w:jc w:val="left"/>
+      </w:pPr>
+      <w:bookmarkStart w:id="35" w:name="_Toc230173683"/>
+      <w:r>
+        <w:t xml:space="preserve">Tabulka </w:t>
+      </w:r>
+      <w:r>
+        <w:fldChar w:fldCharType="begin"/>
+      </w:r>
+      <w:r>
+        <w:instrText xml:space="preserve"> SEQ Tabulka \* ARABIC </w:instrText>
+      </w:r>
+      <w:r>
+        <w:fldChar w:fldCharType="separate"/>
+      </w:r>
+      <w:r>
+        <w:rPr>
+          <w:noProof/>
+        </w:rPr>
+        <w:t>1</w:t>
+      </w:r>
+      <w:r>
+        <w:fldChar w:fldCharType="end"/>
+      </w:r>
+      <w:r>
+        <w:t>: Vlastnosti rozhraní Habit</w:t>
+      </w:r>
+      <w:bookmarkEnd w:id="35"/>
     </w:p>
     <w:p>
       <w:r>
@@ -6192,6 +6783,7 @@
     </w:p>
     <w:p>
       <w:r>
+        <w:lastRenderedPageBreak/>
         <w:t xml:space="preserve">Tímto způsobem je logika práce s daty oddělena od komponent (UI). Komponenty pouze zobrazují data a vyvolávají události (přidání/mazání/aktualizace), zatímco servis zodpovídá za konzistenci a ukládání. Aplikace tedy funguje bez </w:t>
       </w:r>
       <w:proofErr w:type="spellStart"/>
@@ -6213,7 +6805,7 @@
       <w:bookmarkEnd w:id="34"/>
     </w:p>
     <w:p>
-      <w:bookmarkStart w:id="35" w:name="_Toc226556246"/>
+      <w:bookmarkStart w:id="36" w:name="_Toc226556246"/>
       <w:r>
         <w:t xml:space="preserve">Uživatelské rozhraní jsem postavil jako jednostránková aplikace ve frameworku Angular. Základní struktura aplikace se nachází v </w:t>
       </w:r>
@@ -6420,7 +7012,6 @@
         <w:rPr>
           <w:rFonts w:eastAsiaTheme="minorHAnsi"/>
         </w:rPr>
-        <w:lastRenderedPageBreak/>
         <w:t xml:space="preserve">Export </w:t>
       </w:r>
       <w:proofErr w:type="spellStart"/>
@@ -6538,12 +7129,86 @@
     </w:p>
     <w:p>
       <w:pPr>
+        <w:keepNext/>
+      </w:pPr>
+      <w:r>
+        <w:lastRenderedPageBreak/>
+        <w:drawing>
+          <wp:inline distT="0" distB="0" distL="0" distR="0" wp14:anchorId="64F11A53" wp14:editId="1C8A4C54">
+            <wp:extent cx="6120130" cy="3171825"/>
+            <wp:effectExtent l="0" t="0" r="0" b="9525"/>
+            <wp:docPr id="879316593" name="Obrázek 1"/>
+            <wp:cNvGraphicFramePr>
+              <a:graphicFrameLocks xmlns:a="http://schemas.openxmlformats.org/drawingml/2006/main" noChangeAspect="1"/>
+            </wp:cNvGraphicFramePr>
+            <a:graphic xmlns:a="http://schemas.openxmlformats.org/drawingml/2006/main">
+              <a:graphicData uri="http://schemas.openxmlformats.org/drawingml/2006/picture">
+                <pic:pic xmlns:pic="http://schemas.openxmlformats.org/drawingml/2006/picture">
+                  <pic:nvPicPr>
+                    <pic:cNvPr id="879316593" name=""/>
+                    <pic:cNvPicPr/>
+                  </pic:nvPicPr>
+                  <pic:blipFill>
+                    <a:blip r:embed="rId14"/>
+                    <a:stretch>
+                      <a:fillRect/>
+                    </a:stretch>
+                  </pic:blipFill>
+                  <pic:spPr>
+                    <a:xfrm>
+                      <a:off x="0" y="0"/>
+                      <a:ext cx="6120130" cy="3171825"/>
+                    </a:xfrm>
+                    <a:prstGeom prst="rect">
+                      <a:avLst/>
+                    </a:prstGeom>
+                  </pic:spPr>
+                </pic:pic>
+              </a:graphicData>
+            </a:graphic>
+          </wp:inline>
+        </w:drawing>
+      </w:r>
+    </w:p>
+    <w:p>
+      <w:pPr>
+        <w:pStyle w:val="Titulek"/>
+      </w:pPr>
+      <w:bookmarkStart w:id="37" w:name="_Toc230174422"/>
+      <w:r>
+        <w:t xml:space="preserve">Obrázek </w:t>
+      </w:r>
+      <w:r>
+        <w:fldChar w:fldCharType="begin"/>
+      </w:r>
+      <w:r>
+        <w:instrText xml:space="preserve"> SEQ Obrázek \* ARABIC </w:instrText>
+      </w:r>
+      <w:r>
+        <w:fldChar w:fldCharType="separate"/>
+      </w:r>
+      <w:r>
+        <w:rPr>
+          <w:noProof/>
+        </w:rPr>
+        <w:t>1</w:t>
+      </w:r>
+      <w:r>
+        <w:fldChar w:fldCharType="end"/>
+      </w:r>
+      <w:r>
+        <w:t>: Hlavní UI</w:t>
+      </w:r>
+      <w:bookmarkEnd w:id="37"/>
+    </w:p>
+    <w:p>
+      <w:pPr>
         <w:pStyle w:val="Nadpis2"/>
       </w:pPr>
       <w:r>
         <w:t>Formulář pro vytváření nových návyků</w:t>
       </w:r>
-      <w:bookmarkEnd w:id="35"/>
+      <w:bookmarkEnd w:id="36"/>
     </w:p>
     <w:p>
       <w:r>
@@ -6695,6 +7360,7 @@
         <w:pStyle w:val="Odrkovseznam"/>
       </w:pPr>
       <w:r>
+        <w:lastRenderedPageBreak/>
         <w:t xml:space="preserve">vytvoří nový záznam návyku v </w:t>
       </w:r>
       <w:proofErr w:type="spellStart"/>
@@ -6733,197 +7399,338 @@
       </w:r>
     </w:p>
     <w:p>
+      <w:pPr>
+        <w:keepNext/>
+      </w:pPr>
+      <w:r>
+        <w:rPr>
+          <w:noProof/>
+        </w:rPr>
+        <w:drawing>
+          <wp:inline distT="0" distB="0" distL="0" distR="0" wp14:anchorId="126FC2F7" wp14:editId="26E59146">
+            <wp:extent cx="3296285" cy="4144010"/>
+            <wp:effectExtent l="0" t="0" r="0" b="8890"/>
+            <wp:docPr id="1114890055" name="Obrázek 3"/>
+            <wp:cNvGraphicFramePr>
+              <a:graphicFrameLocks xmlns:a="http://schemas.openxmlformats.org/drawingml/2006/main" noChangeAspect="1"/>
+            </wp:cNvGraphicFramePr>
+            <a:graphic xmlns:a="http://schemas.openxmlformats.org/drawingml/2006/main">
+              <a:graphicData uri="http://schemas.openxmlformats.org/drawingml/2006/picture">
+                <pic:pic xmlns:pic="http://schemas.openxmlformats.org/drawingml/2006/picture">
+                  <pic:nvPicPr>
+                    <pic:cNvPr id="0" name="Picture 2"/>
+                    <pic:cNvPicPr>
+                      <a:picLocks noChangeAspect="1" noChangeArrowheads="1"/>
+                    </pic:cNvPicPr>
+                  </pic:nvPicPr>
+                  <pic:blipFill>
+                    <a:blip r:embed="rId15">
+                      <a:extLst>
+                        <a:ext uri="{28A0092B-C50C-407E-A947-70E740481C1C}">
+                          <a14:useLocalDpi xmlns:a14="http://schemas.microsoft.com/office/drawing/2010/main" val="0"/>
+                        </a:ext>
+                      </a:extLst>
+                    </a:blip>
+                    <a:srcRect/>
+                    <a:stretch>
+                      <a:fillRect/>
+                    </a:stretch>
+                  </pic:blipFill>
+                  <pic:spPr bwMode="auto">
+                    <a:xfrm>
+                      <a:off x="0" y="0"/>
+                      <a:ext cx="3296285" cy="4144010"/>
+                    </a:xfrm>
+                    <a:prstGeom prst="rect">
+                      <a:avLst/>
+                    </a:prstGeom>
+                    <a:noFill/>
+                  </pic:spPr>
+                </pic:pic>
+              </a:graphicData>
+            </a:graphic>
+          </wp:inline>
+        </w:drawing>
+      </w:r>
+    </w:p>
+    <w:p>
+      <w:pPr>
+        <w:pStyle w:val="Titulek"/>
+      </w:pPr>
+      <w:bookmarkStart w:id="38" w:name="_Toc230174423"/>
+      <w:r>
+        <w:t xml:space="preserve">Obrázek </w:t>
+      </w:r>
+      <w:r>
+        <w:fldChar w:fldCharType="begin"/>
+      </w:r>
+      <w:r>
+        <w:instrText xml:space="preserve"> SEQ Obrázek \* ARABIC </w:instrText>
+      </w:r>
+      <w:r>
+        <w:fldChar w:fldCharType="separate"/>
+      </w:r>
+      <w:r>
+        <w:rPr>
+          <w:noProof/>
+        </w:rPr>
+        <w:t>2</w:t>
+      </w:r>
+      <w:r>
+        <w:fldChar w:fldCharType="end"/>
+      </w:r>
+      <w:r>
+        <w:t>: Formulář pro přidání nových habitů</w:t>
+      </w:r>
+      <w:bookmarkEnd w:id="38"/>
+    </w:p>
+    <w:p>
+      <w:pPr>
+        <w:pStyle w:val="Nadpis2"/>
+      </w:pPr>
+      <w:bookmarkStart w:id="39" w:name="_Toc226556247"/>
+      <w:r>
+        <w:t>Seznamy návyků</w:t>
+      </w:r>
+      <w:bookmarkEnd w:id="39"/>
+    </w:p>
+    <w:p>
+      <w:r>
+        <w:t xml:space="preserve">Zobrazení seznamu návyků je řešeno komponentami </w:t>
+      </w:r>
+      <w:proofErr w:type="spellStart"/>
+      <w:r>
+        <w:t>HabitsListComponent</w:t>
+      </w:r>
+      <w:proofErr w:type="spellEnd"/>
+      <w:r>
+        <w:t xml:space="preserve"> a </w:t>
+      </w:r>
+      <w:proofErr w:type="spellStart"/>
+      <w:r>
+        <w:t>HabitComponent</w:t>
+      </w:r>
+      <w:proofErr w:type="spellEnd"/>
+      <w:r>
+        <w:t>. Tento způsob je výhodný, protože:</w:t>
+      </w:r>
+    </w:p>
+    <w:p>
+      <w:pPr>
+        <w:pStyle w:val="Odrkovseznam"/>
+      </w:pPr>
+      <w:proofErr w:type="spellStart"/>
+      <w:r>
+        <w:t>HabitsListComponent</w:t>
+      </w:r>
+      <w:proofErr w:type="spellEnd"/>
+      <w:r>
+        <w:t xml:space="preserve"> funguje jako „obálka“ pro seznam,</w:t>
+      </w:r>
+    </w:p>
+    <w:p>
+      <w:pPr>
+        <w:pStyle w:val="Odrkovseznam"/>
+      </w:pPr>
+      <w:proofErr w:type="spellStart"/>
+      <w:r>
+        <w:t>HabitComponent</w:t>
+      </w:r>
+      <w:proofErr w:type="spellEnd"/>
+      <w:r>
+        <w:t xml:space="preserve"> se stará o konkrétní položku (návyk/zlozvyk) a její lokální UI logiku.</w:t>
+      </w:r>
+    </w:p>
+    <w:p>
+      <w:pPr>
+        <w:pStyle w:val="Odrkovseznam"/>
+      </w:pPr>
+      <w:proofErr w:type="spellStart"/>
+      <w:r>
+        <w:t>HabitsListComponent</w:t>
+      </w:r>
+      <w:proofErr w:type="spellEnd"/>
+      <w:r>
+        <w:t xml:space="preserve"> pracuje </w:t>
+      </w:r>
+      <w:proofErr w:type="gramStart"/>
+      <w:r>
+        <w:t>s</w:t>
+      </w:r>
+      <w:proofErr w:type="gramEnd"/>
+      <w:r>
+        <w:t xml:space="preserve"> vstupy:</w:t>
+      </w:r>
+    </w:p>
+    <w:p>
+      <w:pPr>
+        <w:pStyle w:val="Odrkovseznam"/>
+      </w:pPr>
+      <w:proofErr w:type="spellStart"/>
+      <w:r>
+        <w:t>habits</w:t>
+      </w:r>
+      <w:proofErr w:type="spellEnd"/>
+      <w:r>
+        <w:t xml:space="preserve"> – pole návyků k zobrazení,</w:t>
+      </w:r>
+    </w:p>
+    <w:p>
+      <w:pPr>
+        <w:pStyle w:val="Odrkovseznam"/>
+      </w:pPr>
+      <w:r>
+        <w:t>type – typ seznamu (positive/negative),</w:t>
+      </w:r>
+    </w:p>
+    <w:p>
       <w:r>
         <w:lastRenderedPageBreak/>
-        <w:t>[FOTO FORMULÁŘE]</w:t>
-      </w:r>
+        <w:t>a s výstupy pomocí eventů:</w:t>
+      </w:r>
+    </w:p>
+    <w:p>
+      <w:pPr>
+        <w:pStyle w:val="Odrkovseznam"/>
+      </w:pPr>
+      <w:proofErr w:type="spellStart"/>
+      <w:r>
+        <w:t>deleteHabit</w:t>
+      </w:r>
+      <w:proofErr w:type="spellEnd"/>
+      <w:r>
+        <w:t xml:space="preserve"> – odstranění návyku,</w:t>
+      </w:r>
+    </w:p>
+    <w:p>
+      <w:pPr>
+        <w:pStyle w:val="Odrkovseznam"/>
+      </w:pPr>
+      <w:proofErr w:type="spellStart"/>
+      <w:r>
+        <w:t>updateHabit</w:t>
+      </w:r>
+      <w:proofErr w:type="spellEnd"/>
+      <w:r>
+        <w:t xml:space="preserve"> – aktualizace položky (např. změna stavu splnění).</w:t>
+      </w:r>
+    </w:p>
+    <w:p>
+      <w:r>
+        <w:t xml:space="preserve">Tímto stylem se v </w:t>
+      </w:r>
+      <w:proofErr w:type="spellStart"/>
+      <w:r>
+        <w:t>Angularu</w:t>
+      </w:r>
+      <w:proofErr w:type="spellEnd"/>
+      <w:r>
+        <w:t xml:space="preserve"> udržuje čistá separace odpovědností: komponenta seznamu pouze </w:t>
+      </w:r>
+      <w:proofErr w:type="spellStart"/>
+      <w:r>
+        <w:t>renderuje</w:t>
+      </w:r>
+      <w:proofErr w:type="spellEnd"/>
+      <w:r>
+        <w:t xml:space="preserve"> položky a přeposílá uživatelské akce výše, zatímco logika úpravy dat zůstává v nadržené logice a v </w:t>
+      </w:r>
+      <w:proofErr w:type="spellStart"/>
+      <w:r>
+        <w:t>DataService</w:t>
+      </w:r>
+      <w:proofErr w:type="spellEnd"/>
+      <w:r>
+        <w:t>.</w:t>
+      </w:r>
+    </w:p>
+    <w:p>
+      <w:r>
+        <w:t>Výsledkem je přehledné UI, kdy uživatel vidí návyky či zlozvyky v seznamech, může s nimi pracovat a změny se ihned projeví v dalších částech aplikace (např. v grafu).</w:t>
+      </w:r>
+    </w:p>
+    <w:p>
+      <w:pPr>
+        <w:keepNext/>
+      </w:pPr>
+      <w:r>
+        <w:drawing>
+          <wp:inline distT="0" distB="0" distL="0" distR="0" wp14:anchorId="7CD19B90" wp14:editId="179B0791">
+            <wp:extent cx="6120130" cy="2460625"/>
+            <wp:effectExtent l="0" t="0" r="0" b="0"/>
+            <wp:docPr id="1725597943" name="Obrázek 1"/>
+            <wp:cNvGraphicFramePr>
+              <a:graphicFrameLocks xmlns:a="http://schemas.openxmlformats.org/drawingml/2006/main" noChangeAspect="1"/>
+            </wp:cNvGraphicFramePr>
+            <a:graphic xmlns:a="http://schemas.openxmlformats.org/drawingml/2006/main">
+              <a:graphicData uri="http://schemas.openxmlformats.org/drawingml/2006/picture">
+                <pic:pic xmlns:pic="http://schemas.openxmlformats.org/drawingml/2006/picture">
+                  <pic:nvPicPr>
+                    <pic:cNvPr id="1725597943" name=""/>
+                    <pic:cNvPicPr/>
+                  </pic:nvPicPr>
+                  <pic:blipFill>
+                    <a:blip r:embed="rId16"/>
+                    <a:stretch>
+                      <a:fillRect/>
+                    </a:stretch>
+                  </pic:blipFill>
+                  <pic:spPr>
+                    <a:xfrm>
+                      <a:off x="0" y="0"/>
+                      <a:ext cx="6120130" cy="2460625"/>
+                    </a:xfrm>
+                    <a:prstGeom prst="rect">
+                      <a:avLst/>
+                    </a:prstGeom>
+                  </pic:spPr>
+                </pic:pic>
+              </a:graphicData>
+            </a:graphic>
+          </wp:inline>
+        </w:drawing>
+      </w:r>
+    </w:p>
+    <w:p>
+      <w:pPr>
+        <w:pStyle w:val="Titulek"/>
+      </w:pPr>
+      <w:bookmarkStart w:id="40" w:name="_Toc230174424"/>
+      <w:r>
+        <w:t xml:space="preserve">Obrázek </w:t>
+      </w:r>
+      <w:r>
+        <w:fldChar w:fldCharType="begin"/>
+      </w:r>
+      <w:r>
+        <w:instrText xml:space="preserve"> SEQ Obrázek \* ARABIC </w:instrText>
+      </w:r>
+      <w:r>
+        <w:fldChar w:fldCharType="separate"/>
+      </w:r>
+      <w:r>
+        <w:rPr>
+          <w:noProof/>
+        </w:rPr>
+        <w:t>3</w:t>
+      </w:r>
+      <w:r>
+        <w:fldChar w:fldCharType="end"/>
+      </w:r>
+      <w:r>
+        <w:t>: Seznam habitů</w:t>
+      </w:r>
+      <w:bookmarkEnd w:id="40"/>
     </w:p>
     <w:p>
       <w:pPr>
         <w:pStyle w:val="Nadpis2"/>
       </w:pPr>
-      <w:bookmarkStart w:id="36" w:name="_Toc226556247"/>
-      <w:r>
-        <w:t>Seznamy návyků</w:t>
-      </w:r>
-      <w:bookmarkEnd w:id="36"/>
-    </w:p>
-    <w:p>
-      <w:r>
-        <w:t xml:space="preserve">Zobrazení seznamu návyků je řešeno komponentami </w:t>
-      </w:r>
-      <w:proofErr w:type="spellStart"/>
-      <w:r>
-        <w:t>HabitsListComponent</w:t>
-      </w:r>
-      <w:proofErr w:type="spellEnd"/>
-      <w:r>
-        <w:t xml:space="preserve"> a </w:t>
-      </w:r>
-      <w:proofErr w:type="spellStart"/>
-      <w:r>
-        <w:t>HabitComponent</w:t>
-      </w:r>
-      <w:proofErr w:type="spellEnd"/>
-      <w:r>
-        <w:t>. Tento způsob je výhodný, protože:</w:t>
-      </w:r>
-    </w:p>
-    <w:p>
-      <w:pPr>
-        <w:pStyle w:val="Odrkovseznam"/>
-      </w:pPr>
-      <w:proofErr w:type="spellStart"/>
-      <w:r>
-        <w:t>HabitsListComponent</w:t>
-      </w:r>
-      <w:proofErr w:type="spellEnd"/>
-      <w:r>
-        <w:t xml:space="preserve"> funguje jako „obálka“ pro seznam,</w:t>
-      </w:r>
-    </w:p>
-    <w:p>
-      <w:pPr>
-        <w:pStyle w:val="Odrkovseznam"/>
-      </w:pPr>
-      <w:proofErr w:type="spellStart"/>
-      <w:r>
-        <w:t>HabitComponent</w:t>
-      </w:r>
-      <w:proofErr w:type="spellEnd"/>
-      <w:r>
-        <w:t xml:space="preserve"> se stará o konkrétní položku (návyk/zlozvyk) a její lokální UI logiku.</w:t>
-      </w:r>
-    </w:p>
-    <w:p>
-      <w:pPr>
-        <w:pStyle w:val="Odrkovseznam"/>
-      </w:pPr>
-      <w:proofErr w:type="spellStart"/>
-      <w:r>
-        <w:t>HabitsListComponent</w:t>
-      </w:r>
-      <w:proofErr w:type="spellEnd"/>
-      <w:r>
-        <w:t xml:space="preserve"> pracuje </w:t>
-      </w:r>
-      <w:proofErr w:type="gramStart"/>
-      <w:r>
-        <w:t>s</w:t>
-      </w:r>
-      <w:proofErr w:type="gramEnd"/>
-      <w:r>
-        <w:t xml:space="preserve"> vstupy:</w:t>
-      </w:r>
-    </w:p>
-    <w:p>
-      <w:pPr>
-        <w:pStyle w:val="Odrkovseznam"/>
-      </w:pPr>
-      <w:proofErr w:type="spellStart"/>
-      <w:r>
-        <w:t>habits</w:t>
-      </w:r>
-      <w:proofErr w:type="spellEnd"/>
-      <w:r>
-        <w:t xml:space="preserve"> – pole návyků k zobrazení,</w:t>
-      </w:r>
-    </w:p>
-    <w:p>
-      <w:pPr>
-        <w:pStyle w:val="Odrkovseznam"/>
-      </w:pPr>
-      <w:r>
-        <w:t>type – typ seznamu (positive/negative),</w:t>
-      </w:r>
-    </w:p>
-    <w:p>
-      <w:r>
-        <w:t>a s výstupy pomocí eventů:</w:t>
-      </w:r>
-    </w:p>
-    <w:p>
-      <w:pPr>
-        <w:pStyle w:val="Odrkovseznam"/>
-      </w:pPr>
-      <w:proofErr w:type="spellStart"/>
-      <w:r>
-        <w:t>deleteHabit</w:t>
-      </w:r>
-      <w:proofErr w:type="spellEnd"/>
-      <w:r>
-        <w:t xml:space="preserve"> – odstranění návyku,</w:t>
-      </w:r>
-    </w:p>
-    <w:p>
-      <w:pPr>
-        <w:pStyle w:val="Odrkovseznam"/>
-      </w:pPr>
-      <w:proofErr w:type="spellStart"/>
-      <w:r>
-        <w:t>updateHabit</w:t>
-      </w:r>
-      <w:proofErr w:type="spellEnd"/>
-      <w:r>
-        <w:t xml:space="preserve"> – aktualizace položky (např. změna stavu splnění).</w:t>
-      </w:r>
-    </w:p>
-    <w:p>
-      <w:r>
-        <w:t xml:space="preserve">Tímto stylem se v </w:t>
-      </w:r>
-      <w:proofErr w:type="spellStart"/>
-      <w:r>
-        <w:t>Angularu</w:t>
-      </w:r>
-      <w:proofErr w:type="spellEnd"/>
-      <w:r>
-        <w:t xml:space="preserve"> udržuje čistá separace odpovědností: komponenta seznamu pouze </w:t>
-      </w:r>
-      <w:proofErr w:type="spellStart"/>
-      <w:r>
-        <w:t>renderuje</w:t>
-      </w:r>
-      <w:proofErr w:type="spellEnd"/>
-      <w:r>
-        <w:t xml:space="preserve"> položky a přeposílá uživatelské akce výše, zatímco logika úpravy dat zůstává v nadržené logice a v </w:t>
-      </w:r>
-      <w:proofErr w:type="spellStart"/>
-      <w:r>
-        <w:t>DataService</w:t>
-      </w:r>
-      <w:proofErr w:type="spellEnd"/>
-      <w:r>
-        <w:t>.</w:t>
-      </w:r>
-    </w:p>
-    <w:p>
-      <w:r>
-        <w:t>Výsledkem je přehledné UI, kdy uživatel vidí návyky či zlozvyky v seznamech, může s nimi pracovat a změny se ihned projeví v dalších částech aplikace (např. v grafu).</w:t>
-      </w:r>
-    </w:p>
-    <w:p>
-      <w:r>
-        <w:t xml:space="preserve">[FOTO SEZNAMU NÁVYKŮ (JE </w:t>
-      </w:r>
-      <w:proofErr w:type="gramStart"/>
-      <w:r>
-        <w:t>JEDNO</w:t>
-      </w:r>
-      <w:proofErr w:type="gramEnd"/>
-      <w:r>
-        <w:t xml:space="preserve"> KTERÁ KATEGORIE)]</w:t>
-      </w:r>
-    </w:p>
-    <w:p>
-      <w:pPr>
-        <w:pStyle w:val="Nadpis2"/>
-      </w:pPr>
-      <w:bookmarkStart w:id="37" w:name="_Toc226556248"/>
+      <w:bookmarkStart w:id="41" w:name="_Toc226556248"/>
       <w:r>
         <w:t>Vizualizace plnění návyku</w:t>
       </w:r>
-      <w:bookmarkEnd w:id="37"/>
+      <w:bookmarkEnd w:id="41"/>
     </w:p>
     <w:p>
       <w:pPr>
@@ -7033,20 +7840,20 @@
       </w:pPr>
       <w:proofErr w:type="spellStart"/>
       <w:r>
+        <w:t>year</w:t>
+      </w:r>
+      <w:proofErr w:type="spellEnd"/>
+      <w:r>
+        <w:t xml:space="preserve"> (rok),</w:t>
+      </w:r>
+    </w:p>
+    <w:p>
+      <w:pPr>
+        <w:pStyle w:val="Odrkovseznam"/>
+      </w:pPr>
+      <w:proofErr w:type="spellStart"/>
+      <w:r>
         <w:lastRenderedPageBreak/>
-        <w:t>year</w:t>
-      </w:r>
-      <w:proofErr w:type="spellEnd"/>
-      <w:r>
-        <w:t xml:space="preserve"> (rok),</w:t>
-      </w:r>
-    </w:p>
-    <w:p>
-      <w:pPr>
-        <w:pStyle w:val="Odrkovseznam"/>
-      </w:pPr>
-      <w:proofErr w:type="spellStart"/>
-      <w:r>
         <w:t>all</w:t>
       </w:r>
       <w:proofErr w:type="spellEnd"/>
@@ -7086,26 +7893,93 @@
     <w:p>
       <w:pPr>
         <w:pStyle w:val="Normlnweb"/>
+        <w:keepNext/>
+      </w:pPr>
+      <w:r>
         <w:rPr>
           <w:rStyle w:val="Siln"/>
         </w:rPr>
-      </w:pPr>
-      <w:r>
+        <w:drawing>
+          <wp:inline distT="0" distB="0" distL="0" distR="0" wp14:anchorId="5AEEBD81" wp14:editId="6FFD4F09">
+            <wp:extent cx="6120130" cy="1823720"/>
+            <wp:effectExtent l="0" t="0" r="0" b="5080"/>
+            <wp:docPr id="1244389372" name="Obrázek 1"/>
+            <wp:cNvGraphicFramePr>
+              <a:graphicFrameLocks xmlns:a="http://schemas.openxmlformats.org/drawingml/2006/main" noChangeAspect="1"/>
+            </wp:cNvGraphicFramePr>
+            <a:graphic xmlns:a="http://schemas.openxmlformats.org/drawingml/2006/main">
+              <a:graphicData uri="http://schemas.openxmlformats.org/drawingml/2006/picture">
+                <pic:pic xmlns:pic="http://schemas.openxmlformats.org/drawingml/2006/picture">
+                  <pic:nvPicPr>
+                    <pic:cNvPr id="1244389372" name=""/>
+                    <pic:cNvPicPr/>
+                  </pic:nvPicPr>
+                  <pic:blipFill>
+                    <a:blip r:embed="rId17"/>
+                    <a:stretch>
+                      <a:fillRect/>
+                    </a:stretch>
+                  </pic:blipFill>
+                  <pic:spPr>
+                    <a:xfrm>
+                      <a:off x="0" y="0"/>
+                      <a:ext cx="6120130" cy="1823720"/>
+                    </a:xfrm>
+                    <a:prstGeom prst="rect">
+                      <a:avLst/>
+                    </a:prstGeom>
+                  </pic:spPr>
+                </pic:pic>
+              </a:graphicData>
+            </a:graphic>
+          </wp:inline>
+        </w:drawing>
+      </w:r>
+    </w:p>
+    <w:p>
+      <w:pPr>
+        <w:pStyle w:val="Titulek"/>
+        <w:jc w:val="left"/>
         <w:rPr>
           <w:rStyle w:val="Siln"/>
         </w:rPr>
-        <w:t>[FOTO NÁVYKU (ROZEVŘENÝ)]</w:t>
-      </w:r>
+      </w:pPr>
+      <w:bookmarkStart w:id="42" w:name="_Toc230174425"/>
+      <w:r>
+        <w:t xml:space="preserve">Obrázek </w:t>
+      </w:r>
+      <w:r>
+        <w:fldChar w:fldCharType="begin"/>
+      </w:r>
+      <w:r>
+        <w:instrText xml:space="preserve"> SEQ Obrázek \* ARABIC </w:instrText>
+      </w:r>
+      <w:r>
+        <w:fldChar w:fldCharType="separate"/>
+      </w:r>
+      <w:r>
+        <w:rPr>
+          <w:noProof/>
+        </w:rPr>
+        <w:t>4</w:t>
+      </w:r>
+      <w:r>
+        <w:fldChar w:fldCharType="end"/>
+      </w:r>
+      <w:r>
+        <w:t>: Rozevřený habit</w:t>
+      </w:r>
+      <w:bookmarkEnd w:id="42"/>
     </w:p>
     <w:p>
       <w:pPr>
         <w:pStyle w:val="Nadpis2"/>
       </w:pPr>
-      <w:bookmarkStart w:id="38" w:name="_Toc226556249"/>
+      <w:bookmarkStart w:id="43" w:name="_Toc226556249"/>
       <w:r>
         <w:t>Styling a responzivita aplikace</w:t>
       </w:r>
-      <w:bookmarkEnd w:id="38"/>
+      <w:bookmarkEnd w:id="43"/>
     </w:p>
     <w:p>
       <w:r>
@@ -7284,16 +8158,26 @@
       </w:r>
       <w:proofErr w:type="spellEnd"/>
       <w:r>
-        <w:t xml:space="preserve">, aby uživatel mohl graf “přejet” do stran a podívat se na detaily i mimo původní viditelnou oblast, protože žádná jiná metoda </w:t>
+        <w:t xml:space="preserve">, aby uživatel mohl graf “přejet” do stran a podívat se na detaily i mimo původní viditelnou oblast, protože </w:t>
+      </w:r>
+      <w:r>
+        <w:t xml:space="preserve">se mi lépe problém nepovedlo </w:t>
       </w:r>
       <w:proofErr w:type="gramStart"/>
       <w:r>
-        <w:t>nefungovala .</w:t>
+        <w:t>vyřešit</w:t>
       </w:r>
       <w:proofErr w:type="gramEnd"/>
-    </w:p>
-    <w:p>
-      <w:r>
+      <w:r>
+        <w:t xml:space="preserve"> a to počítám i AI pomoc</w:t>
+      </w:r>
+      <w:r>
+        <w:t>.</w:t>
+      </w:r>
+    </w:p>
+    <w:p>
+      <w:r>
+        <w:lastRenderedPageBreak/>
         <w:t xml:space="preserve">Přístup je tedy takový, že aplikace zůstává použitelná i na menších displejích, aniž by docházelo k rozbití layoutu nebo k nečitelnosti obsahu. V případě grafu je preferováno umožnit práci s obsahem přes </w:t>
       </w:r>
       <w:proofErr w:type="spellStart"/>
@@ -7302,20 +8186,185 @@
       </w:r>
       <w:proofErr w:type="spellEnd"/>
       <w:r>
-        <w:t>, protože samotný graf vyžaduje určitou šířku pro čitelnost detailů.</w:t>
-      </w:r>
-    </w:p>
-    <w:p>
-      <w:pPr>
+        <w:t xml:space="preserve">, protože samotný graf vyžaduje určitou šířku pro čitelnost </w:t>
+      </w:r>
+      <w:proofErr w:type="gramStart"/>
+      <w:r>
+        <w:t>detailů.</w:t>
+      </w:r>
+      <w:r>
+        <w:t>¨</w:t>
+      </w:r>
+      <w:proofErr w:type="gramEnd"/>
+    </w:p>
+    <w:p>
+      <w:pPr>
+        <w:keepNext/>
+      </w:pPr>
+      <w:r>
+        <w:drawing>
+          <wp:inline distT="0" distB="0" distL="0" distR="0" wp14:anchorId="30AEE3C8" wp14:editId="3EA8B922">
+            <wp:extent cx="2286000" cy="4662167"/>
+            <wp:effectExtent l="0" t="0" r="0" b="5715"/>
+            <wp:docPr id="176820996" name="Obrázek 1"/>
+            <wp:cNvGraphicFramePr>
+              <a:graphicFrameLocks xmlns:a="http://schemas.openxmlformats.org/drawingml/2006/main" noChangeAspect="1"/>
+            </wp:cNvGraphicFramePr>
+            <a:graphic xmlns:a="http://schemas.openxmlformats.org/drawingml/2006/main">
+              <a:graphicData uri="http://schemas.openxmlformats.org/drawingml/2006/picture">
+                <pic:pic xmlns:pic="http://schemas.openxmlformats.org/drawingml/2006/picture">
+                  <pic:nvPicPr>
+                    <pic:cNvPr id="176820996" name=""/>
+                    <pic:cNvPicPr/>
+                  </pic:nvPicPr>
+                  <pic:blipFill>
+                    <a:blip r:embed="rId18"/>
+                    <a:stretch>
+                      <a:fillRect/>
+                    </a:stretch>
+                  </pic:blipFill>
+                  <pic:spPr>
+                    <a:xfrm>
+                      <a:off x="0" y="0"/>
+                      <a:ext cx="2301767" cy="4694323"/>
+                    </a:xfrm>
+                    <a:prstGeom prst="rect">
+                      <a:avLst/>
+                    </a:prstGeom>
+                  </pic:spPr>
+                </pic:pic>
+              </a:graphicData>
+            </a:graphic>
+          </wp:inline>
+        </w:drawing>
+      </w:r>
+    </w:p>
+    <w:p>
+      <w:pPr>
+        <w:pStyle w:val="Titulek"/>
+      </w:pPr>
+      <w:bookmarkStart w:id="44" w:name="_Toc230174426"/>
+      <w:r>
+        <w:t xml:space="preserve">Obrázek </w:t>
+      </w:r>
+      <w:r>
+        <w:fldChar w:fldCharType="begin"/>
+      </w:r>
+      <w:r>
+        <w:instrText xml:space="preserve"> SEQ Obrázek \* ARABIC </w:instrText>
+      </w:r>
+      <w:r>
+        <w:fldChar w:fldCharType="separate"/>
+      </w:r>
+      <w:r>
         <w:rPr>
-          <w:rStyle w:val="Siln"/>
+          <w:noProof/>
         </w:rPr>
-      </w:pPr>
-      <w:r>
-        <w:rPr>
-          <w:rStyle w:val="Siln"/>
-        </w:rPr>
-        <w:t>[FOTO MOBILNÍHO ROZHRANÍ (DEV TOOLS V PROHLÍŽEČI)]</w:t>
+        <w:t>5</w:t>
+      </w:r>
+      <w:r>
+        <w:fldChar w:fldCharType="end"/>
+      </w:r>
+      <w:r>
+        <w:t>: mobilní verze aplikace</w:t>
+      </w:r>
+      <w:bookmarkEnd w:id="44"/>
+    </w:p>
+    <w:p>
+      <w:pPr>
+        <w:pStyle w:val="Nadpis2"/>
+      </w:pPr>
+      <w:bookmarkStart w:id="45" w:name="_Toc226556250"/>
+      <w:r>
+        <w:t>Optimalizace</w:t>
+      </w:r>
+      <w:bookmarkEnd w:id="45"/>
+    </w:p>
+    <w:p>
+      <w:r>
+        <w:t>Protože jde o malou webovou aplikaci bez náročných databázových dotazů, optimalizace se zaměřuje hlavně na efektivní zpracování dat v klientovi a na minimalizaci zbytečných výpočtů a "ujídání" paměti v počítači uživatele. Hlavní přístupy v aplikaci:</w:t>
+      </w:r>
+    </w:p>
+    <w:p>
+      <w:pPr>
+        <w:pStyle w:val="Nadpis3"/>
+      </w:pPr>
+      <w:r>
+        <w:t xml:space="preserve"> Centrální servis pro data (</w:t>
+      </w:r>
+      <w:proofErr w:type="spellStart"/>
+      <w:r>
+        <w:t>DataService</w:t>
+      </w:r>
+      <w:proofErr w:type="spellEnd"/>
+      <w:r>
+        <w:t>)</w:t>
+      </w:r>
+    </w:p>
+    <w:p>
+      <w:r>
+        <w:t>Namísto duplikování logiky po komponentách se ukládání a načítání řeší na jednom místě. To zjednodušuje údržbu a snižuje riziko chyb.</w:t>
+      </w:r>
+    </w:p>
+    <w:p>
+      <w:r>
+        <w:t>Reaktivní tok dat (</w:t>
+      </w:r>
+      <w:proofErr w:type="spellStart"/>
+      <w:r>
+        <w:t>BehaviorSubject</w:t>
+      </w:r>
+      <w:proofErr w:type="spellEnd"/>
+      <w:r>
+        <w:t xml:space="preserve"> + </w:t>
+      </w:r>
+      <w:proofErr w:type="spellStart"/>
+      <w:r>
+        <w:t>observable</w:t>
+      </w:r>
+      <w:proofErr w:type="spellEnd"/>
+      <w:r>
+        <w:t xml:space="preserve">). Komponenty pracují </w:t>
+      </w:r>
+      <w:proofErr w:type="gramStart"/>
+      <w:r>
+        <w:t>s</w:t>
+      </w:r>
+      <w:proofErr w:type="gramEnd"/>
+      <w:r>
+        <w:t xml:space="preserve"> data tokem a reagují na změny. Díky tomu je UI konzistentní bez nutnosti ručně volat přepočty napříč komponentami.</w:t>
+      </w:r>
+    </w:p>
+    <w:p>
+      <w:pPr>
+        <w:pStyle w:val="Nadpis3"/>
+      </w:pPr>
+      <w:r>
+        <w:lastRenderedPageBreak/>
+        <w:t>Omezení přepočtů grafu</w:t>
+      </w:r>
+    </w:p>
+    <w:p>
+      <w:r>
+        <w:t xml:space="preserve">Komponenta grafu zajišťuje přepočet dat primárně při změně vstupů (hlavně </w:t>
+      </w:r>
+      <w:proofErr w:type="spellStart"/>
+      <w:r>
+        <w:t>history</w:t>
+      </w:r>
+      <w:proofErr w:type="spellEnd"/>
+      <w:r>
+        <w:t>). Díky tomu se graf zbytečně nepřepočítává při každé drobné změně, ale jen když je to potřeba.</w:t>
+      </w:r>
+    </w:p>
+    <w:p>
+      <w:r>
+        <w:t>Validace před uložením. Formulář nepovolí nekonzistentní data (např. prázdné nebo příliš dlouhé hodnoty, duplicitní návyky). Tím se do grafu a seznamu nikdy nedostanou problematické vstupy, které by zhoršily výkon i kvalitu zobrazení.</w:t>
+      </w:r>
+    </w:p>
+    <w:p>
+      <w:r>
+        <w:t>Celkově aplikace používá optimalizační principy typické pro front-end vývoj: reaktivní práce se stavem, efektivní zpracování dat a validace na hraně vstupu.</w:t>
       </w:r>
     </w:p>
     <w:p/>
@@ -7323,16 +8372,15 @@
       <w:pPr>
         <w:pStyle w:val="Nadpis2"/>
       </w:pPr>
-      <w:bookmarkStart w:id="39" w:name="_Toc226556250"/>
-      <w:r>
-        <w:lastRenderedPageBreak/>
-        <w:t>Optimalizace</w:t>
-      </w:r>
-      <w:bookmarkEnd w:id="39"/>
-    </w:p>
-    <w:p>
-      <w:r>
-        <w:t>Protože jde o malou webovou aplikaci bez náročných databázových dotazů, optimalizace se zaměřuje hlavně na efektivní zpracování dat v klientovi a na minimalizaci zbytečných výpočtů a "ujídání" paměti v počítači uživatele. Hlavní přístupy v aplikaci:</w:t>
+      <w:bookmarkStart w:id="46" w:name="_Toc226556251"/>
+      <w:r>
+        <w:t>Zkušenosti nabrané z této práce</w:t>
+      </w:r>
+      <w:bookmarkEnd w:id="46"/>
+    </w:p>
+    <w:p>
+      <w:r>
+        <w:t>Během vývoje aplikace Habit Tracker jsem získal/a praktické zkušenosti v několika oblastech, které jsou pro tvorbu školních i reálných projektů důležité.</w:t>
       </w:r>
     </w:p>
     <w:p>
@@ -7340,7 +8388,49 @@
         <w:pStyle w:val="Nadpis3"/>
       </w:pPr>
       <w:r>
-        <w:t xml:space="preserve"> Centrální servis pro data (</w:t>
+        <w:t>Angular komponentový přístup</w:t>
+      </w:r>
+    </w:p>
+    <w:p>
+      <w:r>
+        <w:t>Utvrdil jsem si rozdělování úlohy do samostatných komponent (habit-</w:t>
+      </w:r>
+      <w:proofErr w:type="spellStart"/>
+      <w:r>
+        <w:t>form</w:t>
+      </w:r>
+      <w:proofErr w:type="spellEnd"/>
+      <w:r>
+        <w:t xml:space="preserve">, </w:t>
+      </w:r>
+      <w:proofErr w:type="spellStart"/>
+      <w:r>
+        <w:t>habits</w:t>
+      </w:r>
+      <w:proofErr w:type="spellEnd"/>
+      <w:r>
+        <w:t>-list, habit-</w:t>
+      </w:r>
+      <w:proofErr w:type="spellStart"/>
+      <w:r>
+        <w:t>graph</w:t>
+      </w:r>
+      <w:proofErr w:type="spellEnd"/>
+      <w:r>
+        <w:t>) způsobem, aby byla aplikace přehledná a snadno rozšiřitelná. Zvlášť přínosné bylo používat @Input a @Output pro předávání dat a událostí mezi komponentami.</w:t>
+      </w:r>
+    </w:p>
+    <w:p>
+      <w:pPr>
+        <w:pStyle w:val="Nadpis3"/>
+      </w:pPr>
+      <w:r>
+        <w:t>Práce se stavem a službami</w:t>
+      </w:r>
+    </w:p>
+    <w:p>
+      <w:r>
+        <w:t xml:space="preserve">Díky této práci jsem se naučil konstruovat </w:t>
       </w:r>
       <w:proofErr w:type="spellStart"/>
       <w:r>
@@ -7348,17 +8438,7 @@
       </w:r>
       <w:proofErr w:type="spellEnd"/>
       <w:r>
-        <w:t>)</w:t>
-      </w:r>
-    </w:p>
-    <w:p>
-      <w:r>
-        <w:t>Namísto duplikování logiky po komponentách se ukládání a načítání řeší na jednom místě. To zjednodušuje údržbu a snižuje riziko chyb.</w:t>
-      </w:r>
-    </w:p>
-    <w:p>
-      <w:r>
-        <w:t>Reaktivní tok dat (</w:t>
+        <w:t xml:space="preserve"> pro centralizovanou správu dat. Zjistil jsem, že reaktivní přístup (</w:t>
       </w:r>
       <w:proofErr w:type="spellStart"/>
       <w:r>
@@ -7366,23 +8446,7 @@
       </w:r>
       <w:proofErr w:type="spellEnd"/>
       <w:r>
-        <w:t xml:space="preserve"> + </w:t>
-      </w:r>
-      <w:proofErr w:type="spellStart"/>
-      <w:r>
-        <w:t>observable</w:t>
-      </w:r>
-      <w:proofErr w:type="spellEnd"/>
-      <w:r>
-        <w:t xml:space="preserve">). Komponenty pracují </w:t>
-      </w:r>
-      <w:proofErr w:type="gramStart"/>
-      <w:r>
-        <w:t>s</w:t>
-      </w:r>
-      <w:proofErr w:type="gramEnd"/>
-      <w:r>
-        <w:t xml:space="preserve"> data tokem a reagují na změny. Díky tomu je UI konzistentní bez nutnosti ručně volat přepočty napříč komponentami.</w:t>
+        <w:t>) výrazně zjednodušuje konzistenci UI a díky tomu se lépe škáluje a opravuje.</w:t>
       </w:r>
     </w:p>
     <w:p>
@@ -7390,46 +8454,12 @@
         <w:pStyle w:val="Nadpis3"/>
       </w:pPr>
       <w:r>
-        <w:t>Omezení přepočtů grafu</w:t>
-      </w:r>
-    </w:p>
-    <w:p>
-      <w:r>
-        <w:t xml:space="preserve">Komponenta grafu zajišťuje přepočet dat primárně při změně vstupů (hlavně </w:t>
-      </w:r>
-      <w:proofErr w:type="spellStart"/>
-      <w:r>
-        <w:t>history</w:t>
-      </w:r>
-      <w:proofErr w:type="spellEnd"/>
-      <w:r>
-        <w:t>). Díky tomu se graf zbytečně nepřepočítává při každé drobné změně, ale jen když je to potřeba.</w:t>
-      </w:r>
-    </w:p>
-    <w:p>
-      <w:r>
-        <w:t>Validace před uložením. Formulář nepovolí nekonzistentní data (např. prázdné nebo příliš dlouhé hodnoty, duplicitní návyky). Tím se do grafu a seznamu nikdy nedostanou problematické vstupy, které by zhoršily výkon i kvalitu zobrazení.</w:t>
-      </w:r>
-    </w:p>
-    <w:p>
-      <w:r>
-        <w:t>Celkově aplikace používá optimalizační principy typické pro front-end vývoj: reaktivní práce se stavem, efektivní zpracování dat a validace na hraně vstupu.</w:t>
-      </w:r>
-    </w:p>
-    <w:p/>
-    <w:p>
-      <w:pPr>
-        <w:pStyle w:val="Nadpis2"/>
-      </w:pPr>
-      <w:bookmarkStart w:id="40" w:name="_Toc226556251"/>
-      <w:r>
-        <w:t>Zkušenosti nabrané z této práce</w:t>
-      </w:r>
-      <w:bookmarkEnd w:id="40"/>
-    </w:p>
-    <w:p>
-      <w:r>
-        <w:t>Během vývoje aplikace Habit Tracker jsem získal/a praktické zkušenosti v několika oblastech, které jsou pro tvorbu školních i reálných projektů důležité.</w:t>
+        <w:t>Validace a ošetření uživatelských vstupů</w:t>
+      </w:r>
+    </w:p>
+    <w:p>
+      <w:r>
+        <w:t>Formulář mi ukázal, že validace není jen „checkbox“, ale reálné zabezpečení kvality dat. Zvlášť kontrola duplicit zabránila tomu, aby aplikace obsahovala nesmyslné nebo duplicitní záznamy.</w:t>
       </w:r>
     </w:p>
     <w:p>
@@ -7437,16 +8467,40 @@
         <w:pStyle w:val="Nadpis3"/>
       </w:pPr>
       <w:r>
-        <w:t>Angular komponentový přístup</w:t>
-      </w:r>
-    </w:p>
-    <w:p>
-      <w:r>
-        <w:t>Utvrdil jsem si rozdělování úlohy do samostatných komponent (habit-</w:t>
-      </w:r>
-      <w:proofErr w:type="spellStart"/>
-      <w:r>
-        <w:t>form</w:t>
+        <w:t>Transformace dat pro graf</w:t>
+      </w:r>
+    </w:p>
+    <w:p>
+      <w:r>
+        <w:t>Další velice užitečná a cenná byla zkušenost s tím, jak převést surovou historii událostí na strukturu vhodnou pro graf (binování podle zvoleného období). To je častý problém v reálných aplikacích – data záznamů se musí agregovat do</w:t>
+      </w:r>
+      <w:r>
+        <w:t xml:space="preserve"> </w:t>
+      </w:r>
+      <w:proofErr w:type="spellStart"/>
+      <w:r>
+        <w:t>zobrazovatelných</w:t>
+      </w:r>
+      <w:proofErr w:type="spellEnd"/>
+      <w:r>
+        <w:t xml:space="preserve"> tvarů.</w:t>
+      </w:r>
+    </w:p>
+    <w:p>
+      <w:pPr>
+        <w:pStyle w:val="Nadpis3"/>
+      </w:pPr>
+      <w:r>
+        <w:t>Uživatelská použitelnost</w:t>
+      </w:r>
+    </w:p>
+    <w:p>
+      <w:r>
+        <w:t>Při implementaci UI (</w:t>
+      </w:r>
+      <w:proofErr w:type="spellStart"/>
+      <w:r>
+        <w:t>toolbar</w:t>
       </w:r>
       <w:proofErr w:type="spellEnd"/>
       <w:r>
@@ -7454,100 +8508,7 @@
       </w:r>
       <w:proofErr w:type="spellStart"/>
       <w:r>
-        <w:t>habits</w:t>
-      </w:r>
-      <w:proofErr w:type="spellEnd"/>
-      <w:r>
-        <w:t>-list, habit-</w:t>
-      </w:r>
-      <w:proofErr w:type="spellStart"/>
-      <w:r>
-        <w:t>graph</w:t>
-      </w:r>
-      <w:proofErr w:type="spellEnd"/>
-      <w:r>
-        <w:t>) způsobem, aby byla aplikace přehledná a snadno rozšiřitelná. Zvlášť přínosné bylo používat @Input a @Output pro předávání dat a událostí mezi komponentami.</w:t>
-      </w:r>
-    </w:p>
-    <w:p>
-      <w:pPr>
-        <w:pStyle w:val="Nadpis3"/>
-      </w:pPr>
-      <w:r>
-        <w:t>Práce se stavem a službami</w:t>
-      </w:r>
-    </w:p>
-    <w:p>
-      <w:r>
-        <w:t xml:space="preserve">Díky této práci jsem se naučil konstruovat </w:t>
-      </w:r>
-      <w:proofErr w:type="spellStart"/>
-      <w:r>
-        <w:t>DataService</w:t>
-      </w:r>
-      <w:proofErr w:type="spellEnd"/>
-      <w:r>
-        <w:t xml:space="preserve"> pro centralizovanou správu dat. Zjistil jsem, že reaktivní přístup (</w:t>
-      </w:r>
-      <w:proofErr w:type="spellStart"/>
-      <w:r>
-        <w:t>BehaviorSubject</w:t>
-      </w:r>
-      <w:proofErr w:type="spellEnd"/>
-      <w:r>
-        <w:t>) výrazně zjednodušuje konzistenci UI a díky tomu se lépe škáluje a opravuje.</w:t>
-      </w:r>
-    </w:p>
-    <w:p>
-      <w:pPr>
-        <w:pStyle w:val="Nadpis3"/>
-      </w:pPr>
-      <w:r>
-        <w:t>Validace a ošetření uživatelských vstupů</w:t>
-      </w:r>
-    </w:p>
-    <w:p>
-      <w:r>
-        <w:t>Formulář mi ukázal, že validace není jen „checkbox“, ale reálné zabezpečení kvality dat. Zvlášť kontrola duplicit zabránila tomu, aby aplikace obsahovala nesmyslné nebo duplicitní záznamy.</w:t>
-      </w:r>
-    </w:p>
-    <w:p>
-      <w:pPr>
-        <w:pStyle w:val="Nadpis3"/>
-      </w:pPr>
-      <w:r>
-        <w:lastRenderedPageBreak/>
-        <w:t>Transformace dat pro graf</w:t>
-      </w:r>
-    </w:p>
-    <w:p>
-      <w:r>
-        <w:t xml:space="preserve">Další velice užitečná a cenná byla zkušenost s tím, jak převést surovou historii událostí na strukturu vhodnou pro graf (binování podle zvoleného období). To je častý problém v reálných aplikacích – data záznamů se musí agregovat do </w:t>
-      </w:r>
-      <w:proofErr w:type="spellStart"/>
-      <w:r>
-        <w:t>vizualizovatelných</w:t>
-      </w:r>
-      <w:proofErr w:type="spellEnd"/>
-      <w:r>
-        <w:t xml:space="preserve"> tvarů.</w:t>
-      </w:r>
-    </w:p>
-    <w:p>
-      <w:pPr>
-        <w:pStyle w:val="Nadpis3"/>
-      </w:pPr>
-      <w:r>
-        <w:t>Uživatelská použitelnost</w:t>
-      </w:r>
-    </w:p>
-    <w:p>
-      <w:r>
-        <w:t>Při implementaci UI (</w:t>
-      </w:r>
-      <w:proofErr w:type="spellStart"/>
-      <w:r>
-        <w:t>toolbar</w:t>
+        <w:t>taby</w:t>
       </w:r>
       <w:proofErr w:type="spellEnd"/>
       <w:r>
@@ -7555,14 +8516,6 @@
       </w:r>
       <w:proofErr w:type="spellStart"/>
       <w:r>
-        <w:t>taby</w:t>
-      </w:r>
-      <w:proofErr w:type="spellEnd"/>
-      <w:r>
-        <w:t xml:space="preserve">, </w:t>
-      </w:r>
-      <w:proofErr w:type="spellStart"/>
-      <w:r>
         <w:t>overlay</w:t>
       </w:r>
       <w:proofErr w:type="spellEnd"/>
@@ -7570,20 +8523,6 @@
         <w:t>) jsem si uvědomil, že dobré uživatelské rozhraní je stejně důležité jako samotná logika. Aplikace musí být srozumitelná a akce musí být dostupné intuitivně.</w:t>
       </w:r>
     </w:p>
-    <w:p>
-      <w:r>
-        <w:t xml:space="preserve">Díky této práci mám nyní lepší představu, jak se propojuje model dat, řízení stavu v </w:t>
-      </w:r>
-      <w:proofErr w:type="spellStart"/>
-      <w:r>
-        <w:t>Angularu</w:t>
-      </w:r>
-      <w:proofErr w:type="spellEnd"/>
-      <w:r>
-        <w:t xml:space="preserve"> a tvorba uživatelsky přívětivého rozhraní.</w:t>
-      </w:r>
-    </w:p>
-    <w:p/>
     <w:p>
       <w:pPr>
         <w:spacing w:after="160" w:line="278" w:lineRule="auto"/>
@@ -7602,12 +8541,12 @@
         </w:numPr>
         <w:ind w:left="720"/>
       </w:pPr>
-      <w:bookmarkStart w:id="41" w:name="_Toc226556252"/>
+      <w:bookmarkStart w:id="47" w:name="_Toc226556252"/>
       <w:r>
         <w:lastRenderedPageBreak/>
         <w:t>Závěr</w:t>
       </w:r>
-      <w:bookmarkEnd w:id="41"/>
+      <w:bookmarkEnd w:id="47"/>
     </w:p>
     <w:p>
       <w:r>
@@ -7669,16 +8608,16 @@
         </w:numPr>
         <w:ind w:left="720"/>
       </w:pPr>
-      <w:bookmarkStart w:id="42" w:name="_Toc222315302"/>
-      <w:bookmarkStart w:id="43" w:name="_Toc223513779"/>
-      <w:bookmarkStart w:id="44" w:name="_Toc226556253"/>
+      <w:bookmarkStart w:id="48" w:name="_Toc222315302"/>
+      <w:bookmarkStart w:id="49" w:name="_Toc223513779"/>
+      <w:bookmarkStart w:id="50" w:name="_Toc226556253"/>
       <w:r>
         <w:lastRenderedPageBreak/>
         <w:t>Použitá literatura</w:t>
       </w:r>
-      <w:bookmarkEnd w:id="42"/>
-      <w:bookmarkEnd w:id="43"/>
-      <w:bookmarkEnd w:id="44"/>
+      <w:bookmarkEnd w:id="48"/>
+      <w:bookmarkEnd w:id="49"/>
+      <w:bookmarkEnd w:id="50"/>
     </w:p>
     <w:p>
       <w:pPr>
@@ -7690,7 +8629,7 @@
       <w:r>
         <w:t xml:space="preserve"> </w:t>
       </w:r>
-      <w:hyperlink r:id="rId14" w:history="1">
+      <w:hyperlink r:id="rId19" w:history="1">
         <w:r>
           <w:rPr>
             <w:rStyle w:val="Hypertextovodkaz"/>
@@ -7741,7 +8680,7 @@
       <w:r>
         <w:t> [online]. c2026 [cit.  2026-05-20]. Dostupné z: </w:t>
       </w:r>
-      <w:hyperlink r:id="rId15" w:tgtFrame="_blank" w:history="1">
+      <w:hyperlink r:id="rId20" w:tgtFrame="_blank" w:history="1">
         <w:r>
           <w:rPr>
             <w:rStyle w:val="Hypertextovodkaz"/>
@@ -7821,16 +8760,390 @@
         </w:numPr>
         <w:ind w:left="720"/>
       </w:pPr>
-      <w:bookmarkStart w:id="45" w:name="_Toc222315303"/>
-      <w:bookmarkStart w:id="46" w:name="_Toc223513780"/>
-      <w:bookmarkStart w:id="47" w:name="_Toc226556254"/>
+      <w:bookmarkStart w:id="51" w:name="_Toc222315303"/>
+      <w:bookmarkStart w:id="52" w:name="_Toc223513780"/>
+      <w:bookmarkStart w:id="53" w:name="_Toc226556254"/>
       <w:r>
         <w:lastRenderedPageBreak/>
         <w:t>Seznam obrázků</w:t>
       </w:r>
-      <w:bookmarkEnd w:id="45"/>
-      <w:bookmarkEnd w:id="46"/>
-      <w:bookmarkEnd w:id="47"/>
+      <w:bookmarkEnd w:id="51"/>
+      <w:bookmarkEnd w:id="52"/>
+      <w:bookmarkEnd w:id="53"/>
+    </w:p>
+    <w:p>
+      <w:r>
+        <w:t>Všechny obrázky byly vyfocené pomocí screenshotů z prohlížeče Brave a byl focen Habit Tracker.</w:t>
+      </w:r>
+    </w:p>
+    <w:p>
+      <w:pPr>
+        <w:pStyle w:val="Seznamobrzk"/>
+        <w:tabs>
+          <w:tab w:val="right" w:leader="dot" w:pos="9628"/>
+        </w:tabs>
+        <w:rPr>
+          <w:rFonts w:asciiTheme="minorHAnsi" w:eastAsiaTheme="minorEastAsia" w:hAnsiTheme="minorHAnsi"/>
+          <w:noProof/>
+          <w:sz w:val="24"/>
+          <w:lang w:eastAsia="cs-CZ"/>
+        </w:rPr>
+      </w:pPr>
+      <w:r>
+        <w:fldChar w:fldCharType="begin"/>
+      </w:r>
+      <w:r>
+        <w:instrText xml:space="preserve"> TOC \h \z \c "Obrázek" </w:instrText>
+      </w:r>
+      <w:r>
+        <w:fldChar w:fldCharType="separate"/>
+      </w:r>
+      <w:hyperlink w:anchor="_Toc230174422" w:history="1">
+        <w:r>
+          <w:rPr>
+            <w:rStyle w:val="Hypertextovodkaz"/>
+            <w:noProof/>
+          </w:rPr>
+          <w:t>Obrázek 1: Hlavní UI</w:t>
+        </w:r>
+        <w:r>
+          <w:rPr>
+            <w:noProof/>
+            <w:webHidden/>
+          </w:rPr>
+          <w:tab/>
+        </w:r>
+        <w:r>
+          <w:rPr>
+            <w:noProof/>
+            <w:webHidden/>
+          </w:rPr>
+          <w:fldChar w:fldCharType="begin"/>
+        </w:r>
+        <w:r>
+          <w:rPr>
+            <w:noProof/>
+            <w:webHidden/>
+          </w:rPr>
+          <w:instrText xml:space="preserve"> PAGEREF _Toc230174422 \h </w:instrText>
+        </w:r>
+        <w:r>
+          <w:rPr>
+            <w:noProof/>
+            <w:webHidden/>
+          </w:rPr>
+        </w:r>
+        <w:r>
+          <w:rPr>
+            <w:noProof/>
+            <w:webHidden/>
+          </w:rPr>
+          <w:fldChar w:fldCharType="separate"/>
+        </w:r>
+        <w:r>
+          <w:rPr>
+            <w:noProof/>
+            <w:webHidden/>
+          </w:rPr>
+          <w:t>17</w:t>
+        </w:r>
+        <w:r>
+          <w:rPr>
+            <w:noProof/>
+            <w:webHidden/>
+          </w:rPr>
+          <w:fldChar w:fldCharType="end"/>
+        </w:r>
+      </w:hyperlink>
+    </w:p>
+    <w:p>
+      <w:pPr>
+        <w:pStyle w:val="Seznamobrzk"/>
+        <w:tabs>
+          <w:tab w:val="right" w:leader="dot" w:pos="9628"/>
+        </w:tabs>
+        <w:rPr>
+          <w:rFonts w:asciiTheme="minorHAnsi" w:eastAsiaTheme="minorEastAsia" w:hAnsiTheme="minorHAnsi"/>
+          <w:noProof/>
+          <w:sz w:val="24"/>
+          <w:lang w:eastAsia="cs-CZ"/>
+        </w:rPr>
+      </w:pPr>
+      <w:hyperlink w:anchor="_Toc230174423" w:history="1">
+        <w:r>
+          <w:rPr>
+            <w:rStyle w:val="Hypertextovodkaz"/>
+            <w:noProof/>
+          </w:rPr>
+          <w:t>Obrázek 2: Formulář pro přidání nových habitů</w:t>
+        </w:r>
+        <w:r>
+          <w:rPr>
+            <w:noProof/>
+            <w:webHidden/>
+          </w:rPr>
+          <w:tab/>
+        </w:r>
+        <w:r>
+          <w:rPr>
+            <w:noProof/>
+            <w:webHidden/>
+          </w:rPr>
+          <w:fldChar w:fldCharType="begin"/>
+        </w:r>
+        <w:r>
+          <w:rPr>
+            <w:noProof/>
+            <w:webHidden/>
+          </w:rPr>
+          <w:instrText xml:space="preserve"> PAGEREF _Toc230174423 \h </w:instrText>
+        </w:r>
+        <w:r>
+          <w:rPr>
+            <w:noProof/>
+            <w:webHidden/>
+          </w:rPr>
+        </w:r>
+        <w:r>
+          <w:rPr>
+            <w:noProof/>
+            <w:webHidden/>
+          </w:rPr>
+          <w:fldChar w:fldCharType="separate"/>
+        </w:r>
+        <w:r>
+          <w:rPr>
+            <w:noProof/>
+            <w:webHidden/>
+          </w:rPr>
+          <w:t>18</w:t>
+        </w:r>
+        <w:r>
+          <w:rPr>
+            <w:noProof/>
+            <w:webHidden/>
+          </w:rPr>
+          <w:fldChar w:fldCharType="end"/>
+        </w:r>
+      </w:hyperlink>
+    </w:p>
+    <w:p>
+      <w:pPr>
+        <w:pStyle w:val="Seznamobrzk"/>
+        <w:tabs>
+          <w:tab w:val="right" w:leader="dot" w:pos="9628"/>
+        </w:tabs>
+        <w:rPr>
+          <w:rFonts w:asciiTheme="minorHAnsi" w:eastAsiaTheme="minorEastAsia" w:hAnsiTheme="minorHAnsi"/>
+          <w:noProof/>
+          <w:sz w:val="24"/>
+          <w:lang w:eastAsia="cs-CZ"/>
+        </w:rPr>
+      </w:pPr>
+      <w:hyperlink w:anchor="_Toc230174424" w:history="1">
+        <w:r>
+          <w:rPr>
+            <w:rStyle w:val="Hypertextovodkaz"/>
+            <w:noProof/>
+          </w:rPr>
+          <w:t>Obrázek 3: Seznam habitů</w:t>
+        </w:r>
+        <w:r>
+          <w:rPr>
+            <w:noProof/>
+            <w:webHidden/>
+          </w:rPr>
+          <w:tab/>
+        </w:r>
+        <w:r>
+          <w:rPr>
+            <w:noProof/>
+            <w:webHidden/>
+          </w:rPr>
+          <w:fldChar w:fldCharType="begin"/>
+        </w:r>
+        <w:r>
+          <w:rPr>
+            <w:noProof/>
+            <w:webHidden/>
+          </w:rPr>
+          <w:instrText xml:space="preserve"> PAGEREF _Toc230174424 \h </w:instrText>
+        </w:r>
+        <w:r>
+          <w:rPr>
+            <w:noProof/>
+            <w:webHidden/>
+          </w:rPr>
+        </w:r>
+        <w:r>
+          <w:rPr>
+            <w:noProof/>
+            <w:webHidden/>
+          </w:rPr>
+          <w:fldChar w:fldCharType="separate"/>
+        </w:r>
+        <w:r>
+          <w:rPr>
+            <w:noProof/>
+            <w:webHidden/>
+          </w:rPr>
+          <w:t>19</w:t>
+        </w:r>
+        <w:r>
+          <w:rPr>
+            <w:noProof/>
+            <w:webHidden/>
+          </w:rPr>
+          <w:fldChar w:fldCharType="end"/>
+        </w:r>
+      </w:hyperlink>
+    </w:p>
+    <w:p>
+      <w:pPr>
+        <w:pStyle w:val="Seznamobrzk"/>
+        <w:tabs>
+          <w:tab w:val="right" w:leader="dot" w:pos="9628"/>
+        </w:tabs>
+        <w:rPr>
+          <w:rFonts w:asciiTheme="minorHAnsi" w:eastAsiaTheme="minorEastAsia" w:hAnsiTheme="minorHAnsi"/>
+          <w:noProof/>
+          <w:sz w:val="24"/>
+          <w:lang w:eastAsia="cs-CZ"/>
+        </w:rPr>
+      </w:pPr>
+      <w:hyperlink w:anchor="_Toc230174425" w:history="1">
+        <w:r>
+          <w:rPr>
+            <w:rStyle w:val="Hypertextovodkaz"/>
+            <w:noProof/>
+          </w:rPr>
+          <w:t>Obrázek 4: Rozevřený habit</w:t>
+        </w:r>
+        <w:r>
+          <w:rPr>
+            <w:noProof/>
+            <w:webHidden/>
+          </w:rPr>
+          <w:tab/>
+        </w:r>
+        <w:r>
+          <w:rPr>
+            <w:noProof/>
+            <w:webHidden/>
+          </w:rPr>
+          <w:fldChar w:fldCharType="begin"/>
+        </w:r>
+        <w:r>
+          <w:rPr>
+            <w:noProof/>
+            <w:webHidden/>
+          </w:rPr>
+          <w:instrText xml:space="preserve"> PAGEREF _Toc230174425 \h </w:instrText>
+        </w:r>
+        <w:r>
+          <w:rPr>
+            <w:noProof/>
+            <w:webHidden/>
+          </w:rPr>
+        </w:r>
+        <w:r>
+          <w:rPr>
+            <w:noProof/>
+            <w:webHidden/>
+          </w:rPr>
+          <w:fldChar w:fldCharType="separate"/>
+        </w:r>
+        <w:r>
+          <w:rPr>
+            <w:noProof/>
+            <w:webHidden/>
+          </w:rPr>
+          <w:t>20</w:t>
+        </w:r>
+        <w:r>
+          <w:rPr>
+            <w:noProof/>
+            <w:webHidden/>
+          </w:rPr>
+          <w:fldChar w:fldCharType="end"/>
+        </w:r>
+      </w:hyperlink>
+    </w:p>
+    <w:p>
+      <w:pPr>
+        <w:pStyle w:val="Seznamobrzk"/>
+        <w:tabs>
+          <w:tab w:val="right" w:leader="dot" w:pos="9628"/>
+        </w:tabs>
+        <w:rPr>
+          <w:rFonts w:asciiTheme="minorHAnsi" w:eastAsiaTheme="minorEastAsia" w:hAnsiTheme="minorHAnsi"/>
+          <w:noProof/>
+          <w:sz w:val="24"/>
+          <w:lang w:eastAsia="cs-CZ"/>
+        </w:rPr>
+      </w:pPr>
+      <w:hyperlink w:anchor="_Toc230174426" w:history="1">
+        <w:r>
+          <w:rPr>
+            <w:rStyle w:val="Hypertextovodkaz"/>
+            <w:noProof/>
+          </w:rPr>
+          <w:t>Obrázek 5: mobilní verze aplikace</w:t>
+        </w:r>
+        <w:r>
+          <w:rPr>
+            <w:noProof/>
+            <w:webHidden/>
+          </w:rPr>
+          <w:tab/>
+        </w:r>
+        <w:r>
+          <w:rPr>
+            <w:noProof/>
+            <w:webHidden/>
+          </w:rPr>
+          <w:fldChar w:fldCharType="begin"/>
+        </w:r>
+        <w:r>
+          <w:rPr>
+            <w:noProof/>
+            <w:webHidden/>
+          </w:rPr>
+          <w:instrText xml:space="preserve"> PAGEREF _Toc230174426 \h </w:instrText>
+        </w:r>
+        <w:r>
+          <w:rPr>
+            <w:noProof/>
+            <w:webHidden/>
+          </w:rPr>
+        </w:r>
+        <w:r>
+          <w:rPr>
+            <w:noProof/>
+            <w:webHidden/>
+          </w:rPr>
+          <w:fldChar w:fldCharType="separate"/>
+        </w:r>
+        <w:r>
+          <w:rPr>
+            <w:noProof/>
+            <w:webHidden/>
+          </w:rPr>
+          <w:t>21</w:t>
+        </w:r>
+        <w:r>
+          <w:rPr>
+            <w:noProof/>
+            <w:webHidden/>
+          </w:rPr>
+          <w:fldChar w:fldCharType="end"/>
+        </w:r>
+      </w:hyperlink>
+    </w:p>
+    <w:p>
+      <w:r>
+        <w:fldChar w:fldCharType="end"/>
+      </w:r>
     </w:p>
     <w:p>
       <w:pPr>
@@ -7850,16 +9163,98 @@
         </w:numPr>
         <w:ind w:left="720"/>
       </w:pPr>
-      <w:bookmarkStart w:id="48" w:name="_Toc222315304"/>
-      <w:bookmarkStart w:id="49" w:name="_Toc223513781"/>
-      <w:bookmarkStart w:id="50" w:name="_Toc226556255"/>
+      <w:bookmarkStart w:id="54" w:name="_Toc222315304"/>
+      <w:bookmarkStart w:id="55" w:name="_Toc223513781"/>
+      <w:bookmarkStart w:id="56" w:name="_Toc226556255"/>
       <w:r>
         <w:lastRenderedPageBreak/>
         <w:t>Seznam tabulek</w:t>
       </w:r>
-      <w:bookmarkEnd w:id="48"/>
-      <w:bookmarkEnd w:id="49"/>
-      <w:bookmarkEnd w:id="50"/>
+      <w:bookmarkEnd w:id="54"/>
+      <w:bookmarkEnd w:id="55"/>
+      <w:bookmarkEnd w:id="56"/>
+    </w:p>
+    <w:p>
+      <w:pPr>
+        <w:pStyle w:val="Seznamobrzk"/>
+        <w:tabs>
+          <w:tab w:val="right" w:leader="dot" w:pos="9628"/>
+        </w:tabs>
+        <w:rPr>
+          <w:noProof/>
+        </w:rPr>
+      </w:pPr>
+      <w:r>
+        <w:fldChar w:fldCharType="begin"/>
+      </w:r>
+      <w:r>
+        <w:instrText xml:space="preserve"> TOC \h \z \c "Tabulka" </w:instrText>
+      </w:r>
+      <w:r>
+        <w:fldChar w:fldCharType="separate"/>
+      </w:r>
+      <w:hyperlink w:anchor="_Toc230173683" w:history="1">
+        <w:r>
+          <w:rPr>
+            <w:rStyle w:val="Hypertextovodkaz"/>
+            <w:noProof/>
+          </w:rPr>
+          <w:t>Tabulka 1: Vlastnosti rozhraní Habit</w:t>
+        </w:r>
+        <w:r>
+          <w:rPr>
+            <w:noProof/>
+            <w:webHidden/>
+          </w:rPr>
+          <w:tab/>
+        </w:r>
+        <w:r>
+          <w:rPr>
+            <w:noProof/>
+            <w:webHidden/>
+          </w:rPr>
+          <w:fldChar w:fldCharType="begin"/>
+        </w:r>
+        <w:r>
+          <w:rPr>
+            <w:noProof/>
+            <w:webHidden/>
+          </w:rPr>
+          <w:instrText xml:space="preserve"> PAGEREF _Toc230173683 \h </w:instrText>
+        </w:r>
+        <w:r>
+          <w:rPr>
+            <w:noProof/>
+            <w:webHidden/>
+          </w:rPr>
+        </w:r>
+        <w:r>
+          <w:rPr>
+            <w:noProof/>
+            <w:webHidden/>
+          </w:rPr>
+          <w:fldChar w:fldCharType="separate"/>
+        </w:r>
+        <w:r>
+          <w:rPr>
+            <w:noProof/>
+            <w:webHidden/>
+          </w:rPr>
+          <w:t>15</w:t>
+        </w:r>
+        <w:r>
+          <w:rPr>
+            <w:noProof/>
+            <w:webHidden/>
+          </w:rPr>
+          <w:fldChar w:fldCharType="end"/>
+        </w:r>
+      </w:hyperlink>
+    </w:p>
+    <w:p>
+      <w:r>
+        <w:fldChar w:fldCharType="end"/>
+      </w:r>
     </w:p>
     <w:p>
       <w:pPr>
@@ -7879,16 +9274,16 @@
         </w:numPr>
         <w:ind w:left="720"/>
       </w:pPr>
-      <w:bookmarkStart w:id="51" w:name="_Toc222315305"/>
-      <w:bookmarkStart w:id="52" w:name="_Toc223513782"/>
-      <w:bookmarkStart w:id="53" w:name="_Toc226556256"/>
+      <w:bookmarkStart w:id="57" w:name="_Toc222315305"/>
+      <w:bookmarkStart w:id="58" w:name="_Toc223513782"/>
+      <w:bookmarkStart w:id="59" w:name="_Toc226556256"/>
       <w:r>
         <w:lastRenderedPageBreak/>
         <w:t>Seznam příloh</w:t>
       </w:r>
-      <w:bookmarkEnd w:id="51"/>
-      <w:bookmarkEnd w:id="52"/>
-      <w:bookmarkEnd w:id="53"/>
+      <w:bookmarkEnd w:id="57"/>
+      <w:bookmarkEnd w:id="58"/>
+      <w:bookmarkEnd w:id="59"/>
     </w:p>
     <w:p>
       <w:r>
@@ -7940,16 +9335,16 @@
         </w:numPr>
         <w:ind w:left="720"/>
       </w:pPr>
-      <w:bookmarkStart w:id="54" w:name="_Toc222315306"/>
-      <w:bookmarkStart w:id="55" w:name="_Toc223513783"/>
-      <w:bookmarkStart w:id="56" w:name="_Toc226556257"/>
+      <w:bookmarkStart w:id="60" w:name="_Toc222315306"/>
+      <w:bookmarkStart w:id="61" w:name="_Toc223513783"/>
+      <w:bookmarkStart w:id="62" w:name="_Toc226556257"/>
       <w:r>
         <w:lastRenderedPageBreak/>
         <w:t>Přílohy</w:t>
       </w:r>
-      <w:bookmarkEnd w:id="54"/>
-      <w:bookmarkEnd w:id="55"/>
-      <w:bookmarkEnd w:id="56"/>
+      <w:bookmarkEnd w:id="60"/>
+      <w:bookmarkEnd w:id="61"/>
+      <w:bookmarkEnd w:id="62"/>
     </w:p>
     <w:p>
       <w:r>
@@ -7963,10 +9358,10 @@
       </w:r>
     </w:p>
     <w:sectPr>
-      <w:headerReference w:type="even" r:id="rId16"/>
-      <w:headerReference w:type="default" r:id="rId17"/>
-      <w:footerReference w:type="default" r:id="rId18"/>
-      <w:headerReference w:type="first" r:id="rId19"/>
+      <w:headerReference w:type="even" r:id="rId21"/>
+      <w:headerReference w:type="default" r:id="rId22"/>
+      <w:footerReference w:type="default" r:id="rId23"/>
+      <w:headerReference w:type="first" r:id="rId24"/>
       <w:pgSz w:w="11906" w:h="16838"/>
       <w:pgMar w:top="1701" w:right="1134" w:bottom="1701" w:left="1134" w:header="680" w:footer="680" w:gutter="0"/>
       <w:cols w:space="708"/>
@@ -13057,6 +14452,36 @@
       <w:bCs/>
     </w:rPr>
   </w:style>
+  <w:style w:type="paragraph" w:styleId="Titulek">
+    <w:name w:val="caption"/>
+    <w:basedOn w:val="Normln"/>
+    <w:next w:val="Normln"/>
+    <w:uiPriority w:val="35"/>
+    <w:unhideWhenUsed/>
+    <w:qFormat/>
+    <w:rsid w:val="007E41D6"/>
+    <w:pPr>
+      <w:spacing w:line="240" w:lineRule="auto"/>
+    </w:pPr>
+    <w:rPr>
+      <w:i/>
+      <w:iCs/>
+      <w:color w:val="0E2841" w:themeColor="text2"/>
+      <w:sz w:val="18"/>
+      <w:szCs w:val="18"/>
+    </w:rPr>
+  </w:style>
+  <w:style w:type="paragraph" w:styleId="Seznamobrzk">
+    <w:name w:val="table of figures"/>
+    <w:basedOn w:val="Normln"/>
+    <w:next w:val="Normln"/>
+    <w:uiPriority w:val="99"/>
+    <w:unhideWhenUsed/>
+    <w:rsid w:val="00C55E45"/>
+    <w:pPr>
+      <w:spacing w:after="0"/>
+    </w:pPr>
+  </w:style>
 </w:styles>
 </file>
 

</xml_diff>

<commit_message>
feat: update habit form validation to allow longer names and descriptions docs: update the visual clarity by adding more sheets instead of lists
</commit_message>
<xml_diff>
--- a/Barta_rocnikova_prace.docx
+++ b/Barta_rocnikova_prace.docx
@@ -1357,6 +1357,7 @@
       <w:bookmarkStart w:id="6" w:name="_Toc223513762"/>
       <w:bookmarkStart w:id="7" w:name="_Toc226550175"/>
       <w:bookmarkStart w:id="8" w:name="_Toc226556217"/>
+      <w:bookmarkStart w:id="9" w:name="_Toc230179517"/>
       <w:r>
         <w:lastRenderedPageBreak/>
         <w:t>Prohlášení</w:t>
@@ -1370,6 +1371,7 @@
       <w:bookmarkEnd w:id="6"/>
       <w:bookmarkEnd w:id="7"/>
       <w:bookmarkEnd w:id="8"/>
+      <w:bookmarkEnd w:id="9"/>
       <w:r>
         <w:t xml:space="preserve"> </w:t>
       </w:r>
@@ -1697,24 +1699,26 @@
         </w:numPr>
         <w:ind w:left="720"/>
       </w:pPr>
-      <w:bookmarkStart w:id="9" w:name="_Toc183979916"/>
-      <w:bookmarkStart w:id="10" w:name="_Toc216425626"/>
-      <w:bookmarkStart w:id="11" w:name="_Toc216425784"/>
-      <w:bookmarkStart w:id="12" w:name="_Toc222315289"/>
-      <w:bookmarkStart w:id="13" w:name="_Toc223513764"/>
-      <w:bookmarkStart w:id="14" w:name="_Toc226550176"/>
-      <w:bookmarkStart w:id="15" w:name="_Toc226556218"/>
+      <w:bookmarkStart w:id="10" w:name="_Toc183979916"/>
+      <w:bookmarkStart w:id="11" w:name="_Toc216425626"/>
+      <w:bookmarkStart w:id="12" w:name="_Toc216425784"/>
+      <w:bookmarkStart w:id="13" w:name="_Toc222315289"/>
+      <w:bookmarkStart w:id="14" w:name="_Toc223513764"/>
+      <w:bookmarkStart w:id="15" w:name="_Toc226550176"/>
+      <w:bookmarkStart w:id="16" w:name="_Toc226556218"/>
+      <w:bookmarkStart w:id="17" w:name="_Toc230179518"/>
       <w:r>
         <w:lastRenderedPageBreak/>
         <w:t>Anotace</w:t>
       </w:r>
-      <w:bookmarkEnd w:id="9"/>
       <w:bookmarkEnd w:id="10"/>
       <w:bookmarkEnd w:id="11"/>
       <w:bookmarkEnd w:id="12"/>
       <w:bookmarkEnd w:id="13"/>
       <w:bookmarkEnd w:id="14"/>
       <w:bookmarkEnd w:id="15"/>
+      <w:bookmarkEnd w:id="16"/>
+      <w:bookmarkEnd w:id="17"/>
     </w:p>
     <w:p>
       <w:r>
@@ -1826,24 +1830,26 @@
         </w:numPr>
         <w:ind w:left="720"/>
       </w:pPr>
-      <w:bookmarkStart w:id="16" w:name="_Toc183979917"/>
-      <w:bookmarkStart w:id="17" w:name="_Toc216425627"/>
-      <w:bookmarkStart w:id="18" w:name="_Toc216425785"/>
-      <w:bookmarkStart w:id="19" w:name="_Toc222315290"/>
-      <w:bookmarkStart w:id="20" w:name="_Toc223513765"/>
-      <w:bookmarkStart w:id="21" w:name="_Toc226550177"/>
-      <w:bookmarkStart w:id="22" w:name="_Toc226556219"/>
+      <w:bookmarkStart w:id="18" w:name="_Toc183979917"/>
+      <w:bookmarkStart w:id="19" w:name="_Toc216425627"/>
+      <w:bookmarkStart w:id="20" w:name="_Toc216425785"/>
+      <w:bookmarkStart w:id="21" w:name="_Toc222315290"/>
+      <w:bookmarkStart w:id="22" w:name="_Toc223513765"/>
+      <w:bookmarkStart w:id="23" w:name="_Toc226550177"/>
+      <w:bookmarkStart w:id="24" w:name="_Toc226556219"/>
+      <w:bookmarkStart w:id="25" w:name="_Toc230179519"/>
       <w:r>
         <w:lastRenderedPageBreak/>
         <w:t>Klíčová slova</w:t>
       </w:r>
-      <w:bookmarkEnd w:id="16"/>
-      <w:bookmarkEnd w:id="17"/>
       <w:bookmarkEnd w:id="18"/>
       <w:bookmarkEnd w:id="19"/>
       <w:bookmarkEnd w:id="20"/>
       <w:bookmarkEnd w:id="21"/>
       <w:bookmarkEnd w:id="22"/>
+      <w:bookmarkEnd w:id="23"/>
+      <w:bookmarkEnd w:id="24"/>
+      <w:bookmarkEnd w:id="25"/>
     </w:p>
     <w:p>
       <w:r>
@@ -1932,24 +1938,26 @@
         </w:numPr>
         <w:ind w:left="720"/>
       </w:pPr>
-      <w:bookmarkStart w:id="23" w:name="_Toc183979918"/>
-      <w:bookmarkStart w:id="24" w:name="_Toc216425628"/>
-      <w:bookmarkStart w:id="25" w:name="_Toc216425786"/>
-      <w:bookmarkStart w:id="26" w:name="_Toc222315291"/>
-      <w:bookmarkStart w:id="27" w:name="_Toc223513766"/>
-      <w:bookmarkStart w:id="28" w:name="_Toc226550178"/>
-      <w:bookmarkStart w:id="29" w:name="_Toc226556220"/>
+      <w:bookmarkStart w:id="26" w:name="_Toc183979918"/>
+      <w:bookmarkStart w:id="27" w:name="_Toc216425628"/>
+      <w:bookmarkStart w:id="28" w:name="_Toc216425786"/>
+      <w:bookmarkStart w:id="29" w:name="_Toc222315291"/>
+      <w:bookmarkStart w:id="30" w:name="_Toc223513766"/>
+      <w:bookmarkStart w:id="31" w:name="_Toc226550178"/>
+      <w:bookmarkStart w:id="32" w:name="_Toc226556220"/>
+      <w:bookmarkStart w:id="33" w:name="_Toc230179520"/>
       <w:r>
         <w:lastRenderedPageBreak/>
         <w:t>Obsah</w:t>
       </w:r>
-      <w:bookmarkEnd w:id="23"/>
-      <w:bookmarkEnd w:id="24"/>
-      <w:bookmarkEnd w:id="25"/>
       <w:bookmarkEnd w:id="26"/>
       <w:bookmarkEnd w:id="27"/>
       <w:bookmarkEnd w:id="28"/>
       <w:bookmarkEnd w:id="29"/>
+      <w:bookmarkEnd w:id="30"/>
+      <w:bookmarkEnd w:id="31"/>
+      <w:bookmarkEnd w:id="32"/>
+      <w:bookmarkEnd w:id="33"/>
     </w:p>
     <w:sdt>
       <w:sdtPr>
@@ -1988,7 +1996,7 @@
           <w:r>
             <w:fldChar w:fldCharType="separate"/>
           </w:r>
-          <w:hyperlink w:anchor="_Toc226556221" w:history="1">
+          <w:hyperlink w:anchor="_Toc230179521" w:history="1">
             <w:r>
               <w:rPr>
                 <w:rStyle w:val="Hypertextovodkaz"/>
@@ -2015,7 +2023,7 @@
                 <w:noProof/>
                 <w:webHidden/>
               </w:rPr>
-              <w:instrText xml:space="preserve"> PAGEREF _Toc226556221 \h </w:instrText>
+              <w:instrText xml:space="preserve"> PAGEREF _Toc230179521 \h </w:instrText>
             </w:r>
             <w:r>
               <w:rPr>
@@ -2035,7 +2043,7 @@
                 <w:noProof/>
                 <w:webHidden/>
               </w:rPr>
-              <w:t>10</w:t>
+              <w:t>9</w:t>
             </w:r>
             <w:r>
               <w:rPr>
@@ -2060,7 +2068,7 @@
               <w:lang w:eastAsia="cs-CZ"/>
             </w:rPr>
           </w:pPr>
-          <w:hyperlink w:anchor="_Toc226556222" w:history="1">
+          <w:hyperlink w:anchor="_Toc230179522" w:history="1">
             <w:r>
               <w:rPr>
                 <w:rStyle w:val="Hypertextovodkaz"/>
@@ -2103,7 +2111,7 @@
                 <w:noProof/>
                 <w:webHidden/>
               </w:rPr>
-              <w:instrText xml:space="preserve"> PAGEREF _Toc226556222 \h </w:instrText>
+              <w:instrText xml:space="preserve"> PAGEREF _Toc230179522 \h </w:instrText>
             </w:r>
             <w:r>
               <w:rPr>
@@ -2123,7 +2131,7 @@
                 <w:noProof/>
                 <w:webHidden/>
               </w:rPr>
-              <w:t>11</w:t>
+              <w:t>10</w:t>
             </w:r>
             <w:r>
               <w:rPr>
@@ -2148,7 +2156,7 @@
               <w:lang w:eastAsia="cs-CZ"/>
             </w:rPr>
           </w:pPr>
-          <w:hyperlink w:anchor="_Toc226556223" w:history="1">
+          <w:hyperlink w:anchor="_Toc230179523" w:history="1">
             <w:r>
               <w:rPr>
                 <w:rStyle w:val="Hypertextovodkaz"/>
@@ -2191,7 +2199,7 @@
                 <w:noProof/>
                 <w:webHidden/>
               </w:rPr>
-              <w:instrText xml:space="preserve"> PAGEREF _Toc226556223 \h </w:instrText>
+              <w:instrText xml:space="preserve"> PAGEREF _Toc230179523 \h </w:instrText>
             </w:r>
             <w:r>
               <w:rPr>
@@ -2211,7 +2219,7 @@
                 <w:noProof/>
                 <w:webHidden/>
               </w:rPr>
-              <w:t>11</w:t>
+              <w:t>10</w:t>
             </w:r>
             <w:r>
               <w:rPr>
@@ -2236,7 +2244,7 @@
               <w:lang w:eastAsia="cs-CZ"/>
             </w:rPr>
           </w:pPr>
-          <w:hyperlink w:anchor="_Toc226556224" w:history="1">
+          <w:hyperlink w:anchor="_Toc230179524" w:history="1">
             <w:r>
               <w:rPr>
                 <w:rStyle w:val="Hypertextovodkaz"/>
@@ -2279,7 +2287,7 @@
                 <w:noProof/>
                 <w:webHidden/>
               </w:rPr>
-              <w:instrText xml:space="preserve"> PAGEREF _Toc226556224 \h </w:instrText>
+              <w:instrText xml:space="preserve"> PAGEREF _Toc230179524 \h </w:instrText>
             </w:r>
             <w:r>
               <w:rPr>
@@ -2299,7 +2307,7 @@
                 <w:noProof/>
                 <w:webHidden/>
               </w:rPr>
-              <w:t>11</w:t>
+              <w:t>10</w:t>
             </w:r>
             <w:r>
               <w:rPr>
@@ -2324,7 +2332,7 @@
               <w:lang w:eastAsia="cs-CZ"/>
             </w:rPr>
           </w:pPr>
-          <w:hyperlink w:anchor="_Toc226556225" w:history="1">
+          <w:hyperlink w:anchor="_Toc230179525" w:history="1">
             <w:r>
               <w:rPr>
                 <w:rStyle w:val="Hypertextovodkaz"/>
@@ -2367,7 +2375,7 @@
                 <w:noProof/>
                 <w:webHidden/>
               </w:rPr>
-              <w:instrText xml:space="preserve"> PAGEREF _Toc226556225 \h </w:instrText>
+              <w:instrText xml:space="preserve"> PAGEREF _Toc230179525 \h </w:instrText>
             </w:r>
             <w:r>
               <w:rPr>
@@ -2387,7 +2395,7 @@
                 <w:noProof/>
                 <w:webHidden/>
               </w:rPr>
-              <w:t>11</w:t>
+              <w:t>10</w:t>
             </w:r>
             <w:r>
               <w:rPr>
@@ -2412,7 +2420,7 @@
               <w:lang w:eastAsia="cs-CZ"/>
             </w:rPr>
           </w:pPr>
-          <w:hyperlink w:anchor="_Toc226556226" w:history="1">
+          <w:hyperlink w:anchor="_Toc230179526" w:history="1">
             <w:r>
               <w:rPr>
                 <w:rStyle w:val="Hypertextovodkaz"/>
@@ -2434,7 +2442,7 @@
                 <w:rStyle w:val="Hypertextovodkaz"/>
                 <w:noProof/>
               </w:rPr>
-              <w:t>Rozšíření prostředí</w:t>
+              <w:t>Rozšíření prostředí (Extensions)</w:t>
             </w:r>
             <w:r>
               <w:rPr>
@@ -2455,7 +2463,7 @@
                 <w:noProof/>
                 <w:webHidden/>
               </w:rPr>
-              <w:instrText xml:space="preserve"> PAGEREF _Toc226556226 \h </w:instrText>
+              <w:instrText xml:space="preserve"> PAGEREF _Toc230179526 \h </w:instrText>
             </w:r>
             <w:r>
               <w:rPr>
@@ -2475,7 +2483,7 @@
                 <w:noProof/>
                 <w:webHidden/>
               </w:rPr>
-              <w:t>11</w:t>
+              <w:t>10</w:t>
             </w:r>
             <w:r>
               <w:rPr>
@@ -2500,7 +2508,7 @@
               <w:lang w:eastAsia="cs-CZ"/>
             </w:rPr>
           </w:pPr>
-          <w:hyperlink w:anchor="_Toc226556227" w:history="1">
+          <w:hyperlink w:anchor="_Toc230179527" w:history="1">
             <w:r>
               <w:rPr>
                 <w:rStyle w:val="Hypertextovodkaz"/>
@@ -2543,7 +2551,7 @@
                 <w:noProof/>
                 <w:webHidden/>
               </w:rPr>
-              <w:instrText xml:space="preserve"> PAGEREF _Toc226556227 \h </w:instrText>
+              <w:instrText xml:space="preserve"> PAGEREF _Toc230179527 \h </w:instrText>
             </w:r>
             <w:r>
               <w:rPr>
@@ -2563,7 +2571,7 @@
                 <w:noProof/>
                 <w:webHidden/>
               </w:rPr>
-              <w:t>11</w:t>
+              <w:t>10</w:t>
             </w:r>
             <w:r>
               <w:rPr>
@@ -2588,7 +2596,7 @@
               <w:lang w:eastAsia="cs-CZ"/>
             </w:rPr>
           </w:pPr>
-          <w:hyperlink w:anchor="_Toc226556228" w:history="1">
+          <w:hyperlink w:anchor="_Toc230179528" w:history="1">
             <w:r>
               <w:rPr>
                 <w:rStyle w:val="Hypertextovodkaz"/>
@@ -2631,7 +2639,7 @@
                 <w:noProof/>
                 <w:webHidden/>
               </w:rPr>
-              <w:instrText xml:space="preserve"> PAGEREF _Toc226556228 \h </w:instrText>
+              <w:instrText xml:space="preserve"> PAGEREF _Toc230179528 \h </w:instrText>
             </w:r>
             <w:r>
               <w:rPr>
@@ -2676,7 +2684,7 @@
               <w:lang w:eastAsia="cs-CZ"/>
             </w:rPr>
           </w:pPr>
-          <w:hyperlink w:anchor="_Toc226556229" w:history="1">
+          <w:hyperlink w:anchor="_Toc230179529" w:history="1">
             <w:r>
               <w:rPr>
                 <w:rStyle w:val="Hypertextovodkaz"/>
@@ -2698,7 +2706,7 @@
                 <w:rStyle w:val="Hypertextovodkaz"/>
                 <w:noProof/>
               </w:rPr>
-              <w:t>TypeScript</w:t>
+              <w:t>SCSS (Sass CSS)</w:t>
             </w:r>
             <w:r>
               <w:rPr>
@@ -2719,7 +2727,7 @@
                 <w:noProof/>
                 <w:webHidden/>
               </w:rPr>
-              <w:instrText xml:space="preserve"> PAGEREF _Toc226556229 \h </w:instrText>
+              <w:instrText xml:space="preserve"> PAGEREF _Toc230179529 \h </w:instrText>
             </w:r>
             <w:r>
               <w:rPr>
@@ -2739,7 +2747,7 @@
                 <w:noProof/>
                 <w:webHidden/>
               </w:rPr>
-              <w:t>12</w:t>
+              <w:t>11</w:t>
             </w:r>
             <w:r>
               <w:rPr>
@@ -2764,7 +2772,7 @@
               <w:lang w:eastAsia="cs-CZ"/>
             </w:rPr>
           </w:pPr>
-          <w:hyperlink w:anchor="_Toc226556230" w:history="1">
+          <w:hyperlink w:anchor="_Toc230179530" w:history="1">
             <w:r>
               <w:rPr>
                 <w:rStyle w:val="Hypertextovodkaz"/>
@@ -2807,7 +2815,7 @@
                 <w:noProof/>
                 <w:webHidden/>
               </w:rPr>
-              <w:instrText xml:space="preserve"> PAGEREF _Toc226556230 \h </w:instrText>
+              <w:instrText xml:space="preserve"> PAGEREF _Toc230179530 \h </w:instrText>
             </w:r>
             <w:r>
               <w:rPr>
@@ -2827,7 +2835,7 @@
                 <w:noProof/>
                 <w:webHidden/>
               </w:rPr>
-              <w:t>12</w:t>
+              <w:t>11</w:t>
             </w:r>
             <w:r>
               <w:rPr>
@@ -2852,7 +2860,7 @@
               <w:lang w:eastAsia="cs-CZ"/>
             </w:rPr>
           </w:pPr>
-          <w:hyperlink w:anchor="_Toc226556231" w:history="1">
+          <w:hyperlink w:anchor="_Toc230179531" w:history="1">
             <w:r>
               <w:rPr>
                 <w:rStyle w:val="Hypertextovodkaz"/>
@@ -2895,7 +2903,7 @@
                 <w:noProof/>
                 <w:webHidden/>
               </w:rPr>
-              <w:instrText xml:space="preserve"> PAGEREF _Toc226556231 \h </w:instrText>
+              <w:instrText xml:space="preserve"> PAGEREF _Toc230179531 \h </w:instrText>
             </w:r>
             <w:r>
               <w:rPr>
@@ -2915,7 +2923,7 @@
                 <w:noProof/>
                 <w:webHidden/>
               </w:rPr>
-              <w:t>12</w:t>
+              <w:t>11</w:t>
             </w:r>
             <w:r>
               <w:rPr>
@@ -2940,7 +2948,7 @@
               <w:lang w:eastAsia="cs-CZ"/>
             </w:rPr>
           </w:pPr>
-          <w:hyperlink w:anchor="_Toc226556232" w:history="1">
+          <w:hyperlink w:anchor="_Toc230179532" w:history="1">
             <w:r>
               <w:rPr>
                 <w:rStyle w:val="Hypertextovodkaz"/>
@@ -2983,7 +2991,7 @@
                 <w:noProof/>
                 <w:webHidden/>
               </w:rPr>
-              <w:instrText xml:space="preserve"> PAGEREF _Toc226556232 \h </w:instrText>
+              <w:instrText xml:space="preserve"> PAGEREF _Toc230179532 \h </w:instrText>
             </w:r>
             <w:r>
               <w:rPr>
@@ -3003,7 +3011,7 @@
                 <w:noProof/>
                 <w:webHidden/>
               </w:rPr>
-              <w:t>12</w:t>
+              <w:t>11</w:t>
             </w:r>
             <w:r>
               <w:rPr>
@@ -3028,7 +3036,7 @@
               <w:lang w:eastAsia="cs-CZ"/>
             </w:rPr>
           </w:pPr>
-          <w:hyperlink w:anchor="_Toc226556233" w:history="1">
+          <w:hyperlink w:anchor="_Toc230179533" w:history="1">
             <w:r>
               <w:rPr>
                 <w:rStyle w:val="Hypertextovodkaz"/>
@@ -3071,7 +3079,7 @@
                 <w:noProof/>
                 <w:webHidden/>
               </w:rPr>
-              <w:instrText xml:space="preserve"> PAGEREF _Toc226556233 \h </w:instrText>
+              <w:instrText xml:space="preserve"> PAGEREF _Toc230179533 \h </w:instrText>
             </w:r>
             <w:r>
               <w:rPr>
@@ -3116,7 +3124,7 @@
               <w:lang w:eastAsia="cs-CZ"/>
             </w:rPr>
           </w:pPr>
-          <w:hyperlink w:anchor="_Toc226556234" w:history="1">
+          <w:hyperlink w:anchor="_Toc230179534" w:history="1">
             <w:r>
               <w:rPr>
                 <w:rStyle w:val="Hypertextovodkaz"/>
@@ -3159,7 +3167,7 @@
                 <w:noProof/>
                 <w:webHidden/>
               </w:rPr>
-              <w:instrText xml:space="preserve"> PAGEREF _Toc226556234 \h </w:instrText>
+              <w:instrText xml:space="preserve"> PAGEREF _Toc230179534 \h </w:instrText>
             </w:r>
             <w:r>
               <w:rPr>
@@ -3204,7 +3212,7 @@
               <w:lang w:eastAsia="cs-CZ"/>
             </w:rPr>
           </w:pPr>
-          <w:hyperlink w:anchor="_Toc226556235" w:history="1">
+          <w:hyperlink w:anchor="_Toc230179535" w:history="1">
             <w:r>
               <w:rPr>
                 <w:rStyle w:val="Hypertextovodkaz"/>
@@ -3247,7 +3255,7 @@
                 <w:noProof/>
                 <w:webHidden/>
               </w:rPr>
-              <w:instrText xml:space="preserve"> PAGEREF _Toc226556235 \h </w:instrText>
+              <w:instrText xml:space="preserve"> PAGEREF _Toc230179535 \h </w:instrText>
             </w:r>
             <w:r>
               <w:rPr>
@@ -3292,7 +3300,7 @@
               <w:lang w:eastAsia="cs-CZ"/>
             </w:rPr>
           </w:pPr>
-          <w:hyperlink w:anchor="_Toc226556236" w:history="1">
+          <w:hyperlink w:anchor="_Toc230179536" w:history="1">
             <w:r>
               <w:rPr>
                 <w:rStyle w:val="Hypertextovodkaz"/>
@@ -3314,7 +3322,7 @@
                 <w:rStyle w:val="Hypertextovodkaz"/>
                 <w:noProof/>
               </w:rPr>
-              <w:t>Sass CSS (SCSS)</w:t>
+              <w:t>TypeScript</w:t>
             </w:r>
             <w:r>
               <w:rPr>
@@ -3335,7 +3343,7 @@
                 <w:noProof/>
                 <w:webHidden/>
               </w:rPr>
-              <w:instrText xml:space="preserve"> PAGEREF _Toc226556236 \h </w:instrText>
+              <w:instrText xml:space="preserve"> PAGEREF _Toc230179536 \h </w:instrText>
             </w:r>
             <w:r>
               <w:rPr>
@@ -3355,7 +3363,7 @@
                 <w:noProof/>
                 <w:webHidden/>
               </w:rPr>
-              <w:t>13</w:t>
+              <w:t>12</w:t>
             </w:r>
             <w:r>
               <w:rPr>
@@ -3380,7 +3388,7 @@
               <w:lang w:eastAsia="cs-CZ"/>
             </w:rPr>
           </w:pPr>
-          <w:hyperlink w:anchor="_Toc226556237" w:history="1">
+          <w:hyperlink w:anchor="_Toc230179537" w:history="1">
             <w:r>
               <w:rPr>
                 <w:rStyle w:val="Hypertextovodkaz"/>
@@ -3402,7 +3410,7 @@
                 <w:rStyle w:val="Hypertextovodkaz"/>
                 <w:noProof/>
               </w:rPr>
-              <w:t>Variables</w:t>
+              <w:t>Statické typování</w:t>
             </w:r>
             <w:r>
               <w:rPr>
@@ -3423,7 +3431,7 @@
                 <w:noProof/>
                 <w:webHidden/>
               </w:rPr>
-              <w:instrText xml:space="preserve"> PAGEREF _Toc226556237 \h </w:instrText>
+              <w:instrText xml:space="preserve"> PAGEREF _Toc230179537 \h </w:instrText>
             </w:r>
             <w:r>
               <w:rPr>
@@ -3468,7 +3476,7 @@
               <w:lang w:eastAsia="cs-CZ"/>
             </w:rPr>
           </w:pPr>
-          <w:hyperlink w:anchor="_Toc226556238" w:history="1">
+          <w:hyperlink w:anchor="_Toc230179538" w:history="1">
             <w:r>
               <w:rPr>
                 <w:rStyle w:val="Hypertextovodkaz"/>
@@ -3490,7 +3498,7 @@
                 <w:rStyle w:val="Hypertextovodkaz"/>
                 <w:noProof/>
               </w:rPr>
-              <w:t>Nesting</w:t>
+              <w:t>Interfaces a typy</w:t>
             </w:r>
             <w:r>
               <w:rPr>
@@ -3511,7 +3519,7 @@
                 <w:noProof/>
                 <w:webHidden/>
               </w:rPr>
-              <w:instrText xml:space="preserve"> PAGEREF _Toc226556238 \h </w:instrText>
+              <w:instrText xml:space="preserve"> PAGEREF _Toc230179538 \h </w:instrText>
             </w:r>
             <w:r>
               <w:rPr>
@@ -3556,7 +3564,7 @@
               <w:lang w:eastAsia="cs-CZ"/>
             </w:rPr>
           </w:pPr>
-          <w:hyperlink w:anchor="_Toc226556239" w:history="1">
+          <w:hyperlink w:anchor="_Toc230179539" w:history="1">
             <w:r>
               <w:rPr>
                 <w:rStyle w:val="Hypertextovodkaz"/>
@@ -3578,7 +3586,7 @@
                 <w:rStyle w:val="Hypertextovodkaz"/>
                 <w:noProof/>
               </w:rPr>
-              <w:t>Mixiny</w:t>
+              <w:t>Dekorátory a metadata</w:t>
             </w:r>
             <w:r>
               <w:rPr>
@@ -3599,7 +3607,95 @@
                 <w:noProof/>
                 <w:webHidden/>
               </w:rPr>
-              <w:instrText xml:space="preserve"> PAGEREF _Toc226556239 \h </w:instrText>
+              <w:instrText xml:space="preserve"> PAGEREF _Toc230179539 \h </w:instrText>
+            </w:r>
+            <w:r>
+              <w:rPr>
+                <w:noProof/>
+                <w:webHidden/>
+              </w:rPr>
+            </w:r>
+            <w:r>
+              <w:rPr>
+                <w:noProof/>
+                <w:webHidden/>
+              </w:rPr>
+              <w:fldChar w:fldCharType="separate"/>
+            </w:r>
+            <w:r>
+              <w:rPr>
+                <w:noProof/>
+                <w:webHidden/>
+              </w:rPr>
+              <w:t>13</w:t>
+            </w:r>
+            <w:r>
+              <w:rPr>
+                <w:noProof/>
+                <w:webHidden/>
+              </w:rPr>
+              <w:fldChar w:fldCharType="end"/>
+            </w:r>
+          </w:hyperlink>
+        </w:p>
+        <w:p>
+          <w:pPr>
+            <w:pStyle w:val="Obsah3"/>
+            <w:tabs>
+              <w:tab w:val="left" w:pos="1200"/>
+              <w:tab w:val="right" w:leader="dot" w:pos="9628"/>
+            </w:tabs>
+            <w:rPr>
+              <w:rFonts w:asciiTheme="minorHAnsi" w:eastAsiaTheme="minorEastAsia" w:hAnsiTheme="minorHAnsi"/>
+              <w:noProof/>
+              <w:sz w:val="24"/>
+              <w:lang w:eastAsia="cs-CZ"/>
+            </w:rPr>
+          </w:pPr>
+          <w:hyperlink w:anchor="_Toc230179540" w:history="1">
+            <w:r>
+              <w:rPr>
+                <w:rStyle w:val="Hypertextovodkaz"/>
+                <w:noProof/>
+              </w:rPr>
+              <w:t>1.4.4.</w:t>
+            </w:r>
+            <w:r>
+              <w:rPr>
+                <w:rFonts w:asciiTheme="minorHAnsi" w:eastAsiaTheme="minorEastAsia" w:hAnsiTheme="minorHAnsi"/>
+                <w:noProof/>
+                <w:sz w:val="24"/>
+                <w:lang w:eastAsia="cs-CZ"/>
+              </w:rPr>
+              <w:tab/>
+            </w:r>
+            <w:r>
+              <w:rPr>
+                <w:rStyle w:val="Hypertextovodkaz"/>
+                <w:noProof/>
+              </w:rPr>
+              <w:t>Generické typy</w:t>
+            </w:r>
+            <w:r>
+              <w:rPr>
+                <w:noProof/>
+                <w:webHidden/>
+              </w:rPr>
+              <w:tab/>
+            </w:r>
+            <w:r>
+              <w:rPr>
+                <w:noProof/>
+                <w:webHidden/>
+              </w:rPr>
+              <w:fldChar w:fldCharType="begin"/>
+            </w:r>
+            <w:r>
+              <w:rPr>
+                <w:noProof/>
+                <w:webHidden/>
+              </w:rPr>
+              <w:instrText xml:space="preserve"> PAGEREF _Toc230179540 \h </w:instrText>
             </w:r>
             <w:r>
               <w:rPr>
@@ -3644,7 +3740,7 @@
               <w:lang w:eastAsia="cs-CZ"/>
             </w:rPr>
           </w:pPr>
-          <w:hyperlink w:anchor="_Toc226556240" w:history="1">
+          <w:hyperlink w:anchor="_Toc230179541" w:history="1">
             <w:r>
               <w:rPr>
                 <w:rStyle w:val="Hypertextovodkaz"/>
@@ -3687,7 +3783,7 @@
                 <w:noProof/>
                 <w:webHidden/>
               </w:rPr>
-              <w:instrText xml:space="preserve"> PAGEREF _Toc226556240 \h </w:instrText>
+              <w:instrText xml:space="preserve"> PAGEREF _Toc230179541 \h </w:instrText>
             </w:r>
             <w:r>
               <w:rPr>
@@ -3732,7 +3828,7 @@
               <w:lang w:eastAsia="cs-CZ"/>
             </w:rPr>
           </w:pPr>
-          <w:hyperlink w:anchor="_Toc226556241" w:history="1">
+          <w:hyperlink w:anchor="_Toc230179542" w:history="1">
             <w:r>
               <w:rPr>
                 <w:rStyle w:val="Hypertextovodkaz"/>
@@ -3775,7 +3871,7 @@
                 <w:noProof/>
                 <w:webHidden/>
               </w:rPr>
-              <w:instrText xml:space="preserve"> PAGEREF _Toc226556241 \h </w:instrText>
+              <w:instrText xml:space="preserve"> PAGEREF _Toc230179542 \h </w:instrText>
             </w:r>
             <w:r>
               <w:rPr>
@@ -3820,7 +3916,7 @@
               <w:lang w:eastAsia="cs-CZ"/>
             </w:rPr>
           </w:pPr>
-          <w:hyperlink w:anchor="_Toc226556242" w:history="1">
+          <w:hyperlink w:anchor="_Toc230179543" w:history="1">
             <w:r>
               <w:rPr>
                 <w:rStyle w:val="Hypertextovodkaz"/>
@@ -3842,7 +3938,7 @@
                 <w:rStyle w:val="Hypertextovodkaz"/>
                 <w:noProof/>
               </w:rPr>
-              <w:t>Příprava repositáře</w:t>
+              <w:t>Modelovaní dat a služby</w:t>
             </w:r>
             <w:r>
               <w:rPr>
@@ -3863,7 +3959,7 @@
                 <w:noProof/>
                 <w:webHidden/>
               </w:rPr>
-              <w:instrText xml:space="preserve"> PAGEREF _Toc226556242 \h </w:instrText>
+              <w:instrText xml:space="preserve"> PAGEREF _Toc230179543 \h </w:instrText>
             </w:r>
             <w:r>
               <w:rPr>
@@ -3908,7 +4004,7 @@
               <w:lang w:eastAsia="cs-CZ"/>
             </w:rPr>
           </w:pPr>
-          <w:hyperlink w:anchor="_Toc226556243" w:history="1">
+          <w:hyperlink w:anchor="_Toc230179544" w:history="1">
             <w:r>
               <w:rPr>
                 <w:rStyle w:val="Hypertextovodkaz"/>
@@ -3930,7 +4026,7 @@
                 <w:rStyle w:val="Hypertextovodkaz"/>
                 <w:noProof/>
               </w:rPr>
-              <w:t>První kroky před vývojem</w:t>
+              <w:t>Hlavní UI a navigace</w:t>
             </w:r>
             <w:r>
               <w:rPr>
@@ -3951,7 +4047,7 @@
                 <w:noProof/>
                 <w:webHidden/>
               </w:rPr>
-              <w:instrText xml:space="preserve"> PAGEREF _Toc226556243 \h </w:instrText>
+              <w:instrText xml:space="preserve"> PAGEREF _Toc230179544 \h </w:instrText>
             </w:r>
             <w:r>
               <w:rPr>
@@ -3971,7 +4067,7 @@
                 <w:noProof/>
                 <w:webHidden/>
               </w:rPr>
-              <w:t>14</w:t>
+              <w:t>15</w:t>
             </w:r>
             <w:r>
               <w:rPr>
@@ -3996,7 +4092,7 @@
               <w:lang w:eastAsia="cs-CZ"/>
             </w:rPr>
           </w:pPr>
-          <w:hyperlink w:anchor="_Toc226556244" w:history="1">
+          <w:hyperlink w:anchor="_Toc230179545" w:history="1">
             <w:r>
               <w:rPr>
                 <w:rStyle w:val="Hypertextovodkaz"/>
@@ -4018,7 +4114,7 @@
                 <w:rStyle w:val="Hypertextovodkaz"/>
                 <w:noProof/>
               </w:rPr>
-              <w:t>Modelovaní dat a služby</w:t>
+              <w:t>Formulář pro vytváření nových návyků</w:t>
             </w:r>
             <w:r>
               <w:rPr>
@@ -4039,7 +4135,7 @@
                 <w:noProof/>
                 <w:webHidden/>
               </w:rPr>
-              <w:instrText xml:space="preserve"> PAGEREF _Toc226556244 \h </w:instrText>
+              <w:instrText xml:space="preserve"> PAGEREF _Toc230179545 \h </w:instrText>
             </w:r>
             <w:r>
               <w:rPr>
@@ -4059,7 +4155,7 @@
                 <w:noProof/>
                 <w:webHidden/>
               </w:rPr>
-              <w:t>14</w:t>
+              <w:t>16</w:t>
             </w:r>
             <w:r>
               <w:rPr>
@@ -4084,7 +4180,7 @@
               <w:lang w:eastAsia="cs-CZ"/>
             </w:rPr>
           </w:pPr>
-          <w:hyperlink w:anchor="_Toc226556245" w:history="1">
+          <w:hyperlink w:anchor="_Toc230179546" w:history="1">
             <w:r>
               <w:rPr>
                 <w:rStyle w:val="Hypertextovodkaz"/>
@@ -4106,7 +4202,7 @@
                 <w:rStyle w:val="Hypertextovodkaz"/>
                 <w:noProof/>
               </w:rPr>
-              <w:t>Hlavní UI a navigace</w:t>
+              <w:t>Seznamy návyků</w:t>
             </w:r>
             <w:r>
               <w:rPr>
@@ -4127,7 +4223,7 @@
                 <w:noProof/>
                 <w:webHidden/>
               </w:rPr>
-              <w:instrText xml:space="preserve"> PAGEREF _Toc226556245 \h </w:instrText>
+              <w:instrText xml:space="preserve"> PAGEREF _Toc230179546 \h </w:instrText>
             </w:r>
             <w:r>
               <w:rPr>
@@ -4147,7 +4243,7 @@
                 <w:noProof/>
                 <w:webHidden/>
               </w:rPr>
-              <w:t>14</w:t>
+              <w:t>17</w:t>
             </w:r>
             <w:r>
               <w:rPr>
@@ -4172,7 +4268,7 @@
               <w:lang w:eastAsia="cs-CZ"/>
             </w:rPr>
           </w:pPr>
-          <w:hyperlink w:anchor="_Toc226556246" w:history="1">
+          <w:hyperlink w:anchor="_Toc230179547" w:history="1">
             <w:r>
               <w:rPr>
                 <w:rStyle w:val="Hypertextovodkaz"/>
@@ -4194,7 +4290,7 @@
                 <w:rStyle w:val="Hypertextovodkaz"/>
                 <w:noProof/>
               </w:rPr>
-              <w:t>Formulář pro vytváření nových návyků</w:t>
+              <w:t>Vizualizace plnění návyku</w:t>
             </w:r>
             <w:r>
               <w:rPr>
@@ -4215,7 +4311,7 @@
                 <w:noProof/>
                 <w:webHidden/>
               </w:rPr>
-              <w:instrText xml:space="preserve"> PAGEREF _Toc226556246 \h </w:instrText>
+              <w:instrText xml:space="preserve"> PAGEREF _Toc230179547 \h </w:instrText>
             </w:r>
             <w:r>
               <w:rPr>
@@ -4235,7 +4331,7 @@
                 <w:noProof/>
                 <w:webHidden/>
               </w:rPr>
-              <w:t>14</w:t>
+              <w:t>18</w:t>
             </w:r>
             <w:r>
               <w:rPr>
@@ -4260,7 +4356,7 @@
               <w:lang w:eastAsia="cs-CZ"/>
             </w:rPr>
           </w:pPr>
-          <w:hyperlink w:anchor="_Toc226556247" w:history="1">
+          <w:hyperlink w:anchor="_Toc230179548" w:history="1">
             <w:r>
               <w:rPr>
                 <w:rStyle w:val="Hypertextovodkaz"/>
@@ -4282,7 +4378,7 @@
                 <w:rStyle w:val="Hypertextovodkaz"/>
                 <w:noProof/>
               </w:rPr>
-              <w:t>Seznamy návyků</w:t>
+              <w:t>Styling a responzivita aplikace</w:t>
             </w:r>
             <w:r>
               <w:rPr>
@@ -4303,7 +4399,7 @@
                 <w:noProof/>
                 <w:webHidden/>
               </w:rPr>
-              <w:instrText xml:space="preserve"> PAGEREF _Toc226556247 \h </w:instrText>
+              <w:instrText xml:space="preserve"> PAGEREF _Toc230179548 \h </w:instrText>
             </w:r>
             <w:r>
               <w:rPr>
@@ -4323,7 +4419,7 @@
                 <w:noProof/>
                 <w:webHidden/>
               </w:rPr>
-              <w:t>14</w:t>
+              <w:t>19</w:t>
             </w:r>
             <w:r>
               <w:rPr>
@@ -4348,7 +4444,7 @@
               <w:lang w:eastAsia="cs-CZ"/>
             </w:rPr>
           </w:pPr>
-          <w:hyperlink w:anchor="_Toc226556248" w:history="1">
+          <w:hyperlink w:anchor="_Toc230179549" w:history="1">
             <w:r>
               <w:rPr>
                 <w:rStyle w:val="Hypertextovodkaz"/>
@@ -4370,7 +4466,7 @@
                 <w:rStyle w:val="Hypertextovodkaz"/>
                 <w:noProof/>
               </w:rPr>
-              <w:t>Vizualizace plnění návyku</w:t>
+              <w:t>Optimalizace</w:t>
             </w:r>
             <w:r>
               <w:rPr>
@@ -4391,7 +4487,7 @@
                 <w:noProof/>
                 <w:webHidden/>
               </w:rPr>
-              <w:instrText xml:space="preserve"> PAGEREF _Toc226556248 \h </w:instrText>
+              <w:instrText xml:space="preserve"> PAGEREF _Toc230179549 \h </w:instrText>
             </w:r>
             <w:r>
               <w:rPr>
@@ -4411,7 +4507,183 @@
                 <w:noProof/>
                 <w:webHidden/>
               </w:rPr>
-              <w:t>14</w:t>
+              <w:t>21</w:t>
+            </w:r>
+            <w:r>
+              <w:rPr>
+                <w:noProof/>
+                <w:webHidden/>
+              </w:rPr>
+              <w:fldChar w:fldCharType="end"/>
+            </w:r>
+          </w:hyperlink>
+        </w:p>
+        <w:p>
+          <w:pPr>
+            <w:pStyle w:val="Obsah3"/>
+            <w:tabs>
+              <w:tab w:val="left" w:pos="1200"/>
+              <w:tab w:val="right" w:leader="dot" w:pos="9628"/>
+            </w:tabs>
+            <w:rPr>
+              <w:rFonts w:asciiTheme="minorHAnsi" w:eastAsiaTheme="minorEastAsia" w:hAnsiTheme="minorHAnsi"/>
+              <w:noProof/>
+              <w:sz w:val="24"/>
+              <w:lang w:eastAsia="cs-CZ"/>
+            </w:rPr>
+          </w:pPr>
+          <w:hyperlink w:anchor="_Toc230179550" w:history="1">
+            <w:r>
+              <w:rPr>
+                <w:rStyle w:val="Hypertextovodkaz"/>
+                <w:noProof/>
+              </w:rPr>
+              <w:t>2.7.1.</w:t>
+            </w:r>
+            <w:r>
+              <w:rPr>
+                <w:rFonts w:asciiTheme="minorHAnsi" w:eastAsiaTheme="minorEastAsia" w:hAnsiTheme="minorHAnsi"/>
+                <w:noProof/>
+                <w:sz w:val="24"/>
+                <w:lang w:eastAsia="cs-CZ"/>
+              </w:rPr>
+              <w:tab/>
+            </w:r>
+            <w:r>
+              <w:rPr>
+                <w:rStyle w:val="Hypertextovodkaz"/>
+                <w:noProof/>
+              </w:rPr>
+              <w:t>Centrální servis pro data (DataService)</w:t>
+            </w:r>
+            <w:r>
+              <w:rPr>
+                <w:noProof/>
+                <w:webHidden/>
+              </w:rPr>
+              <w:tab/>
+            </w:r>
+            <w:r>
+              <w:rPr>
+                <w:noProof/>
+                <w:webHidden/>
+              </w:rPr>
+              <w:fldChar w:fldCharType="begin"/>
+            </w:r>
+            <w:r>
+              <w:rPr>
+                <w:noProof/>
+                <w:webHidden/>
+              </w:rPr>
+              <w:instrText xml:space="preserve"> PAGEREF _Toc230179550 \h </w:instrText>
+            </w:r>
+            <w:r>
+              <w:rPr>
+                <w:noProof/>
+                <w:webHidden/>
+              </w:rPr>
+            </w:r>
+            <w:r>
+              <w:rPr>
+                <w:noProof/>
+                <w:webHidden/>
+              </w:rPr>
+              <w:fldChar w:fldCharType="separate"/>
+            </w:r>
+            <w:r>
+              <w:rPr>
+                <w:noProof/>
+                <w:webHidden/>
+              </w:rPr>
+              <w:t>21</w:t>
+            </w:r>
+            <w:r>
+              <w:rPr>
+                <w:noProof/>
+                <w:webHidden/>
+              </w:rPr>
+              <w:fldChar w:fldCharType="end"/>
+            </w:r>
+          </w:hyperlink>
+        </w:p>
+        <w:p>
+          <w:pPr>
+            <w:pStyle w:val="Obsah3"/>
+            <w:tabs>
+              <w:tab w:val="left" w:pos="1200"/>
+              <w:tab w:val="right" w:leader="dot" w:pos="9628"/>
+            </w:tabs>
+            <w:rPr>
+              <w:rFonts w:asciiTheme="minorHAnsi" w:eastAsiaTheme="minorEastAsia" w:hAnsiTheme="minorHAnsi"/>
+              <w:noProof/>
+              <w:sz w:val="24"/>
+              <w:lang w:eastAsia="cs-CZ"/>
+            </w:rPr>
+          </w:pPr>
+          <w:hyperlink w:anchor="_Toc230179551" w:history="1">
+            <w:r>
+              <w:rPr>
+                <w:rStyle w:val="Hypertextovodkaz"/>
+                <w:noProof/>
+              </w:rPr>
+              <w:t>2.7.2.</w:t>
+            </w:r>
+            <w:r>
+              <w:rPr>
+                <w:rFonts w:asciiTheme="minorHAnsi" w:eastAsiaTheme="minorEastAsia" w:hAnsiTheme="minorHAnsi"/>
+                <w:noProof/>
+                <w:sz w:val="24"/>
+                <w:lang w:eastAsia="cs-CZ"/>
+              </w:rPr>
+              <w:tab/>
+            </w:r>
+            <w:r>
+              <w:rPr>
+                <w:rStyle w:val="Hypertextovodkaz"/>
+                <w:noProof/>
+              </w:rPr>
+              <w:t>Omezení přepočtů grafu</w:t>
+            </w:r>
+            <w:r>
+              <w:rPr>
+                <w:noProof/>
+                <w:webHidden/>
+              </w:rPr>
+              <w:tab/>
+            </w:r>
+            <w:r>
+              <w:rPr>
+                <w:noProof/>
+                <w:webHidden/>
+              </w:rPr>
+              <w:fldChar w:fldCharType="begin"/>
+            </w:r>
+            <w:r>
+              <w:rPr>
+                <w:noProof/>
+                <w:webHidden/>
+              </w:rPr>
+              <w:instrText xml:space="preserve"> PAGEREF _Toc230179551 \h </w:instrText>
+            </w:r>
+            <w:r>
+              <w:rPr>
+                <w:noProof/>
+                <w:webHidden/>
+              </w:rPr>
+            </w:r>
+            <w:r>
+              <w:rPr>
+                <w:noProof/>
+                <w:webHidden/>
+              </w:rPr>
+              <w:fldChar w:fldCharType="separate"/>
+            </w:r>
+            <w:r>
+              <w:rPr>
+                <w:noProof/>
+                <w:webHidden/>
+              </w:rPr>
+              <w:t>21</w:t>
             </w:r>
             <w:r>
               <w:rPr>
@@ -4436,7 +4708,7 @@
               <w:lang w:eastAsia="cs-CZ"/>
             </w:rPr>
           </w:pPr>
-          <w:hyperlink w:anchor="_Toc226556249" w:history="1">
+          <w:hyperlink w:anchor="_Toc230179552" w:history="1">
             <w:r>
               <w:rPr>
                 <w:rStyle w:val="Hypertextovodkaz"/>
@@ -4458,7 +4730,7 @@
                 <w:rStyle w:val="Hypertextovodkaz"/>
                 <w:noProof/>
               </w:rPr>
-              <w:t>Styling a responzivita aplikace</w:t>
+              <w:t>Zkušenosti nabrané z této práce</w:t>
             </w:r>
             <w:r>
               <w:rPr>
@@ -4479,7 +4751,7 @@
                 <w:noProof/>
                 <w:webHidden/>
               </w:rPr>
-              <w:instrText xml:space="preserve"> PAGEREF _Toc226556249 \h </w:instrText>
+              <w:instrText xml:space="preserve"> PAGEREF _Toc230179552 \h </w:instrText>
             </w:r>
             <w:r>
               <w:rPr>
@@ -4499,7 +4771,7 @@
                 <w:noProof/>
                 <w:webHidden/>
               </w:rPr>
-              <w:t>14</w:t>
+              <w:t>21</w:t>
             </w:r>
             <w:r>
               <w:rPr>
@@ -4512,9 +4784,9 @@
         </w:p>
         <w:p>
           <w:pPr>
-            <w:pStyle w:val="Obsah2"/>
+            <w:pStyle w:val="Obsah3"/>
             <w:tabs>
-              <w:tab w:val="left" w:pos="960"/>
+              <w:tab w:val="left" w:pos="1200"/>
               <w:tab w:val="right" w:leader="dot" w:pos="9628"/>
             </w:tabs>
             <w:rPr>
@@ -4524,13 +4796,13 @@
               <w:lang w:eastAsia="cs-CZ"/>
             </w:rPr>
           </w:pPr>
-          <w:hyperlink w:anchor="_Toc226556250" w:history="1">
+          <w:hyperlink w:anchor="_Toc230179553" w:history="1">
             <w:r>
               <w:rPr>
                 <w:rStyle w:val="Hypertextovodkaz"/>
                 <w:noProof/>
               </w:rPr>
-              <w:t>2.9.</w:t>
+              <w:t>2.8.1.</w:t>
             </w:r>
             <w:r>
               <w:rPr>
@@ -4546,7 +4818,7 @@
                 <w:rStyle w:val="Hypertextovodkaz"/>
                 <w:noProof/>
               </w:rPr>
-              <w:t>Optimalizace</w:t>
+              <w:t>Angular komponentový přístup</w:t>
             </w:r>
             <w:r>
               <w:rPr>
@@ -4567,7 +4839,7 @@
                 <w:noProof/>
                 <w:webHidden/>
               </w:rPr>
-              <w:instrText xml:space="preserve"> PAGEREF _Toc226556250 \h </w:instrText>
+              <w:instrText xml:space="preserve"> PAGEREF _Toc230179553 \h </w:instrText>
             </w:r>
             <w:r>
               <w:rPr>
@@ -4587,7 +4859,7 @@
                 <w:noProof/>
                 <w:webHidden/>
               </w:rPr>
-              <w:t>14</w:t>
+              <w:t>21</w:t>
             </w:r>
             <w:r>
               <w:rPr>
@@ -4600,9 +4872,9 @@
         </w:p>
         <w:p>
           <w:pPr>
-            <w:pStyle w:val="Obsah2"/>
+            <w:pStyle w:val="Obsah3"/>
             <w:tabs>
-              <w:tab w:val="left" w:pos="960"/>
+              <w:tab w:val="left" w:pos="1200"/>
               <w:tab w:val="right" w:leader="dot" w:pos="9628"/>
             </w:tabs>
             <w:rPr>
@@ -4612,13 +4884,13 @@
               <w:lang w:eastAsia="cs-CZ"/>
             </w:rPr>
           </w:pPr>
-          <w:hyperlink w:anchor="_Toc226556251" w:history="1">
+          <w:hyperlink w:anchor="_Toc230179554" w:history="1">
             <w:r>
               <w:rPr>
                 <w:rStyle w:val="Hypertextovodkaz"/>
                 <w:noProof/>
               </w:rPr>
-              <w:t>2.10.</w:t>
+              <w:t>2.8.2.</w:t>
             </w:r>
             <w:r>
               <w:rPr>
@@ -4634,7 +4906,7 @@
                 <w:rStyle w:val="Hypertextovodkaz"/>
                 <w:noProof/>
               </w:rPr>
-              <w:t>Zkušenosti nabrané z této práce</w:t>
+              <w:t>Práce se stavem a službami</w:t>
             </w:r>
             <w:r>
               <w:rPr>
@@ -4655,7 +4927,7 @@
                 <w:noProof/>
                 <w:webHidden/>
               </w:rPr>
-              <w:instrText xml:space="preserve"> PAGEREF _Toc226556251 \h </w:instrText>
+              <w:instrText xml:space="preserve"> PAGEREF _Toc230179554 \h </w:instrText>
             </w:r>
             <w:r>
               <w:rPr>
@@ -4675,7 +4947,271 @@
                 <w:noProof/>
                 <w:webHidden/>
               </w:rPr>
-              <w:t>14</w:t>
+              <w:t>21</w:t>
+            </w:r>
+            <w:r>
+              <w:rPr>
+                <w:noProof/>
+                <w:webHidden/>
+              </w:rPr>
+              <w:fldChar w:fldCharType="end"/>
+            </w:r>
+          </w:hyperlink>
+        </w:p>
+        <w:p>
+          <w:pPr>
+            <w:pStyle w:val="Obsah3"/>
+            <w:tabs>
+              <w:tab w:val="left" w:pos="1200"/>
+              <w:tab w:val="right" w:leader="dot" w:pos="9628"/>
+            </w:tabs>
+            <w:rPr>
+              <w:rFonts w:asciiTheme="minorHAnsi" w:eastAsiaTheme="minorEastAsia" w:hAnsiTheme="minorHAnsi"/>
+              <w:noProof/>
+              <w:sz w:val="24"/>
+              <w:lang w:eastAsia="cs-CZ"/>
+            </w:rPr>
+          </w:pPr>
+          <w:hyperlink w:anchor="_Toc230179555" w:history="1">
+            <w:r>
+              <w:rPr>
+                <w:rStyle w:val="Hypertextovodkaz"/>
+                <w:noProof/>
+              </w:rPr>
+              <w:t>2.8.3.</w:t>
+            </w:r>
+            <w:r>
+              <w:rPr>
+                <w:rFonts w:asciiTheme="minorHAnsi" w:eastAsiaTheme="minorEastAsia" w:hAnsiTheme="minorHAnsi"/>
+                <w:noProof/>
+                <w:sz w:val="24"/>
+                <w:lang w:eastAsia="cs-CZ"/>
+              </w:rPr>
+              <w:tab/>
+            </w:r>
+            <w:r>
+              <w:rPr>
+                <w:rStyle w:val="Hypertextovodkaz"/>
+                <w:noProof/>
+              </w:rPr>
+              <w:t>Validace a ošetření uživatelských vstupů</w:t>
+            </w:r>
+            <w:r>
+              <w:rPr>
+                <w:noProof/>
+                <w:webHidden/>
+              </w:rPr>
+              <w:tab/>
+            </w:r>
+            <w:r>
+              <w:rPr>
+                <w:noProof/>
+                <w:webHidden/>
+              </w:rPr>
+              <w:fldChar w:fldCharType="begin"/>
+            </w:r>
+            <w:r>
+              <w:rPr>
+                <w:noProof/>
+                <w:webHidden/>
+              </w:rPr>
+              <w:instrText xml:space="preserve"> PAGEREF _Toc230179555 \h </w:instrText>
+            </w:r>
+            <w:r>
+              <w:rPr>
+                <w:noProof/>
+                <w:webHidden/>
+              </w:rPr>
+            </w:r>
+            <w:r>
+              <w:rPr>
+                <w:noProof/>
+                <w:webHidden/>
+              </w:rPr>
+              <w:fldChar w:fldCharType="separate"/>
+            </w:r>
+            <w:r>
+              <w:rPr>
+                <w:noProof/>
+                <w:webHidden/>
+              </w:rPr>
+              <w:t>21</w:t>
+            </w:r>
+            <w:r>
+              <w:rPr>
+                <w:noProof/>
+                <w:webHidden/>
+              </w:rPr>
+              <w:fldChar w:fldCharType="end"/>
+            </w:r>
+          </w:hyperlink>
+        </w:p>
+        <w:p>
+          <w:pPr>
+            <w:pStyle w:val="Obsah3"/>
+            <w:tabs>
+              <w:tab w:val="left" w:pos="1200"/>
+              <w:tab w:val="right" w:leader="dot" w:pos="9628"/>
+            </w:tabs>
+            <w:rPr>
+              <w:rFonts w:asciiTheme="minorHAnsi" w:eastAsiaTheme="minorEastAsia" w:hAnsiTheme="minorHAnsi"/>
+              <w:noProof/>
+              <w:sz w:val="24"/>
+              <w:lang w:eastAsia="cs-CZ"/>
+            </w:rPr>
+          </w:pPr>
+          <w:hyperlink w:anchor="_Toc230179556" w:history="1">
+            <w:r>
+              <w:rPr>
+                <w:rStyle w:val="Hypertextovodkaz"/>
+                <w:noProof/>
+              </w:rPr>
+              <w:t>2.8.4.</w:t>
+            </w:r>
+            <w:r>
+              <w:rPr>
+                <w:rFonts w:asciiTheme="minorHAnsi" w:eastAsiaTheme="minorEastAsia" w:hAnsiTheme="minorHAnsi"/>
+                <w:noProof/>
+                <w:sz w:val="24"/>
+                <w:lang w:eastAsia="cs-CZ"/>
+              </w:rPr>
+              <w:tab/>
+            </w:r>
+            <w:r>
+              <w:rPr>
+                <w:rStyle w:val="Hypertextovodkaz"/>
+                <w:noProof/>
+              </w:rPr>
+              <w:t>Transformace dat pro graf</w:t>
+            </w:r>
+            <w:r>
+              <w:rPr>
+                <w:noProof/>
+                <w:webHidden/>
+              </w:rPr>
+              <w:tab/>
+            </w:r>
+            <w:r>
+              <w:rPr>
+                <w:noProof/>
+                <w:webHidden/>
+              </w:rPr>
+              <w:fldChar w:fldCharType="begin"/>
+            </w:r>
+            <w:r>
+              <w:rPr>
+                <w:noProof/>
+                <w:webHidden/>
+              </w:rPr>
+              <w:instrText xml:space="preserve"> PAGEREF _Toc230179556 \h </w:instrText>
+            </w:r>
+            <w:r>
+              <w:rPr>
+                <w:noProof/>
+                <w:webHidden/>
+              </w:rPr>
+            </w:r>
+            <w:r>
+              <w:rPr>
+                <w:noProof/>
+                <w:webHidden/>
+              </w:rPr>
+              <w:fldChar w:fldCharType="separate"/>
+            </w:r>
+            <w:r>
+              <w:rPr>
+                <w:noProof/>
+                <w:webHidden/>
+              </w:rPr>
+              <w:t>22</w:t>
+            </w:r>
+            <w:r>
+              <w:rPr>
+                <w:noProof/>
+                <w:webHidden/>
+              </w:rPr>
+              <w:fldChar w:fldCharType="end"/>
+            </w:r>
+          </w:hyperlink>
+        </w:p>
+        <w:p>
+          <w:pPr>
+            <w:pStyle w:val="Obsah3"/>
+            <w:tabs>
+              <w:tab w:val="left" w:pos="1200"/>
+              <w:tab w:val="right" w:leader="dot" w:pos="9628"/>
+            </w:tabs>
+            <w:rPr>
+              <w:rFonts w:asciiTheme="minorHAnsi" w:eastAsiaTheme="minorEastAsia" w:hAnsiTheme="minorHAnsi"/>
+              <w:noProof/>
+              <w:sz w:val="24"/>
+              <w:lang w:eastAsia="cs-CZ"/>
+            </w:rPr>
+          </w:pPr>
+          <w:hyperlink w:anchor="_Toc230179557" w:history="1">
+            <w:r>
+              <w:rPr>
+                <w:rStyle w:val="Hypertextovodkaz"/>
+                <w:noProof/>
+              </w:rPr>
+              <w:t>2.8.5.</w:t>
+            </w:r>
+            <w:r>
+              <w:rPr>
+                <w:rFonts w:asciiTheme="minorHAnsi" w:eastAsiaTheme="minorEastAsia" w:hAnsiTheme="minorHAnsi"/>
+                <w:noProof/>
+                <w:sz w:val="24"/>
+                <w:lang w:eastAsia="cs-CZ"/>
+              </w:rPr>
+              <w:tab/>
+            </w:r>
+            <w:r>
+              <w:rPr>
+                <w:rStyle w:val="Hypertextovodkaz"/>
+                <w:noProof/>
+              </w:rPr>
+              <w:t>Uživatelská použitelnost</w:t>
+            </w:r>
+            <w:r>
+              <w:rPr>
+                <w:noProof/>
+                <w:webHidden/>
+              </w:rPr>
+              <w:tab/>
+            </w:r>
+            <w:r>
+              <w:rPr>
+                <w:noProof/>
+                <w:webHidden/>
+              </w:rPr>
+              <w:fldChar w:fldCharType="begin"/>
+            </w:r>
+            <w:r>
+              <w:rPr>
+                <w:noProof/>
+                <w:webHidden/>
+              </w:rPr>
+              <w:instrText xml:space="preserve"> PAGEREF _Toc230179557 \h </w:instrText>
+            </w:r>
+            <w:r>
+              <w:rPr>
+                <w:noProof/>
+                <w:webHidden/>
+              </w:rPr>
+            </w:r>
+            <w:r>
+              <w:rPr>
+                <w:noProof/>
+                <w:webHidden/>
+              </w:rPr>
+              <w:fldChar w:fldCharType="separate"/>
+            </w:r>
+            <w:r>
+              <w:rPr>
+                <w:noProof/>
+                <w:webHidden/>
+              </w:rPr>
+              <w:t>22</w:t>
             </w:r>
             <w:r>
               <w:rPr>
@@ -4699,7 +5235,7 @@
               <w:lang w:eastAsia="cs-CZ"/>
             </w:rPr>
           </w:pPr>
-          <w:hyperlink w:anchor="_Toc226556252" w:history="1">
+          <w:hyperlink w:anchor="_Toc230179558" w:history="1">
             <w:r>
               <w:rPr>
                 <w:rStyle w:val="Hypertextovodkaz"/>
@@ -4726,7 +5262,7 @@
                 <w:noProof/>
                 <w:webHidden/>
               </w:rPr>
-              <w:instrText xml:space="preserve"> PAGEREF _Toc226556252 \h </w:instrText>
+              <w:instrText xml:space="preserve"> PAGEREF _Toc230179558 \h </w:instrText>
             </w:r>
             <w:r>
               <w:rPr>
@@ -4746,7 +5282,7 @@
                 <w:noProof/>
                 <w:webHidden/>
               </w:rPr>
-              <w:t>15</w:t>
+              <w:t>23</w:t>
             </w:r>
             <w:r>
               <w:rPr>
@@ -4770,7 +5306,7 @@
               <w:lang w:eastAsia="cs-CZ"/>
             </w:rPr>
           </w:pPr>
-          <w:hyperlink w:anchor="_Toc226556253" w:history="1">
+          <w:hyperlink w:anchor="_Toc230179559" w:history="1">
             <w:r>
               <w:rPr>
                 <w:rStyle w:val="Hypertextovodkaz"/>
@@ -4797,7 +5333,7 @@
                 <w:noProof/>
                 <w:webHidden/>
               </w:rPr>
-              <w:instrText xml:space="preserve"> PAGEREF _Toc226556253 \h </w:instrText>
+              <w:instrText xml:space="preserve"> PAGEREF _Toc230179559 \h </w:instrText>
             </w:r>
             <w:r>
               <w:rPr>
@@ -4817,7 +5353,7 @@
                 <w:noProof/>
                 <w:webHidden/>
               </w:rPr>
-              <w:t>16</w:t>
+              <w:t>24</w:t>
             </w:r>
             <w:r>
               <w:rPr>
@@ -4841,7 +5377,7 @@
               <w:lang w:eastAsia="cs-CZ"/>
             </w:rPr>
           </w:pPr>
-          <w:hyperlink w:anchor="_Toc226556254" w:history="1">
+          <w:hyperlink w:anchor="_Toc230179560" w:history="1">
             <w:r>
               <w:rPr>
                 <w:rStyle w:val="Hypertextovodkaz"/>
@@ -4868,7 +5404,7 @@
                 <w:noProof/>
                 <w:webHidden/>
               </w:rPr>
-              <w:instrText xml:space="preserve"> PAGEREF _Toc226556254 \h </w:instrText>
+              <w:instrText xml:space="preserve"> PAGEREF _Toc230179560 \h </w:instrText>
             </w:r>
             <w:r>
               <w:rPr>
@@ -4888,7 +5424,7 @@
                 <w:noProof/>
                 <w:webHidden/>
               </w:rPr>
-              <w:t>17</w:t>
+              <w:t>25</w:t>
             </w:r>
             <w:r>
               <w:rPr>
@@ -4912,7 +5448,7 @@
               <w:lang w:eastAsia="cs-CZ"/>
             </w:rPr>
           </w:pPr>
-          <w:hyperlink w:anchor="_Toc226556255" w:history="1">
+          <w:hyperlink w:anchor="_Toc230179561" w:history="1">
             <w:r>
               <w:rPr>
                 <w:rStyle w:val="Hypertextovodkaz"/>
@@ -4939,7 +5475,7 @@
                 <w:noProof/>
                 <w:webHidden/>
               </w:rPr>
-              <w:instrText xml:space="preserve"> PAGEREF _Toc226556255 \h </w:instrText>
+              <w:instrText xml:space="preserve"> PAGEREF _Toc230179561 \h </w:instrText>
             </w:r>
             <w:r>
               <w:rPr>
@@ -4959,7 +5495,7 @@
                 <w:noProof/>
                 <w:webHidden/>
               </w:rPr>
-              <w:t>18</w:t>
+              <w:t>26</w:t>
             </w:r>
             <w:r>
               <w:rPr>
@@ -4983,7 +5519,7 @@
               <w:lang w:eastAsia="cs-CZ"/>
             </w:rPr>
           </w:pPr>
-          <w:hyperlink w:anchor="_Toc226556256" w:history="1">
+          <w:hyperlink w:anchor="_Toc230179562" w:history="1">
             <w:r>
               <w:rPr>
                 <w:rStyle w:val="Hypertextovodkaz"/>
@@ -5010,7 +5546,7 @@
                 <w:noProof/>
                 <w:webHidden/>
               </w:rPr>
-              <w:instrText xml:space="preserve"> PAGEREF _Toc226556256 \h </w:instrText>
+              <w:instrText xml:space="preserve"> PAGEREF _Toc230179562 \h </w:instrText>
             </w:r>
             <w:r>
               <w:rPr>
@@ -5030,7 +5566,7 @@
                 <w:noProof/>
                 <w:webHidden/>
               </w:rPr>
-              <w:t>19</w:t>
+              <w:t>27</w:t>
             </w:r>
             <w:r>
               <w:rPr>
@@ -5054,7 +5590,7 @@
               <w:lang w:eastAsia="cs-CZ"/>
             </w:rPr>
           </w:pPr>
-          <w:hyperlink w:anchor="_Toc226556257" w:history="1">
+          <w:hyperlink w:anchor="_Toc230179563" w:history="1">
             <w:r>
               <w:rPr>
                 <w:rStyle w:val="Hypertextovodkaz"/>
@@ -5081,7 +5617,7 @@
                 <w:noProof/>
                 <w:webHidden/>
               </w:rPr>
-              <w:instrText xml:space="preserve"> PAGEREF _Toc226556257 \h </w:instrText>
+              <w:instrText xml:space="preserve"> PAGEREF _Toc230179563 \h </w:instrText>
             </w:r>
             <w:r>
               <w:rPr>
@@ -5101,7 +5637,7 @@
                 <w:noProof/>
                 <w:webHidden/>
               </w:rPr>
-              <w:t>20</w:t>
+              <w:t>28</w:t>
             </w:r>
             <w:r>
               <w:rPr>
@@ -5153,12 +5689,12 @@
         </w:numPr>
         <w:ind w:left="720"/>
       </w:pPr>
-      <w:bookmarkStart w:id="30" w:name="_Toc226556221"/>
+      <w:bookmarkStart w:id="34" w:name="_Toc230179521"/>
       <w:r>
         <w:lastRenderedPageBreak/>
         <w:t>Úvod</w:t>
       </w:r>
-      <w:bookmarkEnd w:id="30"/>
+      <w:bookmarkEnd w:id="34"/>
     </w:p>
     <w:p>
       <w:r>
@@ -5244,7 +5780,7 @@
       <w:pPr>
         <w:pStyle w:val="Nadpis1"/>
       </w:pPr>
-      <w:bookmarkStart w:id="31" w:name="_Toc226556222"/>
+      <w:bookmarkStart w:id="35" w:name="_Toc230179522"/>
       <w:r>
         <w:lastRenderedPageBreak/>
         <w:t>Teoretická čás</w:t>
@@ -5252,7 +5788,7 @@
       <w:r>
         <w:t>t</w:t>
       </w:r>
-      <w:bookmarkEnd w:id="31"/>
+      <w:bookmarkEnd w:id="35"/>
     </w:p>
     <w:p>
       <w:r>
@@ -5269,6 +5805,7 @@
       <w:pPr>
         <w:pStyle w:val="Nadpis2"/>
       </w:pPr>
+      <w:bookmarkStart w:id="36" w:name="_Toc230179523"/>
       <w:proofErr w:type="spellStart"/>
       <w:r>
         <w:t>Visual</w:t>
@@ -5281,6 +5818,7 @@
       <w:r>
         <w:t>Code</w:t>
       </w:r>
+      <w:bookmarkEnd w:id="36"/>
       <w:proofErr w:type="spellEnd"/>
     </w:p>
     <w:p>
@@ -5317,9 +5855,11 @@
       <w:pPr>
         <w:pStyle w:val="Nadpis3"/>
       </w:pPr>
+      <w:bookmarkStart w:id="37" w:name="_Toc230179524"/>
       <w:r>
         <w:t>Školní zkušenost</w:t>
       </w:r>
+      <w:bookmarkEnd w:id="37"/>
     </w:p>
     <w:p>
       <w:pPr>
@@ -5337,24 +5877,18 @@
       </w:r>
       <w:proofErr w:type="spellEnd"/>
       <w:r>
-        <w:t xml:space="preserve"> Studio Codu je, že s jinými vývojovými nástroji nemám až takové zkušenosti jako právě s tímto. Na naší škole se většina práce s kódem dělá právě v tomto IDE, takže jsem si postupně osvojil jeho ovládání, práci s projektem, </w:t>
-      </w:r>
-      <w:proofErr w:type="gramStart"/>
-      <w:r>
-        <w:t>ladění</w:t>
-      </w:r>
-      <w:proofErr w:type="gramEnd"/>
-      <w:r>
-        <w:t xml:space="preserve"> a hlavně i to, jak v něm pracovat „běžně“, aniž bych pořád musel hledat, kde se jaká možnost nachází. To u ročníkové práce pomáhá hodně, protože když se člověk soustředí hlavně na samotnou aplikaci, nechce ztrácet čas tím, že se učí nové IDE nebo nové nastavení.</w:t>
+        <w:t xml:space="preserve"> Studio Codu je, že s jinými vývojovými nástroji nemám až takové zkušenosti jako právě s tímto. Na naší škole se většina práce s kódem dělá právě v tomto IDE, takže jsem si postupně osvojil jeho ovládání, práci s projektem, ladění a hlavně i to, jak v něm pracovat „běžně“, aniž bych pořád musel hledat, kde se jaká možnost nachází. To u ročníkové práce pomáhá hodně, protože když se člověk soustředí hlavně na samotnou aplikaci, nechce ztrácet čas tím, že se učí nové IDE nebo nové nastavení.</w:t>
       </w:r>
     </w:p>
     <w:p>
       <w:pPr>
         <w:pStyle w:val="Nadpis3"/>
       </w:pPr>
+      <w:bookmarkStart w:id="38" w:name="_Toc230179525"/>
       <w:r>
         <w:t>Integrovaný terminál</w:t>
       </w:r>
+      <w:bookmarkEnd w:id="38"/>
     </w:p>
     <w:p>
       <w:pPr>
@@ -5387,6 +5921,7 @@
       <w:pPr>
         <w:pStyle w:val="Nadpis3"/>
       </w:pPr>
+      <w:bookmarkStart w:id="39" w:name="_Toc230179526"/>
       <w:r>
         <w:t>Rozšíření prostředí (</w:t>
       </w:r>
@@ -5398,6 +5933,7 @@
       <w:r>
         <w:t>)</w:t>
       </w:r>
+      <w:bookmarkEnd w:id="39"/>
     </w:p>
     <w:p>
       <w:pPr>
@@ -5454,9 +5990,11 @@
       <w:pPr>
         <w:pStyle w:val="Nadpis3"/>
       </w:pPr>
+      <w:bookmarkStart w:id="40" w:name="_Toc230179527"/>
       <w:r>
         <w:t>Git podpora</w:t>
       </w:r>
+      <w:bookmarkEnd w:id="40"/>
     </w:p>
     <w:p>
       <w:pPr>
@@ -5498,10 +6036,12 @@
       <w:pPr>
         <w:pStyle w:val="Nadpis2"/>
       </w:pPr>
+      <w:bookmarkStart w:id="41" w:name="_Toc230179528"/>
       <w:r>
         <w:lastRenderedPageBreak/>
         <w:t>Angular</w:t>
       </w:r>
+      <w:bookmarkEnd w:id="41"/>
     </w:p>
     <w:p>
       <w:r>
@@ -5541,6 +6081,7 @@
       <w:pPr>
         <w:pStyle w:val="Nadpis3"/>
       </w:pPr>
+      <w:bookmarkStart w:id="42" w:name="_Toc230179529"/>
       <w:r>
         <w:t>SCSS (</w:t>
       </w:r>
@@ -5552,6 +6093,7 @@
       <w:r>
         <w:t xml:space="preserve"> CSS)</w:t>
       </w:r>
+      <w:bookmarkEnd w:id="42"/>
     </w:p>
     <w:p>
       <w:pPr>
@@ -5576,9 +6118,11 @@
       <w:pPr>
         <w:pStyle w:val="Nadpis3"/>
       </w:pPr>
+      <w:bookmarkStart w:id="43" w:name="_Toc230179530"/>
       <w:r>
         <w:t>Komponentová architektura</w:t>
       </w:r>
+      <w:bookmarkEnd w:id="43"/>
     </w:p>
     <w:p>
       <w:pPr>
@@ -5599,6 +6143,7 @@
       <w:pPr>
         <w:pStyle w:val="Nadpis3"/>
       </w:pPr>
+      <w:bookmarkStart w:id="44" w:name="_Toc230179531"/>
       <w:proofErr w:type="spellStart"/>
       <w:r>
         <w:t>Services</w:t>
@@ -5619,6 +6164,7 @@
       <w:r>
         <w:t>Injection</w:t>
       </w:r>
+      <w:bookmarkEnd w:id="44"/>
       <w:proofErr w:type="spellEnd"/>
     </w:p>
     <w:p>
@@ -5688,9 +6234,11 @@
       <w:pPr>
         <w:pStyle w:val="Nadpis3"/>
       </w:pPr>
+      <w:bookmarkStart w:id="45" w:name="_Toc230179532"/>
       <w:r>
         <w:t>Angular CLI</w:t>
       </w:r>
+      <w:bookmarkEnd w:id="45"/>
     </w:p>
     <w:p>
       <w:pPr>
@@ -5755,9 +6303,11 @@
       <w:pPr>
         <w:pStyle w:val="Nadpis2"/>
       </w:pPr>
+      <w:bookmarkStart w:id="46" w:name="_Toc230179533"/>
       <w:r>
         <w:t>Angular Material</w:t>
       </w:r>
+      <w:bookmarkEnd w:id="46"/>
     </w:p>
     <w:p>
       <w:pPr>
@@ -5806,9 +6356,11 @@
       <w:pPr>
         <w:pStyle w:val="Nadpis3"/>
       </w:pPr>
+      <w:bookmarkStart w:id="47" w:name="_Toc230179534"/>
       <w:r>
         <w:t>Karty a panely</w:t>
       </w:r>
+      <w:bookmarkEnd w:id="47"/>
     </w:p>
     <w:p>
       <w:r>
@@ -5851,9 +6403,11 @@
       <w:pPr>
         <w:pStyle w:val="Nadpis3"/>
       </w:pPr>
+      <w:bookmarkStart w:id="48" w:name="_Toc230179535"/>
       <w:r>
         <w:t>Formulářové prvky a ikony</w:t>
       </w:r>
+      <w:bookmarkEnd w:id="48"/>
     </w:p>
     <w:p>
       <w:pPr>
@@ -5886,10 +6440,12 @@
       <w:pPr>
         <w:pStyle w:val="Nadpis2"/>
       </w:pPr>
+      <w:bookmarkStart w:id="49" w:name="_Toc230179536"/>
       <w:proofErr w:type="spellStart"/>
       <w:r>
         <w:t>TypeScript</w:t>
       </w:r>
+      <w:bookmarkEnd w:id="49"/>
       <w:proofErr w:type="spellEnd"/>
     </w:p>
     <w:p>
@@ -5983,10 +6539,12 @@
       <w:pPr>
         <w:pStyle w:val="Nadpis3"/>
       </w:pPr>
+      <w:bookmarkStart w:id="50" w:name="_Toc230179537"/>
       <w:r>
         <w:lastRenderedPageBreak/>
         <w:t>Statické typování</w:t>
       </w:r>
+      <w:bookmarkEnd w:id="50"/>
     </w:p>
     <w:p>
       <w:r>
@@ -6050,6 +6608,7 @@
       <w:pPr>
         <w:pStyle w:val="Nadpis3"/>
       </w:pPr>
+      <w:bookmarkStart w:id="51" w:name="_Toc230179538"/>
       <w:proofErr w:type="spellStart"/>
       <w:r>
         <w:t>Interfaces</w:t>
@@ -6058,6 +6617,7 @@
       <w:r>
         <w:t xml:space="preserve"> a typy</w:t>
       </w:r>
+      <w:bookmarkEnd w:id="51"/>
     </w:p>
     <w:p>
       <w:proofErr w:type="spellStart"/>
@@ -6076,16 +6636,11 @@
       <w:r>
         <w:t xml:space="preserve"> slouží </w:t>
       </w:r>
-      <w:proofErr w:type="gramStart"/>
       <w:r>
         <w:t xml:space="preserve">pro </w:t>
       </w:r>
       <w:r>
-        <w:t xml:space="preserve"> definování</w:t>
-      </w:r>
-      <w:proofErr w:type="gramEnd"/>
-      <w:r>
-        <w:t xml:space="preserve"> struktury objektů. V projektu jsem definoval interface pro Habit Tento interface zajišťuje, že všechny návyky v aplikaci mají konzistentní strukturu a jsou správně typované.</w:t>
+        <w:t xml:space="preserve"> definování struktury objektů. V projektu jsem definoval interface pro Habit Tento interface zajišťuje, že všechny návyky v aplikaci mají konzistentní strukturu a jsou správně typované.</w:t>
       </w:r>
     </w:p>
     <w:p>
@@ -6113,6 +6668,7 @@
       <w:pPr>
         <w:pStyle w:val="Nadpis3"/>
       </w:pPr>
+      <w:bookmarkStart w:id="52" w:name="_Toc230179539"/>
       <w:proofErr w:type="spellStart"/>
       <w:r>
         <w:t>Dekorátory</w:t>
@@ -6121,6 +6677,7 @@
       <w:r>
         <w:t xml:space="preserve"> a metadata</w:t>
       </w:r>
+      <w:bookmarkEnd w:id="52"/>
     </w:p>
     <w:p>
       <w:proofErr w:type="spellStart"/>
@@ -6213,9 +6770,11 @@
       <w:pPr>
         <w:pStyle w:val="Nadpis3"/>
       </w:pPr>
+      <w:bookmarkStart w:id="53" w:name="_Toc230179540"/>
       <w:r>
         <w:t>Generické typy</w:t>
       </w:r>
+      <w:bookmarkEnd w:id="53"/>
     </w:p>
     <w:p>
       <w:proofErr w:type="spellStart"/>
@@ -6285,9 +6844,11 @@
       <w:pPr>
         <w:pStyle w:val="Nadpis2"/>
       </w:pPr>
+      <w:bookmarkStart w:id="54" w:name="_Toc230179541"/>
       <w:r>
         <w:t>Netlify</w:t>
       </w:r>
+      <w:bookmarkEnd w:id="54"/>
     </w:p>
     <w:p>
       <w:r>
@@ -6314,10 +6875,7 @@
       <w:r>
         <w:t>Protože je Habit-Tracker single-page aplikace bez potřeby databáze, Netlify mi dává smysl. Aplikaci lze nasadit tak, že se build verze projektu publikují do produkce. Netlify sice umožňuje i použití databáze, ale v mém případě jsem ji zatím nepotřeboval – data si totiž aplikace ukládá lokálně v prohlížeči. Díky tomu je nasazení jednodušší a celý projekt je soustředěný spíš na samotnou funkcionalitu UI.</w:t>
       </w:r>
-    </w:p>
-    <w:p>
-      <w:r>
-        <w:lastRenderedPageBreak/>
+      <w:r>
         <w:br w:type="page"/>
       </w:r>
     </w:p>
@@ -6325,7 +6883,7 @@
       <w:pPr>
         <w:pStyle w:val="Nadpis1"/>
       </w:pPr>
-      <w:bookmarkStart w:id="32" w:name="_Toc226556241"/>
+      <w:bookmarkStart w:id="55" w:name="_Toc230179542"/>
       <w:r>
         <w:lastRenderedPageBreak/>
         <w:t>Praktická</w:t>
@@ -6333,7 +6891,7 @@
       <w:r>
         <w:t xml:space="preserve"> část</w:t>
       </w:r>
-      <w:bookmarkEnd w:id="32"/>
+      <w:bookmarkEnd w:id="55"/>
     </w:p>
     <w:p>
       <w:r>
@@ -6351,22 +6909,21 @@
       <w:r>
         <w:t xml:space="preserve"> Kapitoly této sekce budou věnovány jednotlivým částem vývoje</w:t>
       </w:r>
-      <w:bookmarkStart w:id="33" w:name="_Toc226556244"/>
     </w:p>
     <w:p>
       <w:pPr>
         <w:pStyle w:val="Nadpis2"/>
       </w:pPr>
+      <w:bookmarkStart w:id="56" w:name="_Toc230179543"/>
       <w:r>
         <w:t>Modelovaní</w:t>
       </w:r>
       <w:r>
         <w:t xml:space="preserve"> dat a služby</w:t>
       </w:r>
-      <w:bookmarkEnd w:id="33"/>
-    </w:p>
-    <w:p>
-      <w:bookmarkStart w:id="34" w:name="_Toc226556245"/>
+      <w:bookmarkEnd w:id="56"/>
+    </w:p>
+    <w:p>
       <w:r>
         <w:t xml:space="preserve">V aplikaci je datová vrstva postavená na jednoduchém modelu návyků. Základní datová struktura Habit obsahuje informace potřebné pro zobrazení v UI a pro výpočet/uchování historie plnění. Každý návyk má </w:t>
       </w:r>
@@ -6553,16 +7110,11 @@
             <w:tcW w:w="3210" w:type="dxa"/>
           </w:tcPr>
           <w:p>
-            <w:proofErr w:type="gramStart"/>
             <w:r>
               <w:t>U</w:t>
             </w:r>
             <w:r>
-              <w:t>kazatel</w:t>
-            </w:r>
-            <w:proofErr w:type="gramEnd"/>
-            <w:r>
-              <w:t xml:space="preserve"> zda daný habit náleží skupině kladné nebo špatné</w:t>
+              <w:t>kazatel zda daný habit náleží skupině kladné nebo špatné</w:t>
             </w:r>
           </w:p>
         </w:tc>
@@ -6584,7 +7136,6 @@
           </w:tcPr>
           <w:p>
             <w:proofErr w:type="spellStart"/>
-            <w:proofErr w:type="gramStart"/>
             <w:r>
               <w:t>Array</w:t>
             </w:r>
@@ -6593,7 +7144,6 @@
               <w:t>&lt;</w:t>
             </w:r>
             <w:proofErr w:type="spellStart"/>
-            <w:proofErr w:type="gramEnd"/>
             <w:r>
               <w:t>Date</w:t>
             </w:r>
@@ -6671,7 +7221,7 @@
         <w:pStyle w:val="Titulek"/>
         <w:jc w:val="left"/>
       </w:pPr>
-      <w:bookmarkStart w:id="35" w:name="_Toc230173683"/>
+      <w:bookmarkStart w:id="57" w:name="_Toc230173683"/>
       <w:r>
         <w:t xml:space="preserve">Tabulka </w:t>
       </w:r>
@@ -6696,7 +7246,7 @@
       <w:r>
         <w:t>: Vlastnosti rozhraní Habit</w:t>
       </w:r>
-      <w:bookmarkEnd w:id="35"/>
+      <w:bookmarkEnd w:id="57"/>
     </w:p>
     <w:p>
       <w:r>
@@ -6799,13 +7349,13 @@
       <w:pPr>
         <w:pStyle w:val="Nadpis2"/>
       </w:pPr>
+      <w:bookmarkStart w:id="58" w:name="_Toc230179544"/>
       <w:r>
         <w:t>Hlavní UI a navigace</w:t>
       </w:r>
-      <w:bookmarkEnd w:id="34"/>
-    </w:p>
-    <w:p>
-      <w:bookmarkStart w:id="36" w:name="_Toc226556246"/>
+      <w:bookmarkEnd w:id="58"/>
+    </w:p>
+    <w:p>
       <w:r>
         <w:t xml:space="preserve">Uživatelské rozhraní jsem postavil jako jednostránková aplikace ve frameworku Angular. Základní struktura aplikace se nachází v </w:t>
       </w:r>
@@ -7001,89 +7551,145 @@
         <w:t>), který obsahuje základní akce:</w:t>
       </w:r>
     </w:p>
-    <w:p>
-      <w:pPr>
-        <w:pStyle w:val="Odrkovseznam"/>
+    <w:tbl>
+      <w:tblPr>
+        <w:tblStyle w:val="Mkatabulky"/>
+        <w:tblW w:w="0" w:type="auto"/>
+        <w:tblLook w:val="04A0" w:firstRow="1" w:lastRow="0" w:firstColumn="1" w:lastColumn="0" w:noHBand="0" w:noVBand="1"/>
+      </w:tblPr>
+      <w:tblGrid>
+        <w:gridCol w:w="4814"/>
+        <w:gridCol w:w="4814"/>
+      </w:tblGrid>
+      <w:tr>
+        <w:tc>
+          <w:tcPr>
+            <w:tcW w:w="4814" w:type="dxa"/>
+          </w:tcPr>
+          <w:p>
+            <w:r>
+              <w:t>Pojmenování akce</w:t>
+            </w:r>
+          </w:p>
+        </w:tc>
+        <w:tc>
+          <w:tcPr>
+            <w:tcW w:w="4814" w:type="dxa"/>
+          </w:tcPr>
+          <w:p>
+            <w:r>
+              <w:t>Činnost akce</w:t>
+            </w:r>
+          </w:p>
+        </w:tc>
+      </w:tr>
+      <w:tr>
+        <w:tc>
+          <w:tcPr>
+            <w:tcW w:w="4814" w:type="dxa"/>
+          </w:tcPr>
+          <w:p>
+            <w:r>
+              <w:t xml:space="preserve">Export </w:t>
+            </w:r>
+            <w:proofErr w:type="spellStart"/>
+            <w:r>
+              <w:t>Habits</w:t>
+            </w:r>
+            <w:proofErr w:type="spellEnd"/>
+          </w:p>
+        </w:tc>
+        <w:tc>
+          <w:tcPr>
+            <w:tcW w:w="4814" w:type="dxa"/>
+          </w:tcPr>
+          <w:p>
+            <w:r>
+              <w:t>dovolí stáhnutí aktuálních dat jako JSON soubor,</w:t>
+            </w:r>
+          </w:p>
+        </w:tc>
+      </w:tr>
+      <w:tr>
+        <w:tc>
+          <w:tcPr>
+            <w:tcW w:w="4814" w:type="dxa"/>
+          </w:tcPr>
+          <w:p>
+            <w:r>
+              <w:t xml:space="preserve">Import </w:t>
+            </w:r>
+            <w:proofErr w:type="spellStart"/>
+            <w:r>
+              <w:t>Habits</w:t>
+            </w:r>
+            <w:proofErr w:type="spellEnd"/>
+          </w:p>
+        </w:tc>
+        <w:tc>
+          <w:tcPr>
+            <w:tcW w:w="4814" w:type="dxa"/>
+          </w:tcPr>
+          <w:p>
+            <w:pPr>
+              <w:keepNext/>
+            </w:pPr>
+            <w:r>
+              <w:t xml:space="preserve">otevře </w:t>
+            </w:r>
+            <w:proofErr w:type="spellStart"/>
+            <w:r>
+              <w:t>overlay</w:t>
+            </w:r>
+            <w:proofErr w:type="spellEnd"/>
+            <w:r>
+              <w:t xml:space="preserve">/okno pro import návyků, které je realizováno pomocí Angular Material komponenty </w:t>
+            </w:r>
+            <w:proofErr w:type="spellStart"/>
+            <w:r>
+              <w:t>stepper</w:t>
+            </w:r>
+            <w:proofErr w:type="spellEnd"/>
+            <w:r>
+              <w:t>.</w:t>
+            </w:r>
+          </w:p>
+        </w:tc>
+      </w:tr>
+    </w:tbl>
+    <w:p>
+      <w:pPr>
+        <w:pStyle w:val="Titulek"/>
+      </w:pPr>
+      <w:r>
+        <w:t xml:space="preserve">Tabulka </w:t>
+      </w:r>
+      <w:r>
+        <w:fldChar w:fldCharType="begin"/>
+      </w:r>
+      <w:r>
+        <w:instrText xml:space="preserve"> SEQ Tabulka \* ARABIC </w:instrText>
+      </w:r>
+      <w:r>
+        <w:fldChar w:fldCharType="separate"/>
+      </w:r>
+      <w:r>
         <w:rPr>
-          <w:rFonts w:eastAsiaTheme="minorHAnsi"/>
+          <w:noProof/>
         </w:rPr>
-      </w:pPr>
-      <w:r>
-        <w:rPr>
-          <w:rFonts w:eastAsiaTheme="minorHAnsi"/>
-        </w:rPr>
-        <w:t xml:space="preserve">Export </w:t>
-      </w:r>
-      <w:proofErr w:type="spellStart"/>
-      <w:r>
-        <w:rPr>
-          <w:rFonts w:eastAsiaTheme="minorHAnsi"/>
-        </w:rPr>
-        <w:t>Habits</w:t>
-      </w:r>
-      <w:proofErr w:type="spellEnd"/>
-      <w:r>
-        <w:rPr>
-          <w:rFonts w:eastAsiaTheme="minorHAnsi"/>
-        </w:rPr>
-        <w:t xml:space="preserve"> – dovolí stáhnutí aktuálních dat jako JSON soubor,</w:t>
-      </w:r>
-    </w:p>
-    <w:p>
-      <w:pPr>
-        <w:pStyle w:val="Odrkovseznam"/>
-        <w:rPr>
-          <w:rFonts w:eastAsiaTheme="minorHAnsi"/>
-        </w:rPr>
-      </w:pPr>
-      <w:r>
-        <w:rPr>
-          <w:rFonts w:eastAsiaTheme="minorHAnsi"/>
-        </w:rPr>
-        <w:t xml:space="preserve">Import </w:t>
-      </w:r>
-      <w:proofErr w:type="spellStart"/>
-      <w:r>
-        <w:rPr>
-          <w:rFonts w:eastAsiaTheme="minorHAnsi"/>
-        </w:rPr>
-        <w:t>Habits</w:t>
-      </w:r>
-      <w:proofErr w:type="spellEnd"/>
-      <w:r>
-        <w:rPr>
-          <w:rFonts w:eastAsiaTheme="minorHAnsi"/>
-        </w:rPr>
-        <w:t xml:space="preserve"> – otevře </w:t>
-      </w:r>
-      <w:proofErr w:type="spellStart"/>
-      <w:r>
-        <w:rPr>
-          <w:rFonts w:eastAsiaTheme="minorHAnsi"/>
-        </w:rPr>
-        <w:t>overlay</w:t>
-      </w:r>
-      <w:proofErr w:type="spellEnd"/>
-      <w:r>
-        <w:rPr>
-          <w:rFonts w:eastAsiaTheme="minorHAnsi"/>
-        </w:rPr>
-        <w:t xml:space="preserve">/okno pro import návyků, které je realizováno pomocí Angular Material komponenty </w:t>
-      </w:r>
-      <w:proofErr w:type="spellStart"/>
-      <w:r>
-        <w:rPr>
-          <w:rFonts w:eastAsiaTheme="minorHAnsi"/>
-        </w:rPr>
-        <w:t>stepper</w:t>
-      </w:r>
-      <w:proofErr w:type="spellEnd"/>
-      <w:r>
-        <w:rPr>
-          <w:rFonts w:eastAsiaTheme="minorHAnsi"/>
-        </w:rPr>
-        <w:t>.</w:t>
-      </w:r>
+        <w:t>2</w:t>
+      </w:r>
+      <w:r>
+        <w:fldChar w:fldCharType="end"/>
+      </w:r>
+      <w:r>
+        <w:t xml:space="preserve">: Akce </w:t>
+      </w:r>
+      <w:proofErr w:type="spellStart"/>
+      <w:r>
+        <w:t>toolbaru</w:t>
+      </w:r>
+      <w:proofErr w:type="spellEnd"/>
     </w:p>
     <w:p>
       <w:r>
@@ -7174,7 +7780,7 @@
       <w:pPr>
         <w:pStyle w:val="Titulek"/>
       </w:pPr>
-      <w:bookmarkStart w:id="37" w:name="_Toc230174422"/>
+      <w:bookmarkStart w:id="59" w:name="_Toc230174422"/>
       <w:r>
         <w:t xml:space="preserve">Obrázek </w:t>
       </w:r>
@@ -7199,16 +7805,17 @@
       <w:r>
         <w:t>: Hlavní UI</w:t>
       </w:r>
-      <w:bookmarkEnd w:id="37"/>
+      <w:bookmarkEnd w:id="59"/>
     </w:p>
     <w:p>
       <w:pPr>
         <w:pStyle w:val="Nadpis2"/>
       </w:pPr>
+      <w:bookmarkStart w:id="60" w:name="_Toc230179545"/>
       <w:r>
         <w:t>Formulář pro vytváření nových návyků</w:t>
       </w:r>
-      <w:bookmarkEnd w:id="36"/>
+      <w:bookmarkEnd w:id="60"/>
     </w:p>
     <w:p>
       <w:r>
@@ -7289,128 +7896,289 @@
         <w:t>Formulář obsahuje pole:</w:t>
       </w:r>
     </w:p>
-    <w:p>
-      <w:pPr>
-        <w:pStyle w:val="Odrkovseznam"/>
-      </w:pPr>
-      <w:r>
-        <w:t>název (</w:t>
-      </w:r>
-      <w:proofErr w:type="spellStart"/>
-      <w:r>
-        <w:t>name</w:t>
-      </w:r>
-      <w:proofErr w:type="spellEnd"/>
-      <w:r>
-        <w:t>) – povinný údaj, omezení na maximálně 15 znaků,</w:t>
-      </w:r>
-    </w:p>
-    <w:p>
-      <w:pPr>
-        <w:pStyle w:val="Odrkovseznam"/>
-      </w:pPr>
-      <w:r>
-        <w:t>popis (</w:t>
-      </w:r>
-      <w:proofErr w:type="spellStart"/>
-      <w:r>
-        <w:t>description</w:t>
-      </w:r>
-      <w:proofErr w:type="spellEnd"/>
-      <w:r>
-        <w:t>) – doplňkový údaj, ale v kódu se ověřuje, aby nebyl prázdný (maximálně 25 znaků),</w:t>
-      </w:r>
-    </w:p>
-    <w:p>
-      <w:pPr>
-        <w:pStyle w:val="Odrkovseznam"/>
-      </w:pPr>
-      <w:r>
-        <w:t>typ (type) – volba kategorie (defaultně „positive“), validovaná jako povinná pro rozřazení do typů.</w:t>
-      </w:r>
-    </w:p>
-    <w:p>
-      <w:r>
-        <w:t>Klíčová je také logika proti duplicitám a přehnaně zapsaným návykům/zlozvykům. Před odesláním formuláře se provede kontrola, zda už neexistuje návyk stejného typu, který má shodný název nebo shodný popis (porovnání je case-</w:t>
-      </w:r>
-      <w:proofErr w:type="spellStart"/>
-      <w:r>
-        <w:t>insensitive</w:t>
-      </w:r>
-      <w:proofErr w:type="spellEnd"/>
-      <w:r>
-        <w:t xml:space="preserve"> a pracuje s </w:t>
-      </w:r>
-      <w:proofErr w:type="spellStart"/>
-      <w:r>
-        <w:t>trimmed</w:t>
-      </w:r>
-      <w:proofErr w:type="spellEnd"/>
-      <w:r>
-        <w:t xml:space="preserve"> řetězci pro lehčí zpracování textů). Pokud duplicita nastane, zobrazí se příslušná hláška a data se neuloží, okno zůstane otevřené.</w:t>
-      </w:r>
-    </w:p>
-    <w:p>
-      <w:r>
-        <w:t>Po naopak úspěšném odeslání se:</w:t>
-      </w:r>
-    </w:p>
-    <w:p>
-      <w:pPr>
-        <w:pStyle w:val="Odrkovseznam"/>
-      </w:pPr>
-      <w:r>
-        <w:lastRenderedPageBreak/>
-        <w:t xml:space="preserve">vytvoří nový záznam návyku v </w:t>
-      </w:r>
-      <w:proofErr w:type="spellStart"/>
-      <w:r>
-        <w:t>DataService</w:t>
-      </w:r>
-      <w:proofErr w:type="spellEnd"/>
-      <w:r>
-        <w:t>,</w:t>
-      </w:r>
-    </w:p>
-    <w:p>
-      <w:pPr>
-        <w:pStyle w:val="Odrkovseznam"/>
-      </w:pPr>
-      <w:r>
-        <w:t>formulář se resetuje,</w:t>
-      </w:r>
-    </w:p>
-    <w:p>
-      <w:pPr>
-        <w:pStyle w:val="Odrkovseznam"/>
-      </w:pPr>
-      <w:proofErr w:type="spellStart"/>
-      <w:r>
-        <w:t>overlay</w:t>
-      </w:r>
-      <w:proofErr w:type="spellEnd"/>
-      <w:r>
-        <w:t xml:space="preserve"> se uzavře.</w:t>
-      </w:r>
-    </w:p>
-    <w:p>
-      <w:r>
-        <w:t>Tím je zajištěno, že se uživatelská data ukládají konzistentně a že aplikace není „zanesená“ duplicitami, které by zhoršovaly orientaci v seznamech.</w:t>
-      </w:r>
-    </w:p>
-    <w:p>
-      <w:pPr>
-        <w:keepNext/>
-      </w:pPr>
+    <w:tbl>
+      <w:tblPr>
+        <w:tblStyle w:val="Mkatabulky"/>
+        <w:tblW w:w="0" w:type="auto"/>
+        <w:tblLook w:val="04A0" w:firstRow="1" w:lastRow="0" w:firstColumn="1" w:lastColumn="0" w:noHBand="0" w:noVBand="1"/>
+      </w:tblPr>
+      <w:tblGrid>
+        <w:gridCol w:w="3209"/>
+        <w:gridCol w:w="3209"/>
+        <w:gridCol w:w="3210"/>
+      </w:tblGrid>
+      <w:tr>
+        <w:tc>
+          <w:tcPr>
+            <w:tcW w:w="3209" w:type="dxa"/>
+          </w:tcPr>
+          <w:p>
+            <w:r>
+              <w:t>Vstup</w:t>
+            </w:r>
+          </w:p>
+        </w:tc>
+        <w:tc>
+          <w:tcPr>
+            <w:tcW w:w="3209" w:type="dxa"/>
+          </w:tcPr>
+          <w:p>
+            <w:r>
+              <w:t>Popis</w:t>
+            </w:r>
+          </w:p>
+        </w:tc>
+        <w:tc>
+          <w:tcPr>
+            <w:tcW w:w="3210" w:type="dxa"/>
+          </w:tcPr>
+          <w:p>
+            <w:r>
+              <w:t>Kontrola</w:t>
+            </w:r>
+          </w:p>
+        </w:tc>
+      </w:tr>
+      <w:tr>
+        <w:tc>
+          <w:tcPr>
+            <w:tcW w:w="3209" w:type="dxa"/>
+          </w:tcPr>
+          <w:p>
+            <w:r>
+              <w:t>Název</w:t>
+            </w:r>
+          </w:p>
+        </w:tc>
+        <w:tc>
+          <w:tcPr>
+            <w:tcW w:w="3209" w:type="dxa"/>
+          </w:tcPr>
+          <w:p>
+            <w:r>
+              <w:t xml:space="preserve">Určuje vlastnost </w:t>
+            </w:r>
+            <w:proofErr w:type="spellStart"/>
+            <w:r>
+              <w:t>name</w:t>
+            </w:r>
+            <w:proofErr w:type="spellEnd"/>
+            <w:r>
+              <w:t xml:space="preserve"> z Habit rozhraní</w:t>
+            </w:r>
+          </w:p>
+        </w:tc>
+        <w:tc>
+          <w:tcPr>
+            <w:tcW w:w="3210" w:type="dxa"/>
+          </w:tcPr>
+          <w:p>
+            <w:r>
+              <w:t xml:space="preserve">Zda není </w:t>
+            </w:r>
+            <w:proofErr w:type="spellStart"/>
+            <w:r>
+              <w:t>prazdný</w:t>
+            </w:r>
+            <w:proofErr w:type="spellEnd"/>
+            <w:r>
+              <w:t xml:space="preserve"> a maximum 20 znaků</w:t>
+            </w:r>
+          </w:p>
+        </w:tc>
+      </w:tr>
+      <w:tr>
+        <w:tc>
+          <w:tcPr>
+            <w:tcW w:w="3209" w:type="dxa"/>
+          </w:tcPr>
+          <w:p>
+            <w:r>
+              <w:t>Popis</w:t>
+            </w:r>
+          </w:p>
+        </w:tc>
+        <w:tc>
+          <w:tcPr>
+            <w:tcW w:w="3209" w:type="dxa"/>
+          </w:tcPr>
+          <w:p>
+            <w:r>
+              <w:t xml:space="preserve">Určuje vlastnost </w:t>
+            </w:r>
+            <w:proofErr w:type="spellStart"/>
+            <w:r>
+              <w:t>description</w:t>
+            </w:r>
+            <w:proofErr w:type="spellEnd"/>
+            <w:r>
+              <w:t xml:space="preserve"> z Habit rozhraní</w:t>
+            </w:r>
+          </w:p>
+        </w:tc>
+        <w:tc>
+          <w:tcPr>
+            <w:tcW w:w="3210" w:type="dxa"/>
+          </w:tcPr>
+          <w:p>
+            <w:r>
+              <w:t xml:space="preserve">Zda není </w:t>
+            </w:r>
+            <w:proofErr w:type="spellStart"/>
+            <w:r>
+              <w:t>prádný</w:t>
+            </w:r>
+            <w:proofErr w:type="spellEnd"/>
+            <w:r>
+              <w:t xml:space="preserve"> a maximum 30 znaků</w:t>
+            </w:r>
+          </w:p>
+        </w:tc>
+      </w:tr>
+      <w:tr>
+        <w:tc>
+          <w:tcPr>
+            <w:tcW w:w="3209" w:type="dxa"/>
+          </w:tcPr>
+          <w:p>
+            <w:r>
+              <w:t>Typ</w:t>
+            </w:r>
+          </w:p>
+        </w:tc>
+        <w:tc>
+          <w:tcPr>
+            <w:tcW w:w="3209" w:type="dxa"/>
+          </w:tcPr>
+          <w:p>
+            <w:r>
+              <w:t>Určuje vlastnost type z habit rozhraní</w:t>
+            </w:r>
+          </w:p>
+        </w:tc>
+        <w:tc>
+          <w:tcPr>
+            <w:tcW w:w="3210" w:type="dxa"/>
+          </w:tcPr>
+          <w:p>
+            <w:pPr>
+              <w:keepNext/>
+            </w:pPr>
+            <w:r>
+              <w:t>Nepotřebné</w:t>
+            </w:r>
+          </w:p>
+        </w:tc>
+      </w:tr>
+    </w:tbl>
+    <w:p>
+      <w:pPr>
+        <w:pStyle w:val="Titulek"/>
+      </w:pPr>
+      <w:r>
+        <w:t xml:space="preserve">Tabulka </w:t>
+      </w:r>
+      <w:r>
+        <w:fldChar w:fldCharType="begin"/>
+      </w:r>
+      <w:r>
+        <w:instrText xml:space="preserve"> SEQ Tabulka \* ARABIC </w:instrText>
+      </w:r>
+      <w:r>
+        <w:fldChar w:fldCharType="separate"/>
+      </w:r>
       <w:r>
         <w:rPr>
           <w:noProof/>
         </w:rPr>
+        <w:t>3</w:t>
+      </w:r>
+      <w:r>
+        <w:fldChar w:fldCharType="end"/>
+      </w:r>
+      <w:r>
+        <w:t>: Vstupy formuláře</w:t>
+      </w:r>
+    </w:p>
+    <w:p>
+      <w:r>
+        <w:lastRenderedPageBreak/>
+        <w:t>Klíčová je také logika proti duplicitám a přehnaně zapsaným návykům/zlozvykům. Před odesláním formuláře se provede kontrola, zda už neexistuje návyk stejného typu, který má shodný název nebo shodný popis (porovnání je case-</w:t>
+      </w:r>
+      <w:proofErr w:type="spellStart"/>
+      <w:r>
+        <w:t>insensitive</w:t>
+      </w:r>
+      <w:proofErr w:type="spellEnd"/>
+      <w:r>
+        <w:t xml:space="preserve"> a pracuje s </w:t>
+      </w:r>
+      <w:proofErr w:type="spellStart"/>
+      <w:r>
+        <w:t>trimmed</w:t>
+      </w:r>
+      <w:proofErr w:type="spellEnd"/>
+      <w:r>
+        <w:t xml:space="preserve"> řetězci pro lehčí zpracování textů). Pokud duplicita nastane, zobrazí se příslušná hláška a data se neuloží, okno zůstane otevřené.</w:t>
+      </w:r>
+    </w:p>
+    <w:p>
+      <w:r>
+        <w:t>Po naopak úspěšném odeslání se:</w:t>
+      </w:r>
+    </w:p>
+    <w:p>
+      <w:pPr>
+        <w:pStyle w:val="Odrkovseznam"/>
+      </w:pPr>
+      <w:r>
+        <w:t xml:space="preserve">vytvoří nový záznam návyku v </w:t>
+      </w:r>
+      <w:proofErr w:type="spellStart"/>
+      <w:r>
+        <w:t>DataService</w:t>
+      </w:r>
+      <w:proofErr w:type="spellEnd"/>
+      <w:r>
+        <w:t>,</w:t>
+      </w:r>
+    </w:p>
+    <w:p>
+      <w:pPr>
+        <w:pStyle w:val="Odrkovseznam"/>
+      </w:pPr>
+      <w:r>
+        <w:t>formulář se resetuje,</w:t>
+      </w:r>
+    </w:p>
+    <w:p>
+      <w:pPr>
+        <w:pStyle w:val="Odrkovseznam"/>
+      </w:pPr>
+      <w:proofErr w:type="spellStart"/>
+      <w:r>
+        <w:t>overlay</w:t>
+      </w:r>
+      <w:proofErr w:type="spellEnd"/>
+      <w:r>
+        <w:t xml:space="preserve"> se uzavře.</w:t>
+      </w:r>
+    </w:p>
+    <w:p>
+      <w:r>
+        <w:t>Tím je zajištěno, že se uživatelská data ukládají konzistentně a že aplikace není „zanesená“ duplicitami, které by zhoršovaly orientaci v seznamech.</w:t>
+      </w:r>
+    </w:p>
+    <w:p>
+      <w:pPr>
+        <w:keepNext/>
+      </w:pPr>
+      <w:r>
         <w:drawing>
-          <wp:inline distT="0" distB="0" distL="0" distR="0" wp14:anchorId="126FC2F7" wp14:editId="26E59146">
-            <wp:extent cx="3296285" cy="4144010"/>
-            <wp:effectExtent l="0" t="0" r="0" b="8890"/>
-            <wp:docPr id="1114890055" name="Obrázek 3"/>
+          <wp:inline distT="0" distB="0" distL="0" distR="0" wp14:anchorId="4D44FAA8" wp14:editId="08A65775">
+            <wp:extent cx="1928741" cy="2477386"/>
+            <wp:effectExtent l="0" t="0" r="0" b="0"/>
+            <wp:docPr id="504508239" name="Obrázek 1"/>
             <wp:cNvGraphicFramePr>
               <a:graphicFrameLocks xmlns:a="http://schemas.openxmlformats.org/drawingml/2006/main" noChangeAspect="1"/>
             </wp:cNvGraphicFramePr>
@@ -7418,33 +8186,23 @@
               <a:graphicData uri="http://schemas.openxmlformats.org/drawingml/2006/picture">
                 <pic:pic xmlns:pic="http://schemas.openxmlformats.org/drawingml/2006/picture">
                   <pic:nvPicPr>
-                    <pic:cNvPr id="0" name="Picture 2"/>
-                    <pic:cNvPicPr>
-                      <a:picLocks noChangeAspect="1" noChangeArrowheads="1"/>
-                    </pic:cNvPicPr>
+                    <pic:cNvPr id="504508239" name=""/>
+                    <pic:cNvPicPr/>
                   </pic:nvPicPr>
                   <pic:blipFill>
-                    <a:blip r:embed="rId15">
-                      <a:extLst>
-                        <a:ext uri="{28A0092B-C50C-407E-A947-70E740481C1C}">
-                          <a14:useLocalDpi xmlns:a14="http://schemas.microsoft.com/office/drawing/2010/main" val="0"/>
-                        </a:ext>
-                      </a:extLst>
-                    </a:blip>
-                    <a:srcRect/>
+                    <a:blip r:embed="rId15"/>
                     <a:stretch>
                       <a:fillRect/>
                     </a:stretch>
                   </pic:blipFill>
-                  <pic:spPr bwMode="auto">
+                  <pic:spPr>
                     <a:xfrm>
                       <a:off x="0" y="0"/>
-                      <a:ext cx="3296285" cy="4144010"/>
+                      <a:ext cx="1957900" cy="2514839"/>
                     </a:xfrm>
                     <a:prstGeom prst="rect">
                       <a:avLst/>
                     </a:prstGeom>
-                    <a:noFill/>
                   </pic:spPr>
                 </pic:pic>
               </a:graphicData>
@@ -7457,7 +8215,7 @@
       <w:pPr>
         <w:pStyle w:val="Titulek"/>
       </w:pPr>
-      <w:bookmarkStart w:id="38" w:name="_Toc230174423"/>
+      <w:bookmarkStart w:id="61" w:name="_Toc230174423"/>
       <w:r>
         <w:t xml:space="preserve">Obrázek </w:t>
       </w:r>
@@ -7482,17 +8240,17 @@
       <w:r>
         <w:t>: Formulář pro přidání nových habitů</w:t>
       </w:r>
-      <w:bookmarkEnd w:id="38"/>
+      <w:bookmarkEnd w:id="61"/>
     </w:p>
     <w:p>
       <w:pPr>
         <w:pStyle w:val="Nadpis2"/>
       </w:pPr>
-      <w:bookmarkStart w:id="39" w:name="_Toc226556247"/>
+      <w:bookmarkStart w:id="62" w:name="_Toc230179546"/>
       <w:r>
         <w:t>Seznamy návyků</w:t>
       </w:r>
-      <w:bookmarkEnd w:id="39"/>
+      <w:bookmarkEnd w:id="62"/>
     </w:p>
     <w:p>
       <w:r>
@@ -7515,72 +8273,172 @@
         <w:t>. Tento způsob je výhodný, protože:</w:t>
       </w:r>
     </w:p>
-    <w:p>
-      <w:pPr>
-        <w:pStyle w:val="Odrkovseznam"/>
-      </w:pPr>
-      <w:proofErr w:type="spellStart"/>
-      <w:r>
-        <w:t>HabitsListComponent</w:t>
-      </w:r>
-      <w:proofErr w:type="spellEnd"/>
-      <w:r>
-        <w:t xml:space="preserve"> funguje jako „obálka“ pro seznam,</w:t>
-      </w:r>
-    </w:p>
-    <w:p>
-      <w:pPr>
-        <w:pStyle w:val="Odrkovseznam"/>
-      </w:pPr>
-      <w:proofErr w:type="spellStart"/>
-      <w:r>
-        <w:t>HabitComponent</w:t>
-      </w:r>
-      <w:proofErr w:type="spellEnd"/>
-      <w:r>
-        <w:t xml:space="preserve"> se stará o konkrétní položku (návyk/zlozvyk) a její lokální UI logiku.</w:t>
-      </w:r>
-    </w:p>
-    <w:p>
-      <w:pPr>
-        <w:pStyle w:val="Odrkovseznam"/>
-      </w:pPr>
-      <w:proofErr w:type="spellStart"/>
-      <w:r>
-        <w:t>HabitsListComponent</w:t>
-      </w:r>
-      <w:proofErr w:type="spellEnd"/>
-      <w:r>
-        <w:t xml:space="preserve"> pracuje </w:t>
-      </w:r>
-      <w:proofErr w:type="gramStart"/>
-      <w:r>
-        <w:t>s</w:t>
-      </w:r>
-      <w:proofErr w:type="gramEnd"/>
-      <w:r>
-        <w:t xml:space="preserve"> vstupy:</w:t>
-      </w:r>
-    </w:p>
-    <w:p>
-      <w:pPr>
-        <w:pStyle w:val="Odrkovseznam"/>
-      </w:pPr>
-      <w:proofErr w:type="spellStart"/>
-      <w:r>
-        <w:t>habits</w:t>
-      </w:r>
-      <w:proofErr w:type="spellEnd"/>
-      <w:r>
-        <w:t xml:space="preserve"> – pole návyků k zobrazení,</w:t>
-      </w:r>
-    </w:p>
-    <w:p>
-      <w:pPr>
-        <w:pStyle w:val="Odrkovseznam"/>
-      </w:pPr>
-      <w:r>
-        <w:t>type – typ seznamu (positive/negative),</w:t>
+    <w:tbl>
+      <w:tblPr>
+        <w:tblStyle w:val="Mkatabulky"/>
+        <w:tblW w:w="0" w:type="auto"/>
+        <w:tblLook w:val="04A0" w:firstRow="1" w:lastRow="0" w:firstColumn="1" w:lastColumn="0" w:noHBand="0" w:noVBand="1"/>
+      </w:tblPr>
+      <w:tblGrid>
+        <w:gridCol w:w="4814"/>
+        <w:gridCol w:w="4814"/>
+      </w:tblGrid>
+      <w:tr>
+        <w:tc>
+          <w:tcPr>
+            <w:tcW w:w="4814" w:type="dxa"/>
+          </w:tcPr>
+          <w:p>
+            <w:r>
+              <w:t>Člen</w:t>
+            </w:r>
+          </w:p>
+        </w:tc>
+        <w:tc>
+          <w:tcPr>
+            <w:tcW w:w="4814" w:type="dxa"/>
+          </w:tcPr>
+          <w:p>
+            <w:r>
+              <w:t>Funkce</w:t>
+            </w:r>
+          </w:p>
+        </w:tc>
+      </w:tr>
+      <w:tr>
+        <w:tc>
+          <w:tcPr>
+            <w:tcW w:w="4814" w:type="dxa"/>
+          </w:tcPr>
+          <w:p>
+            <w:proofErr w:type="spellStart"/>
+            <w:r>
+              <w:t>HabitsListComponent</w:t>
+            </w:r>
+            <w:proofErr w:type="spellEnd"/>
+          </w:p>
+        </w:tc>
+        <w:tc>
+          <w:tcPr>
+            <w:tcW w:w="4814" w:type="dxa"/>
+          </w:tcPr>
+          <w:p>
+            <w:r>
+              <w:t>„obálka“ pro seznam</w:t>
+            </w:r>
+            <w:r>
+              <w:t xml:space="preserve"> a pracuje se vstupy</w:t>
+            </w:r>
+          </w:p>
+        </w:tc>
+      </w:tr>
+      <w:tr>
+        <w:tc>
+          <w:tcPr>
+            <w:tcW w:w="4814" w:type="dxa"/>
+          </w:tcPr>
+          <w:p>
+            <w:proofErr w:type="spellStart"/>
+            <w:r>
+              <w:t>HabitComponent</w:t>
+            </w:r>
+            <w:proofErr w:type="spellEnd"/>
+          </w:p>
+        </w:tc>
+        <w:tc>
+          <w:tcPr>
+            <w:tcW w:w="4814" w:type="dxa"/>
+          </w:tcPr>
+          <w:p>
+            <w:r>
+              <w:t>Stará se o</w:t>
+            </w:r>
+            <w:r>
+              <w:t xml:space="preserve"> </w:t>
+            </w:r>
+            <w:r>
+              <w:t>konkrétní položku (návyk/zlozvyk) a její lokální UI logiku</w:t>
+            </w:r>
+          </w:p>
+        </w:tc>
+      </w:tr>
+      <w:tr>
+        <w:tc>
+          <w:tcPr>
+            <w:tcW w:w="4814" w:type="dxa"/>
+          </w:tcPr>
+          <w:p>
+            <w:proofErr w:type="spellStart"/>
+            <w:r>
+              <w:t>habits</w:t>
+            </w:r>
+            <w:proofErr w:type="spellEnd"/>
+          </w:p>
+        </w:tc>
+        <w:tc>
+          <w:tcPr>
+            <w:tcW w:w="4814" w:type="dxa"/>
+          </w:tcPr>
+          <w:p>
+            <w:r>
+              <w:t>pole návyků k zobrazení</w:t>
+            </w:r>
+          </w:p>
+        </w:tc>
+      </w:tr>
+      <w:tr>
+        <w:tc>
+          <w:tcPr>
+            <w:tcW w:w="4814" w:type="dxa"/>
+          </w:tcPr>
+          <w:p>
+            <w:r>
+              <w:t>type</w:t>
+            </w:r>
+          </w:p>
+        </w:tc>
+        <w:tc>
+          <w:tcPr>
+            <w:tcW w:w="4814" w:type="dxa"/>
+          </w:tcPr>
+          <w:p>
+            <w:pPr>
+              <w:keepNext/>
+            </w:pPr>
+            <w:r>
+              <w:t>typ seznamu (positive/negative)</w:t>
+            </w:r>
+          </w:p>
+        </w:tc>
+      </w:tr>
+    </w:tbl>
+    <w:p>
+      <w:pPr>
+        <w:pStyle w:val="Titulek"/>
+      </w:pPr>
+      <w:r>
+        <w:t xml:space="preserve">Tabulka </w:t>
+      </w:r>
+      <w:r>
+        <w:fldChar w:fldCharType="begin"/>
+      </w:r>
+      <w:r>
+        <w:instrText xml:space="preserve"> SEQ Tabulka \* ARABIC </w:instrText>
+      </w:r>
+      <w:r>
+        <w:fldChar w:fldCharType="separate"/>
+      </w:r>
+      <w:r>
+        <w:rPr>
+          <w:noProof/>
+        </w:rPr>
+        <w:t>4</w:t>
+      </w:r>
+      <w:r>
+        <w:fldChar w:fldCharType="end"/>
+      </w:r>
+      <w:r>
+        <w:t>: Členové za funkcí UI</w:t>
       </w:r>
     </w:p>
     <w:p>
@@ -7589,30 +8447,117 @@
         <w:t>a s výstupy pomocí eventů:</w:t>
       </w:r>
     </w:p>
-    <w:p>
-      <w:pPr>
-        <w:pStyle w:val="Odrkovseznam"/>
-      </w:pPr>
-      <w:proofErr w:type="spellStart"/>
-      <w:r>
-        <w:t>deleteHabit</w:t>
-      </w:r>
-      <w:proofErr w:type="spellEnd"/>
-      <w:r>
-        <w:t xml:space="preserve"> – odstranění návyku,</w:t>
-      </w:r>
-    </w:p>
-    <w:p>
-      <w:pPr>
-        <w:pStyle w:val="Odrkovseznam"/>
-      </w:pPr>
-      <w:proofErr w:type="spellStart"/>
-      <w:r>
-        <w:t>updateHabit</w:t>
-      </w:r>
-      <w:proofErr w:type="spellEnd"/>
-      <w:r>
-        <w:t xml:space="preserve"> – aktualizace položky (např. změna stavu splnění).</w:t>
+    <w:tbl>
+      <w:tblPr>
+        <w:tblStyle w:val="Mkatabulky"/>
+        <w:tblW w:w="0" w:type="auto"/>
+        <w:tblLook w:val="04A0" w:firstRow="1" w:lastRow="0" w:firstColumn="1" w:lastColumn="0" w:noHBand="0" w:noVBand="1"/>
+      </w:tblPr>
+      <w:tblGrid>
+        <w:gridCol w:w="4814"/>
+        <w:gridCol w:w="4814"/>
+      </w:tblGrid>
+      <w:tr>
+        <w:tc>
+          <w:tcPr>
+            <w:tcW w:w="4814" w:type="dxa"/>
+          </w:tcPr>
+          <w:p>
+            <w:r>
+              <w:t>Event</w:t>
+            </w:r>
+          </w:p>
+        </w:tc>
+        <w:tc>
+          <w:tcPr>
+            <w:tcW w:w="4814" w:type="dxa"/>
+          </w:tcPr>
+          <w:p>
+            <w:r>
+              <w:t>Akce eventu</w:t>
+            </w:r>
+          </w:p>
+        </w:tc>
+      </w:tr>
+      <w:tr>
+        <w:tc>
+          <w:tcPr>
+            <w:tcW w:w="4814" w:type="dxa"/>
+          </w:tcPr>
+          <w:p>
+            <w:proofErr w:type="spellStart"/>
+            <w:r>
+              <w:t>deleteHabit</w:t>
+            </w:r>
+            <w:proofErr w:type="spellEnd"/>
+          </w:p>
+        </w:tc>
+        <w:tc>
+          <w:tcPr>
+            <w:tcW w:w="4814" w:type="dxa"/>
+          </w:tcPr>
+          <w:p>
+            <w:r>
+              <w:t>Odstranění návyku</w:t>
+            </w:r>
+          </w:p>
+        </w:tc>
+      </w:tr>
+      <w:tr>
+        <w:tc>
+          <w:tcPr>
+            <w:tcW w:w="4814" w:type="dxa"/>
+          </w:tcPr>
+          <w:p>
+            <w:proofErr w:type="spellStart"/>
+            <w:r>
+              <w:t>updateHabit</w:t>
+            </w:r>
+            <w:proofErr w:type="spellEnd"/>
+          </w:p>
+        </w:tc>
+        <w:tc>
+          <w:tcPr>
+            <w:tcW w:w="4814" w:type="dxa"/>
+          </w:tcPr>
+          <w:p>
+            <w:pPr>
+              <w:keepNext/>
+            </w:pPr>
+            <w:r>
+              <w:t>aktualizace položky (změna stavu splnění).</w:t>
+            </w:r>
+          </w:p>
+        </w:tc>
+      </w:tr>
+    </w:tbl>
+    <w:p>
+      <w:pPr>
+        <w:pStyle w:val="Titulek"/>
+      </w:pPr>
+      <w:r>
+        <w:t xml:space="preserve">Tabulka </w:t>
+      </w:r>
+      <w:r>
+        <w:fldChar w:fldCharType="begin"/>
+      </w:r>
+      <w:r>
+        <w:instrText xml:space="preserve"> SEQ Tabulka \* ARABIC </w:instrText>
+      </w:r>
+      <w:r>
+        <w:fldChar w:fldCharType="separate"/>
+      </w:r>
+      <w:r>
+        <w:rPr>
+          <w:noProof/>
+        </w:rPr>
+        <w:t>5</w:t>
+      </w:r>
+      <w:r>
+        <w:fldChar w:fldCharType="end"/>
+      </w:r>
+      <w:r>
+        <w:t>: výstupní eventy UI</w:t>
       </w:r>
     </w:p>
     <w:p>
@@ -7695,7 +8640,7 @@
       <w:pPr>
         <w:pStyle w:val="Titulek"/>
       </w:pPr>
-      <w:bookmarkStart w:id="40" w:name="_Toc230174424"/>
+      <w:bookmarkStart w:id="63" w:name="_Toc230174424"/>
       <w:r>
         <w:t xml:space="preserve">Obrázek </w:t>
       </w:r>
@@ -7720,17 +8665,17 @@
       <w:r>
         <w:t>: Seznam habitů</w:t>
       </w:r>
-      <w:bookmarkEnd w:id="40"/>
+      <w:bookmarkEnd w:id="63"/>
     </w:p>
     <w:p>
       <w:pPr>
         <w:pStyle w:val="Nadpis2"/>
       </w:pPr>
-      <w:bookmarkStart w:id="41" w:name="_Toc226556248"/>
+      <w:bookmarkStart w:id="64" w:name="_Toc230179547"/>
       <w:r>
         <w:t>Vizualizace plnění návyku</w:t>
       </w:r>
-      <w:bookmarkEnd w:id="41"/>
+      <w:bookmarkEnd w:id="64"/>
     </w:p>
     <w:p>
       <w:pPr>
@@ -7764,101 +8709,297 @@
         <w:t>Komponenta přijímá jako vstupy:</w:t>
       </w:r>
     </w:p>
-    <w:p>
-      <w:pPr>
-        <w:pStyle w:val="Odrkovseznam"/>
-      </w:pPr>
-      <w:proofErr w:type="spellStart"/>
-      <w:r>
-        <w:t>history</w:t>
-      </w:r>
-      <w:proofErr w:type="spellEnd"/>
-      <w:r>
-        <w:t xml:space="preserve">: </w:t>
-      </w:r>
-      <w:proofErr w:type="spellStart"/>
-      <w:proofErr w:type="gramStart"/>
-      <w:r>
-        <w:t>Date</w:t>
-      </w:r>
-      <w:proofErr w:type="spellEnd"/>
-      <w:r>
-        <w:t>[</w:t>
-      </w:r>
-      <w:proofErr w:type="gramEnd"/>
-      <w:r>
-        <w:t>] – seznam dat, kdy byl návyk splněn,</w:t>
-      </w:r>
-    </w:p>
-    <w:p>
-      <w:pPr>
-        <w:pStyle w:val="Odrkovseznam"/>
-      </w:pPr>
-      <w:proofErr w:type="spellStart"/>
-      <w:r>
-        <w:t>habitType</w:t>
-      </w:r>
-      <w:proofErr w:type="spellEnd"/>
-      <w:r>
-        <w:t xml:space="preserve"> – typ návyku, který ovlivňuje barvu grafu (dobré návyky jsou zobrazované typicky zeleně, špatné červeně).</w:t>
-      </w:r>
-    </w:p>
-    <w:p>
-      <w:r>
+    <w:tbl>
+      <w:tblPr>
+        <w:tblStyle w:val="Mkatabulky"/>
+        <w:tblW w:w="0" w:type="auto"/>
+        <w:tblLook w:val="04A0" w:firstRow="1" w:lastRow="0" w:firstColumn="1" w:lastColumn="0" w:noHBand="0" w:noVBand="1"/>
+      </w:tblPr>
+      <w:tblGrid>
+        <w:gridCol w:w="4814"/>
+        <w:gridCol w:w="4814"/>
+      </w:tblGrid>
+      <w:tr>
+        <w:tc>
+          <w:tcPr>
+            <w:tcW w:w="4814" w:type="dxa"/>
+          </w:tcPr>
+          <w:p>
+            <w:r>
+              <w:t>Vstup</w:t>
+            </w:r>
+          </w:p>
+        </w:tc>
+        <w:tc>
+          <w:tcPr>
+            <w:tcW w:w="4814" w:type="dxa"/>
+          </w:tcPr>
+          <w:p>
+            <w:r>
+              <w:t>Odůvodnění využití vstupu</w:t>
+            </w:r>
+          </w:p>
+        </w:tc>
+      </w:tr>
+      <w:tr>
+        <w:tc>
+          <w:tcPr>
+            <w:tcW w:w="4814" w:type="dxa"/>
+          </w:tcPr>
+          <w:p>
+            <w:proofErr w:type="spellStart"/>
+            <w:r>
+              <w:t>history</w:t>
+            </w:r>
+            <w:proofErr w:type="spellEnd"/>
+            <w:r>
+              <w:t xml:space="preserve">: </w:t>
+            </w:r>
+            <w:proofErr w:type="spellStart"/>
+            <w:r>
+              <w:t>Date</w:t>
+            </w:r>
+            <w:proofErr w:type="spellEnd"/>
+            <w:r>
+              <w:t>[]</w:t>
+            </w:r>
+          </w:p>
+        </w:tc>
+        <w:tc>
+          <w:tcPr>
+            <w:tcW w:w="4814" w:type="dxa"/>
+          </w:tcPr>
+          <w:p>
+            <w:r>
+              <w:t>seznam dat, kdy byl návyk splněn</w:t>
+            </w:r>
+          </w:p>
+        </w:tc>
+      </w:tr>
+      <w:tr>
+        <w:tc>
+          <w:tcPr>
+            <w:tcW w:w="4814" w:type="dxa"/>
+          </w:tcPr>
+          <w:p>
+            <w:proofErr w:type="spellStart"/>
+            <w:r>
+              <w:t>habitType</w:t>
+            </w:r>
+            <w:proofErr w:type="spellEnd"/>
+          </w:p>
+        </w:tc>
+        <w:tc>
+          <w:tcPr>
+            <w:tcW w:w="4814" w:type="dxa"/>
+          </w:tcPr>
+          <w:p>
+            <w:pPr>
+              <w:keepNext/>
+            </w:pPr>
+            <w:r>
+              <w:t>typ návyku, který ovlivňuje barvu grafu (dobré návyky jsou zobrazované typicky zeleně, špatné červeně).</w:t>
+            </w:r>
+          </w:p>
+        </w:tc>
+      </w:tr>
+    </w:tbl>
+    <w:p>
+      <w:pPr>
+        <w:pStyle w:val="Titulek"/>
+      </w:pPr>
+      <w:r>
+        <w:t xml:space="preserve">Tabulka </w:t>
+      </w:r>
+      <w:r>
+        <w:fldChar w:fldCharType="begin"/>
+      </w:r>
+      <w:r>
+        <w:instrText xml:space="preserve"> SEQ Tabulka \* ARABIC </w:instrText>
+      </w:r>
+      <w:r>
+        <w:fldChar w:fldCharType="separate"/>
+      </w:r>
+      <w:r>
+        <w:rPr>
+          <w:noProof/>
+        </w:rPr>
+        <w:t>6</w:t>
+      </w:r>
+      <w:r>
+        <w:fldChar w:fldCharType="end"/>
+      </w:r>
+      <w:r>
+        <w:t xml:space="preserve">: Vstupy </w:t>
+      </w:r>
+      <w:proofErr w:type="spellStart"/>
+      <w:r>
+        <w:t>HabitGraphu</w:t>
+      </w:r>
+      <w:proofErr w:type="spellEnd"/>
+    </w:p>
+    <w:p>
+      <w:r>
+        <w:lastRenderedPageBreak/>
         <w:t>Graf je navržen tak, aby uměl pracovat s různými časovými obdobími:</w:t>
       </w:r>
     </w:p>
-    <w:p>
-      <w:pPr>
-        <w:pStyle w:val="Odrkovseznam"/>
-      </w:pPr>
-      <w:proofErr w:type="spellStart"/>
-      <w:r>
-        <w:t>week</w:t>
-      </w:r>
-      <w:proofErr w:type="spellEnd"/>
-      <w:r>
-        <w:t xml:space="preserve"> (týden),</w:t>
-      </w:r>
-    </w:p>
-    <w:p>
-      <w:pPr>
-        <w:pStyle w:val="Odrkovseznam"/>
-      </w:pPr>
-      <w:proofErr w:type="spellStart"/>
-      <w:r>
-        <w:t>month</w:t>
-      </w:r>
-      <w:proofErr w:type="spellEnd"/>
-      <w:r>
-        <w:t xml:space="preserve"> (měsíc),</w:t>
-      </w:r>
-    </w:p>
-    <w:p>
-      <w:pPr>
-        <w:pStyle w:val="Odrkovseznam"/>
-      </w:pPr>
-      <w:proofErr w:type="spellStart"/>
-      <w:r>
-        <w:t>year</w:t>
-      </w:r>
-      <w:proofErr w:type="spellEnd"/>
-      <w:r>
-        <w:t xml:space="preserve"> (rok),</w:t>
-      </w:r>
-    </w:p>
-    <w:p>
-      <w:pPr>
-        <w:pStyle w:val="Odrkovseznam"/>
-      </w:pPr>
-      <w:proofErr w:type="spellStart"/>
-      <w:r>
-        <w:lastRenderedPageBreak/>
-        <w:t>all</w:t>
-      </w:r>
-      <w:proofErr w:type="spellEnd"/>
-      <w:r>
-        <w:t xml:space="preserve"> (historie celkem).</w:t>
+    <w:tbl>
+      <w:tblPr>
+        <w:tblStyle w:val="Mkatabulky"/>
+        <w:tblW w:w="0" w:type="auto"/>
+        <w:tblLook w:val="04A0" w:firstRow="1" w:lastRow="0" w:firstColumn="1" w:lastColumn="0" w:noHBand="0" w:noVBand="1"/>
+      </w:tblPr>
+      <w:tblGrid>
+        <w:gridCol w:w="4814"/>
+        <w:gridCol w:w="4814"/>
+      </w:tblGrid>
+      <w:tr>
+        <w:tc>
+          <w:tcPr>
+            <w:tcW w:w="4814" w:type="dxa"/>
+          </w:tcPr>
+          <w:p>
+            <w:r>
+              <w:t>Pojmenování</w:t>
+            </w:r>
+          </w:p>
+        </w:tc>
+        <w:tc>
+          <w:tcPr>
+            <w:tcW w:w="4814" w:type="dxa"/>
+          </w:tcPr>
+          <w:p>
+            <w:r>
+              <w:t>Období</w:t>
+            </w:r>
+          </w:p>
+        </w:tc>
+      </w:tr>
+      <w:tr>
+        <w:tc>
+          <w:tcPr>
+            <w:tcW w:w="4814" w:type="dxa"/>
+          </w:tcPr>
+          <w:p>
+            <w:proofErr w:type="spellStart"/>
+            <w:r>
+              <w:t>Week</w:t>
+            </w:r>
+            <w:proofErr w:type="spellEnd"/>
+          </w:p>
+        </w:tc>
+        <w:tc>
+          <w:tcPr>
+            <w:tcW w:w="4814" w:type="dxa"/>
+          </w:tcPr>
+          <w:p>
+            <w:r>
+              <w:t>Začátek aktuálního týdne do aktuálního dne</w:t>
+            </w:r>
+          </w:p>
+        </w:tc>
+      </w:tr>
+      <w:tr>
+        <w:tc>
+          <w:tcPr>
+            <w:tcW w:w="4814" w:type="dxa"/>
+          </w:tcPr>
+          <w:p>
+            <w:proofErr w:type="spellStart"/>
+            <w:r>
+              <w:t>Month</w:t>
+            </w:r>
+            <w:proofErr w:type="spellEnd"/>
+          </w:p>
+        </w:tc>
+        <w:tc>
+          <w:tcPr>
+            <w:tcW w:w="4814" w:type="dxa"/>
+          </w:tcPr>
+          <w:p>
+            <w:r>
+              <w:t>Začátek aktuálního měsíce do aktuálního dne</w:t>
+            </w:r>
+          </w:p>
+        </w:tc>
+      </w:tr>
+      <w:tr>
+        <w:tc>
+          <w:tcPr>
+            <w:tcW w:w="4814" w:type="dxa"/>
+          </w:tcPr>
+          <w:p>
+            <w:proofErr w:type="spellStart"/>
+            <w:r>
+              <w:t>Year</w:t>
+            </w:r>
+            <w:proofErr w:type="spellEnd"/>
+          </w:p>
+        </w:tc>
+        <w:tc>
+          <w:tcPr>
+            <w:tcW w:w="4814" w:type="dxa"/>
+          </w:tcPr>
+          <w:p>
+            <w:r>
+              <w:t xml:space="preserve">Začátek aktuálního roku do </w:t>
+            </w:r>
+            <w:r>
+              <w:t>aktuálního dne</w:t>
+            </w:r>
+          </w:p>
+        </w:tc>
+      </w:tr>
+      <w:tr>
+        <w:tc>
+          <w:tcPr>
+            <w:tcW w:w="4814" w:type="dxa"/>
+          </w:tcPr>
+          <w:p/>
+        </w:tc>
+        <w:tc>
+          <w:tcPr>
+            <w:tcW w:w="4814" w:type="dxa"/>
+          </w:tcPr>
+          <w:p>
+            <w:pPr>
+              <w:keepNext/>
+            </w:pPr>
+            <w:r>
+              <w:t>Vznik návyku do aktuálního dne</w:t>
+            </w:r>
+          </w:p>
+        </w:tc>
+      </w:tr>
+    </w:tbl>
+    <w:p>
+      <w:pPr>
+        <w:pStyle w:val="Titulek"/>
+      </w:pPr>
+      <w:r>
+        <w:t xml:space="preserve">Tabulka </w:t>
+      </w:r>
+      <w:r>
+        <w:fldChar w:fldCharType="begin"/>
+      </w:r>
+      <w:r>
+        <w:instrText xml:space="preserve"> SEQ Tabulka \* ARABIC </w:instrText>
+      </w:r>
+      <w:r>
+        <w:fldChar w:fldCharType="separate"/>
+      </w:r>
+      <w:r>
+        <w:rPr>
+          <w:noProof/>
+        </w:rPr>
+        <w:t>7</w:t>
+      </w:r>
+      <w:r>
+        <w:fldChar w:fldCharType="end"/>
+      </w:r>
+      <w:r>
+        <w:t>: možnosti grafu</w:t>
       </w:r>
     </w:p>
     <w:p>
@@ -7944,7 +9085,7 @@
           <w:rStyle w:val="Siln"/>
         </w:rPr>
       </w:pPr>
-      <w:bookmarkStart w:id="42" w:name="_Toc230174425"/>
+      <w:bookmarkStart w:id="65" w:name="_Toc230174425"/>
       <w:r>
         <w:t xml:space="preserve">Obrázek </w:t>
       </w:r>
@@ -7969,17 +9110,17 @@
       <w:r>
         <w:t>: Rozevřený habit</w:t>
       </w:r>
-      <w:bookmarkEnd w:id="42"/>
+      <w:bookmarkEnd w:id="65"/>
     </w:p>
     <w:p>
       <w:pPr>
         <w:pStyle w:val="Nadpis2"/>
       </w:pPr>
-      <w:bookmarkStart w:id="43" w:name="_Toc226556249"/>
+      <w:bookmarkStart w:id="66" w:name="_Toc230179548"/>
       <w:r>
         <w:t>Styling a responzivita aplikace</w:t>
       </w:r>
-      <w:bookmarkEnd w:id="43"/>
+      <w:bookmarkEnd w:id="66"/>
     </w:p>
     <w:p>
       <w:r>
@@ -8031,12 +9172,10 @@
         <w:t xml:space="preserve"> a </w:t>
       </w:r>
       <w:proofErr w:type="spellStart"/>
-      <w:proofErr w:type="gramStart"/>
       <w:r>
         <w:t>variables.scss</w:t>
       </w:r>
       <w:proofErr w:type="spellEnd"/>
-      <w:proofErr w:type="gramEnd"/>
       <w:r>
         <w:t>.</w:t>
       </w:r>
@@ -8046,138 +9185,219 @@
         <w:pStyle w:val="Odrkovseznam"/>
       </w:pPr>
       <w:r>
-        <w:t xml:space="preserve">specifické styly jednotlivých komponent jsou v jejich </w:t>
-      </w:r>
-      <w:proofErr w:type="gramStart"/>
-      <w:r>
-        <w:t>vlastních .</w:t>
+        <w:t>specifické styly jednotlivých komponent jsou v jejich vlastních .</w:t>
       </w:r>
       <w:proofErr w:type="spellStart"/>
       <w:r>
         <w:t>scss</w:t>
       </w:r>
       <w:proofErr w:type="spellEnd"/>
-      <w:proofErr w:type="gramEnd"/>
       <w:r>
         <w:t xml:space="preserve"> souborech (</w:t>
       </w:r>
       <w:proofErr w:type="spellStart"/>
-      <w:proofErr w:type="gramStart"/>
-      <w:r>
-        <w:t>např.habit</w:t>
-      </w:r>
-      <w:proofErr w:type="gramEnd"/>
-      <w:r>
-        <w:t>-</w:t>
-      </w:r>
-      <w:proofErr w:type="gramStart"/>
-      <w:r>
-        <w:t>graph.scss</w:t>
-      </w:r>
-      <w:proofErr w:type="spellEnd"/>
-      <w:proofErr w:type="gramEnd"/>
+      <w:r>
+        <w:t>např.habit-graph.scss</w:t>
+      </w:r>
+      <w:proofErr w:type="spellEnd"/>
       <w:r>
         <w:t xml:space="preserve"> a </w:t>
       </w:r>
       <w:proofErr w:type="spellStart"/>
-      <w:proofErr w:type="gramStart"/>
       <w:r>
         <w:t>habits.scss</w:t>
       </w:r>
       <w:proofErr w:type="spellEnd"/>
-      <w:proofErr w:type="gramEnd"/>
       <w:r>
         <w:t>, případně habit-</w:t>
       </w:r>
       <w:proofErr w:type="spellStart"/>
-      <w:proofErr w:type="gramStart"/>
       <w:r>
         <w:t>calendar.scss</w:t>
       </w:r>
       <w:proofErr w:type="spellEnd"/>
-      <w:proofErr w:type="gramEnd"/>
       <w:r>
         <w:t>).</w:t>
       </w:r>
     </w:p>
     <w:p>
       <w:r>
+        <w:lastRenderedPageBreak/>
         <w:t>Responzivitu jsem vyřešil především tak, aby se komponenty přizpůsobily dostupné šířce. V praxi to znamená, že graf a kalendář jsou součástí layoutu v rámci karty konkrétního návyku a jejich chování je řízené právě pomocí stylů příslušných komponent:</w:t>
       </w:r>
     </w:p>
-    <w:p>
-      <w:pPr>
-        <w:pStyle w:val="Odrkovseznam"/>
-      </w:pPr>
-      <w:r>
-        <w:t>Kalendář (habit-</w:t>
-      </w:r>
-      <w:proofErr w:type="spellStart"/>
-      <w:r>
-        <w:t>calendar</w:t>
-      </w:r>
-      <w:proofErr w:type="spellEnd"/>
-      <w:r>
-        <w:t xml:space="preserve">): Kalendář je vykreslen jako </w:t>
-      </w:r>
-      <w:proofErr w:type="spellStart"/>
-      <w:r>
-        <w:t>grid</w:t>
-      </w:r>
-      <w:proofErr w:type="spellEnd"/>
-      <w:r>
-        <w:t xml:space="preserve"> a jeho buňky jsou přizpůsobeny menším rozměrům tak, aby se obsah vešel do karty v dané velikosti displeje.</w:t>
-      </w:r>
-    </w:p>
-    <w:p>
-      <w:pPr>
-        <w:pStyle w:val="Odrkovseznam"/>
-      </w:pPr>
-      <w:r>
-        <w:t>Graf (habit-</w:t>
-      </w:r>
-      <w:proofErr w:type="spellStart"/>
-      <w:r>
-        <w:t>graph</w:t>
-      </w:r>
-      <w:proofErr w:type="spellEnd"/>
-      <w:r>
-        <w:t xml:space="preserve">): Graf je řešen komponentou </w:t>
-      </w:r>
-      <w:proofErr w:type="spellStart"/>
-      <w:r>
-        <w:t>ngx-charts</w:t>
-      </w:r>
-      <w:proofErr w:type="spellEnd"/>
-      <w:r>
-        <w:t xml:space="preserve">. Na mobilních zařízeních je důraz kladen hlavně na to, aby šlo graf prohlížet i při omezené šířce. Proto se na malých šířkách používá horizontální </w:t>
-      </w:r>
-      <w:proofErr w:type="spellStart"/>
-      <w:r>
-        <w:t>scrolling</w:t>
-      </w:r>
-      <w:proofErr w:type="spellEnd"/>
-      <w:r>
-        <w:t xml:space="preserve">, aby uživatel mohl graf “přejet” do stran a podívat se na detaily i mimo původní viditelnou oblast, protože </w:t>
-      </w:r>
-      <w:r>
-        <w:t xml:space="preserve">se mi lépe problém nepovedlo </w:t>
-      </w:r>
-      <w:proofErr w:type="gramStart"/>
-      <w:r>
-        <w:t>vyřešit</w:t>
-      </w:r>
-      <w:proofErr w:type="gramEnd"/>
-      <w:r>
-        <w:t xml:space="preserve"> a to počítám i AI pomoc</w:t>
-      </w:r>
-      <w:r>
-        <w:t>.</w:t>
-      </w:r>
-    </w:p>
-    <w:p>
-      <w:r>
-        <w:lastRenderedPageBreak/>
+    <w:tbl>
+      <w:tblPr>
+        <w:tblStyle w:val="Mkatabulky"/>
+        <w:tblW w:w="0" w:type="auto"/>
+        <w:tblLook w:val="04A0" w:firstRow="1" w:lastRow="0" w:firstColumn="1" w:lastColumn="0" w:noHBand="0" w:noVBand="1"/>
+      </w:tblPr>
+      <w:tblGrid>
+        <w:gridCol w:w="4814"/>
+        <w:gridCol w:w="4814"/>
+      </w:tblGrid>
+      <w:tr>
+        <w:tc>
+          <w:tcPr>
+            <w:tcW w:w="4814" w:type="dxa"/>
+          </w:tcPr>
+          <w:p>
+            <w:r>
+              <w:t>Komponenta</w:t>
+            </w:r>
+          </w:p>
+        </w:tc>
+        <w:tc>
+          <w:tcPr>
+            <w:tcW w:w="4814" w:type="dxa"/>
+          </w:tcPr>
+          <w:p>
+            <w:r>
+              <w:t>Řešení</w:t>
+            </w:r>
+          </w:p>
+        </w:tc>
+      </w:tr>
+      <w:tr>
+        <w:tc>
+          <w:tcPr>
+            <w:tcW w:w="4814" w:type="dxa"/>
+          </w:tcPr>
+          <w:p>
+            <w:r>
+              <w:t>Kalendář (habit-</w:t>
+            </w:r>
+            <w:proofErr w:type="spellStart"/>
+            <w:r>
+              <w:t>calendar</w:t>
+            </w:r>
+            <w:proofErr w:type="spellEnd"/>
+            <w:r>
+              <w:t>)</w:t>
+            </w:r>
+          </w:p>
+        </w:tc>
+        <w:tc>
+          <w:tcPr>
+            <w:tcW w:w="4814" w:type="dxa"/>
+          </w:tcPr>
+          <w:p>
+            <w:r>
+              <w:t xml:space="preserve">Kalendář je vykreslen jako </w:t>
+            </w:r>
+            <w:proofErr w:type="spellStart"/>
+            <w:r>
+              <w:t>grid</w:t>
+            </w:r>
+            <w:proofErr w:type="spellEnd"/>
+            <w:r>
+              <w:t xml:space="preserve"> a jeho buňky jsou přizpůsobeny menším rozměrům tak, aby se obsah vešel do karty v dané velikosti displeje</w:t>
+            </w:r>
+            <w:r>
+              <w:t>.</w:t>
+            </w:r>
+          </w:p>
+        </w:tc>
+      </w:tr>
+      <w:tr>
+        <w:tc>
+          <w:tcPr>
+            <w:tcW w:w="4814" w:type="dxa"/>
+          </w:tcPr>
+          <w:p>
+            <w:r>
+              <w:t>Graf (habit-</w:t>
+            </w:r>
+            <w:proofErr w:type="spellStart"/>
+            <w:r>
+              <w:t>graph</w:t>
+            </w:r>
+            <w:proofErr w:type="spellEnd"/>
+            <w:r>
+              <w:t>)</w:t>
+            </w:r>
+          </w:p>
+        </w:tc>
+        <w:tc>
+          <w:tcPr>
+            <w:tcW w:w="4814" w:type="dxa"/>
+          </w:tcPr>
+          <w:p>
+            <w:pPr>
+              <w:keepNext/>
+            </w:pPr>
+            <w:r>
+              <w:t xml:space="preserve">komponentou </w:t>
+            </w:r>
+            <w:proofErr w:type="spellStart"/>
+            <w:r>
+              <w:t>ngx-charts</w:t>
+            </w:r>
+            <w:proofErr w:type="spellEnd"/>
+            <w:r>
+              <w:t xml:space="preserve">. Na mobilních zařízeních je důraz kladen hlavně na to, aby šlo graf prohlížet i při omezené šířce. Proto se na malých šířkách používá horizontální </w:t>
+            </w:r>
+            <w:proofErr w:type="spellStart"/>
+            <w:r>
+              <w:t>scrolling</w:t>
+            </w:r>
+            <w:proofErr w:type="spellEnd"/>
+            <w:r>
+              <w:t xml:space="preserve">, aby uživatel mohl graf “přejet” do stran a podívat se na detaily i mimo původní viditelnou oblast, protože </w:t>
+            </w:r>
+            <w:r>
+              <w:t xml:space="preserve">se mi lépe problém nepovedlo </w:t>
+            </w:r>
+            <w:r>
+              <w:t>vyřešit,</w:t>
+            </w:r>
+            <w:r>
+              <w:t xml:space="preserve"> a to počítám i AI pomoc</w:t>
+            </w:r>
+            <w:r>
+              <w:t>.</w:t>
+            </w:r>
+          </w:p>
+        </w:tc>
+      </w:tr>
+    </w:tbl>
+    <w:p>
+      <w:pPr>
+        <w:pStyle w:val="Titulek"/>
+      </w:pPr>
+      <w:r>
+        <w:t xml:space="preserve">Tabulka </w:t>
+      </w:r>
+      <w:r>
+        <w:fldChar w:fldCharType="begin"/>
+      </w:r>
+      <w:r>
+        <w:instrText xml:space="preserve"> SEQ Tabulka \* ARABIC </w:instrText>
+      </w:r>
+      <w:r>
+        <w:fldChar w:fldCharType="separate"/>
+      </w:r>
+      <w:r>
+        <w:rPr>
+          <w:noProof/>
+        </w:rPr>
+        <w:t>8</w:t>
+      </w:r>
+      <w:r>
+        <w:fldChar w:fldCharType="end"/>
+      </w:r>
+      <w:r>
+        <w:t xml:space="preserve">: Komponenty </w:t>
+      </w:r>
+      <w:r>
+        <w:t>nejhorší</w:t>
+      </w:r>
+      <w:r>
+        <w:t xml:space="preserve"> na stylování</w:t>
+      </w:r>
+    </w:p>
+    <w:p>
+      <w:r>
         <w:t xml:space="preserve">Přístup je tedy takový, že aplikace zůstává použitelná i na menších displejích, aniž by docházelo k rozbití layoutu nebo k nečitelnosti obsahu. V případě grafu je preferováno umožnit práci s obsahem přes </w:t>
       </w:r>
       <w:proofErr w:type="spellStart"/>
@@ -8188,14 +9408,9 @@
       <w:r>
         <w:t xml:space="preserve">, protože samotný graf vyžaduje určitou šířku pro čitelnost </w:t>
       </w:r>
-      <w:proofErr w:type="gramStart"/>
       <w:r>
         <w:t>detailů.</w:t>
       </w:r>
-      <w:r>
-        <w:t>¨</w:t>
-      </w:r>
-      <w:proofErr w:type="gramEnd"/>
     </w:p>
     <w:p>
       <w:pPr>
@@ -8203,9 +9418,9 @@
       </w:pPr>
       <w:r>
         <w:drawing>
-          <wp:inline distT="0" distB="0" distL="0" distR="0" wp14:anchorId="30AEE3C8" wp14:editId="3EA8B922">
-            <wp:extent cx="2286000" cy="4662167"/>
-            <wp:effectExtent l="0" t="0" r="0" b="5715"/>
+          <wp:inline distT="0" distB="0" distL="0" distR="0" wp14:anchorId="30AEE3C8" wp14:editId="2FB9047E">
+            <wp:extent cx="2285339" cy="3423683"/>
+            <wp:effectExtent l="0" t="0" r="1270" b="5715"/>
             <wp:docPr id="176820996" name="Obrázek 1"/>
             <wp:cNvGraphicFramePr>
               <a:graphicFrameLocks xmlns:a="http://schemas.openxmlformats.org/drawingml/2006/main" noChangeAspect="1"/>
@@ -8226,7 +9441,7 @@
                   <pic:spPr>
                     <a:xfrm>
                       <a:off x="0" y="0"/>
-                      <a:ext cx="2301767" cy="4694323"/>
+                      <a:ext cx="2311706" cy="3463184"/>
                     </a:xfrm>
                     <a:prstGeom prst="rect">
                       <a:avLst/>
@@ -8243,7 +9458,7 @@
       <w:pPr>
         <w:pStyle w:val="Titulek"/>
       </w:pPr>
-      <w:bookmarkStart w:id="44" w:name="_Toc230174426"/>
+      <w:bookmarkStart w:id="67" w:name="_Toc230174426"/>
       <w:r>
         <w:t xml:space="preserve">Obrázek </w:t>
       </w:r>
@@ -8268,17 +9483,18 @@
       <w:r>
         <w:t>: mobilní verze aplikace</w:t>
       </w:r>
-      <w:bookmarkEnd w:id="44"/>
+      <w:bookmarkEnd w:id="67"/>
     </w:p>
     <w:p>
       <w:pPr>
         <w:pStyle w:val="Nadpis2"/>
       </w:pPr>
-      <w:bookmarkStart w:id="45" w:name="_Toc226556250"/>
-      <w:r>
+      <w:bookmarkStart w:id="68" w:name="_Toc230179549"/>
+      <w:r>
+        <w:lastRenderedPageBreak/>
         <w:t>Optimalizace</w:t>
       </w:r>
-      <w:bookmarkEnd w:id="45"/>
+      <w:bookmarkEnd w:id="68"/>
     </w:p>
     <w:p>
       <w:r>
@@ -8290,7 +9506,11 @@
         <w:pStyle w:val="Nadpis3"/>
       </w:pPr>
       <w:r>
-        <w:t xml:space="preserve"> Centrální servis pro data (</w:t>
+        <w:t xml:space="preserve"> </w:t>
+      </w:r>
+      <w:bookmarkStart w:id="69" w:name="_Toc230179550"/>
+      <w:r>
+        <w:t>Centrální servis pro data (</w:t>
       </w:r>
       <w:proofErr w:type="spellStart"/>
       <w:r>
@@ -8300,6 +9520,7 @@
       <w:r>
         <w:t>)</w:t>
       </w:r>
+      <w:bookmarkEnd w:id="69"/>
     </w:p>
     <w:p>
       <w:r>
@@ -8324,175 +9545,179 @@
       </w:r>
       <w:proofErr w:type="spellEnd"/>
       <w:r>
-        <w:t xml:space="preserve">). Komponenty pracují </w:t>
-      </w:r>
-      <w:proofErr w:type="gramStart"/>
-      <w:r>
-        <w:t>s</w:t>
-      </w:r>
-      <w:proofErr w:type="gramEnd"/>
-      <w:r>
-        <w:t xml:space="preserve"> data tokem a reagují na změny. Díky tomu je UI konzistentní bez nutnosti ručně volat přepočty napříč komponentami.</w:t>
+        <w:t>). Komponenty pracují s data tokem a reagují na změny. Díky tomu je UI konzistentní bez nutnosti ručně volat přepočty napříč komponentami.</w:t>
       </w:r>
     </w:p>
     <w:p>
       <w:pPr>
         <w:pStyle w:val="Nadpis3"/>
       </w:pPr>
+      <w:bookmarkStart w:id="70" w:name="_Toc230179551"/>
+      <w:r>
+        <w:t>Omezení přepočtů grafu</w:t>
+      </w:r>
+      <w:bookmarkEnd w:id="70"/>
+    </w:p>
+    <w:p>
+      <w:r>
+        <w:t xml:space="preserve">Komponenta grafu zajišťuje přepočet dat primárně při změně vstupů (hlavně </w:t>
+      </w:r>
+      <w:proofErr w:type="spellStart"/>
+      <w:r>
+        <w:t>history</w:t>
+      </w:r>
+      <w:proofErr w:type="spellEnd"/>
+      <w:r>
+        <w:t>). Díky tomu se graf zbytečně nepřepočítává při každé drobné změně, ale jen když je to potřeba.</w:t>
+      </w:r>
+    </w:p>
+    <w:p>
+      <w:r>
+        <w:t>Validace před uložením. Formulář nepovolí nekonzistentní data (např. prázdné nebo příliš dlouhé hodnoty, duplicitní návyky). Tím se do grafu a seznamu nikdy nedostanou problematické vstupy, které by zhoršily výkon i kvalitu zobrazení.</w:t>
+      </w:r>
+    </w:p>
+    <w:p>
+      <w:r>
+        <w:t>Celkově aplikace používá optimalizační principy typické pro front-end vývoj: reaktivní práce se stavem, efektivní zpracování dat a validace na hraně vstupu.</w:t>
+      </w:r>
+    </w:p>
+    <w:p/>
+    <w:p>
+      <w:pPr>
+        <w:pStyle w:val="Nadpis2"/>
+      </w:pPr>
+      <w:bookmarkStart w:id="71" w:name="_Toc230179552"/>
+      <w:r>
+        <w:t>Zkušenosti nabrané z této práce</w:t>
+      </w:r>
+      <w:bookmarkEnd w:id="71"/>
+    </w:p>
+    <w:p>
+      <w:r>
+        <w:t>Během vývoje aplikace Habit Tracker jsem získal/a praktické zkušenosti v několika oblastech, které jsou pro tvorbu školních i reálných projektů důležité.</w:t>
+      </w:r>
+    </w:p>
+    <w:p>
+      <w:pPr>
+        <w:pStyle w:val="Nadpis3"/>
+      </w:pPr>
+      <w:bookmarkStart w:id="72" w:name="_Toc230179553"/>
+      <w:r>
+        <w:t>Angular komponentový přístup</w:t>
+      </w:r>
+      <w:bookmarkEnd w:id="72"/>
+    </w:p>
+    <w:p>
+      <w:r>
+        <w:t>Utvrdil jsem si rozdělování úlohy do samostatných komponent (habit-</w:t>
+      </w:r>
+      <w:proofErr w:type="spellStart"/>
+      <w:r>
+        <w:t>form</w:t>
+      </w:r>
+      <w:proofErr w:type="spellEnd"/>
+      <w:r>
+        <w:t xml:space="preserve">, </w:t>
+      </w:r>
+      <w:proofErr w:type="spellStart"/>
+      <w:r>
+        <w:t>habits</w:t>
+      </w:r>
+      <w:proofErr w:type="spellEnd"/>
+      <w:r>
+        <w:t>-list, habit-</w:t>
+      </w:r>
+      <w:proofErr w:type="spellStart"/>
+      <w:r>
+        <w:t>graph</w:t>
+      </w:r>
+      <w:proofErr w:type="spellEnd"/>
+      <w:r>
+        <w:t>) způsobem, aby byla aplikace přehledná a snadno rozšiřitelná. Zvlášť přínosné bylo používat @Input a @Output pro předávání dat a událostí mezi komponentami.</w:t>
+      </w:r>
+    </w:p>
+    <w:p>
+      <w:pPr>
+        <w:pStyle w:val="Nadpis3"/>
+      </w:pPr>
+      <w:bookmarkStart w:id="73" w:name="_Toc230179554"/>
+      <w:r>
+        <w:t>Práce se stavem a službami</w:t>
+      </w:r>
+      <w:bookmarkEnd w:id="73"/>
+    </w:p>
+    <w:p>
+      <w:r>
+        <w:t xml:space="preserve">Díky této práci jsem se naučil konstruovat </w:t>
+      </w:r>
+      <w:proofErr w:type="spellStart"/>
+      <w:r>
+        <w:t>DataService</w:t>
+      </w:r>
+      <w:proofErr w:type="spellEnd"/>
+      <w:r>
+        <w:t xml:space="preserve"> pro centralizovanou správu dat. Zjistil jsem, že reaktivní přístup (</w:t>
+      </w:r>
+      <w:proofErr w:type="spellStart"/>
+      <w:r>
+        <w:t>BehaviorSubject</w:t>
+      </w:r>
+      <w:proofErr w:type="spellEnd"/>
+      <w:r>
+        <w:t>) výrazně zjednodušuje konzistenci UI a díky tomu se lépe škáluje a opravuje.</w:t>
+      </w:r>
+    </w:p>
+    <w:p>
+      <w:pPr>
+        <w:pStyle w:val="Nadpis3"/>
+      </w:pPr>
+      <w:bookmarkStart w:id="74" w:name="_Toc230179555"/>
+      <w:r>
+        <w:t>Validace a ošetření uživatelských vstupů</w:t>
+      </w:r>
+      <w:bookmarkEnd w:id="74"/>
+    </w:p>
+    <w:p>
+      <w:r>
+        <w:t>Formulář mi ukázal, že validace není jen „checkbox“, ale reálné zabezpečení kvality dat. Zvlášť kontrola duplicit zabránila tomu, aby aplikace obsahovala nesmyslné nebo duplicitní záznamy.</w:t>
+      </w:r>
+    </w:p>
+    <w:p>
+      <w:pPr>
+        <w:pStyle w:val="Nadpis3"/>
+      </w:pPr>
+      <w:bookmarkStart w:id="75" w:name="_Toc230179556"/>
       <w:r>
         <w:lastRenderedPageBreak/>
-        <w:t>Omezení přepočtů grafu</w:t>
-      </w:r>
-    </w:p>
-    <w:p>
-      <w:r>
-        <w:t xml:space="preserve">Komponenta grafu zajišťuje přepočet dat primárně při změně vstupů (hlavně </w:t>
-      </w:r>
-      <w:proofErr w:type="spellStart"/>
-      <w:r>
-        <w:t>history</w:t>
-      </w:r>
-      <w:proofErr w:type="spellEnd"/>
-      <w:r>
-        <w:t>). Díky tomu se graf zbytečně nepřepočítává při každé drobné změně, ale jen když je to potřeba.</w:t>
-      </w:r>
-    </w:p>
-    <w:p>
-      <w:r>
-        <w:t>Validace před uložením. Formulář nepovolí nekonzistentní data (např. prázdné nebo příliš dlouhé hodnoty, duplicitní návyky). Tím se do grafu a seznamu nikdy nedostanou problematické vstupy, které by zhoršily výkon i kvalitu zobrazení.</w:t>
-      </w:r>
-    </w:p>
-    <w:p>
-      <w:r>
-        <w:t>Celkově aplikace používá optimalizační principy typické pro front-end vývoj: reaktivní práce se stavem, efektivní zpracování dat a validace na hraně vstupu.</w:t>
-      </w:r>
-    </w:p>
-    <w:p/>
-    <w:p>
-      <w:pPr>
-        <w:pStyle w:val="Nadpis2"/>
-      </w:pPr>
-      <w:bookmarkStart w:id="46" w:name="_Toc226556251"/>
-      <w:r>
-        <w:t>Zkušenosti nabrané z této práce</w:t>
-      </w:r>
-      <w:bookmarkEnd w:id="46"/>
-    </w:p>
-    <w:p>
-      <w:r>
-        <w:t>Během vývoje aplikace Habit Tracker jsem získal/a praktické zkušenosti v několika oblastech, které jsou pro tvorbu školních i reálných projektů důležité.</w:t>
+        <w:t>Transformace dat pro graf</w:t>
+      </w:r>
+      <w:bookmarkEnd w:id="75"/>
+    </w:p>
+    <w:p>
+      <w:r>
+        <w:t>Další velice užitečná a cenná byla zkušenost s tím, jak převést surovou historii událostí na strukturu vhodnou pro graf (binování podle zvoleného období). To je častý problém v reálných aplikacích – data záznamů se musí agregovat do</w:t>
+      </w:r>
+      <w:r>
+        <w:t xml:space="preserve"> </w:t>
+      </w:r>
+      <w:proofErr w:type="spellStart"/>
+      <w:r>
+        <w:t>zobrazovatelných</w:t>
+      </w:r>
+      <w:proofErr w:type="spellEnd"/>
+      <w:r>
+        <w:t xml:space="preserve"> tvarů.</w:t>
       </w:r>
     </w:p>
     <w:p>
       <w:pPr>
         <w:pStyle w:val="Nadpis3"/>
       </w:pPr>
-      <w:r>
-        <w:t>Angular komponentový přístup</w:t>
-      </w:r>
-    </w:p>
-    <w:p>
-      <w:r>
-        <w:t>Utvrdil jsem si rozdělování úlohy do samostatných komponent (habit-</w:t>
-      </w:r>
-      <w:proofErr w:type="spellStart"/>
-      <w:r>
-        <w:t>form</w:t>
-      </w:r>
-      <w:proofErr w:type="spellEnd"/>
-      <w:r>
-        <w:t xml:space="preserve">, </w:t>
-      </w:r>
-      <w:proofErr w:type="spellStart"/>
-      <w:r>
-        <w:t>habits</w:t>
-      </w:r>
-      <w:proofErr w:type="spellEnd"/>
-      <w:r>
-        <w:t>-list, habit-</w:t>
-      </w:r>
-      <w:proofErr w:type="spellStart"/>
-      <w:r>
-        <w:t>graph</w:t>
-      </w:r>
-      <w:proofErr w:type="spellEnd"/>
-      <w:r>
-        <w:t>) způsobem, aby byla aplikace přehledná a snadno rozšiřitelná. Zvlášť přínosné bylo používat @Input a @Output pro předávání dat a událostí mezi komponentami.</w:t>
-      </w:r>
-    </w:p>
-    <w:p>
-      <w:pPr>
-        <w:pStyle w:val="Nadpis3"/>
-      </w:pPr>
-      <w:r>
-        <w:t>Práce se stavem a službami</w:t>
-      </w:r>
-    </w:p>
-    <w:p>
-      <w:r>
-        <w:t xml:space="preserve">Díky této práci jsem se naučil konstruovat </w:t>
-      </w:r>
-      <w:proofErr w:type="spellStart"/>
-      <w:r>
-        <w:t>DataService</w:t>
-      </w:r>
-      <w:proofErr w:type="spellEnd"/>
-      <w:r>
-        <w:t xml:space="preserve"> pro centralizovanou správu dat. Zjistil jsem, že reaktivní přístup (</w:t>
-      </w:r>
-      <w:proofErr w:type="spellStart"/>
-      <w:r>
-        <w:t>BehaviorSubject</w:t>
-      </w:r>
-      <w:proofErr w:type="spellEnd"/>
-      <w:r>
-        <w:t>) výrazně zjednodušuje konzistenci UI a díky tomu se lépe škáluje a opravuje.</w:t>
-      </w:r>
-    </w:p>
-    <w:p>
-      <w:pPr>
-        <w:pStyle w:val="Nadpis3"/>
-      </w:pPr>
-      <w:r>
-        <w:t>Validace a ošetření uživatelských vstupů</w:t>
-      </w:r>
-    </w:p>
-    <w:p>
-      <w:r>
-        <w:t>Formulář mi ukázal, že validace není jen „checkbox“, ale reálné zabezpečení kvality dat. Zvlášť kontrola duplicit zabránila tomu, aby aplikace obsahovala nesmyslné nebo duplicitní záznamy.</w:t>
-      </w:r>
-    </w:p>
-    <w:p>
-      <w:pPr>
-        <w:pStyle w:val="Nadpis3"/>
-      </w:pPr>
-      <w:r>
-        <w:t>Transformace dat pro graf</w:t>
-      </w:r>
-    </w:p>
-    <w:p>
-      <w:r>
-        <w:t>Další velice užitečná a cenná byla zkušenost s tím, jak převést surovou historii událostí na strukturu vhodnou pro graf (binování podle zvoleného období). To je častý problém v reálných aplikacích – data záznamů se musí agregovat do</w:t>
-      </w:r>
-      <w:r>
-        <w:t xml:space="preserve"> </w:t>
-      </w:r>
-      <w:proofErr w:type="spellStart"/>
-      <w:r>
-        <w:t>zobrazovatelných</w:t>
-      </w:r>
-      <w:proofErr w:type="spellEnd"/>
-      <w:r>
-        <w:t xml:space="preserve"> tvarů.</w:t>
-      </w:r>
-    </w:p>
-    <w:p>
-      <w:pPr>
-        <w:pStyle w:val="Nadpis3"/>
-      </w:pPr>
+      <w:bookmarkStart w:id="76" w:name="_Toc230179557"/>
       <w:r>
         <w:t>Uživatelská použitelnost</w:t>
       </w:r>
+      <w:bookmarkEnd w:id="76"/>
     </w:p>
     <w:p>
       <w:r>
@@ -8541,12 +9766,12 @@
         </w:numPr>
         <w:ind w:left="720"/>
       </w:pPr>
-      <w:bookmarkStart w:id="47" w:name="_Toc226556252"/>
+      <w:bookmarkStart w:id="77" w:name="_Toc230179558"/>
       <w:r>
         <w:lastRenderedPageBreak/>
         <w:t>Závěr</w:t>
       </w:r>
-      <w:bookmarkEnd w:id="47"/>
+      <w:bookmarkEnd w:id="77"/>
     </w:p>
     <w:p>
       <w:r>
@@ -8554,27 +9779,22 @@
       </w:r>
       <w:proofErr w:type="spellStart"/>
       <w:r>
-        <w:t>observables.</w:t>
-      </w:r>
-      <w:proofErr w:type="spellEnd"/>
-    </w:p>
-    <w:p>
-      <w:r>
-        <w:t xml:space="preserve">Aplikace splňuje svůj primární </w:t>
-      </w:r>
-      <w:proofErr w:type="gramStart"/>
-      <w:r>
-        <w:t xml:space="preserve">účel </w:t>
+        <w:t>observables</w:t>
+      </w:r>
+      <w:proofErr w:type="spellEnd"/>
+      <w:r>
+        <w:t>.</w:t>
+      </w:r>
+    </w:p>
+    <w:p>
+      <w:r>
+        <w:t xml:space="preserve">Aplikace splňuje svůj primární účel </w:t>
       </w:r>
       <w:r>
         <w:t xml:space="preserve">- </w:t>
       </w:r>
       <w:r>
-        <w:t>umožňuje</w:t>
-      </w:r>
-      <w:proofErr w:type="gramEnd"/>
-      <w:r>
-        <w:t xml:space="preserve"> uživatelům intuitivně sledovat a spravovat své návyky a zlozvyky s vizuální zpětnou vazbou v reálném čase. Kombinace Angular Material pro konzistentní design, SCSS pro flexibilní stylování a lokálního úložiště pro perzistenci dat vytváří stabilní a rozšiřitelné řešení. Ačkoli je aplikace v současné podobě plně funkční, existují možnosti pro budoucí rozšíření, jako je synchronizace dat přes cloud, notifikace pro připomenutí návyků nebo pokročilejší analýzy trendů.</w:t>
+        <w:t>umožňuje uživatelům intuitivně sledovat a spravovat své návyky a zlozvyky s vizuální zpětnou vazbou v reálném čase. Kombinace Angular Material pro konzistentní design, SCSS pro flexibilní stylování a lokálního úložiště pro perzistenci dat vytváří stabilní a rozšiřitelné řešení. Ačkoli je aplikace v současné podobě plně funkční, existují možnosti pro budoucí rozšíření, jako je synchronizace dat přes cloud, notifikace pro připomenutí návyků nebo pokročilejší analýzy trendů.</w:t>
       </w:r>
     </w:p>
     <w:p>
@@ -8608,16 +9828,16 @@
         </w:numPr>
         <w:ind w:left="720"/>
       </w:pPr>
-      <w:bookmarkStart w:id="48" w:name="_Toc222315302"/>
-      <w:bookmarkStart w:id="49" w:name="_Toc223513779"/>
-      <w:bookmarkStart w:id="50" w:name="_Toc226556253"/>
+      <w:bookmarkStart w:id="78" w:name="_Toc222315302"/>
+      <w:bookmarkStart w:id="79" w:name="_Toc223513779"/>
+      <w:bookmarkStart w:id="80" w:name="_Toc230179559"/>
       <w:r>
         <w:lastRenderedPageBreak/>
         <w:t>Použitá literatura</w:t>
       </w:r>
-      <w:bookmarkEnd w:id="48"/>
-      <w:bookmarkEnd w:id="49"/>
-      <w:bookmarkEnd w:id="50"/>
+      <w:bookmarkEnd w:id="78"/>
+      <w:bookmarkEnd w:id="79"/>
+      <w:bookmarkEnd w:id="80"/>
     </w:p>
     <w:p>
       <w:pPr>
@@ -8685,21 +9905,7 @@
           <w:rPr>
             <w:rStyle w:val="Hypertextovodkaz"/>
           </w:rPr>
-          <w:t>https://www.typescriptlang.org/</w:t>
-        </w:r>
-        <w:proofErr w:type="spellStart"/>
-        <w:r>
-          <w:rPr>
-            <w:rStyle w:val="Hypertextovodkaz"/>
-          </w:rPr>
-          <w:t>docs</w:t>
-        </w:r>
-        <w:proofErr w:type="spellEnd"/>
-        <w:r>
-          <w:rPr>
-            <w:rStyle w:val="Hypertextovodkaz"/>
-          </w:rPr>
-          <w:t>/</w:t>
+          <w:t>https://www.typescriptlang.org/docs/</w:t>
         </w:r>
       </w:hyperlink>
     </w:p>
@@ -8760,16 +9966,16 @@
         </w:numPr>
         <w:ind w:left="720"/>
       </w:pPr>
-      <w:bookmarkStart w:id="51" w:name="_Toc222315303"/>
-      <w:bookmarkStart w:id="52" w:name="_Toc223513780"/>
-      <w:bookmarkStart w:id="53" w:name="_Toc226556254"/>
+      <w:bookmarkStart w:id="81" w:name="_Toc222315303"/>
+      <w:bookmarkStart w:id="82" w:name="_Toc223513780"/>
+      <w:bookmarkStart w:id="83" w:name="_Toc230179560"/>
       <w:r>
         <w:lastRenderedPageBreak/>
         <w:t>Seznam obrázků</w:t>
       </w:r>
-      <w:bookmarkEnd w:id="51"/>
-      <w:bookmarkEnd w:id="52"/>
-      <w:bookmarkEnd w:id="53"/>
+      <w:bookmarkEnd w:id="81"/>
+      <w:bookmarkEnd w:id="82"/>
+      <w:bookmarkEnd w:id="83"/>
     </w:p>
     <w:p>
       <w:r>
@@ -9163,16 +10369,16 @@
         </w:numPr>
         <w:ind w:left="720"/>
       </w:pPr>
-      <w:bookmarkStart w:id="54" w:name="_Toc222315304"/>
-      <w:bookmarkStart w:id="55" w:name="_Toc223513781"/>
-      <w:bookmarkStart w:id="56" w:name="_Toc226556255"/>
+      <w:bookmarkStart w:id="84" w:name="_Toc222315304"/>
+      <w:bookmarkStart w:id="85" w:name="_Toc223513781"/>
+      <w:bookmarkStart w:id="86" w:name="_Toc230179561"/>
       <w:r>
         <w:lastRenderedPageBreak/>
         <w:t>Seznam tabulek</w:t>
       </w:r>
-      <w:bookmarkEnd w:id="54"/>
-      <w:bookmarkEnd w:id="55"/>
-      <w:bookmarkEnd w:id="56"/>
+      <w:bookmarkEnd w:id="84"/>
+      <w:bookmarkEnd w:id="85"/>
+      <w:bookmarkEnd w:id="86"/>
     </w:p>
     <w:p>
       <w:pPr>
@@ -9274,16 +10480,16 @@
         </w:numPr>
         <w:ind w:left="720"/>
       </w:pPr>
-      <w:bookmarkStart w:id="57" w:name="_Toc222315305"/>
-      <w:bookmarkStart w:id="58" w:name="_Toc223513782"/>
-      <w:bookmarkStart w:id="59" w:name="_Toc226556256"/>
+      <w:bookmarkStart w:id="87" w:name="_Toc222315305"/>
+      <w:bookmarkStart w:id="88" w:name="_Toc223513782"/>
+      <w:bookmarkStart w:id="89" w:name="_Toc230179562"/>
       <w:r>
         <w:lastRenderedPageBreak/>
         <w:t>Seznam příloh</w:t>
       </w:r>
-      <w:bookmarkEnd w:id="57"/>
-      <w:bookmarkEnd w:id="58"/>
-      <w:bookmarkEnd w:id="59"/>
+      <w:bookmarkEnd w:id="87"/>
+      <w:bookmarkEnd w:id="88"/>
+      <w:bookmarkEnd w:id="89"/>
     </w:p>
     <w:p>
       <w:r>
@@ -9335,16 +10541,16 @@
         </w:numPr>
         <w:ind w:left="720"/>
       </w:pPr>
-      <w:bookmarkStart w:id="60" w:name="_Toc222315306"/>
-      <w:bookmarkStart w:id="61" w:name="_Toc223513783"/>
-      <w:bookmarkStart w:id="62" w:name="_Toc226556257"/>
+      <w:bookmarkStart w:id="90" w:name="_Toc222315306"/>
+      <w:bookmarkStart w:id="91" w:name="_Toc223513783"/>
+      <w:bookmarkStart w:id="92" w:name="_Toc230179563"/>
       <w:r>
         <w:lastRenderedPageBreak/>
         <w:t>Přílohy</w:t>
       </w:r>
-      <w:bookmarkEnd w:id="60"/>
-      <w:bookmarkEnd w:id="61"/>
-      <w:bookmarkEnd w:id="62"/>
+      <w:bookmarkEnd w:id="90"/>
+      <w:bookmarkEnd w:id="91"/>
+      <w:bookmarkEnd w:id="92"/>
     </w:p>
     <w:p>
       <w:r>
@@ -10004,21 +11210,13 @@
       <w:ptab w:relativeTo="margin" w:alignment="right" w:leader="none"/>
     </w:r>
     <w:r>
-      <w:t>3.</w:t>
-    </w:r>
-    <w:proofErr w:type="gramStart"/>
-    <w:r>
-      <w:t>E</w:t>
+      <w:t>3.E</w:t>
     </w:r>
     <w:r>
       <w:t xml:space="preserve"> – </w:t>
     </w:r>
     <w:r>
-      <w:t>2025</w:t>
-    </w:r>
-    <w:proofErr w:type="gramEnd"/>
-    <w:r>
-      <w:t>/2026</w:t>
+      <w:t>2025/2026</w:t>
     </w:r>
   </w:p>
 </w:hdr>

</xml_diff>

<commit_message>
again forgot to save the docs
</commit_message>
<xml_diff>
--- a/Barta_rocnikova_prace.docx
+++ b/Barta_rocnikova_prace.docx
@@ -5877,7 +5877,15 @@
       </w:r>
       <w:proofErr w:type="spellEnd"/>
       <w:r>
-        <w:t xml:space="preserve"> Studio Codu je, že s jinými vývojovými nástroji nemám až takové zkušenosti jako právě s tímto. Na naší škole se většina práce s kódem dělá právě v tomto IDE, takže jsem si postupně osvojil jeho ovládání, práci s projektem, ladění a hlavně i to, jak v něm pracovat „běžně“, aniž bych pořád musel hledat, kde se jaká možnost nachází. To u ročníkové práce pomáhá hodně, protože když se člověk soustředí hlavně na samotnou aplikaci, nechce ztrácet čas tím, že se učí nové IDE nebo nové nastavení.</w:t>
+        <w:t xml:space="preserve"> Studio Codu je, že s jinými vývojovými nástroji nemám až takové zkušenosti jako právě s tímto. Na naší škole se většina práce s kódem dělá právě v tomto IDE, takže jsem si postupně osvojil jeho ovládání, práci s projektem, </w:t>
+      </w:r>
+      <w:proofErr w:type="gramStart"/>
+      <w:r>
+        <w:t>ladění</w:t>
+      </w:r>
+      <w:proofErr w:type="gramEnd"/>
+      <w:r>
+        <w:t xml:space="preserve"> a hlavně i to, jak v něm pracovat „běžně“, aniž bych pořád musel hledat, kde se jaká možnost nachází. To u ročníkové práce pomáhá hodně, protože když se člověk soustředí hlavně na samotnou aplikaci, nechce ztrácet čas tím, že se učí nové IDE nebo nové nastavení.</w:t>
       </w:r>
     </w:p>
     <w:p>
@@ -6636,11 +6644,16 @@
       <w:r>
         <w:t xml:space="preserve"> slouží </w:t>
       </w:r>
+      <w:proofErr w:type="gramStart"/>
       <w:r>
         <w:t xml:space="preserve">pro </w:t>
       </w:r>
       <w:r>
-        <w:t xml:space="preserve"> definování struktury objektů. V projektu jsem definoval interface pro Habit Tento interface zajišťuje, že všechny návyky v aplikaci mají konzistentní strukturu a jsou správně typované.</w:t>
+        <w:t xml:space="preserve"> definování</w:t>
+      </w:r>
+      <w:proofErr w:type="gramEnd"/>
+      <w:r>
+        <w:t xml:space="preserve"> struktury objektů. V projektu jsem definoval interface pro Habit Tento interface zajišťuje, že všechny návyky v aplikaci mají konzistentní strukturu a jsou správně typované.</w:t>
       </w:r>
     </w:p>
     <w:p>
@@ -7110,11 +7123,16 @@
             <w:tcW w:w="3210" w:type="dxa"/>
           </w:tcPr>
           <w:p>
+            <w:proofErr w:type="gramStart"/>
             <w:r>
               <w:t>U</w:t>
             </w:r>
             <w:r>
-              <w:t>kazatel zda daný habit náleží skupině kladné nebo špatné</w:t>
+              <w:t>kazatel</w:t>
+            </w:r>
+            <w:proofErr w:type="gramEnd"/>
+            <w:r>
+              <w:t xml:space="preserve"> zda daný habit náleží skupině kladné nebo špatné</w:t>
             </w:r>
           </w:p>
         </w:tc>
@@ -7136,6 +7154,7 @@
           </w:tcPr>
           <w:p>
             <w:proofErr w:type="spellStart"/>
+            <w:proofErr w:type="gramStart"/>
             <w:r>
               <w:t>Array</w:t>
             </w:r>
@@ -7144,6 +7163,7 @@
               <w:t>&lt;</w:t>
             </w:r>
             <w:proofErr w:type="spellStart"/>
+            <w:proofErr w:type="gramEnd"/>
             <w:r>
               <w:t>Date</w:t>
             </w:r>
@@ -7221,7 +7241,7 @@
         <w:pStyle w:val="Titulek"/>
         <w:jc w:val="left"/>
       </w:pPr>
-      <w:bookmarkStart w:id="57" w:name="_Toc230173683"/>
+      <w:bookmarkStart w:id="57" w:name="_Toc230179648"/>
       <w:r>
         <w:t xml:space="preserve">Tabulka </w:t>
       </w:r>
@@ -7661,6 +7681,7 @@
       <w:pPr>
         <w:pStyle w:val="Titulek"/>
       </w:pPr>
+      <w:bookmarkStart w:id="59" w:name="_Toc230179649"/>
       <w:r>
         <w:t xml:space="preserve">Tabulka </w:t>
       </w:r>
@@ -7689,6 +7710,7 @@
       <w:r>
         <w:t>toolbaru</w:t>
       </w:r>
+      <w:bookmarkEnd w:id="59"/>
       <w:proofErr w:type="spellEnd"/>
     </w:p>
     <w:p>
@@ -7780,7 +7802,7 @@
       <w:pPr>
         <w:pStyle w:val="Titulek"/>
       </w:pPr>
-      <w:bookmarkStart w:id="59" w:name="_Toc230174422"/>
+      <w:bookmarkStart w:id="60" w:name="_Toc230179642"/>
       <w:r>
         <w:t xml:space="preserve">Obrázek </w:t>
       </w:r>
@@ -7805,17 +7827,17 @@
       <w:r>
         <w:t>: Hlavní UI</w:t>
       </w:r>
-      <w:bookmarkEnd w:id="59"/>
+      <w:bookmarkEnd w:id="60"/>
     </w:p>
     <w:p>
       <w:pPr>
         <w:pStyle w:val="Nadpis2"/>
       </w:pPr>
-      <w:bookmarkStart w:id="60" w:name="_Toc230179545"/>
+      <w:bookmarkStart w:id="61" w:name="_Toc230179545"/>
       <w:r>
         <w:t>Formulář pro vytváření nových návyků</w:t>
       </w:r>
-      <w:bookmarkEnd w:id="60"/>
+      <w:bookmarkEnd w:id="61"/>
     </w:p>
     <w:p>
       <w:r>
@@ -8075,6 +8097,7 @@
       <w:pPr>
         <w:pStyle w:val="Titulek"/>
       </w:pPr>
+      <w:bookmarkStart w:id="62" w:name="_Toc230179650"/>
       <w:r>
         <w:t xml:space="preserve">Tabulka </w:t>
       </w:r>
@@ -8099,6 +8122,7 @@
       <w:r>
         <w:t>: Vstupy formuláře</w:t>
       </w:r>
+      <w:bookmarkEnd w:id="62"/>
     </w:p>
     <w:p>
       <w:r>
@@ -8215,7 +8239,7 @@
       <w:pPr>
         <w:pStyle w:val="Titulek"/>
       </w:pPr>
-      <w:bookmarkStart w:id="61" w:name="_Toc230174423"/>
+      <w:bookmarkStart w:id="63" w:name="_Toc230179643"/>
       <w:r>
         <w:t xml:space="preserve">Obrázek </w:t>
       </w:r>
@@ -8240,17 +8264,17 @@
       <w:r>
         <w:t>: Formulář pro přidání nových habitů</w:t>
       </w:r>
-      <w:bookmarkEnd w:id="61"/>
+      <w:bookmarkEnd w:id="63"/>
     </w:p>
     <w:p>
       <w:pPr>
         <w:pStyle w:val="Nadpis2"/>
       </w:pPr>
-      <w:bookmarkStart w:id="62" w:name="_Toc230179546"/>
+      <w:bookmarkStart w:id="64" w:name="_Toc230179546"/>
       <w:r>
         <w:t>Seznamy návyků</w:t>
       </w:r>
-      <w:bookmarkEnd w:id="62"/>
+      <w:bookmarkEnd w:id="64"/>
     </w:p>
     <w:p>
       <w:r>
@@ -8416,6 +8440,7 @@
       <w:pPr>
         <w:pStyle w:val="Titulek"/>
       </w:pPr>
+      <w:bookmarkStart w:id="65" w:name="_Toc230179651"/>
       <w:r>
         <w:t xml:space="preserve">Tabulka </w:t>
       </w:r>
@@ -8440,6 +8465,7 @@
       <w:r>
         <w:t>: Členové za funkcí UI</w:t>
       </w:r>
+      <w:bookmarkEnd w:id="65"/>
     </w:p>
     <w:p>
       <w:r>
@@ -8535,6 +8561,7 @@
       <w:pPr>
         <w:pStyle w:val="Titulek"/>
       </w:pPr>
+      <w:bookmarkStart w:id="66" w:name="_Toc230179652"/>
       <w:r>
         <w:t xml:space="preserve">Tabulka </w:t>
       </w:r>
@@ -8559,6 +8586,7 @@
       <w:r>
         <w:t>: výstupní eventy UI</w:t>
       </w:r>
+      <w:bookmarkEnd w:id="66"/>
     </w:p>
     <w:p>
       <w:r>
@@ -8640,7 +8668,7 @@
       <w:pPr>
         <w:pStyle w:val="Titulek"/>
       </w:pPr>
-      <w:bookmarkStart w:id="63" w:name="_Toc230174424"/>
+      <w:bookmarkStart w:id="67" w:name="_Toc230179644"/>
       <w:r>
         <w:t xml:space="preserve">Obrázek </w:t>
       </w:r>
@@ -8665,17 +8693,17 @@
       <w:r>
         <w:t>: Seznam habitů</w:t>
       </w:r>
-      <w:bookmarkEnd w:id="63"/>
+      <w:bookmarkEnd w:id="67"/>
     </w:p>
     <w:p>
       <w:pPr>
         <w:pStyle w:val="Nadpis2"/>
       </w:pPr>
-      <w:bookmarkStart w:id="64" w:name="_Toc230179547"/>
+      <w:bookmarkStart w:id="68" w:name="_Toc230179547"/>
       <w:r>
         <w:t>Vizualizace plnění návyku</w:t>
       </w:r>
-      <w:bookmarkEnd w:id="64"/>
+      <w:bookmarkEnd w:id="68"/>
     </w:p>
     <w:p>
       <w:pPr>
@@ -8756,12 +8784,17 @@
               <w:t xml:space="preserve">: </w:t>
             </w:r>
             <w:proofErr w:type="spellStart"/>
+            <w:proofErr w:type="gramStart"/>
             <w:r>
               <w:t>Date</w:t>
             </w:r>
             <w:proofErr w:type="spellEnd"/>
             <w:r>
-              <w:t>[]</w:t>
+              <w:t>[</w:t>
+            </w:r>
+            <w:proofErr w:type="gramEnd"/>
+            <w:r>
+              <w:t>]</w:t>
             </w:r>
           </w:p>
         </w:tc>
@@ -8808,6 +8841,7 @@
       <w:pPr>
         <w:pStyle w:val="Titulek"/>
       </w:pPr>
+      <w:bookmarkStart w:id="69" w:name="_Toc230179653"/>
       <w:r>
         <w:t xml:space="preserve">Tabulka </w:t>
       </w:r>
@@ -8836,6 +8870,7 @@
       <w:r>
         <w:t>HabitGraphu</w:t>
       </w:r>
+      <w:bookmarkEnd w:id="69"/>
       <w:proofErr w:type="spellEnd"/>
     </w:p>
     <w:p>
@@ -8977,6 +9012,7 @@
       <w:pPr>
         <w:pStyle w:val="Titulek"/>
       </w:pPr>
+      <w:bookmarkStart w:id="70" w:name="_Toc230179654"/>
       <w:r>
         <w:t xml:space="preserve">Tabulka </w:t>
       </w:r>
@@ -9001,6 +9037,7 @@
       <w:r>
         <w:t>: možnosti grafu</w:t>
       </w:r>
+      <w:bookmarkEnd w:id="70"/>
     </w:p>
     <w:p>
       <w:r>
@@ -9085,7 +9122,7 @@
           <w:rStyle w:val="Siln"/>
         </w:rPr>
       </w:pPr>
-      <w:bookmarkStart w:id="65" w:name="_Toc230174425"/>
+      <w:bookmarkStart w:id="71" w:name="_Toc230179645"/>
       <w:r>
         <w:t xml:space="preserve">Obrázek </w:t>
       </w:r>
@@ -9110,17 +9147,17 @@
       <w:r>
         <w:t>: Rozevřený habit</w:t>
       </w:r>
-      <w:bookmarkEnd w:id="65"/>
+      <w:bookmarkEnd w:id="71"/>
     </w:p>
     <w:p>
       <w:pPr>
         <w:pStyle w:val="Nadpis2"/>
       </w:pPr>
-      <w:bookmarkStart w:id="66" w:name="_Toc230179548"/>
+      <w:bookmarkStart w:id="72" w:name="_Toc230179548"/>
       <w:r>
         <w:t>Styling a responzivita aplikace</w:t>
       </w:r>
-      <w:bookmarkEnd w:id="66"/>
+      <w:bookmarkEnd w:id="72"/>
     </w:p>
     <w:p>
       <w:r>
@@ -9172,10 +9209,12 @@
         <w:t xml:space="preserve"> a </w:t>
       </w:r>
       <w:proofErr w:type="spellStart"/>
+      <w:proofErr w:type="gramStart"/>
       <w:r>
         <w:t>variables.scss</w:t>
       </w:r>
       <w:proofErr w:type="spellEnd"/>
+      <w:proofErr w:type="gramEnd"/>
       <w:r>
         <w:t>.</w:t>
       </w:r>
@@ -9196,26 +9235,40 @@
         <w:t xml:space="preserve"> souborech (</w:t>
       </w:r>
       <w:proofErr w:type="spellStart"/>
-      <w:r>
-        <w:t>např.habit-graph.scss</w:t>
+      <w:proofErr w:type="gramStart"/>
+      <w:r>
+        <w:t>např.habit</w:t>
+      </w:r>
+      <w:proofErr w:type="gramEnd"/>
+      <w:r>
+        <w:t>-</w:t>
+      </w:r>
+      <w:proofErr w:type="gramStart"/>
+      <w:r>
+        <w:t>graph.scss</w:t>
       </w:r>
       <w:proofErr w:type="spellEnd"/>
+      <w:proofErr w:type="gramEnd"/>
       <w:r>
         <w:t xml:space="preserve"> a </w:t>
       </w:r>
       <w:proofErr w:type="spellStart"/>
+      <w:proofErr w:type="gramStart"/>
       <w:r>
         <w:t>habits.scss</w:t>
       </w:r>
       <w:proofErr w:type="spellEnd"/>
+      <w:proofErr w:type="gramEnd"/>
       <w:r>
         <w:t>, případně habit-</w:t>
       </w:r>
       <w:proofErr w:type="spellStart"/>
+      <w:proofErr w:type="gramStart"/>
       <w:r>
         <w:t>calendar.scss</w:t>
       </w:r>
       <w:proofErr w:type="spellEnd"/>
+      <w:proofErr w:type="gramEnd"/>
       <w:r>
         <w:t>).</w:t>
       </w:r>
@@ -9365,6 +9418,7 @@
       <w:pPr>
         <w:pStyle w:val="Titulek"/>
       </w:pPr>
+      <w:bookmarkStart w:id="73" w:name="_Toc230179655"/>
       <w:r>
         <w:t xml:space="preserve">Tabulka </w:t>
       </w:r>
@@ -9395,6 +9449,7 @@
       <w:r>
         <w:t xml:space="preserve"> na stylování</w:t>
       </w:r>
+      <w:bookmarkEnd w:id="73"/>
     </w:p>
     <w:p>
       <w:r>
@@ -9458,7 +9513,7 @@
       <w:pPr>
         <w:pStyle w:val="Titulek"/>
       </w:pPr>
-      <w:bookmarkStart w:id="67" w:name="_Toc230174426"/>
+      <w:bookmarkStart w:id="74" w:name="_Toc230179646"/>
       <w:r>
         <w:t xml:space="preserve">Obrázek </w:t>
       </w:r>
@@ -9483,18 +9538,18 @@
       <w:r>
         <w:t>: mobilní verze aplikace</w:t>
       </w:r>
-      <w:bookmarkEnd w:id="67"/>
+      <w:bookmarkEnd w:id="74"/>
     </w:p>
     <w:p>
       <w:pPr>
         <w:pStyle w:val="Nadpis2"/>
       </w:pPr>
-      <w:bookmarkStart w:id="68" w:name="_Toc230179549"/>
+      <w:bookmarkStart w:id="75" w:name="_Toc230179549"/>
       <w:r>
         <w:lastRenderedPageBreak/>
         <w:t>Optimalizace</w:t>
       </w:r>
-      <w:bookmarkEnd w:id="68"/>
+      <w:bookmarkEnd w:id="75"/>
     </w:p>
     <w:p>
       <w:r>
@@ -9508,7 +9563,7 @@
       <w:r>
         <w:t xml:space="preserve"> </w:t>
       </w:r>
-      <w:bookmarkStart w:id="69" w:name="_Toc230179550"/>
+      <w:bookmarkStart w:id="76" w:name="_Toc230179550"/>
       <w:r>
         <w:t>Centrální servis pro data (</w:t>
       </w:r>
@@ -9520,7 +9575,7 @@
       <w:r>
         <w:t>)</w:t>
       </w:r>
-      <w:bookmarkEnd w:id="69"/>
+      <w:bookmarkEnd w:id="76"/>
     </w:p>
     <w:p>
       <w:r>
@@ -9545,18 +9600,26 @@
       </w:r>
       <w:proofErr w:type="spellEnd"/>
       <w:r>
-        <w:t>). Komponenty pracují s data tokem a reagují na změny. Díky tomu je UI konzistentní bez nutnosti ručně volat přepočty napříč komponentami.</w:t>
+        <w:t xml:space="preserve">). Komponenty pracují </w:t>
+      </w:r>
+      <w:proofErr w:type="gramStart"/>
+      <w:r>
+        <w:t>s</w:t>
+      </w:r>
+      <w:proofErr w:type="gramEnd"/>
+      <w:r>
+        <w:t xml:space="preserve"> data tokem a reagují na změny. Díky tomu je UI konzistentní bez nutnosti ručně volat přepočty napříč komponentami.</w:t>
       </w:r>
     </w:p>
     <w:p>
       <w:pPr>
         <w:pStyle w:val="Nadpis3"/>
       </w:pPr>
-      <w:bookmarkStart w:id="70" w:name="_Toc230179551"/>
+      <w:bookmarkStart w:id="77" w:name="_Toc230179551"/>
       <w:r>
         <w:t>Omezení přepočtů grafu</w:t>
       </w:r>
-      <w:bookmarkEnd w:id="70"/>
+      <w:bookmarkEnd w:id="77"/>
     </w:p>
     <w:p>
       <w:r>
@@ -9586,11 +9649,11 @@
       <w:pPr>
         <w:pStyle w:val="Nadpis2"/>
       </w:pPr>
-      <w:bookmarkStart w:id="71" w:name="_Toc230179552"/>
+      <w:bookmarkStart w:id="78" w:name="_Toc230179552"/>
       <w:r>
         <w:t>Zkušenosti nabrané z této práce</w:t>
       </w:r>
-      <w:bookmarkEnd w:id="71"/>
+      <w:bookmarkEnd w:id="78"/>
     </w:p>
     <w:p>
       <w:r>
@@ -9601,11 +9664,11 @@
       <w:pPr>
         <w:pStyle w:val="Nadpis3"/>
       </w:pPr>
-      <w:bookmarkStart w:id="72" w:name="_Toc230179553"/>
+      <w:bookmarkStart w:id="79" w:name="_Toc230179553"/>
       <w:r>
         <w:t>Angular komponentový přístup</w:t>
       </w:r>
-      <w:bookmarkEnd w:id="72"/>
+      <w:bookmarkEnd w:id="79"/>
     </w:p>
     <w:p>
       <w:r>
@@ -9640,11 +9703,11 @@
       <w:pPr>
         <w:pStyle w:val="Nadpis3"/>
       </w:pPr>
-      <w:bookmarkStart w:id="73" w:name="_Toc230179554"/>
+      <w:bookmarkStart w:id="80" w:name="_Toc230179554"/>
       <w:r>
         <w:t>Práce se stavem a službami</w:t>
       </w:r>
-      <w:bookmarkEnd w:id="73"/>
+      <w:bookmarkEnd w:id="80"/>
     </w:p>
     <w:p>
       <w:r>
@@ -9671,11 +9734,11 @@
       <w:pPr>
         <w:pStyle w:val="Nadpis3"/>
       </w:pPr>
-      <w:bookmarkStart w:id="74" w:name="_Toc230179555"/>
+      <w:bookmarkStart w:id="81" w:name="_Toc230179555"/>
       <w:r>
         <w:t>Validace a ošetření uživatelských vstupů</w:t>
       </w:r>
-      <w:bookmarkEnd w:id="74"/>
+      <w:bookmarkEnd w:id="81"/>
     </w:p>
     <w:p>
       <w:r>
@@ -9686,12 +9749,12 @@
       <w:pPr>
         <w:pStyle w:val="Nadpis3"/>
       </w:pPr>
-      <w:bookmarkStart w:id="75" w:name="_Toc230179556"/>
+      <w:bookmarkStart w:id="82" w:name="_Toc230179556"/>
       <w:r>
         <w:lastRenderedPageBreak/>
         <w:t>Transformace dat pro graf</w:t>
       </w:r>
-      <w:bookmarkEnd w:id="75"/>
+      <w:bookmarkEnd w:id="82"/>
     </w:p>
     <w:p>
       <w:r>
@@ -9713,11 +9776,11 @@
       <w:pPr>
         <w:pStyle w:val="Nadpis3"/>
       </w:pPr>
-      <w:bookmarkStart w:id="76" w:name="_Toc230179557"/>
+      <w:bookmarkStart w:id="83" w:name="_Toc230179557"/>
       <w:r>
         <w:t>Uživatelská použitelnost</w:t>
       </w:r>
-      <w:bookmarkEnd w:id="76"/>
+      <w:bookmarkEnd w:id="83"/>
     </w:p>
     <w:p>
       <w:r>
@@ -9766,12 +9829,12 @@
         </w:numPr>
         <w:ind w:left="720"/>
       </w:pPr>
-      <w:bookmarkStart w:id="77" w:name="_Toc230179558"/>
+      <w:bookmarkStart w:id="84" w:name="_Toc230179558"/>
       <w:r>
         <w:lastRenderedPageBreak/>
         <w:t>Závěr</w:t>
       </w:r>
-      <w:bookmarkEnd w:id="77"/>
+      <w:bookmarkEnd w:id="84"/>
     </w:p>
     <w:p>
       <w:r>
@@ -9788,13 +9851,21 @@
     </w:p>
     <w:p>
       <w:r>
-        <w:t xml:space="preserve">Aplikace splňuje svůj primární účel </w:t>
+        <w:t xml:space="preserve">Aplikace splňuje svůj primární </w:t>
+      </w:r>
+      <w:proofErr w:type="gramStart"/>
+      <w:r>
+        <w:t xml:space="preserve">účel </w:t>
       </w:r>
       <w:r>
         <w:t xml:space="preserve">- </w:t>
       </w:r>
       <w:r>
-        <w:t>umožňuje uživatelům intuitivně sledovat a spravovat své návyky a zlozvyky s vizuální zpětnou vazbou v reálném čase. Kombinace Angular Material pro konzistentní design, SCSS pro flexibilní stylování a lokálního úložiště pro perzistenci dat vytváří stabilní a rozšiřitelné řešení. Ačkoli je aplikace v současné podobě plně funkční, existují možnosti pro budoucí rozšíření, jako je synchronizace dat přes cloud, notifikace pro připomenutí návyků nebo pokročilejší analýzy trendů.</w:t>
+        <w:t>umožňuje</w:t>
+      </w:r>
+      <w:proofErr w:type="gramEnd"/>
+      <w:r>
+        <w:t xml:space="preserve"> uživatelům intuitivně sledovat a spravovat své návyky a zlozvyky s vizuální zpětnou vazbou v reálném čase. Kombinace Angular Material pro konzistentní design, SCSS pro flexibilní stylování a lokálního úložiště pro perzistenci dat vytváří stabilní a rozšiřitelné řešení. Ačkoli je aplikace v současné podobě plně funkční, existují možnosti pro budoucí rozšíření, jako je synchronizace dat přes cloud, notifikace pro připomenutí návyků nebo pokročilejší analýzy trendů.</w:t>
       </w:r>
     </w:p>
     <w:p>
@@ -9828,16 +9899,16 @@
         </w:numPr>
         <w:ind w:left="720"/>
       </w:pPr>
-      <w:bookmarkStart w:id="78" w:name="_Toc222315302"/>
-      <w:bookmarkStart w:id="79" w:name="_Toc223513779"/>
-      <w:bookmarkStart w:id="80" w:name="_Toc230179559"/>
+      <w:bookmarkStart w:id="85" w:name="_Toc222315302"/>
+      <w:bookmarkStart w:id="86" w:name="_Toc223513779"/>
+      <w:bookmarkStart w:id="87" w:name="_Toc230179559"/>
       <w:r>
         <w:lastRenderedPageBreak/>
         <w:t>Použitá literatura</w:t>
       </w:r>
-      <w:bookmarkEnd w:id="78"/>
-      <w:bookmarkEnd w:id="79"/>
-      <w:bookmarkEnd w:id="80"/>
+      <w:bookmarkEnd w:id="85"/>
+      <w:bookmarkEnd w:id="86"/>
+      <w:bookmarkEnd w:id="87"/>
     </w:p>
     <w:p>
       <w:pPr>
@@ -9966,16 +10037,16 @@
         </w:numPr>
         <w:ind w:left="720"/>
       </w:pPr>
-      <w:bookmarkStart w:id="81" w:name="_Toc222315303"/>
-      <w:bookmarkStart w:id="82" w:name="_Toc223513780"/>
-      <w:bookmarkStart w:id="83" w:name="_Toc230179560"/>
+      <w:bookmarkStart w:id="88" w:name="_Toc222315303"/>
+      <w:bookmarkStart w:id="89" w:name="_Toc223513780"/>
+      <w:bookmarkStart w:id="90" w:name="_Toc230179560"/>
       <w:r>
         <w:lastRenderedPageBreak/>
         <w:t>Seznam obrázků</w:t>
       </w:r>
-      <w:bookmarkEnd w:id="81"/>
-      <w:bookmarkEnd w:id="82"/>
-      <w:bookmarkEnd w:id="83"/>
+      <w:bookmarkEnd w:id="88"/>
+      <w:bookmarkEnd w:id="89"/>
+      <w:bookmarkEnd w:id="90"/>
     </w:p>
     <w:p>
       <w:r>
@@ -10004,7 +10075,7 @@
       <w:r>
         <w:fldChar w:fldCharType="separate"/>
       </w:r>
-      <w:hyperlink w:anchor="_Toc230174422" w:history="1">
+      <w:hyperlink w:anchor="_Toc230179642" w:history="1">
         <w:r>
           <w:rPr>
             <w:rStyle w:val="Hypertextovodkaz"/>
@@ -10031,7 +10102,78 @@
             <w:noProof/>
             <w:webHidden/>
           </w:rPr>
-          <w:instrText xml:space="preserve"> PAGEREF _Toc230174422 \h </w:instrText>
+          <w:instrText xml:space="preserve"> PAGEREF _Toc230179642 \h </w:instrText>
+        </w:r>
+        <w:r>
+          <w:rPr>
+            <w:noProof/>
+            <w:webHidden/>
+          </w:rPr>
+        </w:r>
+        <w:r>
+          <w:rPr>
+            <w:noProof/>
+            <w:webHidden/>
+          </w:rPr>
+          <w:fldChar w:fldCharType="separate"/>
+        </w:r>
+        <w:r>
+          <w:rPr>
+            <w:noProof/>
+            <w:webHidden/>
+          </w:rPr>
+          <w:t>16</w:t>
+        </w:r>
+        <w:r>
+          <w:rPr>
+            <w:noProof/>
+            <w:webHidden/>
+          </w:rPr>
+          <w:fldChar w:fldCharType="end"/>
+        </w:r>
+      </w:hyperlink>
+    </w:p>
+    <w:p>
+      <w:pPr>
+        <w:pStyle w:val="Seznamobrzk"/>
+        <w:tabs>
+          <w:tab w:val="right" w:leader="dot" w:pos="9628"/>
+        </w:tabs>
+        <w:rPr>
+          <w:rFonts w:asciiTheme="minorHAnsi" w:eastAsiaTheme="minorEastAsia" w:hAnsiTheme="minorHAnsi"/>
+          <w:noProof/>
+          <w:sz w:val="24"/>
+          <w:lang w:eastAsia="cs-CZ"/>
+        </w:rPr>
+      </w:pPr>
+      <w:hyperlink w:anchor="_Toc230179643" w:history="1">
+        <w:r>
+          <w:rPr>
+            <w:rStyle w:val="Hypertextovodkaz"/>
+            <w:noProof/>
+          </w:rPr>
+          <w:t>Obrázek 2: Formulář pro přidání nových habitů</w:t>
+        </w:r>
+        <w:r>
+          <w:rPr>
+            <w:noProof/>
+            <w:webHidden/>
+          </w:rPr>
+          <w:tab/>
+        </w:r>
+        <w:r>
+          <w:rPr>
+            <w:noProof/>
+            <w:webHidden/>
+          </w:rPr>
+          <w:fldChar w:fldCharType="begin"/>
+        </w:r>
+        <w:r>
+          <w:rPr>
+            <w:noProof/>
+            <w:webHidden/>
+          </w:rPr>
+          <w:instrText xml:space="preserve"> PAGEREF _Toc230179643 \h </w:instrText>
         </w:r>
         <w:r>
           <w:rPr>
@@ -10075,13 +10217,13 @@
           <w:lang w:eastAsia="cs-CZ"/>
         </w:rPr>
       </w:pPr>
-      <w:hyperlink w:anchor="_Toc230174423" w:history="1">
+      <w:hyperlink w:anchor="_Toc230179644" w:history="1">
         <w:r>
           <w:rPr>
             <w:rStyle w:val="Hypertextovodkaz"/>
             <w:noProof/>
           </w:rPr>
-          <w:t>Obrázek 2: Formulář pro přidání nových habitů</w:t>
+          <w:t>Obrázek 3: Seznam habitů</w:t>
         </w:r>
         <w:r>
           <w:rPr>
@@ -10102,7 +10244,7 @@
             <w:noProof/>
             <w:webHidden/>
           </w:rPr>
-          <w:instrText xml:space="preserve"> PAGEREF _Toc230174423 \h </w:instrText>
+          <w:instrText xml:space="preserve"> PAGEREF _Toc230179644 \h </w:instrText>
         </w:r>
         <w:r>
           <w:rPr>
@@ -10146,13 +10288,13 @@
           <w:lang w:eastAsia="cs-CZ"/>
         </w:rPr>
       </w:pPr>
-      <w:hyperlink w:anchor="_Toc230174424" w:history="1">
+      <w:hyperlink w:anchor="_Toc230179645" w:history="1">
         <w:r>
           <w:rPr>
             <w:rStyle w:val="Hypertextovodkaz"/>
             <w:noProof/>
           </w:rPr>
-          <w:t>Obrázek 3: Seznam habitů</w:t>
+          <w:t>Obrázek 4: Rozevřený habit</w:t>
         </w:r>
         <w:r>
           <w:rPr>
@@ -10173,7 +10315,7 @@
             <w:noProof/>
             <w:webHidden/>
           </w:rPr>
-          <w:instrText xml:space="preserve"> PAGEREF _Toc230174424 \h </w:instrText>
+          <w:instrText xml:space="preserve"> PAGEREF _Toc230179645 \h </w:instrText>
         </w:r>
         <w:r>
           <w:rPr>
@@ -10217,13 +10359,13 @@
           <w:lang w:eastAsia="cs-CZ"/>
         </w:rPr>
       </w:pPr>
-      <w:hyperlink w:anchor="_Toc230174425" w:history="1">
+      <w:hyperlink w:anchor="_Toc230179646" w:history="1">
         <w:r>
           <w:rPr>
             <w:rStyle w:val="Hypertextovodkaz"/>
             <w:noProof/>
           </w:rPr>
-          <w:t>Obrázek 4: Rozevřený habit</w:t>
+          <w:t>Obrázek 5: mobilní verze aplikace</w:t>
         </w:r>
         <w:r>
           <w:rPr>
@@ -10244,7 +10386,7 @@
             <w:noProof/>
             <w:webHidden/>
           </w:rPr>
-          <w:instrText xml:space="preserve"> PAGEREF _Toc230174425 \h </w:instrText>
+          <w:instrText xml:space="preserve"> PAGEREF _Toc230179646 \h </w:instrText>
         </w:r>
         <w:r>
           <w:rPr>
@@ -10276,6 +10418,40 @@
       </w:hyperlink>
     </w:p>
     <w:p>
+      <w:r>
+        <w:fldChar w:fldCharType="end"/>
+      </w:r>
+    </w:p>
+    <w:p>
+      <w:pPr>
+        <w:spacing w:after="160" w:line="278" w:lineRule="auto"/>
+        <w:jc w:val="left"/>
+      </w:pPr>
+      <w:r>
+        <w:br w:type="page"/>
+      </w:r>
+    </w:p>
+    <w:p>
+      <w:pPr>
+        <w:pStyle w:val="Nadpis1"/>
+        <w:numPr>
+          <w:ilvl w:val="0"/>
+          <w:numId w:val="0"/>
+        </w:numPr>
+        <w:ind w:left="720"/>
+      </w:pPr>
+      <w:bookmarkStart w:id="91" w:name="_Toc222315304"/>
+      <w:bookmarkStart w:id="92" w:name="_Toc223513781"/>
+      <w:bookmarkStart w:id="93" w:name="_Toc230179561"/>
+      <w:r>
+        <w:lastRenderedPageBreak/>
+        <w:t>Seznam tabulek</w:t>
+      </w:r>
+      <w:bookmarkEnd w:id="91"/>
+      <w:bookmarkEnd w:id="92"/>
+      <w:bookmarkEnd w:id="93"/>
+    </w:p>
+    <w:p>
       <w:pPr>
         <w:pStyle w:val="Seznamobrzk"/>
         <w:tabs>
@@ -10288,108 +10464,6 @@
           <w:lang w:eastAsia="cs-CZ"/>
         </w:rPr>
       </w:pPr>
-      <w:hyperlink w:anchor="_Toc230174426" w:history="1">
-        <w:r>
-          <w:rPr>
-            <w:rStyle w:val="Hypertextovodkaz"/>
-            <w:noProof/>
-          </w:rPr>
-          <w:t>Obrázek 5: mobilní verze aplikace</w:t>
-        </w:r>
-        <w:r>
-          <w:rPr>
-            <w:noProof/>
-            <w:webHidden/>
-          </w:rPr>
-          <w:tab/>
-        </w:r>
-        <w:r>
-          <w:rPr>
-            <w:noProof/>
-            <w:webHidden/>
-          </w:rPr>
-          <w:fldChar w:fldCharType="begin"/>
-        </w:r>
-        <w:r>
-          <w:rPr>
-            <w:noProof/>
-            <w:webHidden/>
-          </w:rPr>
-          <w:instrText xml:space="preserve"> PAGEREF _Toc230174426 \h </w:instrText>
-        </w:r>
-        <w:r>
-          <w:rPr>
-            <w:noProof/>
-            <w:webHidden/>
-          </w:rPr>
-        </w:r>
-        <w:r>
-          <w:rPr>
-            <w:noProof/>
-            <w:webHidden/>
-          </w:rPr>
-          <w:fldChar w:fldCharType="separate"/>
-        </w:r>
-        <w:r>
-          <w:rPr>
-            <w:noProof/>
-            <w:webHidden/>
-          </w:rPr>
-          <w:t>21</w:t>
-        </w:r>
-        <w:r>
-          <w:rPr>
-            <w:noProof/>
-            <w:webHidden/>
-          </w:rPr>
-          <w:fldChar w:fldCharType="end"/>
-        </w:r>
-      </w:hyperlink>
-    </w:p>
-    <w:p>
-      <w:r>
-        <w:fldChar w:fldCharType="end"/>
-      </w:r>
-    </w:p>
-    <w:p>
-      <w:pPr>
-        <w:spacing w:after="160" w:line="278" w:lineRule="auto"/>
-        <w:jc w:val="left"/>
-      </w:pPr>
-      <w:r>
-        <w:br w:type="page"/>
-      </w:r>
-    </w:p>
-    <w:p>
-      <w:pPr>
-        <w:pStyle w:val="Nadpis1"/>
-        <w:numPr>
-          <w:ilvl w:val="0"/>
-          <w:numId w:val="0"/>
-        </w:numPr>
-        <w:ind w:left="720"/>
-      </w:pPr>
-      <w:bookmarkStart w:id="84" w:name="_Toc222315304"/>
-      <w:bookmarkStart w:id="85" w:name="_Toc223513781"/>
-      <w:bookmarkStart w:id="86" w:name="_Toc230179561"/>
-      <w:r>
-        <w:lastRenderedPageBreak/>
-        <w:t>Seznam tabulek</w:t>
-      </w:r>
-      <w:bookmarkEnd w:id="84"/>
-      <w:bookmarkEnd w:id="85"/>
-      <w:bookmarkEnd w:id="86"/>
-    </w:p>
-    <w:p>
-      <w:pPr>
-        <w:pStyle w:val="Seznamobrzk"/>
-        <w:tabs>
-          <w:tab w:val="right" w:leader="dot" w:pos="9628"/>
-        </w:tabs>
-        <w:rPr>
-          <w:noProof/>
-        </w:rPr>
-      </w:pPr>
       <w:r>
         <w:fldChar w:fldCharType="begin"/>
       </w:r>
@@ -10399,7 +10473,7 @@
       <w:r>
         <w:fldChar w:fldCharType="separate"/>
       </w:r>
-      <w:hyperlink w:anchor="_Toc230173683" w:history="1">
+      <w:hyperlink w:anchor="_Toc230179648" w:history="1">
         <w:r>
           <w:rPr>
             <w:rStyle w:val="Hypertextovodkaz"/>
@@ -10426,7 +10500,78 @@
             <w:noProof/>
             <w:webHidden/>
           </w:rPr>
-          <w:instrText xml:space="preserve"> PAGEREF _Toc230173683 \h </w:instrText>
+          <w:instrText xml:space="preserve"> PAGEREF _Toc230179648 \h </w:instrText>
+        </w:r>
+        <w:r>
+          <w:rPr>
+            <w:noProof/>
+            <w:webHidden/>
+          </w:rPr>
+        </w:r>
+        <w:r>
+          <w:rPr>
+            <w:noProof/>
+            <w:webHidden/>
+          </w:rPr>
+          <w:fldChar w:fldCharType="separate"/>
+        </w:r>
+        <w:r>
+          <w:rPr>
+            <w:noProof/>
+            <w:webHidden/>
+          </w:rPr>
+          <w:t>14</w:t>
+        </w:r>
+        <w:r>
+          <w:rPr>
+            <w:noProof/>
+            <w:webHidden/>
+          </w:rPr>
+          <w:fldChar w:fldCharType="end"/>
+        </w:r>
+      </w:hyperlink>
+    </w:p>
+    <w:p>
+      <w:pPr>
+        <w:pStyle w:val="Seznamobrzk"/>
+        <w:tabs>
+          <w:tab w:val="right" w:leader="dot" w:pos="9628"/>
+        </w:tabs>
+        <w:rPr>
+          <w:rFonts w:asciiTheme="minorHAnsi" w:eastAsiaTheme="minorEastAsia" w:hAnsiTheme="minorHAnsi"/>
+          <w:noProof/>
+          <w:sz w:val="24"/>
+          <w:lang w:eastAsia="cs-CZ"/>
+        </w:rPr>
+      </w:pPr>
+      <w:hyperlink w:anchor="_Toc230179649" w:history="1">
+        <w:r>
+          <w:rPr>
+            <w:rStyle w:val="Hypertextovodkaz"/>
+            <w:noProof/>
+          </w:rPr>
+          <w:t>Tabulka 2: Akce toolbaru</w:t>
+        </w:r>
+        <w:r>
+          <w:rPr>
+            <w:noProof/>
+            <w:webHidden/>
+          </w:rPr>
+          <w:tab/>
+        </w:r>
+        <w:r>
+          <w:rPr>
+            <w:noProof/>
+            <w:webHidden/>
+          </w:rPr>
+          <w:fldChar w:fldCharType="begin"/>
+        </w:r>
+        <w:r>
+          <w:rPr>
+            <w:noProof/>
+            <w:webHidden/>
+          </w:rPr>
+          <w:instrText xml:space="preserve"> PAGEREF _Toc230179649 \h </w:instrText>
         </w:r>
         <w:r>
           <w:rPr>
@@ -10458,6 +10603,446 @@
       </w:hyperlink>
     </w:p>
     <w:p>
+      <w:pPr>
+        <w:pStyle w:val="Seznamobrzk"/>
+        <w:tabs>
+          <w:tab w:val="right" w:leader="dot" w:pos="9628"/>
+        </w:tabs>
+        <w:rPr>
+          <w:rFonts w:asciiTheme="minorHAnsi" w:eastAsiaTheme="minorEastAsia" w:hAnsiTheme="minorHAnsi"/>
+          <w:noProof/>
+          <w:sz w:val="24"/>
+          <w:lang w:eastAsia="cs-CZ"/>
+        </w:rPr>
+      </w:pPr>
+      <w:hyperlink w:anchor="_Toc230179650" w:history="1">
+        <w:r>
+          <w:rPr>
+            <w:rStyle w:val="Hypertextovodkaz"/>
+            <w:noProof/>
+          </w:rPr>
+          <w:t>Tabulka 3: Vstupy formuláře</w:t>
+        </w:r>
+        <w:r>
+          <w:rPr>
+            <w:noProof/>
+            <w:webHidden/>
+          </w:rPr>
+          <w:tab/>
+        </w:r>
+        <w:r>
+          <w:rPr>
+            <w:noProof/>
+            <w:webHidden/>
+          </w:rPr>
+          <w:fldChar w:fldCharType="begin"/>
+        </w:r>
+        <w:r>
+          <w:rPr>
+            <w:noProof/>
+            <w:webHidden/>
+          </w:rPr>
+          <w:instrText xml:space="preserve"> PAGEREF _Toc230179650 \h </w:instrText>
+        </w:r>
+        <w:r>
+          <w:rPr>
+            <w:noProof/>
+            <w:webHidden/>
+          </w:rPr>
+        </w:r>
+        <w:r>
+          <w:rPr>
+            <w:noProof/>
+            <w:webHidden/>
+          </w:rPr>
+          <w:fldChar w:fldCharType="separate"/>
+        </w:r>
+        <w:r>
+          <w:rPr>
+            <w:noProof/>
+            <w:webHidden/>
+          </w:rPr>
+          <w:t>16</w:t>
+        </w:r>
+        <w:r>
+          <w:rPr>
+            <w:noProof/>
+            <w:webHidden/>
+          </w:rPr>
+          <w:fldChar w:fldCharType="end"/>
+        </w:r>
+      </w:hyperlink>
+    </w:p>
+    <w:p>
+      <w:pPr>
+        <w:pStyle w:val="Seznamobrzk"/>
+        <w:tabs>
+          <w:tab w:val="right" w:leader="dot" w:pos="9628"/>
+        </w:tabs>
+        <w:rPr>
+          <w:rFonts w:asciiTheme="minorHAnsi" w:eastAsiaTheme="minorEastAsia" w:hAnsiTheme="minorHAnsi"/>
+          <w:noProof/>
+          <w:sz w:val="24"/>
+          <w:lang w:eastAsia="cs-CZ"/>
+        </w:rPr>
+      </w:pPr>
+      <w:hyperlink w:anchor="_Toc230179651" w:history="1">
+        <w:r>
+          <w:rPr>
+            <w:rStyle w:val="Hypertextovodkaz"/>
+            <w:noProof/>
+          </w:rPr>
+          <w:t>Tabulka 4: Členové za funkcí UI</w:t>
+        </w:r>
+        <w:r>
+          <w:rPr>
+            <w:noProof/>
+            <w:webHidden/>
+          </w:rPr>
+          <w:tab/>
+        </w:r>
+        <w:r>
+          <w:rPr>
+            <w:noProof/>
+            <w:webHidden/>
+          </w:rPr>
+          <w:fldChar w:fldCharType="begin"/>
+        </w:r>
+        <w:r>
+          <w:rPr>
+            <w:noProof/>
+            <w:webHidden/>
+          </w:rPr>
+          <w:instrText xml:space="preserve"> PAGEREF _Toc230179651 \h </w:instrText>
+        </w:r>
+        <w:r>
+          <w:rPr>
+            <w:noProof/>
+            <w:webHidden/>
+          </w:rPr>
+        </w:r>
+        <w:r>
+          <w:rPr>
+            <w:noProof/>
+            <w:webHidden/>
+          </w:rPr>
+          <w:fldChar w:fldCharType="separate"/>
+        </w:r>
+        <w:r>
+          <w:rPr>
+            <w:noProof/>
+            <w:webHidden/>
+          </w:rPr>
+          <w:t>17</w:t>
+        </w:r>
+        <w:r>
+          <w:rPr>
+            <w:noProof/>
+            <w:webHidden/>
+          </w:rPr>
+          <w:fldChar w:fldCharType="end"/>
+        </w:r>
+      </w:hyperlink>
+    </w:p>
+    <w:p>
+      <w:pPr>
+        <w:pStyle w:val="Seznamobrzk"/>
+        <w:tabs>
+          <w:tab w:val="right" w:leader="dot" w:pos="9628"/>
+        </w:tabs>
+        <w:rPr>
+          <w:rFonts w:asciiTheme="minorHAnsi" w:eastAsiaTheme="minorEastAsia" w:hAnsiTheme="minorHAnsi"/>
+          <w:noProof/>
+          <w:sz w:val="24"/>
+          <w:lang w:eastAsia="cs-CZ"/>
+        </w:rPr>
+      </w:pPr>
+      <w:hyperlink w:anchor="_Toc230179652" w:history="1">
+        <w:r>
+          <w:rPr>
+            <w:rStyle w:val="Hypertextovodkaz"/>
+            <w:noProof/>
+          </w:rPr>
+          <w:t>Tabulka 5: výstupní eventy UI</w:t>
+        </w:r>
+        <w:r>
+          <w:rPr>
+            <w:noProof/>
+            <w:webHidden/>
+          </w:rPr>
+          <w:tab/>
+        </w:r>
+        <w:r>
+          <w:rPr>
+            <w:noProof/>
+            <w:webHidden/>
+          </w:rPr>
+          <w:fldChar w:fldCharType="begin"/>
+        </w:r>
+        <w:r>
+          <w:rPr>
+            <w:noProof/>
+            <w:webHidden/>
+          </w:rPr>
+          <w:instrText xml:space="preserve"> PAGEREF _Toc230179652 \h </w:instrText>
+        </w:r>
+        <w:r>
+          <w:rPr>
+            <w:noProof/>
+            <w:webHidden/>
+          </w:rPr>
+        </w:r>
+        <w:r>
+          <w:rPr>
+            <w:noProof/>
+            <w:webHidden/>
+          </w:rPr>
+          <w:fldChar w:fldCharType="separate"/>
+        </w:r>
+        <w:r>
+          <w:rPr>
+            <w:noProof/>
+            <w:webHidden/>
+          </w:rPr>
+          <w:t>18</w:t>
+        </w:r>
+        <w:r>
+          <w:rPr>
+            <w:noProof/>
+            <w:webHidden/>
+          </w:rPr>
+          <w:fldChar w:fldCharType="end"/>
+        </w:r>
+      </w:hyperlink>
+    </w:p>
+    <w:p>
+      <w:pPr>
+        <w:pStyle w:val="Seznamobrzk"/>
+        <w:tabs>
+          <w:tab w:val="right" w:leader="dot" w:pos="9628"/>
+        </w:tabs>
+        <w:rPr>
+          <w:rFonts w:asciiTheme="minorHAnsi" w:eastAsiaTheme="minorEastAsia" w:hAnsiTheme="minorHAnsi"/>
+          <w:noProof/>
+          <w:sz w:val="24"/>
+          <w:lang w:eastAsia="cs-CZ"/>
+        </w:rPr>
+      </w:pPr>
+      <w:hyperlink w:anchor="_Toc230179653" w:history="1">
+        <w:r>
+          <w:rPr>
+            <w:rStyle w:val="Hypertextovodkaz"/>
+            <w:noProof/>
+          </w:rPr>
+          <w:t>Tabulka 6: Vstupy HabitGraphu</w:t>
+        </w:r>
+        <w:r>
+          <w:rPr>
+            <w:noProof/>
+            <w:webHidden/>
+          </w:rPr>
+          <w:tab/>
+        </w:r>
+        <w:r>
+          <w:rPr>
+            <w:noProof/>
+            <w:webHidden/>
+          </w:rPr>
+          <w:fldChar w:fldCharType="begin"/>
+        </w:r>
+        <w:r>
+          <w:rPr>
+            <w:noProof/>
+            <w:webHidden/>
+          </w:rPr>
+          <w:instrText xml:space="preserve"> PAGEREF _Toc230179653 \h </w:instrText>
+        </w:r>
+        <w:r>
+          <w:rPr>
+            <w:noProof/>
+            <w:webHidden/>
+          </w:rPr>
+        </w:r>
+        <w:r>
+          <w:rPr>
+            <w:noProof/>
+            <w:webHidden/>
+          </w:rPr>
+          <w:fldChar w:fldCharType="separate"/>
+        </w:r>
+        <w:r>
+          <w:rPr>
+            <w:noProof/>
+            <w:webHidden/>
+          </w:rPr>
+          <w:t>18</w:t>
+        </w:r>
+        <w:r>
+          <w:rPr>
+            <w:noProof/>
+            <w:webHidden/>
+          </w:rPr>
+          <w:fldChar w:fldCharType="end"/>
+        </w:r>
+      </w:hyperlink>
+    </w:p>
+    <w:p>
+      <w:pPr>
+        <w:pStyle w:val="Seznamobrzk"/>
+        <w:tabs>
+          <w:tab w:val="right" w:leader="dot" w:pos="9628"/>
+        </w:tabs>
+        <w:rPr>
+          <w:rFonts w:asciiTheme="minorHAnsi" w:eastAsiaTheme="minorEastAsia" w:hAnsiTheme="minorHAnsi"/>
+          <w:noProof/>
+          <w:sz w:val="24"/>
+          <w:lang w:eastAsia="cs-CZ"/>
+        </w:rPr>
+      </w:pPr>
+      <w:hyperlink w:anchor="_Toc230179654" w:history="1">
+        <w:r>
+          <w:rPr>
+            <w:rStyle w:val="Hypertextovodkaz"/>
+            <w:noProof/>
+          </w:rPr>
+          <w:t>Tabulka 7: možnosti grafu</w:t>
+        </w:r>
+        <w:r>
+          <w:rPr>
+            <w:noProof/>
+            <w:webHidden/>
+          </w:rPr>
+          <w:tab/>
+        </w:r>
+        <w:r>
+          <w:rPr>
+            <w:noProof/>
+            <w:webHidden/>
+          </w:rPr>
+          <w:fldChar w:fldCharType="begin"/>
+        </w:r>
+        <w:r>
+          <w:rPr>
+            <w:noProof/>
+            <w:webHidden/>
+          </w:rPr>
+          <w:instrText xml:space="preserve"> PAGEREF _Toc230179654 \h </w:instrText>
+        </w:r>
+        <w:r>
+          <w:rPr>
+            <w:noProof/>
+            <w:webHidden/>
+          </w:rPr>
+        </w:r>
+        <w:r>
+          <w:rPr>
+            <w:noProof/>
+            <w:webHidden/>
+          </w:rPr>
+          <w:fldChar w:fldCharType="separate"/>
+        </w:r>
+        <w:r>
+          <w:rPr>
+            <w:noProof/>
+            <w:webHidden/>
+          </w:rPr>
+          <w:t>19</w:t>
+        </w:r>
+        <w:r>
+          <w:rPr>
+            <w:noProof/>
+            <w:webHidden/>
+          </w:rPr>
+          <w:fldChar w:fldCharType="end"/>
+        </w:r>
+      </w:hyperlink>
+    </w:p>
+    <w:p>
+      <w:pPr>
+        <w:pStyle w:val="Seznamobrzk"/>
+        <w:tabs>
+          <w:tab w:val="right" w:leader="dot" w:pos="9628"/>
+        </w:tabs>
+        <w:rPr>
+          <w:rFonts w:asciiTheme="minorHAnsi" w:eastAsiaTheme="minorEastAsia" w:hAnsiTheme="minorHAnsi"/>
+          <w:noProof/>
+          <w:sz w:val="24"/>
+          <w:lang w:eastAsia="cs-CZ"/>
+        </w:rPr>
+      </w:pPr>
+      <w:hyperlink w:anchor="_Toc230179655" w:history="1">
+        <w:r>
+          <w:rPr>
+            <w:rStyle w:val="Hypertextovodkaz"/>
+            <w:noProof/>
+          </w:rPr>
+          <w:t>Tabulka 8: Komponenty nejhorší na st</w:t>
+        </w:r>
+        <w:r>
+          <w:rPr>
+            <w:rStyle w:val="Hypertextovodkaz"/>
+            <w:noProof/>
+          </w:rPr>
+          <w:t>y</w:t>
+        </w:r>
+        <w:r>
+          <w:rPr>
+            <w:rStyle w:val="Hypertextovodkaz"/>
+            <w:noProof/>
+          </w:rPr>
+          <w:t>lování</w:t>
+        </w:r>
+        <w:r>
+          <w:rPr>
+            <w:noProof/>
+            <w:webHidden/>
+          </w:rPr>
+          <w:tab/>
+        </w:r>
+        <w:r>
+          <w:rPr>
+            <w:noProof/>
+            <w:webHidden/>
+          </w:rPr>
+          <w:fldChar w:fldCharType="begin"/>
+        </w:r>
+        <w:r>
+          <w:rPr>
+            <w:noProof/>
+            <w:webHidden/>
+          </w:rPr>
+          <w:instrText xml:space="preserve"> PAGEREF _Toc230179655 \h </w:instrText>
+        </w:r>
+        <w:r>
+          <w:rPr>
+            <w:noProof/>
+            <w:webHidden/>
+          </w:rPr>
+        </w:r>
+        <w:r>
+          <w:rPr>
+            <w:noProof/>
+            <w:webHidden/>
+          </w:rPr>
+          <w:fldChar w:fldCharType="separate"/>
+        </w:r>
+        <w:r>
+          <w:rPr>
+            <w:noProof/>
+            <w:webHidden/>
+          </w:rPr>
+          <w:t>20</w:t>
+        </w:r>
+        <w:r>
+          <w:rPr>
+            <w:noProof/>
+            <w:webHidden/>
+          </w:rPr>
+          <w:fldChar w:fldCharType="end"/>
+        </w:r>
+      </w:hyperlink>
+    </w:p>
+    <w:p>
       <w:r>
         <w:fldChar w:fldCharType="end"/>
       </w:r>
@@ -10480,16 +11065,16 @@
         </w:numPr>
         <w:ind w:left="720"/>
       </w:pPr>
-      <w:bookmarkStart w:id="87" w:name="_Toc222315305"/>
-      <w:bookmarkStart w:id="88" w:name="_Toc223513782"/>
-      <w:bookmarkStart w:id="89" w:name="_Toc230179562"/>
+      <w:bookmarkStart w:id="94" w:name="_Toc222315305"/>
+      <w:bookmarkStart w:id="95" w:name="_Toc223513782"/>
+      <w:bookmarkStart w:id="96" w:name="_Toc230179562"/>
       <w:r>
         <w:lastRenderedPageBreak/>
         <w:t>Seznam příloh</w:t>
       </w:r>
-      <w:bookmarkEnd w:id="87"/>
-      <w:bookmarkEnd w:id="88"/>
-      <w:bookmarkEnd w:id="89"/>
+      <w:bookmarkEnd w:id="94"/>
+      <w:bookmarkEnd w:id="95"/>
+      <w:bookmarkEnd w:id="96"/>
     </w:p>
     <w:p>
       <w:r>
@@ -10541,16 +11126,16 @@
         </w:numPr>
         <w:ind w:left="720"/>
       </w:pPr>
-      <w:bookmarkStart w:id="90" w:name="_Toc222315306"/>
-      <w:bookmarkStart w:id="91" w:name="_Toc223513783"/>
-      <w:bookmarkStart w:id="92" w:name="_Toc230179563"/>
+      <w:bookmarkStart w:id="97" w:name="_Toc222315306"/>
+      <w:bookmarkStart w:id="98" w:name="_Toc223513783"/>
+      <w:bookmarkStart w:id="99" w:name="_Toc230179563"/>
       <w:r>
         <w:lastRenderedPageBreak/>
         <w:t>Přílohy</w:t>
       </w:r>
-      <w:bookmarkEnd w:id="90"/>
-      <w:bookmarkEnd w:id="91"/>
-      <w:bookmarkEnd w:id="92"/>
+      <w:bookmarkEnd w:id="97"/>
+      <w:bookmarkEnd w:id="98"/>
+      <w:bookmarkEnd w:id="99"/>
     </w:p>
     <w:p>
       <w:r>
@@ -11210,13 +11795,21 @@
       <w:ptab w:relativeTo="margin" w:alignment="right" w:leader="none"/>
     </w:r>
     <w:r>
-      <w:t>3.E</w:t>
+      <w:t>3.</w:t>
+    </w:r>
+    <w:proofErr w:type="gramStart"/>
+    <w:r>
+      <w:t>E</w:t>
     </w:r>
     <w:r>
       <w:t xml:space="preserve"> – </w:t>
     </w:r>
     <w:r>
-      <w:t>2025/2026</w:t>
+      <w:t>2025</w:t>
+    </w:r>
+    <w:proofErr w:type="gramEnd"/>
+    <w:r>
+      <w:t>/2026</w:t>
     </w:r>
   </w:p>
 </w:hdr>

</xml_diff>

<commit_message>
feat: update documentation to remove "Přílohy a seznam příloh"
</commit_message>
<xml_diff>
--- a/Barta_rocnikova_prace.docx
+++ b/Barta_rocnikova_prace.docx
@@ -1358,6 +1358,7 @@
       <w:bookmarkStart w:id="7" w:name="_Toc226550175"/>
       <w:bookmarkStart w:id="8" w:name="_Toc226556217"/>
       <w:bookmarkStart w:id="9" w:name="_Toc230179517"/>
+      <w:bookmarkStart w:id="10" w:name="_Toc230182429"/>
       <w:r>
         <w:lastRenderedPageBreak/>
         <w:t>Prohlášení</w:t>
@@ -1372,6 +1373,7 @@
       <w:bookmarkEnd w:id="7"/>
       <w:bookmarkEnd w:id="8"/>
       <w:bookmarkEnd w:id="9"/>
+      <w:bookmarkEnd w:id="10"/>
       <w:r>
         <w:t xml:space="preserve"> </w:t>
       </w:r>
@@ -1699,19 +1701,19 @@
         </w:numPr>
         <w:ind w:left="720"/>
       </w:pPr>
-      <w:bookmarkStart w:id="10" w:name="_Toc183979916"/>
-      <w:bookmarkStart w:id="11" w:name="_Toc216425626"/>
-      <w:bookmarkStart w:id="12" w:name="_Toc216425784"/>
-      <w:bookmarkStart w:id="13" w:name="_Toc222315289"/>
-      <w:bookmarkStart w:id="14" w:name="_Toc223513764"/>
-      <w:bookmarkStart w:id="15" w:name="_Toc226550176"/>
-      <w:bookmarkStart w:id="16" w:name="_Toc226556218"/>
-      <w:bookmarkStart w:id="17" w:name="_Toc230179518"/>
+      <w:bookmarkStart w:id="11" w:name="_Toc183979916"/>
+      <w:bookmarkStart w:id="12" w:name="_Toc216425626"/>
+      <w:bookmarkStart w:id="13" w:name="_Toc216425784"/>
+      <w:bookmarkStart w:id="14" w:name="_Toc222315289"/>
+      <w:bookmarkStart w:id="15" w:name="_Toc223513764"/>
+      <w:bookmarkStart w:id="16" w:name="_Toc226550176"/>
+      <w:bookmarkStart w:id="17" w:name="_Toc226556218"/>
+      <w:bookmarkStart w:id="18" w:name="_Toc230179518"/>
+      <w:bookmarkStart w:id="19" w:name="_Toc230182430"/>
       <w:r>
         <w:lastRenderedPageBreak/>
         <w:t>Anotace</w:t>
       </w:r>
-      <w:bookmarkEnd w:id="10"/>
       <w:bookmarkEnd w:id="11"/>
       <w:bookmarkEnd w:id="12"/>
       <w:bookmarkEnd w:id="13"/>
@@ -1719,6 +1721,8 @@
       <w:bookmarkEnd w:id="15"/>
       <w:bookmarkEnd w:id="16"/>
       <w:bookmarkEnd w:id="17"/>
+      <w:bookmarkEnd w:id="18"/>
+      <w:bookmarkEnd w:id="19"/>
     </w:p>
     <w:p>
       <w:r>
@@ -1830,26 +1834,28 @@
         </w:numPr>
         <w:ind w:left="720"/>
       </w:pPr>
-      <w:bookmarkStart w:id="18" w:name="_Toc183979917"/>
-      <w:bookmarkStart w:id="19" w:name="_Toc216425627"/>
-      <w:bookmarkStart w:id="20" w:name="_Toc216425785"/>
-      <w:bookmarkStart w:id="21" w:name="_Toc222315290"/>
-      <w:bookmarkStart w:id="22" w:name="_Toc223513765"/>
-      <w:bookmarkStart w:id="23" w:name="_Toc226550177"/>
-      <w:bookmarkStart w:id="24" w:name="_Toc226556219"/>
-      <w:bookmarkStart w:id="25" w:name="_Toc230179519"/>
+      <w:bookmarkStart w:id="20" w:name="_Toc183979917"/>
+      <w:bookmarkStart w:id="21" w:name="_Toc216425627"/>
+      <w:bookmarkStart w:id="22" w:name="_Toc216425785"/>
+      <w:bookmarkStart w:id="23" w:name="_Toc222315290"/>
+      <w:bookmarkStart w:id="24" w:name="_Toc223513765"/>
+      <w:bookmarkStart w:id="25" w:name="_Toc226550177"/>
+      <w:bookmarkStart w:id="26" w:name="_Toc226556219"/>
+      <w:bookmarkStart w:id="27" w:name="_Toc230179519"/>
+      <w:bookmarkStart w:id="28" w:name="_Toc230182431"/>
       <w:r>
         <w:lastRenderedPageBreak/>
         <w:t>Klíčová slova</w:t>
       </w:r>
-      <w:bookmarkEnd w:id="18"/>
-      <w:bookmarkEnd w:id="19"/>
       <w:bookmarkEnd w:id="20"/>
       <w:bookmarkEnd w:id="21"/>
       <w:bookmarkEnd w:id="22"/>
       <w:bookmarkEnd w:id="23"/>
       <w:bookmarkEnd w:id="24"/>
       <w:bookmarkEnd w:id="25"/>
+      <w:bookmarkEnd w:id="26"/>
+      <w:bookmarkEnd w:id="27"/>
+      <w:bookmarkEnd w:id="28"/>
     </w:p>
     <w:p>
       <w:r>
@@ -1938,26 +1944,28 @@
         </w:numPr>
         <w:ind w:left="720"/>
       </w:pPr>
-      <w:bookmarkStart w:id="26" w:name="_Toc183979918"/>
-      <w:bookmarkStart w:id="27" w:name="_Toc216425628"/>
-      <w:bookmarkStart w:id="28" w:name="_Toc216425786"/>
-      <w:bookmarkStart w:id="29" w:name="_Toc222315291"/>
-      <w:bookmarkStart w:id="30" w:name="_Toc223513766"/>
-      <w:bookmarkStart w:id="31" w:name="_Toc226550178"/>
-      <w:bookmarkStart w:id="32" w:name="_Toc226556220"/>
-      <w:bookmarkStart w:id="33" w:name="_Toc230179520"/>
+      <w:bookmarkStart w:id="29" w:name="_Toc183979918"/>
+      <w:bookmarkStart w:id="30" w:name="_Toc216425628"/>
+      <w:bookmarkStart w:id="31" w:name="_Toc216425786"/>
+      <w:bookmarkStart w:id="32" w:name="_Toc222315291"/>
+      <w:bookmarkStart w:id="33" w:name="_Toc223513766"/>
+      <w:bookmarkStart w:id="34" w:name="_Toc226550178"/>
+      <w:bookmarkStart w:id="35" w:name="_Toc226556220"/>
+      <w:bookmarkStart w:id="36" w:name="_Toc230179520"/>
+      <w:bookmarkStart w:id="37" w:name="_Toc230182432"/>
       <w:r>
         <w:lastRenderedPageBreak/>
         <w:t>Obsah</w:t>
       </w:r>
-      <w:bookmarkEnd w:id="26"/>
-      <w:bookmarkEnd w:id="27"/>
-      <w:bookmarkEnd w:id="28"/>
       <w:bookmarkEnd w:id="29"/>
       <w:bookmarkEnd w:id="30"/>
       <w:bookmarkEnd w:id="31"/>
       <w:bookmarkEnd w:id="32"/>
       <w:bookmarkEnd w:id="33"/>
+      <w:bookmarkEnd w:id="34"/>
+      <w:bookmarkEnd w:id="35"/>
+      <w:bookmarkEnd w:id="36"/>
+      <w:bookmarkEnd w:id="37"/>
     </w:p>
     <w:sdt>
       <w:sdtPr>
@@ -1996,7 +2004,7 @@
           <w:r>
             <w:fldChar w:fldCharType="separate"/>
           </w:r>
-          <w:hyperlink w:anchor="_Toc230179521" w:history="1">
+          <w:hyperlink w:anchor="_Toc230182433" w:history="1">
             <w:r>
               <w:rPr>
                 <w:rStyle w:val="Hypertextovodkaz"/>
@@ -2023,7 +2031,7 @@
                 <w:noProof/>
                 <w:webHidden/>
               </w:rPr>
-              <w:instrText xml:space="preserve"> PAGEREF _Toc230179521 \h </w:instrText>
+              <w:instrText xml:space="preserve"> PAGEREF _Toc230182433 \h </w:instrText>
             </w:r>
             <w:r>
               <w:rPr>
@@ -2068,7 +2076,7 @@
               <w:lang w:eastAsia="cs-CZ"/>
             </w:rPr>
           </w:pPr>
-          <w:hyperlink w:anchor="_Toc230179522" w:history="1">
+          <w:hyperlink w:anchor="_Toc230182434" w:history="1">
             <w:r>
               <w:rPr>
                 <w:rStyle w:val="Hypertextovodkaz"/>
@@ -2111,7 +2119,7 @@
                 <w:noProof/>
                 <w:webHidden/>
               </w:rPr>
-              <w:instrText xml:space="preserve"> PAGEREF _Toc230179522 \h </w:instrText>
+              <w:instrText xml:space="preserve"> PAGEREF _Toc230182434 \h </w:instrText>
             </w:r>
             <w:r>
               <w:rPr>
@@ -2156,7 +2164,7 @@
               <w:lang w:eastAsia="cs-CZ"/>
             </w:rPr>
           </w:pPr>
-          <w:hyperlink w:anchor="_Toc230179523" w:history="1">
+          <w:hyperlink w:anchor="_Toc230182435" w:history="1">
             <w:r>
               <w:rPr>
                 <w:rStyle w:val="Hypertextovodkaz"/>
@@ -2199,7 +2207,7 @@
                 <w:noProof/>
                 <w:webHidden/>
               </w:rPr>
-              <w:instrText xml:space="preserve"> PAGEREF _Toc230179523 \h </w:instrText>
+              <w:instrText xml:space="preserve"> PAGEREF _Toc230182435 \h </w:instrText>
             </w:r>
             <w:r>
               <w:rPr>
@@ -2244,7 +2252,7 @@
               <w:lang w:eastAsia="cs-CZ"/>
             </w:rPr>
           </w:pPr>
-          <w:hyperlink w:anchor="_Toc230179524" w:history="1">
+          <w:hyperlink w:anchor="_Toc230182436" w:history="1">
             <w:r>
               <w:rPr>
                 <w:rStyle w:val="Hypertextovodkaz"/>
@@ -2287,7 +2295,7 @@
                 <w:noProof/>
                 <w:webHidden/>
               </w:rPr>
-              <w:instrText xml:space="preserve"> PAGEREF _Toc230179524 \h </w:instrText>
+              <w:instrText xml:space="preserve"> PAGEREF _Toc230182436 \h </w:instrText>
             </w:r>
             <w:r>
               <w:rPr>
@@ -2332,7 +2340,7 @@
               <w:lang w:eastAsia="cs-CZ"/>
             </w:rPr>
           </w:pPr>
-          <w:hyperlink w:anchor="_Toc230179525" w:history="1">
+          <w:hyperlink w:anchor="_Toc230182437" w:history="1">
             <w:r>
               <w:rPr>
                 <w:rStyle w:val="Hypertextovodkaz"/>
@@ -2375,7 +2383,7 @@
                 <w:noProof/>
                 <w:webHidden/>
               </w:rPr>
-              <w:instrText xml:space="preserve"> PAGEREF _Toc230179525 \h </w:instrText>
+              <w:instrText xml:space="preserve"> PAGEREF _Toc230182437 \h </w:instrText>
             </w:r>
             <w:r>
               <w:rPr>
@@ -2420,7 +2428,7 @@
               <w:lang w:eastAsia="cs-CZ"/>
             </w:rPr>
           </w:pPr>
-          <w:hyperlink w:anchor="_Toc230179526" w:history="1">
+          <w:hyperlink w:anchor="_Toc230182438" w:history="1">
             <w:r>
               <w:rPr>
                 <w:rStyle w:val="Hypertextovodkaz"/>
@@ -2463,7 +2471,7 @@
                 <w:noProof/>
                 <w:webHidden/>
               </w:rPr>
-              <w:instrText xml:space="preserve"> PAGEREF _Toc230179526 \h </w:instrText>
+              <w:instrText xml:space="preserve"> PAGEREF _Toc230182438 \h </w:instrText>
             </w:r>
             <w:r>
               <w:rPr>
@@ -2508,7 +2516,7 @@
               <w:lang w:eastAsia="cs-CZ"/>
             </w:rPr>
           </w:pPr>
-          <w:hyperlink w:anchor="_Toc230179527" w:history="1">
+          <w:hyperlink w:anchor="_Toc230182439" w:history="1">
             <w:r>
               <w:rPr>
                 <w:rStyle w:val="Hypertextovodkaz"/>
@@ -2551,7 +2559,7 @@
                 <w:noProof/>
                 <w:webHidden/>
               </w:rPr>
-              <w:instrText xml:space="preserve"> PAGEREF _Toc230179527 \h </w:instrText>
+              <w:instrText xml:space="preserve"> PAGEREF _Toc230182439 \h </w:instrText>
             </w:r>
             <w:r>
               <w:rPr>
@@ -2596,7 +2604,7 @@
               <w:lang w:eastAsia="cs-CZ"/>
             </w:rPr>
           </w:pPr>
-          <w:hyperlink w:anchor="_Toc230179528" w:history="1">
+          <w:hyperlink w:anchor="_Toc230182440" w:history="1">
             <w:r>
               <w:rPr>
                 <w:rStyle w:val="Hypertextovodkaz"/>
@@ -2639,7 +2647,7 @@
                 <w:noProof/>
                 <w:webHidden/>
               </w:rPr>
-              <w:instrText xml:space="preserve"> PAGEREF _Toc230179528 \h </w:instrText>
+              <w:instrText xml:space="preserve"> PAGEREF _Toc230182440 \h </w:instrText>
             </w:r>
             <w:r>
               <w:rPr>
@@ -2684,7 +2692,7 @@
               <w:lang w:eastAsia="cs-CZ"/>
             </w:rPr>
           </w:pPr>
-          <w:hyperlink w:anchor="_Toc230179529" w:history="1">
+          <w:hyperlink w:anchor="_Toc230182441" w:history="1">
             <w:r>
               <w:rPr>
                 <w:rStyle w:val="Hypertextovodkaz"/>
@@ -2727,7 +2735,7 @@
                 <w:noProof/>
                 <w:webHidden/>
               </w:rPr>
-              <w:instrText xml:space="preserve"> PAGEREF _Toc230179529 \h </w:instrText>
+              <w:instrText xml:space="preserve"> PAGEREF _Toc230182441 \h </w:instrText>
             </w:r>
             <w:r>
               <w:rPr>
@@ -2772,7 +2780,7 @@
               <w:lang w:eastAsia="cs-CZ"/>
             </w:rPr>
           </w:pPr>
-          <w:hyperlink w:anchor="_Toc230179530" w:history="1">
+          <w:hyperlink w:anchor="_Toc230182442" w:history="1">
             <w:r>
               <w:rPr>
                 <w:rStyle w:val="Hypertextovodkaz"/>
@@ -2815,7 +2823,7 @@
                 <w:noProof/>
                 <w:webHidden/>
               </w:rPr>
-              <w:instrText xml:space="preserve"> PAGEREF _Toc230179530 \h </w:instrText>
+              <w:instrText xml:space="preserve"> PAGEREF _Toc230182442 \h </w:instrText>
             </w:r>
             <w:r>
               <w:rPr>
@@ -2860,7 +2868,7 @@
               <w:lang w:eastAsia="cs-CZ"/>
             </w:rPr>
           </w:pPr>
-          <w:hyperlink w:anchor="_Toc230179531" w:history="1">
+          <w:hyperlink w:anchor="_Toc230182443" w:history="1">
             <w:r>
               <w:rPr>
                 <w:rStyle w:val="Hypertextovodkaz"/>
@@ -2903,7 +2911,7 @@
                 <w:noProof/>
                 <w:webHidden/>
               </w:rPr>
-              <w:instrText xml:space="preserve"> PAGEREF _Toc230179531 \h </w:instrText>
+              <w:instrText xml:space="preserve"> PAGEREF _Toc230182443 \h </w:instrText>
             </w:r>
             <w:r>
               <w:rPr>
@@ -2948,7 +2956,7 @@
               <w:lang w:eastAsia="cs-CZ"/>
             </w:rPr>
           </w:pPr>
-          <w:hyperlink w:anchor="_Toc230179532" w:history="1">
+          <w:hyperlink w:anchor="_Toc230182444" w:history="1">
             <w:r>
               <w:rPr>
                 <w:rStyle w:val="Hypertextovodkaz"/>
@@ -2991,7 +2999,7 @@
                 <w:noProof/>
                 <w:webHidden/>
               </w:rPr>
-              <w:instrText xml:space="preserve"> PAGEREF _Toc230179532 \h </w:instrText>
+              <w:instrText xml:space="preserve"> PAGEREF _Toc230182444 \h </w:instrText>
             </w:r>
             <w:r>
               <w:rPr>
@@ -3036,7 +3044,7 @@
               <w:lang w:eastAsia="cs-CZ"/>
             </w:rPr>
           </w:pPr>
-          <w:hyperlink w:anchor="_Toc230179533" w:history="1">
+          <w:hyperlink w:anchor="_Toc230182445" w:history="1">
             <w:r>
               <w:rPr>
                 <w:rStyle w:val="Hypertextovodkaz"/>
@@ -3079,7 +3087,7 @@
                 <w:noProof/>
                 <w:webHidden/>
               </w:rPr>
-              <w:instrText xml:space="preserve"> PAGEREF _Toc230179533 \h </w:instrText>
+              <w:instrText xml:space="preserve"> PAGEREF _Toc230182445 \h </w:instrText>
             </w:r>
             <w:r>
               <w:rPr>
@@ -3124,7 +3132,7 @@
               <w:lang w:eastAsia="cs-CZ"/>
             </w:rPr>
           </w:pPr>
-          <w:hyperlink w:anchor="_Toc230179534" w:history="1">
+          <w:hyperlink w:anchor="_Toc230182446" w:history="1">
             <w:r>
               <w:rPr>
                 <w:rStyle w:val="Hypertextovodkaz"/>
@@ -3167,7 +3175,7 @@
                 <w:noProof/>
                 <w:webHidden/>
               </w:rPr>
-              <w:instrText xml:space="preserve"> PAGEREF _Toc230179534 \h </w:instrText>
+              <w:instrText xml:space="preserve"> PAGEREF _Toc230182446 \h </w:instrText>
             </w:r>
             <w:r>
               <w:rPr>
@@ -3212,7 +3220,7 @@
               <w:lang w:eastAsia="cs-CZ"/>
             </w:rPr>
           </w:pPr>
-          <w:hyperlink w:anchor="_Toc230179535" w:history="1">
+          <w:hyperlink w:anchor="_Toc230182447" w:history="1">
             <w:r>
               <w:rPr>
                 <w:rStyle w:val="Hypertextovodkaz"/>
@@ -3255,7 +3263,7 @@
                 <w:noProof/>
                 <w:webHidden/>
               </w:rPr>
-              <w:instrText xml:space="preserve"> PAGEREF _Toc230179535 \h </w:instrText>
+              <w:instrText xml:space="preserve"> PAGEREF _Toc230182447 \h </w:instrText>
             </w:r>
             <w:r>
               <w:rPr>
@@ -3300,7 +3308,7 @@
               <w:lang w:eastAsia="cs-CZ"/>
             </w:rPr>
           </w:pPr>
-          <w:hyperlink w:anchor="_Toc230179536" w:history="1">
+          <w:hyperlink w:anchor="_Toc230182448" w:history="1">
             <w:r>
               <w:rPr>
                 <w:rStyle w:val="Hypertextovodkaz"/>
@@ -3343,7 +3351,7 @@
                 <w:noProof/>
                 <w:webHidden/>
               </w:rPr>
-              <w:instrText xml:space="preserve"> PAGEREF _Toc230179536 \h </w:instrText>
+              <w:instrText xml:space="preserve"> PAGEREF _Toc230182448 \h </w:instrText>
             </w:r>
             <w:r>
               <w:rPr>
@@ -3388,7 +3396,7 @@
               <w:lang w:eastAsia="cs-CZ"/>
             </w:rPr>
           </w:pPr>
-          <w:hyperlink w:anchor="_Toc230179537" w:history="1">
+          <w:hyperlink w:anchor="_Toc230182449" w:history="1">
             <w:r>
               <w:rPr>
                 <w:rStyle w:val="Hypertextovodkaz"/>
@@ -3431,7 +3439,7 @@
                 <w:noProof/>
                 <w:webHidden/>
               </w:rPr>
-              <w:instrText xml:space="preserve"> PAGEREF _Toc230179537 \h </w:instrText>
+              <w:instrText xml:space="preserve"> PAGEREF _Toc230182449 \h </w:instrText>
             </w:r>
             <w:r>
               <w:rPr>
@@ -3476,7 +3484,7 @@
               <w:lang w:eastAsia="cs-CZ"/>
             </w:rPr>
           </w:pPr>
-          <w:hyperlink w:anchor="_Toc230179538" w:history="1">
+          <w:hyperlink w:anchor="_Toc230182450" w:history="1">
             <w:r>
               <w:rPr>
                 <w:rStyle w:val="Hypertextovodkaz"/>
@@ -3519,7 +3527,7 @@
                 <w:noProof/>
                 <w:webHidden/>
               </w:rPr>
-              <w:instrText xml:space="preserve"> PAGEREF _Toc230179538 \h </w:instrText>
+              <w:instrText xml:space="preserve"> PAGEREF _Toc230182450 \h </w:instrText>
             </w:r>
             <w:r>
               <w:rPr>
@@ -3564,7 +3572,7 @@
               <w:lang w:eastAsia="cs-CZ"/>
             </w:rPr>
           </w:pPr>
-          <w:hyperlink w:anchor="_Toc230179539" w:history="1">
+          <w:hyperlink w:anchor="_Toc230182451" w:history="1">
             <w:r>
               <w:rPr>
                 <w:rStyle w:val="Hypertextovodkaz"/>
@@ -3607,7 +3615,7 @@
                 <w:noProof/>
                 <w:webHidden/>
               </w:rPr>
-              <w:instrText xml:space="preserve"> PAGEREF _Toc230179539 \h </w:instrText>
+              <w:instrText xml:space="preserve"> PAGEREF _Toc230182451 \h </w:instrText>
             </w:r>
             <w:r>
               <w:rPr>
@@ -3652,7 +3660,7 @@
               <w:lang w:eastAsia="cs-CZ"/>
             </w:rPr>
           </w:pPr>
-          <w:hyperlink w:anchor="_Toc230179540" w:history="1">
+          <w:hyperlink w:anchor="_Toc230182452" w:history="1">
             <w:r>
               <w:rPr>
                 <w:rStyle w:val="Hypertextovodkaz"/>
@@ -3695,7 +3703,7 @@
                 <w:noProof/>
                 <w:webHidden/>
               </w:rPr>
-              <w:instrText xml:space="preserve"> PAGEREF _Toc230179540 \h </w:instrText>
+              <w:instrText xml:space="preserve"> PAGEREF _Toc230182452 \h </w:instrText>
             </w:r>
             <w:r>
               <w:rPr>
@@ -3740,7 +3748,7 @@
               <w:lang w:eastAsia="cs-CZ"/>
             </w:rPr>
           </w:pPr>
-          <w:hyperlink w:anchor="_Toc230179541" w:history="1">
+          <w:hyperlink w:anchor="_Toc230182453" w:history="1">
             <w:r>
               <w:rPr>
                 <w:rStyle w:val="Hypertextovodkaz"/>
@@ -3783,7 +3791,7 @@
                 <w:noProof/>
                 <w:webHidden/>
               </w:rPr>
-              <w:instrText xml:space="preserve"> PAGEREF _Toc230179541 \h </w:instrText>
+              <w:instrText xml:space="preserve"> PAGEREF _Toc230182453 \h </w:instrText>
             </w:r>
             <w:r>
               <w:rPr>
@@ -3828,7 +3836,7 @@
               <w:lang w:eastAsia="cs-CZ"/>
             </w:rPr>
           </w:pPr>
-          <w:hyperlink w:anchor="_Toc230179542" w:history="1">
+          <w:hyperlink w:anchor="_Toc230182454" w:history="1">
             <w:r>
               <w:rPr>
                 <w:rStyle w:val="Hypertextovodkaz"/>
@@ -3871,7 +3879,7 @@
                 <w:noProof/>
                 <w:webHidden/>
               </w:rPr>
-              <w:instrText xml:space="preserve"> PAGEREF _Toc230179542 \h </w:instrText>
+              <w:instrText xml:space="preserve"> PAGEREF _Toc230182454 \h </w:instrText>
             </w:r>
             <w:r>
               <w:rPr>
@@ -3916,7 +3924,7 @@
               <w:lang w:eastAsia="cs-CZ"/>
             </w:rPr>
           </w:pPr>
-          <w:hyperlink w:anchor="_Toc230179543" w:history="1">
+          <w:hyperlink w:anchor="_Toc230182455" w:history="1">
             <w:r>
               <w:rPr>
                 <w:rStyle w:val="Hypertextovodkaz"/>
@@ -3959,7 +3967,7 @@
                 <w:noProof/>
                 <w:webHidden/>
               </w:rPr>
-              <w:instrText xml:space="preserve"> PAGEREF _Toc230179543 \h </w:instrText>
+              <w:instrText xml:space="preserve"> PAGEREF _Toc230182455 \h </w:instrText>
             </w:r>
             <w:r>
               <w:rPr>
@@ -4004,7 +4012,7 @@
               <w:lang w:eastAsia="cs-CZ"/>
             </w:rPr>
           </w:pPr>
-          <w:hyperlink w:anchor="_Toc230179544" w:history="1">
+          <w:hyperlink w:anchor="_Toc230182456" w:history="1">
             <w:r>
               <w:rPr>
                 <w:rStyle w:val="Hypertextovodkaz"/>
@@ -4047,7 +4055,7 @@
                 <w:noProof/>
                 <w:webHidden/>
               </w:rPr>
-              <w:instrText xml:space="preserve"> PAGEREF _Toc230179544 \h </w:instrText>
+              <w:instrText xml:space="preserve"> PAGEREF _Toc230182456 \h </w:instrText>
             </w:r>
             <w:r>
               <w:rPr>
@@ -4092,7 +4100,7 @@
               <w:lang w:eastAsia="cs-CZ"/>
             </w:rPr>
           </w:pPr>
-          <w:hyperlink w:anchor="_Toc230179545" w:history="1">
+          <w:hyperlink w:anchor="_Toc230182457" w:history="1">
             <w:r>
               <w:rPr>
                 <w:rStyle w:val="Hypertextovodkaz"/>
@@ -4135,7 +4143,7 @@
                 <w:noProof/>
                 <w:webHidden/>
               </w:rPr>
-              <w:instrText xml:space="preserve"> PAGEREF _Toc230179545 \h </w:instrText>
+              <w:instrText xml:space="preserve"> PAGEREF _Toc230182457 \h </w:instrText>
             </w:r>
             <w:r>
               <w:rPr>
@@ -4180,7 +4188,7 @@
               <w:lang w:eastAsia="cs-CZ"/>
             </w:rPr>
           </w:pPr>
-          <w:hyperlink w:anchor="_Toc230179546" w:history="1">
+          <w:hyperlink w:anchor="_Toc230182458" w:history="1">
             <w:r>
               <w:rPr>
                 <w:rStyle w:val="Hypertextovodkaz"/>
@@ -4223,7 +4231,7 @@
                 <w:noProof/>
                 <w:webHidden/>
               </w:rPr>
-              <w:instrText xml:space="preserve"> PAGEREF _Toc230179546 \h </w:instrText>
+              <w:instrText xml:space="preserve"> PAGEREF _Toc230182458 \h </w:instrText>
             </w:r>
             <w:r>
               <w:rPr>
@@ -4268,7 +4276,7 @@
               <w:lang w:eastAsia="cs-CZ"/>
             </w:rPr>
           </w:pPr>
-          <w:hyperlink w:anchor="_Toc230179547" w:history="1">
+          <w:hyperlink w:anchor="_Toc230182459" w:history="1">
             <w:r>
               <w:rPr>
                 <w:rStyle w:val="Hypertextovodkaz"/>
@@ -4311,7 +4319,7 @@
                 <w:noProof/>
                 <w:webHidden/>
               </w:rPr>
-              <w:instrText xml:space="preserve"> PAGEREF _Toc230179547 \h </w:instrText>
+              <w:instrText xml:space="preserve"> PAGEREF _Toc230182459 \h </w:instrText>
             </w:r>
             <w:r>
               <w:rPr>
@@ -4356,7 +4364,7 @@
               <w:lang w:eastAsia="cs-CZ"/>
             </w:rPr>
           </w:pPr>
-          <w:hyperlink w:anchor="_Toc230179548" w:history="1">
+          <w:hyperlink w:anchor="_Toc230182460" w:history="1">
             <w:r>
               <w:rPr>
                 <w:rStyle w:val="Hypertextovodkaz"/>
@@ -4399,7 +4407,7 @@
                 <w:noProof/>
                 <w:webHidden/>
               </w:rPr>
-              <w:instrText xml:space="preserve"> PAGEREF _Toc230179548 \h </w:instrText>
+              <w:instrText xml:space="preserve"> PAGEREF _Toc230182460 \h </w:instrText>
             </w:r>
             <w:r>
               <w:rPr>
@@ -4444,7 +4452,7 @@
               <w:lang w:eastAsia="cs-CZ"/>
             </w:rPr>
           </w:pPr>
-          <w:hyperlink w:anchor="_Toc230179549" w:history="1">
+          <w:hyperlink w:anchor="_Toc230182461" w:history="1">
             <w:r>
               <w:rPr>
                 <w:rStyle w:val="Hypertextovodkaz"/>
@@ -4487,7 +4495,7 @@
                 <w:noProof/>
                 <w:webHidden/>
               </w:rPr>
-              <w:instrText xml:space="preserve"> PAGEREF _Toc230179549 \h </w:instrText>
+              <w:instrText xml:space="preserve"> PAGEREF _Toc230182461 \h </w:instrText>
             </w:r>
             <w:r>
               <w:rPr>
@@ -4532,7 +4540,7 @@
               <w:lang w:eastAsia="cs-CZ"/>
             </w:rPr>
           </w:pPr>
-          <w:hyperlink w:anchor="_Toc230179550" w:history="1">
+          <w:hyperlink w:anchor="_Toc230182462" w:history="1">
             <w:r>
               <w:rPr>
                 <w:rStyle w:val="Hypertextovodkaz"/>
@@ -4575,7 +4583,7 @@
                 <w:noProof/>
                 <w:webHidden/>
               </w:rPr>
-              <w:instrText xml:space="preserve"> PAGEREF _Toc230179550 \h </w:instrText>
+              <w:instrText xml:space="preserve"> PAGEREF _Toc230182462 \h </w:instrText>
             </w:r>
             <w:r>
               <w:rPr>
@@ -4620,7 +4628,7 @@
               <w:lang w:eastAsia="cs-CZ"/>
             </w:rPr>
           </w:pPr>
-          <w:hyperlink w:anchor="_Toc230179551" w:history="1">
+          <w:hyperlink w:anchor="_Toc230182463" w:history="1">
             <w:r>
               <w:rPr>
                 <w:rStyle w:val="Hypertextovodkaz"/>
@@ -4663,7 +4671,7 @@
                 <w:noProof/>
                 <w:webHidden/>
               </w:rPr>
-              <w:instrText xml:space="preserve"> PAGEREF _Toc230179551 \h </w:instrText>
+              <w:instrText xml:space="preserve"> PAGEREF _Toc230182463 \h </w:instrText>
             </w:r>
             <w:r>
               <w:rPr>
@@ -4708,7 +4716,7 @@
               <w:lang w:eastAsia="cs-CZ"/>
             </w:rPr>
           </w:pPr>
-          <w:hyperlink w:anchor="_Toc230179552" w:history="1">
+          <w:hyperlink w:anchor="_Toc230182464" w:history="1">
             <w:r>
               <w:rPr>
                 <w:rStyle w:val="Hypertextovodkaz"/>
@@ -4751,7 +4759,7 @@
                 <w:noProof/>
                 <w:webHidden/>
               </w:rPr>
-              <w:instrText xml:space="preserve"> PAGEREF _Toc230179552 \h </w:instrText>
+              <w:instrText xml:space="preserve"> PAGEREF _Toc230182464 \h </w:instrText>
             </w:r>
             <w:r>
               <w:rPr>
@@ -4796,7 +4804,7 @@
               <w:lang w:eastAsia="cs-CZ"/>
             </w:rPr>
           </w:pPr>
-          <w:hyperlink w:anchor="_Toc230179553" w:history="1">
+          <w:hyperlink w:anchor="_Toc230182465" w:history="1">
             <w:r>
               <w:rPr>
                 <w:rStyle w:val="Hypertextovodkaz"/>
@@ -4839,7 +4847,7 @@
                 <w:noProof/>
                 <w:webHidden/>
               </w:rPr>
-              <w:instrText xml:space="preserve"> PAGEREF _Toc230179553 \h </w:instrText>
+              <w:instrText xml:space="preserve"> PAGEREF _Toc230182465 \h </w:instrText>
             </w:r>
             <w:r>
               <w:rPr>
@@ -4884,7 +4892,7 @@
               <w:lang w:eastAsia="cs-CZ"/>
             </w:rPr>
           </w:pPr>
-          <w:hyperlink w:anchor="_Toc230179554" w:history="1">
+          <w:hyperlink w:anchor="_Toc230182466" w:history="1">
             <w:r>
               <w:rPr>
                 <w:rStyle w:val="Hypertextovodkaz"/>
@@ -4927,7 +4935,7 @@
                 <w:noProof/>
                 <w:webHidden/>
               </w:rPr>
-              <w:instrText xml:space="preserve"> PAGEREF _Toc230179554 \h </w:instrText>
+              <w:instrText xml:space="preserve"> PAGEREF _Toc230182466 \h </w:instrText>
             </w:r>
             <w:r>
               <w:rPr>
@@ -4972,7 +4980,7 @@
               <w:lang w:eastAsia="cs-CZ"/>
             </w:rPr>
           </w:pPr>
-          <w:hyperlink w:anchor="_Toc230179555" w:history="1">
+          <w:hyperlink w:anchor="_Toc230182467" w:history="1">
             <w:r>
               <w:rPr>
                 <w:rStyle w:val="Hypertextovodkaz"/>
@@ -5015,7 +5023,7 @@
                 <w:noProof/>
                 <w:webHidden/>
               </w:rPr>
-              <w:instrText xml:space="preserve"> PAGEREF _Toc230179555 \h </w:instrText>
+              <w:instrText xml:space="preserve"> PAGEREF _Toc230182467 \h </w:instrText>
             </w:r>
             <w:r>
               <w:rPr>
@@ -5060,7 +5068,7 @@
               <w:lang w:eastAsia="cs-CZ"/>
             </w:rPr>
           </w:pPr>
-          <w:hyperlink w:anchor="_Toc230179556" w:history="1">
+          <w:hyperlink w:anchor="_Toc230182468" w:history="1">
             <w:r>
               <w:rPr>
                 <w:rStyle w:val="Hypertextovodkaz"/>
@@ -5103,7 +5111,7 @@
                 <w:noProof/>
                 <w:webHidden/>
               </w:rPr>
-              <w:instrText xml:space="preserve"> PAGEREF _Toc230179556 \h </w:instrText>
+              <w:instrText xml:space="preserve"> PAGEREF _Toc230182468 \h </w:instrText>
             </w:r>
             <w:r>
               <w:rPr>
@@ -5148,7 +5156,7 @@
               <w:lang w:eastAsia="cs-CZ"/>
             </w:rPr>
           </w:pPr>
-          <w:hyperlink w:anchor="_Toc230179557" w:history="1">
+          <w:hyperlink w:anchor="_Toc230182469" w:history="1">
             <w:r>
               <w:rPr>
                 <w:rStyle w:val="Hypertextovodkaz"/>
@@ -5191,7 +5199,7 @@
                 <w:noProof/>
                 <w:webHidden/>
               </w:rPr>
-              <w:instrText xml:space="preserve"> PAGEREF _Toc230179557 \h </w:instrText>
+              <w:instrText xml:space="preserve"> PAGEREF _Toc230182469 \h </w:instrText>
             </w:r>
             <w:r>
               <w:rPr>
@@ -5235,7 +5243,7 @@
               <w:lang w:eastAsia="cs-CZ"/>
             </w:rPr>
           </w:pPr>
-          <w:hyperlink w:anchor="_Toc230179558" w:history="1">
+          <w:hyperlink w:anchor="_Toc230182470" w:history="1">
             <w:r>
               <w:rPr>
                 <w:rStyle w:val="Hypertextovodkaz"/>
@@ -5262,7 +5270,7 @@
                 <w:noProof/>
                 <w:webHidden/>
               </w:rPr>
-              <w:instrText xml:space="preserve"> PAGEREF _Toc230179558 \h </w:instrText>
+              <w:instrText xml:space="preserve"> PAGEREF _Toc230182470 \h </w:instrText>
             </w:r>
             <w:r>
               <w:rPr>
@@ -5306,7 +5314,7 @@
               <w:lang w:eastAsia="cs-CZ"/>
             </w:rPr>
           </w:pPr>
-          <w:hyperlink w:anchor="_Toc230179559" w:history="1">
+          <w:hyperlink w:anchor="_Toc230182471" w:history="1">
             <w:r>
               <w:rPr>
                 <w:rStyle w:val="Hypertextovodkaz"/>
@@ -5333,7 +5341,7 @@
                 <w:noProof/>
                 <w:webHidden/>
               </w:rPr>
-              <w:instrText xml:space="preserve"> PAGEREF _Toc230179559 \h </w:instrText>
+              <w:instrText xml:space="preserve"> PAGEREF _Toc230182471 \h </w:instrText>
             </w:r>
             <w:r>
               <w:rPr>
@@ -5377,7 +5385,7 @@
               <w:lang w:eastAsia="cs-CZ"/>
             </w:rPr>
           </w:pPr>
-          <w:hyperlink w:anchor="_Toc230179560" w:history="1">
+          <w:hyperlink w:anchor="_Toc230182472" w:history="1">
             <w:r>
               <w:rPr>
                 <w:rStyle w:val="Hypertextovodkaz"/>
@@ -5404,7 +5412,7 @@
                 <w:noProof/>
                 <w:webHidden/>
               </w:rPr>
-              <w:instrText xml:space="preserve"> PAGEREF _Toc230179560 \h </w:instrText>
+              <w:instrText xml:space="preserve"> PAGEREF _Toc230182472 \h </w:instrText>
             </w:r>
             <w:r>
               <w:rPr>
@@ -5448,7 +5456,7 @@
               <w:lang w:eastAsia="cs-CZ"/>
             </w:rPr>
           </w:pPr>
-          <w:hyperlink w:anchor="_Toc230179561" w:history="1">
+          <w:hyperlink w:anchor="_Toc230182473" w:history="1">
             <w:r>
               <w:rPr>
                 <w:rStyle w:val="Hypertextovodkaz"/>
@@ -5475,7 +5483,7 @@
                 <w:noProof/>
                 <w:webHidden/>
               </w:rPr>
-              <w:instrText xml:space="preserve"> PAGEREF _Toc230179561 \h </w:instrText>
+              <w:instrText xml:space="preserve"> PAGEREF _Toc230182473 \h </w:instrText>
             </w:r>
             <w:r>
               <w:rPr>
@@ -5496,148 +5504,6 @@
                 <w:webHidden/>
               </w:rPr>
               <w:t>26</w:t>
-            </w:r>
-            <w:r>
-              <w:rPr>
-                <w:noProof/>
-                <w:webHidden/>
-              </w:rPr>
-              <w:fldChar w:fldCharType="end"/>
-            </w:r>
-          </w:hyperlink>
-        </w:p>
-        <w:p>
-          <w:pPr>
-            <w:pStyle w:val="Obsah1"/>
-            <w:tabs>
-              <w:tab w:val="right" w:leader="dot" w:pos="9628"/>
-            </w:tabs>
-            <w:rPr>
-              <w:rFonts w:asciiTheme="minorHAnsi" w:eastAsiaTheme="minorEastAsia" w:hAnsiTheme="minorHAnsi"/>
-              <w:noProof/>
-              <w:sz w:val="24"/>
-              <w:lang w:eastAsia="cs-CZ"/>
-            </w:rPr>
-          </w:pPr>
-          <w:hyperlink w:anchor="_Toc230179562" w:history="1">
-            <w:r>
-              <w:rPr>
-                <w:rStyle w:val="Hypertextovodkaz"/>
-                <w:noProof/>
-              </w:rPr>
-              <w:t>Seznam příloh</w:t>
-            </w:r>
-            <w:r>
-              <w:rPr>
-                <w:noProof/>
-                <w:webHidden/>
-              </w:rPr>
-              <w:tab/>
-            </w:r>
-            <w:r>
-              <w:rPr>
-                <w:noProof/>
-                <w:webHidden/>
-              </w:rPr>
-              <w:fldChar w:fldCharType="begin"/>
-            </w:r>
-            <w:r>
-              <w:rPr>
-                <w:noProof/>
-                <w:webHidden/>
-              </w:rPr>
-              <w:instrText xml:space="preserve"> PAGEREF _Toc230179562 \h </w:instrText>
-            </w:r>
-            <w:r>
-              <w:rPr>
-                <w:noProof/>
-                <w:webHidden/>
-              </w:rPr>
-            </w:r>
-            <w:r>
-              <w:rPr>
-                <w:noProof/>
-                <w:webHidden/>
-              </w:rPr>
-              <w:fldChar w:fldCharType="separate"/>
-            </w:r>
-            <w:r>
-              <w:rPr>
-                <w:noProof/>
-                <w:webHidden/>
-              </w:rPr>
-              <w:t>27</w:t>
-            </w:r>
-            <w:r>
-              <w:rPr>
-                <w:noProof/>
-                <w:webHidden/>
-              </w:rPr>
-              <w:fldChar w:fldCharType="end"/>
-            </w:r>
-          </w:hyperlink>
-        </w:p>
-        <w:p>
-          <w:pPr>
-            <w:pStyle w:val="Obsah1"/>
-            <w:tabs>
-              <w:tab w:val="right" w:leader="dot" w:pos="9628"/>
-            </w:tabs>
-            <w:rPr>
-              <w:rFonts w:asciiTheme="minorHAnsi" w:eastAsiaTheme="minorEastAsia" w:hAnsiTheme="minorHAnsi"/>
-              <w:noProof/>
-              <w:sz w:val="24"/>
-              <w:lang w:eastAsia="cs-CZ"/>
-            </w:rPr>
-          </w:pPr>
-          <w:hyperlink w:anchor="_Toc230179563" w:history="1">
-            <w:r>
-              <w:rPr>
-                <w:rStyle w:val="Hypertextovodkaz"/>
-                <w:noProof/>
-              </w:rPr>
-              <w:t>Přílohy</w:t>
-            </w:r>
-            <w:r>
-              <w:rPr>
-                <w:noProof/>
-                <w:webHidden/>
-              </w:rPr>
-              <w:tab/>
-            </w:r>
-            <w:r>
-              <w:rPr>
-                <w:noProof/>
-                <w:webHidden/>
-              </w:rPr>
-              <w:fldChar w:fldCharType="begin"/>
-            </w:r>
-            <w:r>
-              <w:rPr>
-                <w:noProof/>
-                <w:webHidden/>
-              </w:rPr>
-              <w:instrText xml:space="preserve"> PAGEREF _Toc230179563 \h </w:instrText>
-            </w:r>
-            <w:r>
-              <w:rPr>
-                <w:noProof/>
-                <w:webHidden/>
-              </w:rPr>
-            </w:r>
-            <w:r>
-              <w:rPr>
-                <w:noProof/>
-                <w:webHidden/>
-              </w:rPr>
-              <w:fldChar w:fldCharType="separate"/>
-            </w:r>
-            <w:r>
-              <w:rPr>
-                <w:noProof/>
-                <w:webHidden/>
-              </w:rPr>
-              <w:t>28</w:t>
             </w:r>
             <w:r>
               <w:rPr>
@@ -5689,12 +5555,12 @@
         </w:numPr>
         <w:ind w:left="720"/>
       </w:pPr>
-      <w:bookmarkStart w:id="34" w:name="_Toc230179521"/>
+      <w:bookmarkStart w:id="38" w:name="_Toc230182433"/>
       <w:r>
         <w:lastRenderedPageBreak/>
         <w:t>Úvod</w:t>
       </w:r>
-      <w:bookmarkEnd w:id="34"/>
+      <w:bookmarkEnd w:id="38"/>
     </w:p>
     <w:p>
       <w:r>
@@ -5780,7 +5646,7 @@
       <w:pPr>
         <w:pStyle w:val="Nadpis1"/>
       </w:pPr>
-      <w:bookmarkStart w:id="35" w:name="_Toc230179522"/>
+      <w:bookmarkStart w:id="39" w:name="_Toc230182434"/>
       <w:r>
         <w:lastRenderedPageBreak/>
         <w:t>Teoretická čás</w:t>
@@ -5788,7 +5654,7 @@
       <w:r>
         <w:t>t</w:t>
       </w:r>
-      <w:bookmarkEnd w:id="35"/>
+      <w:bookmarkEnd w:id="39"/>
     </w:p>
     <w:p>
       <w:r>
@@ -5805,7 +5671,7 @@
       <w:pPr>
         <w:pStyle w:val="Nadpis2"/>
       </w:pPr>
-      <w:bookmarkStart w:id="36" w:name="_Toc230179523"/>
+      <w:bookmarkStart w:id="40" w:name="_Toc230182435"/>
       <w:proofErr w:type="spellStart"/>
       <w:r>
         <w:t>Visual</w:t>
@@ -5818,7 +5684,7 @@
       <w:r>
         <w:t>Code</w:t>
       </w:r>
-      <w:bookmarkEnd w:id="36"/>
+      <w:bookmarkEnd w:id="40"/>
       <w:proofErr w:type="spellEnd"/>
     </w:p>
     <w:p>
@@ -5855,11 +5721,11 @@
       <w:pPr>
         <w:pStyle w:val="Nadpis3"/>
       </w:pPr>
-      <w:bookmarkStart w:id="37" w:name="_Toc230179524"/>
+      <w:bookmarkStart w:id="41" w:name="_Toc230182436"/>
       <w:r>
         <w:t>Školní zkušenost</w:t>
       </w:r>
-      <w:bookmarkEnd w:id="37"/>
+      <w:bookmarkEnd w:id="41"/>
     </w:p>
     <w:p>
       <w:pPr>
@@ -5879,11 +5745,9 @@
       <w:r>
         <w:t xml:space="preserve"> Studio Codu je, že s jinými vývojovými nástroji nemám až takové zkušenosti jako právě s tímto. Na naší škole se většina práce s kódem dělá právě v tomto IDE, takže jsem si postupně osvojil jeho ovládání, práci s projektem, </w:t>
       </w:r>
-      <w:proofErr w:type="gramStart"/>
-      <w:r>
-        <w:t>ladění</w:t>
-      </w:r>
-      <w:proofErr w:type="gramEnd"/>
+      <w:r>
+        <w:t>ladění,</w:t>
+      </w:r>
       <w:r>
         <w:t xml:space="preserve"> a hlavně i to, jak v něm pracovat „běžně“, aniž bych pořád musel hledat, kde se jaká možnost nachází. To u ročníkové práce pomáhá hodně, protože když se člověk soustředí hlavně na samotnou aplikaci, nechce ztrácet čas tím, že se učí nové IDE nebo nové nastavení.</w:t>
       </w:r>
@@ -5892,11 +5756,11 @@
       <w:pPr>
         <w:pStyle w:val="Nadpis3"/>
       </w:pPr>
-      <w:bookmarkStart w:id="38" w:name="_Toc230179525"/>
+      <w:bookmarkStart w:id="42" w:name="_Toc230182437"/>
       <w:r>
         <w:t>Integrovaný terminál</w:t>
       </w:r>
-      <w:bookmarkEnd w:id="38"/>
+      <w:bookmarkEnd w:id="42"/>
     </w:p>
     <w:p>
       <w:pPr>
@@ -5929,7 +5793,7 @@
       <w:pPr>
         <w:pStyle w:val="Nadpis3"/>
       </w:pPr>
-      <w:bookmarkStart w:id="39" w:name="_Toc230179526"/>
+      <w:bookmarkStart w:id="43" w:name="_Toc230182438"/>
       <w:r>
         <w:t>Rozšíření prostředí (</w:t>
       </w:r>
@@ -5941,7 +5805,7 @@
       <w:r>
         <w:t>)</w:t>
       </w:r>
-      <w:bookmarkEnd w:id="39"/>
+      <w:bookmarkEnd w:id="43"/>
     </w:p>
     <w:p>
       <w:pPr>
@@ -5998,11 +5862,11 @@
       <w:pPr>
         <w:pStyle w:val="Nadpis3"/>
       </w:pPr>
-      <w:bookmarkStart w:id="40" w:name="_Toc230179527"/>
+      <w:bookmarkStart w:id="44" w:name="_Toc230182439"/>
       <w:r>
         <w:t>Git podpora</w:t>
       </w:r>
-      <w:bookmarkEnd w:id="40"/>
+      <w:bookmarkEnd w:id="44"/>
     </w:p>
     <w:p>
       <w:pPr>
@@ -6044,12 +5908,12 @@
       <w:pPr>
         <w:pStyle w:val="Nadpis2"/>
       </w:pPr>
-      <w:bookmarkStart w:id="41" w:name="_Toc230179528"/>
+      <w:bookmarkStart w:id="45" w:name="_Toc230182440"/>
       <w:r>
         <w:lastRenderedPageBreak/>
         <w:t>Angular</w:t>
       </w:r>
-      <w:bookmarkEnd w:id="41"/>
+      <w:bookmarkEnd w:id="45"/>
     </w:p>
     <w:p>
       <w:r>
@@ -6089,7 +5953,7 @@
       <w:pPr>
         <w:pStyle w:val="Nadpis3"/>
       </w:pPr>
-      <w:bookmarkStart w:id="42" w:name="_Toc230179529"/>
+      <w:bookmarkStart w:id="46" w:name="_Toc230182441"/>
       <w:r>
         <w:t>SCSS (</w:t>
       </w:r>
@@ -6101,7 +5965,7 @@
       <w:r>
         <w:t xml:space="preserve"> CSS)</w:t>
       </w:r>
-      <w:bookmarkEnd w:id="42"/>
+      <w:bookmarkEnd w:id="46"/>
     </w:p>
     <w:p>
       <w:pPr>
@@ -6126,11 +5990,11 @@
       <w:pPr>
         <w:pStyle w:val="Nadpis3"/>
       </w:pPr>
-      <w:bookmarkStart w:id="43" w:name="_Toc230179530"/>
+      <w:bookmarkStart w:id="47" w:name="_Toc230182442"/>
       <w:r>
         <w:t>Komponentová architektura</w:t>
       </w:r>
-      <w:bookmarkEnd w:id="43"/>
+      <w:bookmarkEnd w:id="47"/>
     </w:p>
     <w:p>
       <w:pPr>
@@ -6151,7 +6015,7 @@
       <w:pPr>
         <w:pStyle w:val="Nadpis3"/>
       </w:pPr>
-      <w:bookmarkStart w:id="44" w:name="_Toc230179531"/>
+      <w:bookmarkStart w:id="48" w:name="_Toc230182443"/>
       <w:proofErr w:type="spellStart"/>
       <w:r>
         <w:t>Services</w:t>
@@ -6172,7 +6036,7 @@
       <w:r>
         <w:t>Injection</w:t>
       </w:r>
-      <w:bookmarkEnd w:id="44"/>
+      <w:bookmarkEnd w:id="48"/>
       <w:proofErr w:type="spellEnd"/>
     </w:p>
     <w:p>
@@ -6242,11 +6106,11 @@
       <w:pPr>
         <w:pStyle w:val="Nadpis3"/>
       </w:pPr>
-      <w:bookmarkStart w:id="45" w:name="_Toc230179532"/>
+      <w:bookmarkStart w:id="49" w:name="_Toc230182444"/>
       <w:r>
         <w:t>Angular CLI</w:t>
       </w:r>
-      <w:bookmarkEnd w:id="45"/>
+      <w:bookmarkEnd w:id="49"/>
     </w:p>
     <w:p>
       <w:pPr>
@@ -6297,13 +6161,7 @@
       </w:r>
       <w:proofErr w:type="spellEnd"/>
       <w:r>
-        <w:t xml:space="preserve"> na p</w:t>
-      </w:r>
-      <w:r>
-        <w:t>or</w:t>
-      </w:r>
-      <w:r>
-        <w:t>tu 4200. Pro mě bylo Angular CLI důležité i kvůli časovému ulehčení práce. Když člověk dělá projekt, který obsahuje více komponent, nechce ručně vytvářet strukturu pro každou komponentu. CLI mi to připravilo rychle a přehledně, takže jsem se mohl soustředit hlavně na vlastní funkčnost aplikace.</w:t>
+        <w:t xml:space="preserve"> na portu 4200. Pro mě bylo Angular CLI důležité i kvůli časovému ulehčení práce. Když člověk dělá projekt, který obsahuje více komponent, nechce ručně vytvářet strukturu pro každou komponentu. CLI mi to připravilo rychle a přehledně, takže jsem se mohl soustředit hlavně na vlastní funkčnost aplikace.</w:t>
       </w:r>
     </w:p>
     <w:p/>
@@ -6311,11 +6169,11 @@
       <w:pPr>
         <w:pStyle w:val="Nadpis2"/>
       </w:pPr>
-      <w:bookmarkStart w:id="46" w:name="_Toc230179533"/>
+      <w:bookmarkStart w:id="50" w:name="_Toc230182445"/>
       <w:r>
         <w:t>Angular Material</w:t>
       </w:r>
-      <w:bookmarkEnd w:id="46"/>
+      <w:bookmarkEnd w:id="50"/>
     </w:p>
     <w:p>
       <w:pPr>
@@ -6364,11 +6222,11 @@
       <w:pPr>
         <w:pStyle w:val="Nadpis3"/>
       </w:pPr>
-      <w:bookmarkStart w:id="47" w:name="_Toc230179534"/>
+      <w:bookmarkStart w:id="51" w:name="_Toc230182446"/>
       <w:r>
         <w:t>Karty a panely</w:t>
       </w:r>
-      <w:bookmarkEnd w:id="47"/>
+      <w:bookmarkEnd w:id="51"/>
     </w:p>
     <w:p>
       <w:r>
@@ -6411,11 +6269,11 @@
       <w:pPr>
         <w:pStyle w:val="Nadpis3"/>
       </w:pPr>
-      <w:bookmarkStart w:id="48" w:name="_Toc230179535"/>
+      <w:bookmarkStart w:id="52" w:name="_Toc230182447"/>
       <w:r>
         <w:t>Formulářové prvky a ikony</w:t>
       </w:r>
-      <w:bookmarkEnd w:id="48"/>
+      <w:bookmarkEnd w:id="52"/>
     </w:p>
     <w:p>
       <w:pPr>
@@ -6448,12 +6306,12 @@
       <w:pPr>
         <w:pStyle w:val="Nadpis2"/>
       </w:pPr>
-      <w:bookmarkStart w:id="49" w:name="_Toc230179536"/>
+      <w:bookmarkStart w:id="53" w:name="_Toc230182448"/>
       <w:proofErr w:type="spellStart"/>
       <w:r>
         <w:t>TypeScript</w:t>
       </w:r>
-      <w:bookmarkEnd w:id="49"/>
+      <w:bookmarkEnd w:id="53"/>
       <w:proofErr w:type="spellEnd"/>
     </w:p>
     <w:p>
@@ -6547,12 +6405,12 @@
       <w:pPr>
         <w:pStyle w:val="Nadpis3"/>
       </w:pPr>
-      <w:bookmarkStart w:id="50" w:name="_Toc230179537"/>
+      <w:bookmarkStart w:id="54" w:name="_Toc230182449"/>
       <w:r>
         <w:lastRenderedPageBreak/>
         <w:t>Statické typování</w:t>
       </w:r>
-      <w:bookmarkEnd w:id="50"/>
+      <w:bookmarkEnd w:id="54"/>
     </w:p>
     <w:p>
       <w:r>
@@ -6616,7 +6474,7 @@
       <w:pPr>
         <w:pStyle w:val="Nadpis3"/>
       </w:pPr>
-      <w:bookmarkStart w:id="51" w:name="_Toc230179538"/>
+      <w:bookmarkStart w:id="55" w:name="_Toc230182450"/>
       <w:proofErr w:type="spellStart"/>
       <w:r>
         <w:t>Interfaces</w:t>
@@ -6625,7 +6483,7 @@
       <w:r>
         <w:t xml:space="preserve"> a typy</w:t>
       </w:r>
-      <w:bookmarkEnd w:id="51"/>
+      <w:bookmarkEnd w:id="55"/>
     </w:p>
     <w:p>
       <w:proofErr w:type="spellStart"/>
@@ -6681,7 +6539,7 @@
       <w:pPr>
         <w:pStyle w:val="Nadpis3"/>
       </w:pPr>
-      <w:bookmarkStart w:id="52" w:name="_Toc230179539"/>
+      <w:bookmarkStart w:id="56" w:name="_Toc230182451"/>
       <w:proofErr w:type="spellStart"/>
       <w:r>
         <w:t>Dekorátory</w:t>
@@ -6690,7 +6548,7 @@
       <w:r>
         <w:t xml:space="preserve"> a metadata</w:t>
       </w:r>
-      <w:bookmarkEnd w:id="52"/>
+      <w:bookmarkEnd w:id="56"/>
     </w:p>
     <w:p>
       <w:proofErr w:type="spellStart"/>
@@ -6783,11 +6641,11 @@
       <w:pPr>
         <w:pStyle w:val="Nadpis3"/>
       </w:pPr>
-      <w:bookmarkStart w:id="53" w:name="_Toc230179540"/>
+      <w:bookmarkStart w:id="57" w:name="_Toc230182452"/>
       <w:r>
         <w:t>Generické typy</w:t>
       </w:r>
-      <w:bookmarkEnd w:id="53"/>
+      <w:bookmarkEnd w:id="57"/>
     </w:p>
     <w:p>
       <w:proofErr w:type="spellStart"/>
@@ -6857,11 +6715,11 @@
       <w:pPr>
         <w:pStyle w:val="Nadpis2"/>
       </w:pPr>
-      <w:bookmarkStart w:id="54" w:name="_Toc230179541"/>
+      <w:bookmarkStart w:id="58" w:name="_Toc230182453"/>
       <w:r>
         <w:t>Netlify</w:t>
       </w:r>
-      <w:bookmarkEnd w:id="54"/>
+      <w:bookmarkEnd w:id="58"/>
     </w:p>
     <w:p>
       <w:r>
@@ -6896,7 +6754,7 @@
       <w:pPr>
         <w:pStyle w:val="Nadpis1"/>
       </w:pPr>
-      <w:bookmarkStart w:id="55" w:name="_Toc230179542"/>
+      <w:bookmarkStart w:id="59" w:name="_Toc230182454"/>
       <w:r>
         <w:lastRenderedPageBreak/>
         <w:t>Praktická</w:t>
@@ -6904,7 +6762,7 @@
       <w:r>
         <w:t xml:space="preserve"> část</w:t>
       </w:r>
-      <w:bookmarkEnd w:id="55"/>
+      <w:bookmarkEnd w:id="59"/>
     </w:p>
     <w:p>
       <w:r>
@@ -6927,14 +6785,14 @@
       <w:pPr>
         <w:pStyle w:val="Nadpis2"/>
       </w:pPr>
-      <w:bookmarkStart w:id="56" w:name="_Toc230179543"/>
+      <w:bookmarkStart w:id="60" w:name="_Toc230182455"/>
       <w:r>
         <w:t>Modelovaní</w:t>
       </w:r>
       <w:r>
         <w:t xml:space="preserve"> dat a služby</w:t>
       </w:r>
-      <w:bookmarkEnd w:id="56"/>
+      <w:bookmarkEnd w:id="60"/>
     </w:p>
     <w:p>
       <w:r>
@@ -7125,10 +6983,7 @@
           <w:p>
             <w:proofErr w:type="gramStart"/>
             <w:r>
-              <w:t>U</w:t>
-            </w:r>
-            <w:r>
-              <w:t>kazatel</w:t>
+              <w:t>Ukazatel</w:t>
             </w:r>
             <w:proofErr w:type="gramEnd"/>
             <w:r>
@@ -7241,32 +7096,22 @@
         <w:pStyle w:val="Titulek"/>
         <w:jc w:val="left"/>
       </w:pPr>
-      <w:bookmarkStart w:id="57" w:name="_Toc230179648"/>
+      <w:bookmarkStart w:id="61" w:name="_Toc230179648"/>
       <w:r>
         <w:t xml:space="preserve">Tabulka </w:t>
       </w:r>
-      <w:r>
-        <w:fldChar w:fldCharType="begin"/>
-      </w:r>
-      <w:r>
-        <w:instrText xml:space="preserve"> SEQ Tabulka \* ARABIC </w:instrText>
-      </w:r>
-      <w:r>
-        <w:fldChar w:fldCharType="separate"/>
-      </w:r>
-      <w:r>
-        <w:rPr>
-          <w:noProof/>
-        </w:rPr>
-        <w:t>1</w:t>
-      </w:r>
-      <w:r>
-        <w:fldChar w:fldCharType="end"/>
-      </w:r>
+      <w:fldSimple w:instr=" SEQ Tabulka \* ARABIC ">
+        <w:r>
+          <w:rPr>
+            <w:noProof/>
+          </w:rPr>
+          <w:t>1</w:t>
+        </w:r>
+      </w:fldSimple>
       <w:r>
         <w:t>: Vlastnosti rozhraní Habit</w:t>
       </w:r>
-      <w:bookmarkEnd w:id="57"/>
+      <w:bookmarkEnd w:id="61"/>
     </w:p>
     <w:p>
       <w:r>
@@ -7369,11 +7214,11 @@
       <w:pPr>
         <w:pStyle w:val="Nadpis2"/>
       </w:pPr>
-      <w:bookmarkStart w:id="58" w:name="_Toc230179544"/>
+      <w:bookmarkStart w:id="62" w:name="_Toc230182456"/>
       <w:r>
         <w:t>Hlavní UI a navigace</w:t>
       </w:r>
-      <w:bookmarkEnd w:id="58"/>
+      <w:bookmarkEnd w:id="62"/>
     </w:p>
     <w:p>
       <w:r>
@@ -7415,160 +7260,6 @@
       <w:proofErr w:type="spellEnd"/>
       <w:r>
         <w:t>, která dle předaného parametru typu návyků načte a zobrazí správnou podmnožinu pole návyků. Díky dvěma existujícím typům návyků, jsou jen 2 podmnožiny:</w:t>
-      </w:r>
-    </w:p>
-    <w:p>
-      <w:pPr>
-        <w:pStyle w:val="Odrkovseznam"/>
-        <w:rPr>
-          <w:rFonts w:eastAsiaTheme="minorHAnsi"/>
-        </w:rPr>
-      </w:pPr>
-      <w:r>
-        <w:rPr>
-          <w:rFonts w:eastAsiaTheme="minorHAnsi"/>
-        </w:rPr>
-        <w:t>Karta s "</w:t>
-      </w:r>
-      <w:proofErr w:type="spellStart"/>
-      <w:r>
-        <w:rPr>
-          <w:rFonts w:eastAsiaTheme="minorHAnsi"/>
-        </w:rPr>
-        <w:t>Good</w:t>
-      </w:r>
-      <w:proofErr w:type="spellEnd"/>
-      <w:r>
-        <w:rPr>
-          <w:rFonts w:eastAsiaTheme="minorHAnsi"/>
-        </w:rPr>
-        <w:t xml:space="preserve"> </w:t>
-      </w:r>
-      <w:proofErr w:type="spellStart"/>
-      <w:r>
-        <w:rPr>
-          <w:rFonts w:eastAsiaTheme="minorHAnsi"/>
-        </w:rPr>
-        <w:t>Habits</w:t>
-      </w:r>
-      <w:proofErr w:type="spellEnd"/>
-      <w:r>
-        <w:rPr>
-          <w:rFonts w:eastAsiaTheme="minorHAnsi"/>
-        </w:rPr>
-        <w:t xml:space="preserve">" zobrazuje kladné návyky, které uživatel chce každý den dodržovat. Tato podmnožina je </w:t>
-      </w:r>
-      <w:proofErr w:type="spellStart"/>
-      <w:r>
-        <w:rPr>
-          <w:rFonts w:eastAsiaTheme="minorHAnsi"/>
-        </w:rPr>
-        <w:t>definováná</w:t>
-      </w:r>
-      <w:proofErr w:type="spellEnd"/>
-      <w:r>
-        <w:rPr>
-          <w:rFonts w:eastAsiaTheme="minorHAnsi"/>
-        </w:rPr>
-        <w:t xml:space="preserve"> typem "positive".</w:t>
-      </w:r>
-    </w:p>
-    <w:p>
-      <w:pPr>
-        <w:pStyle w:val="Odrkovseznam"/>
-        <w:rPr>
-          <w:rFonts w:eastAsiaTheme="minorHAnsi"/>
-        </w:rPr>
-      </w:pPr>
-      <w:r>
-        <w:rPr>
-          <w:rFonts w:eastAsiaTheme="minorHAnsi"/>
-        </w:rPr>
-        <w:t>Karta s "</w:t>
-      </w:r>
-      <w:proofErr w:type="spellStart"/>
-      <w:r>
-        <w:rPr>
-          <w:rFonts w:eastAsiaTheme="minorHAnsi"/>
-        </w:rPr>
-        <w:t>Bad</w:t>
-      </w:r>
-      <w:proofErr w:type="spellEnd"/>
-      <w:r>
-        <w:rPr>
-          <w:rFonts w:eastAsiaTheme="minorHAnsi"/>
-        </w:rPr>
-        <w:t xml:space="preserve"> </w:t>
-      </w:r>
-      <w:proofErr w:type="spellStart"/>
-      <w:r>
-        <w:rPr>
-          <w:rFonts w:eastAsiaTheme="minorHAnsi"/>
-        </w:rPr>
-        <w:t>Habits</w:t>
-      </w:r>
-      <w:proofErr w:type="spellEnd"/>
-      <w:r>
-        <w:rPr>
-          <w:rFonts w:eastAsiaTheme="minorHAnsi"/>
-        </w:rPr>
-        <w:t xml:space="preserve">" zobrazuje zlozvyky, které by si uživatel chtěl každý den držet co nejdál od svého denního života. Tato podmnožina je </w:t>
-      </w:r>
-      <w:proofErr w:type="spellStart"/>
-      <w:r>
-        <w:rPr>
-          <w:rFonts w:eastAsiaTheme="minorHAnsi"/>
-        </w:rPr>
-        <w:t>definováná</w:t>
-      </w:r>
-      <w:proofErr w:type="spellEnd"/>
-      <w:r>
-        <w:rPr>
-          <w:rFonts w:eastAsiaTheme="minorHAnsi"/>
-        </w:rPr>
-        <w:t xml:space="preserve"> typem "negative".</w:t>
-      </w:r>
-    </w:p>
-    <w:p>
-      <w:r>
-        <w:t xml:space="preserve">Každá karta v této komponentě </w:t>
-      </w:r>
-      <w:proofErr w:type="spellStart"/>
-      <w:r>
-        <w:t>renderuje</w:t>
-      </w:r>
-      <w:proofErr w:type="spellEnd"/>
-      <w:r>
-        <w:t xml:space="preserve"> samostatnou komponentu, konkrétněji mnou definovanou </w:t>
-      </w:r>
-      <w:proofErr w:type="spellStart"/>
-      <w:r>
-        <w:t>app-habits-tab</w:t>
-      </w:r>
-      <w:proofErr w:type="spellEnd"/>
-      <w:r>
-        <w:t>, která podle předaného parametru typu načte a zobrazí správnou podmnožinu návyků.</w:t>
-      </w:r>
-    </w:p>
-    <w:p>
-      <w:r>
-        <w:t xml:space="preserve">V horní části stránky je umístěný </w:t>
-      </w:r>
-      <w:proofErr w:type="spellStart"/>
-      <w:r>
-        <w:t>toolbar</w:t>
-      </w:r>
-      <w:proofErr w:type="spellEnd"/>
-      <w:r>
-        <w:t xml:space="preserve"> (mat-</w:t>
-      </w:r>
-      <w:proofErr w:type="spellStart"/>
-      <w:r>
-        <w:t>toolbar</w:t>
-      </w:r>
-      <w:proofErr w:type="spellEnd"/>
-      <w:r>
-        <w:t>), který obsahuje základní akce:</w:t>
       </w:r>
     </w:p>
     <w:tbl>
@@ -7588,6 +7279,174 @@
           </w:tcPr>
           <w:p>
             <w:r>
+              <w:t>Název Karty</w:t>
+            </w:r>
+          </w:p>
+        </w:tc>
+        <w:tc>
+          <w:tcPr>
+            <w:tcW w:w="4814" w:type="dxa"/>
+          </w:tcPr>
+          <w:p>
+            <w:r>
+              <w:t>Zobrazení</w:t>
+            </w:r>
+          </w:p>
+        </w:tc>
+      </w:tr>
+      <w:tr>
+        <w:tc>
+          <w:tcPr>
+            <w:tcW w:w="4814" w:type="dxa"/>
+          </w:tcPr>
+          <w:p>
+            <w:r>
+              <w:t>"</w:t>
+            </w:r>
+            <w:proofErr w:type="spellStart"/>
+            <w:r>
+              <w:t>Good</w:t>
+            </w:r>
+            <w:proofErr w:type="spellEnd"/>
+            <w:r>
+              <w:t xml:space="preserve"> </w:t>
+            </w:r>
+            <w:proofErr w:type="spellStart"/>
+            <w:r>
+              <w:t>Habits</w:t>
+            </w:r>
+            <w:proofErr w:type="spellEnd"/>
+            <w:r>
+              <w:t>"</w:t>
+            </w:r>
+          </w:p>
+        </w:tc>
+        <w:tc>
+          <w:tcPr>
+            <w:tcW w:w="4814" w:type="dxa"/>
+          </w:tcPr>
+          <w:p>
+            <w:r>
+              <w:t xml:space="preserve">kladné návyky, které uživatel chce každý den dodržovat. Tato podmnožina je </w:t>
+            </w:r>
+            <w:proofErr w:type="spellStart"/>
+            <w:r>
+              <w:t>definováná</w:t>
+            </w:r>
+            <w:proofErr w:type="spellEnd"/>
+            <w:r>
+              <w:t xml:space="preserve"> typem "positive"</w:t>
+            </w:r>
+          </w:p>
+        </w:tc>
+      </w:tr>
+      <w:tr>
+        <w:tc>
+          <w:tcPr>
+            <w:tcW w:w="4814" w:type="dxa"/>
+          </w:tcPr>
+          <w:p>
+            <w:r>
+              <w:t>"</w:t>
+            </w:r>
+            <w:proofErr w:type="spellStart"/>
+            <w:r>
+              <w:t>Bad</w:t>
+            </w:r>
+            <w:proofErr w:type="spellEnd"/>
+            <w:r>
+              <w:t xml:space="preserve"> </w:t>
+            </w:r>
+            <w:proofErr w:type="spellStart"/>
+            <w:r>
+              <w:t>Habits</w:t>
+            </w:r>
+            <w:proofErr w:type="spellEnd"/>
+            <w:r>
+              <w:t>"</w:t>
+            </w:r>
+          </w:p>
+        </w:tc>
+        <w:tc>
+          <w:tcPr>
+            <w:tcW w:w="4814" w:type="dxa"/>
+          </w:tcPr>
+          <w:p>
+            <w:r>
+              <w:t xml:space="preserve">zlozvyky, které by si uživatel chtěl každý den držet co nejdál od svého denního života. Tato podmnožina je </w:t>
+            </w:r>
+            <w:proofErr w:type="spellStart"/>
+            <w:r>
+              <w:t>definováná</w:t>
+            </w:r>
+            <w:proofErr w:type="spellEnd"/>
+            <w:r>
+              <w:t xml:space="preserve"> typem "negative".</w:t>
+            </w:r>
+          </w:p>
+        </w:tc>
+      </w:tr>
+    </w:tbl>
+    <w:p/>
+    <w:p>
+      <w:r>
+        <w:t xml:space="preserve">Každá karta v této komponentě </w:t>
+      </w:r>
+      <w:proofErr w:type="spellStart"/>
+      <w:r>
+        <w:t>renderuje</w:t>
+      </w:r>
+      <w:proofErr w:type="spellEnd"/>
+      <w:r>
+        <w:t xml:space="preserve"> samostatnou komponentu, konkrétněji mnou definovanou </w:t>
+      </w:r>
+      <w:proofErr w:type="spellStart"/>
+      <w:r>
+        <w:t>app-habits-tab</w:t>
+      </w:r>
+      <w:proofErr w:type="spellEnd"/>
+      <w:r>
+        <w:t>, která podle předaného parametru typu načte a zobrazí správnou podmnožinu návyků.</w:t>
+      </w:r>
+    </w:p>
+    <w:p>
+      <w:r>
+        <w:t xml:space="preserve">V horní části stránky je umístěný </w:t>
+      </w:r>
+      <w:proofErr w:type="spellStart"/>
+      <w:r>
+        <w:t>toolbar</w:t>
+      </w:r>
+      <w:proofErr w:type="spellEnd"/>
+      <w:r>
+        <w:t xml:space="preserve"> (mat-</w:t>
+      </w:r>
+      <w:proofErr w:type="spellStart"/>
+      <w:r>
+        <w:t>toolbar</w:t>
+      </w:r>
+      <w:proofErr w:type="spellEnd"/>
+      <w:r>
+        <w:t>), který obsahuje základní akce:</w:t>
+      </w:r>
+    </w:p>
+    <w:tbl>
+      <w:tblPr>
+        <w:tblStyle w:val="Mkatabulky"/>
+        <w:tblW w:w="0" w:type="auto"/>
+        <w:tblLook w:val="04A0" w:firstRow="1" w:lastRow="0" w:firstColumn="1" w:lastColumn="0" w:noHBand="0" w:noVBand="1"/>
+      </w:tblPr>
+      <w:tblGrid>
+        <w:gridCol w:w="4814"/>
+        <w:gridCol w:w="4814"/>
+      </w:tblGrid>
+      <w:tr>
+        <w:tc>
+          <w:tcPr>
+            <w:tcW w:w="4814" w:type="dxa"/>
+          </w:tcPr>
+          <w:p>
+            <w:r>
               <w:t>Pojmenování akce</w:t>
             </w:r>
           </w:p>
@@ -7681,85 +7540,79 @@
       <w:pPr>
         <w:pStyle w:val="Titulek"/>
       </w:pPr>
-      <w:bookmarkStart w:id="59" w:name="_Toc230179649"/>
+      <w:bookmarkStart w:id="63" w:name="_Toc230179649"/>
       <w:r>
         <w:t xml:space="preserve">Tabulka </w:t>
       </w:r>
-      <w:r>
-        <w:fldChar w:fldCharType="begin"/>
-      </w:r>
-      <w:r>
-        <w:instrText xml:space="preserve"> SEQ Tabulka \* ARABIC </w:instrText>
-      </w:r>
-      <w:r>
-        <w:fldChar w:fldCharType="separate"/>
-      </w:r>
+      <w:fldSimple w:instr=" SEQ Tabulka \* ARABIC ">
+        <w:r>
+          <w:rPr>
+            <w:noProof/>
+          </w:rPr>
+          <w:t>2</w:t>
+        </w:r>
+      </w:fldSimple>
+      <w:r>
+        <w:t xml:space="preserve">: Akce </w:t>
+      </w:r>
+      <w:proofErr w:type="spellStart"/>
+      <w:r>
+        <w:t>toolbaru</w:t>
+      </w:r>
+      <w:bookmarkEnd w:id="63"/>
+      <w:proofErr w:type="spellEnd"/>
+    </w:p>
+    <w:p>
+      <w:r>
+        <w:t xml:space="preserve">Dále aplikace obsahuje plovoucí tlačítko (FAB) pro vytvoření nového návyku. Po kliknutí se zobrazí Angular Material komponenta </w:t>
+      </w:r>
+      <w:proofErr w:type="spellStart"/>
+      <w:r>
+        <w:t>overlay</w:t>
+      </w:r>
+      <w:proofErr w:type="spellEnd"/>
+      <w:r>
+        <w:t xml:space="preserve"> s formulářem (komponenta mnou definována </w:t>
+      </w:r>
+      <w:proofErr w:type="spellStart"/>
+      <w:r>
+        <w:t>app</w:t>
+      </w:r>
+      <w:proofErr w:type="spellEnd"/>
+      <w:r>
+        <w:t>-habit-</w:t>
+      </w:r>
+      <w:proofErr w:type="spellStart"/>
+      <w:r>
+        <w:t>form</w:t>
+      </w:r>
+      <w:proofErr w:type="spellEnd"/>
+      <w:r>
+        <w:t>).</w:t>
+      </w:r>
+    </w:p>
+    <w:p>
+      <w:r>
+        <w:t xml:space="preserve">Tímto rozdělením UI vzniká přehledně vypadající prostředí: uživatel se orientuje přes </w:t>
+      </w:r>
+      <w:proofErr w:type="spellStart"/>
+      <w:r>
+        <w:t>taby</w:t>
+      </w:r>
+      <w:proofErr w:type="spellEnd"/>
+      <w:r>
+        <w:t xml:space="preserve"> (dobré/špatné návyky), zatímco běžné akce (export/import JSON souborů s návyky) jsou dostupné z horní lišty a přidání návyků/zlozvyků z tlačítka v pravém dolním rohu stránky.</w:t>
+      </w:r>
+    </w:p>
+    <w:p>
+      <w:pPr>
+        <w:keepNext/>
+        <w:jc w:val="center"/>
+      </w:pPr>
       <w:r>
         <w:rPr>
           <w:noProof/>
         </w:rPr>
-        <w:t>2</w:t>
-      </w:r>
-      <w:r>
-        <w:fldChar w:fldCharType="end"/>
-      </w:r>
-      <w:r>
-        <w:t xml:space="preserve">: Akce </w:t>
-      </w:r>
-      <w:proofErr w:type="spellStart"/>
-      <w:r>
-        <w:t>toolbaru</w:t>
-      </w:r>
-      <w:bookmarkEnd w:id="59"/>
-      <w:proofErr w:type="spellEnd"/>
-    </w:p>
-    <w:p>
-      <w:r>
-        <w:t xml:space="preserve">Dále aplikace obsahuje plovoucí tlačítko (FAB) pro vytvoření nového návyku. Po kliknutí se zobrazí Angular Material komponenta </w:t>
-      </w:r>
-      <w:proofErr w:type="spellStart"/>
-      <w:r>
-        <w:t>overlay</w:t>
-      </w:r>
-      <w:proofErr w:type="spellEnd"/>
-      <w:r>
-        <w:t xml:space="preserve"> s formulářem (komponenta mnou definována </w:t>
-      </w:r>
-      <w:proofErr w:type="spellStart"/>
-      <w:r>
-        <w:t>app</w:t>
-      </w:r>
-      <w:proofErr w:type="spellEnd"/>
-      <w:r>
-        <w:t>-habit-</w:t>
-      </w:r>
-      <w:proofErr w:type="spellStart"/>
-      <w:r>
-        <w:t>form</w:t>
-      </w:r>
-      <w:proofErr w:type="spellEnd"/>
-      <w:r>
-        <w:t>).</w:t>
-      </w:r>
-    </w:p>
-    <w:p>
-      <w:r>
-        <w:t xml:space="preserve">Tímto rozdělením UI vzniká přehledně vypadající prostředí: uživatel se orientuje přes </w:t>
-      </w:r>
-      <w:proofErr w:type="spellStart"/>
-      <w:r>
-        <w:t>taby</w:t>
-      </w:r>
-      <w:proofErr w:type="spellEnd"/>
-      <w:r>
-        <w:t xml:space="preserve"> (dobré/špatné návyky), zatímco běžné akce (export/import JSON souborů s návyky) jsou dostupné z horní lišty a přidání návyků/zlozvyků z tlačítka v pravém dolním rohu stránky.</w:t>
-      </w:r>
-    </w:p>
-    <w:p>
-      <w:pPr>
-        <w:keepNext/>
-      </w:pPr>
-      <w:r>
         <w:lastRenderedPageBreak/>
         <w:drawing>
           <wp:inline distT="0" distB="0" distL="0" distR="0" wp14:anchorId="64F11A53" wp14:editId="1C8A4C54">
@@ -7801,43 +7654,34 @@
     <w:p>
       <w:pPr>
         <w:pStyle w:val="Titulek"/>
-      </w:pPr>
-      <w:bookmarkStart w:id="60" w:name="_Toc230179642"/>
+        <w:jc w:val="center"/>
+      </w:pPr>
+      <w:bookmarkStart w:id="64" w:name="_Toc230179642"/>
       <w:r>
         <w:t xml:space="preserve">Obrázek </w:t>
       </w:r>
-      <w:r>
-        <w:fldChar w:fldCharType="begin"/>
-      </w:r>
-      <w:r>
-        <w:instrText xml:space="preserve"> SEQ Obrázek \* ARABIC </w:instrText>
-      </w:r>
-      <w:r>
-        <w:fldChar w:fldCharType="separate"/>
-      </w:r>
-      <w:r>
-        <w:rPr>
-          <w:noProof/>
-        </w:rPr>
-        <w:t>1</w:t>
-      </w:r>
-      <w:r>
-        <w:fldChar w:fldCharType="end"/>
-      </w:r>
+      <w:fldSimple w:instr=" SEQ Obrázek \* ARABIC ">
+        <w:r>
+          <w:rPr>
+            <w:noProof/>
+          </w:rPr>
+          <w:t>1</w:t>
+        </w:r>
+      </w:fldSimple>
       <w:r>
         <w:t>: Hlavní UI</w:t>
       </w:r>
-      <w:bookmarkEnd w:id="60"/>
+      <w:bookmarkEnd w:id="64"/>
     </w:p>
     <w:p>
       <w:pPr>
         <w:pStyle w:val="Nadpis2"/>
       </w:pPr>
-      <w:bookmarkStart w:id="61" w:name="_Toc230179545"/>
+      <w:bookmarkStart w:id="65" w:name="_Toc230182457"/>
       <w:r>
         <w:t>Formulář pro vytváření nových návyků</w:t>
       </w:r>
-      <w:bookmarkEnd w:id="61"/>
+      <w:bookmarkEnd w:id="65"/>
     </w:p>
     <w:p>
       <w:r>
@@ -8096,108 +7940,103 @@
     <w:p>
       <w:pPr>
         <w:pStyle w:val="Titulek"/>
-      </w:pPr>
-      <w:bookmarkStart w:id="62" w:name="_Toc230179650"/>
+        <w:jc w:val="center"/>
+      </w:pPr>
+      <w:bookmarkStart w:id="66" w:name="_Toc230179650"/>
       <w:r>
         <w:t xml:space="preserve">Tabulka </w:t>
       </w:r>
-      <w:r>
-        <w:fldChar w:fldCharType="begin"/>
-      </w:r>
-      <w:r>
-        <w:instrText xml:space="preserve"> SEQ Tabulka \* ARABIC </w:instrText>
-      </w:r>
-      <w:r>
-        <w:fldChar w:fldCharType="separate"/>
-      </w:r>
+      <w:fldSimple w:instr=" SEQ Tabulka \* ARABIC ">
+        <w:r>
+          <w:rPr>
+            <w:noProof/>
+          </w:rPr>
+          <w:t>3</w:t>
+        </w:r>
+      </w:fldSimple>
+      <w:r>
+        <w:t>: Vstupy formuláře</w:t>
+      </w:r>
+      <w:bookmarkEnd w:id="66"/>
+    </w:p>
+    <w:p>
+      <w:r>
+        <w:lastRenderedPageBreak/>
+        <w:t>Klíčová je také logika proti duplicitám a přehnaně zapsaným návykům/zlozvykům. Před odesláním formuláře se provede kontrola, zda už neexistuje návyk stejného typu, který má shodný název nebo shodný popis (porovnání je case-</w:t>
+      </w:r>
+      <w:proofErr w:type="spellStart"/>
+      <w:r>
+        <w:t>insensitive</w:t>
+      </w:r>
+      <w:proofErr w:type="spellEnd"/>
+      <w:r>
+        <w:t xml:space="preserve"> a pracuje s </w:t>
+      </w:r>
+      <w:proofErr w:type="spellStart"/>
+      <w:r>
+        <w:t>trimmed</w:t>
+      </w:r>
+      <w:proofErr w:type="spellEnd"/>
+      <w:r>
+        <w:t xml:space="preserve"> řetězci pro lehčí zpracování textů). Pokud duplicita nastane, zobrazí se příslušná hláška a data se neuloží, okno zůstane otevřené.</w:t>
+      </w:r>
+    </w:p>
+    <w:p>
+      <w:r>
+        <w:t>Po naopak úspěšném odeslání se:</w:t>
+      </w:r>
+    </w:p>
+    <w:p>
+      <w:pPr>
+        <w:pStyle w:val="Odrkovseznam"/>
+      </w:pPr>
+      <w:r>
+        <w:t xml:space="preserve">vytvoří nový záznam návyku v </w:t>
+      </w:r>
+      <w:proofErr w:type="spellStart"/>
+      <w:r>
+        <w:t>DataService</w:t>
+      </w:r>
+      <w:proofErr w:type="spellEnd"/>
+      <w:r>
+        <w:t>,</w:t>
+      </w:r>
+    </w:p>
+    <w:p>
+      <w:pPr>
+        <w:pStyle w:val="Odrkovseznam"/>
+      </w:pPr>
+      <w:r>
+        <w:t>formulář se resetuje,</w:t>
+      </w:r>
+    </w:p>
+    <w:p>
+      <w:pPr>
+        <w:pStyle w:val="Odrkovseznam"/>
+      </w:pPr>
+      <w:proofErr w:type="spellStart"/>
+      <w:r>
+        <w:t>overlay</w:t>
+      </w:r>
+      <w:proofErr w:type="spellEnd"/>
+      <w:r>
+        <w:t xml:space="preserve"> se uzavře.</w:t>
+      </w:r>
+    </w:p>
+    <w:p>
+      <w:r>
+        <w:t>Tím je zajištěno, že se uživatelská data ukládají konzistentně a že aplikace není „zanesená“ duplicitami, které by zhoršovaly orientaci v seznamech.</w:t>
+      </w:r>
+    </w:p>
+    <w:p>
+      <w:pPr>
+        <w:keepNext/>
+        <w:jc w:val="center"/>
+      </w:pPr>
       <w:r>
         <w:rPr>
           <w:noProof/>
         </w:rPr>
-        <w:t>3</w:t>
-      </w:r>
-      <w:r>
-        <w:fldChar w:fldCharType="end"/>
-      </w:r>
-      <w:r>
-        <w:t>: Vstupy formuláře</w:t>
-      </w:r>
-      <w:bookmarkEnd w:id="62"/>
-    </w:p>
-    <w:p>
-      <w:r>
-        <w:lastRenderedPageBreak/>
-        <w:t>Klíčová je také logika proti duplicitám a přehnaně zapsaným návykům/zlozvykům. Před odesláním formuláře se provede kontrola, zda už neexistuje návyk stejného typu, který má shodný název nebo shodný popis (porovnání je case-</w:t>
-      </w:r>
-      <w:proofErr w:type="spellStart"/>
-      <w:r>
-        <w:t>insensitive</w:t>
-      </w:r>
-      <w:proofErr w:type="spellEnd"/>
-      <w:r>
-        <w:t xml:space="preserve"> a pracuje s </w:t>
-      </w:r>
-      <w:proofErr w:type="spellStart"/>
-      <w:r>
-        <w:t>trimmed</w:t>
-      </w:r>
-      <w:proofErr w:type="spellEnd"/>
-      <w:r>
-        <w:t xml:space="preserve"> řetězci pro lehčí zpracování textů). Pokud duplicita nastane, zobrazí se příslušná hláška a data se neuloží, okno zůstane otevřené.</w:t>
-      </w:r>
-    </w:p>
-    <w:p>
-      <w:r>
-        <w:t>Po naopak úspěšném odeslání se:</w:t>
-      </w:r>
-    </w:p>
-    <w:p>
-      <w:pPr>
-        <w:pStyle w:val="Odrkovseznam"/>
-      </w:pPr>
-      <w:r>
-        <w:t xml:space="preserve">vytvoří nový záznam návyku v </w:t>
-      </w:r>
-      <w:proofErr w:type="spellStart"/>
-      <w:r>
-        <w:t>DataService</w:t>
-      </w:r>
-      <w:proofErr w:type="spellEnd"/>
-      <w:r>
-        <w:t>,</w:t>
-      </w:r>
-    </w:p>
-    <w:p>
-      <w:pPr>
-        <w:pStyle w:val="Odrkovseznam"/>
-      </w:pPr>
-      <w:r>
-        <w:t>formulář se resetuje,</w:t>
-      </w:r>
-    </w:p>
-    <w:p>
-      <w:pPr>
-        <w:pStyle w:val="Odrkovseznam"/>
-      </w:pPr>
-      <w:proofErr w:type="spellStart"/>
-      <w:r>
-        <w:t>overlay</w:t>
-      </w:r>
-      <w:proofErr w:type="spellEnd"/>
-      <w:r>
-        <w:t xml:space="preserve"> se uzavře.</w:t>
-      </w:r>
-    </w:p>
-    <w:p>
-      <w:r>
-        <w:t>Tím je zajištěno, že se uživatelská data ukládají konzistentně a že aplikace není „zanesená“ duplicitami, které by zhoršovaly orientaci v seznamech.</w:t>
-      </w:r>
-    </w:p>
-    <w:p>
-      <w:pPr>
-        <w:keepNext/>
-      </w:pPr>
-      <w:r>
         <w:drawing>
           <wp:inline distT="0" distB="0" distL="0" distR="0" wp14:anchorId="4D44FAA8" wp14:editId="08A65775">
             <wp:extent cx="1928741" cy="2477386"/>
@@ -8238,43 +8077,34 @@
     <w:p>
       <w:pPr>
         <w:pStyle w:val="Titulek"/>
-      </w:pPr>
-      <w:bookmarkStart w:id="63" w:name="_Toc230179643"/>
+        <w:jc w:val="center"/>
+      </w:pPr>
+      <w:bookmarkStart w:id="67" w:name="_Toc230179643"/>
       <w:r>
         <w:t xml:space="preserve">Obrázek </w:t>
       </w:r>
-      <w:r>
-        <w:fldChar w:fldCharType="begin"/>
-      </w:r>
-      <w:r>
-        <w:instrText xml:space="preserve"> SEQ Obrázek \* ARABIC </w:instrText>
-      </w:r>
-      <w:r>
-        <w:fldChar w:fldCharType="separate"/>
-      </w:r>
-      <w:r>
-        <w:rPr>
-          <w:noProof/>
-        </w:rPr>
-        <w:t>2</w:t>
-      </w:r>
-      <w:r>
-        <w:fldChar w:fldCharType="end"/>
-      </w:r>
+      <w:fldSimple w:instr=" SEQ Obrázek \* ARABIC ">
+        <w:r>
+          <w:rPr>
+            <w:noProof/>
+          </w:rPr>
+          <w:t>2</w:t>
+        </w:r>
+      </w:fldSimple>
       <w:r>
         <w:t>: Formulář pro přidání nových habitů</w:t>
       </w:r>
-      <w:bookmarkEnd w:id="63"/>
+      <w:bookmarkEnd w:id="67"/>
     </w:p>
     <w:p>
       <w:pPr>
         <w:pStyle w:val="Nadpis2"/>
       </w:pPr>
-      <w:bookmarkStart w:id="64" w:name="_Toc230179546"/>
+      <w:bookmarkStart w:id="68" w:name="_Toc230182458"/>
       <w:r>
         <w:t>Seznamy návyků</w:t>
       </w:r>
-      <w:bookmarkEnd w:id="64"/>
+      <w:bookmarkEnd w:id="68"/>
     </w:p>
     <w:p>
       <w:r>
@@ -8378,10 +8208,7 @@
               <w:t>Stará se o</w:t>
             </w:r>
             <w:r>
-              <w:t xml:space="preserve"> </w:t>
-            </w:r>
-            <w:r>
-              <w:t>konkrétní položku (návyk/zlozvyk) a její lokální UI logiku</w:t>
+              <w:t xml:space="preserve"> konkrétní položku (návyk/zlozvyk) a její lokální UI logiku</w:t>
             </w:r>
           </w:p>
         </w:tc>
@@ -8440,32 +8267,22 @@
       <w:pPr>
         <w:pStyle w:val="Titulek"/>
       </w:pPr>
-      <w:bookmarkStart w:id="65" w:name="_Toc230179651"/>
+      <w:bookmarkStart w:id="69" w:name="_Toc230179651"/>
       <w:r>
         <w:t xml:space="preserve">Tabulka </w:t>
       </w:r>
-      <w:r>
-        <w:fldChar w:fldCharType="begin"/>
-      </w:r>
-      <w:r>
-        <w:instrText xml:space="preserve"> SEQ Tabulka \* ARABIC </w:instrText>
-      </w:r>
-      <w:r>
-        <w:fldChar w:fldCharType="separate"/>
-      </w:r>
-      <w:r>
-        <w:rPr>
-          <w:noProof/>
-        </w:rPr>
-        <w:t>4</w:t>
-      </w:r>
-      <w:r>
-        <w:fldChar w:fldCharType="end"/>
-      </w:r>
+      <w:fldSimple w:instr=" SEQ Tabulka \* ARABIC ">
+        <w:r>
+          <w:rPr>
+            <w:noProof/>
+          </w:rPr>
+          <w:t>4</w:t>
+        </w:r>
+      </w:fldSimple>
       <w:r>
         <w:t>: Členové za funkcí UI</w:t>
       </w:r>
-      <w:bookmarkEnd w:id="65"/>
+      <w:bookmarkEnd w:id="69"/>
     </w:p>
     <w:p>
       <w:r>
@@ -8561,72 +8378,66 @@
       <w:pPr>
         <w:pStyle w:val="Titulek"/>
       </w:pPr>
-      <w:bookmarkStart w:id="66" w:name="_Toc230179652"/>
+      <w:bookmarkStart w:id="70" w:name="_Toc230179652"/>
       <w:r>
         <w:t xml:space="preserve">Tabulka </w:t>
       </w:r>
-      <w:r>
-        <w:fldChar w:fldCharType="begin"/>
-      </w:r>
-      <w:r>
-        <w:instrText xml:space="preserve"> SEQ Tabulka \* ARABIC </w:instrText>
-      </w:r>
-      <w:r>
-        <w:fldChar w:fldCharType="separate"/>
-      </w:r>
+      <w:fldSimple w:instr=" SEQ Tabulka \* ARABIC ">
+        <w:r>
+          <w:rPr>
+            <w:noProof/>
+          </w:rPr>
+          <w:t>5</w:t>
+        </w:r>
+      </w:fldSimple>
+      <w:r>
+        <w:t>: výstupní eventy UI</w:t>
+      </w:r>
+      <w:bookmarkEnd w:id="70"/>
+    </w:p>
+    <w:p>
+      <w:r>
+        <w:t xml:space="preserve">Tímto stylem se v </w:t>
+      </w:r>
+      <w:proofErr w:type="spellStart"/>
+      <w:r>
+        <w:t>Angularu</w:t>
+      </w:r>
+      <w:proofErr w:type="spellEnd"/>
+      <w:r>
+        <w:t xml:space="preserve"> udržuje čistá separace odpovědností: komponenta seznamu pouze </w:t>
+      </w:r>
+      <w:proofErr w:type="spellStart"/>
+      <w:r>
+        <w:t>renderuje</w:t>
+      </w:r>
+      <w:proofErr w:type="spellEnd"/>
+      <w:r>
+        <w:t xml:space="preserve"> položky a přeposílá uživatelské akce výše, zatímco logika úpravy dat zůstává v nadržené logice a v </w:t>
+      </w:r>
+      <w:proofErr w:type="spellStart"/>
+      <w:r>
+        <w:t>DataService</w:t>
+      </w:r>
+      <w:proofErr w:type="spellEnd"/>
+      <w:r>
+        <w:t>.</w:t>
+      </w:r>
+    </w:p>
+    <w:p>
+      <w:r>
+        <w:t>Výsledkem je přehledné UI, kdy uživatel vidí návyky či zlozvyky v seznamech, může s nimi pracovat a změny se ihned projeví v dalších částech aplikace (např. v grafu).</w:t>
+      </w:r>
+    </w:p>
+    <w:p>
+      <w:pPr>
+        <w:keepNext/>
+        <w:jc w:val="center"/>
+      </w:pPr>
       <w:r>
         <w:rPr>
           <w:noProof/>
         </w:rPr>
-        <w:t>5</w:t>
-      </w:r>
-      <w:r>
-        <w:fldChar w:fldCharType="end"/>
-      </w:r>
-      <w:r>
-        <w:t>: výstupní eventy UI</w:t>
-      </w:r>
-      <w:bookmarkEnd w:id="66"/>
-    </w:p>
-    <w:p>
-      <w:r>
-        <w:t xml:space="preserve">Tímto stylem se v </w:t>
-      </w:r>
-      <w:proofErr w:type="spellStart"/>
-      <w:r>
-        <w:t>Angularu</w:t>
-      </w:r>
-      <w:proofErr w:type="spellEnd"/>
-      <w:r>
-        <w:t xml:space="preserve"> udržuje čistá separace odpovědností: komponenta seznamu pouze </w:t>
-      </w:r>
-      <w:proofErr w:type="spellStart"/>
-      <w:r>
-        <w:t>renderuje</w:t>
-      </w:r>
-      <w:proofErr w:type="spellEnd"/>
-      <w:r>
-        <w:t xml:space="preserve"> položky a přeposílá uživatelské akce výše, zatímco logika úpravy dat zůstává v nadržené logice a v </w:t>
-      </w:r>
-      <w:proofErr w:type="spellStart"/>
-      <w:r>
-        <w:t>DataService</w:t>
-      </w:r>
-      <w:proofErr w:type="spellEnd"/>
-      <w:r>
-        <w:t>.</w:t>
-      </w:r>
-    </w:p>
-    <w:p>
-      <w:r>
-        <w:t>Výsledkem je přehledné UI, kdy uživatel vidí návyky či zlozvyky v seznamech, může s nimi pracovat a změny se ihned projeví v dalších částech aplikace (např. v grafu).</w:t>
-      </w:r>
-    </w:p>
-    <w:p>
-      <w:pPr>
-        <w:keepNext/>
-      </w:pPr>
-      <w:r>
         <w:drawing>
           <wp:inline distT="0" distB="0" distL="0" distR="0" wp14:anchorId="7CD19B90" wp14:editId="179B0791">
             <wp:extent cx="6120130" cy="2460625"/>
@@ -8667,43 +8478,34 @@
     <w:p>
       <w:pPr>
         <w:pStyle w:val="Titulek"/>
-      </w:pPr>
-      <w:bookmarkStart w:id="67" w:name="_Toc230179644"/>
+        <w:jc w:val="center"/>
+      </w:pPr>
+      <w:bookmarkStart w:id="71" w:name="_Toc230179644"/>
       <w:r>
         <w:t xml:space="preserve">Obrázek </w:t>
       </w:r>
-      <w:r>
-        <w:fldChar w:fldCharType="begin"/>
-      </w:r>
-      <w:r>
-        <w:instrText xml:space="preserve"> SEQ Obrázek \* ARABIC </w:instrText>
-      </w:r>
-      <w:r>
-        <w:fldChar w:fldCharType="separate"/>
-      </w:r>
-      <w:r>
-        <w:rPr>
-          <w:noProof/>
-        </w:rPr>
-        <w:t>3</w:t>
-      </w:r>
-      <w:r>
-        <w:fldChar w:fldCharType="end"/>
-      </w:r>
+      <w:fldSimple w:instr=" SEQ Obrázek \* ARABIC ">
+        <w:r>
+          <w:rPr>
+            <w:noProof/>
+          </w:rPr>
+          <w:t>3</w:t>
+        </w:r>
+      </w:fldSimple>
       <w:r>
         <w:t>: Seznam habitů</w:t>
       </w:r>
-      <w:bookmarkEnd w:id="67"/>
+      <w:bookmarkEnd w:id="71"/>
     </w:p>
     <w:p>
       <w:pPr>
         <w:pStyle w:val="Nadpis2"/>
       </w:pPr>
-      <w:bookmarkStart w:id="68" w:name="_Toc230179547"/>
+      <w:bookmarkStart w:id="72" w:name="_Toc230182459"/>
       <w:r>
         <w:t>Vizualizace plnění návyku</w:t>
       </w:r>
-      <w:bookmarkEnd w:id="68"/>
+      <w:bookmarkEnd w:id="72"/>
     </w:p>
     <w:p>
       <w:pPr>
@@ -8840,29 +8642,20 @@
     <w:p>
       <w:pPr>
         <w:pStyle w:val="Titulek"/>
-      </w:pPr>
-      <w:bookmarkStart w:id="69" w:name="_Toc230179653"/>
+        <w:jc w:val="center"/>
+      </w:pPr>
+      <w:bookmarkStart w:id="73" w:name="_Toc230179653"/>
       <w:r>
         <w:t xml:space="preserve">Tabulka </w:t>
       </w:r>
-      <w:r>
-        <w:fldChar w:fldCharType="begin"/>
-      </w:r>
-      <w:r>
-        <w:instrText xml:space="preserve"> SEQ Tabulka \* ARABIC </w:instrText>
-      </w:r>
-      <w:r>
-        <w:fldChar w:fldCharType="separate"/>
-      </w:r>
-      <w:r>
-        <w:rPr>
-          <w:noProof/>
-        </w:rPr>
-        <w:t>6</w:t>
-      </w:r>
-      <w:r>
-        <w:fldChar w:fldCharType="end"/>
-      </w:r>
+      <w:fldSimple w:instr=" SEQ Tabulka \* ARABIC ">
+        <w:r>
+          <w:rPr>
+            <w:noProof/>
+          </w:rPr>
+          <w:t>6</w:t>
+        </w:r>
+      </w:fldSimple>
       <w:r>
         <w:t xml:space="preserve">: Vstupy </w:t>
       </w:r>
@@ -8870,7 +8663,7 @@
       <w:r>
         <w:t>HabitGraphu</w:t>
       </w:r>
-      <w:bookmarkEnd w:id="69"/>
+      <w:bookmarkEnd w:id="73"/>
       <w:proofErr w:type="spellEnd"/>
     </w:p>
     <w:p>
@@ -9011,33 +8804,24 @@
     <w:p>
       <w:pPr>
         <w:pStyle w:val="Titulek"/>
-      </w:pPr>
-      <w:bookmarkStart w:id="70" w:name="_Toc230179654"/>
+        <w:jc w:val="center"/>
+      </w:pPr>
+      <w:bookmarkStart w:id="74" w:name="_Toc230179654"/>
       <w:r>
         <w:t xml:space="preserve">Tabulka </w:t>
       </w:r>
-      <w:r>
-        <w:fldChar w:fldCharType="begin"/>
-      </w:r>
-      <w:r>
-        <w:instrText xml:space="preserve"> SEQ Tabulka \* ARABIC </w:instrText>
-      </w:r>
-      <w:r>
-        <w:fldChar w:fldCharType="separate"/>
-      </w:r>
-      <w:r>
-        <w:rPr>
-          <w:noProof/>
-        </w:rPr>
-        <w:t>7</w:t>
-      </w:r>
-      <w:r>
-        <w:fldChar w:fldCharType="end"/>
-      </w:r>
+      <w:fldSimple w:instr=" SEQ Tabulka \* ARABIC ">
+        <w:r>
+          <w:rPr>
+            <w:noProof/>
+          </w:rPr>
+          <w:t>7</w:t>
+        </w:r>
+      </w:fldSimple>
       <w:r>
         <w:t>: možnosti grafu</w:t>
       </w:r>
-      <w:bookmarkEnd w:id="70"/>
+      <w:bookmarkEnd w:id="74"/>
     </w:p>
     <w:p>
       <w:r>
@@ -9072,10 +8856,12 @@
       <w:pPr>
         <w:pStyle w:val="Normlnweb"/>
         <w:keepNext/>
+        <w:jc w:val="center"/>
       </w:pPr>
       <w:r>
         <w:rPr>
           <w:rStyle w:val="Siln"/>
+          <w:noProof/>
         </w:rPr>
         <w:drawing>
           <wp:inline distT="0" distB="0" distL="0" distR="0" wp14:anchorId="5AEEBD81" wp14:editId="6FFD4F09">
@@ -9117,47 +8903,37 @@
     <w:p>
       <w:pPr>
         <w:pStyle w:val="Titulek"/>
-        <w:jc w:val="left"/>
+        <w:jc w:val="center"/>
         <w:rPr>
           <w:rStyle w:val="Siln"/>
         </w:rPr>
       </w:pPr>
-      <w:bookmarkStart w:id="71" w:name="_Toc230179645"/>
+      <w:bookmarkStart w:id="75" w:name="_Toc230179645"/>
       <w:r>
         <w:t xml:space="preserve">Obrázek </w:t>
       </w:r>
-      <w:r>
-        <w:fldChar w:fldCharType="begin"/>
-      </w:r>
-      <w:r>
-        <w:instrText xml:space="preserve"> SEQ Obrázek \* ARABIC </w:instrText>
-      </w:r>
-      <w:r>
-        <w:fldChar w:fldCharType="separate"/>
-      </w:r>
-      <w:r>
-        <w:rPr>
-          <w:noProof/>
-        </w:rPr>
-        <w:t>4</w:t>
-      </w:r>
-      <w:r>
-        <w:fldChar w:fldCharType="end"/>
-      </w:r>
+      <w:fldSimple w:instr=" SEQ Obrázek \* ARABIC ">
+        <w:r>
+          <w:rPr>
+            <w:noProof/>
+          </w:rPr>
+          <w:t>4</w:t>
+        </w:r>
+      </w:fldSimple>
       <w:r>
         <w:t>: Rozevřený habit</w:t>
       </w:r>
-      <w:bookmarkEnd w:id="71"/>
+      <w:bookmarkEnd w:id="75"/>
     </w:p>
     <w:p>
       <w:pPr>
         <w:pStyle w:val="Nadpis2"/>
       </w:pPr>
-      <w:bookmarkStart w:id="72" w:name="_Toc230179548"/>
+      <w:bookmarkStart w:id="76" w:name="_Toc230182460"/>
       <w:r>
         <w:t>Styling a responzivita aplikace</w:t>
       </w:r>
-      <w:bookmarkEnd w:id="72"/>
+      <w:bookmarkEnd w:id="76"/>
     </w:p>
     <w:p>
       <w:r>
@@ -9224,13 +9000,18 @@
         <w:pStyle w:val="Odrkovseznam"/>
       </w:pPr>
       <w:r>
-        <w:t>specifické styly jednotlivých komponent jsou v jejich vlastních .</w:t>
+        <w:t xml:space="preserve">specifické styly jednotlivých komponent jsou v jejich </w:t>
+      </w:r>
+      <w:proofErr w:type="gramStart"/>
+      <w:r>
+        <w:t>vlastních .</w:t>
       </w:r>
       <w:proofErr w:type="spellStart"/>
       <w:r>
         <w:t>scss</w:t>
       </w:r>
       <w:proofErr w:type="spellEnd"/>
+      <w:proofErr w:type="gramEnd"/>
       <w:r>
         <w:t xml:space="preserve"> souborech (</w:t>
       </w:r>
@@ -9417,61 +9198,56 @@
     <w:p>
       <w:pPr>
         <w:pStyle w:val="Titulek"/>
-      </w:pPr>
-      <w:bookmarkStart w:id="73" w:name="_Toc230179655"/>
+        <w:jc w:val="center"/>
+      </w:pPr>
+      <w:bookmarkStart w:id="77" w:name="_Toc230179655"/>
       <w:r>
         <w:t xml:space="preserve">Tabulka </w:t>
       </w:r>
-      <w:r>
-        <w:fldChar w:fldCharType="begin"/>
-      </w:r>
-      <w:r>
-        <w:instrText xml:space="preserve"> SEQ Tabulka \* ARABIC </w:instrText>
-      </w:r>
-      <w:r>
-        <w:fldChar w:fldCharType="separate"/>
-      </w:r>
+      <w:fldSimple w:instr=" SEQ Tabulka \* ARABIC ">
+        <w:r>
+          <w:rPr>
+            <w:noProof/>
+          </w:rPr>
+          <w:t>8</w:t>
+        </w:r>
+      </w:fldSimple>
+      <w:r>
+        <w:t xml:space="preserve">: Komponenty </w:t>
+      </w:r>
+      <w:r>
+        <w:t>nejhorší</w:t>
+      </w:r>
+      <w:r>
+        <w:t xml:space="preserve"> na stylování</w:t>
+      </w:r>
+      <w:bookmarkEnd w:id="77"/>
+    </w:p>
+    <w:p>
+      <w:r>
+        <w:t xml:space="preserve">Přístup je tedy takový, že aplikace zůstává použitelná i na menších displejích, aniž by docházelo k rozbití layoutu nebo k nečitelnosti obsahu. V případě grafu je preferováno umožnit práci s obsahem přes </w:t>
+      </w:r>
+      <w:proofErr w:type="spellStart"/>
+      <w:r>
+        <w:t>scroll</w:t>
+      </w:r>
+      <w:proofErr w:type="spellEnd"/>
+      <w:r>
+        <w:t xml:space="preserve">, protože samotný graf vyžaduje určitou šířku pro čitelnost </w:t>
+      </w:r>
+      <w:r>
+        <w:t>detailů.</w:t>
+      </w:r>
+    </w:p>
+    <w:p>
+      <w:pPr>
+        <w:keepNext/>
+        <w:jc w:val="center"/>
+      </w:pPr>
       <w:r>
         <w:rPr>
           <w:noProof/>
         </w:rPr>
-        <w:t>8</w:t>
-      </w:r>
-      <w:r>
-        <w:fldChar w:fldCharType="end"/>
-      </w:r>
-      <w:r>
-        <w:t xml:space="preserve">: Komponenty </w:t>
-      </w:r>
-      <w:r>
-        <w:t>nejhorší</w:t>
-      </w:r>
-      <w:r>
-        <w:t xml:space="preserve"> na stylování</w:t>
-      </w:r>
-      <w:bookmarkEnd w:id="73"/>
-    </w:p>
-    <w:p>
-      <w:r>
-        <w:t xml:space="preserve">Přístup je tedy takový, že aplikace zůstává použitelná i na menších displejích, aniž by docházelo k rozbití layoutu nebo k nečitelnosti obsahu. V případě grafu je preferováno umožnit práci s obsahem přes </w:t>
-      </w:r>
-      <w:proofErr w:type="spellStart"/>
-      <w:r>
-        <w:t>scroll</w:t>
-      </w:r>
-      <w:proofErr w:type="spellEnd"/>
-      <w:r>
-        <w:t xml:space="preserve">, protože samotný graf vyžaduje určitou šířku pro čitelnost </w:t>
-      </w:r>
-      <w:r>
-        <w:t>detailů.</w:t>
-      </w:r>
-    </w:p>
-    <w:p>
-      <w:pPr>
-        <w:keepNext/>
-      </w:pPr>
-      <w:r>
         <w:drawing>
           <wp:inline distT="0" distB="0" distL="0" distR="0" wp14:anchorId="30AEE3C8" wp14:editId="2FB9047E">
             <wp:extent cx="2285339" cy="3423683"/>
@@ -9512,44 +9288,35 @@
     <w:p>
       <w:pPr>
         <w:pStyle w:val="Titulek"/>
-      </w:pPr>
-      <w:bookmarkStart w:id="74" w:name="_Toc230179646"/>
+        <w:jc w:val="center"/>
+      </w:pPr>
+      <w:bookmarkStart w:id="78" w:name="_Toc230179646"/>
       <w:r>
         <w:t xml:space="preserve">Obrázek </w:t>
       </w:r>
-      <w:r>
-        <w:fldChar w:fldCharType="begin"/>
-      </w:r>
-      <w:r>
-        <w:instrText xml:space="preserve"> SEQ Obrázek \* ARABIC </w:instrText>
-      </w:r>
-      <w:r>
-        <w:fldChar w:fldCharType="separate"/>
-      </w:r>
-      <w:r>
-        <w:rPr>
-          <w:noProof/>
-        </w:rPr>
-        <w:t>5</w:t>
-      </w:r>
-      <w:r>
-        <w:fldChar w:fldCharType="end"/>
-      </w:r>
+      <w:fldSimple w:instr=" SEQ Obrázek \* ARABIC ">
+        <w:r>
+          <w:rPr>
+            <w:noProof/>
+          </w:rPr>
+          <w:t>5</w:t>
+        </w:r>
+      </w:fldSimple>
       <w:r>
         <w:t>: mobilní verze aplikace</w:t>
       </w:r>
-      <w:bookmarkEnd w:id="74"/>
+      <w:bookmarkEnd w:id="78"/>
     </w:p>
     <w:p>
       <w:pPr>
         <w:pStyle w:val="Nadpis2"/>
       </w:pPr>
-      <w:bookmarkStart w:id="75" w:name="_Toc230179549"/>
+      <w:bookmarkStart w:id="79" w:name="_Toc230182461"/>
       <w:r>
         <w:lastRenderedPageBreak/>
         <w:t>Optimalizace</w:t>
       </w:r>
-      <w:bookmarkEnd w:id="75"/>
+      <w:bookmarkEnd w:id="79"/>
     </w:p>
     <w:p>
       <w:r>
@@ -9563,7 +9330,7 @@
       <w:r>
         <w:t xml:space="preserve"> </w:t>
       </w:r>
-      <w:bookmarkStart w:id="76" w:name="_Toc230179550"/>
+      <w:bookmarkStart w:id="80" w:name="_Toc230182462"/>
       <w:r>
         <w:t>Centrální servis pro data (</w:t>
       </w:r>
@@ -9575,7 +9342,7 @@
       <w:r>
         <w:t>)</w:t>
       </w:r>
-      <w:bookmarkEnd w:id="76"/>
+      <w:bookmarkEnd w:id="80"/>
     </w:p>
     <w:p>
       <w:r>
@@ -9615,11 +9382,11 @@
       <w:pPr>
         <w:pStyle w:val="Nadpis3"/>
       </w:pPr>
-      <w:bookmarkStart w:id="77" w:name="_Toc230179551"/>
+      <w:bookmarkStart w:id="81" w:name="_Toc230182463"/>
       <w:r>
         <w:t>Omezení přepočtů grafu</w:t>
       </w:r>
-      <w:bookmarkEnd w:id="77"/>
+      <w:bookmarkEnd w:id="81"/>
     </w:p>
     <w:p>
       <w:r>
@@ -9649,11 +9416,11 @@
       <w:pPr>
         <w:pStyle w:val="Nadpis2"/>
       </w:pPr>
-      <w:bookmarkStart w:id="78" w:name="_Toc230179552"/>
+      <w:bookmarkStart w:id="82" w:name="_Toc230182464"/>
       <w:r>
         <w:t>Zkušenosti nabrané z této práce</w:t>
       </w:r>
-      <w:bookmarkEnd w:id="78"/>
+      <w:bookmarkEnd w:id="82"/>
     </w:p>
     <w:p>
       <w:r>
@@ -9664,11 +9431,11 @@
       <w:pPr>
         <w:pStyle w:val="Nadpis3"/>
       </w:pPr>
-      <w:bookmarkStart w:id="79" w:name="_Toc230179553"/>
+      <w:bookmarkStart w:id="83" w:name="_Toc230182465"/>
       <w:r>
         <w:t>Angular komponentový přístup</w:t>
       </w:r>
-      <w:bookmarkEnd w:id="79"/>
+      <w:bookmarkEnd w:id="83"/>
     </w:p>
     <w:p>
       <w:r>
@@ -9703,11 +9470,11 @@
       <w:pPr>
         <w:pStyle w:val="Nadpis3"/>
       </w:pPr>
-      <w:bookmarkStart w:id="80" w:name="_Toc230179554"/>
+      <w:bookmarkStart w:id="84" w:name="_Toc230182466"/>
       <w:r>
         <w:t>Práce se stavem a službami</w:t>
       </w:r>
-      <w:bookmarkEnd w:id="80"/>
+      <w:bookmarkEnd w:id="84"/>
     </w:p>
     <w:p>
       <w:r>
@@ -9734,11 +9501,11 @@
       <w:pPr>
         <w:pStyle w:val="Nadpis3"/>
       </w:pPr>
-      <w:bookmarkStart w:id="81" w:name="_Toc230179555"/>
+      <w:bookmarkStart w:id="85" w:name="_Toc230182467"/>
       <w:r>
         <w:t>Validace a ošetření uživatelských vstupů</w:t>
       </w:r>
-      <w:bookmarkEnd w:id="81"/>
+      <w:bookmarkEnd w:id="85"/>
     </w:p>
     <w:p>
       <w:r>
@@ -9749,12 +9516,12 @@
       <w:pPr>
         <w:pStyle w:val="Nadpis3"/>
       </w:pPr>
-      <w:bookmarkStart w:id="82" w:name="_Toc230179556"/>
+      <w:bookmarkStart w:id="86" w:name="_Toc230182468"/>
       <w:r>
         <w:lastRenderedPageBreak/>
         <w:t>Transformace dat pro graf</w:t>
       </w:r>
-      <w:bookmarkEnd w:id="82"/>
+      <w:bookmarkEnd w:id="86"/>
     </w:p>
     <w:p>
       <w:r>
@@ -9776,11 +9543,11 @@
       <w:pPr>
         <w:pStyle w:val="Nadpis3"/>
       </w:pPr>
-      <w:bookmarkStart w:id="83" w:name="_Toc230179557"/>
+      <w:bookmarkStart w:id="87" w:name="_Toc230182469"/>
       <w:r>
         <w:t>Uživatelská použitelnost</w:t>
       </w:r>
-      <w:bookmarkEnd w:id="83"/>
+      <w:bookmarkEnd w:id="87"/>
     </w:p>
     <w:p>
       <w:r>
@@ -9829,12 +9596,12 @@
         </w:numPr>
         <w:ind w:left="720"/>
       </w:pPr>
-      <w:bookmarkStart w:id="84" w:name="_Toc230179558"/>
+      <w:bookmarkStart w:id="88" w:name="_Toc230182470"/>
       <w:r>
         <w:lastRenderedPageBreak/>
         <w:t>Závěr</w:t>
       </w:r>
-      <w:bookmarkEnd w:id="84"/>
+      <w:bookmarkEnd w:id="88"/>
     </w:p>
     <w:p>
       <w:r>
@@ -9855,13 +9622,7 @@
       </w:r>
       <w:proofErr w:type="gramStart"/>
       <w:r>
-        <w:t xml:space="preserve">účel </w:t>
-      </w:r>
-      <w:r>
-        <w:t xml:space="preserve">- </w:t>
-      </w:r>
-      <w:r>
-        <w:t>umožňuje</w:t>
+        <w:t>účel - umožňuje</w:t>
       </w:r>
       <w:proofErr w:type="gramEnd"/>
       <w:r>
@@ -9870,19 +9631,7 @@
     </w:p>
     <w:p>
       <w:r>
-        <w:t xml:space="preserve">Tato ročníková práce mi </w:t>
-      </w:r>
-      <w:r>
-        <w:t>pomohla si osvojit</w:t>
-      </w:r>
-      <w:r>
-        <w:t xml:space="preserve"> nejen praktické dovednosti v moderním webovém vývoji, ale také hlubší pochopení toho, jak propojit technické řešení s uživatelskými potřebami a jak vytvářet aplikace, které jsou funkční</w:t>
-      </w:r>
-      <w:r>
-        <w:t xml:space="preserve"> a</w:t>
-      </w:r>
-      <w:r>
-        <w:t xml:space="preserve"> příjemné na používání.</w:t>
+        <w:t>Tato ročníková práce mi pomohla si osvojit nejen praktické dovednosti v moderním webovém vývoji, ale také hlubší pochopení toho, jak propojit technické řešení s uživatelskými potřebami a jak vytvářet aplikace, které jsou funkční a příjemné na používání.</w:t>
       </w:r>
     </w:p>
     <w:p>
@@ -9899,16 +9648,16 @@
         </w:numPr>
         <w:ind w:left="720"/>
       </w:pPr>
-      <w:bookmarkStart w:id="85" w:name="_Toc222315302"/>
-      <w:bookmarkStart w:id="86" w:name="_Toc223513779"/>
-      <w:bookmarkStart w:id="87" w:name="_Toc230179559"/>
+      <w:bookmarkStart w:id="89" w:name="_Toc222315302"/>
+      <w:bookmarkStart w:id="90" w:name="_Toc223513779"/>
+      <w:bookmarkStart w:id="91" w:name="_Toc230182471"/>
       <w:r>
         <w:lastRenderedPageBreak/>
         <w:t>Použitá literatura</w:t>
       </w:r>
-      <w:bookmarkEnd w:id="85"/>
-      <w:bookmarkEnd w:id="86"/>
-      <w:bookmarkEnd w:id="87"/>
+      <w:bookmarkEnd w:id="89"/>
+      <w:bookmarkEnd w:id="90"/>
+      <w:bookmarkEnd w:id="91"/>
     </w:p>
     <w:p>
       <w:pPr>
@@ -10037,20 +9786,38 @@
         </w:numPr>
         <w:ind w:left="720"/>
       </w:pPr>
-      <w:bookmarkStart w:id="88" w:name="_Toc222315303"/>
-      <w:bookmarkStart w:id="89" w:name="_Toc223513780"/>
-      <w:bookmarkStart w:id="90" w:name="_Toc230179560"/>
+      <w:bookmarkStart w:id="92" w:name="_Toc222315303"/>
+      <w:bookmarkStart w:id="93" w:name="_Toc223513780"/>
+      <w:bookmarkStart w:id="94" w:name="_Toc230182472"/>
       <w:r>
         <w:lastRenderedPageBreak/>
         <w:t>Seznam obrázků</w:t>
       </w:r>
-      <w:bookmarkEnd w:id="88"/>
-      <w:bookmarkEnd w:id="89"/>
-      <w:bookmarkEnd w:id="90"/>
-    </w:p>
-    <w:p>
-      <w:r>
-        <w:t>Všechny obrázky byly vyfocené pomocí screenshotů z prohlížeče Brave a byl focen Habit Tracker.</w:t>
+      <w:bookmarkEnd w:id="92"/>
+      <w:bookmarkEnd w:id="93"/>
+      <w:bookmarkEnd w:id="94"/>
+    </w:p>
+    <w:p>
+      <w:r>
+        <w:t>Všechny obrázky byly vyfocené pomocí screenshotů z prohlížeče Brave a byl</w:t>
+      </w:r>
+      <w:r>
+        <w:t>y</w:t>
+      </w:r>
+      <w:r>
+        <w:t xml:space="preserve"> focen</w:t>
+      </w:r>
+      <w:r>
+        <w:t>y v</w:t>
+      </w:r>
+      <w:r>
+        <w:t xml:space="preserve"> Habit Tracker</w:t>
+      </w:r>
+      <w:r>
+        <w:t>u</w:t>
+      </w:r>
+      <w:r>
+        <w:t>.</w:t>
       </w:r>
     </w:p>
     <w:p>
@@ -10440,16 +10207,16 @@
         </w:numPr>
         <w:ind w:left="720"/>
       </w:pPr>
-      <w:bookmarkStart w:id="91" w:name="_Toc222315304"/>
-      <w:bookmarkStart w:id="92" w:name="_Toc223513781"/>
-      <w:bookmarkStart w:id="93" w:name="_Toc230179561"/>
+      <w:bookmarkStart w:id="95" w:name="_Toc222315304"/>
+      <w:bookmarkStart w:id="96" w:name="_Toc223513781"/>
+      <w:bookmarkStart w:id="97" w:name="_Toc230182473"/>
       <w:r>
         <w:lastRenderedPageBreak/>
         <w:t>Seznam tabulek</w:t>
       </w:r>
-      <w:bookmarkEnd w:id="91"/>
-      <w:bookmarkEnd w:id="92"/>
-      <w:bookmarkEnd w:id="93"/>
+      <w:bookmarkEnd w:id="95"/>
+      <w:bookmarkEnd w:id="96"/>
+      <w:bookmarkEnd w:id="97"/>
     </w:p>
     <w:p>
       <w:pPr>
@@ -10976,21 +10743,7 @@
             <w:rStyle w:val="Hypertextovodkaz"/>
             <w:noProof/>
           </w:rPr>
-          <w:t>Tabulka 8: Komponenty nejhorší na st</w:t>
-        </w:r>
-        <w:r>
-          <w:rPr>
-            <w:rStyle w:val="Hypertextovodkaz"/>
-            <w:noProof/>
-          </w:rPr>
-          <w:t>y</w:t>
-        </w:r>
-        <w:r>
-          <w:rPr>
-            <w:rStyle w:val="Hypertextovodkaz"/>
-            <w:noProof/>
-          </w:rPr>
-          <w:t>lování</w:t>
+          <w:t>Tabulka 8: Komponenty nejhorší na stylování</w:t>
         </w:r>
         <w:r>
           <w:rPr>
@@ -11045,107 +10798,6 @@
     <w:p>
       <w:r>
         <w:fldChar w:fldCharType="end"/>
-      </w:r>
-    </w:p>
-    <w:p>
-      <w:pPr>
-        <w:spacing w:after="160" w:line="278" w:lineRule="auto"/>
-        <w:jc w:val="left"/>
-      </w:pPr>
-      <w:r>
-        <w:br w:type="page"/>
-      </w:r>
-    </w:p>
-    <w:p>
-      <w:pPr>
-        <w:pStyle w:val="Nadpis1"/>
-        <w:numPr>
-          <w:ilvl w:val="0"/>
-          <w:numId w:val="0"/>
-        </w:numPr>
-        <w:ind w:left="720"/>
-      </w:pPr>
-      <w:bookmarkStart w:id="94" w:name="_Toc222315305"/>
-      <w:bookmarkStart w:id="95" w:name="_Toc223513782"/>
-      <w:bookmarkStart w:id="96" w:name="_Toc230179562"/>
-      <w:r>
-        <w:lastRenderedPageBreak/>
-        <w:t>Seznam příloh</w:t>
-      </w:r>
-      <w:bookmarkEnd w:id="94"/>
-      <w:bookmarkEnd w:id="95"/>
-      <w:bookmarkEnd w:id="96"/>
-    </w:p>
-    <w:p>
-      <w:r>
-        <w:t>Pokud žádné přílohy nemáte</w:t>
-      </w:r>
-      <w:r>
-        <w:t>, stránku odstraňte.</w:t>
-      </w:r>
-    </w:p>
-    <w:p>
-      <w:pPr>
-        <w:pStyle w:val="Seznamploh"/>
-      </w:pPr>
-      <w:r>
-        <w:t>Příloha 1</w:t>
-      </w:r>
-    </w:p>
-    <w:p>
-      <w:pPr>
-        <w:pStyle w:val="Seznamploh"/>
-      </w:pPr>
-      <w:r>
-        <w:t>Příloha 2</w:t>
-      </w:r>
-    </w:p>
-    <w:p>
-      <w:pPr>
-        <w:pStyle w:val="Seznamploh"/>
-      </w:pPr>
-      <w:r>
-        <w:t>Příloha 3</w:t>
-      </w:r>
-    </w:p>
-    <w:p>
-      <w:pPr>
-        <w:spacing w:after="160" w:line="278" w:lineRule="auto"/>
-        <w:jc w:val="left"/>
-      </w:pPr>
-      <w:r>
-        <w:br w:type="page"/>
-      </w:r>
-    </w:p>
-    <w:p>
-      <w:pPr>
-        <w:pStyle w:val="Nadpis1"/>
-        <w:numPr>
-          <w:ilvl w:val="0"/>
-          <w:numId w:val="0"/>
-        </w:numPr>
-        <w:ind w:left="720"/>
-      </w:pPr>
-      <w:bookmarkStart w:id="97" w:name="_Toc222315306"/>
-      <w:bookmarkStart w:id="98" w:name="_Toc223513783"/>
-      <w:bookmarkStart w:id="99" w:name="_Toc230179563"/>
-      <w:r>
-        <w:lastRenderedPageBreak/>
-        <w:t>Přílohy</w:t>
-      </w:r>
-      <w:bookmarkEnd w:id="97"/>
-      <w:bookmarkEnd w:id="98"/>
-      <w:bookmarkEnd w:id="99"/>
-    </w:p>
-    <w:p>
-      <w:r>
-        <w:t>Stejné jako u</w:t>
-      </w:r>
-      <w:r>
-        <w:t xml:space="preserve"> seznamu </w:t>
-      </w:r>
-      <w:r>
-        <w:t>příloh.</w:t>
       </w:r>
     </w:p>
     <w:sectPr>
@@ -15607,6 +15259,7 @@
   <w:style w:type="character" w:default="1" w:styleId="Standardnpsmoodstavce">
     <w:name w:val="Default Paragraph Font"/>
     <w:uiPriority w:val="1"/>
+    <w:semiHidden/>
     <w:unhideWhenUsed/>
   </w:style>
   <w:style w:type="table" w:default="1" w:styleId="Normlntabulka">
@@ -16581,14 +16234,7 @@
 </file>
 
 <file path=customXml/item2.xml><?xml version="1.0" encoding="utf-8"?>
-<p:properties xmlns:p="http://schemas.microsoft.com/office/2006/metadata/properties" xmlns:xsi="http://www.w3.org/2001/XMLSchema-instance" xmlns:pc="http://schemas.microsoft.com/office/infopath/2007/PartnerControls">
-  <documentManagement>
-    <TaxCatchAll xmlns="9069f8e3-06b5-4841-af59-bd496f6fbcdc" xsi:nil="true"/>
-    <lcf76f155ced4ddcb4097134ff3c332f xmlns="ac4d9f64-92e6-40df-bbe5-cbf691cfe8ae">
-      <Terms xmlns="http://schemas.microsoft.com/office/infopath/2007/PartnerControls"/>
-    </lcf76f155ced4ddcb4097134ff3c332f>
-  </documentManagement>
-</p:properties>
+<b:Sources xmlns:b="http://schemas.openxmlformats.org/officeDocument/2006/bibliography" xmlns="http://schemas.openxmlformats.org/officeDocument/2006/bibliography" SelectedStyle="\APASixthEditionOfficeOnline.xsl" StyleName="APA" Version="6"/>
 </file>
 
 <file path=customXml/item3.xml><?xml version="1.0" encoding="utf-8"?>
@@ -16781,7 +16427,14 @@
 </file>
 
 <file path=customXml/item4.xml><?xml version="1.0" encoding="utf-8"?>
-<b:Sources xmlns:b="http://schemas.openxmlformats.org/officeDocument/2006/bibliography" xmlns="http://schemas.openxmlformats.org/officeDocument/2006/bibliography" SelectedStyle="\APASixthEditionOfficeOnline.xsl" StyleName="APA" Version="6"/>
+<p:properties xmlns:p="http://schemas.microsoft.com/office/2006/metadata/properties" xmlns:xsi="http://www.w3.org/2001/XMLSchema-instance" xmlns:pc="http://schemas.microsoft.com/office/infopath/2007/PartnerControls">
+  <documentManagement>
+    <TaxCatchAll xmlns="9069f8e3-06b5-4841-af59-bd496f6fbcdc" xsi:nil="true"/>
+    <lcf76f155ced4ddcb4097134ff3c332f xmlns="ac4d9f64-92e6-40df-bbe5-cbf691cfe8ae">
+      <Terms xmlns="http://schemas.microsoft.com/office/infopath/2007/PartnerControls"/>
+    </lcf76f155ced4ddcb4097134ff3c332f>
+  </documentManagement>
+</p:properties>
 </file>
 
 <file path=customXml/itemProps1.xml><?xml version="1.0" encoding="utf-8"?>
@@ -16793,12 +16446,9 @@
 </file>
 
 <file path=customXml/itemProps2.xml><?xml version="1.0" encoding="utf-8"?>
-<ds:datastoreItem xmlns:ds="http://schemas.openxmlformats.org/officeDocument/2006/customXml" ds:itemID="{FB1D83C0-C8CC-4C35-B0E6-D4B15A08C6B5}">
+<ds:datastoreItem xmlns:ds="http://schemas.openxmlformats.org/officeDocument/2006/customXml" ds:itemID="{E0BB6427-4419-4C21-A0DF-4471F23995B6}">
   <ds:schemaRefs>
-    <ds:schemaRef ds:uri="http://schemas.microsoft.com/office/2006/metadata/properties"/>
-    <ds:schemaRef ds:uri="http://schemas.microsoft.com/office/infopath/2007/PartnerControls"/>
-    <ds:schemaRef ds:uri="9069f8e3-06b5-4841-af59-bd496f6fbcdc"/>
-    <ds:schemaRef ds:uri="ac4d9f64-92e6-40df-bbe5-cbf691cfe8ae"/>
+    <ds:schemaRef ds:uri="http://schemas.openxmlformats.org/officeDocument/2006/bibliography"/>
   </ds:schemaRefs>
 </ds:datastoreItem>
 </file>
@@ -16823,9 +16473,12 @@
 </file>
 
 <file path=customXml/itemProps4.xml><?xml version="1.0" encoding="utf-8"?>
-<ds:datastoreItem xmlns:ds="http://schemas.openxmlformats.org/officeDocument/2006/customXml" ds:itemID="{E0BB6427-4419-4C21-A0DF-4471F23995B6}">
+<ds:datastoreItem xmlns:ds="http://schemas.openxmlformats.org/officeDocument/2006/customXml" ds:itemID="{FB1D83C0-C8CC-4C35-B0E6-D4B15A08C6B5}">
   <ds:schemaRefs>
-    <ds:schemaRef ds:uri="http://schemas.openxmlformats.org/officeDocument/2006/bibliography"/>
+    <ds:schemaRef ds:uri="http://schemas.microsoft.com/office/2006/metadata/properties"/>
+    <ds:schemaRef ds:uri="http://schemas.microsoft.com/office/infopath/2007/PartnerControls"/>
+    <ds:schemaRef ds:uri="9069f8e3-06b5-4841-af59-bd496f6fbcdc"/>
+    <ds:schemaRef ds:uri="ac4d9f64-92e6-40df-bbe5-cbf691cfe8ae"/>
   </ds:schemaRefs>
 </ds:datastoreItem>
 </file>
</xml_diff>

<commit_message>
fix (vedoucí práce orders): - Odstranit zbytečné odsazení u oponenta práce. - Změnit název kapitoly 1. na Použité nástroje a asi i odstranit první větu/odstavec v kapitole 1. (po změně názvu nebude potřeba) - Přejmenovat kapitolu 2. na Tvorba aplikace (anebo něco podobného) a opět odstranit první odstavec. - Přidat popisek k první tabulce. - Nepoužívat počeštěné výrazy - použij "Seznam návyků" místo "Seznam habitů" a podobně. - Obsah kapitoly 2.8 přesunout do závěru - nové zkušenosti přímo nesouvisí s tvorbou aplikace - praktická část by měla primárně popisovat proces tvorby práce. - Přidat použitou literaturu - pochybuji, že veškeré informace byly brány pouze ze tří uvedených zdrojů. - Odebrat přímé citace a používat pouze parafráze - tvá práce přímé citace nevyžaduje, ty se používají pouze, když je to nutné (například při citacích právních definic). Navíc na každý zdroj v použité literatuře se musí objevit v textu křížový odkaz.
</commit_message>
<xml_diff>
--- a/Barta_rocnikova_prace.docx
+++ b/Barta_rocnikova_prace.docx
@@ -299,7 +299,6 @@
     </w:p>
     <w:p>
       <w:pPr>
-        <w:ind w:left="2832" w:firstLine="708"/>
         <w:jc w:val="center"/>
         <w:rPr>
           <w:b/>
@@ -1359,6 +1358,7 @@
       <w:bookmarkStart w:id="8" w:name="_Toc226556217"/>
       <w:bookmarkStart w:id="9" w:name="_Toc230179517"/>
       <w:bookmarkStart w:id="10" w:name="_Toc230182429"/>
+      <w:bookmarkStart w:id="11" w:name="_Toc230197530"/>
       <w:r>
         <w:lastRenderedPageBreak/>
         <w:t>Prohlášení</w:t>
@@ -1374,6 +1374,7 @@
       <w:bookmarkEnd w:id="8"/>
       <w:bookmarkEnd w:id="9"/>
       <w:bookmarkEnd w:id="10"/>
+      <w:bookmarkEnd w:id="11"/>
       <w:r>
         <w:t xml:space="preserve"> </w:t>
       </w:r>
@@ -1701,20 +1702,20 @@
         </w:numPr>
         <w:ind w:left="720"/>
       </w:pPr>
-      <w:bookmarkStart w:id="11" w:name="_Toc183979916"/>
-      <w:bookmarkStart w:id="12" w:name="_Toc216425626"/>
-      <w:bookmarkStart w:id="13" w:name="_Toc216425784"/>
-      <w:bookmarkStart w:id="14" w:name="_Toc222315289"/>
-      <w:bookmarkStart w:id="15" w:name="_Toc223513764"/>
-      <w:bookmarkStart w:id="16" w:name="_Toc226550176"/>
-      <w:bookmarkStart w:id="17" w:name="_Toc226556218"/>
-      <w:bookmarkStart w:id="18" w:name="_Toc230179518"/>
-      <w:bookmarkStart w:id="19" w:name="_Toc230182430"/>
+      <w:bookmarkStart w:id="12" w:name="_Toc183979916"/>
+      <w:bookmarkStart w:id="13" w:name="_Toc216425626"/>
+      <w:bookmarkStart w:id="14" w:name="_Toc216425784"/>
+      <w:bookmarkStart w:id="15" w:name="_Toc222315289"/>
+      <w:bookmarkStart w:id="16" w:name="_Toc223513764"/>
+      <w:bookmarkStart w:id="17" w:name="_Toc226550176"/>
+      <w:bookmarkStart w:id="18" w:name="_Toc226556218"/>
+      <w:bookmarkStart w:id="19" w:name="_Toc230179518"/>
+      <w:bookmarkStart w:id="20" w:name="_Toc230182430"/>
+      <w:bookmarkStart w:id="21" w:name="_Toc230197531"/>
       <w:r>
         <w:lastRenderedPageBreak/>
         <w:t>Anotace</w:t>
       </w:r>
-      <w:bookmarkEnd w:id="11"/>
       <w:bookmarkEnd w:id="12"/>
       <w:bookmarkEnd w:id="13"/>
       <w:bookmarkEnd w:id="14"/>
@@ -1723,6 +1724,8 @@
       <w:bookmarkEnd w:id="17"/>
       <w:bookmarkEnd w:id="18"/>
       <w:bookmarkEnd w:id="19"/>
+      <w:bookmarkEnd w:id="20"/>
+      <w:bookmarkEnd w:id="21"/>
     </w:p>
     <w:p>
       <w:r>
@@ -1834,21 +1837,20 @@
         </w:numPr>
         <w:ind w:left="720"/>
       </w:pPr>
-      <w:bookmarkStart w:id="20" w:name="_Toc183979917"/>
-      <w:bookmarkStart w:id="21" w:name="_Toc216425627"/>
-      <w:bookmarkStart w:id="22" w:name="_Toc216425785"/>
-      <w:bookmarkStart w:id="23" w:name="_Toc222315290"/>
-      <w:bookmarkStart w:id="24" w:name="_Toc223513765"/>
-      <w:bookmarkStart w:id="25" w:name="_Toc226550177"/>
-      <w:bookmarkStart w:id="26" w:name="_Toc226556219"/>
-      <w:bookmarkStart w:id="27" w:name="_Toc230179519"/>
-      <w:bookmarkStart w:id="28" w:name="_Toc230182431"/>
+      <w:bookmarkStart w:id="22" w:name="_Toc183979917"/>
+      <w:bookmarkStart w:id="23" w:name="_Toc216425627"/>
+      <w:bookmarkStart w:id="24" w:name="_Toc216425785"/>
+      <w:bookmarkStart w:id="25" w:name="_Toc222315290"/>
+      <w:bookmarkStart w:id="26" w:name="_Toc223513765"/>
+      <w:bookmarkStart w:id="27" w:name="_Toc226550177"/>
+      <w:bookmarkStart w:id="28" w:name="_Toc226556219"/>
+      <w:bookmarkStart w:id="29" w:name="_Toc230179519"/>
+      <w:bookmarkStart w:id="30" w:name="_Toc230182431"/>
+      <w:bookmarkStart w:id="31" w:name="_Toc230197532"/>
       <w:r>
         <w:lastRenderedPageBreak/>
         <w:t>Klíčová slova</w:t>
       </w:r>
-      <w:bookmarkEnd w:id="20"/>
-      <w:bookmarkEnd w:id="21"/>
       <w:bookmarkEnd w:id="22"/>
       <w:bookmarkEnd w:id="23"/>
       <w:bookmarkEnd w:id="24"/>
@@ -1856,6 +1858,9 @@
       <w:bookmarkEnd w:id="26"/>
       <w:bookmarkEnd w:id="27"/>
       <w:bookmarkEnd w:id="28"/>
+      <w:bookmarkEnd w:id="29"/>
+      <w:bookmarkEnd w:id="30"/>
+      <w:bookmarkEnd w:id="31"/>
     </w:p>
     <w:p>
       <w:r>
@@ -1944,28 +1949,30 @@
         </w:numPr>
         <w:ind w:left="720"/>
       </w:pPr>
-      <w:bookmarkStart w:id="29" w:name="_Toc183979918"/>
-      <w:bookmarkStart w:id="30" w:name="_Toc216425628"/>
-      <w:bookmarkStart w:id="31" w:name="_Toc216425786"/>
-      <w:bookmarkStart w:id="32" w:name="_Toc222315291"/>
-      <w:bookmarkStart w:id="33" w:name="_Toc223513766"/>
-      <w:bookmarkStart w:id="34" w:name="_Toc226550178"/>
-      <w:bookmarkStart w:id="35" w:name="_Toc226556220"/>
-      <w:bookmarkStart w:id="36" w:name="_Toc230179520"/>
-      <w:bookmarkStart w:id="37" w:name="_Toc230182432"/>
+      <w:bookmarkStart w:id="32" w:name="_Toc183979918"/>
+      <w:bookmarkStart w:id="33" w:name="_Toc216425628"/>
+      <w:bookmarkStart w:id="34" w:name="_Toc216425786"/>
+      <w:bookmarkStart w:id="35" w:name="_Toc222315291"/>
+      <w:bookmarkStart w:id="36" w:name="_Toc223513766"/>
+      <w:bookmarkStart w:id="37" w:name="_Toc226550178"/>
+      <w:bookmarkStart w:id="38" w:name="_Toc226556220"/>
+      <w:bookmarkStart w:id="39" w:name="_Toc230179520"/>
+      <w:bookmarkStart w:id="40" w:name="_Toc230182432"/>
+      <w:bookmarkStart w:id="41" w:name="_Toc230197533"/>
       <w:r>
         <w:lastRenderedPageBreak/>
         <w:t>Obsah</w:t>
       </w:r>
-      <w:bookmarkEnd w:id="29"/>
-      <w:bookmarkEnd w:id="30"/>
-      <w:bookmarkEnd w:id="31"/>
       <w:bookmarkEnd w:id="32"/>
       <w:bookmarkEnd w:id="33"/>
       <w:bookmarkEnd w:id="34"/>
       <w:bookmarkEnd w:id="35"/>
       <w:bookmarkEnd w:id="36"/>
       <w:bookmarkEnd w:id="37"/>
+      <w:bookmarkEnd w:id="38"/>
+      <w:bookmarkEnd w:id="39"/>
+      <w:bookmarkEnd w:id="40"/>
+      <w:bookmarkEnd w:id="41"/>
     </w:p>
     <w:sdt>
       <w:sdtPr>
@@ -2004,7 +2011,7 @@
           <w:r>
             <w:fldChar w:fldCharType="separate"/>
           </w:r>
-          <w:hyperlink w:anchor="_Toc230182433" w:history="1">
+          <w:hyperlink w:anchor="_Toc230197534" w:history="1">
             <w:r>
               <w:rPr>
                 <w:rStyle w:val="Hypertextovodkaz"/>
@@ -2031,7 +2038,7 @@
                 <w:noProof/>
                 <w:webHidden/>
               </w:rPr>
-              <w:instrText xml:space="preserve"> PAGEREF _Toc230182433 \h </w:instrText>
+              <w:instrText xml:space="preserve"> PAGEREF _Toc230197534 \h </w:instrText>
             </w:r>
             <w:r>
               <w:rPr>
@@ -2076,7 +2083,7 @@
               <w:lang w:eastAsia="cs-CZ"/>
             </w:rPr>
           </w:pPr>
-          <w:hyperlink w:anchor="_Toc230182434" w:history="1">
+          <w:hyperlink w:anchor="_Toc230197535" w:history="1">
             <w:r>
               <w:rPr>
                 <w:rStyle w:val="Hypertextovodkaz"/>
@@ -2098,7 +2105,7 @@
                 <w:rStyle w:val="Hypertextovodkaz"/>
                 <w:noProof/>
               </w:rPr>
-              <w:t>Teoretická část</w:t>
+              <w:t>Použité nástroje</w:t>
             </w:r>
             <w:r>
               <w:rPr>
@@ -2119,7 +2126,7 @@
                 <w:noProof/>
                 <w:webHidden/>
               </w:rPr>
-              <w:instrText xml:space="preserve"> PAGEREF _Toc230182434 \h </w:instrText>
+              <w:instrText xml:space="preserve"> PAGEREF _Toc230197535 \h </w:instrText>
             </w:r>
             <w:r>
               <w:rPr>
@@ -2164,7 +2171,7 @@
               <w:lang w:eastAsia="cs-CZ"/>
             </w:rPr>
           </w:pPr>
-          <w:hyperlink w:anchor="_Toc230182435" w:history="1">
+          <w:hyperlink w:anchor="_Toc230197536" w:history="1">
             <w:r>
               <w:rPr>
                 <w:rStyle w:val="Hypertextovodkaz"/>
@@ -2207,7 +2214,7 @@
                 <w:noProof/>
                 <w:webHidden/>
               </w:rPr>
-              <w:instrText xml:space="preserve"> PAGEREF _Toc230182435 \h </w:instrText>
+              <w:instrText xml:space="preserve"> PAGEREF _Toc230197536 \h </w:instrText>
             </w:r>
             <w:r>
               <w:rPr>
@@ -2252,7 +2259,7 @@
               <w:lang w:eastAsia="cs-CZ"/>
             </w:rPr>
           </w:pPr>
-          <w:hyperlink w:anchor="_Toc230182436" w:history="1">
+          <w:hyperlink w:anchor="_Toc230197537" w:history="1">
             <w:r>
               <w:rPr>
                 <w:rStyle w:val="Hypertextovodkaz"/>
@@ -2295,7 +2302,7 @@
                 <w:noProof/>
                 <w:webHidden/>
               </w:rPr>
-              <w:instrText xml:space="preserve"> PAGEREF _Toc230182436 \h </w:instrText>
+              <w:instrText xml:space="preserve"> PAGEREF _Toc230197537 \h </w:instrText>
             </w:r>
             <w:r>
               <w:rPr>
@@ -2340,7 +2347,7 @@
               <w:lang w:eastAsia="cs-CZ"/>
             </w:rPr>
           </w:pPr>
-          <w:hyperlink w:anchor="_Toc230182437" w:history="1">
+          <w:hyperlink w:anchor="_Toc230197538" w:history="1">
             <w:r>
               <w:rPr>
                 <w:rStyle w:val="Hypertextovodkaz"/>
@@ -2383,7 +2390,7 @@
                 <w:noProof/>
                 <w:webHidden/>
               </w:rPr>
-              <w:instrText xml:space="preserve"> PAGEREF _Toc230182437 \h </w:instrText>
+              <w:instrText xml:space="preserve"> PAGEREF _Toc230197538 \h </w:instrText>
             </w:r>
             <w:r>
               <w:rPr>
@@ -2428,7 +2435,7 @@
               <w:lang w:eastAsia="cs-CZ"/>
             </w:rPr>
           </w:pPr>
-          <w:hyperlink w:anchor="_Toc230182438" w:history="1">
+          <w:hyperlink w:anchor="_Toc230197539" w:history="1">
             <w:r>
               <w:rPr>
                 <w:rStyle w:val="Hypertextovodkaz"/>
@@ -2471,7 +2478,7 @@
                 <w:noProof/>
                 <w:webHidden/>
               </w:rPr>
-              <w:instrText xml:space="preserve"> PAGEREF _Toc230182438 \h </w:instrText>
+              <w:instrText xml:space="preserve"> PAGEREF _Toc230197539 \h </w:instrText>
             </w:r>
             <w:r>
               <w:rPr>
@@ -2516,7 +2523,7 @@
               <w:lang w:eastAsia="cs-CZ"/>
             </w:rPr>
           </w:pPr>
-          <w:hyperlink w:anchor="_Toc230182439" w:history="1">
+          <w:hyperlink w:anchor="_Toc230197540" w:history="1">
             <w:r>
               <w:rPr>
                 <w:rStyle w:val="Hypertextovodkaz"/>
@@ -2559,7 +2566,7 @@
                 <w:noProof/>
                 <w:webHidden/>
               </w:rPr>
-              <w:instrText xml:space="preserve"> PAGEREF _Toc230182439 \h </w:instrText>
+              <w:instrText xml:space="preserve"> PAGEREF _Toc230197540 \h </w:instrText>
             </w:r>
             <w:r>
               <w:rPr>
@@ -2604,7 +2611,7 @@
               <w:lang w:eastAsia="cs-CZ"/>
             </w:rPr>
           </w:pPr>
-          <w:hyperlink w:anchor="_Toc230182440" w:history="1">
+          <w:hyperlink w:anchor="_Toc230197541" w:history="1">
             <w:r>
               <w:rPr>
                 <w:rStyle w:val="Hypertextovodkaz"/>
@@ -2647,7 +2654,7 @@
                 <w:noProof/>
                 <w:webHidden/>
               </w:rPr>
-              <w:instrText xml:space="preserve"> PAGEREF _Toc230182440 \h </w:instrText>
+              <w:instrText xml:space="preserve"> PAGEREF _Toc230197541 \h </w:instrText>
             </w:r>
             <w:r>
               <w:rPr>
@@ -2667,7 +2674,7 @@
                 <w:noProof/>
                 <w:webHidden/>
               </w:rPr>
-              <w:t>11</w:t>
+              <w:t>10</w:t>
             </w:r>
             <w:r>
               <w:rPr>
@@ -2692,7 +2699,7 @@
               <w:lang w:eastAsia="cs-CZ"/>
             </w:rPr>
           </w:pPr>
-          <w:hyperlink w:anchor="_Toc230182441" w:history="1">
+          <w:hyperlink w:anchor="_Toc230197542" w:history="1">
             <w:r>
               <w:rPr>
                 <w:rStyle w:val="Hypertextovodkaz"/>
@@ -2735,7 +2742,7 @@
                 <w:noProof/>
                 <w:webHidden/>
               </w:rPr>
-              <w:instrText xml:space="preserve"> PAGEREF _Toc230182441 \h </w:instrText>
+              <w:instrText xml:space="preserve"> PAGEREF _Toc230197542 \h </w:instrText>
             </w:r>
             <w:r>
               <w:rPr>
@@ -2780,7 +2787,7 @@
               <w:lang w:eastAsia="cs-CZ"/>
             </w:rPr>
           </w:pPr>
-          <w:hyperlink w:anchor="_Toc230182442" w:history="1">
+          <w:hyperlink w:anchor="_Toc230197543" w:history="1">
             <w:r>
               <w:rPr>
                 <w:rStyle w:val="Hypertextovodkaz"/>
@@ -2823,7 +2830,7 @@
                 <w:noProof/>
                 <w:webHidden/>
               </w:rPr>
-              <w:instrText xml:space="preserve"> PAGEREF _Toc230182442 \h </w:instrText>
+              <w:instrText xml:space="preserve"> PAGEREF _Toc230197543 \h </w:instrText>
             </w:r>
             <w:r>
               <w:rPr>
@@ -2868,7 +2875,7 @@
               <w:lang w:eastAsia="cs-CZ"/>
             </w:rPr>
           </w:pPr>
-          <w:hyperlink w:anchor="_Toc230182443" w:history="1">
+          <w:hyperlink w:anchor="_Toc230197544" w:history="1">
             <w:r>
               <w:rPr>
                 <w:rStyle w:val="Hypertextovodkaz"/>
@@ -2911,7 +2918,7 @@
                 <w:noProof/>
                 <w:webHidden/>
               </w:rPr>
-              <w:instrText xml:space="preserve"> PAGEREF _Toc230182443 \h </w:instrText>
+              <w:instrText xml:space="preserve"> PAGEREF _Toc230197544 \h </w:instrText>
             </w:r>
             <w:r>
               <w:rPr>
@@ -2956,7 +2963,7 @@
               <w:lang w:eastAsia="cs-CZ"/>
             </w:rPr>
           </w:pPr>
-          <w:hyperlink w:anchor="_Toc230182444" w:history="1">
+          <w:hyperlink w:anchor="_Toc230197545" w:history="1">
             <w:r>
               <w:rPr>
                 <w:rStyle w:val="Hypertextovodkaz"/>
@@ -2999,7 +3006,7 @@
                 <w:noProof/>
                 <w:webHidden/>
               </w:rPr>
-              <w:instrText xml:space="preserve"> PAGEREF _Toc230182444 \h </w:instrText>
+              <w:instrText xml:space="preserve"> PAGEREF _Toc230197545 \h </w:instrText>
             </w:r>
             <w:r>
               <w:rPr>
@@ -3044,7 +3051,7 @@
               <w:lang w:eastAsia="cs-CZ"/>
             </w:rPr>
           </w:pPr>
-          <w:hyperlink w:anchor="_Toc230182445" w:history="1">
+          <w:hyperlink w:anchor="_Toc230197546" w:history="1">
             <w:r>
               <w:rPr>
                 <w:rStyle w:val="Hypertextovodkaz"/>
@@ -3087,7 +3094,7 @@
                 <w:noProof/>
                 <w:webHidden/>
               </w:rPr>
-              <w:instrText xml:space="preserve"> PAGEREF _Toc230182445 \h </w:instrText>
+              <w:instrText xml:space="preserve"> PAGEREF _Toc230197546 \h </w:instrText>
             </w:r>
             <w:r>
               <w:rPr>
@@ -3132,7 +3139,7 @@
               <w:lang w:eastAsia="cs-CZ"/>
             </w:rPr>
           </w:pPr>
-          <w:hyperlink w:anchor="_Toc230182446" w:history="1">
+          <w:hyperlink w:anchor="_Toc230197547" w:history="1">
             <w:r>
               <w:rPr>
                 <w:rStyle w:val="Hypertextovodkaz"/>
@@ -3175,7 +3182,7 @@
                 <w:noProof/>
                 <w:webHidden/>
               </w:rPr>
-              <w:instrText xml:space="preserve"> PAGEREF _Toc230182446 \h </w:instrText>
+              <w:instrText xml:space="preserve"> PAGEREF _Toc230197547 \h </w:instrText>
             </w:r>
             <w:r>
               <w:rPr>
@@ -3220,7 +3227,7 @@
               <w:lang w:eastAsia="cs-CZ"/>
             </w:rPr>
           </w:pPr>
-          <w:hyperlink w:anchor="_Toc230182447" w:history="1">
+          <w:hyperlink w:anchor="_Toc230197548" w:history="1">
             <w:r>
               <w:rPr>
                 <w:rStyle w:val="Hypertextovodkaz"/>
@@ -3263,7 +3270,7 @@
                 <w:noProof/>
                 <w:webHidden/>
               </w:rPr>
-              <w:instrText xml:space="preserve"> PAGEREF _Toc230182447 \h </w:instrText>
+              <w:instrText xml:space="preserve"> PAGEREF _Toc230197548 \h </w:instrText>
             </w:r>
             <w:r>
               <w:rPr>
@@ -3308,7 +3315,7 @@
               <w:lang w:eastAsia="cs-CZ"/>
             </w:rPr>
           </w:pPr>
-          <w:hyperlink w:anchor="_Toc230182448" w:history="1">
+          <w:hyperlink w:anchor="_Toc230197549" w:history="1">
             <w:r>
               <w:rPr>
                 <w:rStyle w:val="Hypertextovodkaz"/>
@@ -3351,7 +3358,7 @@
                 <w:noProof/>
                 <w:webHidden/>
               </w:rPr>
-              <w:instrText xml:space="preserve"> PAGEREF _Toc230182448 \h </w:instrText>
+              <w:instrText xml:space="preserve"> PAGEREF _Toc230197549 \h </w:instrText>
             </w:r>
             <w:r>
               <w:rPr>
@@ -3396,7 +3403,7 @@
               <w:lang w:eastAsia="cs-CZ"/>
             </w:rPr>
           </w:pPr>
-          <w:hyperlink w:anchor="_Toc230182449" w:history="1">
+          <w:hyperlink w:anchor="_Toc230197550" w:history="1">
             <w:r>
               <w:rPr>
                 <w:rStyle w:val="Hypertextovodkaz"/>
@@ -3439,7 +3446,7 @@
                 <w:noProof/>
                 <w:webHidden/>
               </w:rPr>
-              <w:instrText xml:space="preserve"> PAGEREF _Toc230182449 \h </w:instrText>
+              <w:instrText xml:space="preserve"> PAGEREF _Toc230197550 \h </w:instrText>
             </w:r>
             <w:r>
               <w:rPr>
@@ -3459,7 +3466,7 @@
                 <w:noProof/>
                 <w:webHidden/>
               </w:rPr>
-              <w:t>13</w:t>
+              <w:t>12</w:t>
             </w:r>
             <w:r>
               <w:rPr>
@@ -3484,7 +3491,7 @@
               <w:lang w:eastAsia="cs-CZ"/>
             </w:rPr>
           </w:pPr>
-          <w:hyperlink w:anchor="_Toc230182450" w:history="1">
+          <w:hyperlink w:anchor="_Toc230197551" w:history="1">
             <w:r>
               <w:rPr>
                 <w:rStyle w:val="Hypertextovodkaz"/>
@@ -3527,7 +3534,7 @@
                 <w:noProof/>
                 <w:webHidden/>
               </w:rPr>
-              <w:instrText xml:space="preserve"> PAGEREF _Toc230182450 \h </w:instrText>
+              <w:instrText xml:space="preserve"> PAGEREF _Toc230197551 \h </w:instrText>
             </w:r>
             <w:r>
               <w:rPr>
@@ -3572,7 +3579,7 @@
               <w:lang w:eastAsia="cs-CZ"/>
             </w:rPr>
           </w:pPr>
-          <w:hyperlink w:anchor="_Toc230182451" w:history="1">
+          <w:hyperlink w:anchor="_Toc230197552" w:history="1">
             <w:r>
               <w:rPr>
                 <w:rStyle w:val="Hypertextovodkaz"/>
@@ -3615,7 +3622,7 @@
                 <w:noProof/>
                 <w:webHidden/>
               </w:rPr>
-              <w:instrText xml:space="preserve"> PAGEREF _Toc230182451 \h </w:instrText>
+              <w:instrText xml:space="preserve"> PAGEREF _Toc230197552 \h </w:instrText>
             </w:r>
             <w:r>
               <w:rPr>
@@ -3660,7 +3667,7 @@
               <w:lang w:eastAsia="cs-CZ"/>
             </w:rPr>
           </w:pPr>
-          <w:hyperlink w:anchor="_Toc230182452" w:history="1">
+          <w:hyperlink w:anchor="_Toc230197553" w:history="1">
             <w:r>
               <w:rPr>
                 <w:rStyle w:val="Hypertextovodkaz"/>
@@ -3703,7 +3710,7 @@
                 <w:noProof/>
                 <w:webHidden/>
               </w:rPr>
-              <w:instrText xml:space="preserve"> PAGEREF _Toc230182452 \h </w:instrText>
+              <w:instrText xml:space="preserve"> PAGEREF _Toc230197553 \h </w:instrText>
             </w:r>
             <w:r>
               <w:rPr>
@@ -3748,7 +3755,7 @@
               <w:lang w:eastAsia="cs-CZ"/>
             </w:rPr>
           </w:pPr>
-          <w:hyperlink w:anchor="_Toc230182453" w:history="1">
+          <w:hyperlink w:anchor="_Toc230197554" w:history="1">
             <w:r>
               <w:rPr>
                 <w:rStyle w:val="Hypertextovodkaz"/>
@@ -3791,7 +3798,7 @@
                 <w:noProof/>
                 <w:webHidden/>
               </w:rPr>
-              <w:instrText xml:space="preserve"> PAGEREF _Toc230182453 \h </w:instrText>
+              <w:instrText xml:space="preserve"> PAGEREF _Toc230197554 \h </w:instrText>
             </w:r>
             <w:r>
               <w:rPr>
@@ -3836,7 +3843,7 @@
               <w:lang w:eastAsia="cs-CZ"/>
             </w:rPr>
           </w:pPr>
-          <w:hyperlink w:anchor="_Toc230182454" w:history="1">
+          <w:hyperlink w:anchor="_Toc230197555" w:history="1">
             <w:r>
               <w:rPr>
                 <w:rStyle w:val="Hypertextovodkaz"/>
@@ -3858,7 +3865,7 @@
                 <w:rStyle w:val="Hypertextovodkaz"/>
                 <w:noProof/>
               </w:rPr>
-              <w:t>Praktická část</w:t>
+              <w:t>Tvorba Aplikace</w:t>
             </w:r>
             <w:r>
               <w:rPr>
@@ -3879,7 +3886,7 @@
                 <w:noProof/>
                 <w:webHidden/>
               </w:rPr>
-              <w:instrText xml:space="preserve"> PAGEREF _Toc230182454 \h </w:instrText>
+              <w:instrText xml:space="preserve"> PAGEREF _Toc230197555 \h </w:instrText>
             </w:r>
             <w:r>
               <w:rPr>
@@ -3924,7 +3931,7 @@
               <w:lang w:eastAsia="cs-CZ"/>
             </w:rPr>
           </w:pPr>
-          <w:hyperlink w:anchor="_Toc230182455" w:history="1">
+          <w:hyperlink w:anchor="_Toc230197556" w:history="1">
             <w:r>
               <w:rPr>
                 <w:rStyle w:val="Hypertextovodkaz"/>
@@ -3967,7 +3974,7 @@
                 <w:noProof/>
                 <w:webHidden/>
               </w:rPr>
-              <w:instrText xml:space="preserve"> PAGEREF _Toc230182455 \h </w:instrText>
+              <w:instrText xml:space="preserve"> PAGEREF _Toc230197556 \h </w:instrText>
             </w:r>
             <w:r>
               <w:rPr>
@@ -4012,7 +4019,7 @@
               <w:lang w:eastAsia="cs-CZ"/>
             </w:rPr>
           </w:pPr>
-          <w:hyperlink w:anchor="_Toc230182456" w:history="1">
+          <w:hyperlink w:anchor="_Toc230197557" w:history="1">
             <w:r>
               <w:rPr>
                 <w:rStyle w:val="Hypertextovodkaz"/>
@@ -4055,7 +4062,7 @@
                 <w:noProof/>
                 <w:webHidden/>
               </w:rPr>
-              <w:instrText xml:space="preserve"> PAGEREF _Toc230182456 \h </w:instrText>
+              <w:instrText xml:space="preserve"> PAGEREF _Toc230197557 \h </w:instrText>
             </w:r>
             <w:r>
               <w:rPr>
@@ -4100,7 +4107,7 @@
               <w:lang w:eastAsia="cs-CZ"/>
             </w:rPr>
           </w:pPr>
-          <w:hyperlink w:anchor="_Toc230182457" w:history="1">
+          <w:hyperlink w:anchor="_Toc230197558" w:history="1">
             <w:r>
               <w:rPr>
                 <w:rStyle w:val="Hypertextovodkaz"/>
@@ -4143,7 +4150,7 @@
                 <w:noProof/>
                 <w:webHidden/>
               </w:rPr>
-              <w:instrText xml:space="preserve"> PAGEREF _Toc230182457 \h </w:instrText>
+              <w:instrText xml:space="preserve"> PAGEREF _Toc230197558 \h </w:instrText>
             </w:r>
             <w:r>
               <w:rPr>
@@ -4188,7 +4195,7 @@
               <w:lang w:eastAsia="cs-CZ"/>
             </w:rPr>
           </w:pPr>
-          <w:hyperlink w:anchor="_Toc230182458" w:history="1">
+          <w:hyperlink w:anchor="_Toc230197559" w:history="1">
             <w:r>
               <w:rPr>
                 <w:rStyle w:val="Hypertextovodkaz"/>
@@ -4231,7 +4238,7 @@
                 <w:noProof/>
                 <w:webHidden/>
               </w:rPr>
-              <w:instrText xml:space="preserve"> PAGEREF _Toc230182458 \h </w:instrText>
+              <w:instrText xml:space="preserve"> PAGEREF _Toc230197559 \h </w:instrText>
             </w:r>
             <w:r>
               <w:rPr>
@@ -4276,7 +4283,7 @@
               <w:lang w:eastAsia="cs-CZ"/>
             </w:rPr>
           </w:pPr>
-          <w:hyperlink w:anchor="_Toc230182459" w:history="1">
+          <w:hyperlink w:anchor="_Toc230197560" w:history="1">
             <w:r>
               <w:rPr>
                 <w:rStyle w:val="Hypertextovodkaz"/>
@@ -4319,7 +4326,7 @@
                 <w:noProof/>
                 <w:webHidden/>
               </w:rPr>
-              <w:instrText xml:space="preserve"> PAGEREF _Toc230182459 \h </w:instrText>
+              <w:instrText xml:space="preserve"> PAGEREF _Toc230197560 \h </w:instrText>
             </w:r>
             <w:r>
               <w:rPr>
@@ -4364,7 +4371,7 @@
               <w:lang w:eastAsia="cs-CZ"/>
             </w:rPr>
           </w:pPr>
-          <w:hyperlink w:anchor="_Toc230182460" w:history="1">
+          <w:hyperlink w:anchor="_Toc230197561" w:history="1">
             <w:r>
               <w:rPr>
                 <w:rStyle w:val="Hypertextovodkaz"/>
@@ -4407,7 +4414,7 @@
                 <w:noProof/>
                 <w:webHidden/>
               </w:rPr>
-              <w:instrText xml:space="preserve"> PAGEREF _Toc230182460 \h </w:instrText>
+              <w:instrText xml:space="preserve"> PAGEREF _Toc230197561 \h </w:instrText>
             </w:r>
             <w:r>
               <w:rPr>
@@ -4452,7 +4459,7 @@
               <w:lang w:eastAsia="cs-CZ"/>
             </w:rPr>
           </w:pPr>
-          <w:hyperlink w:anchor="_Toc230182461" w:history="1">
+          <w:hyperlink w:anchor="_Toc230197562" w:history="1">
             <w:r>
               <w:rPr>
                 <w:rStyle w:val="Hypertextovodkaz"/>
@@ -4495,7 +4502,7 @@
                 <w:noProof/>
                 <w:webHidden/>
               </w:rPr>
-              <w:instrText xml:space="preserve"> PAGEREF _Toc230182461 \h </w:instrText>
+              <w:instrText xml:space="preserve"> PAGEREF _Toc230197562 \h </w:instrText>
             </w:r>
             <w:r>
               <w:rPr>
@@ -4540,7 +4547,7 @@
               <w:lang w:eastAsia="cs-CZ"/>
             </w:rPr>
           </w:pPr>
-          <w:hyperlink w:anchor="_Toc230182462" w:history="1">
+          <w:hyperlink w:anchor="_Toc230197563" w:history="1">
             <w:r>
               <w:rPr>
                 <w:rStyle w:val="Hypertextovodkaz"/>
@@ -4583,7 +4590,7 @@
                 <w:noProof/>
                 <w:webHidden/>
               </w:rPr>
-              <w:instrText xml:space="preserve"> PAGEREF _Toc230182462 \h </w:instrText>
+              <w:instrText xml:space="preserve"> PAGEREF _Toc230197563 \h </w:instrText>
             </w:r>
             <w:r>
               <w:rPr>
@@ -4628,7 +4635,7 @@
               <w:lang w:eastAsia="cs-CZ"/>
             </w:rPr>
           </w:pPr>
-          <w:hyperlink w:anchor="_Toc230182463" w:history="1">
+          <w:hyperlink w:anchor="_Toc230197564" w:history="1">
             <w:r>
               <w:rPr>
                 <w:rStyle w:val="Hypertextovodkaz"/>
@@ -4671,7 +4678,7 @@
                 <w:noProof/>
                 <w:webHidden/>
               </w:rPr>
-              <w:instrText xml:space="preserve"> PAGEREF _Toc230182463 \h </w:instrText>
+              <w:instrText xml:space="preserve"> PAGEREF _Toc230197564 \h </w:instrText>
             </w:r>
             <w:r>
               <w:rPr>
@@ -4716,7 +4723,7 @@
               <w:lang w:eastAsia="cs-CZ"/>
             </w:rPr>
           </w:pPr>
-          <w:hyperlink w:anchor="_Toc230182464" w:history="1">
+          <w:hyperlink w:anchor="_Toc230197565" w:history="1">
             <w:r>
               <w:rPr>
                 <w:rStyle w:val="Hypertextovodkaz"/>
@@ -4759,7 +4766,7 @@
                 <w:noProof/>
                 <w:webHidden/>
               </w:rPr>
-              <w:instrText xml:space="preserve"> PAGEREF _Toc230182464 \h </w:instrText>
+              <w:instrText xml:space="preserve"> PAGEREF _Toc230197565 \h </w:instrText>
             </w:r>
             <w:r>
               <w:rPr>
@@ -4804,7 +4811,7 @@
               <w:lang w:eastAsia="cs-CZ"/>
             </w:rPr>
           </w:pPr>
-          <w:hyperlink w:anchor="_Toc230182465" w:history="1">
+          <w:hyperlink w:anchor="_Toc230197566" w:history="1">
             <w:r>
               <w:rPr>
                 <w:rStyle w:val="Hypertextovodkaz"/>
@@ -4847,7 +4854,7 @@
                 <w:noProof/>
                 <w:webHidden/>
               </w:rPr>
-              <w:instrText xml:space="preserve"> PAGEREF _Toc230182465 \h </w:instrText>
+              <w:instrText xml:space="preserve"> PAGEREF _Toc230197566 \h </w:instrText>
             </w:r>
             <w:r>
               <w:rPr>
@@ -4892,7 +4899,7 @@
               <w:lang w:eastAsia="cs-CZ"/>
             </w:rPr>
           </w:pPr>
-          <w:hyperlink w:anchor="_Toc230182466" w:history="1">
+          <w:hyperlink w:anchor="_Toc230197567" w:history="1">
             <w:r>
               <w:rPr>
                 <w:rStyle w:val="Hypertextovodkaz"/>
@@ -4935,7 +4942,7 @@
                 <w:noProof/>
                 <w:webHidden/>
               </w:rPr>
-              <w:instrText xml:space="preserve"> PAGEREF _Toc230182466 \h </w:instrText>
+              <w:instrText xml:space="preserve"> PAGEREF _Toc230197567 \h </w:instrText>
             </w:r>
             <w:r>
               <w:rPr>
@@ -4980,7 +4987,7 @@
               <w:lang w:eastAsia="cs-CZ"/>
             </w:rPr>
           </w:pPr>
-          <w:hyperlink w:anchor="_Toc230182467" w:history="1">
+          <w:hyperlink w:anchor="_Toc230197568" w:history="1">
             <w:r>
               <w:rPr>
                 <w:rStyle w:val="Hypertextovodkaz"/>
@@ -5023,7 +5030,7 @@
                 <w:noProof/>
                 <w:webHidden/>
               </w:rPr>
-              <w:instrText xml:space="preserve"> PAGEREF _Toc230182467 \h </w:instrText>
+              <w:instrText xml:space="preserve"> PAGEREF _Toc230197568 \h </w:instrText>
             </w:r>
             <w:r>
               <w:rPr>
@@ -5068,7 +5075,7 @@
               <w:lang w:eastAsia="cs-CZ"/>
             </w:rPr>
           </w:pPr>
-          <w:hyperlink w:anchor="_Toc230182468" w:history="1">
+          <w:hyperlink w:anchor="_Toc230197569" w:history="1">
             <w:r>
               <w:rPr>
                 <w:rStyle w:val="Hypertextovodkaz"/>
@@ -5111,7 +5118,7 @@
                 <w:noProof/>
                 <w:webHidden/>
               </w:rPr>
-              <w:instrText xml:space="preserve"> PAGEREF _Toc230182468 \h </w:instrText>
+              <w:instrText xml:space="preserve"> PAGEREF _Toc230197569 \h </w:instrText>
             </w:r>
             <w:r>
               <w:rPr>
@@ -5156,7 +5163,7 @@
               <w:lang w:eastAsia="cs-CZ"/>
             </w:rPr>
           </w:pPr>
-          <w:hyperlink w:anchor="_Toc230182469" w:history="1">
+          <w:hyperlink w:anchor="_Toc230197570" w:history="1">
             <w:r>
               <w:rPr>
                 <w:rStyle w:val="Hypertextovodkaz"/>
@@ -5199,7 +5206,7 @@
                 <w:noProof/>
                 <w:webHidden/>
               </w:rPr>
-              <w:instrText xml:space="preserve"> PAGEREF _Toc230182469 \h </w:instrText>
+              <w:instrText xml:space="preserve"> PAGEREF _Toc230197570 \h </w:instrText>
             </w:r>
             <w:r>
               <w:rPr>
@@ -5243,7 +5250,7 @@
               <w:lang w:eastAsia="cs-CZ"/>
             </w:rPr>
           </w:pPr>
-          <w:hyperlink w:anchor="_Toc230182470" w:history="1">
+          <w:hyperlink w:anchor="_Toc230197571" w:history="1">
             <w:r>
               <w:rPr>
                 <w:rStyle w:val="Hypertextovodkaz"/>
@@ -5270,7 +5277,7 @@
                 <w:noProof/>
                 <w:webHidden/>
               </w:rPr>
-              <w:instrText xml:space="preserve"> PAGEREF _Toc230182470 \h </w:instrText>
+              <w:instrText xml:space="preserve"> PAGEREF _Toc230197571 \h </w:instrText>
             </w:r>
             <w:r>
               <w:rPr>
@@ -5314,7 +5321,7 @@
               <w:lang w:eastAsia="cs-CZ"/>
             </w:rPr>
           </w:pPr>
-          <w:hyperlink w:anchor="_Toc230182471" w:history="1">
+          <w:hyperlink w:anchor="_Toc230197572" w:history="1">
             <w:r>
               <w:rPr>
                 <w:rStyle w:val="Hypertextovodkaz"/>
@@ -5341,7 +5348,7 @@
                 <w:noProof/>
                 <w:webHidden/>
               </w:rPr>
-              <w:instrText xml:space="preserve"> PAGEREF _Toc230182471 \h </w:instrText>
+              <w:instrText xml:space="preserve"> PAGEREF _Toc230197572 \h </w:instrText>
             </w:r>
             <w:r>
               <w:rPr>
@@ -5385,7 +5392,7 @@
               <w:lang w:eastAsia="cs-CZ"/>
             </w:rPr>
           </w:pPr>
-          <w:hyperlink w:anchor="_Toc230182472" w:history="1">
+          <w:hyperlink w:anchor="_Toc230197573" w:history="1">
             <w:r>
               <w:rPr>
                 <w:rStyle w:val="Hypertextovodkaz"/>
@@ -5412,7 +5419,7 @@
                 <w:noProof/>
                 <w:webHidden/>
               </w:rPr>
-              <w:instrText xml:space="preserve"> PAGEREF _Toc230182472 \h </w:instrText>
+              <w:instrText xml:space="preserve"> PAGEREF _Toc230197573 \h </w:instrText>
             </w:r>
             <w:r>
               <w:rPr>
@@ -5456,7 +5463,7 @@
               <w:lang w:eastAsia="cs-CZ"/>
             </w:rPr>
           </w:pPr>
-          <w:hyperlink w:anchor="_Toc230182473" w:history="1">
+          <w:hyperlink w:anchor="_Toc230197574" w:history="1">
             <w:r>
               <w:rPr>
                 <w:rStyle w:val="Hypertextovodkaz"/>
@@ -5483,7 +5490,7 @@
                 <w:noProof/>
                 <w:webHidden/>
               </w:rPr>
-              <w:instrText xml:space="preserve"> PAGEREF _Toc230182473 \h </w:instrText>
+              <w:instrText xml:space="preserve"> PAGEREF _Toc230197574 \h </w:instrText>
             </w:r>
             <w:r>
               <w:rPr>
@@ -5555,12 +5562,12 @@
         </w:numPr>
         <w:ind w:left="720"/>
       </w:pPr>
-      <w:bookmarkStart w:id="38" w:name="_Toc230182433"/>
+      <w:bookmarkStart w:id="42" w:name="_Toc230197534"/>
       <w:r>
         <w:lastRenderedPageBreak/>
         <w:t>Úvod</w:t>
       </w:r>
-      <w:bookmarkEnd w:id="38"/>
+      <w:bookmarkEnd w:id="42"/>
     </w:p>
     <w:p>
       <w:r>
@@ -5646,32 +5653,18 @@
       <w:pPr>
         <w:pStyle w:val="Nadpis1"/>
       </w:pPr>
-      <w:bookmarkStart w:id="39" w:name="_Toc230182434"/>
+      <w:bookmarkStart w:id="43" w:name="_Toc230197535"/>
       <w:r>
         <w:lastRenderedPageBreak/>
-        <w:t>Teoretická čás</w:t>
-      </w:r>
-      <w:r>
-        <w:t>t</w:t>
-      </w:r>
-      <w:bookmarkEnd w:id="39"/>
-    </w:p>
-    <w:p>
-      <w:r>
-        <w:t xml:space="preserve">V této části dokumentu bych vás (čtenáře) chtěl seznámit s nejpodstatnějšími částmi softwaru, programovacího jazyku atp., které byly využity pro vývoj a samostatné vytvoření </w:t>
-      </w:r>
-      <w:r>
-        <w:t>Habit-Tracker</w:t>
-      </w:r>
-      <w:r>
-        <w:t xml:space="preserve"> aplikace</w:t>
-      </w:r>
+        <w:t>Použité nástroje</w:t>
+      </w:r>
+      <w:bookmarkEnd w:id="43"/>
     </w:p>
     <w:p>
       <w:pPr>
         <w:pStyle w:val="Nadpis2"/>
       </w:pPr>
-      <w:bookmarkStart w:id="40" w:name="_Toc230182435"/>
+      <w:bookmarkStart w:id="44" w:name="_Toc230197536"/>
       <w:proofErr w:type="spellStart"/>
       <w:r>
         <w:t>Visual</w:t>
@@ -5684,48 +5677,8 @@
       <w:r>
         <w:t>Code</w:t>
       </w:r>
-      <w:bookmarkEnd w:id="40"/>
+      <w:bookmarkEnd w:id="44"/>
       <w:proofErr w:type="spellEnd"/>
-    </w:p>
-    <w:p>
-      <w:pPr>
-        <w:rPr>
-          <w:rFonts w:ascii="Cambria" w:eastAsiaTheme="majorEastAsia" w:hAnsi="Cambria" w:cstheme="majorBidi"/>
-          <w:b/>
-          <w:bCs/>
-          <w:sz w:val="24"/>
-          <w:szCs w:val="28"/>
-        </w:rPr>
-      </w:pPr>
-      <w:r>
-        <w:t xml:space="preserve">Pro vývoj této webové aplikace jsem zvolil </w:t>
-      </w:r>
-      <w:proofErr w:type="spellStart"/>
-      <w:r>
-        <w:t>Visual</w:t>
-      </w:r>
-      <w:proofErr w:type="spellEnd"/>
-      <w:r>
-        <w:t xml:space="preserve"> Studio </w:t>
-      </w:r>
-      <w:proofErr w:type="spellStart"/>
-      <w:r>
-        <w:t>Code</w:t>
-      </w:r>
-      <w:proofErr w:type="spellEnd"/>
-      <w:r>
-        <w:t xml:space="preserve"> jako své vývojové prostředí (IDE) od společnosti Microsoft. Považuji toto prostředí za svoje „standardní“ řešení, protože mi v něm jde práce nejrychleji a zároveň v něm mám všechno, co při vývoji potřebuji, na jednom místě.</w:t>
-      </w:r>
-    </w:p>
-    <w:p>
-      <w:pPr>
-        <w:pStyle w:val="Nadpis3"/>
-      </w:pPr>
-      <w:bookmarkStart w:id="41" w:name="_Toc230182436"/>
-      <w:r>
-        <w:t>Školní zkušenost</w:t>
-      </w:r>
-      <w:bookmarkEnd w:id="41"/>
     </w:p>
     <w:p>
       <w:pPr>
@@ -5734,8 +5687,9 @@
           <w:sz w:val="24"/>
         </w:rPr>
       </w:pPr>
-      <w:r>
-        <w:t xml:space="preserve">Prvním z důvodů pro vybrání </w:t>
+      <w:bookmarkStart w:id="45" w:name="_Toc230197537"/>
+      <w:r>
+        <w:t xml:space="preserve">Pro vývoj této webové aplikace jsem zvolil </w:t>
       </w:r>
       <w:proofErr w:type="spellStart"/>
       <w:r>
@@ -5743,24 +5697,25 @@
       </w:r>
       <w:proofErr w:type="spellEnd"/>
       <w:r>
-        <w:t xml:space="preserve"> Studio Codu je, že s jinými vývojovými nástroji nemám až takové zkušenosti jako právě s tímto. Na naší škole se většina práce s kódem dělá právě v tomto IDE, takže jsem si postupně osvojil jeho ovládání, práci s projektem, </w:t>
-      </w:r>
-      <w:r>
-        <w:t>ladění,</w:t>
-      </w:r>
-      <w:r>
-        <w:t xml:space="preserve"> a hlavně i to, jak v něm pracovat „běžně“, aniž bych pořád musel hledat, kde se jaká možnost nachází. To u ročníkové práce pomáhá hodně, protože když se člověk soustředí hlavně na samotnou aplikaci, nechce ztrácet čas tím, že se učí nové IDE nebo nové nastavení.</w:t>
+        <w:t xml:space="preserve"> Studio </w:t>
+      </w:r>
+      <w:proofErr w:type="spellStart"/>
+      <w:r>
+        <w:t>Code</w:t>
+      </w:r>
+      <w:proofErr w:type="spellEnd"/>
+      <w:r>
+        <w:t xml:space="preserve"> jako své vývojové prostředí (IDE) od společnosti Microsoft. Považuji toto prostředí za svoje „standardní" řešení, protože mi v něm jde práce nejrychleji a zároveň v něm mám všechno, co při vývoji potřebuji, na jednom místě.</w:t>
       </w:r>
     </w:p>
     <w:p>
       <w:pPr>
         <w:pStyle w:val="Nadpis3"/>
       </w:pPr>
-      <w:bookmarkStart w:id="42" w:name="_Toc230182437"/>
-      <w:r>
-        <w:t>Integrovaný terminál</w:t>
-      </w:r>
-      <w:bookmarkEnd w:id="42"/>
+      <w:r>
+        <w:t>Školní zkušenost</w:t>
+      </w:r>
+      <w:bookmarkEnd w:id="45"/>
     </w:p>
     <w:p>
       <w:pPr>
@@ -5769,8 +5724,9 @@
           <w:sz w:val="24"/>
         </w:rPr>
       </w:pPr>
-      <w:r>
-        <w:t xml:space="preserve">Dalším důvodem pro využívání </w:t>
+      <w:bookmarkStart w:id="46" w:name="_Toc230197538"/>
+      <w:r>
+        <w:t xml:space="preserve">Prvním z důvodů pro vybrání </w:t>
       </w:r>
       <w:proofErr w:type="spellStart"/>
       <w:r>
@@ -5778,34 +5734,17 @@
       </w:r>
       <w:proofErr w:type="spellEnd"/>
       <w:r>
-        <w:t xml:space="preserve"> Studio </w:t>
-      </w:r>
-      <w:proofErr w:type="spellStart"/>
-      <w:r>
-        <w:t>Code</w:t>
-      </w:r>
-      <w:proofErr w:type="spellEnd"/>
-      <w:r>
-        <w:t xml:space="preserve"> je integrovaný terminál, který mi umožňuje spouštět Angular CLI příkazy přímo z editoru bez nutnosti otevírat si samostatné okno příkazového řádku. Tímto způsobem mám vše na jednom místě – kód, editor a terminál – což výrazně zrychluje pracovní tok a zvyšuje produktivitu během vývoje. Nemusím si tedy neustále přepínat mezi různými okny a aplikacemi, což je obzvláště užitečné při práci na ročníkové práci, kde je čas velmi cenný.</w:t>
+        <w:t xml:space="preserve"> Studio Codu je, že s jinými vývojovými nástroji nemám až takové zkušenosti jako právě s tímto. Na naší škole se většina práce s kódem dělá právě v tomto IDE, takže jsem si postupně osvojil jeho ovládání, práci s projektem, ladění, a hlavně i to, jak v něm pracovat „běžně", aniž bych pořád musel hledat, kde se jaká možnost nachází. To u ročníkové práce pomáhá hodně, protože když se člověk soustředí hlavně na samotnou aplikaci, nechce ztrácet čas tím, že se učí nové IDE nebo nové nastavení.</w:t>
       </w:r>
     </w:p>
     <w:p>
       <w:pPr>
         <w:pStyle w:val="Nadpis3"/>
       </w:pPr>
-      <w:bookmarkStart w:id="43" w:name="_Toc230182438"/>
-      <w:r>
-        <w:t>Rozšíření prostředí (</w:t>
-      </w:r>
-      <w:proofErr w:type="spellStart"/>
-      <w:r>
-        <w:t>Extensions</w:t>
-      </w:r>
-      <w:proofErr w:type="spellEnd"/>
-      <w:r>
-        <w:t>)</w:t>
-      </w:r>
-      <w:bookmarkEnd w:id="43"/>
+      <w:r>
+        <w:t>Integrovaný terminál</w:t>
+      </w:r>
+      <w:bookmarkEnd w:id="46"/>
     </w:p>
     <w:p>
       <w:pPr>
@@ -5814,59 +5753,43 @@
           <w:sz w:val="24"/>
         </w:rPr>
       </w:pPr>
-      <w:r>
-        <w:t xml:space="preserve">Teoreticky by šlo vytvořit aplikaci i bez nich, ale práce jako taková by byla zbytečně těžší a mnohem pomalejší. </w:t>
+      <w:bookmarkStart w:id="47" w:name="_Toc230197539"/>
+      <w:r>
+        <w:t xml:space="preserve">Dalším důvodem pro využívání </w:t>
       </w:r>
       <w:proofErr w:type="spellStart"/>
       <w:r>
+        <w:t>Visual</w:t>
+      </w:r>
+      <w:proofErr w:type="spellEnd"/>
+      <w:r>
+        <w:t xml:space="preserve"> Studio </w:t>
+      </w:r>
+      <w:proofErr w:type="spellStart"/>
+      <w:r>
+        <w:t>Code</w:t>
+      </w:r>
+      <w:proofErr w:type="spellEnd"/>
+      <w:r>
+        <w:t xml:space="preserve"> je integrovaný terminál, který mi umožňuje spouštět Angular CLI příkazy přímo z editoru bez nutnosti otevírat si samostatné okno příkazového řádku. Tímto způsobem mám vše na jednom místě – kód, editor a terminál – což výrazně zrychluje pracovní tok a zvyšuje produktivitu během vývoje. Nemusím si tedy neustále přepínat mezi různými okny a aplikacemi, což je obzvláště užitečné při práci na ročníkové práci, kde je čas velmi cenný.</w:t>
+      </w:r>
+    </w:p>
+    <w:p>
+      <w:pPr>
+        <w:pStyle w:val="Nadpis3"/>
+      </w:pPr>
+      <w:r>
+        <w:t>Rozšíření prostředí (</w:t>
+      </w:r>
+      <w:proofErr w:type="spellStart"/>
+      <w:r>
         <w:t>Extensions</w:t>
       </w:r>
       <w:proofErr w:type="spellEnd"/>
       <w:r>
-        <w:t xml:space="preserve"> mi hlavně pomáhají se psaním a úpravami kódu. U tohoto projektu jsem například ocenil Angular </w:t>
-      </w:r>
-      <w:proofErr w:type="spellStart"/>
-      <w:r>
-        <w:t>Language</w:t>
-      </w:r>
-      <w:proofErr w:type="spellEnd"/>
-      <w:r>
-        <w:t xml:space="preserve"> </w:t>
-      </w:r>
-      <w:proofErr w:type="spellStart"/>
-      <w:r>
-        <w:t>Service</w:t>
-      </w:r>
-      <w:proofErr w:type="spellEnd"/>
-      <w:r>
-        <w:t xml:space="preserve">, který poskytuje nápovědy a pomáhá s orientací v </w:t>
-      </w:r>
-      <w:proofErr w:type="spellStart"/>
-      <w:r>
-        <w:t>TypeScriptu</w:t>
-      </w:r>
-      <w:proofErr w:type="spellEnd"/>
-      <w:r>
-        <w:t xml:space="preserve"> a Angular struktuře. Další rozšíření používám kvůli formátování (typicky </w:t>
-      </w:r>
-      <w:proofErr w:type="spellStart"/>
-      <w:r>
-        <w:t>Prettier</w:t>
-      </w:r>
-      <w:proofErr w:type="spellEnd"/>
-      <w:r>
-        <w:t>), aby byl kód přehledný a sjednocený. Díky tomu nemusím řešit drobné mezery, odsazení nebo styl kódu pokaždé ručně a celý projekt vypadá konzistentně.</w:t>
-      </w:r>
-    </w:p>
-    <w:p>
-      <w:pPr>
-        <w:pStyle w:val="Nadpis3"/>
-      </w:pPr>
-      <w:bookmarkStart w:id="44" w:name="_Toc230182439"/>
-      <w:r>
-        <w:t>Git podpora</w:t>
-      </w:r>
-      <w:bookmarkEnd w:id="44"/>
+        <w:t>)</w:t>
+      </w:r>
+      <w:bookmarkEnd w:id="47"/>
     </w:p>
     <w:p>
       <w:pPr>
@@ -5875,97 +5798,59 @@
           <w:sz w:val="24"/>
         </w:rPr>
       </w:pPr>
-      <w:r>
-        <w:t xml:space="preserve">V neposlední řadě je tu Git podpora přímo v editoru. U ročníkové práce je to dost důležité, protože jsem průběžně experimentoval – někdy něco napadne a zkusí to, někdy se něco nepovede nebo se narazí na problém, který nejde vůbec vyřešit. Kdybych neměl průběžné verze, tak by se mi hůř vracelo zpátky k předchozím změnám. </w:t>
+      <w:bookmarkStart w:id="48" w:name="_Toc230197540"/>
+      <w:r>
+        <w:t xml:space="preserve">Teoreticky by šlo vytvořit aplikaci i bez nich, ale práce jako taková by byla zbytečně těžší a mnohem pomalejší. </w:t>
       </w:r>
       <w:proofErr w:type="spellStart"/>
       <w:r>
-        <w:t>Visual</w:t>
+        <w:t>Extensions</w:t>
       </w:r>
       <w:proofErr w:type="spellEnd"/>
       <w:r>
-        <w:t xml:space="preserve"> Studio </w:t>
+        <w:t xml:space="preserve"> mi hlavně pomáhají se psaním a úpravami kódu. U tohoto projektu jsem například ocenil Angular </w:t>
       </w:r>
       <w:proofErr w:type="spellStart"/>
       <w:r>
-        <w:t>Code</w:t>
+        <w:t>Language</w:t>
       </w:r>
       <w:proofErr w:type="spellEnd"/>
       <w:r>
-        <w:t xml:space="preserve"> mi umožňuje spravovat </w:t>
+        <w:t xml:space="preserve"> </w:t>
       </w:r>
       <w:proofErr w:type="spellStart"/>
       <w:r>
-        <w:t>commity</w:t>
+        <w:t>Service</w:t>
       </w:r>
       <w:proofErr w:type="spellEnd"/>
       <w:r>
-        <w:t>, větve a kontrolovat historii změn jednoduše v rozhraní editoru, takže je všechno přehledné a není potřeba se pokaždé orientovat jen v příkazech v terminálu.</w:t>
-      </w:r>
-    </w:p>
-    <w:p/>
-    <w:p>
-      <w:pPr>
-        <w:pStyle w:val="Nadpis2"/>
-      </w:pPr>
-      <w:bookmarkStart w:id="45" w:name="_Toc230182440"/>
-      <w:r>
-        <w:lastRenderedPageBreak/>
-        <w:t>Angular</w:t>
-      </w:r>
-      <w:bookmarkEnd w:id="45"/>
-    </w:p>
-    <w:p>
-      <w:r>
-        <w:t xml:space="preserve">Každá aplikace potřebuje své „jádro“, tedy framework, který určuje strukturu celé práce. Jelikož je Habit-Tracker navržen jako Single Page </w:t>
+        <w:t xml:space="preserve">, který poskytuje nápovědy a pomáhá s orientací v </w:t>
       </w:r>
       <w:proofErr w:type="spellStart"/>
       <w:r>
-        <w:t>Application</w:t>
+        <w:t>TypeScriptu</w:t>
       </w:r>
       <w:proofErr w:type="spellEnd"/>
       <w:r>
-        <w:t xml:space="preserve">, nenapadlo mě nic, co by se k tomu hodilo lépe než Angular. Angular je framework přímo zaměřený na tvorbu moderních webových aplikací, kde se obsah aktualizuje bez klasického </w:t>
+        <w:t xml:space="preserve"> a Angular struktuře. Další rozšíření používám kvůli formátování (typicky </w:t>
       </w:r>
       <w:proofErr w:type="spellStart"/>
       <w:r>
-        <w:t>přenačítání</w:t>
+        <w:t>Prettier</w:t>
       </w:r>
       <w:proofErr w:type="spellEnd"/>
       <w:r>
-        <w:t xml:space="preserve"> celé stránky. V projektu jsem původně pracoval s verzí 20, ale v této ročníkové práci se budu věnovat novější verzi </w:t>
-      </w:r>
-      <w:proofErr w:type="spellStart"/>
-      <w:r>
-        <w:t>Angularu</w:t>
-      </w:r>
-      <w:proofErr w:type="spellEnd"/>
-      <w:r>
-        <w:t xml:space="preserve"> 21.2.0, kterou jsem během vývoje aktualizoval a používal.</w:t>
-      </w:r>
-    </w:p>
-    <w:p>
-      <w:r>
-        <w:t>Angular je pro tento projekt vhodný hlavně kvůli tomu, že má jasnou strukturu, dobré možnosti pro komponenty a také se dobře udržuje. U ročníkové práce je údržba dost důležitá, protože aplikace se většinou vyvíjí postupně a člověk se k věcem vrací v dalších fázích.</w:t>
+        <w:t>), aby byl kód přehledný a sjednocený. Díky tomu nemusím řešit drobné mezery, odsazení nebo styl kódu pokaždé ručně a celý projekt vypadá konzistentně.</w:t>
       </w:r>
     </w:p>
     <w:p>
       <w:pPr>
         <w:pStyle w:val="Nadpis3"/>
       </w:pPr>
-      <w:bookmarkStart w:id="46" w:name="_Toc230182441"/>
-      <w:r>
-        <w:t>SCSS (</w:t>
-      </w:r>
-      <w:proofErr w:type="spellStart"/>
-      <w:r>
-        <w:t>Sass</w:t>
-      </w:r>
-      <w:proofErr w:type="spellEnd"/>
-      <w:r>
-        <w:t xml:space="preserve"> CSS)</w:t>
-      </w:r>
-      <w:bookmarkEnd w:id="46"/>
+      <w:r>
+        <w:t>Git podpora</w:t>
+      </w:r>
+      <w:bookmarkEnd w:id="48"/>
     </w:p>
     <w:p>
       <w:pPr>
@@ -5975,26 +5860,42 @@
         </w:rPr>
       </w:pPr>
       <w:r>
-        <w:t xml:space="preserve">Habit-Tracker používá SCSS pro stylování. SCSS je rozšíření CSS, které přidává funkce jako proměnné, vnořování a </w:t>
+        <w:t xml:space="preserve">V neposlední řadě je tu Git podpora přímo v editoru. U ročníkové práce je to dost důležité, protože jsem průběžně experimentoval – někdy něco napadne a zkusí to, někdy se něco nepovede nebo se narazí na problém, který nejde vůbec vyřešit. Kdybych neměl průběžné verze, tak by se mi hůř vracelo zpátky k předchozím změnám. </w:t>
       </w:r>
       <w:proofErr w:type="spellStart"/>
       <w:r>
-        <w:t>mixiny</w:t>
+        <w:t>Visual</w:t>
       </w:r>
       <w:proofErr w:type="spellEnd"/>
       <w:r>
-        <w:t>. Zvolil jsem si SCSS místo CSS, LESS nebo dalších z důvodu, že knihovna komponent Angular Material ho používá. Prakticky to znamená, že stylování je lépe organizované a znovupoužitelné. V projektu jsem například vytvořil proměnné pro barvy a rozměry, takže když se změní barevné schéma, stačí změnit hodnotu na jednom místě. Díky tomu se lépe spravují styly v celé aplikaci a kód je přehlednější. Zároveň to zlepšuje čitelnost stylů, protože je hned vidět, jaké barvy a rozměry aplikace používá.</w:t>
-      </w:r>
-    </w:p>
-    <w:p>
-      <w:pPr>
-        <w:pStyle w:val="Nadpis3"/>
-      </w:pPr>
-      <w:bookmarkStart w:id="47" w:name="_Toc230182442"/>
-      <w:r>
-        <w:t>Komponentová architektura</w:t>
-      </w:r>
-      <w:bookmarkEnd w:id="47"/>
+        <w:t xml:space="preserve"> Studio </w:t>
+      </w:r>
+      <w:proofErr w:type="spellStart"/>
+      <w:r>
+        <w:t>Code</w:t>
+      </w:r>
+      <w:proofErr w:type="spellEnd"/>
+      <w:r>
+        <w:t xml:space="preserve"> mi umožňuje spravovat </w:t>
+      </w:r>
+      <w:proofErr w:type="spellStart"/>
+      <w:r>
+        <w:t>commity</w:t>
+      </w:r>
+      <w:proofErr w:type="spellEnd"/>
+      <w:r>
+        <w:t>, větve a kontrolovat historii změn jednoduše v rozhraní editoru, takže je všechno přehledné a není potřeba se pokaždé orientovat jen v příkazech v terminálu.</w:t>
+      </w:r>
+    </w:p>
+    <w:p>
+      <w:pPr>
+        <w:pStyle w:val="Nadpis2"/>
+      </w:pPr>
+      <w:bookmarkStart w:id="49" w:name="_Toc230197541"/>
+      <w:r>
+        <w:t>Angular</w:t>
+      </w:r>
+      <w:bookmarkEnd w:id="49"/>
     </w:p>
     <w:p>
       <w:pPr>
@@ -6003,41 +5904,60 @@
           <w:sz w:val="24"/>
         </w:rPr>
       </w:pPr>
-      <w:r>
-        <w:t>Celý Habit-Tracker jsem rozdělil na nezávislé a znovupoužitelné komponenty. Tento přístup považuji za jeden z největších důvodů, proč je Angular pro podobné projekty tak vhodný. Místo toho, aby byl celý kód „na jednom místě“, má každá část aplikace svůj vlastní komponentní soubor a vlastní logiku i šablonu.</w:t>
-      </w:r>
-      <w:r>
-        <w:br/>
-        <w:t>Například existuje komponenta pro seznam návyků, komponenta pro detailní zobrazení konkrétního návyku a také komponenty, které zajišťují přepínání mezi „dobrými“ a „špatnými“ návyky. Takové rozdělení usnadní údržbu, protože když se změní jen jedna část UI, většinou se nemusí sahat do celé aplikace. Do budoucna je to taky lepší, kdybych chtěl projekt rozšířit (třeba o další filtry, grafy nebo další stránky).</w:t>
+      <w:bookmarkStart w:id="50" w:name="_Toc230197542"/>
+      <w:r>
+        <w:t xml:space="preserve">Každá aplikace potřebuje své „jádro", tedy framework, který určuje strukturu celé práce. Jelikož je Habit-Tracker navržen jako Single Page </w:t>
+      </w:r>
+      <w:proofErr w:type="spellStart"/>
+      <w:r>
+        <w:t>Application</w:t>
+      </w:r>
+      <w:proofErr w:type="spellEnd"/>
+      <w:r>
+        <w:t xml:space="preserve">, nenapadlo mě nic, co by se k tomu hodilo lépe než Angular. Angular je framework přímo zaměřený na tvorbu moderních webových aplikací, kde se obsah aktualizuje bez </w:t>
+      </w:r>
+      <w:r>
+        <w:lastRenderedPageBreak/>
+        <w:t xml:space="preserve">klasického </w:t>
+      </w:r>
+      <w:proofErr w:type="spellStart"/>
+      <w:r>
+        <w:t>přenačítání</w:t>
+      </w:r>
+      <w:proofErr w:type="spellEnd"/>
+      <w:r>
+        <w:t xml:space="preserve"> celé stránky. V projektu jsem původně pracoval s verzí 20, ale v této ročníkové práci se budu věnovat novější verzi </w:t>
+      </w:r>
+      <w:proofErr w:type="spellStart"/>
+      <w:r>
+        <w:t>Angularu</w:t>
+      </w:r>
+      <w:proofErr w:type="spellEnd"/>
+      <w:r>
+        <w:t xml:space="preserve"> 21.2.0, kterou jsem během vývoje aktualizoval a používal.</w:t>
+      </w:r>
+    </w:p>
+    <w:p>
+      <w:r>
+        <w:t>Angular je pro tento projekt vhodný hlavně kvůli tomu, že má jasnou strukturu, dobré možnosti pro komponenty a také se dobře udržuje. U ročníkové práce je údržba dost důležitá, protože aplikace se většinou vyvíjí postupně a člověk se k věcem vrací v dalších fázích.</w:t>
       </w:r>
     </w:p>
     <w:p>
       <w:pPr>
         <w:pStyle w:val="Nadpis3"/>
       </w:pPr>
-      <w:bookmarkStart w:id="48" w:name="_Toc230182443"/>
+      <w:r>
+        <w:t>SCSS (</w:t>
+      </w:r>
       <w:proofErr w:type="spellStart"/>
       <w:r>
-        <w:t>Services</w:t>
+        <w:t>Sass</w:t>
       </w:r>
       <w:proofErr w:type="spellEnd"/>
       <w:r>
-        <w:t xml:space="preserve"> &amp; </w:t>
-      </w:r>
-      <w:proofErr w:type="spellStart"/>
-      <w:r>
-        <w:t>Dependency</w:t>
-      </w:r>
-      <w:proofErr w:type="spellEnd"/>
-      <w:r>
-        <w:t xml:space="preserve"> </w:t>
-      </w:r>
-      <w:proofErr w:type="spellStart"/>
-      <w:r>
-        <w:t>Injection</w:t>
-      </w:r>
-      <w:bookmarkEnd w:id="48"/>
-      <w:proofErr w:type="spellEnd"/>
+        <w:t xml:space="preserve"> CSS)</w:t>
+      </w:r>
+      <w:bookmarkEnd w:id="50"/>
     </w:p>
     <w:p>
       <w:pPr>
@@ -6046,71 +5966,56 @@
           <w:sz w:val="24"/>
         </w:rPr>
       </w:pPr>
-      <w:r>
-        <w:t xml:space="preserve">Pro práci s daty používám službu </w:t>
+      <w:bookmarkStart w:id="51" w:name="_Toc230197543"/>
+      <w:r>
+        <w:t xml:space="preserve">Habit-Tracker používá SCSS pro stylování. SCSS je rozšíření CSS, které přidává funkce jako proměnné, vnořování a </w:t>
       </w:r>
       <w:proofErr w:type="spellStart"/>
       <w:r>
-        <w:t>DataService</w:t>
+        <w:t>mixiny</w:t>
       </w:r>
       <w:proofErr w:type="spellEnd"/>
       <w:r>
-        <w:t>. Tato služba je v projektu zodpovědná za to, aby aplikace měla odkud brát data a kam je ukládat. V mém případě se data ukládají lokálně v prohlížeči (pomocí lokálního uložiště). Komponenty tak nemusejí řešit samotnou logiku ukládání – jen si řeknou, jaké data potřebují, a služba je poskytne.</w:t>
-      </w:r>
-      <w:r>
-        <w:br/>
-        <w:t xml:space="preserve">Angular k tomu přidává ještě systém </w:t>
+        <w:t xml:space="preserve">. Zvolil jsem si SCSS místo CSS, LESS nebo dalších z důvodu, že knihovna komponent Angular Material ho používá. Prakticky to znamená, že stylování je lépe organizované a znovupoužitelné. V projektu jsem například vytvořil proměnné pro barvy a rozměry, takže když se změní barevné schéma, stačí změnit hodnotu na jednom místě. Díky tomu se lépe spravují styly v celé aplikaci a kód je přehlednější. Zároveň to zlepšuje čitelnost stylů, protože je hned vidět, jaké barvy a rozměry aplikace používá. Podle dokumentace </w:t>
       </w:r>
       <w:proofErr w:type="spellStart"/>
       <w:r>
-        <w:t>Dependency</w:t>
+        <w:t>Sass</w:t>
       </w:r>
       <w:proofErr w:type="spellEnd"/>
       <w:r>
-        <w:t xml:space="preserve"> </w:t>
-      </w:r>
-      <w:proofErr w:type="spellStart"/>
-      <w:r>
-        <w:t>Injection</w:t>
-      </w:r>
-      <w:proofErr w:type="spellEnd"/>
-      <w:r>
-        <w:t>. Výsledek je, že se logika (</w:t>
-      </w:r>
-      <w:proofErr w:type="spellStart"/>
-      <w:r>
-        <w:t>DataService</w:t>
-      </w:r>
-      <w:proofErr w:type="spellEnd"/>
-      <w:r>
-        <w:t xml:space="preserve">) lépe </w:t>
-      </w:r>
-      <w:proofErr w:type="spellStart"/>
-      <w:r>
-        <w:t>oddědušší</w:t>
-      </w:r>
-      <w:proofErr w:type="spellEnd"/>
-      <w:r>
-        <w:t xml:space="preserve"> na případné úpravy, protože změny v datové logice nezasáhnou tolik UI a </w:t>
-      </w:r>
-      <w:proofErr w:type="spellStart"/>
-      <w:r>
-        <w:t>naopakluje</w:t>
-      </w:r>
-      <w:proofErr w:type="spellEnd"/>
-      <w:r>
-        <w:t xml:space="preserve"> od uživatelského rozhraní (komponenty). Kód je potom přehlednější, a hlavně jedno.</w:t>
+        <w:t xml:space="preserve"> týmu, SCSS umožňuje vývojářům psát CSS efektivněji prostřednictvím pokročilých funkcí jako jsou proměnné, funkce a logické operace. </w:t>
+      </w:r>
+      <w:r>
+        <w:fldChar w:fldCharType="begin"/>
+      </w:r>
+      <w:r>
+        <w:instrText xml:space="preserve"> REF _Ref230200351 \n \h </w:instrText>
+      </w:r>
+      <w:r>
+        <w:fldChar w:fldCharType="separate"/>
+      </w:r>
+      <w:r>
+        <w:t>[</w:t>
+      </w:r>
+      <w:r>
+        <w:t>5</w:t>
+      </w:r>
+      <w:r>
+        <w:t>]</w:t>
+      </w:r>
+      <w:r>
+        <w:fldChar w:fldCharType="end"/>
       </w:r>
     </w:p>
     <w:p>
       <w:pPr>
         <w:pStyle w:val="Nadpis3"/>
       </w:pPr>
-      <w:bookmarkStart w:id="49" w:name="_Toc230182444"/>
-      <w:r>
-        <w:t>Angular CLI</w:t>
-      </w:r>
-      <w:bookmarkEnd w:id="49"/>
+      <w:r>
+        <w:t>Komponentová architektura</w:t>
+      </w:r>
+      <w:bookmarkEnd w:id="51"/>
     </w:p>
     <w:p>
       <w:pPr>
@@ -6119,61 +6024,61 @@
           <w:sz w:val="24"/>
         </w:rPr>
       </w:pPr>
-      <w:r>
-        <w:t xml:space="preserve">Při vývoji jsem hodně využíval Angular CLI. To je příkazový nástroj, který Angular poskytuje a který pomáhá zautomatizovat několik činností. Podle oficiální dokumentace </w:t>
-      </w:r>
-      <w:r>
-        <w:rPr>
-          <w:rStyle w:val="VrazncittChar"/>
-        </w:rPr>
-        <w:t xml:space="preserve">"Angular CLI e nástrojem příkazového řádku, který vám umožňuje vytvářet, vyvíjet, testovat, nasazovat a udržovat Angular aplikace přímo z příkazového </w:t>
-      </w:r>
-      <w:r>
-        <w:rPr>
-          <w:rStyle w:val="VrazncittChar"/>
-        </w:rPr>
-        <w:lastRenderedPageBreak/>
-        <w:t>prostředí."[1]</w:t>
-      </w:r>
-      <w:r>
-        <w:t xml:space="preserve"> Pomocí něj se dají generovat nové komponenty, služby nebo další části projektu prostřednictvím schémat (</w:t>
-      </w:r>
+      <w:bookmarkStart w:id="52" w:name="_Toc230197544"/>
+      <w:r>
+        <w:t>Celý Habit-Tracker jsem rozdělil na nezávislé a znovupoužitelné komponenty. Tento přístup považuji za jeden z největších důvodů, proč je Angular pro podobné projekty tak vhodný. Místo toho, aby byl celý kód „na jednom místě", má každá část aplikace svůj vlastní komponentní soubor a vlastní logiku i šablonu.</w:t>
+      </w:r>
+    </w:p>
+    <w:p>
+      <w:r>
+        <w:t>Například existuje komponenta pro seznam návyků, komponenta pro detailní zobrazení konkrétního návyku a také komponenty, které zajišťují přepínání mezi „dobrými" a „špatnými" návyky. Takové rozdělení usnadní údržbu, protože když se změní jen jedna část UI, většinou se nemusí sahat do celé aplikace. Do budoucna je to taky lepší, kdybych chtěl projekt rozšířit (třeba o další filtry, grafy nebo další stránky).</w:t>
+      </w:r>
+    </w:p>
+    <w:p>
+      <w:pPr>
+        <w:pStyle w:val="Nadpis3"/>
+      </w:pPr>
       <w:proofErr w:type="spellStart"/>
       <w:r>
-        <w:t>schematics</w:t>
+        <w:t>Services</w:t>
       </w:r>
       <w:proofErr w:type="spellEnd"/>
       <w:r>
-        <w:t xml:space="preserve">), která </w:t>
-      </w:r>
-      <w:r>
-        <w:rPr>
-          <w:rStyle w:val="VrazncittChar"/>
-        </w:rPr>
-        <w:t>"generují a upravují zdrojové soubory vaší aplikace automaticky."[1]</w:t>
-      </w:r>
-      <w:r>
-        <w:t xml:space="preserve"> Také se přes něj spouští vývojový server v </w:t>
+        <w:t xml:space="preserve"> &amp; </w:t>
       </w:r>
       <w:proofErr w:type="spellStart"/>
       <w:r>
-        <w:t>localhostu</w:t>
+        <w:t>Dependency</w:t>
       </w:r>
       <w:proofErr w:type="spellEnd"/>
       <w:r>
-        <w:t xml:space="preserve"> na portu 4200. Pro mě bylo Angular CLI důležité i kvůli časovému ulehčení práce. Když člověk dělá projekt, který obsahuje více komponent, nechce ručně vytvářet strukturu pro každou komponentu. CLI mi to připravilo rychle a přehledně, takže jsem se mohl soustředit hlavně na vlastní funkčnost aplikace.</w:t>
-      </w:r>
-    </w:p>
-    <w:p/>
-    <w:p>
-      <w:pPr>
-        <w:pStyle w:val="Nadpis2"/>
-      </w:pPr>
-      <w:bookmarkStart w:id="50" w:name="_Toc230182445"/>
-      <w:r>
-        <w:t>Angular Material</w:t>
-      </w:r>
-      <w:bookmarkEnd w:id="50"/>
+        <w:t xml:space="preserve"> </w:t>
+      </w:r>
+      <w:proofErr w:type="spellStart"/>
+      <w:r>
+        <w:t>Injection</w:t>
+      </w:r>
+      <w:bookmarkEnd w:id="52"/>
+      <w:proofErr w:type="spellEnd"/>
+    </w:p>
+    <w:p>
+      <w:r>
+        <w:t xml:space="preserve">Pro práci s daty používám službu </w:t>
+      </w:r>
+      <w:proofErr w:type="spellStart"/>
+      <w:r>
+        <w:t>DataService</w:t>
+      </w:r>
+      <w:proofErr w:type="spellEnd"/>
+      <w:r>
+        <w:t>. Tato služba je v projektu zodpovědná za to, aby aplikace měla odkud brát data a kam je ukládat. V mém případě se data ukládají lokálně v prohlížeči (pomocí lokálního uložiště). Komponenty tak nemusejí řešit samotnou logiku ukládání – jen si řeknou, jaké data potřebují, a služba</w:t>
+      </w:r>
+      <w:r>
+        <w:t xml:space="preserve"> je </w:t>
+      </w:r>
+      <w:r>
+        <w:t>poskytne.</w:t>
+      </w:r>
     </w:p>
     <w:p>
       <w:pPr>
@@ -6182,98 +6087,45 @@
           <w:sz w:val="24"/>
         </w:rPr>
       </w:pPr>
-      <w:r>
-        <w:t xml:space="preserve">Pro hlavní stránku jsou klíčové komponenty </w:t>
+      <w:bookmarkStart w:id="53" w:name="_Toc230197545"/>
+      <w:bookmarkStart w:id="54" w:name="_Ref230199175"/>
+      <w:r>
+        <w:t xml:space="preserve">Angular k tomu přidává ještě systém </w:t>
       </w:r>
       <w:proofErr w:type="spellStart"/>
       <w:r>
-        <w:t>MatCard</w:t>
+        <w:t>Dependency</w:t>
       </w:r>
       <w:proofErr w:type="spellEnd"/>
       <w:r>
-        <w:t xml:space="preserve"> a </w:t>
+        <w:t xml:space="preserve"> </w:t>
       </w:r>
       <w:proofErr w:type="spellStart"/>
       <w:r>
-        <w:t>MatTabs</w:t>
+        <w:t>Injection</w:t>
       </w:r>
       <w:proofErr w:type="spellEnd"/>
       <w:r>
-        <w:t xml:space="preserve">. </w:t>
+        <w:t>. Výsledek je, že se logika (</w:t>
       </w:r>
       <w:proofErr w:type="spellStart"/>
       <w:r>
-        <w:t>MatCard</w:t>
+        <w:t>DataService</w:t>
       </w:r>
       <w:proofErr w:type="spellEnd"/>
       <w:r>
-        <w:t xml:space="preserve"> používám tam, kde chci mít návyky zobrazené v ucelených „kartách“ – uživatel pak hned vidí strukturu a nemusí se v obsahu ztrácet. </w:t>
-      </w:r>
-      <w:proofErr w:type="spellStart"/>
-      <w:r>
-        <w:t>MatTabs</w:t>
-      </w:r>
-      <w:proofErr w:type="spellEnd"/>
-      <w:r>
-        <w:t xml:space="preserve"> zase řeší přepínání mezi dvěma kategoriemi návyků. V mém případě to jsou „dobré“ a „špatné“ návyky. Tento způsob přepínání je pro uživatele intuitivní, protože místo přesměrování nebo složitých filtrů jen přepne záložku a hned vidí relevantní obsah.</w:t>
+        <w:t>) lépe odděluje na případné úpravy, protože změny v datové logice nezasáhnou tolik UI a naopak. Kód je potom přehlednější, a hlavně jednotný.</w:t>
       </w:r>
     </w:p>
     <w:p>
       <w:pPr>
         <w:pStyle w:val="Nadpis3"/>
       </w:pPr>
-      <w:bookmarkStart w:id="51" w:name="_Toc230182446"/>
-      <w:r>
-        <w:t>Karty a panely</w:t>
-      </w:r>
-      <w:bookmarkEnd w:id="51"/>
-    </w:p>
-    <w:p>
-      <w:r>
-        <w:t xml:space="preserve">Pro hlavní stránku jsou klíčové komponenty </w:t>
-      </w:r>
-      <w:proofErr w:type="spellStart"/>
-      <w:r>
-        <w:t>MatCard</w:t>
-      </w:r>
-      <w:proofErr w:type="spellEnd"/>
-      <w:r>
-        <w:t xml:space="preserve"> a </w:t>
-      </w:r>
-      <w:proofErr w:type="spellStart"/>
-      <w:r>
-        <w:t>MatTabs</w:t>
-      </w:r>
-      <w:proofErr w:type="spellEnd"/>
-      <w:r>
-        <w:t xml:space="preserve">. </w:t>
-      </w:r>
-      <w:proofErr w:type="spellStart"/>
-      <w:r>
-        <w:t>MatCard</w:t>
-      </w:r>
-      <w:proofErr w:type="spellEnd"/>
-      <w:r>
-        <w:t xml:space="preserve"> používám tam, kde chci mít návyky zobrazené v ucelených „kartách“ – uživatel pak hned vidí strukturu a nemusí se v obsahu ztrácet. </w:t>
-      </w:r>
-      <w:proofErr w:type="spellStart"/>
-      <w:r>
-        <w:t>MatTabs</w:t>
-      </w:r>
-      <w:proofErr w:type="spellEnd"/>
-      <w:r>
-        <w:t xml:space="preserve"> zase řeší přepínání mezi dvěma kategoriemi návyků. V mém případě to jsou „dobré“ a „špatné“ návyky. Tento způsob přepínání je pro uživatele intuitivní, protože místo přesměrování nebo složitých filtrů jen přepne záložku a hned vidí relevantní obsah.</w:t>
-      </w:r>
-    </w:p>
-    <w:p>
-      <w:pPr>
-        <w:pStyle w:val="Nadpis3"/>
-      </w:pPr>
-      <w:bookmarkStart w:id="52" w:name="_Toc230182447"/>
-      <w:r>
-        <w:t>Formulářové prvky a ikony</w:t>
-      </w:r>
-      <w:bookmarkEnd w:id="52"/>
+      <w:r>
+        <w:t>Angular CLI</w:t>
+      </w:r>
+      <w:bookmarkEnd w:id="53"/>
+      <w:bookmarkEnd w:id="54"/>
     </w:p>
     <w:p>
       <w:pPr>
@@ -6283,6 +6135,203 @@
         </w:rPr>
       </w:pPr>
       <w:r>
+        <w:t xml:space="preserve">Při vývoji jsem hodně využíval Angular CLI. To je příkazový nástroj, který Angular poskytuje a který pomáhá zautomatizovat několik činností. Angular CLI představuje příkazový nástroj, který vývojářům umožňuje přímo z příkazového řádku vytvářet, vyvíjet, testovat, nasazovat a spravovat Angular aplikace. </w:t>
+      </w:r>
+      <w:r>
+        <w:fldChar w:fldCharType="begin"/>
+      </w:r>
+      <w:r>
+        <w:instrText xml:space="preserve"> REF _Ref230199246 \n \h </w:instrText>
+      </w:r>
+      <w:r>
+        <w:fldChar w:fldCharType="separate"/>
+      </w:r>
+      <w:r>
+        <w:t>[1]</w:t>
+      </w:r>
+      <w:r>
+        <w:fldChar w:fldCharType="end"/>
+      </w:r>
+      <w:r>
+        <w:t xml:space="preserve"> </w:t>
+      </w:r>
+      <w:r>
+        <w:t>Pomocí něj se dají generovat nové komponenty, služby nebo další části projektu prostřednictvím schémat (</w:t>
+      </w:r>
+      <w:proofErr w:type="spellStart"/>
+      <w:r>
+        <w:t>schematics</w:t>
+      </w:r>
+      <w:proofErr w:type="spellEnd"/>
+      <w:r>
+        <w:t xml:space="preserve">), která automaticky upravují a generují zdrojové kódy vaší aplikace. Také se přes něj spouští vývojový server v </w:t>
+      </w:r>
+      <w:proofErr w:type="spellStart"/>
+      <w:r>
+        <w:lastRenderedPageBreak/>
+        <w:t>localhostu</w:t>
+      </w:r>
+      <w:proofErr w:type="spellEnd"/>
+      <w:r>
+        <w:t xml:space="preserve"> na portu 4200. Pro mě bylo Angular CLI důležité i kvůli časovému ulehčení práce. Když člověk dělá projekt, který obsahuje více komponent, nechce ručně vytvářet strukturu pro každou komponentu. CLI mi to připravilo rychle a přehledně, takže jsem se mohl soustředit hlavně na vlastní funkčnost aplikace.</w:t>
+      </w:r>
+    </w:p>
+    <w:p>
+      <w:pPr>
+        <w:pStyle w:val="Nadpis2"/>
+      </w:pPr>
+      <w:bookmarkStart w:id="55" w:name="_Toc230197546"/>
+      <w:r>
+        <w:t>Angular Material</w:t>
+      </w:r>
+      <w:bookmarkEnd w:id="55"/>
+    </w:p>
+    <w:p>
+      <w:pPr>
+        <w:rPr>
+          <w:rFonts w:ascii="Times New Roman" w:hAnsi="Times New Roman"/>
+          <w:sz w:val="24"/>
+        </w:rPr>
+      </w:pPr>
+      <w:bookmarkStart w:id="56" w:name="_Toc230197547"/>
+      <w:r>
+        <w:t xml:space="preserve">Pro hlavní stránku jsou klíčové komponenty </w:t>
+      </w:r>
+      <w:proofErr w:type="spellStart"/>
+      <w:r>
+        <w:t>MatCard</w:t>
+      </w:r>
+      <w:proofErr w:type="spellEnd"/>
+      <w:r>
+        <w:t xml:space="preserve"> a </w:t>
+      </w:r>
+      <w:proofErr w:type="spellStart"/>
+      <w:r>
+        <w:t>MatTabs</w:t>
+      </w:r>
+      <w:proofErr w:type="spellEnd"/>
+      <w:r>
+        <w:t xml:space="preserve">. </w:t>
+      </w:r>
+      <w:proofErr w:type="spellStart"/>
+      <w:r>
+        <w:t>MatCard</w:t>
+      </w:r>
+      <w:proofErr w:type="spellEnd"/>
+      <w:r>
+        <w:t xml:space="preserve"> používám tam, kde chci mít návyky zobrazené v ucelených „kartách" – uživatel pak hned vidí strukturu a nemusí se v obsahu ztrácet. </w:t>
+      </w:r>
+      <w:proofErr w:type="spellStart"/>
+      <w:r>
+        <w:t>MatTabs</w:t>
+      </w:r>
+      <w:proofErr w:type="spellEnd"/>
+      <w:r>
+        <w:t xml:space="preserve"> zase řeší přepínání mezi dvěma kategoriemi návyků. V mém případě to jsou „dobré" a „špatné" návyky. Tento způsob přepínání je pro uživatele intuitivní, protože místo přesměrování nebo složitých filtrů jen přepne záložku a hned vidí relevantní obsah.</w:t>
+      </w:r>
+    </w:p>
+    <w:p>
+      <w:pPr>
+        <w:pStyle w:val="Nadpis3"/>
+      </w:pPr>
+      <w:r>
+        <w:t>Karty a panely</w:t>
+      </w:r>
+      <w:bookmarkEnd w:id="56"/>
+    </w:p>
+    <w:p>
+      <w:pPr>
+        <w:rPr>
+          <w:rFonts w:ascii="Times New Roman" w:hAnsi="Times New Roman"/>
+          <w:sz w:val="24"/>
+        </w:rPr>
+      </w:pPr>
+      <w:bookmarkStart w:id="57" w:name="_Toc230197548"/>
+      <w:r>
+        <w:t xml:space="preserve">Pro hlavní stránku jsou klíčové komponenty </w:t>
+      </w:r>
+      <w:proofErr w:type="spellStart"/>
+      <w:r>
+        <w:t>MatCard</w:t>
+      </w:r>
+      <w:proofErr w:type="spellEnd"/>
+      <w:r>
+        <w:t xml:space="preserve"> a </w:t>
+      </w:r>
+      <w:proofErr w:type="spellStart"/>
+      <w:r>
+        <w:t>MatTabs</w:t>
+      </w:r>
+      <w:proofErr w:type="spellEnd"/>
+      <w:r>
+        <w:t xml:space="preserve">. </w:t>
+      </w:r>
+      <w:proofErr w:type="spellStart"/>
+      <w:r>
+        <w:t>MatCard</w:t>
+      </w:r>
+      <w:proofErr w:type="spellEnd"/>
+      <w:r>
+        <w:t xml:space="preserve"> používám tam, kde chci mít návyky zobrazené v ucelených „kartách" – uživatel pak hned vidí strukturu a nemusí se v obsahu ztrácet. </w:t>
+      </w:r>
+      <w:proofErr w:type="spellStart"/>
+      <w:r>
+        <w:t>MatTabs</w:t>
+      </w:r>
+      <w:proofErr w:type="spellEnd"/>
+      <w:r>
+        <w:t xml:space="preserve"> zase řeší přepínání mezi dvěma kategoriemi návyků. V mém případě to jsou „dobré" a „špatné" návyky. Tento způsob přepínání je pro uživatele intuitivní, protože místo přesměrování nebo složitých filtrů jen přepne záložku a hned vidí relevantní obsah. Podle oficiální dokumentace Angular Material, komponenty jako </w:t>
+      </w:r>
+      <w:proofErr w:type="spellStart"/>
+      <w:r>
+        <w:t>MatCard</w:t>
+      </w:r>
+      <w:proofErr w:type="spellEnd"/>
+      <w:r>
+        <w:t xml:space="preserve"> a </w:t>
+      </w:r>
+      <w:proofErr w:type="spellStart"/>
+      <w:r>
+        <w:t>MatTabs</w:t>
+      </w:r>
+      <w:proofErr w:type="spellEnd"/>
+      <w:r>
+        <w:t xml:space="preserve"> jsou navrženy tak, aby poskytovaly konzistentní a intuitivní uživatelské rozhraní v souladu s Material Design principy. </w:t>
+      </w:r>
+      <w:r>
+        <w:fldChar w:fldCharType="begin"/>
+      </w:r>
+      <w:r>
+        <w:instrText xml:space="preserve"> REF _Ref230200553 \n \h </w:instrText>
+      </w:r>
+      <w:r>
+        <w:fldChar w:fldCharType="separate"/>
+      </w:r>
+      <w:r>
+        <w:t>[3]</w:t>
+      </w:r>
+      <w:r>
+        <w:fldChar w:fldCharType="end"/>
+      </w:r>
+    </w:p>
+    <w:p>
+      <w:pPr>
+        <w:pStyle w:val="Nadpis3"/>
+      </w:pPr>
+      <w:r>
+        <w:t>Formulářové prvky a ikony</w:t>
+      </w:r>
+      <w:bookmarkEnd w:id="57"/>
+    </w:p>
+    <w:p>
+      <w:pPr>
+        <w:rPr>
+          <w:rFonts w:ascii="Times New Roman" w:hAnsi="Times New Roman"/>
+          <w:sz w:val="24"/>
+        </w:rPr>
+      </w:pPr>
+      <w:bookmarkStart w:id="58" w:name="_Toc230197549"/>
+      <w:r>
         <w:t xml:space="preserve">Pro zadávání názvu nového návyku a výběr barvy používám ovládací prvky </w:t>
       </w:r>
       <w:proofErr w:type="spellStart"/>
@@ -6299,22 +6348,28 @@
       </w:r>
       <w:proofErr w:type="spellEnd"/>
       <w:r>
-        <w:t>. Ikony jsem použil jako vizuální doplněk k návykům, aby bylo možné návyky rychleji rozpoznat a aby vzhled aplikace nebyl jen „textový“, ale měl i jasné symboly. I když se to může zdát jako drobnost, v praxi to zvyšuje použitelnost a uživatelský komfort.</w:t>
+        <w:t>. Ikony jsem použil jako vizuální doplněk k návykům, aby bylo možné návyky rychleji rozpoznat a aby vzhled aplikace nebyl jen „textový", ale měl i jasné symboly. I když se to může zdát jako drobnost, v praxi to zvyšuje použitelnost a uživatelský komfort.</w:t>
       </w:r>
     </w:p>
     <w:p>
       <w:pPr>
         <w:pStyle w:val="Nadpis2"/>
       </w:pPr>
-      <w:bookmarkStart w:id="53" w:name="_Toc230182448"/>
       <w:proofErr w:type="spellStart"/>
       <w:r>
         <w:t>TypeScript</w:t>
       </w:r>
-      <w:bookmarkEnd w:id="53"/>
+      <w:bookmarkEnd w:id="58"/>
       <w:proofErr w:type="spellEnd"/>
     </w:p>
     <w:p>
+      <w:pPr>
+        <w:rPr>
+          <w:rFonts w:ascii="Times New Roman" w:hAnsi="Times New Roman"/>
+          <w:sz w:val="24"/>
+        </w:rPr>
+      </w:pPr>
+      <w:bookmarkStart w:id="59" w:name="_Toc230197550"/>
       <w:proofErr w:type="spellStart"/>
       <w:r>
         <w:t>TypeScript</w:t>
@@ -6398,21 +6453,50 @@
       </w:r>
       <w:proofErr w:type="spellEnd"/>
       <w:r>
-        <w:t>, typy) jsou optimalizovány právě pro tento jazyk. Díky tomu lze plně využít všech výhod, které Angular nabízí.</w:t>
+        <w:t xml:space="preserve">, typy) jsou optimalizovány právě pro tento jazyk. Díky tomu lze plně využít všech výhod, které Angular nabízí. Podle dokumentace Microsoftu, </w:t>
+      </w:r>
+      <w:proofErr w:type="spellStart"/>
+      <w:r>
+        <w:t>TypeScript</w:t>
+      </w:r>
+      <w:proofErr w:type="spellEnd"/>
+      <w:r>
+        <w:t xml:space="preserve"> poskytuje vývojářům nástroje pro psaní kódu s vyšší úrovní bezpečnosti a čitelnosti prostřednictvím statického typování a dalších pokročilých jazykových funkcí. </w:t>
+      </w:r>
+      <w:r>
+        <w:fldChar w:fldCharType="begin"/>
+      </w:r>
+      <w:r>
+        <w:instrText xml:space="preserve"> REF _Ref230200596 \n \h </w:instrText>
+      </w:r>
+      <w:r>
+        <w:fldChar w:fldCharType="separate"/>
+      </w:r>
+      <w:r>
+        <w:t>[2]</w:t>
+      </w:r>
+      <w:r>
+        <w:fldChar w:fldCharType="end"/>
       </w:r>
     </w:p>
     <w:p>
       <w:pPr>
         <w:pStyle w:val="Nadpis3"/>
       </w:pPr>
-      <w:bookmarkStart w:id="54" w:name="_Toc230182449"/>
       <w:r>
         <w:lastRenderedPageBreak/>
         <w:t>Statické typování</w:t>
       </w:r>
-      <w:bookmarkEnd w:id="54"/>
-    </w:p>
-    <w:p>
+      <w:bookmarkEnd w:id="59"/>
+    </w:p>
+    <w:p>
+      <w:pPr>
+        <w:rPr>
+          <w:rFonts w:ascii="Times New Roman" w:hAnsi="Times New Roman"/>
+          <w:sz w:val="24"/>
+        </w:rPr>
+      </w:pPr>
+      <w:bookmarkStart w:id="60" w:name="_Toc230197551"/>
       <w:r>
         <w:t xml:space="preserve">Jednou z hlavních výhod </w:t>
       </w:r>
@@ -6451,72 +6535,230 @@
       </w:r>
       <w:proofErr w:type="spellEnd"/>
       <w:r>
-        <w:t>) pro objekty návyků. Například rozhraní Habit definuje všechny vlastnosti, které návyk obsahuje</w:t>
-      </w:r>
+        <w:t>) pro objekty návyků. Například rozhraní Habit definuje všechny vlastnosti, které návyk obsahuje.</w:t>
+      </w:r>
+    </w:p>
+    <w:p>
+      <w:r>
+        <w:t>Díky tomu je už při psaní kódu jasné, jaké vlastnosti má objekt, a editor může poskytovat lepší návrhy (</w:t>
+      </w:r>
+      <w:proofErr w:type="spellStart"/>
+      <w:r>
+        <w:t>autocomplete</w:t>
+      </w:r>
+      <w:proofErr w:type="spellEnd"/>
+      <w:r>
+        <w:t>). Chyby se odhalují během vývoje, ne až když aplikace běží.</w:t>
+      </w:r>
+    </w:p>
+    <w:p>
+      <w:pPr>
+        <w:pStyle w:val="Nadpis3"/>
+      </w:pPr>
+      <w:proofErr w:type="spellStart"/>
+      <w:r>
+        <w:t>Interfaces</w:t>
+      </w:r>
+      <w:proofErr w:type="spellEnd"/>
+      <w:r>
+        <w:t xml:space="preserve"> a typy</w:t>
+      </w:r>
+      <w:bookmarkEnd w:id="60"/>
+    </w:p>
+    <w:p>
+      <w:pPr>
+        <w:rPr>
+          <w:rFonts w:ascii="Times New Roman" w:hAnsi="Times New Roman"/>
+          <w:sz w:val="24"/>
+        </w:rPr>
+      </w:pPr>
+      <w:bookmarkStart w:id="61" w:name="_Toc230197552"/>
+      <w:proofErr w:type="spellStart"/>
+      <w:r>
+        <w:t>Interfaces</w:t>
+      </w:r>
+      <w:proofErr w:type="spellEnd"/>
+      <w:r>
+        <w:t xml:space="preserve"> (dále jako rozhraní) v </w:t>
+      </w:r>
+      <w:proofErr w:type="spellStart"/>
+      <w:r>
+        <w:t>TypeScriptu</w:t>
+      </w:r>
+      <w:proofErr w:type="spellEnd"/>
+      <w:r>
+        <w:t xml:space="preserve"> slouží pro definování struktury objektů. V projektu jsem definoval rozhraní pro Habit. Toto rozhraní zajišťuje, že všechny návyky v aplikaci mají konzistentní strukturu a jsou správně typované.</w:t>
+      </w:r>
+    </w:p>
+    <w:p>
+      <w:r>
+        <w:t xml:space="preserve">Tímto způsobem je zajištěno, že všechny návyky v aplikaci mají konzistentní strukturu. Pokud by se někdo pokusil přidat návyk bez některého z těchto polí, </w:t>
+      </w:r>
+      <w:proofErr w:type="spellStart"/>
+      <w:r>
+        <w:t>TypeScript</w:t>
+      </w:r>
+      <w:proofErr w:type="spellEnd"/>
+      <w:r>
+        <w:t xml:space="preserve"> by to označil jako chybu. Rozhraní také zlepšují čitelnost kódu, protože vývojář hned vidí, jaké data komponenta očekává.</w:t>
+      </w:r>
+    </w:p>
+    <w:p>
+      <w:pPr>
+        <w:pStyle w:val="Nadpis3"/>
+      </w:pPr>
+      <w:proofErr w:type="spellStart"/>
+      <w:r>
+        <w:t>Dekorátory</w:t>
+      </w:r>
+      <w:proofErr w:type="spellEnd"/>
+      <w:r>
+        <w:t xml:space="preserve"> a metadata</w:t>
+      </w:r>
+      <w:bookmarkEnd w:id="61"/>
+    </w:p>
+    <w:p>
+      <w:pPr>
+        <w:rPr>
+          <w:rFonts w:ascii="Times New Roman" w:hAnsi="Times New Roman"/>
+          <w:sz w:val="24"/>
+        </w:rPr>
+      </w:pPr>
+      <w:bookmarkStart w:id="62" w:name="_Toc230197553"/>
+      <w:proofErr w:type="spellStart"/>
+      <w:r>
+        <w:t>TypeScript</w:t>
+      </w:r>
+      <w:proofErr w:type="spellEnd"/>
+      <w:r>
+        <w:t xml:space="preserve"> podporuje </w:t>
+      </w:r>
+      <w:proofErr w:type="spellStart"/>
+      <w:r>
+        <w:t>dekorátory</w:t>
+      </w:r>
+      <w:proofErr w:type="spellEnd"/>
+      <w:r>
+        <w:t xml:space="preserve">, což jsou speciální funkce, které mění chování tříd, metod nebo vlastností. Angular intenzivně používá </w:t>
+      </w:r>
+      <w:proofErr w:type="spellStart"/>
+      <w:r>
+        <w:t>dekorátory</w:t>
+      </w:r>
+      <w:proofErr w:type="spellEnd"/>
+      <w:r>
+        <w:t xml:space="preserve"> jako @Component, @Injectable, @Input, @Output. Tyto </w:t>
+      </w:r>
+      <w:proofErr w:type="spellStart"/>
+      <w:r>
+        <w:t>dekorátory</w:t>
+      </w:r>
+      <w:proofErr w:type="spellEnd"/>
+      <w:r>
+        <w:t xml:space="preserve"> poskytují metadata, která Angular používá k vytvoření a konfiguraci součástí aplikace.</w:t>
+      </w:r>
+    </w:p>
+    <w:p>
+      <w:r>
+        <w:t xml:space="preserve">Například </w:t>
+      </w:r>
+      <w:proofErr w:type="spellStart"/>
+      <w:r>
+        <w:t>dekorátor</w:t>
+      </w:r>
+      <w:proofErr w:type="spellEnd"/>
+      <w:r>
+        <w:t xml:space="preserve"> @Component definuje, že třída je komponenta, a specifikuje její šablonu, styly a selektor. </w:t>
+      </w:r>
+      <w:proofErr w:type="spellStart"/>
+      <w:r>
+        <w:t>Dekorátor</w:t>
+      </w:r>
+      <w:proofErr w:type="spellEnd"/>
+      <w:r>
+        <w:t xml:space="preserve"> @Injectable označuje, že třída je služba, kterou lze vložit do jiných tříd pomocí </w:t>
+      </w:r>
+      <w:proofErr w:type="spellStart"/>
+      <w:r>
+        <w:t>dependency</w:t>
+      </w:r>
+      <w:proofErr w:type="spellEnd"/>
+      <w:r>
+        <w:t xml:space="preserve"> </w:t>
+      </w:r>
+      <w:proofErr w:type="spellStart"/>
+      <w:r>
+        <w:t>injection</w:t>
+      </w:r>
+      <w:proofErr w:type="spellEnd"/>
+      <w:r>
+        <w:t xml:space="preserve">. Bez </w:t>
+      </w:r>
+      <w:proofErr w:type="spellStart"/>
+      <w:r>
+        <w:t>TypeScriptu</w:t>
+      </w:r>
+      <w:proofErr w:type="spellEnd"/>
+      <w:r>
+        <w:t xml:space="preserve"> by bylo obtížné používat tyto pokročilé funkce </w:t>
+      </w:r>
+      <w:proofErr w:type="spellStart"/>
+      <w:r>
+        <w:t>Angularu</w:t>
+      </w:r>
+      <w:proofErr w:type="spellEnd"/>
       <w:r>
         <w:t>.</w:t>
       </w:r>
     </w:p>
     <w:p>
-      <w:r>
-        <w:t>Díky tomu je už při psaní kódu jasné, jaké vlastnosti má objekt, a editor může poskytovat lepší návrhy (</w:t>
-      </w:r>
+      <w:pPr>
+        <w:pStyle w:val="Nadpis3"/>
+      </w:pPr>
+      <w:r>
+        <w:t>Generické typy</w:t>
+      </w:r>
+      <w:bookmarkEnd w:id="62"/>
+    </w:p>
+    <w:p>
+      <w:pPr>
+        <w:rPr>
+          <w:rFonts w:ascii="Times New Roman" w:hAnsi="Times New Roman"/>
+          <w:sz w:val="24"/>
+        </w:rPr>
+      </w:pPr>
+      <w:bookmarkStart w:id="63" w:name="_Toc230197554"/>
       <w:proofErr w:type="spellStart"/>
       <w:r>
-        <w:t>autocomplete</w:t>
+        <w:t>TypeScript</w:t>
       </w:r>
       <w:proofErr w:type="spellEnd"/>
       <w:r>
-        <w:t>). Chyby se odhalují během vývoje, ne až když aplikace běží.</w:t>
-      </w:r>
-    </w:p>
-    <w:p>
-      <w:pPr>
-        <w:pStyle w:val="Nadpis3"/>
-      </w:pPr>
-      <w:bookmarkStart w:id="55" w:name="_Toc230182450"/>
+        <w:t xml:space="preserve"> podporuje generické typy, které umožňují psát kód, který je flexibilní, ale zároveň typově bezpečný. V </w:t>
+      </w:r>
       <w:proofErr w:type="spellStart"/>
       <w:r>
-        <w:t>Interfaces</w:t>
+        <w:t>DataService</w:t>
       </w:r>
       <w:proofErr w:type="spellEnd"/>
       <w:r>
-        <w:t xml:space="preserve"> a typy</w:t>
-      </w:r>
-      <w:bookmarkEnd w:id="55"/>
-    </w:p>
-    <w:p>
+        <w:t xml:space="preserve"> jsem používal generické typy pro například </w:t>
+      </w:r>
       <w:proofErr w:type="spellStart"/>
       <w:r>
-        <w:t>Interfaces</w:t>
+        <w:t>BehaviorSubject</w:t>
       </w:r>
       <w:proofErr w:type="spellEnd"/>
       <w:r>
-        <w:t xml:space="preserve"> v </w:t>
+        <w:t xml:space="preserve">. Tímto způsobem je jasně vidět, že </w:t>
       </w:r>
       <w:proofErr w:type="spellStart"/>
       <w:r>
-        <w:t>TypeScriptu</w:t>
+        <w:t>habitsSubject</w:t>
       </w:r>
       <w:proofErr w:type="spellEnd"/>
       <w:r>
-        <w:t xml:space="preserve"> slouží </w:t>
-      </w:r>
-      <w:proofErr w:type="gramStart"/>
-      <w:r>
-        <w:t xml:space="preserve">pro </w:t>
-      </w:r>
-      <w:r>
-        <w:t xml:space="preserve"> definování</w:t>
-      </w:r>
-      <w:proofErr w:type="gramEnd"/>
-      <w:r>
-        <w:t xml:space="preserve"> struktury objektů. V projektu jsem definoval interface pro Habit Tento interface zajišťuje, že všechny návyky v aplikaci mají konzistentní strukturu a jsou správně typované.</w:t>
-      </w:r>
-    </w:p>
-    <w:p>
-      <w:r>
-        <w:t xml:space="preserve">Tímto způsobem je zajištěno, že všechny návyky v aplikaci mají konzistentní strukturu. Pokud by se někdo pokusil přidat návyk bez některého z těchto polí, </w:t>
+        <w:t xml:space="preserve"> emituje pole návyků. Pokud by se někdo pokusil vložit něco jiného, </w:t>
       </w:r>
       <w:proofErr w:type="spellStart"/>
       <w:r>
@@ -6524,275 +6766,136 @@
       </w:r>
       <w:proofErr w:type="spellEnd"/>
       <w:r>
-        <w:t xml:space="preserve"> by to označil jako chybu. </w:t>
+        <w:t xml:space="preserve"> by to detekoval jako chybu. Generické typy jsou zvlášť užitečné při práci s </w:t>
       </w:r>
       <w:proofErr w:type="spellStart"/>
       <w:r>
-        <w:t>Interfaces</w:t>
+        <w:t>observables</w:t>
       </w:r>
       <w:proofErr w:type="spellEnd"/>
       <w:r>
-        <w:t xml:space="preserve"> také zlepšují čitelnost kódu, protože vývojář hned vidí, jaké data komponenta očekává.</w:t>
-      </w:r>
-    </w:p>
-    <w:p>
-      <w:pPr>
-        <w:pStyle w:val="Nadpis3"/>
-      </w:pPr>
-      <w:bookmarkStart w:id="56" w:name="_Toc230182451"/>
+        <w:t xml:space="preserve"> a reaktivním programováním. </w:t>
+      </w:r>
       <w:proofErr w:type="spellStart"/>
       <w:r>
-        <w:t>Dekorátory</w:t>
+        <w:t>RxJS</w:t>
       </w:r>
       <w:proofErr w:type="spellEnd"/>
       <w:r>
-        <w:t xml:space="preserve"> a metadata</w:t>
-      </w:r>
-      <w:bookmarkEnd w:id="56"/>
-    </w:p>
-    <w:p>
+        <w:t xml:space="preserve"> dokumentace podrobně vysvětluje, jak pracovat s </w:t>
+      </w:r>
       <w:proofErr w:type="spellStart"/>
       <w:r>
-        <w:t>TypeScript</w:t>
+        <w:t>observables</w:t>
       </w:r>
       <w:proofErr w:type="spellEnd"/>
       <w:r>
-        <w:t xml:space="preserve"> podporuje </w:t>
+        <w:t xml:space="preserve"> a jak je efektivně využívat v reaktivních aplikacích. </w:t>
+      </w:r>
+      <w:r>
+        <w:fldChar w:fldCharType="begin"/>
+      </w:r>
+      <w:r>
+        <w:instrText xml:space="preserve"> REF _Ref230200702 \n \h </w:instrText>
+      </w:r>
+      <w:r>
+        <w:fldChar w:fldCharType="separate"/>
+      </w:r>
+      <w:r>
+        <w:t>[4]</w:t>
+      </w:r>
+      <w:r>
+        <w:fldChar w:fldCharType="end"/>
+      </w:r>
+    </w:p>
+    <w:p>
+      <w:pPr>
+        <w:pStyle w:val="Nadpis2"/>
+      </w:pPr>
+      <w:r>
+        <w:t>Netlify</w:t>
+      </w:r>
+      <w:bookmarkEnd w:id="63"/>
+    </w:p>
+    <w:p>
+      <w:pPr>
+        <w:rPr>
+          <w:rFonts w:ascii="Times New Roman" w:hAnsi="Times New Roman"/>
+          <w:sz w:val="24"/>
+        </w:rPr>
+      </w:pPr>
+      <w:r>
+        <w:t>V minulosti mě vždycky zajímalo, jak dostat vytvořenou aplikaci na web, aby ji šlo reálně sdílet. Netlify je v tomhle ohledu jednoduchá a docela „student-</w:t>
       </w:r>
       <w:proofErr w:type="spellStart"/>
       <w:r>
-        <w:t>dekorátory</w:t>
+        <w:t>friendly</w:t>
       </w:r>
       <w:proofErr w:type="spellEnd"/>
       <w:r>
-        <w:t xml:space="preserve">, což jsou speciální funkce, které mění chování tříd, metod nebo vlastností. Angular intenzivně používá </w:t>
+        <w:t xml:space="preserve">“ platforma. Nabízí rychlé publikování bez toho, aby člověk musel řešit složitý a jednoduché nasazení bez nutnosti řešit složitý </w:t>
       </w:r>
       <w:proofErr w:type="spellStart"/>
       <w:r>
-        <w:t>dekorátory</w:t>
+        <w:t>backend</w:t>
       </w:r>
       <w:proofErr w:type="spellEnd"/>
       <w:r>
-        <w:t xml:space="preserve"> jako @Component, @Injectable, @Input, @Input, @Output. Tyto </w:t>
-      </w:r>
-      <w:proofErr w:type="spellStart"/>
-      <w:r>
-        <w:t>dekorátory</w:t>
-      </w:r>
-      <w:proofErr w:type="spellEnd"/>
-      <w:r>
-        <w:t xml:space="preserve"> poskytují metadata, která Angular používá k vytvoření a konfiguraci součástí aplikace.</w:t>
-      </w:r>
-    </w:p>
-    <w:p>
-      <w:r>
-        <w:t xml:space="preserve">Například </w:t>
-      </w:r>
-      <w:proofErr w:type="spellStart"/>
-      <w:r>
-        <w:t>dekorátor</w:t>
-      </w:r>
-      <w:proofErr w:type="spellEnd"/>
-      <w:r>
-        <w:t xml:space="preserve"> @Component definuje, že třída je komponenta, a specifikuje její šablonu, styly a selektor. </w:t>
-      </w:r>
-      <w:proofErr w:type="spellStart"/>
-      <w:r>
-        <w:t>Dekorátor</w:t>
-      </w:r>
-      <w:proofErr w:type="spellEnd"/>
-      <w:r>
-        <w:t xml:space="preserve"> @Injectable označuje, že třída je služba, kterou lze vložit do jiných tříd pomocí </w:t>
-      </w:r>
-      <w:proofErr w:type="spellStart"/>
-      <w:r>
-        <w:t>dependency</w:t>
-      </w:r>
-      <w:proofErr w:type="spellEnd"/>
-      <w:r>
-        <w:t xml:space="preserve"> </w:t>
-      </w:r>
-      <w:proofErr w:type="spellStart"/>
-      <w:r>
-        <w:t>injection</w:t>
-      </w:r>
-      <w:proofErr w:type="spellEnd"/>
-      <w:r>
-        <w:t xml:space="preserve">. Bez </w:t>
-      </w:r>
-      <w:proofErr w:type="spellStart"/>
-      <w:r>
-        <w:t>TypeScriptu</w:t>
-      </w:r>
-      <w:proofErr w:type="spellEnd"/>
-      <w:r>
-        <w:t xml:space="preserve"> by bylo obtížné používat tyto pokročilé funkce </w:t>
-      </w:r>
-      <w:proofErr w:type="spellStart"/>
-      <w:r>
-        <w:t>Angularu</w:t>
-      </w:r>
-      <w:proofErr w:type="spellEnd"/>
-      <w:r>
-        <w:t>.</w:t>
-      </w:r>
-    </w:p>
-    <w:p>
-      <w:pPr>
-        <w:pStyle w:val="Nadpis3"/>
-      </w:pPr>
-      <w:bookmarkStart w:id="57" w:name="_Toc230182452"/>
-      <w:r>
-        <w:t>Generické typy</w:t>
-      </w:r>
-      <w:bookmarkEnd w:id="57"/>
-    </w:p>
-    <w:p>
-      <w:proofErr w:type="spellStart"/>
-      <w:r>
-        <w:t>TypeScript</w:t>
-      </w:r>
-      <w:proofErr w:type="spellEnd"/>
-      <w:r>
-        <w:t xml:space="preserve"> podporuje generické typy, které umožňují psát kód, který je flexibilní, ale zároveň typově bezpečný. V </w:t>
-      </w:r>
-      <w:proofErr w:type="spellStart"/>
-      <w:r>
-        <w:t>DataService</w:t>
-      </w:r>
-      <w:proofErr w:type="spellEnd"/>
-      <w:r>
-        <w:t xml:space="preserve"> jsem používal generické typy pro </w:t>
-      </w:r>
-      <w:proofErr w:type="spellStart"/>
-      <w:r>
-        <w:t>napříkad</w:t>
-      </w:r>
-      <w:proofErr w:type="spellEnd"/>
-      <w:r>
-        <w:t xml:space="preserve"> </w:t>
-      </w:r>
-      <w:proofErr w:type="spellStart"/>
-      <w:r>
-        <w:t>BehaviorSubject</w:t>
-      </w:r>
-      <w:proofErr w:type="spellEnd"/>
-      <w:r>
-        <w:t>.</w:t>
-      </w:r>
-      <w:r>
-        <w:t xml:space="preserve"> </w:t>
-      </w:r>
-      <w:r>
-        <w:t xml:space="preserve">Tímto způsobem je jasně vidět, že </w:t>
-      </w:r>
-      <w:proofErr w:type="spellStart"/>
-      <w:r>
-        <w:t>habitsSubject</w:t>
-      </w:r>
-      <w:proofErr w:type="spellEnd"/>
-      <w:r>
-        <w:t xml:space="preserve"> emituje pole návyků. Pokud by se někdo pokusil vložit něco jiného, </w:t>
-      </w:r>
-      <w:proofErr w:type="spellStart"/>
-      <w:r>
-        <w:t>TypeScript</w:t>
-      </w:r>
-      <w:proofErr w:type="spellEnd"/>
-      <w:r>
-        <w:t xml:space="preserve"> by to detekoval jako chybu. Generické typy jsou zvlášť užitečné při práci s </w:t>
-      </w:r>
-      <w:proofErr w:type="spellStart"/>
-      <w:r>
-        <w:t>observables</w:t>
-      </w:r>
-      <w:proofErr w:type="spellEnd"/>
-      <w:r>
-        <w:t xml:space="preserve"> a reaktivním programováním.</w:t>
-      </w:r>
+        <w:t xml:space="preserve"> nebo konfiguraci serveru.</w:t>
+      </w:r>
+    </w:p>
+    <w:p>
+      <w:r>
+        <w:lastRenderedPageBreak/>
+        <w:t xml:space="preserve">Protože je Habit-Tracker navržen jako single-page aplikace bez závislosti na databázi, Netlify představuje ideální řešení pro publikování. Podle dokumentace Netlify, platforma umožňuje automatizované nasazení a kontinuální integraci, což vývojářům zjednodušuje proces uvedení aplikace do produkce. </w:t>
+      </w:r>
+      <w:r>
+        <w:fldChar w:fldCharType="begin"/>
+      </w:r>
+      <w:r>
+        <w:instrText xml:space="preserve"> REF _Ref230200750 \n \h </w:instrText>
+      </w:r>
+      <w:r>
+        <w:fldChar w:fldCharType="separate"/>
+      </w:r>
+      <w:r>
+        <w:t>[6]</w:t>
+      </w:r>
+      <w:r>
+        <w:fldChar w:fldCharType="end"/>
+      </w:r>
+      <w:r>
+        <w:t xml:space="preserve"> V mém případě se aplikace nasazuje tak, že se build verze projektu publikuje přímo do produkčního prostředí. Ačkoliv Netlify podporuje i práci s databázemi, v tomto projektu jsem je zatím nepotřeboval – data se ukládají lokálně v prohlížeči uživatele. Tímto přístupem se nasazení zjednodušuje a projekt se může plně soustředit na funkcionalitu a uživatelské rozhraní.</w:t>
+      </w:r>
+    </w:p>
+    <w:p>
+      <w:r>
+        <w:br w:type="page"/>
+      </w:r>
+    </w:p>
+    <w:p>
+      <w:pPr>
+        <w:pStyle w:val="Nadpis1"/>
+      </w:pPr>
+      <w:bookmarkStart w:id="64" w:name="_Toc230197555"/>
+      <w:r>
+        <w:lastRenderedPageBreak/>
+        <w:t>Tvorba Aplikace</w:t>
+      </w:r>
+      <w:bookmarkEnd w:id="64"/>
     </w:p>
     <w:p>
       <w:pPr>
         <w:pStyle w:val="Nadpis2"/>
       </w:pPr>
-      <w:bookmarkStart w:id="58" w:name="_Toc230182453"/>
-      <w:r>
-        <w:t>Netlify</w:t>
-      </w:r>
-      <w:bookmarkEnd w:id="58"/>
-    </w:p>
-    <w:p>
-      <w:r>
-        <w:t>V minulosti mě vždycky zajímalo, jak dostat vytvořenou aplikaci na web, aby ji šlo reálně sdílet. Netlify je v tomhle ohledu jednoduchá a docela „student-</w:t>
-      </w:r>
-      <w:proofErr w:type="spellStart"/>
-      <w:r>
-        <w:t>friendly</w:t>
-      </w:r>
-      <w:proofErr w:type="spellEnd"/>
-      <w:r>
-        <w:t xml:space="preserve">“ platforma. Nabízí rychlé publikování bez toho, aby člověk musel řešit složitý </w:t>
-      </w:r>
-      <w:proofErr w:type="spellStart"/>
-      <w:r>
-        <w:t>backend</w:t>
-      </w:r>
-      <w:proofErr w:type="spellEnd"/>
-      <w:r>
-        <w:t xml:space="preserve"> nebo vlastní konfiguraci serveru.</w:t>
-      </w:r>
-    </w:p>
-    <w:p>
-      <w:r>
-        <w:t>Protože je Habit-Tracker single-page aplikace bez potřeby databáze, Netlify mi dává smysl. Aplikaci lze nasadit tak, že se build verze projektu publikují do produkce. Netlify sice umožňuje i použití databáze, ale v mém případě jsem ji zatím nepotřeboval – data si totiž aplikace ukládá lokálně v prohlížeči. Díky tomu je nasazení jednodušší a celý projekt je soustředěný spíš na samotnou funkcionalitu UI.</w:t>
-      </w:r>
-      <w:r>
-        <w:br w:type="page"/>
-      </w:r>
-    </w:p>
-    <w:p>
-      <w:pPr>
-        <w:pStyle w:val="Nadpis1"/>
-      </w:pPr>
-      <w:bookmarkStart w:id="59" w:name="_Toc230182454"/>
-      <w:r>
-        <w:lastRenderedPageBreak/>
-        <w:t>Praktická</w:t>
-      </w:r>
-      <w:r>
-        <w:t xml:space="preserve"> část</w:t>
-      </w:r>
-      <w:bookmarkEnd w:id="59"/>
-    </w:p>
-    <w:p>
-      <w:r>
-        <w:t>Když jsme si teď prošli základy nástrojů a Angular knihoven, je nejlepší čas se podívat na to, jak přesně jsem s těmito vymoženostmi pracoval</w:t>
-      </w:r>
-      <w:r>
-        <w:t xml:space="preserve"> při vytvářeních jednotlivých částí mého </w:t>
-      </w:r>
-      <w:r>
-        <w:t>Habit-Tracker</w:t>
-      </w:r>
-      <w:r>
-        <w:t>u.</w:t>
-      </w:r>
-      <w:r>
-        <w:t xml:space="preserve"> Kapitoly této sekce budou věnovány jednotlivým částem vývoje</w:t>
-      </w:r>
-    </w:p>
-    <w:p>
-      <w:pPr>
-        <w:pStyle w:val="Nadpis2"/>
-      </w:pPr>
-      <w:bookmarkStart w:id="60" w:name="_Toc230182455"/>
+      <w:bookmarkStart w:id="65" w:name="_Toc230197556"/>
       <w:r>
         <w:t>Modelovaní</w:t>
       </w:r>
       <w:r>
         <w:t xml:space="preserve"> dat a služby</w:t>
       </w:r>
-      <w:bookmarkEnd w:id="60"/>
+      <w:bookmarkEnd w:id="65"/>
     </w:p>
     <w:p>
       <w:r>
@@ -6877,7 +6980,16 @@
               <w:t xml:space="preserve">Unikátní identifikátor každého </w:t>
             </w:r>
             <w:r>
-              <w:t>habitu pro přesné určení habitu, se kterým pracuje</w:t>
+              <w:t>návyk</w:t>
+            </w:r>
+            <w:r>
+              <w:t xml:space="preserve">u pro přesné určení </w:t>
+            </w:r>
+            <w:r>
+              <w:t>návyku</w:t>
+            </w:r>
+            <w:r>
+              <w:t>, se kterým pracuje</w:t>
             </w:r>
           </w:p>
         </w:tc>
@@ -6911,7 +7023,13 @@
           </w:tcPr>
           <w:p>
             <w:r>
-              <w:t>Uživatelem definované pojmenování habitu</w:t>
+              <w:t xml:space="preserve">Uživatelem definované pojmenování </w:t>
+            </w:r>
+            <w:r>
+              <w:t>návyk</w:t>
+            </w:r>
+            <w:r>
+              <w:t>u</w:t>
             </w:r>
           </w:p>
         </w:tc>
@@ -6945,7 +7063,13 @@
           </w:tcPr>
           <w:p>
             <w:r>
-              <w:t>Uživatelem zadaný popis daného habitu</w:t>
+              <w:t xml:space="preserve">Uživatelem zadaný popis daného </w:t>
+            </w:r>
+            <w:r>
+              <w:t>návyk</w:t>
+            </w:r>
+            <w:r>
+              <w:t>u</w:t>
             </w:r>
           </w:p>
         </w:tc>
@@ -6981,13 +7105,17 @@
             <w:tcW w:w="3210" w:type="dxa"/>
           </w:tcPr>
           <w:p>
-            <w:proofErr w:type="gramStart"/>
-            <w:r>
-              <w:t>Ukazatel</w:t>
-            </w:r>
-            <w:proofErr w:type="gramEnd"/>
-            <w:r>
-              <w:t xml:space="preserve"> zda daný habit náleží skupině kladné nebo špatné</w:t>
+            <w:r>
+              <w:t>Ukazatel,</w:t>
+            </w:r>
+            <w:r>
+              <w:t xml:space="preserve"> zda daný </w:t>
+            </w:r>
+            <w:r>
+              <w:t>návyk</w:t>
+            </w:r>
+            <w:r>
+              <w:t xml:space="preserve"> náleží skupině kladné nebo špatné</w:t>
             </w:r>
           </w:p>
         </w:tc>
@@ -7034,7 +7162,13 @@
           </w:tcPr>
           <w:p>
             <w:r>
-              <w:t>Udržuje v sobě data, kdy byl daný habit „splněn“ uživatelem</w:t>
+              <w:t xml:space="preserve">Udržuje v sobě data, kdy byl daný </w:t>
+            </w:r>
+            <w:r>
+              <w:t>návyk</w:t>
+            </w:r>
+            <w:r>
+              <w:t xml:space="preserve"> „splněn“ uživatelem</w:t>
             </w:r>
           </w:p>
         </w:tc>
@@ -7066,13 +7200,8 @@
             <w:r>
               <w:t xml:space="preserve">přesněji </w:t>
             </w:r>
-            <w:proofErr w:type="spellStart"/>
-            <w:r>
-              <w:t>Integer</w:t>
-            </w:r>
-            <w:proofErr w:type="spellEnd"/>
-            <w:r>
-              <w:t>)</w:t>
+            <w:r>
+              <w:t>celé číslo)</w:t>
             </w:r>
           </w:p>
         </w:tc>
@@ -7094,24 +7223,37 @@
     <w:p>
       <w:pPr>
         <w:pStyle w:val="Titulek"/>
-        <w:jc w:val="left"/>
-      </w:pPr>
-      <w:bookmarkStart w:id="61" w:name="_Toc230179648"/>
+        <w:jc w:val="center"/>
+      </w:pPr>
+      <w:bookmarkStart w:id="66" w:name="_Toc230179648"/>
       <w:r>
         <w:t xml:space="preserve">Tabulka </w:t>
       </w:r>
-      <w:fldSimple w:instr=" SEQ Tabulka \* ARABIC ">
-        <w:r>
-          <w:rPr>
-            <w:noProof/>
-          </w:rPr>
-          <w:t>1</w:t>
-        </w:r>
-      </w:fldSimple>
+      <w:r>
+        <w:fldChar w:fldCharType="begin"/>
+      </w:r>
+      <w:r>
+        <w:instrText xml:space="preserve"> SEQ Tabulka \* ARABIC </w:instrText>
+      </w:r>
+      <w:r>
+        <w:fldChar w:fldCharType="separate"/>
+      </w:r>
+      <w:r>
+        <w:rPr>
+          <w:noProof/>
+        </w:rPr>
+        <w:t>1</w:t>
+      </w:r>
+      <w:r>
+        <w:rPr>
+          <w:noProof/>
+        </w:rPr>
+        <w:fldChar w:fldCharType="end"/>
+      </w:r>
       <w:r>
         <w:t>: Vlastnosti rozhraní Habit</w:t>
       </w:r>
-      <w:bookmarkEnd w:id="61"/>
+      <w:bookmarkEnd w:id="66"/>
     </w:p>
     <w:p>
       <w:r>
@@ -7198,27 +7340,27 @@
     </w:p>
     <w:p>
       <w:r>
+        <w:t xml:space="preserve">Tímto způsobem je logika práce s daty oddělena od komponent (UI). Komponenty pouze zobrazují data a vyvolávají události (přidání/mazání/aktualizace), zatímco servis zodpovídá za konzistenci a ukládání. Aplikace tedy funguje bez </w:t>
+      </w:r>
+      <w:proofErr w:type="spellStart"/>
+      <w:r>
+        <w:t>backendu</w:t>
+      </w:r>
+      <w:proofErr w:type="spellEnd"/>
+      <w:r>
+        <w:t xml:space="preserve"> – data jsou lokálně a stabilně dostupná i po obnovení stránky.</w:t>
+      </w:r>
+    </w:p>
+    <w:p>
+      <w:pPr>
+        <w:pStyle w:val="Nadpis2"/>
+      </w:pPr>
+      <w:bookmarkStart w:id="67" w:name="_Toc230197557"/>
+      <w:r>
         <w:lastRenderedPageBreak/>
-        <w:t xml:space="preserve">Tímto způsobem je logika práce s daty oddělena od komponent (UI). Komponenty pouze zobrazují data a vyvolávají události (přidání/mazání/aktualizace), zatímco servis zodpovídá za konzistenci a ukládání. Aplikace tedy funguje bez </w:t>
-      </w:r>
-      <w:proofErr w:type="spellStart"/>
-      <w:r>
-        <w:t>backendu</w:t>
-      </w:r>
-      <w:proofErr w:type="spellEnd"/>
-      <w:r>
-        <w:t xml:space="preserve"> – data jsou lokálně a stabilně dostupná i po obnovení stránky.</w:t>
-      </w:r>
-    </w:p>
-    <w:p>
-      <w:pPr>
-        <w:pStyle w:val="Nadpis2"/>
-      </w:pPr>
-      <w:bookmarkStart w:id="62" w:name="_Toc230182456"/>
-      <w:r>
         <w:t>Hlavní UI a navigace</w:t>
       </w:r>
-      <w:bookmarkEnd w:id="62"/>
+      <w:bookmarkEnd w:id="67"/>
     </w:p>
     <w:p>
       <w:r>
@@ -7329,11 +7471,9 @@
             <w:r>
               <w:t xml:space="preserve">kladné návyky, které uživatel chce každý den dodržovat. Tato podmnožina je </w:t>
             </w:r>
-            <w:proofErr w:type="spellStart"/>
-            <w:r>
-              <w:t>definováná</w:t>
-            </w:r>
-            <w:proofErr w:type="spellEnd"/>
+            <w:r>
+              <w:t>definována</w:t>
+            </w:r>
             <w:r>
               <w:t xml:space="preserve"> typem "positive"</w:t>
             </w:r>
@@ -7375,11 +7515,9 @@
             <w:r>
               <w:t xml:space="preserve">zlozvyky, které by si uživatel chtěl každý den držet co nejdál od svého denního života. Tato podmnožina je </w:t>
             </w:r>
-            <w:proofErr w:type="spellStart"/>
-            <w:r>
-              <w:t>definováná</w:t>
-            </w:r>
-            <w:proofErr w:type="spellEnd"/>
+            <w:r>
+              <w:t>definována</w:t>
+            </w:r>
             <w:r>
               <w:t xml:space="preserve"> typem "negative".</w:t>
             </w:r>
@@ -7539,19 +7677,33 @@
     <w:p>
       <w:pPr>
         <w:pStyle w:val="Titulek"/>
-      </w:pPr>
-      <w:bookmarkStart w:id="63" w:name="_Toc230179649"/>
+        <w:jc w:val="center"/>
+      </w:pPr>
+      <w:bookmarkStart w:id="68" w:name="_Toc230179649"/>
       <w:r>
         <w:t xml:space="preserve">Tabulka </w:t>
       </w:r>
-      <w:fldSimple w:instr=" SEQ Tabulka \* ARABIC ">
-        <w:r>
-          <w:rPr>
-            <w:noProof/>
-          </w:rPr>
-          <w:t>2</w:t>
-        </w:r>
-      </w:fldSimple>
+      <w:r>
+        <w:fldChar w:fldCharType="begin"/>
+      </w:r>
+      <w:r>
+        <w:instrText xml:space="preserve"> SEQ Tabulka \* ARABIC </w:instrText>
+      </w:r>
+      <w:r>
+        <w:fldChar w:fldCharType="separate"/>
+      </w:r>
+      <w:r>
+        <w:rPr>
+          <w:noProof/>
+        </w:rPr>
+        <w:t>2</w:t>
+      </w:r>
+      <w:r>
+        <w:rPr>
+          <w:noProof/>
+        </w:rPr>
+        <w:fldChar w:fldCharType="end"/>
+      </w:r>
       <w:r>
         <w:t xml:space="preserve">: Akce </w:t>
       </w:r>
@@ -7559,7 +7711,7 @@
       <w:r>
         <w:t>toolbaru</w:t>
       </w:r>
-      <w:bookmarkEnd w:id="63"/>
+      <w:bookmarkEnd w:id="68"/>
       <w:proofErr w:type="spellEnd"/>
     </w:p>
     <w:p>
@@ -7656,32 +7808,45 @@
         <w:pStyle w:val="Titulek"/>
         <w:jc w:val="center"/>
       </w:pPr>
-      <w:bookmarkStart w:id="64" w:name="_Toc230179642"/>
+      <w:bookmarkStart w:id="69" w:name="_Toc230197179"/>
       <w:r>
         <w:t xml:space="preserve">Obrázek </w:t>
       </w:r>
-      <w:fldSimple w:instr=" SEQ Obrázek \* ARABIC ">
-        <w:r>
-          <w:rPr>
-            <w:noProof/>
-          </w:rPr>
-          <w:t>1</w:t>
-        </w:r>
-      </w:fldSimple>
+      <w:r>
+        <w:fldChar w:fldCharType="begin"/>
+      </w:r>
+      <w:r>
+        <w:instrText xml:space="preserve"> SEQ Obrázek \* ARABIC </w:instrText>
+      </w:r>
+      <w:r>
+        <w:fldChar w:fldCharType="separate"/>
+      </w:r>
+      <w:r>
+        <w:rPr>
+          <w:noProof/>
+        </w:rPr>
+        <w:t>1</w:t>
+      </w:r>
+      <w:r>
+        <w:rPr>
+          <w:noProof/>
+        </w:rPr>
+        <w:fldChar w:fldCharType="end"/>
+      </w:r>
       <w:r>
         <w:t>: Hlavní UI</w:t>
       </w:r>
-      <w:bookmarkEnd w:id="64"/>
+      <w:bookmarkEnd w:id="69"/>
     </w:p>
     <w:p>
       <w:pPr>
         <w:pStyle w:val="Nadpis2"/>
       </w:pPr>
-      <w:bookmarkStart w:id="65" w:name="_Toc230182457"/>
+      <w:bookmarkStart w:id="70" w:name="_Toc230197558"/>
       <w:r>
         <w:t>Formulář pro vytváření nových návyků</w:t>
       </w:r>
-      <w:bookmarkEnd w:id="65"/>
+      <w:bookmarkEnd w:id="70"/>
     </w:p>
     <w:p>
       <w:r>
@@ -7842,11 +8007,9 @@
             <w:r>
               <w:t xml:space="preserve">Zda není </w:t>
             </w:r>
-            <w:proofErr w:type="spellStart"/>
-            <w:r>
-              <w:t>prazdný</w:t>
-            </w:r>
-            <w:proofErr w:type="spellEnd"/>
+            <w:r>
+              <w:t>prázdný</w:t>
+            </w:r>
             <w:r>
               <w:t xml:space="preserve"> a maximum 20 znaků</w:t>
             </w:r>
@@ -7890,11 +8053,9 @@
             <w:r>
               <w:t xml:space="preserve">Zda není </w:t>
             </w:r>
-            <w:proofErr w:type="spellStart"/>
-            <w:r>
-              <w:t>prádný</w:t>
-            </w:r>
-            <w:proofErr w:type="spellEnd"/>
+            <w:r>
+              <w:t>prázdný</w:t>
+            </w:r>
             <w:r>
               <w:t xml:space="preserve"> a maximum 30 znaků</w:t>
             </w:r>
@@ -7942,22 +8103,35 @@
         <w:pStyle w:val="Titulek"/>
         <w:jc w:val="center"/>
       </w:pPr>
-      <w:bookmarkStart w:id="66" w:name="_Toc230179650"/>
+      <w:bookmarkStart w:id="71" w:name="_Toc230179650"/>
       <w:r>
         <w:t xml:space="preserve">Tabulka </w:t>
       </w:r>
-      <w:fldSimple w:instr=" SEQ Tabulka \* ARABIC ">
-        <w:r>
-          <w:rPr>
-            <w:noProof/>
-          </w:rPr>
-          <w:t>3</w:t>
-        </w:r>
-      </w:fldSimple>
+      <w:r>
+        <w:fldChar w:fldCharType="begin"/>
+      </w:r>
+      <w:r>
+        <w:instrText xml:space="preserve"> SEQ Tabulka \* ARABIC </w:instrText>
+      </w:r>
+      <w:r>
+        <w:fldChar w:fldCharType="separate"/>
+      </w:r>
+      <w:r>
+        <w:rPr>
+          <w:noProof/>
+        </w:rPr>
+        <w:t>3</w:t>
+      </w:r>
+      <w:r>
+        <w:rPr>
+          <w:noProof/>
+        </w:rPr>
+        <w:fldChar w:fldCharType="end"/>
+      </w:r>
       <w:r>
         <w:t>: Vstupy formuláře</w:t>
       </w:r>
-      <w:bookmarkEnd w:id="66"/>
+      <w:bookmarkEnd w:id="71"/>
     </w:p>
     <w:p>
       <w:r>
@@ -8079,32 +8253,51 @@
         <w:pStyle w:val="Titulek"/>
         <w:jc w:val="center"/>
       </w:pPr>
-      <w:bookmarkStart w:id="67" w:name="_Toc230179643"/>
+      <w:bookmarkStart w:id="72" w:name="_Toc230197180"/>
       <w:r>
         <w:t xml:space="preserve">Obrázek </w:t>
       </w:r>
-      <w:fldSimple w:instr=" SEQ Obrázek \* ARABIC ">
-        <w:r>
-          <w:rPr>
-            <w:noProof/>
-          </w:rPr>
-          <w:t>2</w:t>
-        </w:r>
-      </w:fldSimple>
-      <w:r>
-        <w:t>: Formulář pro přidání nových habitů</w:t>
-      </w:r>
-      <w:bookmarkEnd w:id="67"/>
+      <w:r>
+        <w:fldChar w:fldCharType="begin"/>
+      </w:r>
+      <w:r>
+        <w:instrText xml:space="preserve"> SEQ Obrázek \* ARABIC </w:instrText>
+      </w:r>
+      <w:r>
+        <w:fldChar w:fldCharType="separate"/>
+      </w:r>
+      <w:r>
+        <w:rPr>
+          <w:noProof/>
+        </w:rPr>
+        <w:t>2</w:t>
+      </w:r>
+      <w:r>
+        <w:rPr>
+          <w:noProof/>
+        </w:rPr>
+        <w:fldChar w:fldCharType="end"/>
+      </w:r>
+      <w:r>
+        <w:t xml:space="preserve">: Formulář pro přidání nových </w:t>
+      </w:r>
+      <w:r>
+        <w:t>návyk</w:t>
+      </w:r>
+      <w:r>
+        <w:t>ů</w:t>
+      </w:r>
+      <w:bookmarkEnd w:id="72"/>
     </w:p>
     <w:p>
       <w:pPr>
         <w:pStyle w:val="Nadpis2"/>
       </w:pPr>
-      <w:bookmarkStart w:id="68" w:name="_Toc230182458"/>
+      <w:bookmarkStart w:id="73" w:name="_Toc230197559"/>
       <w:r>
         <w:t>Seznamy návyků</w:t>
       </w:r>
-      <w:bookmarkEnd w:id="68"/>
+      <w:bookmarkEnd w:id="73"/>
     </w:p>
     <w:p>
       <w:r>
@@ -8266,23 +8459,37 @@
     <w:p>
       <w:pPr>
         <w:pStyle w:val="Titulek"/>
-      </w:pPr>
-      <w:bookmarkStart w:id="69" w:name="_Toc230179651"/>
+        <w:jc w:val="center"/>
+      </w:pPr>
+      <w:bookmarkStart w:id="74" w:name="_Toc230179651"/>
       <w:r>
         <w:t xml:space="preserve">Tabulka </w:t>
       </w:r>
-      <w:fldSimple w:instr=" SEQ Tabulka \* ARABIC ">
-        <w:r>
-          <w:rPr>
-            <w:noProof/>
-          </w:rPr>
-          <w:t>4</w:t>
-        </w:r>
-      </w:fldSimple>
+      <w:r>
+        <w:fldChar w:fldCharType="begin"/>
+      </w:r>
+      <w:r>
+        <w:instrText xml:space="preserve"> SEQ Tabulka \* ARABIC </w:instrText>
+      </w:r>
+      <w:r>
+        <w:fldChar w:fldCharType="separate"/>
+      </w:r>
+      <w:r>
+        <w:rPr>
+          <w:noProof/>
+        </w:rPr>
+        <w:t>4</w:t>
+      </w:r>
+      <w:r>
+        <w:rPr>
+          <w:noProof/>
+        </w:rPr>
+        <w:fldChar w:fldCharType="end"/>
+      </w:r>
       <w:r>
         <w:t>: Členové za funkcí UI</w:t>
       </w:r>
-      <w:bookmarkEnd w:id="69"/>
+      <w:bookmarkEnd w:id="74"/>
     </w:p>
     <w:p>
       <w:r>
@@ -8377,23 +8584,37 @@
     <w:p>
       <w:pPr>
         <w:pStyle w:val="Titulek"/>
-      </w:pPr>
-      <w:bookmarkStart w:id="70" w:name="_Toc230179652"/>
+        <w:jc w:val="center"/>
+      </w:pPr>
+      <w:bookmarkStart w:id="75" w:name="_Toc230179652"/>
       <w:r>
         <w:t xml:space="preserve">Tabulka </w:t>
       </w:r>
-      <w:fldSimple w:instr=" SEQ Tabulka \* ARABIC ">
-        <w:r>
-          <w:rPr>
-            <w:noProof/>
-          </w:rPr>
-          <w:t>5</w:t>
-        </w:r>
-      </w:fldSimple>
+      <w:r>
+        <w:fldChar w:fldCharType="begin"/>
+      </w:r>
+      <w:r>
+        <w:instrText xml:space="preserve"> SEQ Tabulka \* ARABIC </w:instrText>
+      </w:r>
+      <w:r>
+        <w:fldChar w:fldCharType="separate"/>
+      </w:r>
+      <w:r>
+        <w:rPr>
+          <w:noProof/>
+        </w:rPr>
+        <w:t>5</w:t>
+      </w:r>
+      <w:r>
+        <w:rPr>
+          <w:noProof/>
+        </w:rPr>
+        <w:fldChar w:fldCharType="end"/>
+      </w:r>
       <w:r>
         <w:t>: výstupní eventy UI</w:t>
       </w:r>
-      <w:bookmarkEnd w:id="70"/>
+      <w:bookmarkEnd w:id="75"/>
     </w:p>
     <w:p>
       <w:r>
@@ -8480,32 +8701,48 @@
         <w:pStyle w:val="Titulek"/>
         <w:jc w:val="center"/>
       </w:pPr>
-      <w:bookmarkStart w:id="71" w:name="_Toc230179644"/>
+      <w:bookmarkStart w:id="76" w:name="_Toc230197181"/>
       <w:r>
         <w:t xml:space="preserve">Obrázek </w:t>
       </w:r>
-      <w:fldSimple w:instr=" SEQ Obrázek \* ARABIC ">
-        <w:r>
-          <w:rPr>
-            <w:noProof/>
-          </w:rPr>
-          <w:t>3</w:t>
-        </w:r>
-      </w:fldSimple>
-      <w:r>
-        <w:t>: Seznam habitů</w:t>
-      </w:r>
-      <w:bookmarkEnd w:id="71"/>
+      <w:r>
+        <w:fldChar w:fldCharType="begin"/>
+      </w:r>
+      <w:r>
+        <w:instrText xml:space="preserve"> SEQ Obrázek \* ARABIC </w:instrText>
+      </w:r>
+      <w:r>
+        <w:fldChar w:fldCharType="separate"/>
+      </w:r>
+      <w:r>
+        <w:rPr>
+          <w:noProof/>
+        </w:rPr>
+        <w:t>3</w:t>
+      </w:r>
+      <w:r>
+        <w:rPr>
+          <w:noProof/>
+        </w:rPr>
+        <w:fldChar w:fldCharType="end"/>
+      </w:r>
+      <w:r>
+        <w:t xml:space="preserve">: Seznam </w:t>
+      </w:r>
+      <w:r>
+        <w:t>návyků</w:t>
+      </w:r>
+      <w:bookmarkEnd w:id="76"/>
     </w:p>
     <w:p>
       <w:pPr>
         <w:pStyle w:val="Nadpis2"/>
       </w:pPr>
-      <w:bookmarkStart w:id="72" w:name="_Toc230182459"/>
+      <w:bookmarkStart w:id="77" w:name="_Toc230197560"/>
       <w:r>
         <w:t>Vizualizace plnění návyku</w:t>
       </w:r>
-      <w:bookmarkEnd w:id="72"/>
+      <w:bookmarkEnd w:id="77"/>
     </w:p>
     <w:p>
       <w:pPr>
@@ -8644,18 +8881,31 @@
         <w:pStyle w:val="Titulek"/>
         <w:jc w:val="center"/>
       </w:pPr>
-      <w:bookmarkStart w:id="73" w:name="_Toc230179653"/>
+      <w:bookmarkStart w:id="78" w:name="_Toc230179653"/>
       <w:r>
         <w:t xml:space="preserve">Tabulka </w:t>
       </w:r>
-      <w:fldSimple w:instr=" SEQ Tabulka \* ARABIC ">
-        <w:r>
-          <w:rPr>
-            <w:noProof/>
-          </w:rPr>
-          <w:t>6</w:t>
-        </w:r>
-      </w:fldSimple>
+      <w:r>
+        <w:fldChar w:fldCharType="begin"/>
+      </w:r>
+      <w:r>
+        <w:instrText xml:space="preserve"> SEQ Tabulka \* ARABIC </w:instrText>
+      </w:r>
+      <w:r>
+        <w:fldChar w:fldCharType="separate"/>
+      </w:r>
+      <w:r>
+        <w:rPr>
+          <w:noProof/>
+        </w:rPr>
+        <w:t>6</w:t>
+      </w:r>
+      <w:r>
+        <w:rPr>
+          <w:noProof/>
+        </w:rPr>
+        <w:fldChar w:fldCharType="end"/>
+      </w:r>
       <w:r>
         <w:t xml:space="preserve">: Vstupy </w:t>
       </w:r>
@@ -8663,7 +8913,7 @@
       <w:r>
         <w:t>HabitGraphu</w:t>
       </w:r>
-      <w:bookmarkEnd w:id="73"/>
+      <w:bookmarkEnd w:id="78"/>
       <w:proofErr w:type="spellEnd"/>
     </w:p>
     <w:p>
@@ -8784,7 +9034,11 @@
           <w:tcPr>
             <w:tcW w:w="4814" w:type="dxa"/>
           </w:tcPr>
-          <w:p/>
+          <w:p>
+            <w:r>
+              <w:t>All</w:t>
+            </w:r>
+          </w:p>
         </w:tc>
         <w:tc>
           <w:tcPr>
@@ -8806,22 +9060,35 @@
         <w:pStyle w:val="Titulek"/>
         <w:jc w:val="center"/>
       </w:pPr>
-      <w:bookmarkStart w:id="74" w:name="_Toc230179654"/>
+      <w:bookmarkStart w:id="79" w:name="_Toc230179654"/>
       <w:r>
         <w:t xml:space="preserve">Tabulka </w:t>
       </w:r>
-      <w:fldSimple w:instr=" SEQ Tabulka \* ARABIC ">
-        <w:r>
-          <w:rPr>
-            <w:noProof/>
-          </w:rPr>
-          <w:t>7</w:t>
-        </w:r>
-      </w:fldSimple>
+      <w:r>
+        <w:fldChar w:fldCharType="begin"/>
+      </w:r>
+      <w:r>
+        <w:instrText xml:space="preserve"> SEQ Tabulka \* ARABIC </w:instrText>
+      </w:r>
+      <w:r>
+        <w:fldChar w:fldCharType="separate"/>
+      </w:r>
+      <w:r>
+        <w:rPr>
+          <w:noProof/>
+        </w:rPr>
+        <w:t>7</w:t>
+      </w:r>
+      <w:r>
+        <w:rPr>
+          <w:noProof/>
+        </w:rPr>
+        <w:fldChar w:fldCharType="end"/>
+      </w:r>
       <w:r>
         <w:t>: možnosti grafu</w:t>
       </w:r>
-      <w:bookmarkEnd w:id="74"/>
+      <w:bookmarkEnd w:id="79"/>
     </w:p>
     <w:p>
       <w:r>
@@ -8908,32 +9175,48 @@
           <w:rStyle w:val="Siln"/>
         </w:rPr>
       </w:pPr>
-      <w:bookmarkStart w:id="75" w:name="_Toc230179645"/>
+      <w:bookmarkStart w:id="80" w:name="_Toc230197182"/>
       <w:r>
         <w:t xml:space="preserve">Obrázek </w:t>
       </w:r>
-      <w:fldSimple w:instr=" SEQ Obrázek \* ARABIC ">
-        <w:r>
-          <w:rPr>
-            <w:noProof/>
-          </w:rPr>
-          <w:t>4</w:t>
-        </w:r>
-      </w:fldSimple>
-      <w:r>
-        <w:t>: Rozevřený habit</w:t>
-      </w:r>
-      <w:bookmarkEnd w:id="75"/>
+      <w:r>
+        <w:fldChar w:fldCharType="begin"/>
+      </w:r>
+      <w:r>
+        <w:instrText xml:space="preserve"> SEQ Obrázek \* ARABIC </w:instrText>
+      </w:r>
+      <w:r>
+        <w:fldChar w:fldCharType="separate"/>
+      </w:r>
+      <w:r>
+        <w:rPr>
+          <w:noProof/>
+        </w:rPr>
+        <w:t>4</w:t>
+      </w:r>
+      <w:r>
+        <w:rPr>
+          <w:noProof/>
+        </w:rPr>
+        <w:fldChar w:fldCharType="end"/>
+      </w:r>
+      <w:r>
+        <w:t xml:space="preserve">: Rozevřený </w:t>
+      </w:r>
+      <w:bookmarkEnd w:id="80"/>
+      <w:r>
+        <w:t>návyk</w:t>
+      </w:r>
     </w:p>
     <w:p>
       <w:pPr>
         <w:pStyle w:val="Nadpis2"/>
       </w:pPr>
-      <w:bookmarkStart w:id="76" w:name="_Toc230182460"/>
+      <w:bookmarkStart w:id="81" w:name="_Toc230197561"/>
       <w:r>
         <w:t>Styling a responzivita aplikace</w:t>
       </w:r>
-      <w:bookmarkEnd w:id="76"/>
+      <w:bookmarkEnd w:id="81"/>
     </w:p>
     <w:p>
       <w:r>
@@ -9125,6 +9408,9 @@
             </w:r>
             <w:proofErr w:type="spellEnd"/>
             <w:r>
+              <w:t xml:space="preserve"> (mřížka)</w:t>
+            </w:r>
+            <w:r>
               <w:t xml:space="preserve"> a jeho buňky jsou přizpůsobeny menším rozměrům tak, aby se obsah vešel do karty v dané velikosti displeje</w:t>
             </w:r>
             <w:r>
@@ -9173,11 +9459,11 @@
             </w:r>
             <w:proofErr w:type="spellStart"/>
             <w:r>
-              <w:t>scrolling</w:t>
+              <w:t>scrolování</w:t>
             </w:r>
             <w:proofErr w:type="spellEnd"/>
             <w:r>
-              <w:t xml:space="preserve">, aby uživatel mohl graf “přejet” do stran a podívat se na detaily i mimo původní viditelnou oblast, protože </w:t>
+              <w:t xml:space="preserve"> aby uživatel mohl graf “přejet” do stran a podívat se na detaily i mimo původní viditelnou oblast, protože </w:t>
             </w:r>
             <w:r>
               <w:t xml:space="preserve">se mi lépe problém nepovedlo </w:t>
@@ -9200,18 +9486,31 @@
         <w:pStyle w:val="Titulek"/>
         <w:jc w:val="center"/>
       </w:pPr>
-      <w:bookmarkStart w:id="77" w:name="_Toc230179655"/>
+      <w:bookmarkStart w:id="82" w:name="_Toc230179655"/>
       <w:r>
         <w:t xml:space="preserve">Tabulka </w:t>
       </w:r>
-      <w:fldSimple w:instr=" SEQ Tabulka \* ARABIC ">
-        <w:r>
-          <w:rPr>
-            <w:noProof/>
-          </w:rPr>
-          <w:t>8</w:t>
-        </w:r>
-      </w:fldSimple>
+      <w:r>
+        <w:fldChar w:fldCharType="begin"/>
+      </w:r>
+      <w:r>
+        <w:instrText xml:space="preserve"> SEQ Tabulka \* ARABIC </w:instrText>
+      </w:r>
+      <w:r>
+        <w:fldChar w:fldCharType="separate"/>
+      </w:r>
+      <w:r>
+        <w:rPr>
+          <w:noProof/>
+        </w:rPr>
+        <w:t>8</w:t>
+      </w:r>
+      <w:r>
+        <w:rPr>
+          <w:noProof/>
+        </w:rPr>
+        <w:fldChar w:fldCharType="end"/>
+      </w:r>
       <w:r>
         <w:t xml:space="preserve">: Komponenty </w:t>
       </w:r>
@@ -9221,15 +9520,18 @@
       <w:r>
         <w:t xml:space="preserve"> na stylování</w:t>
       </w:r>
-      <w:bookmarkEnd w:id="77"/>
-    </w:p>
-    <w:p>
-      <w:r>
-        <w:t xml:space="preserve">Přístup je tedy takový, že aplikace zůstává použitelná i na menších displejích, aniž by docházelo k rozbití layoutu nebo k nečitelnosti obsahu. V případě grafu je preferováno umožnit práci s obsahem přes </w:t>
+      <w:bookmarkEnd w:id="82"/>
+    </w:p>
+    <w:p>
+      <w:r>
+        <w:t xml:space="preserve">Přístup je tedy takový, že aplikace zůstává použitelná i na menších displejích, aniž by docházelo k rozbití layoutu nebo k nečitelnosti obsahu. V případě grafu je preferováno umožnit práci s obsahem </w:t>
+      </w:r>
+      <w:r>
+        <w:t xml:space="preserve">pomocí </w:t>
       </w:r>
       <w:proofErr w:type="spellStart"/>
       <w:r>
-        <w:t>scroll</w:t>
+        <w:t>scrolování</w:t>
       </w:r>
       <w:proofErr w:type="spellEnd"/>
       <w:r>
@@ -9290,33 +9592,46 @@
         <w:pStyle w:val="Titulek"/>
         <w:jc w:val="center"/>
       </w:pPr>
-      <w:bookmarkStart w:id="78" w:name="_Toc230179646"/>
+      <w:bookmarkStart w:id="83" w:name="_Toc230197183"/>
       <w:r>
         <w:t xml:space="preserve">Obrázek </w:t>
       </w:r>
-      <w:fldSimple w:instr=" SEQ Obrázek \* ARABIC ">
-        <w:r>
-          <w:rPr>
-            <w:noProof/>
-          </w:rPr>
-          <w:t>5</w:t>
-        </w:r>
-      </w:fldSimple>
+      <w:r>
+        <w:fldChar w:fldCharType="begin"/>
+      </w:r>
+      <w:r>
+        <w:instrText xml:space="preserve"> SEQ Obrázek \* ARABIC </w:instrText>
+      </w:r>
+      <w:r>
+        <w:fldChar w:fldCharType="separate"/>
+      </w:r>
+      <w:r>
+        <w:rPr>
+          <w:noProof/>
+        </w:rPr>
+        <w:t>5</w:t>
+      </w:r>
+      <w:r>
+        <w:rPr>
+          <w:noProof/>
+        </w:rPr>
+        <w:fldChar w:fldCharType="end"/>
+      </w:r>
       <w:r>
         <w:t>: mobilní verze aplikace</w:t>
       </w:r>
-      <w:bookmarkEnd w:id="78"/>
+      <w:bookmarkEnd w:id="83"/>
     </w:p>
     <w:p>
       <w:pPr>
         <w:pStyle w:val="Nadpis2"/>
       </w:pPr>
-      <w:bookmarkStart w:id="79" w:name="_Toc230182461"/>
+      <w:bookmarkStart w:id="84" w:name="_Toc230197562"/>
       <w:r>
         <w:lastRenderedPageBreak/>
         <w:t>Optimalizace</w:t>
       </w:r>
-      <w:bookmarkEnd w:id="79"/>
+      <w:bookmarkEnd w:id="84"/>
     </w:p>
     <w:p>
       <w:r>
@@ -9330,7 +9645,7 @@
       <w:r>
         <w:t xml:space="preserve"> </w:t>
       </w:r>
-      <w:bookmarkStart w:id="80" w:name="_Toc230182462"/>
+      <w:bookmarkStart w:id="85" w:name="_Toc230197563"/>
       <w:r>
         <w:t>Centrální servis pro data (</w:t>
       </w:r>
@@ -9342,7 +9657,7 @@
       <w:r>
         <w:t>)</w:t>
       </w:r>
-      <w:bookmarkEnd w:id="80"/>
+      <w:bookmarkEnd w:id="85"/>
     </w:p>
     <w:p>
       <w:r>
@@ -9382,11 +9697,11 @@
       <w:pPr>
         <w:pStyle w:val="Nadpis3"/>
       </w:pPr>
-      <w:bookmarkStart w:id="81" w:name="_Toc230182463"/>
+      <w:bookmarkStart w:id="86" w:name="_Toc230197564"/>
       <w:r>
         <w:t>Omezení přepočtů grafu</w:t>
       </w:r>
-      <w:bookmarkEnd w:id="81"/>
+      <w:bookmarkEnd w:id="86"/>
     </w:p>
     <w:p>
       <w:r>
@@ -9398,6 +9713,9 @@
       </w:r>
       <w:proofErr w:type="spellEnd"/>
       <w:r>
+        <w:t xml:space="preserve"> vlastnost</w:t>
+      </w:r>
+      <w:r>
         <w:t>). Díky tomu se graf zbytečně nepřepočítává při každé drobné změně, ale jen když je to potřeba.</w:t>
       </w:r>
     </w:p>
@@ -9409,173 +9727,6 @@
     <w:p>
       <w:r>
         <w:t>Celkově aplikace používá optimalizační principy typické pro front-end vývoj: reaktivní práce se stavem, efektivní zpracování dat a validace na hraně vstupu.</w:t>
-      </w:r>
-    </w:p>
-    <w:p/>
-    <w:p>
-      <w:pPr>
-        <w:pStyle w:val="Nadpis2"/>
-      </w:pPr>
-      <w:bookmarkStart w:id="82" w:name="_Toc230182464"/>
-      <w:r>
-        <w:t>Zkušenosti nabrané z této práce</w:t>
-      </w:r>
-      <w:bookmarkEnd w:id="82"/>
-    </w:p>
-    <w:p>
-      <w:r>
-        <w:t>Během vývoje aplikace Habit Tracker jsem získal/a praktické zkušenosti v několika oblastech, které jsou pro tvorbu školních i reálných projektů důležité.</w:t>
-      </w:r>
-    </w:p>
-    <w:p>
-      <w:pPr>
-        <w:pStyle w:val="Nadpis3"/>
-      </w:pPr>
-      <w:bookmarkStart w:id="83" w:name="_Toc230182465"/>
-      <w:r>
-        <w:t>Angular komponentový přístup</w:t>
-      </w:r>
-      <w:bookmarkEnd w:id="83"/>
-    </w:p>
-    <w:p>
-      <w:r>
-        <w:t>Utvrdil jsem si rozdělování úlohy do samostatných komponent (habit-</w:t>
-      </w:r>
-      <w:proofErr w:type="spellStart"/>
-      <w:r>
-        <w:t>form</w:t>
-      </w:r>
-      <w:proofErr w:type="spellEnd"/>
-      <w:r>
-        <w:t xml:space="preserve">, </w:t>
-      </w:r>
-      <w:proofErr w:type="spellStart"/>
-      <w:r>
-        <w:t>habits</w:t>
-      </w:r>
-      <w:proofErr w:type="spellEnd"/>
-      <w:r>
-        <w:t>-list, habit-</w:t>
-      </w:r>
-      <w:proofErr w:type="spellStart"/>
-      <w:r>
-        <w:t>graph</w:t>
-      </w:r>
-      <w:proofErr w:type="spellEnd"/>
-      <w:r>
-        <w:t>) způsobem, aby byla aplikace přehledná a snadno rozšiřitelná. Zvlášť přínosné bylo používat @Input a @Output pro předávání dat a událostí mezi komponentami.</w:t>
-      </w:r>
-    </w:p>
-    <w:p>
-      <w:pPr>
-        <w:pStyle w:val="Nadpis3"/>
-      </w:pPr>
-      <w:bookmarkStart w:id="84" w:name="_Toc230182466"/>
-      <w:r>
-        <w:t>Práce se stavem a službami</w:t>
-      </w:r>
-      <w:bookmarkEnd w:id="84"/>
-    </w:p>
-    <w:p>
-      <w:r>
-        <w:t xml:space="preserve">Díky této práci jsem se naučil konstruovat </w:t>
-      </w:r>
-      <w:proofErr w:type="spellStart"/>
-      <w:r>
-        <w:t>DataService</w:t>
-      </w:r>
-      <w:proofErr w:type="spellEnd"/>
-      <w:r>
-        <w:t xml:space="preserve"> pro centralizovanou správu dat. Zjistil jsem, že reaktivní přístup (</w:t>
-      </w:r>
-      <w:proofErr w:type="spellStart"/>
-      <w:r>
-        <w:t>BehaviorSubject</w:t>
-      </w:r>
-      <w:proofErr w:type="spellEnd"/>
-      <w:r>
-        <w:t>) výrazně zjednodušuje konzistenci UI a díky tomu se lépe škáluje a opravuje.</w:t>
-      </w:r>
-    </w:p>
-    <w:p>
-      <w:pPr>
-        <w:pStyle w:val="Nadpis3"/>
-      </w:pPr>
-      <w:bookmarkStart w:id="85" w:name="_Toc230182467"/>
-      <w:r>
-        <w:t>Validace a ošetření uživatelských vstupů</w:t>
-      </w:r>
-      <w:bookmarkEnd w:id="85"/>
-    </w:p>
-    <w:p>
-      <w:r>
-        <w:t>Formulář mi ukázal, že validace není jen „checkbox“, ale reálné zabezpečení kvality dat. Zvlášť kontrola duplicit zabránila tomu, aby aplikace obsahovala nesmyslné nebo duplicitní záznamy.</w:t>
-      </w:r>
-    </w:p>
-    <w:p>
-      <w:pPr>
-        <w:pStyle w:val="Nadpis3"/>
-      </w:pPr>
-      <w:bookmarkStart w:id="86" w:name="_Toc230182468"/>
-      <w:r>
-        <w:lastRenderedPageBreak/>
-        <w:t>Transformace dat pro graf</w:t>
-      </w:r>
-      <w:bookmarkEnd w:id="86"/>
-    </w:p>
-    <w:p>
-      <w:r>
-        <w:t>Další velice užitečná a cenná byla zkušenost s tím, jak převést surovou historii událostí na strukturu vhodnou pro graf (binování podle zvoleného období). To je častý problém v reálných aplikacích – data záznamů se musí agregovat do</w:t>
-      </w:r>
-      <w:r>
-        <w:t xml:space="preserve"> </w:t>
-      </w:r>
-      <w:proofErr w:type="spellStart"/>
-      <w:r>
-        <w:t>zobrazovatelných</w:t>
-      </w:r>
-      <w:proofErr w:type="spellEnd"/>
-      <w:r>
-        <w:t xml:space="preserve"> tvarů.</w:t>
-      </w:r>
-    </w:p>
-    <w:p>
-      <w:pPr>
-        <w:pStyle w:val="Nadpis3"/>
-      </w:pPr>
-      <w:bookmarkStart w:id="87" w:name="_Toc230182469"/>
-      <w:r>
-        <w:t>Uživatelská použitelnost</w:t>
-      </w:r>
-      <w:bookmarkEnd w:id="87"/>
-    </w:p>
-    <w:p>
-      <w:r>
-        <w:t>Při implementaci UI (</w:t>
-      </w:r>
-      <w:proofErr w:type="spellStart"/>
-      <w:r>
-        <w:t>toolbar</w:t>
-      </w:r>
-      <w:proofErr w:type="spellEnd"/>
-      <w:r>
-        <w:t xml:space="preserve">, </w:t>
-      </w:r>
-      <w:proofErr w:type="spellStart"/>
-      <w:r>
-        <w:t>taby</w:t>
-      </w:r>
-      <w:proofErr w:type="spellEnd"/>
-      <w:r>
-        <w:t xml:space="preserve">, </w:t>
-      </w:r>
-      <w:proofErr w:type="spellStart"/>
-      <w:r>
-        <w:t>overlay</w:t>
-      </w:r>
-      <w:proofErr w:type="spellEnd"/>
-      <w:r>
-        <w:t>) jsem si uvědomil, že dobré uživatelské rozhraní je stejně důležité jako samotná logika. Aplikace musí být srozumitelná a akce musí být dostupné intuitivně.</w:t>
       </w:r>
     </w:p>
     <w:p>
@@ -9596,42 +9747,170 @@
         </w:numPr>
         <w:ind w:left="720"/>
       </w:pPr>
-      <w:bookmarkStart w:id="88" w:name="_Toc230182470"/>
+      <w:bookmarkStart w:id="87" w:name="_Toc230197571"/>
       <w:r>
         <w:lastRenderedPageBreak/>
         <w:t>Závěr</w:t>
       </w:r>
+      <w:bookmarkEnd w:id="87"/>
+    </w:p>
+    <w:p>
+      <w:pPr>
+        <w:pStyle w:val="Nadpis2"/>
+      </w:pPr>
+      <w:r>
+        <w:tab/>
+        <w:t>Zkušenosti nabrané z práce</w:t>
+      </w:r>
+    </w:p>
+    <w:p>
+      <w:pPr>
+        <w:pStyle w:val="Nadpis3"/>
+      </w:pPr>
+      <w:bookmarkStart w:id="88" w:name="_Toc230197566"/>
+      <w:r>
+        <w:t>Angular komponentový přístup</w:t>
+      </w:r>
       <w:bookmarkEnd w:id="88"/>
     </w:p>
     <w:p>
       <w:r>
-        <w:t xml:space="preserve">Habit-Tracker je webová aplikace, která úspěšně demonstruje praktické využití moderních technologií při tvorbě funkčního a uživatelsky přívětivého nástroje. Během vývoje jsem si osvojil klíčové koncepty Angular frameworku, od komponentové architektury přes správu stavu pomocí služeb až po reaktivní programování s </w:t>
+        <w:t>Utvrdil jsem si rozdělování úlohy do samostatných komponent (habit-</w:t>
       </w:r>
       <w:proofErr w:type="spellStart"/>
       <w:r>
-        <w:t>observables</w:t>
+        <w:t>form</w:t>
       </w:r>
       <w:proofErr w:type="spellEnd"/>
       <w:r>
-        <w:t>.</w:t>
-      </w:r>
-    </w:p>
-    <w:p>
-      <w:r>
-        <w:t xml:space="preserve">Aplikace splňuje svůj primární </w:t>
-      </w:r>
-      <w:proofErr w:type="gramStart"/>
-      <w:r>
-        <w:t>účel - umožňuje</w:t>
-      </w:r>
-      <w:proofErr w:type="gramEnd"/>
-      <w:r>
-        <w:t xml:space="preserve"> uživatelům intuitivně sledovat a spravovat své návyky a zlozvyky s vizuální zpětnou vazbou v reálném čase. Kombinace Angular Material pro konzistentní design, SCSS pro flexibilní stylování a lokálního úložiště pro perzistenci dat vytváří stabilní a rozšiřitelné řešení. Ačkoli je aplikace v současné podobě plně funkční, existují možnosti pro budoucí rozšíření, jako je synchronizace dat přes cloud, notifikace pro připomenutí návyků nebo pokročilejší analýzy trendů.</w:t>
-      </w:r>
-    </w:p>
-    <w:p>
-      <w:r>
-        <w:t>Tato ročníková práce mi pomohla si osvojit nejen praktické dovednosti v moderním webovém vývoji, ale také hlubší pochopení toho, jak propojit technické řešení s uživatelskými potřebami a jak vytvářet aplikace, které jsou funkční a příjemné na používání.</w:t>
+        <w:t xml:space="preserve">, </w:t>
+      </w:r>
+      <w:proofErr w:type="spellStart"/>
+      <w:r>
+        <w:t>habits</w:t>
+      </w:r>
+      <w:proofErr w:type="spellEnd"/>
+      <w:r>
+        <w:t>-list, habit-</w:t>
+      </w:r>
+      <w:proofErr w:type="spellStart"/>
+      <w:r>
+        <w:t>graph</w:t>
+      </w:r>
+      <w:proofErr w:type="spellEnd"/>
+      <w:r>
+        <w:t>) způsobem, aby byla aplikace přehledná a snadno rozšiřitelná. Zvlášť přínosné bylo používat @Input a @Output pro předávání dat a událostí mezi komponentami.</w:t>
+      </w:r>
+    </w:p>
+    <w:p>
+      <w:pPr>
+        <w:pStyle w:val="Nadpis3"/>
+      </w:pPr>
+      <w:bookmarkStart w:id="89" w:name="_Toc230197567"/>
+      <w:r>
+        <w:t>Práce se stavem a službami</w:t>
+      </w:r>
+      <w:bookmarkEnd w:id="89"/>
+    </w:p>
+    <w:p>
+      <w:r>
+        <w:t xml:space="preserve">Díky této práci jsem se naučil konstruovat </w:t>
+      </w:r>
+      <w:proofErr w:type="spellStart"/>
+      <w:r>
+        <w:t>DataService</w:t>
+      </w:r>
+      <w:proofErr w:type="spellEnd"/>
+      <w:r>
+        <w:t xml:space="preserve"> pro centralizovanou správu dat. Zjistil jsem, že reaktivní přístup (</w:t>
+      </w:r>
+      <w:proofErr w:type="spellStart"/>
+      <w:r>
+        <w:t>BehaviorSubject</w:t>
+      </w:r>
+      <w:proofErr w:type="spellEnd"/>
+      <w:r>
+        <w:t>) výrazně zjednodušuje konzistenci UI a díky tomu se lépe škáluje a opravuje.</w:t>
+      </w:r>
+    </w:p>
+    <w:p>
+      <w:pPr>
+        <w:pStyle w:val="Nadpis3"/>
+      </w:pPr>
+      <w:bookmarkStart w:id="90" w:name="_Toc230197568"/>
+      <w:r>
+        <w:t>Validace a ošetření uživatelských vstupů</w:t>
+      </w:r>
+      <w:bookmarkEnd w:id="90"/>
+    </w:p>
+    <w:p>
+      <w:r>
+        <w:t>Formulář mi ukázal, že validace není jen „checkbox“, ale reálné zabezpečení kvality dat. Zvlášť kontrola duplicit zabránila tomu, aby aplikace obsahovala nesmyslné nebo duplicitní záznamy.</w:t>
+      </w:r>
+    </w:p>
+    <w:p>
+      <w:pPr>
+        <w:pStyle w:val="Nadpis3"/>
+      </w:pPr>
+      <w:bookmarkStart w:id="91" w:name="_Toc230197569"/>
+      <w:r>
+        <w:t>Transformace dat pro graf</w:t>
+      </w:r>
+      <w:bookmarkEnd w:id="91"/>
+    </w:p>
+    <w:p>
+      <w:r>
+        <w:t>Další velice užitečná a cenná byla zkušenost s tím, jak převést surovou historii událostí na strukturu vhodnou pro graf (binování podle zvoleného období). To je častý problém v reálných aplikacích – data záznamů se musí agregovat do</w:t>
+      </w:r>
+      <w:r>
+        <w:t xml:space="preserve"> </w:t>
+      </w:r>
+      <w:proofErr w:type="spellStart"/>
+      <w:r>
+        <w:t>zobrazovatelných</w:t>
+      </w:r>
+      <w:proofErr w:type="spellEnd"/>
+      <w:r>
+        <w:t xml:space="preserve"> tvarů.</w:t>
+      </w:r>
+    </w:p>
+    <w:p>
+      <w:pPr>
+        <w:pStyle w:val="Nadpis3"/>
+      </w:pPr>
+      <w:bookmarkStart w:id="92" w:name="_Toc230197570"/>
+      <w:r>
+        <w:t>Uživatelská použitelnost</w:t>
+      </w:r>
+      <w:bookmarkEnd w:id="92"/>
+    </w:p>
+    <w:p>
+      <w:r>
+        <w:t>Při implementaci UI (</w:t>
+      </w:r>
+      <w:proofErr w:type="spellStart"/>
+      <w:r>
+        <w:t>toolbar</w:t>
+      </w:r>
+      <w:proofErr w:type="spellEnd"/>
+      <w:r>
+        <w:t xml:space="preserve">, </w:t>
+      </w:r>
+      <w:proofErr w:type="spellStart"/>
+      <w:r>
+        <w:t>taby</w:t>
+      </w:r>
+      <w:proofErr w:type="spellEnd"/>
+      <w:r>
+        <w:t xml:space="preserve">, </w:t>
+      </w:r>
+      <w:proofErr w:type="spellStart"/>
+      <w:r>
+        <w:t>overlay</w:t>
+      </w:r>
+      <w:proofErr w:type="spellEnd"/>
+      <w:r>
+        <w:t>) jsem si uvědomil, že dobré uživatelské rozhraní je stejně důležité jako samotná logika. Aplikace musí být srozumitelná a akce musí být dostupné intuitivně.</w:t>
       </w:r>
     </w:p>
     <w:p>
@@ -9648,23 +9927,31 @@
         </w:numPr>
         <w:ind w:left="720"/>
       </w:pPr>
-      <w:bookmarkStart w:id="89" w:name="_Toc222315302"/>
-      <w:bookmarkStart w:id="90" w:name="_Toc223513779"/>
-      <w:bookmarkStart w:id="91" w:name="_Toc230182471"/>
+      <w:bookmarkStart w:id="93" w:name="_Toc222315302"/>
+      <w:bookmarkStart w:id="94" w:name="_Toc223513779"/>
+      <w:bookmarkStart w:id="95" w:name="_Toc230197572"/>
       <w:r>
         <w:lastRenderedPageBreak/>
         <w:t>Použitá literatura</w:t>
       </w:r>
-      <w:bookmarkEnd w:id="89"/>
-      <w:bookmarkEnd w:id="90"/>
-      <w:bookmarkEnd w:id="91"/>
+      <w:bookmarkEnd w:id="93"/>
+      <w:bookmarkEnd w:id="94"/>
+      <w:bookmarkEnd w:id="95"/>
     </w:p>
     <w:p>
       <w:pPr>
         <w:pStyle w:val="Pouitliteratura"/>
       </w:pPr>
-      <w:r>
-        <w:t>GOOGLE. Angular [online]. c2026 [cit.  2026-05-20]. Dostupné z:</w:t>
+      <w:bookmarkStart w:id="96" w:name="_Ref230199246"/>
+      <w:r>
+        <w:rPr>
+          <w:b/>
+          <w:bCs/>
+        </w:rPr>
+        <w:t>GOOGLE</w:t>
+      </w:r>
+      <w:r>
+        <w:t>. Angular [online]. c2026 [cit.  2026-05-20]. Dostupné z:</w:t>
       </w:r>
       <w:r>
         <w:t xml:space="preserve"> </w:t>
@@ -9677,11 +9964,13 @@
           <w:t>https://angular.dev/overview</w:t>
         </w:r>
       </w:hyperlink>
+      <w:bookmarkEnd w:id="96"/>
     </w:p>
     <w:p>
       <w:pPr>
         <w:pStyle w:val="Pouitliteratura"/>
       </w:pPr>
+      <w:bookmarkStart w:id="97" w:name="_Ref230200596"/>
       <w:r>
         <w:rPr>
           <w:b/>
@@ -9728,11 +10017,13 @@
           <w:t>https://www.typescriptlang.org/docs/</w:t>
         </w:r>
       </w:hyperlink>
+      <w:bookmarkEnd w:id="97"/>
     </w:p>
     <w:p>
       <w:pPr>
         <w:pStyle w:val="Pouitliteratura"/>
       </w:pPr>
+      <w:bookmarkStart w:id="98" w:name="_Ref230200553"/>
       <w:r>
         <w:rPr>
           <w:b/>
@@ -9765,8 +10056,152 @@
         <w:t>Material</w:t>
       </w:r>
       <w:r>
-        <w:t> [online]. c2026 [cit.  2026-05-20]. Dostupné z: https://material.angular.io/</w:t>
-      </w:r>
+        <w:t> [online]. c2026 [cit.  2026-05-20]. Dostupné z: </w:t>
+      </w:r>
+      <w:hyperlink r:id="rId21" w:history="1">
+        <w:r>
+          <w:rPr>
+            <w:rStyle w:val="Hypertextovodkaz"/>
+          </w:rPr>
+          <w:t>https://material.angular.io/</w:t>
+        </w:r>
+      </w:hyperlink>
+      <w:bookmarkEnd w:id="98"/>
+    </w:p>
+    <w:p>
+      <w:pPr>
+        <w:pStyle w:val="Pouitliteratura"/>
+      </w:pPr>
+      <w:bookmarkStart w:id="99" w:name="_Ref230200702"/>
+      <w:r>
+        <w:rPr>
+          <w:b/>
+          <w:bCs/>
+        </w:rPr>
+        <w:t>REACTIVE</w:t>
+      </w:r>
+      <w:r>
+        <w:t xml:space="preserve"> </w:t>
+      </w:r>
+      <w:r>
+        <w:rPr>
+          <w:b/>
+          <w:bCs/>
+        </w:rPr>
+        <w:t>PROGRAMMING</w:t>
+      </w:r>
+      <w:r>
+        <w:t xml:space="preserve">. </w:t>
+      </w:r>
+      <w:proofErr w:type="spellStart"/>
+      <w:r>
+        <w:t>RxJS</w:t>
+      </w:r>
+      <w:proofErr w:type="spellEnd"/>
+      <w:r>
+        <w:t xml:space="preserve"> </w:t>
+      </w:r>
+      <w:proofErr w:type="spellStart"/>
+      <w:r>
+        <w:t>Documentation</w:t>
+      </w:r>
+      <w:proofErr w:type="spellEnd"/>
+      <w:r>
+        <w:t xml:space="preserve"> [online]. c2026 [cit. 2026-05-20]. Dostupné z: </w:t>
+      </w:r>
+      <w:hyperlink r:id="rId22" w:history="1">
+        <w:r>
+          <w:rPr>
+            <w:rStyle w:val="Hypertextovodkaz"/>
+          </w:rPr>
+          <w:t>https://rxjs.dev/</w:t>
+        </w:r>
+      </w:hyperlink>
+      <w:bookmarkEnd w:id="99"/>
+    </w:p>
+    <w:p>
+      <w:pPr>
+        <w:pStyle w:val="Pouitliteratura"/>
+      </w:pPr>
+      <w:bookmarkStart w:id="100" w:name="_Ref230200351"/>
+      <w:r>
+        <w:rPr>
+          <w:b/>
+          <w:bCs/>
+        </w:rPr>
+        <w:t>SASS</w:t>
+      </w:r>
+      <w:r>
+        <w:t xml:space="preserve"> </w:t>
+      </w:r>
+      <w:r>
+        <w:rPr>
+          <w:b/>
+          <w:bCs/>
+        </w:rPr>
+        <w:t>TEAM</w:t>
+      </w:r>
+      <w:r>
+        <w:t xml:space="preserve">. </w:t>
+      </w:r>
+      <w:proofErr w:type="spellStart"/>
+      <w:r>
+        <w:t>Sass</w:t>
+      </w:r>
+      <w:proofErr w:type="spellEnd"/>
+      <w:r>
+        <w:t xml:space="preserve"> </w:t>
+      </w:r>
+      <w:proofErr w:type="spellStart"/>
+      <w:r>
+        <w:t>Documentation</w:t>
+      </w:r>
+      <w:proofErr w:type="spellEnd"/>
+      <w:r>
+        <w:t xml:space="preserve"> [online]. c2026 [cit. 2026-05-20]. Dostupné z: </w:t>
+      </w:r>
+      <w:hyperlink r:id="rId23" w:history="1">
+        <w:r>
+          <w:rPr>
+            <w:rStyle w:val="Hypertextovodkaz"/>
+          </w:rPr>
+          <w:t>https://sass-lang.com/documentation</w:t>
+        </w:r>
+      </w:hyperlink>
+      <w:bookmarkEnd w:id="100"/>
+    </w:p>
+    <w:p>
+      <w:pPr>
+        <w:pStyle w:val="Pouitliteratura"/>
+      </w:pPr>
+      <w:bookmarkStart w:id="101" w:name="_Ref230200750"/>
+      <w:r>
+        <w:rPr>
+          <w:b/>
+          <w:bCs/>
+        </w:rPr>
+        <w:t>NETLIFY</w:t>
+      </w:r>
+      <w:r>
+        <w:t xml:space="preserve">. Netlify </w:t>
+      </w:r>
+      <w:proofErr w:type="spellStart"/>
+      <w:r>
+        <w:t>Docs</w:t>
+      </w:r>
+      <w:proofErr w:type="spellEnd"/>
+      <w:r>
+        <w:t xml:space="preserve"> [online]. c2026 [cit. 2026-05-20]. Dostupné z: </w:t>
+      </w:r>
+      <w:hyperlink r:id="rId24" w:history="1">
+        <w:r>
+          <w:rPr>
+            <w:rStyle w:val="Hypertextovodkaz"/>
+          </w:rPr>
+          <w:t>https://docs.netlify.com/</w:t>
+        </w:r>
+      </w:hyperlink>
+      <w:bookmarkEnd w:id="101"/>
     </w:p>
     <w:p>
       <w:pPr>
@@ -9786,16 +10221,16 @@
         </w:numPr>
         <w:ind w:left="720"/>
       </w:pPr>
-      <w:bookmarkStart w:id="92" w:name="_Toc222315303"/>
-      <w:bookmarkStart w:id="93" w:name="_Toc223513780"/>
-      <w:bookmarkStart w:id="94" w:name="_Toc230182472"/>
+      <w:bookmarkStart w:id="102" w:name="_Toc222315303"/>
+      <w:bookmarkStart w:id="103" w:name="_Toc223513780"/>
+      <w:bookmarkStart w:id="104" w:name="_Toc230197573"/>
       <w:r>
         <w:lastRenderedPageBreak/>
         <w:t>Seznam obrázků</w:t>
       </w:r>
-      <w:bookmarkEnd w:id="92"/>
-      <w:bookmarkEnd w:id="93"/>
-      <w:bookmarkEnd w:id="94"/>
+      <w:bookmarkEnd w:id="102"/>
+      <w:bookmarkEnd w:id="103"/>
+      <w:bookmarkEnd w:id="104"/>
     </w:p>
     <w:p>
       <w:r>
@@ -9842,7 +10277,7 @@
       <w:r>
         <w:fldChar w:fldCharType="separate"/>
       </w:r>
-      <w:hyperlink w:anchor="_Toc230179642" w:history="1">
+      <w:hyperlink w:anchor="_Toc230197179" w:history="1">
         <w:r>
           <w:rPr>
             <w:rStyle w:val="Hypertextovodkaz"/>
@@ -9869,7 +10304,7 @@
             <w:noProof/>
             <w:webHidden/>
           </w:rPr>
-          <w:instrText xml:space="preserve"> PAGEREF _Toc230179642 \h </w:instrText>
+          <w:instrText xml:space="preserve"> PAGEREF _Toc230197179 \h </w:instrText>
         </w:r>
         <w:r>
           <w:rPr>
@@ -9913,7 +10348,7 @@
           <w:lang w:eastAsia="cs-CZ"/>
         </w:rPr>
       </w:pPr>
-      <w:hyperlink w:anchor="_Toc230179643" w:history="1">
+      <w:hyperlink w:anchor="_Toc230197180" w:history="1">
         <w:r>
           <w:rPr>
             <w:rStyle w:val="Hypertextovodkaz"/>
@@ -9940,7 +10375,7 @@
             <w:noProof/>
             <w:webHidden/>
           </w:rPr>
-          <w:instrText xml:space="preserve"> PAGEREF _Toc230179643 \h </w:instrText>
+          <w:instrText xml:space="preserve"> PAGEREF _Toc230197180 \h </w:instrText>
         </w:r>
         <w:r>
           <w:rPr>
@@ -9984,13 +10419,13 @@
           <w:lang w:eastAsia="cs-CZ"/>
         </w:rPr>
       </w:pPr>
-      <w:hyperlink w:anchor="_Toc230179644" w:history="1">
+      <w:hyperlink w:anchor="_Toc230197181" w:history="1">
         <w:r>
           <w:rPr>
             <w:rStyle w:val="Hypertextovodkaz"/>
             <w:noProof/>
           </w:rPr>
-          <w:t>Obrázek 3: Seznam habitů</w:t>
+          <w:t>Obrázek 3: Seznam návyků</w:t>
         </w:r>
         <w:r>
           <w:rPr>
@@ -10011,7 +10446,7 @@
             <w:noProof/>
             <w:webHidden/>
           </w:rPr>
-          <w:instrText xml:space="preserve"> PAGEREF _Toc230179644 \h </w:instrText>
+          <w:instrText xml:space="preserve"> PAGEREF _Toc230197181 \h </w:instrText>
         </w:r>
         <w:r>
           <w:rPr>
@@ -10055,7 +10490,7 @@
           <w:lang w:eastAsia="cs-CZ"/>
         </w:rPr>
       </w:pPr>
-      <w:hyperlink w:anchor="_Toc230179645" w:history="1">
+      <w:hyperlink w:anchor="_Toc230197182" w:history="1">
         <w:r>
           <w:rPr>
             <w:rStyle w:val="Hypertextovodkaz"/>
@@ -10082,7 +10517,7 @@
             <w:noProof/>
             <w:webHidden/>
           </w:rPr>
-          <w:instrText xml:space="preserve"> PAGEREF _Toc230179645 \h </w:instrText>
+          <w:instrText xml:space="preserve"> PAGEREF _Toc230197182 \h </w:instrText>
         </w:r>
         <w:r>
           <w:rPr>
@@ -10126,7 +10561,7 @@
           <w:lang w:eastAsia="cs-CZ"/>
         </w:rPr>
       </w:pPr>
-      <w:hyperlink w:anchor="_Toc230179646" w:history="1">
+      <w:hyperlink w:anchor="_Toc230197183" w:history="1">
         <w:r>
           <w:rPr>
             <w:rStyle w:val="Hypertextovodkaz"/>
@@ -10153,7 +10588,7 @@
             <w:noProof/>
             <w:webHidden/>
           </w:rPr>
-          <w:instrText xml:space="preserve"> PAGEREF _Toc230179646 \h </w:instrText>
+          <w:instrText xml:space="preserve"> PAGEREF _Toc230197183 \h </w:instrText>
         </w:r>
         <w:r>
           <w:rPr>
@@ -10207,16 +10642,16 @@
         </w:numPr>
         <w:ind w:left="720"/>
       </w:pPr>
-      <w:bookmarkStart w:id="95" w:name="_Toc222315304"/>
-      <w:bookmarkStart w:id="96" w:name="_Toc223513781"/>
-      <w:bookmarkStart w:id="97" w:name="_Toc230182473"/>
+      <w:bookmarkStart w:id="105" w:name="_Toc222315304"/>
+      <w:bookmarkStart w:id="106" w:name="_Toc223513781"/>
+      <w:bookmarkStart w:id="107" w:name="_Toc230197574"/>
       <w:r>
         <w:lastRenderedPageBreak/>
         <w:t>Seznam tabulek</w:t>
       </w:r>
-      <w:bookmarkEnd w:id="95"/>
-      <w:bookmarkEnd w:id="96"/>
-      <w:bookmarkEnd w:id="97"/>
+      <w:bookmarkEnd w:id="105"/>
+      <w:bookmarkEnd w:id="106"/>
+      <w:bookmarkEnd w:id="107"/>
     </w:p>
     <w:p>
       <w:pPr>
@@ -10801,10 +11236,10 @@
       </w:r>
     </w:p>
     <w:sectPr>
-      <w:headerReference w:type="even" r:id="rId21"/>
-      <w:headerReference w:type="default" r:id="rId22"/>
-      <w:footerReference w:type="default" r:id="rId23"/>
-      <w:headerReference w:type="first" r:id="rId24"/>
+      <w:headerReference w:type="even" r:id="rId25"/>
+      <w:headerReference w:type="default" r:id="rId26"/>
+      <w:footerReference w:type="default" r:id="rId27"/>
+      <w:headerReference w:type="first" r:id="rId28"/>
       <w:pgSz w:w="11906" w:h="16838"/>
       <w:pgMar w:top="1701" w:right="1134" w:bottom="1701" w:left="1134" w:header="680" w:footer="680" w:gutter="0"/>
       <w:cols w:space="708"/>
@@ -11234,7 +11669,7 @@
           <wp:extent cx="7567200" cy="10692000"/>
           <wp:effectExtent l="0" t="0" r="0" b="0"/>
           <wp:wrapNone/>
-          <wp:docPr id="605187476" name="Obrázek 1"/>
+          <wp:docPr id="374923427" name="Obrázek 1"/>
           <wp:cNvGraphicFramePr>
             <a:graphicFrameLocks xmlns:a="http://schemas.openxmlformats.org/drawingml/2006/main" noChangeAspect="1"/>
           </wp:cNvGraphicFramePr>
@@ -11310,7 +11745,7 @@
           <wp:extent cx="893264" cy="463877"/>
           <wp:effectExtent l="0" t="0" r="2540" b="0"/>
           <wp:wrapNone/>
-          <wp:docPr id="1270952593" name="Obrázek 187" descr="Obsah obrázku text, Písmo, rukopis, typografie&#10;&#10;Obsah generovaný pomocí AI může být nesprávný."/>
+          <wp:docPr id="1018980385" name="Obrázek 187" descr="Obsah obrázku text, Písmo, rukopis, typografie&#10;&#10;Obsah generovaný pomocí AI může být nesprávný."/>
           <wp:cNvGraphicFramePr>
             <a:graphicFrameLocks xmlns:a="http://schemas.openxmlformats.org/drawingml/2006/main" noChangeAspect="1"/>
           </wp:cNvGraphicFramePr>
@@ -11370,7 +11805,7 @@
           <wp:extent cx="3675600" cy="532800"/>
           <wp:effectExtent l="0" t="0" r="1270" b="635"/>
           <wp:wrapNone/>
-          <wp:docPr id="1376352524" name="Obrázek 184"/>
+          <wp:docPr id="2119906305" name="Obrázek 184"/>
           <wp:cNvGraphicFramePr>
             <a:graphicFrameLocks xmlns:a="http://schemas.openxmlformats.org/drawingml/2006/main" noChangeAspect="1"/>
           </wp:cNvGraphicFramePr>
@@ -15259,7 +15694,6 @@
   <w:style w:type="character" w:default="1" w:styleId="Standardnpsmoodstavce">
     <w:name w:val="Default Paragraph Font"/>
     <w:uiPriority w:val="1"/>
-    <w:semiHidden/>
     <w:unhideWhenUsed/>
   </w:style>
   <w:style w:type="table" w:default="1" w:styleId="Normlntabulka">
@@ -16234,7 +16668,14 @@
 </file>
 
 <file path=customXml/item2.xml><?xml version="1.0" encoding="utf-8"?>
-<b:Sources xmlns:b="http://schemas.openxmlformats.org/officeDocument/2006/bibliography" xmlns="http://schemas.openxmlformats.org/officeDocument/2006/bibliography" SelectedStyle="\APASixthEditionOfficeOnline.xsl" StyleName="APA" Version="6"/>
+<p:properties xmlns:p="http://schemas.microsoft.com/office/2006/metadata/properties" xmlns:xsi="http://www.w3.org/2001/XMLSchema-instance" xmlns:pc="http://schemas.microsoft.com/office/infopath/2007/PartnerControls">
+  <documentManagement>
+    <TaxCatchAll xmlns="9069f8e3-06b5-4841-af59-bd496f6fbcdc" xsi:nil="true"/>
+    <lcf76f155ced4ddcb4097134ff3c332f xmlns="ac4d9f64-92e6-40df-bbe5-cbf691cfe8ae">
+      <Terms xmlns="http://schemas.microsoft.com/office/infopath/2007/PartnerControls"/>
+    </lcf76f155ced4ddcb4097134ff3c332f>
+  </documentManagement>
+</p:properties>
 </file>
 
 <file path=customXml/item3.xml><?xml version="1.0" encoding="utf-8"?>
@@ -16427,14 +16868,7 @@
 </file>
 
 <file path=customXml/item4.xml><?xml version="1.0" encoding="utf-8"?>
-<p:properties xmlns:p="http://schemas.microsoft.com/office/2006/metadata/properties" xmlns:xsi="http://www.w3.org/2001/XMLSchema-instance" xmlns:pc="http://schemas.microsoft.com/office/infopath/2007/PartnerControls">
-  <documentManagement>
-    <TaxCatchAll xmlns="9069f8e3-06b5-4841-af59-bd496f6fbcdc" xsi:nil="true"/>
-    <lcf76f155ced4ddcb4097134ff3c332f xmlns="ac4d9f64-92e6-40df-bbe5-cbf691cfe8ae">
-      <Terms xmlns="http://schemas.microsoft.com/office/infopath/2007/PartnerControls"/>
-    </lcf76f155ced4ddcb4097134ff3c332f>
-  </documentManagement>
-</p:properties>
+<b:Sources xmlns:b="http://schemas.openxmlformats.org/officeDocument/2006/bibliography" xmlns="http://schemas.openxmlformats.org/officeDocument/2006/bibliography" SelectedStyle="\APASixthEditionOfficeOnline.xsl" StyleName="APA" Version="6"/>
 </file>
 
 <file path=customXml/itemProps1.xml><?xml version="1.0" encoding="utf-8"?>
@@ -16446,9 +16880,12 @@
 </file>
 
 <file path=customXml/itemProps2.xml><?xml version="1.0" encoding="utf-8"?>
-<ds:datastoreItem xmlns:ds="http://schemas.openxmlformats.org/officeDocument/2006/customXml" ds:itemID="{E0BB6427-4419-4C21-A0DF-4471F23995B6}">
+<ds:datastoreItem xmlns:ds="http://schemas.openxmlformats.org/officeDocument/2006/customXml" ds:itemID="{FB1D83C0-C8CC-4C35-B0E6-D4B15A08C6B5}">
   <ds:schemaRefs>
-    <ds:schemaRef ds:uri="http://schemas.openxmlformats.org/officeDocument/2006/bibliography"/>
+    <ds:schemaRef ds:uri="http://schemas.microsoft.com/office/2006/metadata/properties"/>
+    <ds:schemaRef ds:uri="http://schemas.microsoft.com/office/infopath/2007/PartnerControls"/>
+    <ds:schemaRef ds:uri="9069f8e3-06b5-4841-af59-bd496f6fbcdc"/>
+    <ds:schemaRef ds:uri="ac4d9f64-92e6-40df-bbe5-cbf691cfe8ae"/>
   </ds:schemaRefs>
 </ds:datastoreItem>
 </file>
@@ -16473,12 +16910,9 @@
 </file>
 
 <file path=customXml/itemProps4.xml><?xml version="1.0" encoding="utf-8"?>
-<ds:datastoreItem xmlns:ds="http://schemas.openxmlformats.org/officeDocument/2006/customXml" ds:itemID="{FB1D83C0-C8CC-4C35-B0E6-D4B15A08C6B5}">
+<ds:datastoreItem xmlns:ds="http://schemas.openxmlformats.org/officeDocument/2006/customXml" ds:itemID="{E0BB6427-4419-4C21-A0DF-4471F23995B6}">
   <ds:schemaRefs>
-    <ds:schemaRef ds:uri="http://schemas.microsoft.com/office/2006/metadata/properties"/>
-    <ds:schemaRef ds:uri="http://schemas.microsoft.com/office/infopath/2007/PartnerControls"/>
-    <ds:schemaRef ds:uri="9069f8e3-06b5-4841-af59-bd496f6fbcdc"/>
-    <ds:schemaRef ds:uri="ac4d9f64-92e6-40df-bbe5-cbf691cfe8ae"/>
+    <ds:schemaRef ds:uri="http://schemas.openxmlformats.org/officeDocument/2006/bibliography"/>
   </ds:schemaRefs>
 </ds:datastoreItem>
 </file>
</xml_diff>

<commit_message>
fix: hopefully finish documentation
</commit_message>
<xml_diff>
--- a/Barta_rocnikova_prace.docx
+++ b/Barta_rocnikova_prace.docx
@@ -1359,6 +1359,7 @@
       <w:bookmarkStart w:id="9" w:name="_Toc230179517"/>
       <w:bookmarkStart w:id="10" w:name="_Toc230182429"/>
       <w:bookmarkStart w:id="11" w:name="_Toc230197530"/>
+      <w:bookmarkStart w:id="12" w:name="_Toc230273303"/>
       <w:r>
         <w:lastRenderedPageBreak/>
         <w:t>Prohlášení</w:t>
@@ -1375,6 +1376,7 @@
       <w:bookmarkEnd w:id="9"/>
       <w:bookmarkEnd w:id="10"/>
       <w:bookmarkEnd w:id="11"/>
+      <w:bookmarkEnd w:id="12"/>
       <w:r>
         <w:t xml:space="preserve"> </w:t>
       </w:r>
@@ -1425,7 +1427,6 @@
       <w:r>
         <w:rPr>
           <w:rFonts w:ascii="Jokerman" w:hAnsi="Jokerman"/>
-          <w:color w:val="EE0000"/>
         </w:rPr>
         <w:t xml:space="preserve"> </w:t>
       </w:r>
@@ -1438,7 +1439,6 @@
       <w:r>
         <w:rPr>
           <w:rFonts w:ascii="Jokerman" w:hAnsi="Jokerman"/>
-          <w:color w:val="EE0000"/>
         </w:rPr>
         <w:t xml:space="preserve"> </w:t>
       </w:r>
@@ -1652,7 +1652,7 @@
         <w:rPr>
           <w:rFonts w:cs="Calibri"/>
         </w:rPr>
-        <w:t>12.11.2025</w:t>
+        <w:t>21.05.2026</w:t>
       </w:r>
       <w:r>
         <w:t>]</w:t>
@@ -1702,21 +1702,21 @@
         </w:numPr>
         <w:ind w:left="720"/>
       </w:pPr>
-      <w:bookmarkStart w:id="12" w:name="_Toc183979916"/>
-      <w:bookmarkStart w:id="13" w:name="_Toc216425626"/>
-      <w:bookmarkStart w:id="14" w:name="_Toc216425784"/>
-      <w:bookmarkStart w:id="15" w:name="_Toc222315289"/>
-      <w:bookmarkStart w:id="16" w:name="_Toc223513764"/>
-      <w:bookmarkStart w:id="17" w:name="_Toc226550176"/>
-      <w:bookmarkStart w:id="18" w:name="_Toc226556218"/>
-      <w:bookmarkStart w:id="19" w:name="_Toc230179518"/>
-      <w:bookmarkStart w:id="20" w:name="_Toc230182430"/>
-      <w:bookmarkStart w:id="21" w:name="_Toc230197531"/>
+      <w:bookmarkStart w:id="13" w:name="_Toc183979916"/>
+      <w:bookmarkStart w:id="14" w:name="_Toc216425626"/>
+      <w:bookmarkStart w:id="15" w:name="_Toc216425784"/>
+      <w:bookmarkStart w:id="16" w:name="_Toc222315289"/>
+      <w:bookmarkStart w:id="17" w:name="_Toc223513764"/>
+      <w:bookmarkStart w:id="18" w:name="_Toc226550176"/>
+      <w:bookmarkStart w:id="19" w:name="_Toc226556218"/>
+      <w:bookmarkStart w:id="20" w:name="_Toc230179518"/>
+      <w:bookmarkStart w:id="21" w:name="_Toc230182430"/>
+      <w:bookmarkStart w:id="22" w:name="_Toc230197531"/>
+      <w:bookmarkStart w:id="23" w:name="_Toc230273304"/>
       <w:r>
         <w:lastRenderedPageBreak/>
         <w:t>Anotace</w:t>
       </w:r>
-      <w:bookmarkEnd w:id="12"/>
       <w:bookmarkEnd w:id="13"/>
       <w:bookmarkEnd w:id="14"/>
       <w:bookmarkEnd w:id="15"/>
@@ -1726,6 +1726,8 @@
       <w:bookmarkEnd w:id="19"/>
       <w:bookmarkEnd w:id="20"/>
       <w:bookmarkEnd w:id="21"/>
+      <w:bookmarkEnd w:id="22"/>
+      <w:bookmarkEnd w:id="23"/>
     </w:p>
     <w:p>
       <w:r>
@@ -1805,11 +1807,9 @@
       <w:r>
         <w:t xml:space="preserve"> pro správu dat, uživatelské rozhraní s navigací přes Material </w:t>
       </w:r>
-      <w:proofErr w:type="spellStart"/>
-      <w:r>
-        <w:t>taby</w:t>
-      </w:r>
-      <w:proofErr w:type="spellEnd"/>
+      <w:r>
+        <w:t>karty</w:t>
+      </w:r>
       <w:r>
         <w:t>, formulář pro vytváření nových návyků s validací a ochranou před duplicitami, seznamy návyků a jejich vizualizace prostřednictvím grafů a kalendářů. Součástí práce jsou také poznatky o optimalizaci aplikace a reflexe získaných zkušeností.</w:t>
       </w:r>
@@ -1837,22 +1837,21 @@
         </w:numPr>
         <w:ind w:left="720"/>
       </w:pPr>
-      <w:bookmarkStart w:id="22" w:name="_Toc183979917"/>
-      <w:bookmarkStart w:id="23" w:name="_Toc216425627"/>
-      <w:bookmarkStart w:id="24" w:name="_Toc216425785"/>
-      <w:bookmarkStart w:id="25" w:name="_Toc222315290"/>
-      <w:bookmarkStart w:id="26" w:name="_Toc223513765"/>
-      <w:bookmarkStart w:id="27" w:name="_Toc226550177"/>
-      <w:bookmarkStart w:id="28" w:name="_Toc226556219"/>
-      <w:bookmarkStart w:id="29" w:name="_Toc230179519"/>
-      <w:bookmarkStart w:id="30" w:name="_Toc230182431"/>
-      <w:bookmarkStart w:id="31" w:name="_Toc230197532"/>
+      <w:bookmarkStart w:id="24" w:name="_Toc183979917"/>
+      <w:bookmarkStart w:id="25" w:name="_Toc216425627"/>
+      <w:bookmarkStart w:id="26" w:name="_Toc216425785"/>
+      <w:bookmarkStart w:id="27" w:name="_Toc222315290"/>
+      <w:bookmarkStart w:id="28" w:name="_Toc223513765"/>
+      <w:bookmarkStart w:id="29" w:name="_Toc226550177"/>
+      <w:bookmarkStart w:id="30" w:name="_Toc226556219"/>
+      <w:bookmarkStart w:id="31" w:name="_Toc230179519"/>
+      <w:bookmarkStart w:id="32" w:name="_Toc230182431"/>
+      <w:bookmarkStart w:id="33" w:name="_Toc230197532"/>
+      <w:bookmarkStart w:id="34" w:name="_Toc230273305"/>
       <w:r>
         <w:lastRenderedPageBreak/>
         <w:t>Klíčová slova</w:t>
       </w:r>
-      <w:bookmarkEnd w:id="22"/>
-      <w:bookmarkEnd w:id="23"/>
       <w:bookmarkEnd w:id="24"/>
       <w:bookmarkEnd w:id="25"/>
       <w:bookmarkEnd w:id="26"/>
@@ -1861,6 +1860,9 @@
       <w:bookmarkEnd w:id="29"/>
       <w:bookmarkEnd w:id="30"/>
       <w:bookmarkEnd w:id="31"/>
+      <w:bookmarkEnd w:id="32"/>
+      <w:bookmarkEnd w:id="33"/>
+      <w:bookmarkEnd w:id="34"/>
     </w:p>
     <w:p>
       <w:r>
@@ -1949,23 +1951,21 @@
         </w:numPr>
         <w:ind w:left="720"/>
       </w:pPr>
-      <w:bookmarkStart w:id="32" w:name="_Toc183979918"/>
-      <w:bookmarkStart w:id="33" w:name="_Toc216425628"/>
-      <w:bookmarkStart w:id="34" w:name="_Toc216425786"/>
-      <w:bookmarkStart w:id="35" w:name="_Toc222315291"/>
-      <w:bookmarkStart w:id="36" w:name="_Toc223513766"/>
-      <w:bookmarkStart w:id="37" w:name="_Toc226550178"/>
-      <w:bookmarkStart w:id="38" w:name="_Toc226556220"/>
-      <w:bookmarkStart w:id="39" w:name="_Toc230179520"/>
-      <w:bookmarkStart w:id="40" w:name="_Toc230182432"/>
-      <w:bookmarkStart w:id="41" w:name="_Toc230197533"/>
+      <w:bookmarkStart w:id="35" w:name="_Toc183979918"/>
+      <w:bookmarkStart w:id="36" w:name="_Toc216425628"/>
+      <w:bookmarkStart w:id="37" w:name="_Toc216425786"/>
+      <w:bookmarkStart w:id="38" w:name="_Toc222315291"/>
+      <w:bookmarkStart w:id="39" w:name="_Toc223513766"/>
+      <w:bookmarkStart w:id="40" w:name="_Toc226550178"/>
+      <w:bookmarkStart w:id="41" w:name="_Toc226556220"/>
+      <w:bookmarkStart w:id="42" w:name="_Toc230179520"/>
+      <w:bookmarkStart w:id="43" w:name="_Toc230182432"/>
+      <w:bookmarkStart w:id="44" w:name="_Toc230197533"/>
+      <w:bookmarkStart w:id="45" w:name="_Toc230273306"/>
       <w:r>
         <w:lastRenderedPageBreak/>
         <w:t>Obsah</w:t>
       </w:r>
-      <w:bookmarkEnd w:id="32"/>
-      <w:bookmarkEnd w:id="33"/>
-      <w:bookmarkEnd w:id="34"/>
       <w:bookmarkEnd w:id="35"/>
       <w:bookmarkEnd w:id="36"/>
       <w:bookmarkEnd w:id="37"/>
@@ -1973,6 +1973,10 @@
       <w:bookmarkEnd w:id="39"/>
       <w:bookmarkEnd w:id="40"/>
       <w:bookmarkEnd w:id="41"/>
+      <w:bookmarkEnd w:id="42"/>
+      <w:bookmarkEnd w:id="43"/>
+      <w:bookmarkEnd w:id="44"/>
+      <w:bookmarkEnd w:id="45"/>
     </w:p>
     <w:sdt>
       <w:sdtPr>
@@ -2011,7 +2015,7 @@
           <w:r>
             <w:fldChar w:fldCharType="separate"/>
           </w:r>
-          <w:hyperlink w:anchor="_Toc230197534" w:history="1">
+          <w:hyperlink w:anchor="_Toc230273307" w:history="1">
             <w:r>
               <w:rPr>
                 <w:rStyle w:val="Hypertextovodkaz"/>
@@ -2038,7 +2042,7 @@
                 <w:noProof/>
                 <w:webHidden/>
               </w:rPr>
-              <w:instrText xml:space="preserve"> PAGEREF _Toc230197534 \h </w:instrText>
+              <w:instrText xml:space="preserve"> PAGEREF _Toc230273307 \h </w:instrText>
             </w:r>
             <w:r>
               <w:rPr>
@@ -2083,7 +2087,7 @@
               <w:lang w:eastAsia="cs-CZ"/>
             </w:rPr>
           </w:pPr>
-          <w:hyperlink w:anchor="_Toc230197535" w:history="1">
+          <w:hyperlink w:anchor="_Toc230273308" w:history="1">
             <w:r>
               <w:rPr>
                 <w:rStyle w:val="Hypertextovodkaz"/>
@@ -2126,7 +2130,7 @@
                 <w:noProof/>
                 <w:webHidden/>
               </w:rPr>
-              <w:instrText xml:space="preserve"> PAGEREF _Toc230197535 \h </w:instrText>
+              <w:instrText xml:space="preserve"> PAGEREF _Toc230273308 \h </w:instrText>
             </w:r>
             <w:r>
               <w:rPr>
@@ -2171,7 +2175,7 @@
               <w:lang w:eastAsia="cs-CZ"/>
             </w:rPr>
           </w:pPr>
-          <w:hyperlink w:anchor="_Toc230197536" w:history="1">
+          <w:hyperlink w:anchor="_Toc230273309" w:history="1">
             <w:r>
               <w:rPr>
                 <w:rStyle w:val="Hypertextovodkaz"/>
@@ -2214,7 +2218,7 @@
                 <w:noProof/>
                 <w:webHidden/>
               </w:rPr>
-              <w:instrText xml:space="preserve"> PAGEREF _Toc230197536 \h </w:instrText>
+              <w:instrText xml:space="preserve"> PAGEREF _Toc230273309 \h </w:instrText>
             </w:r>
             <w:r>
               <w:rPr>
@@ -2259,7 +2263,7 @@
               <w:lang w:eastAsia="cs-CZ"/>
             </w:rPr>
           </w:pPr>
-          <w:hyperlink w:anchor="_Toc230197537" w:history="1">
+          <w:hyperlink w:anchor="_Toc230273310" w:history="1">
             <w:r>
               <w:rPr>
                 <w:rStyle w:val="Hypertextovodkaz"/>
@@ -2302,7 +2306,7 @@
                 <w:noProof/>
                 <w:webHidden/>
               </w:rPr>
-              <w:instrText xml:space="preserve"> PAGEREF _Toc230197537 \h </w:instrText>
+              <w:instrText xml:space="preserve"> PAGEREF _Toc230273310 \h </w:instrText>
             </w:r>
             <w:r>
               <w:rPr>
@@ -2347,7 +2351,7 @@
               <w:lang w:eastAsia="cs-CZ"/>
             </w:rPr>
           </w:pPr>
-          <w:hyperlink w:anchor="_Toc230197538" w:history="1">
+          <w:hyperlink w:anchor="_Toc230273311" w:history="1">
             <w:r>
               <w:rPr>
                 <w:rStyle w:val="Hypertextovodkaz"/>
@@ -2390,7 +2394,7 @@
                 <w:noProof/>
                 <w:webHidden/>
               </w:rPr>
-              <w:instrText xml:space="preserve"> PAGEREF _Toc230197538 \h </w:instrText>
+              <w:instrText xml:space="preserve"> PAGEREF _Toc230273311 \h </w:instrText>
             </w:r>
             <w:r>
               <w:rPr>
@@ -2435,7 +2439,7 @@
               <w:lang w:eastAsia="cs-CZ"/>
             </w:rPr>
           </w:pPr>
-          <w:hyperlink w:anchor="_Toc230197539" w:history="1">
+          <w:hyperlink w:anchor="_Toc230273312" w:history="1">
             <w:r>
               <w:rPr>
                 <w:rStyle w:val="Hypertextovodkaz"/>
@@ -2478,7 +2482,7 @@
                 <w:noProof/>
                 <w:webHidden/>
               </w:rPr>
-              <w:instrText xml:space="preserve"> PAGEREF _Toc230197539 \h </w:instrText>
+              <w:instrText xml:space="preserve"> PAGEREF _Toc230273312 \h </w:instrText>
             </w:r>
             <w:r>
               <w:rPr>
@@ -2523,7 +2527,7 @@
               <w:lang w:eastAsia="cs-CZ"/>
             </w:rPr>
           </w:pPr>
-          <w:hyperlink w:anchor="_Toc230197540" w:history="1">
+          <w:hyperlink w:anchor="_Toc230273313" w:history="1">
             <w:r>
               <w:rPr>
                 <w:rStyle w:val="Hypertextovodkaz"/>
@@ -2566,7 +2570,7 @@
                 <w:noProof/>
                 <w:webHidden/>
               </w:rPr>
-              <w:instrText xml:space="preserve"> PAGEREF _Toc230197540 \h </w:instrText>
+              <w:instrText xml:space="preserve"> PAGEREF _Toc230273313 \h </w:instrText>
             </w:r>
             <w:r>
               <w:rPr>
@@ -2611,7 +2615,7 @@
               <w:lang w:eastAsia="cs-CZ"/>
             </w:rPr>
           </w:pPr>
-          <w:hyperlink w:anchor="_Toc230197541" w:history="1">
+          <w:hyperlink w:anchor="_Toc230273314" w:history="1">
             <w:r>
               <w:rPr>
                 <w:rStyle w:val="Hypertextovodkaz"/>
@@ -2654,7 +2658,7 @@
                 <w:noProof/>
                 <w:webHidden/>
               </w:rPr>
-              <w:instrText xml:space="preserve"> PAGEREF _Toc230197541 \h </w:instrText>
+              <w:instrText xml:space="preserve"> PAGEREF _Toc230273314 \h </w:instrText>
             </w:r>
             <w:r>
               <w:rPr>
@@ -2699,7 +2703,7 @@
               <w:lang w:eastAsia="cs-CZ"/>
             </w:rPr>
           </w:pPr>
-          <w:hyperlink w:anchor="_Toc230197542" w:history="1">
+          <w:hyperlink w:anchor="_Toc230273315" w:history="1">
             <w:r>
               <w:rPr>
                 <w:rStyle w:val="Hypertextovodkaz"/>
@@ -2742,7 +2746,7 @@
                 <w:noProof/>
                 <w:webHidden/>
               </w:rPr>
-              <w:instrText xml:space="preserve"> PAGEREF _Toc230197542 \h </w:instrText>
+              <w:instrText xml:space="preserve"> PAGEREF _Toc230273315 \h </w:instrText>
             </w:r>
             <w:r>
               <w:rPr>
@@ -2787,7 +2791,7 @@
               <w:lang w:eastAsia="cs-CZ"/>
             </w:rPr>
           </w:pPr>
-          <w:hyperlink w:anchor="_Toc230197543" w:history="1">
+          <w:hyperlink w:anchor="_Toc230273316" w:history="1">
             <w:r>
               <w:rPr>
                 <w:rStyle w:val="Hypertextovodkaz"/>
@@ -2830,7 +2834,7 @@
                 <w:noProof/>
                 <w:webHidden/>
               </w:rPr>
-              <w:instrText xml:space="preserve"> PAGEREF _Toc230197543 \h </w:instrText>
+              <w:instrText xml:space="preserve"> PAGEREF _Toc230273316 \h </w:instrText>
             </w:r>
             <w:r>
               <w:rPr>
@@ -2875,7 +2879,7 @@
               <w:lang w:eastAsia="cs-CZ"/>
             </w:rPr>
           </w:pPr>
-          <w:hyperlink w:anchor="_Toc230197544" w:history="1">
+          <w:hyperlink w:anchor="_Toc230273317" w:history="1">
             <w:r>
               <w:rPr>
                 <w:rStyle w:val="Hypertextovodkaz"/>
@@ -2918,7 +2922,7 @@
                 <w:noProof/>
                 <w:webHidden/>
               </w:rPr>
-              <w:instrText xml:space="preserve"> PAGEREF _Toc230197544 \h </w:instrText>
+              <w:instrText xml:space="preserve"> PAGEREF _Toc230273317 \h </w:instrText>
             </w:r>
             <w:r>
               <w:rPr>
@@ -2963,7 +2967,7 @@
               <w:lang w:eastAsia="cs-CZ"/>
             </w:rPr>
           </w:pPr>
-          <w:hyperlink w:anchor="_Toc230197545" w:history="1">
+          <w:hyperlink w:anchor="_Toc230273318" w:history="1">
             <w:r>
               <w:rPr>
                 <w:rStyle w:val="Hypertextovodkaz"/>
@@ -3006,7 +3010,7 @@
                 <w:noProof/>
                 <w:webHidden/>
               </w:rPr>
-              <w:instrText xml:space="preserve"> PAGEREF _Toc230197545 \h </w:instrText>
+              <w:instrText xml:space="preserve"> PAGEREF _Toc230273318 \h </w:instrText>
             </w:r>
             <w:r>
               <w:rPr>
@@ -3051,7 +3055,7 @@
               <w:lang w:eastAsia="cs-CZ"/>
             </w:rPr>
           </w:pPr>
-          <w:hyperlink w:anchor="_Toc230197546" w:history="1">
+          <w:hyperlink w:anchor="_Toc230273319" w:history="1">
             <w:r>
               <w:rPr>
                 <w:rStyle w:val="Hypertextovodkaz"/>
@@ -3094,7 +3098,7 @@
                 <w:noProof/>
                 <w:webHidden/>
               </w:rPr>
-              <w:instrText xml:space="preserve"> PAGEREF _Toc230197546 \h </w:instrText>
+              <w:instrText xml:space="preserve"> PAGEREF _Toc230273319 \h </w:instrText>
             </w:r>
             <w:r>
               <w:rPr>
@@ -3139,7 +3143,7 @@
               <w:lang w:eastAsia="cs-CZ"/>
             </w:rPr>
           </w:pPr>
-          <w:hyperlink w:anchor="_Toc230197547" w:history="1">
+          <w:hyperlink w:anchor="_Toc230273320" w:history="1">
             <w:r>
               <w:rPr>
                 <w:rStyle w:val="Hypertextovodkaz"/>
@@ -3182,7 +3186,7 @@
                 <w:noProof/>
                 <w:webHidden/>
               </w:rPr>
-              <w:instrText xml:space="preserve"> PAGEREF _Toc230197547 \h </w:instrText>
+              <w:instrText xml:space="preserve"> PAGEREF _Toc230273320 \h </w:instrText>
             </w:r>
             <w:r>
               <w:rPr>
@@ -3227,7 +3231,7 @@
               <w:lang w:eastAsia="cs-CZ"/>
             </w:rPr>
           </w:pPr>
-          <w:hyperlink w:anchor="_Toc230197548" w:history="1">
+          <w:hyperlink w:anchor="_Toc230273321" w:history="1">
             <w:r>
               <w:rPr>
                 <w:rStyle w:val="Hypertextovodkaz"/>
@@ -3270,7 +3274,7 @@
                 <w:noProof/>
                 <w:webHidden/>
               </w:rPr>
-              <w:instrText xml:space="preserve"> PAGEREF _Toc230197548 \h </w:instrText>
+              <w:instrText xml:space="preserve"> PAGEREF _Toc230273321 \h </w:instrText>
             </w:r>
             <w:r>
               <w:rPr>
@@ -3315,7 +3319,7 @@
               <w:lang w:eastAsia="cs-CZ"/>
             </w:rPr>
           </w:pPr>
-          <w:hyperlink w:anchor="_Toc230197549" w:history="1">
+          <w:hyperlink w:anchor="_Toc230273322" w:history="1">
             <w:r>
               <w:rPr>
                 <w:rStyle w:val="Hypertextovodkaz"/>
@@ -3358,7 +3362,7 @@
                 <w:noProof/>
                 <w:webHidden/>
               </w:rPr>
-              <w:instrText xml:space="preserve"> PAGEREF _Toc230197549 \h </w:instrText>
+              <w:instrText xml:space="preserve"> PAGEREF _Toc230273322 \h </w:instrText>
             </w:r>
             <w:r>
               <w:rPr>
@@ -3403,7 +3407,7 @@
               <w:lang w:eastAsia="cs-CZ"/>
             </w:rPr>
           </w:pPr>
-          <w:hyperlink w:anchor="_Toc230197550" w:history="1">
+          <w:hyperlink w:anchor="_Toc230273323" w:history="1">
             <w:r>
               <w:rPr>
                 <w:rStyle w:val="Hypertextovodkaz"/>
@@ -3446,7 +3450,7 @@
                 <w:noProof/>
                 <w:webHidden/>
               </w:rPr>
-              <w:instrText xml:space="preserve"> PAGEREF _Toc230197550 \h </w:instrText>
+              <w:instrText xml:space="preserve"> PAGEREF _Toc230273323 \h </w:instrText>
             </w:r>
             <w:r>
               <w:rPr>
@@ -3466,7 +3470,7 @@
                 <w:noProof/>
                 <w:webHidden/>
               </w:rPr>
-              <w:t>12</w:t>
+              <w:t>13</w:t>
             </w:r>
             <w:r>
               <w:rPr>
@@ -3491,7 +3495,7 @@
               <w:lang w:eastAsia="cs-CZ"/>
             </w:rPr>
           </w:pPr>
-          <w:hyperlink w:anchor="_Toc230197551" w:history="1">
+          <w:hyperlink w:anchor="_Toc230273324" w:history="1">
             <w:r>
               <w:rPr>
                 <w:rStyle w:val="Hypertextovodkaz"/>
@@ -3534,7 +3538,7 @@
                 <w:noProof/>
                 <w:webHidden/>
               </w:rPr>
-              <w:instrText xml:space="preserve"> PAGEREF _Toc230197551 \h </w:instrText>
+              <w:instrText xml:space="preserve"> PAGEREF _Toc230273324 \h </w:instrText>
             </w:r>
             <w:r>
               <w:rPr>
@@ -3579,7 +3583,7 @@
               <w:lang w:eastAsia="cs-CZ"/>
             </w:rPr>
           </w:pPr>
-          <w:hyperlink w:anchor="_Toc230197552" w:history="1">
+          <w:hyperlink w:anchor="_Toc230273325" w:history="1">
             <w:r>
               <w:rPr>
                 <w:rStyle w:val="Hypertextovodkaz"/>
@@ -3622,7 +3626,7 @@
                 <w:noProof/>
                 <w:webHidden/>
               </w:rPr>
-              <w:instrText xml:space="preserve"> PAGEREF _Toc230197552 \h </w:instrText>
+              <w:instrText xml:space="preserve"> PAGEREF _Toc230273325 \h </w:instrText>
             </w:r>
             <w:r>
               <w:rPr>
@@ -3667,7 +3671,7 @@
               <w:lang w:eastAsia="cs-CZ"/>
             </w:rPr>
           </w:pPr>
-          <w:hyperlink w:anchor="_Toc230197553" w:history="1">
+          <w:hyperlink w:anchor="_Toc230273326" w:history="1">
             <w:r>
               <w:rPr>
                 <w:rStyle w:val="Hypertextovodkaz"/>
@@ -3710,7 +3714,7 @@
                 <w:noProof/>
                 <w:webHidden/>
               </w:rPr>
-              <w:instrText xml:space="preserve"> PAGEREF _Toc230197553 \h </w:instrText>
+              <w:instrText xml:space="preserve"> PAGEREF _Toc230273326 \h </w:instrText>
             </w:r>
             <w:r>
               <w:rPr>
@@ -3755,7 +3759,7 @@
               <w:lang w:eastAsia="cs-CZ"/>
             </w:rPr>
           </w:pPr>
-          <w:hyperlink w:anchor="_Toc230197554" w:history="1">
+          <w:hyperlink w:anchor="_Toc230273327" w:history="1">
             <w:r>
               <w:rPr>
                 <w:rStyle w:val="Hypertextovodkaz"/>
@@ -3798,7 +3802,7 @@
                 <w:noProof/>
                 <w:webHidden/>
               </w:rPr>
-              <w:instrText xml:space="preserve"> PAGEREF _Toc230197554 \h </w:instrText>
+              <w:instrText xml:space="preserve"> PAGEREF _Toc230273327 \h </w:instrText>
             </w:r>
             <w:r>
               <w:rPr>
@@ -3843,7 +3847,7 @@
               <w:lang w:eastAsia="cs-CZ"/>
             </w:rPr>
           </w:pPr>
-          <w:hyperlink w:anchor="_Toc230197555" w:history="1">
+          <w:hyperlink w:anchor="_Toc230273328" w:history="1">
             <w:r>
               <w:rPr>
                 <w:rStyle w:val="Hypertextovodkaz"/>
@@ -3886,7 +3890,7 @@
                 <w:noProof/>
                 <w:webHidden/>
               </w:rPr>
-              <w:instrText xml:space="preserve"> PAGEREF _Toc230197555 \h </w:instrText>
+              <w:instrText xml:space="preserve"> PAGEREF _Toc230273328 \h </w:instrText>
             </w:r>
             <w:r>
               <w:rPr>
@@ -3906,7 +3910,7 @@
                 <w:noProof/>
                 <w:webHidden/>
               </w:rPr>
-              <w:t>14</w:t>
+              <w:t>15</w:t>
             </w:r>
             <w:r>
               <w:rPr>
@@ -3931,7 +3935,7 @@
               <w:lang w:eastAsia="cs-CZ"/>
             </w:rPr>
           </w:pPr>
-          <w:hyperlink w:anchor="_Toc230197556" w:history="1">
+          <w:hyperlink w:anchor="_Toc230273329" w:history="1">
             <w:r>
               <w:rPr>
                 <w:rStyle w:val="Hypertextovodkaz"/>
@@ -3974,7 +3978,7 @@
                 <w:noProof/>
                 <w:webHidden/>
               </w:rPr>
-              <w:instrText xml:space="preserve"> PAGEREF _Toc230197556 \h </w:instrText>
+              <w:instrText xml:space="preserve"> PAGEREF _Toc230273329 \h </w:instrText>
             </w:r>
             <w:r>
               <w:rPr>
@@ -3994,7 +3998,7 @@
                 <w:noProof/>
                 <w:webHidden/>
               </w:rPr>
-              <w:t>14</w:t>
+              <w:t>15</w:t>
             </w:r>
             <w:r>
               <w:rPr>
@@ -4019,7 +4023,7 @@
               <w:lang w:eastAsia="cs-CZ"/>
             </w:rPr>
           </w:pPr>
-          <w:hyperlink w:anchor="_Toc230197557" w:history="1">
+          <w:hyperlink w:anchor="_Toc230273330" w:history="1">
             <w:r>
               <w:rPr>
                 <w:rStyle w:val="Hypertextovodkaz"/>
@@ -4062,7 +4066,7 @@
                 <w:noProof/>
                 <w:webHidden/>
               </w:rPr>
-              <w:instrText xml:space="preserve"> PAGEREF _Toc230197557 \h </w:instrText>
+              <w:instrText xml:space="preserve"> PAGEREF _Toc230273330 \h </w:instrText>
             </w:r>
             <w:r>
               <w:rPr>
@@ -4082,7 +4086,7 @@
                 <w:noProof/>
                 <w:webHidden/>
               </w:rPr>
-              <w:t>15</w:t>
+              <w:t>16</w:t>
             </w:r>
             <w:r>
               <w:rPr>
@@ -4107,7 +4111,7 @@
               <w:lang w:eastAsia="cs-CZ"/>
             </w:rPr>
           </w:pPr>
-          <w:hyperlink w:anchor="_Toc230197558" w:history="1">
+          <w:hyperlink w:anchor="_Toc230273331" w:history="1">
             <w:r>
               <w:rPr>
                 <w:rStyle w:val="Hypertextovodkaz"/>
@@ -4150,7 +4154,7 @@
                 <w:noProof/>
                 <w:webHidden/>
               </w:rPr>
-              <w:instrText xml:space="preserve"> PAGEREF _Toc230197558 \h </w:instrText>
+              <w:instrText xml:space="preserve"> PAGEREF _Toc230273331 \h </w:instrText>
             </w:r>
             <w:r>
               <w:rPr>
@@ -4170,7 +4174,7 @@
                 <w:noProof/>
                 <w:webHidden/>
               </w:rPr>
-              <w:t>16</w:t>
+              <w:t>17</w:t>
             </w:r>
             <w:r>
               <w:rPr>
@@ -4195,7 +4199,7 @@
               <w:lang w:eastAsia="cs-CZ"/>
             </w:rPr>
           </w:pPr>
-          <w:hyperlink w:anchor="_Toc230197559" w:history="1">
+          <w:hyperlink w:anchor="_Toc230273332" w:history="1">
             <w:r>
               <w:rPr>
                 <w:rStyle w:val="Hypertextovodkaz"/>
@@ -4238,7 +4242,7 @@
                 <w:noProof/>
                 <w:webHidden/>
               </w:rPr>
-              <w:instrText xml:space="preserve"> PAGEREF _Toc230197559 \h </w:instrText>
+              <w:instrText xml:space="preserve"> PAGEREF _Toc230273332 \h </w:instrText>
             </w:r>
             <w:r>
               <w:rPr>
@@ -4258,7 +4262,7 @@
                 <w:noProof/>
                 <w:webHidden/>
               </w:rPr>
-              <w:t>17</w:t>
+              <w:t>18</w:t>
             </w:r>
             <w:r>
               <w:rPr>
@@ -4283,7 +4287,7 @@
               <w:lang w:eastAsia="cs-CZ"/>
             </w:rPr>
           </w:pPr>
-          <w:hyperlink w:anchor="_Toc230197560" w:history="1">
+          <w:hyperlink w:anchor="_Toc230273333" w:history="1">
             <w:r>
               <w:rPr>
                 <w:rStyle w:val="Hypertextovodkaz"/>
@@ -4326,7 +4330,7 @@
                 <w:noProof/>
                 <w:webHidden/>
               </w:rPr>
-              <w:instrText xml:space="preserve"> PAGEREF _Toc230197560 \h </w:instrText>
+              <w:instrText xml:space="preserve"> PAGEREF _Toc230273333 \h </w:instrText>
             </w:r>
             <w:r>
               <w:rPr>
@@ -4346,7 +4350,7 @@
                 <w:noProof/>
                 <w:webHidden/>
               </w:rPr>
-              <w:t>18</w:t>
+              <w:t>19</w:t>
             </w:r>
             <w:r>
               <w:rPr>
@@ -4371,7 +4375,7 @@
               <w:lang w:eastAsia="cs-CZ"/>
             </w:rPr>
           </w:pPr>
-          <w:hyperlink w:anchor="_Toc230197561" w:history="1">
+          <w:hyperlink w:anchor="_Toc230273334" w:history="1">
             <w:r>
               <w:rPr>
                 <w:rStyle w:val="Hypertextovodkaz"/>
@@ -4414,7 +4418,7 @@
                 <w:noProof/>
                 <w:webHidden/>
               </w:rPr>
-              <w:instrText xml:space="preserve"> PAGEREF _Toc230197561 \h </w:instrText>
+              <w:instrText xml:space="preserve"> PAGEREF _Toc230273334 \h </w:instrText>
             </w:r>
             <w:r>
               <w:rPr>
@@ -4434,7 +4438,7 @@
                 <w:noProof/>
                 <w:webHidden/>
               </w:rPr>
-              <w:t>19</w:t>
+              <w:t>20</w:t>
             </w:r>
             <w:r>
               <w:rPr>
@@ -4459,7 +4463,7 @@
               <w:lang w:eastAsia="cs-CZ"/>
             </w:rPr>
           </w:pPr>
-          <w:hyperlink w:anchor="_Toc230197562" w:history="1">
+          <w:hyperlink w:anchor="_Toc230273335" w:history="1">
             <w:r>
               <w:rPr>
                 <w:rStyle w:val="Hypertextovodkaz"/>
@@ -4502,7 +4506,7 @@
                 <w:noProof/>
                 <w:webHidden/>
               </w:rPr>
-              <w:instrText xml:space="preserve"> PAGEREF _Toc230197562 \h </w:instrText>
+              <w:instrText xml:space="preserve"> PAGEREF _Toc230273335 \h </w:instrText>
             </w:r>
             <w:r>
               <w:rPr>
@@ -4522,7 +4526,7 @@
                 <w:noProof/>
                 <w:webHidden/>
               </w:rPr>
-              <w:t>21</w:t>
+              <w:t>22</w:t>
             </w:r>
             <w:r>
               <w:rPr>
@@ -4547,7 +4551,7 @@
               <w:lang w:eastAsia="cs-CZ"/>
             </w:rPr>
           </w:pPr>
-          <w:hyperlink w:anchor="_Toc230197563" w:history="1">
+          <w:hyperlink w:anchor="_Toc230273336" w:history="1">
             <w:r>
               <w:rPr>
                 <w:rStyle w:val="Hypertextovodkaz"/>
@@ -4590,7 +4594,7 @@
                 <w:noProof/>
                 <w:webHidden/>
               </w:rPr>
-              <w:instrText xml:space="preserve"> PAGEREF _Toc230197563 \h </w:instrText>
+              <w:instrText xml:space="preserve"> PAGEREF _Toc230273336 \h </w:instrText>
             </w:r>
             <w:r>
               <w:rPr>
@@ -4610,7 +4614,7 @@
                 <w:noProof/>
                 <w:webHidden/>
               </w:rPr>
-              <w:t>21</w:t>
+              <w:t>22</w:t>
             </w:r>
             <w:r>
               <w:rPr>
@@ -4635,7 +4639,7 @@
               <w:lang w:eastAsia="cs-CZ"/>
             </w:rPr>
           </w:pPr>
-          <w:hyperlink w:anchor="_Toc230197564" w:history="1">
+          <w:hyperlink w:anchor="_Toc230273337" w:history="1">
             <w:r>
               <w:rPr>
                 <w:rStyle w:val="Hypertextovodkaz"/>
@@ -4678,535 +4682,7 @@
                 <w:noProof/>
                 <w:webHidden/>
               </w:rPr>
-              <w:instrText xml:space="preserve"> PAGEREF _Toc230197564 \h </w:instrText>
-            </w:r>
-            <w:r>
-              <w:rPr>
-                <w:noProof/>
-                <w:webHidden/>
-              </w:rPr>
-            </w:r>
-            <w:r>
-              <w:rPr>
-                <w:noProof/>
-                <w:webHidden/>
-              </w:rPr>
-              <w:fldChar w:fldCharType="separate"/>
-            </w:r>
-            <w:r>
-              <w:rPr>
-                <w:noProof/>
-                <w:webHidden/>
-              </w:rPr>
-              <w:t>21</w:t>
-            </w:r>
-            <w:r>
-              <w:rPr>
-                <w:noProof/>
-                <w:webHidden/>
-              </w:rPr>
-              <w:fldChar w:fldCharType="end"/>
-            </w:r>
-          </w:hyperlink>
-        </w:p>
-        <w:p>
-          <w:pPr>
-            <w:pStyle w:val="Obsah2"/>
-            <w:tabs>
-              <w:tab w:val="left" w:pos="960"/>
-              <w:tab w:val="right" w:leader="dot" w:pos="9628"/>
-            </w:tabs>
-            <w:rPr>
-              <w:rFonts w:asciiTheme="minorHAnsi" w:eastAsiaTheme="minorEastAsia" w:hAnsiTheme="minorHAnsi"/>
-              <w:noProof/>
-              <w:sz w:val="24"/>
-              <w:lang w:eastAsia="cs-CZ"/>
-            </w:rPr>
-          </w:pPr>
-          <w:hyperlink w:anchor="_Toc230197565" w:history="1">
-            <w:r>
-              <w:rPr>
-                <w:rStyle w:val="Hypertextovodkaz"/>
-                <w:noProof/>
-              </w:rPr>
-              <w:t>2.8.</w:t>
-            </w:r>
-            <w:r>
-              <w:rPr>
-                <w:rFonts w:asciiTheme="minorHAnsi" w:eastAsiaTheme="minorEastAsia" w:hAnsiTheme="minorHAnsi"/>
-                <w:noProof/>
-                <w:sz w:val="24"/>
-                <w:lang w:eastAsia="cs-CZ"/>
-              </w:rPr>
-              <w:tab/>
-            </w:r>
-            <w:r>
-              <w:rPr>
-                <w:rStyle w:val="Hypertextovodkaz"/>
-                <w:noProof/>
-              </w:rPr>
-              <w:t>Zkušenosti nabrané z této práce</w:t>
-            </w:r>
-            <w:r>
-              <w:rPr>
-                <w:noProof/>
-                <w:webHidden/>
-              </w:rPr>
-              <w:tab/>
-            </w:r>
-            <w:r>
-              <w:rPr>
-                <w:noProof/>
-                <w:webHidden/>
-              </w:rPr>
-              <w:fldChar w:fldCharType="begin"/>
-            </w:r>
-            <w:r>
-              <w:rPr>
-                <w:noProof/>
-                <w:webHidden/>
-              </w:rPr>
-              <w:instrText xml:space="preserve"> PAGEREF _Toc230197565 \h </w:instrText>
-            </w:r>
-            <w:r>
-              <w:rPr>
-                <w:noProof/>
-                <w:webHidden/>
-              </w:rPr>
-            </w:r>
-            <w:r>
-              <w:rPr>
-                <w:noProof/>
-                <w:webHidden/>
-              </w:rPr>
-              <w:fldChar w:fldCharType="separate"/>
-            </w:r>
-            <w:r>
-              <w:rPr>
-                <w:noProof/>
-                <w:webHidden/>
-              </w:rPr>
-              <w:t>21</w:t>
-            </w:r>
-            <w:r>
-              <w:rPr>
-                <w:noProof/>
-                <w:webHidden/>
-              </w:rPr>
-              <w:fldChar w:fldCharType="end"/>
-            </w:r>
-          </w:hyperlink>
-        </w:p>
-        <w:p>
-          <w:pPr>
-            <w:pStyle w:val="Obsah3"/>
-            <w:tabs>
-              <w:tab w:val="left" w:pos="1200"/>
-              <w:tab w:val="right" w:leader="dot" w:pos="9628"/>
-            </w:tabs>
-            <w:rPr>
-              <w:rFonts w:asciiTheme="minorHAnsi" w:eastAsiaTheme="minorEastAsia" w:hAnsiTheme="minorHAnsi"/>
-              <w:noProof/>
-              <w:sz w:val="24"/>
-              <w:lang w:eastAsia="cs-CZ"/>
-            </w:rPr>
-          </w:pPr>
-          <w:hyperlink w:anchor="_Toc230197566" w:history="1">
-            <w:r>
-              <w:rPr>
-                <w:rStyle w:val="Hypertextovodkaz"/>
-                <w:noProof/>
-              </w:rPr>
-              <w:t>2.8.1.</w:t>
-            </w:r>
-            <w:r>
-              <w:rPr>
-                <w:rFonts w:asciiTheme="minorHAnsi" w:eastAsiaTheme="minorEastAsia" w:hAnsiTheme="minorHAnsi"/>
-                <w:noProof/>
-                <w:sz w:val="24"/>
-                <w:lang w:eastAsia="cs-CZ"/>
-              </w:rPr>
-              <w:tab/>
-            </w:r>
-            <w:r>
-              <w:rPr>
-                <w:rStyle w:val="Hypertextovodkaz"/>
-                <w:noProof/>
-              </w:rPr>
-              <w:t>Angular komponentový přístup</w:t>
-            </w:r>
-            <w:r>
-              <w:rPr>
-                <w:noProof/>
-                <w:webHidden/>
-              </w:rPr>
-              <w:tab/>
-            </w:r>
-            <w:r>
-              <w:rPr>
-                <w:noProof/>
-                <w:webHidden/>
-              </w:rPr>
-              <w:fldChar w:fldCharType="begin"/>
-            </w:r>
-            <w:r>
-              <w:rPr>
-                <w:noProof/>
-                <w:webHidden/>
-              </w:rPr>
-              <w:instrText xml:space="preserve"> PAGEREF _Toc230197566 \h </w:instrText>
-            </w:r>
-            <w:r>
-              <w:rPr>
-                <w:noProof/>
-                <w:webHidden/>
-              </w:rPr>
-            </w:r>
-            <w:r>
-              <w:rPr>
-                <w:noProof/>
-                <w:webHidden/>
-              </w:rPr>
-              <w:fldChar w:fldCharType="separate"/>
-            </w:r>
-            <w:r>
-              <w:rPr>
-                <w:noProof/>
-                <w:webHidden/>
-              </w:rPr>
-              <w:t>21</w:t>
-            </w:r>
-            <w:r>
-              <w:rPr>
-                <w:noProof/>
-                <w:webHidden/>
-              </w:rPr>
-              <w:fldChar w:fldCharType="end"/>
-            </w:r>
-          </w:hyperlink>
-        </w:p>
-        <w:p>
-          <w:pPr>
-            <w:pStyle w:val="Obsah3"/>
-            <w:tabs>
-              <w:tab w:val="left" w:pos="1200"/>
-              <w:tab w:val="right" w:leader="dot" w:pos="9628"/>
-            </w:tabs>
-            <w:rPr>
-              <w:rFonts w:asciiTheme="minorHAnsi" w:eastAsiaTheme="minorEastAsia" w:hAnsiTheme="minorHAnsi"/>
-              <w:noProof/>
-              <w:sz w:val="24"/>
-              <w:lang w:eastAsia="cs-CZ"/>
-            </w:rPr>
-          </w:pPr>
-          <w:hyperlink w:anchor="_Toc230197567" w:history="1">
-            <w:r>
-              <w:rPr>
-                <w:rStyle w:val="Hypertextovodkaz"/>
-                <w:noProof/>
-              </w:rPr>
-              <w:t>2.8.2.</w:t>
-            </w:r>
-            <w:r>
-              <w:rPr>
-                <w:rFonts w:asciiTheme="minorHAnsi" w:eastAsiaTheme="minorEastAsia" w:hAnsiTheme="minorHAnsi"/>
-                <w:noProof/>
-                <w:sz w:val="24"/>
-                <w:lang w:eastAsia="cs-CZ"/>
-              </w:rPr>
-              <w:tab/>
-            </w:r>
-            <w:r>
-              <w:rPr>
-                <w:rStyle w:val="Hypertextovodkaz"/>
-                <w:noProof/>
-              </w:rPr>
-              <w:t>Práce se stavem a službami</w:t>
-            </w:r>
-            <w:r>
-              <w:rPr>
-                <w:noProof/>
-                <w:webHidden/>
-              </w:rPr>
-              <w:tab/>
-            </w:r>
-            <w:r>
-              <w:rPr>
-                <w:noProof/>
-                <w:webHidden/>
-              </w:rPr>
-              <w:fldChar w:fldCharType="begin"/>
-            </w:r>
-            <w:r>
-              <w:rPr>
-                <w:noProof/>
-                <w:webHidden/>
-              </w:rPr>
-              <w:instrText xml:space="preserve"> PAGEREF _Toc230197567 \h </w:instrText>
-            </w:r>
-            <w:r>
-              <w:rPr>
-                <w:noProof/>
-                <w:webHidden/>
-              </w:rPr>
-            </w:r>
-            <w:r>
-              <w:rPr>
-                <w:noProof/>
-                <w:webHidden/>
-              </w:rPr>
-              <w:fldChar w:fldCharType="separate"/>
-            </w:r>
-            <w:r>
-              <w:rPr>
-                <w:noProof/>
-                <w:webHidden/>
-              </w:rPr>
-              <w:t>21</w:t>
-            </w:r>
-            <w:r>
-              <w:rPr>
-                <w:noProof/>
-                <w:webHidden/>
-              </w:rPr>
-              <w:fldChar w:fldCharType="end"/>
-            </w:r>
-          </w:hyperlink>
-        </w:p>
-        <w:p>
-          <w:pPr>
-            <w:pStyle w:val="Obsah3"/>
-            <w:tabs>
-              <w:tab w:val="left" w:pos="1200"/>
-              <w:tab w:val="right" w:leader="dot" w:pos="9628"/>
-            </w:tabs>
-            <w:rPr>
-              <w:rFonts w:asciiTheme="minorHAnsi" w:eastAsiaTheme="minorEastAsia" w:hAnsiTheme="minorHAnsi"/>
-              <w:noProof/>
-              <w:sz w:val="24"/>
-              <w:lang w:eastAsia="cs-CZ"/>
-            </w:rPr>
-          </w:pPr>
-          <w:hyperlink w:anchor="_Toc230197568" w:history="1">
-            <w:r>
-              <w:rPr>
-                <w:rStyle w:val="Hypertextovodkaz"/>
-                <w:noProof/>
-              </w:rPr>
-              <w:t>2.8.3.</w:t>
-            </w:r>
-            <w:r>
-              <w:rPr>
-                <w:rFonts w:asciiTheme="minorHAnsi" w:eastAsiaTheme="minorEastAsia" w:hAnsiTheme="minorHAnsi"/>
-                <w:noProof/>
-                <w:sz w:val="24"/>
-                <w:lang w:eastAsia="cs-CZ"/>
-              </w:rPr>
-              <w:tab/>
-            </w:r>
-            <w:r>
-              <w:rPr>
-                <w:rStyle w:val="Hypertextovodkaz"/>
-                <w:noProof/>
-              </w:rPr>
-              <w:t>Validace a ošetření uživatelských vstupů</w:t>
-            </w:r>
-            <w:r>
-              <w:rPr>
-                <w:noProof/>
-                <w:webHidden/>
-              </w:rPr>
-              <w:tab/>
-            </w:r>
-            <w:r>
-              <w:rPr>
-                <w:noProof/>
-                <w:webHidden/>
-              </w:rPr>
-              <w:fldChar w:fldCharType="begin"/>
-            </w:r>
-            <w:r>
-              <w:rPr>
-                <w:noProof/>
-                <w:webHidden/>
-              </w:rPr>
-              <w:instrText xml:space="preserve"> PAGEREF _Toc230197568 \h </w:instrText>
-            </w:r>
-            <w:r>
-              <w:rPr>
-                <w:noProof/>
-                <w:webHidden/>
-              </w:rPr>
-            </w:r>
-            <w:r>
-              <w:rPr>
-                <w:noProof/>
-                <w:webHidden/>
-              </w:rPr>
-              <w:fldChar w:fldCharType="separate"/>
-            </w:r>
-            <w:r>
-              <w:rPr>
-                <w:noProof/>
-                <w:webHidden/>
-              </w:rPr>
-              <w:t>21</w:t>
-            </w:r>
-            <w:r>
-              <w:rPr>
-                <w:noProof/>
-                <w:webHidden/>
-              </w:rPr>
-              <w:fldChar w:fldCharType="end"/>
-            </w:r>
-          </w:hyperlink>
-        </w:p>
-        <w:p>
-          <w:pPr>
-            <w:pStyle w:val="Obsah3"/>
-            <w:tabs>
-              <w:tab w:val="left" w:pos="1200"/>
-              <w:tab w:val="right" w:leader="dot" w:pos="9628"/>
-            </w:tabs>
-            <w:rPr>
-              <w:rFonts w:asciiTheme="minorHAnsi" w:eastAsiaTheme="minorEastAsia" w:hAnsiTheme="minorHAnsi"/>
-              <w:noProof/>
-              <w:sz w:val="24"/>
-              <w:lang w:eastAsia="cs-CZ"/>
-            </w:rPr>
-          </w:pPr>
-          <w:hyperlink w:anchor="_Toc230197569" w:history="1">
-            <w:r>
-              <w:rPr>
-                <w:rStyle w:val="Hypertextovodkaz"/>
-                <w:noProof/>
-              </w:rPr>
-              <w:t>2.8.4.</w:t>
-            </w:r>
-            <w:r>
-              <w:rPr>
-                <w:rFonts w:asciiTheme="minorHAnsi" w:eastAsiaTheme="minorEastAsia" w:hAnsiTheme="minorHAnsi"/>
-                <w:noProof/>
-                <w:sz w:val="24"/>
-                <w:lang w:eastAsia="cs-CZ"/>
-              </w:rPr>
-              <w:tab/>
-            </w:r>
-            <w:r>
-              <w:rPr>
-                <w:rStyle w:val="Hypertextovodkaz"/>
-                <w:noProof/>
-              </w:rPr>
-              <w:t>Transformace dat pro graf</w:t>
-            </w:r>
-            <w:r>
-              <w:rPr>
-                <w:noProof/>
-                <w:webHidden/>
-              </w:rPr>
-              <w:tab/>
-            </w:r>
-            <w:r>
-              <w:rPr>
-                <w:noProof/>
-                <w:webHidden/>
-              </w:rPr>
-              <w:fldChar w:fldCharType="begin"/>
-            </w:r>
-            <w:r>
-              <w:rPr>
-                <w:noProof/>
-                <w:webHidden/>
-              </w:rPr>
-              <w:instrText xml:space="preserve"> PAGEREF _Toc230197569 \h </w:instrText>
-            </w:r>
-            <w:r>
-              <w:rPr>
-                <w:noProof/>
-                <w:webHidden/>
-              </w:rPr>
-            </w:r>
-            <w:r>
-              <w:rPr>
-                <w:noProof/>
-                <w:webHidden/>
-              </w:rPr>
-              <w:fldChar w:fldCharType="separate"/>
-            </w:r>
-            <w:r>
-              <w:rPr>
-                <w:noProof/>
-                <w:webHidden/>
-              </w:rPr>
-              <w:t>22</w:t>
-            </w:r>
-            <w:r>
-              <w:rPr>
-                <w:noProof/>
-                <w:webHidden/>
-              </w:rPr>
-              <w:fldChar w:fldCharType="end"/>
-            </w:r>
-          </w:hyperlink>
-        </w:p>
-        <w:p>
-          <w:pPr>
-            <w:pStyle w:val="Obsah3"/>
-            <w:tabs>
-              <w:tab w:val="left" w:pos="1200"/>
-              <w:tab w:val="right" w:leader="dot" w:pos="9628"/>
-            </w:tabs>
-            <w:rPr>
-              <w:rFonts w:asciiTheme="minorHAnsi" w:eastAsiaTheme="minorEastAsia" w:hAnsiTheme="minorHAnsi"/>
-              <w:noProof/>
-              <w:sz w:val="24"/>
-              <w:lang w:eastAsia="cs-CZ"/>
-            </w:rPr>
-          </w:pPr>
-          <w:hyperlink w:anchor="_Toc230197570" w:history="1">
-            <w:r>
-              <w:rPr>
-                <w:rStyle w:val="Hypertextovodkaz"/>
-                <w:noProof/>
-              </w:rPr>
-              <w:t>2.8.5.</w:t>
-            </w:r>
-            <w:r>
-              <w:rPr>
-                <w:rFonts w:asciiTheme="minorHAnsi" w:eastAsiaTheme="minorEastAsia" w:hAnsiTheme="minorHAnsi"/>
-                <w:noProof/>
-                <w:sz w:val="24"/>
-                <w:lang w:eastAsia="cs-CZ"/>
-              </w:rPr>
-              <w:tab/>
-            </w:r>
-            <w:r>
-              <w:rPr>
-                <w:rStyle w:val="Hypertextovodkaz"/>
-                <w:noProof/>
-              </w:rPr>
-              <w:t>Uživatelská použitelnost</w:t>
-            </w:r>
-            <w:r>
-              <w:rPr>
-                <w:noProof/>
-                <w:webHidden/>
-              </w:rPr>
-              <w:tab/>
-            </w:r>
-            <w:r>
-              <w:rPr>
-                <w:noProof/>
-                <w:webHidden/>
-              </w:rPr>
-              <w:fldChar w:fldCharType="begin"/>
-            </w:r>
-            <w:r>
-              <w:rPr>
-                <w:noProof/>
-                <w:webHidden/>
-              </w:rPr>
-              <w:instrText xml:space="preserve"> PAGEREF _Toc230197570 \h </w:instrText>
+              <w:instrText xml:space="preserve"> PAGEREF _Toc230273337 \h </w:instrText>
             </w:r>
             <w:r>
               <w:rPr>
@@ -5250,7 +4726,7 @@
               <w:lang w:eastAsia="cs-CZ"/>
             </w:rPr>
           </w:pPr>
-          <w:hyperlink w:anchor="_Toc230197571" w:history="1">
+          <w:hyperlink w:anchor="_Toc230273338" w:history="1">
             <w:r>
               <w:rPr>
                 <w:rStyle w:val="Hypertextovodkaz"/>
@@ -5277,7 +4753,7 @@
                 <w:noProof/>
                 <w:webHidden/>
               </w:rPr>
-              <w:instrText xml:space="preserve"> PAGEREF _Toc230197571 \h </w:instrText>
+              <w:instrText xml:space="preserve"> PAGEREF _Toc230273338 \h </w:instrText>
             </w:r>
             <w:r>
               <w:rPr>
@@ -5321,7 +4797,7 @@
               <w:lang w:eastAsia="cs-CZ"/>
             </w:rPr>
           </w:pPr>
-          <w:hyperlink w:anchor="_Toc230197572" w:history="1">
+          <w:hyperlink w:anchor="_Toc230273339" w:history="1">
             <w:r>
               <w:rPr>
                 <w:rStyle w:val="Hypertextovodkaz"/>
@@ -5348,7 +4824,7 @@
                 <w:noProof/>
                 <w:webHidden/>
               </w:rPr>
-              <w:instrText xml:space="preserve"> PAGEREF _Toc230197572 \h </w:instrText>
+              <w:instrText xml:space="preserve"> PAGEREF _Toc230273339 \h </w:instrText>
             </w:r>
             <w:r>
               <w:rPr>
@@ -5392,7 +4868,7 @@
               <w:lang w:eastAsia="cs-CZ"/>
             </w:rPr>
           </w:pPr>
-          <w:hyperlink w:anchor="_Toc230197573" w:history="1">
+          <w:hyperlink w:anchor="_Toc230273340" w:history="1">
             <w:r>
               <w:rPr>
                 <w:rStyle w:val="Hypertextovodkaz"/>
@@ -5419,7 +4895,7 @@
                 <w:noProof/>
                 <w:webHidden/>
               </w:rPr>
-              <w:instrText xml:space="preserve"> PAGEREF _Toc230197573 \h </w:instrText>
+              <w:instrText xml:space="preserve"> PAGEREF _Toc230273340 \h </w:instrText>
             </w:r>
             <w:r>
               <w:rPr>
@@ -5463,7 +4939,7 @@
               <w:lang w:eastAsia="cs-CZ"/>
             </w:rPr>
           </w:pPr>
-          <w:hyperlink w:anchor="_Toc230197574" w:history="1">
+          <w:hyperlink w:anchor="_Toc230273341" w:history="1">
             <w:r>
               <w:rPr>
                 <w:rStyle w:val="Hypertextovodkaz"/>
@@ -5490,7 +4966,7 @@
                 <w:noProof/>
                 <w:webHidden/>
               </w:rPr>
-              <w:instrText xml:space="preserve"> PAGEREF _Toc230197574 \h </w:instrText>
+              <w:instrText xml:space="preserve"> PAGEREF _Toc230273341 \h </w:instrText>
             </w:r>
             <w:r>
               <w:rPr>
@@ -5562,12 +5038,12 @@
         </w:numPr>
         <w:ind w:left="720"/>
       </w:pPr>
-      <w:bookmarkStart w:id="42" w:name="_Toc230197534"/>
+      <w:bookmarkStart w:id="46" w:name="_Toc230273307"/>
       <w:r>
         <w:lastRenderedPageBreak/>
         <w:t>Úvod</w:t>
       </w:r>
-      <w:bookmarkEnd w:id="42"/>
+      <w:bookmarkEnd w:id="46"/>
     </w:p>
     <w:p>
       <w:r>
@@ -5653,18 +5129,18 @@
       <w:pPr>
         <w:pStyle w:val="Nadpis1"/>
       </w:pPr>
-      <w:bookmarkStart w:id="43" w:name="_Toc230197535"/>
+      <w:bookmarkStart w:id="47" w:name="_Toc230273308"/>
       <w:r>
         <w:lastRenderedPageBreak/>
         <w:t>Použité nástroje</w:t>
       </w:r>
-      <w:bookmarkEnd w:id="43"/>
+      <w:bookmarkEnd w:id="47"/>
     </w:p>
     <w:p>
       <w:pPr>
         <w:pStyle w:val="Nadpis2"/>
       </w:pPr>
-      <w:bookmarkStart w:id="44" w:name="_Toc230197536"/>
+      <w:bookmarkStart w:id="48" w:name="_Toc230273309"/>
       <w:proofErr w:type="spellStart"/>
       <w:r>
         <w:t>Visual</w:t>
@@ -5677,7 +5153,7 @@
       <w:r>
         <w:t>Code</w:t>
       </w:r>
-      <w:bookmarkEnd w:id="44"/>
+      <w:bookmarkEnd w:id="48"/>
       <w:proofErr w:type="spellEnd"/>
     </w:p>
     <w:p>
@@ -5687,7 +5163,6 @@
           <w:sz w:val="24"/>
         </w:rPr>
       </w:pPr>
-      <w:bookmarkStart w:id="45" w:name="_Toc230197537"/>
       <w:r>
         <w:t xml:space="preserve">Pro vývoj této webové aplikace jsem zvolil </w:t>
       </w:r>
@@ -5712,10 +5187,11 @@
       <w:pPr>
         <w:pStyle w:val="Nadpis3"/>
       </w:pPr>
+      <w:bookmarkStart w:id="49" w:name="_Toc230273310"/>
       <w:r>
         <w:t>Školní zkušenost</w:t>
       </w:r>
-      <w:bookmarkEnd w:id="45"/>
+      <w:bookmarkEnd w:id="49"/>
     </w:p>
     <w:p>
       <w:pPr>
@@ -5724,7 +5200,6 @@
           <w:sz w:val="24"/>
         </w:rPr>
       </w:pPr>
-      <w:bookmarkStart w:id="46" w:name="_Toc230197538"/>
       <w:r>
         <w:t xml:space="preserve">Prvním z důvodů pro vybrání </w:t>
       </w:r>
@@ -5741,10 +5216,11 @@
       <w:pPr>
         <w:pStyle w:val="Nadpis3"/>
       </w:pPr>
+      <w:bookmarkStart w:id="50" w:name="_Toc230273311"/>
       <w:r>
         <w:t>Integrovaný terminál</w:t>
       </w:r>
-      <w:bookmarkEnd w:id="46"/>
+      <w:bookmarkEnd w:id="50"/>
     </w:p>
     <w:p>
       <w:pPr>
@@ -5753,7 +5229,6 @@
           <w:sz w:val="24"/>
         </w:rPr>
       </w:pPr>
-      <w:bookmarkStart w:id="47" w:name="_Toc230197539"/>
       <w:r>
         <w:t xml:space="preserve">Dalším důvodem pro využívání </w:t>
       </w:r>
@@ -5778,6 +5253,7 @@
       <w:pPr>
         <w:pStyle w:val="Nadpis3"/>
       </w:pPr>
+      <w:bookmarkStart w:id="51" w:name="_Toc230273312"/>
       <w:r>
         <w:t>Rozšíření prostředí (</w:t>
       </w:r>
@@ -5789,7 +5265,7 @@
       <w:r>
         <w:t>)</w:t>
       </w:r>
-      <w:bookmarkEnd w:id="47"/>
+      <w:bookmarkEnd w:id="51"/>
     </w:p>
     <w:p>
       <w:pPr>
@@ -5798,7 +5274,6 @@
           <w:sz w:val="24"/>
         </w:rPr>
       </w:pPr>
-      <w:bookmarkStart w:id="48" w:name="_Toc230197540"/>
       <w:r>
         <w:t xml:space="preserve">Teoreticky by šlo vytvořit aplikaci i bez nich, ale práce jako taková by byla zbytečně těžší a mnohem pomalejší. </w:t>
       </w:r>
@@ -5847,10 +5322,11 @@
       <w:pPr>
         <w:pStyle w:val="Nadpis3"/>
       </w:pPr>
+      <w:bookmarkStart w:id="52" w:name="_Toc230273313"/>
       <w:r>
         <w:t>Git podpora</w:t>
       </w:r>
-      <w:bookmarkEnd w:id="48"/>
+      <w:bookmarkEnd w:id="52"/>
     </w:p>
     <w:p>
       <w:pPr>
@@ -5891,11 +5367,11 @@
       <w:pPr>
         <w:pStyle w:val="Nadpis2"/>
       </w:pPr>
-      <w:bookmarkStart w:id="49" w:name="_Toc230197541"/>
+      <w:bookmarkStart w:id="53" w:name="_Toc230273314"/>
       <w:r>
         <w:t>Angular</w:t>
       </w:r>
-      <w:bookmarkEnd w:id="49"/>
+      <w:bookmarkEnd w:id="53"/>
     </w:p>
     <w:p>
       <w:pPr>
@@ -5904,7 +5380,6 @@
           <w:sz w:val="24"/>
         </w:rPr>
       </w:pPr>
-      <w:bookmarkStart w:id="50" w:name="_Toc230197542"/>
       <w:r>
         <w:t xml:space="preserve">Každá aplikace potřebuje své „jádro", tedy framework, který určuje strukturu celé práce. Jelikož je Habit-Tracker navržen jako Single Page </w:t>
       </w:r>
@@ -5946,6 +5421,7 @@
       <w:pPr>
         <w:pStyle w:val="Nadpis3"/>
       </w:pPr>
+      <w:bookmarkStart w:id="54" w:name="_Toc230273315"/>
       <w:r>
         <w:t>SCSS (</w:t>
       </w:r>
@@ -5957,7 +5433,7 @@
       <w:r>
         <w:t xml:space="preserve"> CSS)</w:t>
       </w:r>
-      <w:bookmarkEnd w:id="50"/>
+      <w:bookmarkEnd w:id="54"/>
     </w:p>
     <w:p>
       <w:pPr>
@@ -5966,7 +5442,6 @@
           <w:sz w:val="24"/>
         </w:rPr>
       </w:pPr>
-      <w:bookmarkStart w:id="51" w:name="_Toc230197543"/>
       <w:r>
         <w:t xml:space="preserve">Habit-Tracker používá SCSS pro stylování. SCSS je rozšíření CSS, které přidává funkce jako proměnné, vnořování a </w:t>
       </w:r>
@@ -5996,13 +5471,7 @@
         <w:fldChar w:fldCharType="separate"/>
       </w:r>
       <w:r>
-        <w:t>[</w:t>
-      </w:r>
-      <w:r>
-        <w:t>5</w:t>
-      </w:r>
-      <w:r>
-        <w:t>]</w:t>
+        <w:t>[5]</w:t>
       </w:r>
       <w:r>
         <w:fldChar w:fldCharType="end"/>
@@ -6012,10 +5481,11 @@
       <w:pPr>
         <w:pStyle w:val="Nadpis3"/>
       </w:pPr>
+      <w:bookmarkStart w:id="55" w:name="_Toc230273316"/>
       <w:r>
         <w:t>Komponentová architektura</w:t>
       </w:r>
-      <w:bookmarkEnd w:id="51"/>
+      <w:bookmarkEnd w:id="55"/>
     </w:p>
     <w:p>
       <w:pPr>
@@ -6024,7 +5494,6 @@
           <w:sz w:val="24"/>
         </w:rPr>
       </w:pPr>
-      <w:bookmarkStart w:id="52" w:name="_Toc230197544"/>
       <w:r>
         <w:t>Celý Habit-Tracker jsem rozdělil na nezávislé a znovupoužitelné komponenty. Tento přístup považuji za jeden z největších důvodů, proč je Angular pro podobné projekty tak vhodný. Místo toho, aby byl celý kód „na jednom místě", má každá část aplikace svůj vlastní komponentní soubor a vlastní logiku i šablonu.</w:t>
       </w:r>
@@ -6038,6 +5507,7 @@
       <w:pPr>
         <w:pStyle w:val="Nadpis3"/>
       </w:pPr>
+      <w:bookmarkStart w:id="56" w:name="_Toc230273317"/>
       <w:proofErr w:type="spellStart"/>
       <w:r>
         <w:t>Services</w:t>
@@ -6058,7 +5528,7 @@
       <w:r>
         <w:t>Injection</w:t>
       </w:r>
-      <w:bookmarkEnd w:id="52"/>
+      <w:bookmarkEnd w:id="56"/>
       <w:proofErr w:type="spellEnd"/>
     </w:p>
     <w:p>
@@ -6071,13 +5541,7 @@
       </w:r>
       <w:proofErr w:type="spellEnd"/>
       <w:r>
-        <w:t>. Tato služba je v projektu zodpovědná za to, aby aplikace měla odkud brát data a kam je ukládat. V mém případě se data ukládají lokálně v prohlížeči (pomocí lokálního uložiště). Komponenty tak nemusejí řešit samotnou logiku ukládání – jen si řeknou, jaké data potřebují, a služba</w:t>
-      </w:r>
-      <w:r>
-        <w:t xml:space="preserve"> je </w:t>
-      </w:r>
-      <w:r>
-        <w:t>poskytne.</w:t>
+        <w:t>. Tato služba je v projektu zodpovědná za to, aby aplikace měla odkud brát data a kam je ukládat. V mém případě se data ukládají lokálně v prohlížeči (pomocí lokálního uložiště). Komponenty tak nemusejí řešit samotnou logiku ukládání – jen si řeknou, jaké data potřebují, a služba je poskytne.</w:t>
       </w:r>
     </w:p>
     <w:p>
@@ -6087,8 +5551,7 @@
           <w:sz w:val="24"/>
         </w:rPr>
       </w:pPr>
-      <w:bookmarkStart w:id="53" w:name="_Toc230197545"/>
-      <w:bookmarkStart w:id="54" w:name="_Ref230199175"/>
+      <w:bookmarkStart w:id="57" w:name="_Ref230199175"/>
       <w:r>
         <w:t xml:space="preserve">Angular k tomu přidává ještě systém </w:t>
       </w:r>
@@ -6121,11 +5584,12 @@
       <w:pPr>
         <w:pStyle w:val="Nadpis3"/>
       </w:pPr>
+      <w:bookmarkStart w:id="58" w:name="_Toc230273318"/>
       <w:r>
         <w:t>Angular CLI</w:t>
       </w:r>
-      <w:bookmarkEnd w:id="53"/>
-      <w:bookmarkEnd w:id="54"/>
+      <w:bookmarkEnd w:id="57"/>
+      <w:bookmarkEnd w:id="58"/>
     </w:p>
     <w:p>
       <w:pPr>
@@ -6153,10 +5617,7 @@
         <w:fldChar w:fldCharType="end"/>
       </w:r>
       <w:r>
-        <w:t xml:space="preserve"> </w:t>
-      </w:r>
-      <w:r>
-        <w:t>Pomocí něj se dají generovat nové komponenty, služby nebo další části projektu prostřednictvím schémat (</w:t>
+        <w:t xml:space="preserve"> Pomocí něj se dají generovat nové komponenty, služby nebo další části projektu prostřednictvím schémat (</w:t>
       </w:r>
       <w:proofErr w:type="spellStart"/>
       <w:r>
@@ -6180,11 +5641,11 @@
       <w:pPr>
         <w:pStyle w:val="Nadpis2"/>
       </w:pPr>
-      <w:bookmarkStart w:id="55" w:name="_Toc230197546"/>
+      <w:bookmarkStart w:id="59" w:name="_Toc230273319"/>
       <w:r>
         <w:t>Angular Material</w:t>
       </w:r>
-      <w:bookmarkEnd w:id="55"/>
+      <w:bookmarkEnd w:id="59"/>
     </w:p>
     <w:p>
       <w:pPr>
@@ -6193,7 +5654,6 @@
           <w:sz w:val="24"/>
         </w:rPr>
       </w:pPr>
-      <w:bookmarkStart w:id="56" w:name="_Toc230197547"/>
       <w:r>
         <w:t xml:space="preserve">Pro hlavní stránku jsou klíčové komponenty </w:t>
       </w:r>
@@ -6234,10 +5694,11 @@
       <w:pPr>
         <w:pStyle w:val="Nadpis3"/>
       </w:pPr>
+      <w:bookmarkStart w:id="60" w:name="_Toc230273320"/>
       <w:r>
         <w:t>Karty a panely</w:t>
       </w:r>
-      <w:bookmarkEnd w:id="56"/>
+      <w:bookmarkEnd w:id="60"/>
     </w:p>
     <w:p>
       <w:pPr>
@@ -6246,7 +5707,6 @@
           <w:sz w:val="24"/>
         </w:rPr>
       </w:pPr>
-      <w:bookmarkStart w:id="57" w:name="_Toc230197548"/>
       <w:r>
         <w:t xml:space="preserve">Pro hlavní stránku jsou klíčové komponenty </w:t>
       </w:r>
@@ -6318,10 +5778,11 @@
       <w:pPr>
         <w:pStyle w:val="Nadpis3"/>
       </w:pPr>
+      <w:bookmarkStart w:id="61" w:name="_Toc230273321"/>
       <w:r>
         <w:t>Formulářové prvky a ikony</w:t>
       </w:r>
-      <w:bookmarkEnd w:id="57"/>
+      <w:bookmarkEnd w:id="61"/>
     </w:p>
     <w:p>
       <w:pPr>
@@ -6330,7 +5791,6 @@
           <w:sz w:val="24"/>
         </w:rPr>
       </w:pPr>
-      <w:bookmarkStart w:id="58" w:name="_Toc230197549"/>
       <w:r>
         <w:t xml:space="preserve">Pro zadávání názvu nového návyku a výběr barvy používám ovládací prvky </w:t>
       </w:r>
@@ -6355,11 +5815,12 @@
       <w:pPr>
         <w:pStyle w:val="Nadpis2"/>
       </w:pPr>
+      <w:bookmarkStart w:id="62" w:name="_Toc230273322"/>
       <w:proofErr w:type="spellStart"/>
       <w:r>
         <w:t>TypeScript</w:t>
       </w:r>
-      <w:bookmarkEnd w:id="58"/>
+      <w:bookmarkEnd w:id="62"/>
       <w:proofErr w:type="spellEnd"/>
     </w:p>
     <w:p>
@@ -6369,7 +5830,6 @@
           <w:sz w:val="24"/>
         </w:rPr>
       </w:pPr>
-      <w:bookmarkStart w:id="59" w:name="_Toc230197550"/>
       <w:proofErr w:type="spellStart"/>
       <w:r>
         <w:t>TypeScript</w:t>
@@ -6483,11 +5943,12 @@
       <w:pPr>
         <w:pStyle w:val="Nadpis3"/>
       </w:pPr>
+      <w:bookmarkStart w:id="63" w:name="_Toc230273323"/>
       <w:r>
         <w:lastRenderedPageBreak/>
         <w:t>Statické typování</w:t>
       </w:r>
-      <w:bookmarkEnd w:id="59"/>
+      <w:bookmarkEnd w:id="63"/>
     </w:p>
     <w:p>
       <w:pPr>
@@ -6496,7 +5957,6 @@
           <w:sz w:val="24"/>
         </w:rPr>
       </w:pPr>
-      <w:bookmarkStart w:id="60" w:name="_Toc230197551"/>
       <w:r>
         <w:t xml:space="preserve">Jednou z hlavních výhod </w:t>
       </w:r>
@@ -6555,6 +6015,7 @@
       <w:pPr>
         <w:pStyle w:val="Nadpis3"/>
       </w:pPr>
+      <w:bookmarkStart w:id="64" w:name="_Toc230273324"/>
       <w:proofErr w:type="spellStart"/>
       <w:r>
         <w:t>Interfaces</w:t>
@@ -6563,7 +6024,7 @@
       <w:r>
         <w:t xml:space="preserve"> a typy</w:t>
       </w:r>
-      <w:bookmarkEnd w:id="60"/>
+      <w:bookmarkEnd w:id="64"/>
     </w:p>
     <w:p>
       <w:pPr>
@@ -6572,7 +6033,6 @@
           <w:sz w:val="24"/>
         </w:rPr>
       </w:pPr>
-      <w:bookmarkStart w:id="61" w:name="_Toc230197552"/>
       <w:proofErr w:type="spellStart"/>
       <w:r>
         <w:t>Interfaces</w:t>
@@ -6607,6 +6067,7 @@
       <w:pPr>
         <w:pStyle w:val="Nadpis3"/>
       </w:pPr>
+      <w:bookmarkStart w:id="65" w:name="_Toc230273325"/>
       <w:proofErr w:type="spellStart"/>
       <w:r>
         <w:t>Dekorátory</w:t>
@@ -6615,7 +6076,7 @@
       <w:r>
         <w:t xml:space="preserve"> a metadata</w:t>
       </w:r>
-      <w:bookmarkEnd w:id="61"/>
+      <w:bookmarkEnd w:id="65"/>
     </w:p>
     <w:p>
       <w:pPr>
@@ -6624,7 +6085,6 @@
           <w:sz w:val="24"/>
         </w:rPr>
       </w:pPr>
-      <w:bookmarkStart w:id="62" w:name="_Toc230197553"/>
       <w:proofErr w:type="spellStart"/>
       <w:r>
         <w:t>TypeScript</w:t>
@@ -6715,10 +6175,11 @@
       <w:pPr>
         <w:pStyle w:val="Nadpis3"/>
       </w:pPr>
+      <w:bookmarkStart w:id="66" w:name="_Toc230273326"/>
       <w:r>
         <w:t>Generické typy</w:t>
       </w:r>
-      <w:bookmarkEnd w:id="62"/>
+      <w:bookmarkEnd w:id="66"/>
     </w:p>
     <w:p>
       <w:pPr>
@@ -6727,7 +6188,6 @@
           <w:sz w:val="24"/>
         </w:rPr>
       </w:pPr>
-      <w:bookmarkStart w:id="63" w:name="_Toc230197554"/>
       <w:proofErr w:type="spellStart"/>
       <w:r>
         <w:t>TypeScript</w:t>
@@ -6812,10 +6272,11 @@
       <w:pPr>
         <w:pStyle w:val="Nadpis2"/>
       </w:pPr>
+      <w:bookmarkStart w:id="67" w:name="_Toc230273327"/>
       <w:r>
         <w:t>Netlify</w:t>
       </w:r>
-      <w:bookmarkEnd w:id="63"/>
+      <w:bookmarkEnd w:id="67"/>
     </w:p>
     <w:p>
       <w:pPr>
@@ -6877,25 +6338,25 @@
       <w:pPr>
         <w:pStyle w:val="Nadpis1"/>
       </w:pPr>
-      <w:bookmarkStart w:id="64" w:name="_Toc230197555"/>
+      <w:bookmarkStart w:id="68" w:name="_Toc230273328"/>
       <w:r>
         <w:lastRenderedPageBreak/>
         <w:t>Tvorba Aplikace</w:t>
       </w:r>
-      <w:bookmarkEnd w:id="64"/>
+      <w:bookmarkEnd w:id="68"/>
     </w:p>
     <w:p>
       <w:pPr>
         <w:pStyle w:val="Nadpis2"/>
       </w:pPr>
-      <w:bookmarkStart w:id="65" w:name="_Toc230197556"/>
+      <w:bookmarkStart w:id="69" w:name="_Toc230273329"/>
       <w:r>
         <w:t>Modelovaní</w:t>
       </w:r>
       <w:r>
         <w:t xml:space="preserve"> dat a služby</w:t>
       </w:r>
-      <w:bookmarkEnd w:id="65"/>
+      <w:bookmarkEnd w:id="69"/>
     </w:p>
     <w:p>
       <w:r>
@@ -6909,6 +6370,7 @@
       <w:tblPr>
         <w:tblStyle w:val="Mkatabulky"/>
         <w:tblW w:w="0" w:type="auto"/>
+        <w:jc w:val="center"/>
         <w:tblLook w:val="04A0" w:firstRow="1" w:lastRow="0" w:firstColumn="1" w:lastColumn="0" w:noHBand="0" w:noVBand="1"/>
       </w:tblPr>
       <w:tblGrid>
@@ -6917,6 +6379,9 @@
         <w:gridCol w:w="3210"/>
       </w:tblGrid>
       <w:tr>
+        <w:trPr>
+          <w:jc w:val="center"/>
+        </w:trPr>
         <w:tc>
           <w:tcPr>
             <w:tcW w:w="3209" w:type="dxa"/>
@@ -6949,6 +6414,9 @@
         </w:tc>
       </w:tr>
       <w:tr>
+        <w:trPr>
+          <w:jc w:val="center"/>
+        </w:trPr>
         <w:tc>
           <w:tcPr>
             <w:tcW w:w="3209" w:type="dxa"/>
@@ -6995,6 +6463,9 @@
         </w:tc>
       </w:tr>
       <w:tr>
+        <w:trPr>
+          <w:jc w:val="center"/>
+        </w:trPr>
         <w:tc>
           <w:tcPr>
             <w:tcW w:w="3209" w:type="dxa"/>
@@ -7035,6 +6506,9 @@
         </w:tc>
       </w:tr>
       <w:tr>
+        <w:trPr>
+          <w:jc w:val="center"/>
+        </w:trPr>
         <w:tc>
           <w:tcPr>
             <w:tcW w:w="3209" w:type="dxa"/>
@@ -7075,6 +6549,9 @@
         </w:tc>
       </w:tr>
       <w:tr>
+        <w:trPr>
+          <w:jc w:val="center"/>
+        </w:trPr>
         <w:tc>
           <w:tcPr>
             <w:tcW w:w="3209" w:type="dxa"/>
@@ -7121,6 +6598,9 @@
         </w:tc>
       </w:tr>
       <w:tr>
+        <w:trPr>
+          <w:jc w:val="center"/>
+        </w:trPr>
         <w:tc>
           <w:tcPr>
             <w:tcW w:w="3209" w:type="dxa"/>
@@ -7174,6 +6654,9 @@
         </w:tc>
       </w:tr>
       <w:tr>
+        <w:trPr>
+          <w:jc w:val="center"/>
+        </w:trPr>
         <w:tc>
           <w:tcPr>
             <w:tcW w:w="3209" w:type="dxa"/>
@@ -7225,35 +6708,22 @@
         <w:pStyle w:val="Titulek"/>
         <w:jc w:val="center"/>
       </w:pPr>
-      <w:bookmarkStart w:id="66" w:name="_Toc230179648"/>
+      <w:bookmarkStart w:id="70" w:name="_Toc230179648"/>
       <w:r>
         <w:t xml:space="preserve">Tabulka </w:t>
       </w:r>
-      <w:r>
-        <w:fldChar w:fldCharType="begin"/>
-      </w:r>
-      <w:r>
-        <w:instrText xml:space="preserve"> SEQ Tabulka \* ARABIC </w:instrText>
-      </w:r>
-      <w:r>
-        <w:fldChar w:fldCharType="separate"/>
-      </w:r>
-      <w:r>
-        <w:rPr>
-          <w:noProof/>
-        </w:rPr>
-        <w:t>1</w:t>
-      </w:r>
-      <w:r>
-        <w:rPr>
-          <w:noProof/>
-        </w:rPr>
-        <w:fldChar w:fldCharType="end"/>
-      </w:r>
+      <w:fldSimple w:instr=" SEQ Tabulka \* ARABIC ">
+        <w:r>
+          <w:rPr>
+            <w:noProof/>
+          </w:rPr>
+          <w:t>1</w:t>
+        </w:r>
+      </w:fldSimple>
       <w:r>
         <w:t>: Vlastnosti rozhraní Habit</w:t>
       </w:r>
-      <w:bookmarkEnd w:id="66"/>
+      <w:bookmarkEnd w:id="70"/>
     </w:p>
     <w:p>
       <w:r>
@@ -7355,12 +6825,12 @@
       <w:pPr>
         <w:pStyle w:val="Nadpis2"/>
       </w:pPr>
-      <w:bookmarkStart w:id="67" w:name="_Toc230197557"/>
+      <w:bookmarkStart w:id="71" w:name="_Toc230273330"/>
       <w:r>
         <w:lastRenderedPageBreak/>
         <w:t>Hlavní UI a navigace</w:t>
       </w:r>
-      <w:bookmarkEnd w:id="67"/>
+      <w:bookmarkEnd w:id="71"/>
     </w:p>
     <w:p>
       <w:r>
@@ -7420,6 +6890,9 @@
             <w:tcW w:w="4814" w:type="dxa"/>
           </w:tcPr>
           <w:p>
+            <w:pPr>
+              <w:jc w:val="left"/>
+            </w:pPr>
             <w:r>
               <w:t>Název Karty</w:t>
             </w:r>
@@ -7430,6 +6903,9 @@
             <w:tcW w:w="4814" w:type="dxa"/>
           </w:tcPr>
           <w:p>
+            <w:pPr>
+              <w:jc w:val="left"/>
+            </w:pPr>
             <w:r>
               <w:t>Zobrazení</w:t>
             </w:r>
@@ -7442,6 +6918,9 @@
             <w:tcW w:w="4814" w:type="dxa"/>
           </w:tcPr>
           <w:p>
+            <w:pPr>
+              <w:jc w:val="left"/>
+            </w:pPr>
             <w:r>
               <w:t>"</w:t>
             </w:r>
@@ -7468,6 +6947,9 @@
             <w:tcW w:w="4814" w:type="dxa"/>
           </w:tcPr>
           <w:p>
+            <w:pPr>
+              <w:jc w:val="left"/>
+            </w:pPr>
             <w:r>
               <w:t xml:space="preserve">kladné návyky, které uživatel chce každý den dodržovat. Tato podmnožina je </w:t>
             </w:r>
@@ -7486,6 +6968,9 @@
             <w:tcW w:w="4814" w:type="dxa"/>
           </w:tcPr>
           <w:p>
+            <w:pPr>
+              <w:jc w:val="left"/>
+            </w:pPr>
             <w:r>
               <w:t>"</w:t>
             </w:r>
@@ -7512,6 +6997,10 @@
             <w:tcW w:w="4814" w:type="dxa"/>
           </w:tcPr>
           <w:p>
+            <w:pPr>
+              <w:keepNext/>
+              <w:jc w:val="left"/>
+            </w:pPr>
             <w:r>
               <w:t xml:space="preserve">zlozvyky, které by si uživatel chtěl každý den držet co nejdál od svého denního života. Tato podmnožina je </w:t>
             </w:r>
@@ -7525,7 +7014,26 @@
         </w:tc>
       </w:tr>
     </w:tbl>
-    <w:p/>
+    <w:p>
+      <w:pPr>
+        <w:pStyle w:val="Titulek"/>
+        <w:jc w:val="center"/>
+      </w:pPr>
+      <w:r>
+        <w:t xml:space="preserve">Tabulka </w:t>
+      </w:r>
+      <w:fldSimple w:instr=" SEQ Tabulka \* ARABIC ">
+        <w:r>
+          <w:rPr>
+            <w:noProof/>
+          </w:rPr>
+          <w:t>2</w:t>
+        </w:r>
+      </w:fldSimple>
+      <w:r>
+        <w:t>: rozložení karet</w:t>
+      </w:r>
+    </w:p>
     <w:p>
       <w:r>
         <w:t xml:space="preserve">Každá karta v této komponentě </w:t>
@@ -7679,31 +7187,18 @@
         <w:pStyle w:val="Titulek"/>
         <w:jc w:val="center"/>
       </w:pPr>
-      <w:bookmarkStart w:id="68" w:name="_Toc230179649"/>
+      <w:bookmarkStart w:id="72" w:name="_Toc230179649"/>
       <w:r>
         <w:t xml:space="preserve">Tabulka </w:t>
       </w:r>
-      <w:r>
-        <w:fldChar w:fldCharType="begin"/>
-      </w:r>
-      <w:r>
-        <w:instrText xml:space="preserve"> SEQ Tabulka \* ARABIC </w:instrText>
-      </w:r>
-      <w:r>
-        <w:fldChar w:fldCharType="separate"/>
-      </w:r>
-      <w:r>
-        <w:rPr>
-          <w:noProof/>
-        </w:rPr>
-        <w:t>2</w:t>
-      </w:r>
-      <w:r>
-        <w:rPr>
-          <w:noProof/>
-        </w:rPr>
-        <w:fldChar w:fldCharType="end"/>
-      </w:r>
+      <w:fldSimple w:instr=" SEQ Tabulka \* ARABIC ">
+        <w:r>
+          <w:rPr>
+            <w:noProof/>
+          </w:rPr>
+          <w:t>3</w:t>
+        </w:r>
+      </w:fldSimple>
       <w:r>
         <w:t xml:space="preserve">: Akce </w:t>
       </w:r>
@@ -7711,7 +7206,7 @@
       <w:r>
         <w:t>toolbaru</w:t>
       </w:r>
-      <w:bookmarkEnd w:id="68"/>
+      <w:bookmarkEnd w:id="72"/>
       <w:proofErr w:type="spellEnd"/>
     </w:p>
     <w:p>
@@ -7747,11 +7242,9 @@
       <w:r>
         <w:t xml:space="preserve">Tímto rozdělením UI vzniká přehledně vypadající prostředí: uživatel se orientuje přes </w:t>
       </w:r>
-      <w:proofErr w:type="spellStart"/>
-      <w:r>
-        <w:t>taby</w:t>
-      </w:r>
-      <w:proofErr w:type="spellEnd"/>
+      <w:r>
+        <w:t>karty</w:t>
+      </w:r>
       <w:r>
         <w:t xml:space="preserve"> (dobré/špatné návyky), zatímco běžné akce (export/import JSON souborů s návyky) jsou dostupné z horní lišty a přidání návyků/zlozvyků z tlačítka v pravém dolním rohu stránky.</w:t>
       </w:r>
@@ -7808,45 +7301,32 @@
         <w:pStyle w:val="Titulek"/>
         <w:jc w:val="center"/>
       </w:pPr>
-      <w:bookmarkStart w:id="69" w:name="_Toc230197179"/>
+      <w:bookmarkStart w:id="73" w:name="_Toc230197179"/>
       <w:r>
         <w:t xml:space="preserve">Obrázek </w:t>
       </w:r>
-      <w:r>
-        <w:fldChar w:fldCharType="begin"/>
-      </w:r>
-      <w:r>
-        <w:instrText xml:space="preserve"> SEQ Obrázek \* ARABIC </w:instrText>
-      </w:r>
-      <w:r>
-        <w:fldChar w:fldCharType="separate"/>
-      </w:r>
-      <w:r>
-        <w:rPr>
-          <w:noProof/>
-        </w:rPr>
-        <w:t>1</w:t>
-      </w:r>
-      <w:r>
-        <w:rPr>
-          <w:noProof/>
-        </w:rPr>
-        <w:fldChar w:fldCharType="end"/>
-      </w:r>
+      <w:fldSimple w:instr=" SEQ Obrázek \* ARABIC ">
+        <w:r>
+          <w:rPr>
+            <w:noProof/>
+          </w:rPr>
+          <w:t>1</w:t>
+        </w:r>
+      </w:fldSimple>
       <w:r>
         <w:t>: Hlavní UI</w:t>
       </w:r>
-      <w:bookmarkEnd w:id="69"/>
+      <w:bookmarkEnd w:id="73"/>
     </w:p>
     <w:p>
       <w:pPr>
         <w:pStyle w:val="Nadpis2"/>
       </w:pPr>
-      <w:bookmarkStart w:id="70" w:name="_Toc230197558"/>
+      <w:bookmarkStart w:id="74" w:name="_Toc230273331"/>
       <w:r>
         <w:t>Formulář pro vytváření nových návyků</w:t>
       </w:r>
-      <w:bookmarkEnd w:id="70"/>
+      <w:bookmarkEnd w:id="74"/>
     </w:p>
     <w:p>
       <w:r>
@@ -7931,6 +7411,7 @@
       <w:tblPr>
         <w:tblStyle w:val="Mkatabulky"/>
         <w:tblW w:w="0" w:type="auto"/>
+        <w:jc w:val="center"/>
         <w:tblLook w:val="04A0" w:firstRow="1" w:lastRow="0" w:firstColumn="1" w:lastColumn="0" w:noHBand="0" w:noVBand="1"/>
       </w:tblPr>
       <w:tblGrid>
@@ -7939,6 +7420,9 @@
         <w:gridCol w:w="3210"/>
       </w:tblGrid>
       <w:tr>
+        <w:trPr>
+          <w:jc w:val="center"/>
+        </w:trPr>
         <w:tc>
           <w:tcPr>
             <w:tcW w:w="3209" w:type="dxa"/>
@@ -7971,6 +7455,9 @@
         </w:tc>
       </w:tr>
       <w:tr>
+        <w:trPr>
+          <w:jc w:val="center"/>
+        </w:trPr>
         <w:tc>
           <w:tcPr>
             <w:tcW w:w="3209" w:type="dxa"/>
@@ -8017,6 +7504,9 @@
         </w:tc>
       </w:tr>
       <w:tr>
+        <w:trPr>
+          <w:jc w:val="center"/>
+        </w:trPr>
         <w:tc>
           <w:tcPr>
             <w:tcW w:w="3209" w:type="dxa"/>
@@ -8063,6 +7553,9 @@
         </w:tc>
       </w:tr>
       <w:tr>
+        <w:trPr>
+          <w:jc w:val="center"/>
+        </w:trPr>
         <w:tc>
           <w:tcPr>
             <w:tcW w:w="3209" w:type="dxa"/>
@@ -8103,35 +7596,22 @@
         <w:pStyle w:val="Titulek"/>
         <w:jc w:val="center"/>
       </w:pPr>
-      <w:bookmarkStart w:id="71" w:name="_Toc230179650"/>
+      <w:bookmarkStart w:id="75" w:name="_Toc230179650"/>
       <w:r>
         <w:t xml:space="preserve">Tabulka </w:t>
       </w:r>
-      <w:r>
-        <w:fldChar w:fldCharType="begin"/>
-      </w:r>
-      <w:r>
-        <w:instrText xml:space="preserve"> SEQ Tabulka \* ARABIC </w:instrText>
-      </w:r>
-      <w:r>
-        <w:fldChar w:fldCharType="separate"/>
-      </w:r>
-      <w:r>
-        <w:rPr>
-          <w:noProof/>
-        </w:rPr>
-        <w:t>3</w:t>
-      </w:r>
-      <w:r>
-        <w:rPr>
-          <w:noProof/>
-        </w:rPr>
-        <w:fldChar w:fldCharType="end"/>
-      </w:r>
+      <w:fldSimple w:instr=" SEQ Tabulka \* ARABIC ">
+        <w:r>
+          <w:rPr>
+            <w:noProof/>
+          </w:rPr>
+          <w:t>4</w:t>
+        </w:r>
+      </w:fldSimple>
       <w:r>
         <w:t>: Vstupy formuláře</w:t>
       </w:r>
-      <w:bookmarkEnd w:id="71"/>
+      <w:bookmarkEnd w:id="75"/>
     </w:p>
     <w:p>
       <w:r>
@@ -8253,31 +7733,18 @@
         <w:pStyle w:val="Titulek"/>
         <w:jc w:val="center"/>
       </w:pPr>
-      <w:bookmarkStart w:id="72" w:name="_Toc230197180"/>
+      <w:bookmarkStart w:id="76" w:name="_Toc230197180"/>
       <w:r>
         <w:t xml:space="preserve">Obrázek </w:t>
       </w:r>
-      <w:r>
-        <w:fldChar w:fldCharType="begin"/>
-      </w:r>
-      <w:r>
-        <w:instrText xml:space="preserve"> SEQ Obrázek \* ARABIC </w:instrText>
-      </w:r>
-      <w:r>
-        <w:fldChar w:fldCharType="separate"/>
-      </w:r>
-      <w:r>
-        <w:rPr>
-          <w:noProof/>
-        </w:rPr>
-        <w:t>2</w:t>
-      </w:r>
-      <w:r>
-        <w:rPr>
-          <w:noProof/>
-        </w:rPr>
-        <w:fldChar w:fldCharType="end"/>
-      </w:r>
+      <w:fldSimple w:instr=" SEQ Obrázek \* ARABIC ">
+        <w:r>
+          <w:rPr>
+            <w:noProof/>
+          </w:rPr>
+          <w:t>2</w:t>
+        </w:r>
+      </w:fldSimple>
       <w:r>
         <w:t xml:space="preserve">: Formulář pro přidání nových </w:t>
       </w:r>
@@ -8287,17 +7754,17 @@
       <w:r>
         <w:t>ů</w:t>
       </w:r>
-      <w:bookmarkEnd w:id="72"/>
+      <w:bookmarkEnd w:id="76"/>
     </w:p>
     <w:p>
       <w:pPr>
         <w:pStyle w:val="Nadpis2"/>
       </w:pPr>
-      <w:bookmarkStart w:id="73" w:name="_Toc230197559"/>
+      <w:bookmarkStart w:id="77" w:name="_Toc230273332"/>
       <w:r>
         <w:t>Seznamy návyků</w:t>
       </w:r>
-      <w:bookmarkEnd w:id="73"/>
+      <w:bookmarkEnd w:id="77"/>
     </w:p>
     <w:p>
       <w:r>
@@ -8324,6 +7791,7 @@
       <w:tblPr>
         <w:tblStyle w:val="Mkatabulky"/>
         <w:tblW w:w="0" w:type="auto"/>
+        <w:jc w:val="center"/>
         <w:tblLook w:val="04A0" w:firstRow="1" w:lastRow="0" w:firstColumn="1" w:lastColumn="0" w:noHBand="0" w:noVBand="1"/>
       </w:tblPr>
       <w:tblGrid>
@@ -8331,6 +7799,9 @@
         <w:gridCol w:w="4814"/>
       </w:tblGrid>
       <w:tr>
+        <w:trPr>
+          <w:jc w:val="center"/>
+        </w:trPr>
         <w:tc>
           <w:tcPr>
             <w:tcW w:w="4814" w:type="dxa"/>
@@ -8353,6 +7824,9 @@
         </w:tc>
       </w:tr>
       <w:tr>
+        <w:trPr>
+          <w:jc w:val="center"/>
+        </w:trPr>
         <w:tc>
           <w:tcPr>
             <w:tcW w:w="4814" w:type="dxa"/>
@@ -8380,6 +7854,9 @@
         </w:tc>
       </w:tr>
       <w:tr>
+        <w:trPr>
+          <w:jc w:val="center"/>
+        </w:trPr>
         <w:tc>
           <w:tcPr>
             <w:tcW w:w="4814" w:type="dxa"/>
@@ -8407,6 +7884,9 @@
         </w:tc>
       </w:tr>
       <w:tr>
+        <w:trPr>
+          <w:jc w:val="center"/>
+        </w:trPr>
         <w:tc>
           <w:tcPr>
             <w:tcW w:w="4814" w:type="dxa"/>
@@ -8431,6 +7911,9 @@
         </w:tc>
       </w:tr>
       <w:tr>
+        <w:trPr>
+          <w:jc w:val="center"/>
+        </w:trPr>
         <w:tc>
           <w:tcPr>
             <w:tcW w:w="4814" w:type="dxa"/>
@@ -8461,35 +7944,22 @@
         <w:pStyle w:val="Titulek"/>
         <w:jc w:val="center"/>
       </w:pPr>
-      <w:bookmarkStart w:id="74" w:name="_Toc230179651"/>
+      <w:bookmarkStart w:id="78" w:name="_Toc230179651"/>
       <w:r>
         <w:t xml:space="preserve">Tabulka </w:t>
       </w:r>
-      <w:r>
-        <w:fldChar w:fldCharType="begin"/>
-      </w:r>
-      <w:r>
-        <w:instrText xml:space="preserve"> SEQ Tabulka \* ARABIC </w:instrText>
-      </w:r>
-      <w:r>
-        <w:fldChar w:fldCharType="separate"/>
-      </w:r>
-      <w:r>
-        <w:rPr>
-          <w:noProof/>
-        </w:rPr>
-        <w:t>4</w:t>
-      </w:r>
-      <w:r>
-        <w:rPr>
-          <w:noProof/>
-        </w:rPr>
-        <w:fldChar w:fldCharType="end"/>
-      </w:r>
+      <w:fldSimple w:instr=" SEQ Tabulka \* ARABIC ">
+        <w:r>
+          <w:rPr>
+            <w:noProof/>
+          </w:rPr>
+          <w:t>5</w:t>
+        </w:r>
+      </w:fldSimple>
       <w:r>
         <w:t>: Členové za funkcí UI</w:t>
       </w:r>
-      <w:bookmarkEnd w:id="74"/>
+      <w:bookmarkEnd w:id="78"/>
     </w:p>
     <w:p>
       <w:r>
@@ -8501,6 +7971,7 @@
       <w:tblPr>
         <w:tblStyle w:val="Mkatabulky"/>
         <w:tblW w:w="0" w:type="auto"/>
+        <w:jc w:val="center"/>
         <w:tblLook w:val="04A0" w:firstRow="1" w:lastRow="0" w:firstColumn="1" w:lastColumn="0" w:noHBand="0" w:noVBand="1"/>
       </w:tblPr>
       <w:tblGrid>
@@ -8508,6 +7979,9 @@
         <w:gridCol w:w="4814"/>
       </w:tblGrid>
       <w:tr>
+        <w:trPr>
+          <w:jc w:val="center"/>
+        </w:trPr>
         <w:tc>
           <w:tcPr>
             <w:tcW w:w="4814" w:type="dxa"/>
@@ -8530,6 +8004,9 @@
         </w:tc>
       </w:tr>
       <w:tr>
+        <w:trPr>
+          <w:jc w:val="center"/>
+        </w:trPr>
         <w:tc>
           <w:tcPr>
             <w:tcW w:w="4814" w:type="dxa"/>
@@ -8554,6 +8031,9 @@
         </w:tc>
       </w:tr>
       <w:tr>
+        <w:trPr>
+          <w:jc w:val="center"/>
+        </w:trPr>
         <w:tc>
           <w:tcPr>
             <w:tcW w:w="4814" w:type="dxa"/>
@@ -8586,35 +8066,22 @@
         <w:pStyle w:val="Titulek"/>
         <w:jc w:val="center"/>
       </w:pPr>
-      <w:bookmarkStart w:id="75" w:name="_Toc230179652"/>
+      <w:bookmarkStart w:id="79" w:name="_Toc230179652"/>
       <w:r>
         <w:t xml:space="preserve">Tabulka </w:t>
       </w:r>
-      <w:r>
-        <w:fldChar w:fldCharType="begin"/>
-      </w:r>
-      <w:r>
-        <w:instrText xml:space="preserve"> SEQ Tabulka \* ARABIC </w:instrText>
-      </w:r>
-      <w:r>
-        <w:fldChar w:fldCharType="separate"/>
-      </w:r>
-      <w:r>
-        <w:rPr>
-          <w:noProof/>
-        </w:rPr>
-        <w:t>5</w:t>
-      </w:r>
-      <w:r>
-        <w:rPr>
-          <w:noProof/>
-        </w:rPr>
-        <w:fldChar w:fldCharType="end"/>
-      </w:r>
+      <w:fldSimple w:instr=" SEQ Tabulka \* ARABIC ">
+        <w:r>
+          <w:rPr>
+            <w:noProof/>
+          </w:rPr>
+          <w:t>6</w:t>
+        </w:r>
+      </w:fldSimple>
       <w:r>
         <w:t>: výstupní eventy UI</w:t>
       </w:r>
-      <w:bookmarkEnd w:id="75"/>
+      <w:bookmarkEnd w:id="79"/>
     </w:p>
     <w:p>
       <w:r>
@@ -8701,48 +8168,35 @@
         <w:pStyle w:val="Titulek"/>
         <w:jc w:val="center"/>
       </w:pPr>
-      <w:bookmarkStart w:id="76" w:name="_Toc230197181"/>
+      <w:bookmarkStart w:id="80" w:name="_Toc230197181"/>
       <w:r>
         <w:t xml:space="preserve">Obrázek </w:t>
       </w:r>
-      <w:r>
-        <w:fldChar w:fldCharType="begin"/>
-      </w:r>
-      <w:r>
-        <w:instrText xml:space="preserve"> SEQ Obrázek \* ARABIC </w:instrText>
-      </w:r>
-      <w:r>
-        <w:fldChar w:fldCharType="separate"/>
-      </w:r>
-      <w:r>
-        <w:rPr>
-          <w:noProof/>
-        </w:rPr>
-        <w:t>3</w:t>
-      </w:r>
-      <w:r>
-        <w:rPr>
-          <w:noProof/>
-        </w:rPr>
-        <w:fldChar w:fldCharType="end"/>
-      </w:r>
+      <w:fldSimple w:instr=" SEQ Obrázek \* ARABIC ">
+        <w:r>
+          <w:rPr>
+            <w:noProof/>
+          </w:rPr>
+          <w:t>3</w:t>
+        </w:r>
+      </w:fldSimple>
       <w:r>
         <w:t xml:space="preserve">: Seznam </w:t>
       </w:r>
       <w:r>
         <w:t>návyků</w:t>
       </w:r>
-      <w:bookmarkEnd w:id="76"/>
+      <w:bookmarkEnd w:id="80"/>
     </w:p>
     <w:p>
       <w:pPr>
         <w:pStyle w:val="Nadpis2"/>
       </w:pPr>
-      <w:bookmarkStart w:id="77" w:name="_Toc230197560"/>
+      <w:bookmarkStart w:id="81" w:name="_Toc230273333"/>
       <w:r>
         <w:t>Vizualizace plnění návyku</w:t>
       </w:r>
-      <w:bookmarkEnd w:id="77"/>
+      <w:bookmarkEnd w:id="81"/>
     </w:p>
     <w:p>
       <w:pPr>
@@ -8780,6 +8234,7 @@
       <w:tblPr>
         <w:tblStyle w:val="Mkatabulky"/>
         <w:tblW w:w="0" w:type="auto"/>
+        <w:jc w:val="center"/>
         <w:tblLook w:val="04A0" w:firstRow="1" w:lastRow="0" w:firstColumn="1" w:lastColumn="0" w:noHBand="0" w:noVBand="1"/>
       </w:tblPr>
       <w:tblGrid>
@@ -8787,6 +8242,9 @@
         <w:gridCol w:w="4814"/>
       </w:tblGrid>
       <w:tr>
+        <w:trPr>
+          <w:jc w:val="center"/>
+        </w:trPr>
         <w:tc>
           <w:tcPr>
             <w:tcW w:w="4814" w:type="dxa"/>
@@ -8809,6 +8267,9 @@
         </w:tc>
       </w:tr>
       <w:tr>
+        <w:trPr>
+          <w:jc w:val="center"/>
+        </w:trPr>
         <w:tc>
           <w:tcPr>
             <w:tcW w:w="4814" w:type="dxa"/>
@@ -8849,6 +8310,9 @@
         </w:tc>
       </w:tr>
       <w:tr>
+        <w:trPr>
+          <w:jc w:val="center"/>
+        </w:trPr>
         <w:tc>
           <w:tcPr>
             <w:tcW w:w="4814" w:type="dxa"/>
@@ -8881,31 +8345,18 @@
         <w:pStyle w:val="Titulek"/>
         <w:jc w:val="center"/>
       </w:pPr>
-      <w:bookmarkStart w:id="78" w:name="_Toc230179653"/>
+      <w:bookmarkStart w:id="82" w:name="_Toc230179653"/>
       <w:r>
         <w:t xml:space="preserve">Tabulka </w:t>
       </w:r>
-      <w:r>
-        <w:fldChar w:fldCharType="begin"/>
-      </w:r>
-      <w:r>
-        <w:instrText xml:space="preserve"> SEQ Tabulka \* ARABIC </w:instrText>
-      </w:r>
-      <w:r>
-        <w:fldChar w:fldCharType="separate"/>
-      </w:r>
-      <w:r>
-        <w:rPr>
-          <w:noProof/>
-        </w:rPr>
-        <w:t>6</w:t>
-      </w:r>
-      <w:r>
-        <w:rPr>
-          <w:noProof/>
-        </w:rPr>
-        <w:fldChar w:fldCharType="end"/>
-      </w:r>
+      <w:fldSimple w:instr=" SEQ Tabulka \* ARABIC ">
+        <w:r>
+          <w:rPr>
+            <w:noProof/>
+          </w:rPr>
+          <w:t>7</w:t>
+        </w:r>
+      </w:fldSimple>
       <w:r>
         <w:t xml:space="preserve">: Vstupy </w:t>
       </w:r>
@@ -8913,7 +8364,7 @@
       <w:r>
         <w:t>HabitGraphu</w:t>
       </w:r>
-      <w:bookmarkEnd w:id="78"/>
+      <w:bookmarkEnd w:id="82"/>
       <w:proofErr w:type="spellEnd"/>
     </w:p>
     <w:p>
@@ -8926,6 +8377,7 @@
       <w:tblPr>
         <w:tblStyle w:val="Mkatabulky"/>
         <w:tblW w:w="0" w:type="auto"/>
+        <w:jc w:val="center"/>
         <w:tblLook w:val="04A0" w:firstRow="1" w:lastRow="0" w:firstColumn="1" w:lastColumn="0" w:noHBand="0" w:noVBand="1"/>
       </w:tblPr>
       <w:tblGrid>
@@ -8933,6 +8385,9 @@
         <w:gridCol w:w="4814"/>
       </w:tblGrid>
       <w:tr>
+        <w:trPr>
+          <w:jc w:val="center"/>
+        </w:trPr>
         <w:tc>
           <w:tcPr>
             <w:tcW w:w="4814" w:type="dxa"/>
@@ -8955,6 +8410,9 @@
         </w:tc>
       </w:tr>
       <w:tr>
+        <w:trPr>
+          <w:jc w:val="center"/>
+        </w:trPr>
         <w:tc>
           <w:tcPr>
             <w:tcW w:w="4814" w:type="dxa"/>
@@ -8979,6 +8437,9 @@
         </w:tc>
       </w:tr>
       <w:tr>
+        <w:trPr>
+          <w:jc w:val="center"/>
+        </w:trPr>
         <w:tc>
           <w:tcPr>
             <w:tcW w:w="4814" w:type="dxa"/>
@@ -9003,6 +8464,9 @@
         </w:tc>
       </w:tr>
       <w:tr>
+        <w:trPr>
+          <w:jc w:val="center"/>
+        </w:trPr>
         <w:tc>
           <w:tcPr>
             <w:tcW w:w="4814" w:type="dxa"/>
@@ -9030,6 +8494,9 @@
         </w:tc>
       </w:tr>
       <w:tr>
+        <w:trPr>
+          <w:jc w:val="center"/>
+        </w:trPr>
         <w:tc>
           <w:tcPr>
             <w:tcW w:w="4814" w:type="dxa"/>
@@ -9060,35 +8527,22 @@
         <w:pStyle w:val="Titulek"/>
         <w:jc w:val="center"/>
       </w:pPr>
-      <w:bookmarkStart w:id="79" w:name="_Toc230179654"/>
+      <w:bookmarkStart w:id="83" w:name="_Toc230179654"/>
       <w:r>
         <w:t xml:space="preserve">Tabulka </w:t>
       </w:r>
-      <w:r>
-        <w:fldChar w:fldCharType="begin"/>
-      </w:r>
-      <w:r>
-        <w:instrText xml:space="preserve"> SEQ Tabulka \* ARABIC </w:instrText>
-      </w:r>
-      <w:r>
-        <w:fldChar w:fldCharType="separate"/>
-      </w:r>
-      <w:r>
-        <w:rPr>
-          <w:noProof/>
-        </w:rPr>
-        <w:t>7</w:t>
-      </w:r>
-      <w:r>
-        <w:rPr>
-          <w:noProof/>
-        </w:rPr>
-        <w:fldChar w:fldCharType="end"/>
-      </w:r>
+      <w:fldSimple w:instr=" SEQ Tabulka \* ARABIC ">
+        <w:r>
+          <w:rPr>
+            <w:noProof/>
+          </w:rPr>
+          <w:t>8</w:t>
+        </w:r>
+      </w:fldSimple>
       <w:r>
         <w:t>: možnosti grafu</w:t>
       </w:r>
-      <w:bookmarkEnd w:id="79"/>
+      <w:bookmarkEnd w:id="83"/>
     </w:p>
     <w:p>
       <w:r>
@@ -9175,35 +8629,22 @@
           <w:rStyle w:val="Siln"/>
         </w:rPr>
       </w:pPr>
-      <w:bookmarkStart w:id="80" w:name="_Toc230197182"/>
+      <w:bookmarkStart w:id="84" w:name="_Toc230197182"/>
       <w:r>
         <w:t xml:space="preserve">Obrázek </w:t>
       </w:r>
-      <w:r>
-        <w:fldChar w:fldCharType="begin"/>
-      </w:r>
-      <w:r>
-        <w:instrText xml:space="preserve"> SEQ Obrázek \* ARABIC </w:instrText>
-      </w:r>
-      <w:r>
-        <w:fldChar w:fldCharType="separate"/>
-      </w:r>
-      <w:r>
-        <w:rPr>
-          <w:noProof/>
-        </w:rPr>
-        <w:t>4</w:t>
-      </w:r>
-      <w:r>
-        <w:rPr>
-          <w:noProof/>
-        </w:rPr>
-        <w:fldChar w:fldCharType="end"/>
-      </w:r>
+      <w:fldSimple w:instr=" SEQ Obrázek \* ARABIC ">
+        <w:r>
+          <w:rPr>
+            <w:noProof/>
+          </w:rPr>
+          <w:t>4</w:t>
+        </w:r>
+      </w:fldSimple>
       <w:r>
         <w:t xml:space="preserve">: Rozevřený </w:t>
       </w:r>
-      <w:bookmarkEnd w:id="80"/>
+      <w:bookmarkEnd w:id="84"/>
       <w:r>
         <w:t>návyk</w:t>
       </w:r>
@@ -9212,11 +8653,11 @@
       <w:pPr>
         <w:pStyle w:val="Nadpis2"/>
       </w:pPr>
-      <w:bookmarkStart w:id="81" w:name="_Toc230197561"/>
+      <w:bookmarkStart w:id="85" w:name="_Toc230273334"/>
       <w:r>
         <w:t>Styling a responzivita aplikace</w:t>
       </w:r>
-      <w:bookmarkEnd w:id="81"/>
+      <w:bookmarkEnd w:id="85"/>
     </w:p>
     <w:p>
       <w:r>
@@ -9230,11 +8671,9 @@
       <w:r>
         <w:t xml:space="preserve">, </w:t>
       </w:r>
-      <w:proofErr w:type="spellStart"/>
-      <w:r>
-        <w:t>taby</w:t>
-      </w:r>
-      <w:proofErr w:type="spellEnd"/>
+      <w:r>
+        <w:t>karty</w:t>
+      </w:r>
       <w:r>
         <w:t>, tlačítka a formulářové komponenty. Dále se využívají vlastní SCSS soubory pro doladění layoutu a vizuální podoby jednotlivých komponent.</w:t>
       </w:r>
@@ -9347,6 +8786,7 @@
       <w:tblPr>
         <w:tblStyle w:val="Mkatabulky"/>
         <w:tblW w:w="0" w:type="auto"/>
+        <w:jc w:val="center"/>
         <w:tblLook w:val="04A0" w:firstRow="1" w:lastRow="0" w:firstColumn="1" w:lastColumn="0" w:noHBand="0" w:noVBand="1"/>
       </w:tblPr>
       <w:tblGrid>
@@ -9354,6 +8794,9 @@
         <w:gridCol w:w="4814"/>
       </w:tblGrid>
       <w:tr>
+        <w:trPr>
+          <w:jc w:val="center"/>
+        </w:trPr>
         <w:tc>
           <w:tcPr>
             <w:tcW w:w="4814" w:type="dxa"/>
@@ -9376,6 +8819,9 @@
         </w:tc>
       </w:tr>
       <w:tr>
+        <w:trPr>
+          <w:jc w:val="center"/>
+        </w:trPr>
         <w:tc>
           <w:tcPr>
             <w:tcW w:w="4814" w:type="dxa"/>
@@ -9420,6 +8866,9 @@
         </w:tc>
       </w:tr>
       <w:tr>
+        <w:trPr>
+          <w:jc w:val="center"/>
+        </w:trPr>
         <w:tc>
           <w:tcPr>
             <w:tcW w:w="4814" w:type="dxa"/>
@@ -9486,31 +8935,18 @@
         <w:pStyle w:val="Titulek"/>
         <w:jc w:val="center"/>
       </w:pPr>
-      <w:bookmarkStart w:id="82" w:name="_Toc230179655"/>
+      <w:bookmarkStart w:id="86" w:name="_Toc230179655"/>
       <w:r>
         <w:t xml:space="preserve">Tabulka </w:t>
       </w:r>
-      <w:r>
-        <w:fldChar w:fldCharType="begin"/>
-      </w:r>
-      <w:r>
-        <w:instrText xml:space="preserve"> SEQ Tabulka \* ARABIC </w:instrText>
-      </w:r>
-      <w:r>
-        <w:fldChar w:fldCharType="separate"/>
-      </w:r>
-      <w:r>
-        <w:rPr>
-          <w:noProof/>
-        </w:rPr>
-        <w:t>8</w:t>
-      </w:r>
-      <w:r>
-        <w:rPr>
-          <w:noProof/>
-        </w:rPr>
-        <w:fldChar w:fldCharType="end"/>
-      </w:r>
+      <w:fldSimple w:instr=" SEQ Tabulka \* ARABIC ">
+        <w:r>
+          <w:rPr>
+            <w:noProof/>
+          </w:rPr>
+          <w:t>9</w:t>
+        </w:r>
+      </w:fldSimple>
       <w:r>
         <w:t xml:space="preserve">: Komponenty </w:t>
       </w:r>
@@ -9520,7 +8956,7 @@
       <w:r>
         <w:t xml:space="preserve"> na stylování</w:t>
       </w:r>
-      <w:bookmarkEnd w:id="82"/>
+      <w:bookmarkEnd w:id="86"/>
     </w:p>
     <w:p>
       <w:r>
@@ -9592,46 +9028,33 @@
         <w:pStyle w:val="Titulek"/>
         <w:jc w:val="center"/>
       </w:pPr>
-      <w:bookmarkStart w:id="83" w:name="_Toc230197183"/>
+      <w:bookmarkStart w:id="87" w:name="_Toc230197183"/>
       <w:r>
         <w:t xml:space="preserve">Obrázek </w:t>
       </w:r>
-      <w:r>
-        <w:fldChar w:fldCharType="begin"/>
-      </w:r>
-      <w:r>
-        <w:instrText xml:space="preserve"> SEQ Obrázek \* ARABIC </w:instrText>
-      </w:r>
-      <w:r>
-        <w:fldChar w:fldCharType="separate"/>
-      </w:r>
-      <w:r>
-        <w:rPr>
-          <w:noProof/>
-        </w:rPr>
-        <w:t>5</w:t>
-      </w:r>
-      <w:r>
-        <w:rPr>
-          <w:noProof/>
-        </w:rPr>
-        <w:fldChar w:fldCharType="end"/>
-      </w:r>
+      <w:fldSimple w:instr=" SEQ Obrázek \* ARABIC ">
+        <w:r>
+          <w:rPr>
+            <w:noProof/>
+          </w:rPr>
+          <w:t>5</w:t>
+        </w:r>
+      </w:fldSimple>
       <w:r>
         <w:t>: mobilní verze aplikace</w:t>
       </w:r>
-      <w:bookmarkEnd w:id="83"/>
+      <w:bookmarkEnd w:id="87"/>
     </w:p>
     <w:p>
       <w:pPr>
         <w:pStyle w:val="Nadpis2"/>
       </w:pPr>
-      <w:bookmarkStart w:id="84" w:name="_Toc230197562"/>
+      <w:bookmarkStart w:id="88" w:name="_Toc230273335"/>
       <w:r>
         <w:lastRenderedPageBreak/>
         <w:t>Optimalizace</w:t>
       </w:r>
-      <w:bookmarkEnd w:id="84"/>
+      <w:bookmarkEnd w:id="88"/>
     </w:p>
     <w:p>
       <w:r>
@@ -9645,7 +9068,7 @@
       <w:r>
         <w:t xml:space="preserve"> </w:t>
       </w:r>
-      <w:bookmarkStart w:id="85" w:name="_Toc230197563"/>
+      <w:bookmarkStart w:id="89" w:name="_Toc230273336"/>
       <w:r>
         <w:t>Centrální servis pro data (</w:t>
       </w:r>
@@ -9657,7 +9080,7 @@
       <w:r>
         <w:t>)</w:t>
       </w:r>
-      <w:bookmarkEnd w:id="85"/>
+      <w:bookmarkEnd w:id="89"/>
     </w:p>
     <w:p>
       <w:r>
@@ -9697,11 +9120,11 @@
       <w:pPr>
         <w:pStyle w:val="Nadpis3"/>
       </w:pPr>
-      <w:bookmarkStart w:id="86" w:name="_Toc230197564"/>
+      <w:bookmarkStart w:id="90" w:name="_Toc230273337"/>
       <w:r>
         <w:t>Omezení přepočtů grafu</w:t>
       </w:r>
-      <w:bookmarkEnd w:id="86"/>
+      <w:bookmarkEnd w:id="90"/>
     </w:p>
     <w:p>
       <w:r>
@@ -9747,35 +9170,21 @@
         </w:numPr>
         <w:ind w:left="720"/>
       </w:pPr>
-      <w:bookmarkStart w:id="87" w:name="_Toc230197571"/>
+      <w:bookmarkStart w:id="91" w:name="_Toc230273338"/>
       <w:r>
         <w:lastRenderedPageBreak/>
         <w:t>Závěr</w:t>
       </w:r>
-      <w:bookmarkEnd w:id="87"/>
-    </w:p>
-    <w:p>
-      <w:pPr>
-        <w:pStyle w:val="Nadpis2"/>
-      </w:pPr>
-      <w:r>
-        <w:tab/>
-        <w:t>Zkušenosti nabrané z práce</w:t>
-      </w:r>
-    </w:p>
-    <w:p>
-      <w:pPr>
-        <w:pStyle w:val="Nadpis3"/>
-      </w:pPr>
-      <w:bookmarkStart w:id="88" w:name="_Toc230197566"/>
-      <w:r>
-        <w:t>Angular komponentový přístup</w:t>
-      </w:r>
-      <w:bookmarkEnd w:id="88"/>
-    </w:p>
-    <w:p>
-      <w:r>
-        <w:t>Utvrdil jsem si rozdělování úlohy do samostatných komponent (habit-</w:t>
+      <w:bookmarkEnd w:id="91"/>
+    </w:p>
+    <w:p>
+      <w:r>
+        <w:t>Tato ročníková práce představuje komplexní webovou aplikaci, která demonstruje hluboké porozumění modernímu front-end vývoji. Aplikace Habit-Tracker úspěšně integruje všechny klíčové koncepty Angular frameworku a prakticky je aplikuje v reálném projektu.</w:t>
+      </w:r>
+    </w:p>
+    <w:p>
+      <w:r>
+        <w:t>Během vývoje jsem získal cenné zkušenosti v několika oblastech. Nejdůležitější bylo pochopení komponentové architektury – rozdělením aplikace do samostatných komponent (habit-</w:t>
       </w:r>
       <w:proofErr w:type="spellStart"/>
       <w:r>
@@ -9799,22 +9208,20 @@
       </w:r>
       <w:proofErr w:type="spellEnd"/>
       <w:r>
-        <w:t>) způsobem, aby byla aplikace přehledná a snadno rozšiřitelná. Zvlášť přínosné bylo používat @Input a @Output pro předávání dat a událostí mezi komponentami.</w:t>
-      </w:r>
-    </w:p>
-    <w:p>
-      <w:pPr>
-        <w:pStyle w:val="Nadpis3"/>
-      </w:pPr>
-      <w:bookmarkStart w:id="89" w:name="_Toc230197567"/>
-      <w:r>
-        <w:t>Práce se stavem a službami</w:t>
-      </w:r>
-      <w:bookmarkEnd w:id="89"/>
-    </w:p>
-    <w:p>
-      <w:r>
-        <w:t xml:space="preserve">Díky této práci jsem se naučil konstruovat </w:t>
+        <w:t xml:space="preserve">) se stala aplikace přehledná, udržovatelná a snadno rozšiřitelná. Práce s @Input a @Output </w:t>
+      </w:r>
+      <w:proofErr w:type="spellStart"/>
+      <w:r>
+        <w:t>dekorátory</w:t>
+      </w:r>
+      <w:proofErr w:type="spellEnd"/>
+      <w:r>
+        <w:t xml:space="preserve"> mi ukázala, jak efektivně předávat data a události mezi komponentami bez zbytečného propojení.</w:t>
+      </w:r>
+    </w:p>
+    <w:p>
+      <w:r>
+        <w:t xml:space="preserve">Zásadní roli sehrála implementace centralizovaného </w:t>
       </w:r>
       <w:proofErr w:type="spellStart"/>
       <w:r>
@@ -9822,7 +9229,7 @@
       </w:r>
       <w:proofErr w:type="spellEnd"/>
       <w:r>
-        <w:t xml:space="preserve"> pro centralizovanou správu dat. Zjistil jsem, že reaktivní přístup (</w:t>
+        <w:t xml:space="preserve">. Zjistil jsem, že reaktivní přístup s </w:t>
       </w:r>
       <w:proofErr w:type="spellStart"/>
       <w:r>
@@ -9830,63 +9237,22 @@
       </w:r>
       <w:proofErr w:type="spellEnd"/>
       <w:r>
-        <w:t>) výrazně zjednodušuje konzistenci UI a díky tomu se lépe škáluje a opravuje.</w:t>
-      </w:r>
-    </w:p>
-    <w:p>
-      <w:pPr>
-        <w:pStyle w:val="Nadpis3"/>
-      </w:pPr>
-      <w:bookmarkStart w:id="90" w:name="_Toc230197568"/>
-      <w:r>
-        <w:t>Validace a ošetření uživatelských vstupů</w:t>
-      </w:r>
-      <w:bookmarkEnd w:id="90"/>
-    </w:p>
-    <w:p>
-      <w:r>
-        <w:t>Formulář mi ukázal, že validace není jen „checkbox“, ale reálné zabezpečení kvality dat. Zvlášť kontrola duplicit zabránila tomu, aby aplikace obsahovala nesmyslné nebo duplicitní záznamy.</w:t>
-      </w:r>
-    </w:p>
-    <w:p>
-      <w:pPr>
-        <w:pStyle w:val="Nadpis3"/>
-      </w:pPr>
-      <w:bookmarkStart w:id="91" w:name="_Toc230197569"/>
-      <w:r>
-        <w:t>Transformace dat pro graf</w:t>
-      </w:r>
-      <w:bookmarkEnd w:id="91"/>
-    </w:p>
-    <w:p>
-      <w:r>
-        <w:t>Další velice užitečná a cenná byla zkušenost s tím, jak převést surovou historii událostí na strukturu vhodnou pro graf (binování podle zvoleného období). To je častý problém v reálných aplikacích – data záznamů se musí agregovat do</w:t>
-      </w:r>
-      <w:r>
-        <w:t xml:space="preserve"> </w:t>
-      </w:r>
-      <w:proofErr w:type="spellStart"/>
-      <w:r>
-        <w:t>zobrazovatelných</w:t>
-      </w:r>
-      <w:proofErr w:type="spellEnd"/>
-      <w:r>
-        <w:t xml:space="preserve"> tvarů.</w:t>
-      </w:r>
-    </w:p>
-    <w:p>
-      <w:pPr>
-        <w:pStyle w:val="Nadpis3"/>
-      </w:pPr>
-      <w:bookmarkStart w:id="92" w:name="_Toc230197570"/>
-      <w:r>
-        <w:t>Uživatelská použitelnost</w:t>
-      </w:r>
-      <w:bookmarkEnd w:id="92"/>
-    </w:p>
-    <w:p>
-      <w:r>
-        <w:t>Při implementaci UI (</w:t>
+        <w:t xml:space="preserve"> výrazně zjednodušuje konzistenci uživatelského rozhraní a umožňuje snadnější škálování a údržbu aplikace. Tato zkušenost s reaktivním programováním je klíčová pro moderní webový vývoj.</w:t>
+      </w:r>
+    </w:p>
+    <w:p>
+      <w:r>
+        <w:t>Formuláře a validace mě naučily, že kvalita dat není jen „checkbox", ale skutečné zabezpečení funkčnosti celé aplikace. Zvlášť implementace kontroly duplicit zabránila tomu, aby aplikace obsahovala nesmyslné záznamy, a demonstruje důležitost validace na vstupu.</w:t>
+      </w:r>
+    </w:p>
+    <w:p>
+      <w:r>
+        <w:t>Obzvláště přínosná byla práce s vizualizací dat – převod surové historie plnění na strukturu vhodnou pro graf prostřednictvím binování podle zvoleného období. Tato agregace dat je běžný problém v reálných aplikacích a nyní vím, jak jej řešit efektivně.</w:t>
+      </w:r>
+    </w:p>
+    <w:p>
+      <w:r>
+        <w:t>Při návrhu uživatelského rozhraní (</w:t>
       </w:r>
       <w:proofErr w:type="spellStart"/>
       <w:r>
@@ -9896,11 +9262,9 @@
       <w:r>
         <w:t xml:space="preserve">, </w:t>
       </w:r>
-      <w:proofErr w:type="spellStart"/>
-      <w:r>
-        <w:t>taby</w:t>
-      </w:r>
-      <w:proofErr w:type="spellEnd"/>
+      <w:r>
+        <w:t>karty</w:t>
+      </w:r>
       <w:r>
         <w:t xml:space="preserve">, </w:t>
       </w:r>
@@ -9910,7 +9274,7 @@
       </w:r>
       <w:proofErr w:type="spellEnd"/>
       <w:r>
-        <w:t>) jsem si uvědomil, že dobré uživatelské rozhraní je stejně důležité jako samotná logika. Aplikace musí být srozumitelná a akce musí být dostupné intuitivně.</w:t>
+        <w:t>) jsem si uvědomil, že kvalitní UI design je stejně důležitý jako samotná logika aplikace. Uživatelské rozhraní musí být intuitivní a akce snadno dostupné, aby byla aplikace skutečně použitelná.</w:t>
       </w:r>
     </w:p>
     <w:p>
@@ -9927,22 +9291,22 @@
         </w:numPr>
         <w:ind w:left="720"/>
       </w:pPr>
-      <w:bookmarkStart w:id="93" w:name="_Toc222315302"/>
-      <w:bookmarkStart w:id="94" w:name="_Toc223513779"/>
-      <w:bookmarkStart w:id="95" w:name="_Toc230197572"/>
+      <w:bookmarkStart w:id="92" w:name="_Toc222315302"/>
+      <w:bookmarkStart w:id="93" w:name="_Toc223513779"/>
+      <w:bookmarkStart w:id="94" w:name="_Toc230273339"/>
       <w:r>
         <w:lastRenderedPageBreak/>
         <w:t>Použitá literatura</w:t>
       </w:r>
+      <w:bookmarkEnd w:id="92"/>
       <w:bookmarkEnd w:id="93"/>
       <w:bookmarkEnd w:id="94"/>
-      <w:bookmarkEnd w:id="95"/>
     </w:p>
     <w:p>
       <w:pPr>
         <w:pStyle w:val="Pouitliteratura"/>
       </w:pPr>
-      <w:bookmarkStart w:id="96" w:name="_Ref230199246"/>
+      <w:bookmarkStart w:id="95" w:name="_Ref230199246"/>
       <w:r>
         <w:rPr>
           <w:b/>
@@ -9964,13 +9328,13 @@
           <w:t>https://angular.dev/overview</w:t>
         </w:r>
       </w:hyperlink>
-      <w:bookmarkEnd w:id="96"/>
+      <w:bookmarkEnd w:id="95"/>
     </w:p>
     <w:p>
       <w:pPr>
         <w:pStyle w:val="Pouitliteratura"/>
       </w:pPr>
-      <w:bookmarkStart w:id="97" w:name="_Ref230200596"/>
+      <w:bookmarkStart w:id="96" w:name="_Ref230200596"/>
       <w:r>
         <w:rPr>
           <w:b/>
@@ -10017,13 +9381,13 @@
           <w:t>https://www.typescriptlang.org/docs/</w:t>
         </w:r>
       </w:hyperlink>
-      <w:bookmarkEnd w:id="97"/>
+      <w:bookmarkEnd w:id="96"/>
     </w:p>
     <w:p>
       <w:pPr>
         <w:pStyle w:val="Pouitliteratura"/>
       </w:pPr>
-      <w:bookmarkStart w:id="98" w:name="_Ref230200553"/>
+      <w:bookmarkStart w:id="97" w:name="_Ref230200553"/>
       <w:r>
         <w:rPr>
           <w:b/>
@@ -10066,13 +9430,13 @@
           <w:t>https://material.angular.io/</w:t>
         </w:r>
       </w:hyperlink>
-      <w:bookmarkEnd w:id="98"/>
+      <w:bookmarkEnd w:id="97"/>
     </w:p>
     <w:p>
       <w:pPr>
         <w:pStyle w:val="Pouitliteratura"/>
       </w:pPr>
-      <w:bookmarkStart w:id="99" w:name="_Ref230200702"/>
+      <w:bookmarkStart w:id="98" w:name="_Ref230200702"/>
       <w:r>
         <w:rPr>
           <w:b/>
@@ -10117,13 +9481,13 @@
           <w:t>https://rxjs.dev/</w:t>
         </w:r>
       </w:hyperlink>
-      <w:bookmarkEnd w:id="99"/>
+      <w:bookmarkEnd w:id="98"/>
     </w:p>
     <w:p>
       <w:pPr>
         <w:pStyle w:val="Pouitliteratura"/>
       </w:pPr>
-      <w:bookmarkStart w:id="100" w:name="_Ref230200351"/>
+      <w:bookmarkStart w:id="99" w:name="_Ref230200351"/>
       <w:r>
         <w:rPr>
           <w:b/>
@@ -10168,13 +9532,13 @@
           <w:t>https://sass-lang.com/documentation</w:t>
         </w:r>
       </w:hyperlink>
-      <w:bookmarkEnd w:id="100"/>
+      <w:bookmarkEnd w:id="99"/>
     </w:p>
     <w:p>
       <w:pPr>
         <w:pStyle w:val="Pouitliteratura"/>
       </w:pPr>
-      <w:bookmarkStart w:id="101" w:name="_Ref230200750"/>
+      <w:bookmarkStart w:id="100" w:name="_Ref230200750"/>
       <w:r>
         <w:rPr>
           <w:b/>
@@ -10201,7 +9565,7 @@
           <w:t>https://docs.netlify.com/</w:t>
         </w:r>
       </w:hyperlink>
-      <w:bookmarkEnd w:id="101"/>
+      <w:bookmarkEnd w:id="100"/>
     </w:p>
     <w:p>
       <w:pPr>
@@ -10221,16 +9585,16 @@
         </w:numPr>
         <w:ind w:left="720"/>
       </w:pPr>
-      <w:bookmarkStart w:id="102" w:name="_Toc222315303"/>
-      <w:bookmarkStart w:id="103" w:name="_Toc223513780"/>
-      <w:bookmarkStart w:id="104" w:name="_Toc230197573"/>
+      <w:bookmarkStart w:id="101" w:name="_Toc222315303"/>
+      <w:bookmarkStart w:id="102" w:name="_Toc223513780"/>
+      <w:bookmarkStart w:id="103" w:name="_Toc230273340"/>
       <w:r>
         <w:lastRenderedPageBreak/>
         <w:t>Seznam obrázků</w:t>
       </w:r>
+      <w:bookmarkEnd w:id="101"/>
       <w:bookmarkEnd w:id="102"/>
       <w:bookmarkEnd w:id="103"/>
-      <w:bookmarkEnd w:id="104"/>
     </w:p>
     <w:p>
       <w:r>
@@ -10642,16 +10006,16 @@
         </w:numPr>
         <w:ind w:left="720"/>
       </w:pPr>
-      <w:bookmarkStart w:id="105" w:name="_Toc222315304"/>
-      <w:bookmarkStart w:id="106" w:name="_Toc223513781"/>
-      <w:bookmarkStart w:id="107" w:name="_Toc230197574"/>
+      <w:bookmarkStart w:id="104" w:name="_Toc222315304"/>
+      <w:bookmarkStart w:id="105" w:name="_Toc223513781"/>
+      <w:bookmarkStart w:id="106" w:name="_Toc230273341"/>
       <w:r>
         <w:lastRenderedPageBreak/>
         <w:t>Seznam tabulek</w:t>
       </w:r>
+      <w:bookmarkEnd w:id="104"/>
       <w:bookmarkEnd w:id="105"/>
       <w:bookmarkEnd w:id="106"/>
-      <w:bookmarkEnd w:id="107"/>
     </w:p>
     <w:p>
       <w:pPr>
@@ -15694,6 +15058,7 @@
   <w:style w:type="character" w:default="1" w:styleId="Standardnpsmoodstavce">
     <w:name w:val="Default Paragraph Font"/>
     <w:uiPriority w:val="1"/>
+    <w:semiHidden/>
     <w:unhideWhenUsed/>
   </w:style>
   <w:style w:type="table" w:default="1" w:styleId="Normlntabulka">

</xml_diff>